<commit_message>
Learned Priority classes and Custom Schedulers with demo
</commit_message>
<xml_diff>
--- a/9-Interesting_learning_Notes/Learning_Notes.docx
+++ b/9-Interesting_learning_Notes/Learning_Notes.docx
@@ -410,12 +410,21 @@
         <w:t xml:space="preserve">The full DNS to refer a service is: </w:t>
       </w:r>
       <w:proofErr w:type="spellStart"/>
-      <w:r>
-        <w:rPr>
-          <w:b/>
-          <w:bCs/>
-        </w:rPr>
-        <w:t>myservice.default.svc.cluster.local</w:t>
+      <w:proofErr w:type="gramStart"/>
+      <w:r>
+        <w:rPr>
+          <w:b/>
+          <w:bCs/>
+        </w:rPr>
+        <w:t>myservice.default.svc.cluster</w:t>
+      </w:r>
+      <w:proofErr w:type="gramEnd"/>
+      <w:r>
+        <w:rPr>
+          <w:b/>
+          <w:bCs/>
+        </w:rPr>
+        <w:t>.local</w:t>
       </w:r>
       <w:proofErr w:type="spellEnd"/>
     </w:p>
@@ -452,11 +461,32 @@
       </w:r>
       <w:proofErr w:type="spellEnd"/>
       <w:r>
-        <w:t xml:space="preserve"> Service gets a full DNS address that looks like this:[service-name].[namespace].</w:t>
-      </w:r>
-      <w:proofErr w:type="spellStart"/>
-      <w:r>
-        <w:t>svc.cluster.local</w:t>
+        <w:t xml:space="preserve"> Service gets a full DNS address that looks like </w:t>
+      </w:r>
+      <w:proofErr w:type="gramStart"/>
+      <w:r>
+        <w:t>this:[</w:t>
+      </w:r>
+      <w:proofErr w:type="gramEnd"/>
+      <w:r>
+        <w:t>service-name</w:t>
+      </w:r>
+      <w:proofErr w:type="gramStart"/>
+      <w:r>
+        <w:t>].[</w:t>
+      </w:r>
+      <w:proofErr w:type="gramEnd"/>
+      <w:r>
+        <w:t>namespace].</w:t>
+      </w:r>
+      <w:proofErr w:type="spellStart"/>
+      <w:proofErr w:type="gramStart"/>
+      <w:r>
+        <w:t>svc.cluster</w:t>
+      </w:r>
+      <w:proofErr w:type="gramEnd"/>
+      <w:r>
+        <w:t>.local</w:t>
       </w:r>
       <w:proofErr w:type="spellEnd"/>
     </w:p>
@@ -470,9 +500,14 @@
       </w:pPr>
       <w:proofErr w:type="spellStart"/>
       <w:r>
-        <w:t>service-name:The</w:t>
-      </w:r>
-      <w:proofErr w:type="spellEnd"/>
+        <w:t>service-</w:t>
+      </w:r>
+      <w:proofErr w:type="gramStart"/>
+      <w:r>
+        <w:t>name:The</w:t>
+      </w:r>
+      <w:proofErr w:type="spellEnd"/>
+      <w:proofErr w:type="gramEnd"/>
       <w:r>
         <w:t xml:space="preserve"> name you gave your Service.</w:t>
       </w:r>
@@ -503,10 +538,12 @@
     </w:p>
     <w:p>
       <w:proofErr w:type="spellStart"/>
+      <w:proofErr w:type="gramStart"/>
       <w:r>
         <w:t>cluster.local</w:t>
       </w:r>
       <w:proofErr w:type="spellEnd"/>
+      <w:proofErr w:type="gramEnd"/>
       <w:r>
         <w:t>: The default local domain name for your entire cluster.</w:t>
       </w:r>
@@ -514,7 +551,15 @@
     <w:p/>
     <w:p>
       <w:r>
-        <w:t>Scenario A Example: A pod in the "frontend" namespace connects to a database in the same namespace using just "</w:t>
+        <w:t xml:space="preserve">Scenario </w:t>
+      </w:r>
+      <w:proofErr w:type="gramStart"/>
+      <w:r>
+        <w:t>A</w:t>
+      </w:r>
+      <w:proofErr w:type="gramEnd"/>
+      <w:r>
+        <w:t xml:space="preserve"> Example: A pod in the "frontend" namespace connects to a database in the same namespace using just "</w:t>
       </w:r>
       <w:proofErr w:type="spellStart"/>
       <w:r>
@@ -531,9 +576,14 @@
       </w:r>
       <w:proofErr w:type="spellStart"/>
       <w:r>
-        <w:t>db-service.backend</w:t>
-      </w:r>
-      <w:proofErr w:type="spellEnd"/>
+        <w:t>db-</w:t>
+      </w:r>
+      <w:proofErr w:type="gramStart"/>
+      <w:r>
+        <w:t>service.backend</w:t>
+      </w:r>
+      <w:proofErr w:type="spellEnd"/>
+      <w:proofErr w:type="gramEnd"/>
       <w:r>
         <w:t>".</w:t>
       </w:r>
@@ -543,8 +593,13 @@
         <w:t>The remaining part of the address—.</w:t>
       </w:r>
       <w:proofErr w:type="spellStart"/>
-      <w:r>
-        <w:t>svc.cluster.local</w:t>
+      <w:proofErr w:type="gramStart"/>
+      <w:r>
+        <w:t>svc.cluster</w:t>
+      </w:r>
+      <w:proofErr w:type="gramEnd"/>
+      <w:r>
+        <w:t>.local</w:t>
       </w:r>
       <w:proofErr w:type="spellEnd"/>
       <w:r>
@@ -564,13 +619,23 @@
       </w:r>
       <w:proofErr w:type="spellEnd"/>
       <w:r>
-        <w:t xml:space="preserve">) created automatically by the cluster. it contain all the search </w:t>
-      </w:r>
-      <w:proofErr w:type="spellStart"/>
+        <w:t xml:space="preserve">) created automatically by the cluster. it </w:t>
+      </w:r>
+      <w:proofErr w:type="gramStart"/>
+      <w:r>
+        <w:t>contain</w:t>
+      </w:r>
+      <w:proofErr w:type="gramEnd"/>
+      <w:r>
+        <w:t xml:space="preserve"> all the search </w:t>
+      </w:r>
+      <w:proofErr w:type="spellStart"/>
+      <w:proofErr w:type="gramStart"/>
       <w:r>
         <w:t>list.Because</w:t>
       </w:r>
       <w:proofErr w:type="spellEnd"/>
+      <w:proofErr w:type="gramEnd"/>
       <w:r>
         <w:t xml:space="preserve"> of this search list, if you type just </w:t>
       </w:r>
@@ -583,8 +648,13 @@
         <w:t>-service, Kubernetes automatically appends the remaining parts (.</w:t>
       </w:r>
       <w:proofErr w:type="spellStart"/>
-      <w:r>
-        <w:t>svc.cluster.local</w:t>
+      <w:proofErr w:type="gramStart"/>
+      <w:r>
+        <w:t>svc.cluster</w:t>
+      </w:r>
+      <w:proofErr w:type="gramEnd"/>
+      <w:r>
+        <w:t>.local</w:t>
       </w:r>
       <w:proofErr w:type="spellEnd"/>
       <w:r>
@@ -620,7 +690,7 @@
                     <pic:cNvPicPr/>
                   </pic:nvPicPr>
                   <pic:blipFill>
-                    <a:blip r:embed="rId5"/>
+                    <a:blip r:embed="rId6"/>
                     <a:stretch>
                       <a:fillRect/>
                     </a:stretch>
@@ -788,10 +858,18 @@
       </w:r>
       <w:proofErr w:type="spellEnd"/>
       <w:r>
-        <w:t>-resources -o wide</w:t>
-      </w:r>
-      <w:r>
-        <w:t xml:space="preserve"> : shows all resources of Kubernetes. Helps to find the </w:t>
+        <w:t xml:space="preserve">-resources -o </w:t>
+      </w:r>
+      <w:proofErr w:type="gramStart"/>
+      <w:r>
+        <w:t>wide</w:t>
+      </w:r>
+      <w:r>
+        <w:t xml:space="preserve"> :</w:t>
+      </w:r>
+      <w:proofErr w:type="gramEnd"/>
+      <w:r>
+        <w:t xml:space="preserve"> shows all resources of Kubernetes. Helps to find the </w:t>
       </w:r>
       <w:proofErr w:type="spellStart"/>
       <w:r>
@@ -981,6 +1059,9 @@
     </w:p>
     <w:p>
       <w:r>
+        <w:rPr>
+          <w:noProof/>
+        </w:rPr>
         <w:drawing>
           <wp:inline distT="0" distB="0" distL="0" distR="0" wp14:anchorId="0B79166A" wp14:editId="6E90FA13">
             <wp:extent cx="5943600" cy="431165"/>
@@ -997,7 +1078,7 @@
                     <pic:cNvPicPr/>
                   </pic:nvPicPr>
                   <pic:blipFill>
-                    <a:blip r:embed="rId6"/>
+                    <a:blip r:embed="rId7"/>
                     <a:stretch>
                       <a:fillRect/>
                     </a:stretch>
@@ -1019,6 +1100,286 @@
       </w:r>
     </w:p>
     <w:p/>
+    <w:p>
+      <w:r>
+        <w:t xml:space="preserve">You can manually schedule a pod using the </w:t>
+      </w:r>
+      <w:proofErr w:type="spellStart"/>
+      <w:r>
+        <w:t>nodeName</w:t>
+      </w:r>
+      <w:proofErr w:type="spellEnd"/>
+      <w:r>
+        <w:t xml:space="preserve"> property. It can be used</w:t>
+      </w:r>
+      <w:r>
+        <w:t xml:space="preserve"> in situations where s</w:t>
+      </w:r>
+      <w:r>
+        <w:t>cheduler is not running.</w:t>
+      </w:r>
+    </w:p>
+    <w:p/>
+    <w:p>
+      <w:proofErr w:type="spellStart"/>
+      <w:r>
+        <w:rPr>
+          <w:b/>
+          <w:bCs/>
+        </w:rPr>
+        <w:t>PriorityClass</w:t>
+      </w:r>
+      <w:proofErr w:type="spellEnd"/>
+      <w:r>
+        <w:rPr>
+          <w:b/>
+          <w:bCs/>
+        </w:rPr>
+        <w:t>:</w:t>
+      </w:r>
+      <w:r>
+        <w:t xml:space="preserve"> A Kubernetes object that defines the priority of Pods. Higher-priority Pods are scheduled before lower-priority Pods and can </w:t>
+      </w:r>
+      <w:proofErr w:type="spellStart"/>
+      <w:r>
+        <w:t>preempt</w:t>
+      </w:r>
+      <w:proofErr w:type="spellEnd"/>
+      <w:r>
+        <w:t xml:space="preserve"> (evict) lower-priority Pods when resources are insufficient.</w:t>
+      </w:r>
+    </w:p>
+    <w:p>
+      <w:pPr>
+        <w:pStyle w:val="ListParagraph"/>
+        <w:numPr>
+          <w:ilvl w:val="0"/>
+          <w:numId w:val="4"/>
+        </w:numPr>
+      </w:pPr>
+      <w:r>
+        <w:rPr>
+          <w:b/>
+          <w:bCs/>
+        </w:rPr>
+        <w:t>Higher value</w:t>
+      </w:r>
+      <w:r>
+        <w:t xml:space="preserve"> </w:t>
+      </w:r>
+      <w:r>
+        <w:t>-</w:t>
+      </w:r>
+      <w:r>
+        <w:t xml:space="preserve"> Pod has higher priority → scheduled first and can </w:t>
+      </w:r>
+      <w:proofErr w:type="spellStart"/>
+      <w:r>
+        <w:t>preempt</w:t>
+      </w:r>
+      <w:proofErr w:type="spellEnd"/>
+      <w:r>
+        <w:t xml:space="preserve"> lower-priority Pods. </w:t>
+      </w:r>
+    </w:p>
+    <w:p>
+      <w:pPr>
+        <w:pStyle w:val="ListParagraph"/>
+        <w:numPr>
+          <w:ilvl w:val="0"/>
+          <w:numId w:val="4"/>
+        </w:numPr>
+      </w:pPr>
+      <w:r>
+        <w:rPr>
+          <w:b/>
+          <w:bCs/>
+        </w:rPr>
+        <w:t>Lower value</w:t>
+      </w:r>
+      <w:r>
+        <w:t xml:space="preserve"> </w:t>
+      </w:r>
+      <w:r>
+        <w:t>-</w:t>
+      </w:r>
+      <w:r>
+        <w:t xml:space="preserve"> Pod has lower priority → scheduled later and can be </w:t>
+      </w:r>
+      <w:proofErr w:type="spellStart"/>
+      <w:r>
+        <w:t>preempted</w:t>
+      </w:r>
+      <w:proofErr w:type="spellEnd"/>
+      <w:r>
+        <w:t xml:space="preserve"> by higher-priority Pods.</w:t>
+      </w:r>
+    </w:p>
+    <w:p>
+      <w:pPr>
+        <w:pStyle w:val="ListParagraph"/>
+        <w:numPr>
+          <w:ilvl w:val="0"/>
+          <w:numId w:val="4"/>
+        </w:numPr>
+      </w:pPr>
+      <w:r>
+        <w:rPr>
+          <w:b/>
+          <w:bCs/>
+        </w:rPr>
+        <w:t>Range:</w:t>
+      </w:r>
+      <w:r>
+        <w:t xml:space="preserve"> -2,147,483,648 to 1,000,000,000</w:t>
+      </w:r>
+    </w:p>
+    <w:p>
+      <w:pPr>
+        <w:pStyle w:val="ListParagraph"/>
+        <w:numPr>
+          <w:ilvl w:val="0"/>
+          <w:numId w:val="4"/>
+        </w:numPr>
+      </w:pPr>
+      <w:proofErr w:type="spellStart"/>
+      <w:r>
+        <w:t>preemptionPolicy</w:t>
+      </w:r>
+      <w:proofErr w:type="spellEnd"/>
+      <w:r>
+        <w:t xml:space="preserve">: </w:t>
+      </w:r>
+      <w:proofErr w:type="spellStart"/>
+      <w:proofErr w:type="gramStart"/>
+      <w:r>
+        <w:t>PreemptLowerPriority</w:t>
+      </w:r>
+      <w:proofErr w:type="spellEnd"/>
+      <w:r>
+        <w:t xml:space="preserve">  or</w:t>
+      </w:r>
+      <w:proofErr w:type="gramEnd"/>
+      <w:r>
+        <w:t xml:space="preserve"> </w:t>
+      </w:r>
+      <w:proofErr w:type="spellStart"/>
+      <w:r>
+        <w:t>preemptionPolicy</w:t>
+      </w:r>
+      <w:proofErr w:type="spellEnd"/>
+      <w:r>
+        <w:t>: Never</w:t>
+      </w:r>
+      <w:r>
+        <w:t>s</w:t>
+      </w:r>
+    </w:p>
+    <w:p>
+      <w:proofErr w:type="spellStart"/>
+      <w:r>
+        <w:t>kubectl</w:t>
+      </w:r>
+      <w:proofErr w:type="spellEnd"/>
+      <w:r>
+        <w:t xml:space="preserve"> logs commands only displays the applications </w:t>
+      </w:r>
+      <w:proofErr w:type="spellStart"/>
+      <w:r>
+        <w:rPr>
+          <w:b/>
+          <w:bCs/>
+        </w:rPr>
+        <w:t>stdout</w:t>
+      </w:r>
+      <w:proofErr w:type="spellEnd"/>
+      <w:r>
+        <w:t xml:space="preserve"> and </w:t>
+      </w:r>
+      <w:r>
+        <w:rPr>
+          <w:b/>
+          <w:bCs/>
+        </w:rPr>
+        <w:t>stderr</w:t>
+      </w:r>
+      <w:r>
+        <w:rPr>
+          <w:b/>
+          <w:bCs/>
+        </w:rPr>
+        <w:t xml:space="preserve">. </w:t>
+      </w:r>
+      <w:r>
+        <w:t xml:space="preserve">It does not include application specific </w:t>
+      </w:r>
+      <w:r>
+        <w:t>logs.</w:t>
+      </w:r>
+      <w:r>
+        <w:t xml:space="preserve"> </w:t>
+      </w:r>
+      <w:proofErr w:type="spellStart"/>
+      <w:r>
+        <w:t>etc</w:t>
+      </w:r>
+      <w:proofErr w:type="spellEnd"/>
+      <w:r>
+        <w:t xml:space="preserve"> those stored in /var/</w:t>
+      </w:r>
+      <w:r>
+        <w:t>…</w:t>
+      </w:r>
+    </w:p>
+    <w:p/>
+    <w:p>
+      <w:r>
+        <w:rPr>
+          <w:b/>
+          <w:bCs/>
+        </w:rPr>
+        <w:t>Custom-Scheduler:</w:t>
+      </w:r>
+    </w:p>
+    <w:p>
+      <w:r>
+        <w:t xml:space="preserve">After using a customer-scheduler, if you want to see the evidence that the pod used it, you can get the events of the po along with -o wide flag. Check the </w:t>
+      </w:r>
+      <w:r>
+        <w:rPr>
+          <w:b/>
+          <w:bCs/>
+        </w:rPr>
+        <w:t>SOURCE</w:t>
+      </w:r>
+      <w:r>
+        <w:t xml:space="preserve"> field.</w:t>
+      </w:r>
+    </w:p>
+    <w:p>
+      <w:r>
+        <w:t xml:space="preserve">Eg: </w:t>
+      </w:r>
+      <w:proofErr w:type="gramStart"/>
+      <w:r>
+        <w:t>“</w:t>
+      </w:r>
+      <w:r>
+        <w:t xml:space="preserve"> my</w:t>
+      </w:r>
+      <w:proofErr w:type="gramEnd"/>
+      <w:r>
+        <w:t xml:space="preserve">-scheduler, my-scheduler-my-scheduler   Successfully assigned default/nginx to </w:t>
+      </w:r>
+      <w:proofErr w:type="spellStart"/>
+      <w:r>
+        <w:t>controlplan</w:t>
+      </w:r>
+      <w:proofErr w:type="spellEnd"/>
+      <w:r>
+        <w:t>”</w:t>
+      </w:r>
+    </w:p>
     <w:p/>
     <w:p/>
     <w:p>
@@ -1110,10 +1471,12 @@
         <w:t xml:space="preserve"> apply -f </w:t>
       </w:r>
       <w:proofErr w:type="spellStart"/>
+      <w:proofErr w:type="gramStart"/>
       <w:r>
         <w:t>file.yaml</w:t>
       </w:r>
       <w:proofErr w:type="spellEnd"/>
+      <w:proofErr w:type="gramEnd"/>
       <w:r>
         <w:t xml:space="preserve"> → Creates the resource if it doesn't exist, or updates it if it already exists. </w:t>
       </w:r>
@@ -1128,10 +1491,12 @@
         <w:t xml:space="preserve"> replace -f </w:t>
       </w:r>
       <w:proofErr w:type="spellStart"/>
+      <w:proofErr w:type="gramStart"/>
       <w:r>
         <w:t>file.yaml</w:t>
       </w:r>
       <w:proofErr w:type="spellEnd"/>
+      <w:proofErr w:type="gramEnd"/>
       <w:r>
         <w:t xml:space="preserve"> → Replaces an existing resource. It fails if the resource doesn't exist.</w:t>
       </w:r>
@@ -1181,7 +1546,15 @@
     </w:p>
     <w:p>
       <w:r>
-        <w:t xml:space="preserve">You can use  --recursive flag to display all the applicable fields that are part of </w:t>
+        <w:t xml:space="preserve">You can </w:t>
+      </w:r>
+      <w:proofErr w:type="gramStart"/>
+      <w:r>
+        <w:t>use  --</w:t>
+      </w:r>
+      <w:proofErr w:type="gramEnd"/>
+      <w:r>
+        <w:t xml:space="preserve">recursive flag to display all the applicable fields that are part of </w:t>
       </w:r>
       <w:r>
         <w:t>those resources</w:t>
@@ -1192,7 +1565,6 @@
     </w:p>
     <w:p>
       <w:r>
-        <w:lastRenderedPageBreak/>
         <w:t xml:space="preserve">Eg: </w:t>
       </w:r>
       <w:proofErr w:type="spellStart"/>
@@ -1204,10 +1576,12 @@
         <w:t xml:space="preserve"> explain </w:t>
       </w:r>
       <w:proofErr w:type="spellStart"/>
+      <w:proofErr w:type="gramStart"/>
       <w:r>
         <w:t>pod.spec</w:t>
       </w:r>
       <w:proofErr w:type="spellEnd"/>
+      <w:proofErr w:type="gramEnd"/>
       <w:r>
         <w:t xml:space="preserve"> --</w:t>
       </w:r>
@@ -1233,6 +1607,119 @@
 <file path=word/numbering.xml><?xml version="1.0" encoding="utf-8"?>
 <w:numbering xmlns:wpc="http://schemas.microsoft.com/office/word/2010/wordprocessingCanvas" xmlns:cx="http://schemas.microsoft.com/office/drawing/2014/chartex" xmlns:cx1="http://schemas.microsoft.com/office/drawing/2015/9/8/chartex" xmlns:cx2="http://schemas.microsoft.com/office/drawing/2015/10/21/chartex" xmlns:cx3="http://schemas.microsoft.com/office/drawing/2016/5/9/chartex" xmlns:cx4="http://schemas.microsoft.com/office/drawing/2016/5/10/chartex" xmlns:cx5="http://schemas.microsoft.com/office/drawing/2016/5/11/chartex" xmlns:cx6="http://schemas.microsoft.com/office/drawing/2016/5/12/chartex" xmlns:cx7="http://schemas.microsoft.com/office/drawing/2016/5/13/chartex" xmlns:cx8="http://schemas.microsoft.com/office/drawing/2016/5/14/chartex" xmlns:mc="http://schemas.openxmlformats.org/markup-compatibility/2006" xmlns:aink="http://schemas.microsoft.com/office/drawing/2016/ink" xmlns:am3d="http://schemas.microsoft.com/office/drawing/2017/model3d" xmlns:o="urn:schemas-microsoft-com:office:office" xmlns:oel="http://schemas.microsoft.com/office/2019/extlst" xmlns:r="http://schemas.openxmlformats.org/officeDocument/2006/relationships" xmlns:m="http://schemas.openxmlformats.org/officeDocument/2006/math" xmlns:v="urn:schemas-microsoft-com:vml" xmlns:wp14="http://schemas.microsoft.com/office/word/2010/wordprocessingDrawing" xmlns:wp="http://schemas.openxmlformats.org/drawingml/2006/wordprocessingDrawing" xmlns:w10="urn:schemas-microsoft-com:office:word" xmlns:w="http://schemas.openxmlformats.org/wordprocessingml/2006/main" xmlns:w14="http://schemas.microsoft.com/office/word/2010/wordml" xmlns:w15="http://schemas.microsoft.com/office/word/2012/wordml" xmlns:w16cex="http://schemas.microsoft.com/office/word/2018/wordml/cex" xmlns:w16cid="http://schemas.microsoft.com/office/word/2016/wordml/cid" xmlns:w16="http://schemas.microsoft.com/office/word/2018/wordml" xmlns:w16du="http://schemas.microsoft.com/office/word/2023/wordml/word16du" xmlns:w16sdtdh="http://schemas.microsoft.com/office/word/2020/wordml/sdtdatahash" xmlns:w16sdtfl="http://schemas.microsoft.com/office/word/2024/wordml/sdtformatlock" xmlns:w16se="http://schemas.microsoft.com/office/word/2015/wordml/symex" xmlns:wpg="http://schemas.microsoft.com/office/word/2010/wordprocessingGroup" xmlns:wpi="http://schemas.microsoft.com/office/word/2010/wordprocessingInk" xmlns:wne="http://schemas.microsoft.com/office/word/2006/wordml" xmlns:wps="http://schemas.microsoft.com/office/word/2010/wordprocessingShape" mc:Ignorable="w14 w15 w16se w16cid w16 w16cex w16sdtdh w16sdtfl w16du wp14">
   <w:abstractNum w:abstractNumId="0" w15:restartNumberingAfterBreak="0">
+    <w:nsid w:val="1EC935CE"/>
+    <w:multiLevelType w:val="hybridMultilevel"/>
+    <w:tmpl w:val="AA029186"/>
+    <w:lvl w:ilvl="0" w:tplc="10090001">
+      <w:start w:val="1"/>
+      <w:numFmt w:val="bullet"/>
+      <w:lvlText w:val=""/>
+      <w:lvlJc w:val="left"/>
+      <w:pPr>
+        <w:ind w:left="720" w:hanging="360"/>
+      </w:pPr>
+      <w:rPr>
+        <w:rFonts w:ascii="Symbol" w:hAnsi="Symbol" w:hint="default"/>
+      </w:rPr>
+    </w:lvl>
+    <w:lvl w:ilvl="1" w:tplc="10090003" w:tentative="1">
+      <w:start w:val="1"/>
+      <w:numFmt w:val="bullet"/>
+      <w:lvlText w:val="o"/>
+      <w:lvlJc w:val="left"/>
+      <w:pPr>
+        <w:ind w:left="1440" w:hanging="360"/>
+      </w:pPr>
+      <w:rPr>
+        <w:rFonts w:ascii="Courier New" w:hAnsi="Courier New" w:cs="Courier New" w:hint="default"/>
+      </w:rPr>
+    </w:lvl>
+    <w:lvl w:ilvl="2" w:tplc="10090005" w:tentative="1">
+      <w:start w:val="1"/>
+      <w:numFmt w:val="bullet"/>
+      <w:lvlText w:val=""/>
+      <w:lvlJc w:val="left"/>
+      <w:pPr>
+        <w:ind w:left="2160" w:hanging="360"/>
+      </w:pPr>
+      <w:rPr>
+        <w:rFonts w:ascii="Wingdings" w:hAnsi="Wingdings" w:hint="default"/>
+      </w:rPr>
+    </w:lvl>
+    <w:lvl w:ilvl="3" w:tplc="10090001" w:tentative="1">
+      <w:start w:val="1"/>
+      <w:numFmt w:val="bullet"/>
+      <w:lvlText w:val=""/>
+      <w:lvlJc w:val="left"/>
+      <w:pPr>
+        <w:ind w:left="2880" w:hanging="360"/>
+      </w:pPr>
+      <w:rPr>
+        <w:rFonts w:ascii="Symbol" w:hAnsi="Symbol" w:hint="default"/>
+      </w:rPr>
+    </w:lvl>
+    <w:lvl w:ilvl="4" w:tplc="10090003" w:tentative="1">
+      <w:start w:val="1"/>
+      <w:numFmt w:val="bullet"/>
+      <w:lvlText w:val="o"/>
+      <w:lvlJc w:val="left"/>
+      <w:pPr>
+        <w:ind w:left="3600" w:hanging="360"/>
+      </w:pPr>
+      <w:rPr>
+        <w:rFonts w:ascii="Courier New" w:hAnsi="Courier New" w:cs="Courier New" w:hint="default"/>
+      </w:rPr>
+    </w:lvl>
+    <w:lvl w:ilvl="5" w:tplc="10090005" w:tentative="1">
+      <w:start w:val="1"/>
+      <w:numFmt w:val="bullet"/>
+      <w:lvlText w:val=""/>
+      <w:lvlJc w:val="left"/>
+      <w:pPr>
+        <w:ind w:left="4320" w:hanging="360"/>
+      </w:pPr>
+      <w:rPr>
+        <w:rFonts w:ascii="Wingdings" w:hAnsi="Wingdings" w:hint="default"/>
+      </w:rPr>
+    </w:lvl>
+    <w:lvl w:ilvl="6" w:tplc="10090001" w:tentative="1">
+      <w:start w:val="1"/>
+      <w:numFmt w:val="bullet"/>
+      <w:lvlText w:val=""/>
+      <w:lvlJc w:val="left"/>
+      <w:pPr>
+        <w:ind w:left="5040" w:hanging="360"/>
+      </w:pPr>
+      <w:rPr>
+        <w:rFonts w:ascii="Symbol" w:hAnsi="Symbol" w:hint="default"/>
+      </w:rPr>
+    </w:lvl>
+    <w:lvl w:ilvl="7" w:tplc="10090003" w:tentative="1">
+      <w:start w:val="1"/>
+      <w:numFmt w:val="bullet"/>
+      <w:lvlText w:val="o"/>
+      <w:lvlJc w:val="left"/>
+      <w:pPr>
+        <w:ind w:left="5760" w:hanging="360"/>
+      </w:pPr>
+      <w:rPr>
+        <w:rFonts w:ascii="Courier New" w:hAnsi="Courier New" w:cs="Courier New" w:hint="default"/>
+      </w:rPr>
+    </w:lvl>
+    <w:lvl w:ilvl="8" w:tplc="10090005" w:tentative="1">
+      <w:start w:val="1"/>
+      <w:numFmt w:val="bullet"/>
+      <w:lvlText w:val=""/>
+      <w:lvlJc w:val="left"/>
+      <w:pPr>
+        <w:ind w:left="6480" w:hanging="360"/>
+      </w:pPr>
+      <w:rPr>
+        <w:rFonts w:ascii="Wingdings" w:hAnsi="Wingdings" w:hint="default"/>
+      </w:rPr>
+    </w:lvl>
+  </w:abstractNum>
+  <w:abstractNum w:abstractNumId="1" w15:restartNumberingAfterBreak="0">
     <w:nsid w:val="21A273DA"/>
     <w:multiLevelType w:val="hybridMultilevel"/>
     <w:tmpl w:val="825437A6"/>
@@ -1345,7 +1832,7 @@
       </w:rPr>
     </w:lvl>
   </w:abstractNum>
-  <w:abstractNum w:abstractNumId="1" w15:restartNumberingAfterBreak="0">
+  <w:abstractNum w:abstractNumId="2" w15:restartNumberingAfterBreak="0">
     <w:nsid w:val="6F6B297F"/>
     <w:multiLevelType w:val="hybridMultilevel"/>
     <w:tmpl w:val="90604326"/>
@@ -1457,7 +1944,7 @@
       </w:rPr>
     </w:lvl>
   </w:abstractNum>
-  <w:abstractNum w:abstractNumId="2" w15:restartNumberingAfterBreak="0">
+  <w:abstractNum w:abstractNumId="3" w15:restartNumberingAfterBreak="0">
     <w:nsid w:val="7FE96A27"/>
     <w:multiLevelType w:val="multilevel"/>
     <w:tmpl w:val="2E109BCA"/>
@@ -1607,12 +2094,15 @@
     </w:lvl>
   </w:abstractNum>
   <w:num w:numId="1" w16cid:durableId="1329406315">
+    <w:abstractNumId w:val="2"/>
+  </w:num>
+  <w:num w:numId="2" w16cid:durableId="346176687">
+    <w:abstractNumId w:val="3"/>
+  </w:num>
+  <w:num w:numId="3" w16cid:durableId="588125869">
     <w:abstractNumId w:val="1"/>
   </w:num>
-  <w:num w:numId="2" w16cid:durableId="346176687">
-    <w:abstractNumId w:val="2"/>
-  </w:num>
-  <w:num w:numId="3" w16cid:durableId="588125869">
+  <w:num w:numId="4" w16cid:durableId="423965292">
     <w:abstractNumId w:val="0"/>
   </w:num>
 </w:numbering>
@@ -2850,4 +3340,16 @@
     </a:ext>
   </a:extLst>
 </a:theme>
+</file>
+
+<file path=customXml/item1.xml><?xml version="1.0" encoding="utf-8"?>
+<b:Sources xmlns:b="http://schemas.openxmlformats.org/officeDocument/2006/bibliography" xmlns="http://schemas.openxmlformats.org/officeDocument/2006/bibliography" SelectedStyle="\APASixthEditionOfficeOnline.xsl" StyleName="APA" Version="6"/>
+</file>
+
+<file path=customXml/itemProps1.xml><?xml version="1.0" encoding="utf-8"?>
+<ds:datastoreItem xmlns:ds="http://schemas.openxmlformats.org/officeDocument/2006/customXml" ds:itemID="{89CC66AF-3F3D-4E8D-A793-3825C7DECA98}">
+  <ds:schemaRefs>
+    <ds:schemaRef ds:uri="http://schemas.openxmlformats.org/officeDocument/2006/bibliography"/>
+  </ds:schemaRefs>
+</ds:datastoreItem>
 </file>
</xml_diff>

<commit_message>
Learned Admission controllers, Metrics server, kubectl logs command
</commit_message>
<xml_diff>
--- a/9-Interesting_learning_Notes/Learning_Notes.docx
+++ b/9-Interesting_learning_Notes/Learning_Notes.docx
@@ -118,7 +118,6 @@
       <w:r>
         <w:t xml:space="preserve">, Kubernetes assigns it a </w:t>
       </w:r>
-      <w:proofErr w:type="spellStart"/>
       <w:r>
         <w:rPr>
           <w:b/>
@@ -126,7 +125,6 @@
         </w:rPr>
         <w:t>ClusterIP</w:t>
       </w:r>
-      <w:proofErr w:type="spellEnd"/>
       <w:r>
         <w:t xml:space="preserve">. </w:t>
       </w:r>
@@ -180,21 +178,12 @@
           <w:numId w:val="2"/>
         </w:numPr>
       </w:pPr>
-      <w:proofErr w:type="spellStart"/>
-      <w:r>
-        <w:rPr>
-          <w:b/>
-          <w:bCs/>
-        </w:rPr>
-        <w:t>kube</w:t>
-      </w:r>
-      <w:proofErr w:type="spellEnd"/>
-      <w:r>
-        <w:rPr>
-          <w:b/>
-          <w:bCs/>
-        </w:rPr>
-        <w:t>-proxy does not assign the Service IP.</w:t>
+      <w:r>
+        <w:rPr>
+          <w:b/>
+          <w:bCs/>
+        </w:rPr>
+        <w:t>kube-proxy does not assign the Service IP.</w:t>
       </w:r>
       <w:r>
         <w:t xml:space="preserve"> </w:t>
@@ -207,13 +196,8 @@
           <w:numId w:val="2"/>
         </w:numPr>
       </w:pPr>
-      <w:proofErr w:type="spellStart"/>
-      <w:r>
-        <w:t>kube</w:t>
-      </w:r>
-      <w:proofErr w:type="spellEnd"/>
-      <w:r>
-        <w:t xml:space="preserve">-proxy watches Services and creates </w:t>
+      <w:r>
+        <w:t xml:space="preserve">kube-proxy watches Services and creates </w:t>
       </w:r>
       <w:r>
         <w:rPr>
@@ -223,15 +207,7 @@
         <w:t>networking rules</w:t>
       </w:r>
       <w:r>
-        <w:t xml:space="preserve"> (iptables/IPVS/</w:t>
-      </w:r>
-      <w:proofErr w:type="spellStart"/>
-      <w:r>
-        <w:t>nftables</w:t>
-      </w:r>
-      <w:proofErr w:type="spellEnd"/>
-      <w:r>
-        <w:t>) to route traffic from the Service IP to the backend Pod IPs.</w:t>
+        <w:t xml:space="preserve"> (iptables/IPVS/nftables) to route traffic from the Service IP to the backend Pod IPs.</w:t>
       </w:r>
     </w:p>
     <w:p>
@@ -262,21 +238,12 @@
           <w:numId w:val="2"/>
         </w:numPr>
       </w:pPr>
-      <w:proofErr w:type="spellStart"/>
-      <w:r>
-        <w:rPr>
-          <w:b/>
-          <w:bCs/>
-        </w:rPr>
-        <w:t>kube</w:t>
-      </w:r>
-      <w:proofErr w:type="spellEnd"/>
-      <w:r>
-        <w:rPr>
-          <w:b/>
-          <w:bCs/>
-        </w:rPr>
-        <w:t>-proxy</w:t>
+      <w:r>
+        <w:rPr>
+          <w:b/>
+          <w:bCs/>
+        </w:rPr>
+        <w:t>kube-proxy</w:t>
       </w:r>
       <w:r>
         <w:t xml:space="preserve"> creates networking rules that recognize this virtual IP and forward traffic to the Service's backend Pods.</w:t>
@@ -321,40 +288,19 @@
         <w:t xml:space="preserve">: </w:t>
       </w:r>
       <w:r>
-        <w:t xml:space="preserve">A Kubernetes </w:t>
-      </w:r>
-      <w:proofErr w:type="spellStart"/>
-      <w:r>
-        <w:t>NodePort</w:t>
-      </w:r>
-      <w:proofErr w:type="spellEnd"/>
-      <w:r>
-        <w:t xml:space="preserve"> does not create a normal listening socket on the node. Instead, </w:t>
-      </w:r>
-      <w:proofErr w:type="spellStart"/>
-      <w:r>
-        <w:t>Kuberne</w:t>
+        <w:t>A Kubernetes NodePort does not create a normal listening socket on the node. Instead, Kuberne</w:t>
       </w:r>
       <w:r>
         <w:t>s</w:t>
       </w:r>
       <w:r>
-        <w:t>tes</w:t>
-      </w:r>
-      <w:proofErr w:type="spellEnd"/>
-      <w:r>
-        <w:t xml:space="preserve"> configures networking rules to forward traffic arriving on that port to the Service. Therefore, if a host-level application is already listening on the same port, traffic arriving through that node may be handled by the existing application instead of reaching the Kubernetes Service, depending on the networking implementation and rule processing.</w:t>
+        <w:t>tes configures networking rules to forward traffic arriving on that port to the Service. Therefore, if a host-level application is already listening on the same port, traffic arriving through that node may be handled by the existing application instead of reaching the Kubernetes Service, depending on the networking implementation and rule processing.</w:t>
       </w:r>
     </w:p>
     <w:p/>
     <w:p>
-      <w:proofErr w:type="spellStart"/>
-      <w:r>
-        <w:t>NodePort</w:t>
-      </w:r>
-      <w:proofErr w:type="spellEnd"/>
-      <w:r>
-        <w:t xml:space="preserve"> 30005 does NOT mean:</w:t>
+      <w:r>
+        <w:t>NodePort 30005 does NOT mean:</w:t>
       </w:r>
     </w:p>
     <w:p>
@@ -378,21 +324,12 @@
       <w:r>
         <w:t xml:space="preserve">packet gets </w:t>
       </w:r>
-      <w:proofErr w:type="spellStart"/>
-      <w:r>
-        <w:rPr>
-          <w:b/>
-          <w:bCs/>
-        </w:rPr>
-        <w:t>DNAT'ed</w:t>
-      </w:r>
-      <w:proofErr w:type="spellEnd"/>
-      <w:r>
-        <w:rPr>
-          <w:b/>
-          <w:bCs/>
-        </w:rPr>
-        <w:t>/redirected by the Kubernetes networking rules before normal socket delivery</w:t>
+      <w:r>
+        <w:rPr>
+          <w:b/>
+          <w:bCs/>
+        </w:rPr>
+        <w:t>DNAT'ed/redirected by the Kubernetes networking rules before normal socket delivery</w:t>
       </w:r>
       <w:r>
         <w:t>.</w:t>
@@ -409,24 +346,13 @@
       <w:r>
         <w:t xml:space="preserve">The full DNS to refer a service is: </w:t>
       </w:r>
-      <w:proofErr w:type="spellStart"/>
-      <w:proofErr w:type="gramStart"/>
-      <w:r>
-        <w:rPr>
-          <w:b/>
-          <w:bCs/>
-        </w:rPr>
-        <w:t>myservice.default.svc.cluster</w:t>
-      </w:r>
-      <w:proofErr w:type="gramEnd"/>
-      <w:r>
-        <w:rPr>
-          <w:b/>
-          <w:bCs/>
-        </w:rPr>
-        <w:t>.local</w:t>
-      </w:r>
-      <w:proofErr w:type="spellEnd"/>
+      <w:r>
+        <w:rPr>
+          <w:b/>
+          <w:bCs/>
+        </w:rPr>
+        <w:t>myservice.default.svc.cluster.local</w:t>
+      </w:r>
     </w:p>
     <w:p>
       <w:pPr>
@@ -453,42 +379,8 @@
     </w:p>
     <w:p>
       <w:r>
-        <w:t xml:space="preserve">The Structure of a Kubernetes Service DNS </w:t>
-      </w:r>
-      <w:proofErr w:type="spellStart"/>
-      <w:r>
-        <w:t>NameEvery</w:t>
-      </w:r>
-      <w:proofErr w:type="spellEnd"/>
-      <w:r>
-        <w:t xml:space="preserve"> Service gets a full DNS address that looks like </w:t>
-      </w:r>
-      <w:proofErr w:type="gramStart"/>
-      <w:r>
-        <w:t>this:[</w:t>
-      </w:r>
-      <w:proofErr w:type="gramEnd"/>
-      <w:r>
-        <w:t>service-name</w:t>
-      </w:r>
-      <w:proofErr w:type="gramStart"/>
-      <w:r>
-        <w:t>].[</w:t>
-      </w:r>
-      <w:proofErr w:type="gramEnd"/>
-      <w:r>
-        <w:t>namespace].</w:t>
-      </w:r>
-      <w:proofErr w:type="spellStart"/>
-      <w:proofErr w:type="gramStart"/>
-      <w:r>
-        <w:t>svc.cluster</w:t>
-      </w:r>
-      <w:proofErr w:type="gramEnd"/>
-      <w:r>
-        <w:t>.local</w:t>
-      </w:r>
-      <w:proofErr w:type="spellEnd"/>
+        <w:t>The Structure of a Kubernetes Service DNS NameEvery Service gets a full DNS address that looks like this:[service-name].[namespace].svc.cluster.local</w:t>
+      </w:r>
     </w:p>
     <w:p>
       <w:pPr>
@@ -498,18 +390,8 @@
           <w:numId w:val="3"/>
         </w:numPr>
       </w:pPr>
-      <w:proofErr w:type="spellStart"/>
-      <w:r>
-        <w:t>service-</w:t>
-      </w:r>
-      <w:proofErr w:type="gramStart"/>
-      <w:r>
-        <w:t>name:The</w:t>
-      </w:r>
-      <w:proofErr w:type="spellEnd"/>
-      <w:proofErr w:type="gramEnd"/>
-      <w:r>
-        <w:t xml:space="preserve"> name you gave your Service.</w:t>
+      <w:r>
+        <w:t>service-name:The name you gave your Service.</w:t>
       </w:r>
     </w:p>
     <w:p>
@@ -537,128 +419,24 @@
       </w:r>
     </w:p>
     <w:p>
-      <w:proofErr w:type="spellStart"/>
-      <w:proofErr w:type="gramStart"/>
-      <w:r>
-        <w:t>cluster.local</w:t>
-      </w:r>
-      <w:proofErr w:type="spellEnd"/>
-      <w:proofErr w:type="gramEnd"/>
-      <w:r>
-        <w:t>: The default local domain name for your entire cluster.</w:t>
+      <w:r>
+        <w:t>cluster.local: The default local domain name for your entire cluster.</w:t>
       </w:r>
     </w:p>
     <w:p/>
     <w:p>
       <w:r>
-        <w:t xml:space="preserve">Scenario </w:t>
-      </w:r>
-      <w:proofErr w:type="gramStart"/>
-      <w:r>
-        <w:t>A</w:t>
-      </w:r>
-      <w:proofErr w:type="gramEnd"/>
-      <w:r>
-        <w:t xml:space="preserve"> Example: A pod in the "frontend" namespace connects to a database in the same namespace using just "</w:t>
-      </w:r>
-      <w:proofErr w:type="spellStart"/>
-      <w:r>
-        <w:t>db</w:t>
-      </w:r>
-      <w:proofErr w:type="spellEnd"/>
-      <w:r>
-        <w:t>-service".</w:t>
-      </w:r>
-    </w:p>
-    <w:p>
-      <w:r>
-        <w:t>Scenario B Example: A pod in the "frontend" namespace connects to a database in the "backend" namespace using "</w:t>
-      </w:r>
-      <w:proofErr w:type="spellStart"/>
-      <w:r>
-        <w:t>db-</w:t>
-      </w:r>
-      <w:proofErr w:type="gramStart"/>
-      <w:r>
-        <w:t>service.backend</w:t>
-      </w:r>
-      <w:proofErr w:type="spellEnd"/>
-      <w:proofErr w:type="gramEnd"/>
-      <w:r>
-        <w:t>".</w:t>
-      </w:r>
-    </w:p>
-    <w:p>
-      <w:r>
-        <w:t>The remaining part of the address—.</w:t>
-      </w:r>
-      <w:proofErr w:type="spellStart"/>
-      <w:proofErr w:type="gramStart"/>
-      <w:r>
-        <w:t>svc.cluster</w:t>
-      </w:r>
-      <w:proofErr w:type="gramEnd"/>
-      <w:r>
-        <w:t>.local</w:t>
-      </w:r>
-      <w:proofErr w:type="spellEnd"/>
-      <w:r>
-        <w:t>—is called the cluster suffix. It is not mandatory because every container running inside a Kubernetes Pod has a hidden configuration file (/</w:t>
-      </w:r>
-      <w:proofErr w:type="spellStart"/>
-      <w:r>
-        <w:t>etc</w:t>
-      </w:r>
-      <w:proofErr w:type="spellEnd"/>
-      <w:r>
-        <w:t>/</w:t>
-      </w:r>
-      <w:proofErr w:type="spellStart"/>
-      <w:r>
-        <w:t>resolv.conf</w:t>
-      </w:r>
-      <w:proofErr w:type="spellEnd"/>
-      <w:r>
-        <w:t xml:space="preserve">) created automatically by the cluster. it </w:t>
-      </w:r>
-      <w:proofErr w:type="gramStart"/>
-      <w:r>
-        <w:t>contain</w:t>
-      </w:r>
-      <w:proofErr w:type="gramEnd"/>
-      <w:r>
-        <w:t xml:space="preserve"> all the search </w:t>
-      </w:r>
-      <w:proofErr w:type="spellStart"/>
-      <w:proofErr w:type="gramStart"/>
-      <w:r>
-        <w:t>list.Because</w:t>
-      </w:r>
-      <w:proofErr w:type="spellEnd"/>
-      <w:proofErr w:type="gramEnd"/>
-      <w:r>
-        <w:t xml:space="preserve"> of this search list, if you type just </w:t>
-      </w:r>
-      <w:proofErr w:type="spellStart"/>
-      <w:r>
-        <w:t>db</w:t>
-      </w:r>
-      <w:proofErr w:type="spellEnd"/>
-      <w:r>
-        <w:t>-service, Kubernetes automatically appends the remaining parts (.</w:t>
-      </w:r>
-      <w:proofErr w:type="spellStart"/>
-      <w:proofErr w:type="gramStart"/>
-      <w:r>
-        <w:t>svc.cluster</w:t>
-      </w:r>
-      <w:proofErr w:type="gramEnd"/>
-      <w:r>
-        <w:t>.local</w:t>
-      </w:r>
-      <w:proofErr w:type="spellEnd"/>
-      <w:r>
-        <w:t>) behind the scenes and tests them one by one until it finds a match!</w:t>
+        <w:t>Scenario A Example: A pod in the "frontend" namespace connects to a database in the same namespace using just "db-service".</w:t>
+      </w:r>
+    </w:p>
+    <w:p>
+      <w:r>
+        <w:t>Scenario B Example: A pod in the "frontend" namespace connects to a database in the "backend" namespace using "db-service.backend".</w:t>
+      </w:r>
+    </w:p>
+    <w:p>
+      <w:r>
+        <w:t>The remaining part of the address—.svc.cluster.local—is called the cluster suffix. It is not mandatory because every container running inside a Kubernetes Pod has a hidden configuration file (/etc/resolv.conf) created automatically by the cluster. it contain all the search list.Because of this search list, if you type just db-service, Kubernetes automatically appends the remaining parts (.svc.cluster.local) behind the scenes and tests them one by one until it finds a match!</w:t>
       </w:r>
     </w:p>
     <w:p>
@@ -741,317 +519,278 @@
       <w:r>
         <w:t xml:space="preserve"> </w:t>
       </w:r>
-      <w:proofErr w:type="spellStart"/>
-      <w:r>
-        <w:t>kubectl</w:t>
-      </w:r>
-      <w:proofErr w:type="spellEnd"/>
+      <w:r>
+        <w:t xml:space="preserve">kubectl </w:t>
+      </w:r>
+      <w:r>
+        <w:rPr>
+          <w:b/>
+          <w:bCs/>
+        </w:rPr>
+        <w:t>edit</w:t>
+      </w:r>
+      <w:r>
+        <w:t xml:space="preserve"> svc my-nodeport-service</w:t>
+      </w:r>
+    </w:p>
+    <w:p>
+      <w:pPr>
+        <w:rPr>
+          <w:b/>
+          <w:bCs/>
+        </w:rPr>
+      </w:pPr>
+      <w:r>
+        <w:t xml:space="preserve">Under the selector section, add the label of the pod. The pod label can be found </w:t>
+      </w:r>
+      <w:r>
+        <w:t>using:</w:t>
+      </w:r>
       <w:r>
         <w:t xml:space="preserve"> </w:t>
       </w:r>
       <w:r>
-        <w:rPr>
-          <w:b/>
-          <w:bCs/>
-        </w:rPr>
-        <w:t>edit</w:t>
-      </w:r>
-      <w:r>
-        <w:t xml:space="preserve"> svc my-</w:t>
-      </w:r>
-      <w:proofErr w:type="spellStart"/>
-      <w:r>
-        <w:t>nodeport</w:t>
-      </w:r>
-      <w:proofErr w:type="spellEnd"/>
-      <w:r>
-        <w:t>-service</w:t>
-      </w:r>
-    </w:p>
-    <w:p>
-      <w:r>
-        <w:t xml:space="preserve">Under the selector section, add the label of the pod. The pod label can be found </w:t>
-      </w:r>
-      <w:r>
-        <w:t>using:</w:t>
+        <w:t>k</w:t>
+      </w:r>
+      <w:r>
+        <w:t xml:space="preserve">ubectl </w:t>
+      </w:r>
+      <w:r>
+        <w:t xml:space="preserve">get pods </w:t>
+      </w:r>
+      <w:r>
+        <w:rPr>
+          <w:b/>
+          <w:bCs/>
+        </w:rPr>
+        <w:t>--show-labels</w:t>
+      </w:r>
+    </w:p>
+    <w:p>
+      <w:pPr>
+        <w:rPr>
+          <w:b/>
+          <w:bCs/>
+        </w:rPr>
+      </w:pPr>
+    </w:p>
+    <w:p>
+      <w:pPr>
+        <w:rPr>
+          <w:b/>
+          <w:bCs/>
+        </w:rPr>
+      </w:pPr>
+      <w:r>
+        <w:rPr>
+          <w:b/>
+          <w:bCs/>
+        </w:rPr>
+        <w:t>METRICS SERVER</w:t>
+      </w:r>
+    </w:p>
+    <w:p>
+      <w:r>
+        <w:t>Metrics Server collects resource metrics from the Kubernetes nodes and pods and makes them available through the Kubernetes Metrics API.</w:t>
+      </w:r>
+    </w:p>
+    <w:p>
+      <w:r>
+        <w:t>It gets metrics from kubelets, which expose cAdvisor</w:t>
       </w:r>
       <w:r>
         <w:t xml:space="preserve"> </w:t>
       </w:r>
-      <w:proofErr w:type="spellStart"/>
-      <w:r>
-        <w:t>k</w:t>
-      </w:r>
-      <w:r>
-        <w:t>ubectl</w:t>
-      </w:r>
-      <w:proofErr w:type="spellEnd"/>
+      <w:r>
+        <w:t>derived container metrics.</w:t>
+      </w:r>
+    </w:p>
+    <w:p/>
+    <w:p>
+      <w:r>
+        <w:rPr>
+          <w:b/>
+          <w:bCs/>
+        </w:rPr>
+        <w:t>cAdvisor</w:t>
+      </w:r>
+      <w:r>
+        <w:t xml:space="preserve"> is part of kubelet and collects container resource metrics. Metrics Server collects metrics from kubelets and provides them through the Kubernetes Metrics API.</w:t>
+      </w:r>
+    </w:p>
+    <w:p>
+      <w:r>
+        <w:t>Following commands are supported:</w:t>
+      </w:r>
+    </w:p>
+    <w:p>
+      <w:r>
+        <w:t>kubectl top pods</w:t>
+      </w:r>
+    </w:p>
+    <w:p>
+      <w:pPr>
+        <w:rPr>
+          <w:b/>
+          <w:bCs/>
+        </w:rPr>
+      </w:pPr>
+      <w:r>
+        <w:t xml:space="preserve"> kubectl top nodes</w:t>
+      </w:r>
+      <w:r>
+        <w:rPr>
+          <w:b/>
+          <w:bCs/>
+        </w:rPr>
+        <w:tab/>
+      </w:r>
+      <w:r>
+        <w:rPr>
+          <w:b/>
+          <w:bCs/>
+        </w:rPr>
+        <w:tab/>
+      </w:r>
+    </w:p>
+    <w:p>
+      <w:pPr>
+        <w:jc w:val="center"/>
+        <w:rPr>
+          <w:b/>
+          <w:bCs/>
+        </w:rPr>
+      </w:pPr>
+    </w:p>
+    <w:p>
+      <w:pPr>
+        <w:jc w:val="center"/>
+        <w:rPr>
+          <w:b/>
+          <w:bCs/>
+        </w:rPr>
+      </w:pPr>
+      <w:r>
+        <w:rPr>
+          <w:b/>
+          <w:bCs/>
+        </w:rPr>
+        <w:t>GENERAL KUBERNETES KNOWLEDGE</w:t>
+      </w:r>
+    </w:p>
+    <w:p>
+      <w:pPr>
+        <w:rPr>
+          <w:b/>
+          <w:bCs/>
+        </w:rPr>
+      </w:pPr>
+    </w:p>
+    <w:p>
+      <w:r>
+        <w:t>kubectl api-resources -o wide</w:t>
+      </w:r>
+      <w:r>
+        <w:t xml:space="preserve"> : shows all resources of Kubernetes. Helps to find the apiversion.  </w:t>
+      </w:r>
+    </w:p>
+    <w:p>
+      <w:r>
+        <w:t>When you run kubectl get all, the resources that should be included in the “</w:t>
+      </w:r>
+      <w:r>
+        <w:rPr>
+          <w:b/>
+          <w:bCs/>
+        </w:rPr>
+        <w:t>all</w:t>
+      </w:r>
+      <w:r>
+        <w:t>” can be seen in the output of “</w:t>
+      </w:r>
+      <w:r>
+        <w:t>kubectl api-resources -o wide</w:t>
+      </w:r>
+      <w:r>
+        <w:t xml:space="preserve">” command, under the </w:t>
+      </w:r>
+      <w:r>
+        <w:rPr>
+          <w:b/>
+          <w:bCs/>
+        </w:rPr>
+        <w:t>CATEGORIES</w:t>
+      </w:r>
       <w:r>
         <w:t xml:space="preserve"> </w:t>
       </w:r>
       <w:r>
-        <w:t xml:space="preserve">get pods </w:t>
-      </w:r>
-      <w:r>
-        <w:rPr>
-          <w:b/>
-          <w:bCs/>
-        </w:rPr>
-        <w:t>--show-labels</w:t>
+        <w:t>columns</w:t>
       </w:r>
     </w:p>
     <w:p/>
     <w:p>
-      <w:pPr>
-        <w:jc w:val="center"/>
-        <w:rPr>
-          <w:b/>
-          <w:bCs/>
-        </w:rPr>
-      </w:pPr>
-    </w:p>
-    <w:p>
-      <w:pPr>
-        <w:jc w:val="center"/>
-        <w:rPr>
-          <w:b/>
-          <w:bCs/>
-        </w:rPr>
-      </w:pPr>
-    </w:p>
-    <w:p>
-      <w:pPr>
-        <w:jc w:val="center"/>
-        <w:rPr>
-          <w:b/>
-          <w:bCs/>
-        </w:rPr>
-      </w:pPr>
-      <w:r>
-        <w:rPr>
-          <w:b/>
-          <w:bCs/>
-        </w:rPr>
-        <w:t>GENERAL KUBERNETES KNOWLEDGE</w:t>
-      </w:r>
-    </w:p>
-    <w:p>
-      <w:pPr>
-        <w:rPr>
-          <w:b/>
-          <w:bCs/>
-        </w:rPr>
-      </w:pPr>
-    </w:p>
-    <w:p>
-      <w:proofErr w:type="spellStart"/>
-      <w:r>
-        <w:t>kubectl</w:t>
-      </w:r>
-      <w:proofErr w:type="spellEnd"/>
-      <w:r>
-        <w:t xml:space="preserve"> </w:t>
-      </w:r>
-      <w:proofErr w:type="spellStart"/>
-      <w:r>
-        <w:t>api</w:t>
-      </w:r>
-      <w:proofErr w:type="spellEnd"/>
-      <w:r>
-        <w:t xml:space="preserve">-resources -o </w:t>
-      </w:r>
-      <w:proofErr w:type="gramStart"/>
-      <w:r>
-        <w:t>wide</w:t>
-      </w:r>
-      <w:r>
-        <w:t xml:space="preserve"> :</w:t>
-      </w:r>
-      <w:proofErr w:type="gramEnd"/>
-      <w:r>
-        <w:t xml:space="preserve"> shows all resources of Kubernetes. Helps to find the </w:t>
-      </w:r>
-      <w:proofErr w:type="spellStart"/>
-      <w:r>
-        <w:t>apiversion</w:t>
-      </w:r>
-      <w:proofErr w:type="spellEnd"/>
-      <w:r>
-        <w:t xml:space="preserve">.  </w:t>
-      </w:r>
-    </w:p>
-    <w:p>
-      <w:r>
-        <w:t xml:space="preserve">When you run </w:t>
-      </w:r>
-      <w:proofErr w:type="spellStart"/>
-      <w:r>
-        <w:t>kubectl</w:t>
-      </w:r>
-      <w:proofErr w:type="spellEnd"/>
-      <w:r>
-        <w:t xml:space="preserve"> get all, the resources that should be included in the “</w:t>
-      </w:r>
-      <w:r>
-        <w:rPr>
-          <w:b/>
-          <w:bCs/>
-        </w:rPr>
-        <w:t>all</w:t>
-      </w:r>
-      <w:r>
-        <w:t>” can be seen in the output of “</w:t>
-      </w:r>
-      <w:proofErr w:type="spellStart"/>
-      <w:r>
-        <w:t>kubectl</w:t>
-      </w:r>
-      <w:proofErr w:type="spellEnd"/>
-      <w:r>
-        <w:t xml:space="preserve"> </w:t>
-      </w:r>
-      <w:proofErr w:type="spellStart"/>
-      <w:r>
-        <w:t>api</w:t>
-      </w:r>
-      <w:proofErr w:type="spellEnd"/>
-      <w:r>
-        <w:t>-resources -o wide</w:t>
-      </w:r>
-      <w:r>
-        <w:t xml:space="preserve">” command, under the </w:t>
-      </w:r>
-      <w:r>
-        <w:rPr>
-          <w:b/>
-          <w:bCs/>
-        </w:rPr>
-        <w:t>CATEGORIES</w:t>
-      </w:r>
-      <w:r>
-        <w:t xml:space="preserve"> </w:t>
-      </w:r>
-      <w:r>
-        <w:t>columns</w:t>
+      <w:r>
+        <w:t>The cluster-info CA certificate in kube-public acts just like the trusted root certificates in your web browser, allowing new clients to safely verify the identity of the Kubernetes API server during a secure TLS connection.</w:t>
       </w:r>
     </w:p>
     <w:p/>
     <w:p>
-      <w:r>
-        <w:t xml:space="preserve">The cluster-info CA certificate in </w:t>
-      </w:r>
-      <w:proofErr w:type="spellStart"/>
-      <w:r>
-        <w:t>kube</w:t>
-      </w:r>
-      <w:proofErr w:type="spellEnd"/>
-      <w:r>
-        <w:t>-public acts just like the trusted root certificates in your web browser, allowing new clients to safely verify the identity of the Kubernetes API server during a secure TLS connection.</w:t>
+      <w:pPr>
+        <w:rPr>
+          <w:b/>
+          <w:bCs/>
+        </w:rPr>
+      </w:pPr>
+      <w:r>
+        <w:rPr>
+          <w:b/>
+          <w:bCs/>
+        </w:rPr>
+        <w:t>Service Dependency</w:t>
+      </w:r>
+    </w:p>
+    <w:p>
+      <w:r>
+        <w:t>kubectl apply -f folder/ does not guarantee resource creation order.</w:t>
+      </w:r>
+    </w:p>
+    <w:p>
+      <w:r>
+        <w:t>A Pod may start before its required Service exists.</w:t>
+      </w:r>
+    </w:p>
+    <w:p>
+      <w:r>
+        <w:t>The application should retry the connection until the Service is available.</w:t>
+      </w:r>
+    </w:p>
+    <w:p>
+      <w:r>
+        <w:t>Readiness probes prevent traffic from reaching the Pod until the application is ready.</w:t>
       </w:r>
     </w:p>
     <w:p/>
     <w:p>
-      <w:pPr>
-        <w:rPr>
-          <w:b/>
-          <w:bCs/>
-        </w:rPr>
-      </w:pPr>
-      <w:r>
-        <w:rPr>
-          <w:b/>
-          <w:bCs/>
-        </w:rPr>
-        <w:t>Service Dependency</w:t>
-      </w:r>
-    </w:p>
-    <w:p>
-      <w:proofErr w:type="spellStart"/>
-      <w:r>
-        <w:t>kubectl</w:t>
-      </w:r>
-      <w:proofErr w:type="spellEnd"/>
-      <w:r>
-        <w:t xml:space="preserve"> apply -f folder/ does not guarantee resource creation order.</w:t>
-      </w:r>
-    </w:p>
-    <w:p>
-      <w:r>
-        <w:t>A Pod may start before its required Service exists.</w:t>
-      </w:r>
-    </w:p>
-    <w:p>
-      <w:r>
-        <w:t>The application should retry the connection until the Service is available.</w:t>
-      </w:r>
-    </w:p>
-    <w:p>
-      <w:r>
-        <w:t>Readiness probes prevent traffic from reaching the Pod until the application is ready.</w:t>
+      <w:r>
+        <w:t xml:space="preserve">Remember: Kubernetes doesn't manage dependency order; the application handles </w:t>
+      </w:r>
+      <w:r>
+        <w:t>retry</w:t>
+      </w:r>
+      <w:r>
+        <w:t>.</w:t>
+      </w:r>
+    </w:p>
+    <w:p>
+      <w:r>
+        <w:t>When PID 1 exits, the container runtime records its exit code, and kubelet uses that result along with the restartPolicy to decide whether to restart the container.</w:t>
       </w:r>
     </w:p>
     <w:p/>
     <w:p>
       <w:r>
-        <w:t xml:space="preserve">Remember: Kubernetes doesn't manage dependency order; the application handles </w:t>
-      </w:r>
-      <w:r>
-        <w:t>retry</w:t>
-      </w:r>
-      <w:r>
-        <w:t>.</w:t>
-      </w:r>
-    </w:p>
-    <w:p>
-      <w:r>
-        <w:lastRenderedPageBreak/>
-        <w:t xml:space="preserve">When PID 1 exits, the container runtime records its exit code, and </w:t>
-      </w:r>
-      <w:proofErr w:type="spellStart"/>
-      <w:r>
-        <w:t>kubelet</w:t>
-      </w:r>
-      <w:proofErr w:type="spellEnd"/>
-      <w:r>
-        <w:t xml:space="preserve"> uses that result along with the </w:t>
-      </w:r>
-      <w:proofErr w:type="spellStart"/>
-      <w:r>
-        <w:t>restartPolicy</w:t>
-      </w:r>
-      <w:proofErr w:type="spellEnd"/>
-      <w:r>
-        <w:t xml:space="preserve"> to decide whether to restart the container.</w:t>
-      </w:r>
-    </w:p>
-    <w:p/>
-    <w:p>
-      <w:r>
-        <w:t xml:space="preserve">Kubernetes stores the last applied configuration in the same live object configuration in </w:t>
-      </w:r>
-      <w:proofErr w:type="spellStart"/>
-      <w:r>
-        <w:t>etcd</w:t>
-      </w:r>
-      <w:proofErr w:type="spellEnd"/>
-      <w:r>
-        <w:t xml:space="preserve">. It uses this and the actual </w:t>
-      </w:r>
-      <w:proofErr w:type="spellStart"/>
-      <w:r>
-        <w:t>yaml</w:t>
-      </w:r>
-      <w:proofErr w:type="spellEnd"/>
-      <w:r>
-        <w:t xml:space="preserve"> to decide how modifications need to be performed when using </w:t>
-      </w:r>
-      <w:proofErr w:type="spellStart"/>
-      <w:r>
-        <w:t>kubectl</w:t>
-      </w:r>
-      <w:proofErr w:type="spellEnd"/>
-      <w:r>
-        <w:t xml:space="preserve"> apply command</w:t>
+        <w:t>Kubernetes stores the last applied configuration in the same live object configuration in etcd. It uses this and the actual yaml to decide how modifications need to be performed when using kubectl apply command</w:t>
       </w:r>
       <w:r>
         <w:t>s</w:t>
@@ -1102,15 +841,7 @@
     <w:p/>
     <w:p>
       <w:r>
-        <w:t xml:space="preserve">You can manually schedule a pod using the </w:t>
-      </w:r>
-      <w:proofErr w:type="spellStart"/>
-      <w:r>
-        <w:t>nodeName</w:t>
-      </w:r>
-      <w:proofErr w:type="spellEnd"/>
-      <w:r>
-        <w:t xml:space="preserve"> property. It can be used</w:t>
+        <w:t>You can manually schedule a pod using the nodeName property. It can be used</w:t>
       </w:r>
       <w:r>
         <w:t xml:space="preserve"> in situations where s</w:t>
@@ -1121,32 +852,15 @@
     </w:p>
     <w:p/>
     <w:p>
-      <w:proofErr w:type="spellStart"/>
-      <w:r>
-        <w:rPr>
-          <w:b/>
-          <w:bCs/>
-        </w:rPr>
-        <w:t>PriorityClass</w:t>
-      </w:r>
-      <w:proofErr w:type="spellEnd"/>
-      <w:r>
-        <w:rPr>
-          <w:b/>
-          <w:bCs/>
-        </w:rPr>
-        <w:t>:</w:t>
-      </w:r>
-      <w:r>
-        <w:t xml:space="preserve"> A Kubernetes object that defines the priority of Pods. Higher-priority Pods are scheduled before lower-priority Pods and can </w:t>
-      </w:r>
-      <w:proofErr w:type="spellStart"/>
-      <w:r>
-        <w:t>preempt</w:t>
-      </w:r>
-      <w:proofErr w:type="spellEnd"/>
-      <w:r>
-        <w:t xml:space="preserve"> (evict) lower-priority Pods when resources are insufficient.</w:t>
+      <w:r>
+        <w:rPr>
+          <w:b/>
+          <w:bCs/>
+        </w:rPr>
+        <w:t>PriorityClass:</w:t>
+      </w:r>
+      <w:r>
+        <w:t xml:space="preserve"> A Kubernetes object that defines the priority of Pods. Higher-priority Pods are scheduled before lower-priority Pods and can preempt (evict) lower-priority Pods when resources are insufficient.</w:t>
       </w:r>
     </w:p>
     <w:p>
@@ -1171,15 +885,7 @@
         <w:t>-</w:t>
       </w:r>
       <w:r>
-        <w:t xml:space="preserve"> Pod has higher priority → scheduled first and can </w:t>
-      </w:r>
-      <w:proofErr w:type="spellStart"/>
-      <w:r>
-        <w:t>preempt</w:t>
-      </w:r>
-      <w:proofErr w:type="spellEnd"/>
-      <w:r>
-        <w:t xml:space="preserve"> lower-priority Pods. </w:t>
+        <w:t xml:space="preserve"> Pod has higher priority → scheduled first and can preempt lower-priority Pods. </w:t>
       </w:r>
     </w:p>
     <w:p>
@@ -1204,15 +910,7 @@
         <w:t>-</w:t>
       </w:r>
       <w:r>
-        <w:t xml:space="preserve"> Pod has lower priority → scheduled later and can be </w:t>
-      </w:r>
-      <w:proofErr w:type="spellStart"/>
-      <w:r>
-        <w:t>preempted</w:t>
-      </w:r>
-      <w:proofErr w:type="spellEnd"/>
-      <w:r>
-        <w:t xml:space="preserve"> by higher-priority Pods.</w:t>
+        <w:t xml:space="preserve"> Pod has lower priority → scheduled later and can be preempted by higher-priority Pods.</w:t>
       </w:r>
     </w:p>
     <w:p>
@@ -1242,49 +940,24 @@
           <w:numId w:val="4"/>
         </w:numPr>
       </w:pPr>
-      <w:proofErr w:type="spellStart"/>
-      <w:r>
-        <w:t>preemptionPolicy</w:t>
-      </w:r>
-      <w:proofErr w:type="spellEnd"/>
-      <w:r>
-        <w:t xml:space="preserve">: </w:t>
-      </w:r>
-      <w:proofErr w:type="spellStart"/>
-      <w:proofErr w:type="gramStart"/>
-      <w:r>
-        <w:t>PreemptLowerPriority</w:t>
-      </w:r>
-      <w:proofErr w:type="spellEnd"/>
-      <w:r>
-        <w:t xml:space="preserve">  or</w:t>
-      </w:r>
-      <w:proofErr w:type="gramEnd"/>
-      <w:r>
-        <w:t xml:space="preserve"> </w:t>
-      </w:r>
-      <w:proofErr w:type="spellStart"/>
-      <w:r>
-        <w:t>preemptionPolicy</w:t>
-      </w:r>
-      <w:proofErr w:type="spellEnd"/>
-      <w:r>
-        <w:t>: Never</w:t>
+      <w:r>
+        <w:t>preemptionPolicy: PreemptLowerPriority</w:t>
+      </w:r>
+      <w:r>
+        <w:t xml:space="preserve">  or </w:t>
+      </w:r>
+      <w:r>
+        <w:t>preemptionPolicy: Never</w:t>
       </w:r>
       <w:r>
         <w:t>s</w:t>
       </w:r>
     </w:p>
     <w:p>
-      <w:proofErr w:type="spellStart"/>
-      <w:r>
-        <w:t>kubectl</w:t>
-      </w:r>
-      <w:proofErr w:type="spellEnd"/>
-      <w:r>
-        <w:t xml:space="preserve"> logs commands only displays the applications </w:t>
-      </w:r>
-      <w:proofErr w:type="spellStart"/>
+      <w:r>
+        <w:lastRenderedPageBreak/>
+        <w:t xml:space="preserve">kubectl logs commands only displays the applications </w:t>
+      </w:r>
       <w:r>
         <w:rPr>
           <w:b/>
@@ -1292,7 +965,6 @@
         </w:rPr>
         <w:t>stdout</w:t>
       </w:r>
-      <w:proofErr w:type="spellEnd"/>
       <w:r>
         <w:t xml:space="preserve"> and </w:t>
       </w:r>
@@ -1317,15 +989,7 @@
         <w:t>logs.</w:t>
       </w:r>
       <w:r>
-        <w:t xml:space="preserve"> </w:t>
-      </w:r>
-      <w:proofErr w:type="spellStart"/>
-      <w:r>
-        <w:t>etc</w:t>
-      </w:r>
-      <w:proofErr w:type="spellEnd"/>
-      <w:r>
-        <w:t xml:space="preserve"> those stored in /var/</w:t>
+        <w:t xml:space="preserve"> etc those stored in /var/</w:t>
       </w:r>
       <w:r>
         <w:t>…</w:t>
@@ -1358,26 +1022,177 @@
     </w:p>
     <w:p>
       <w:r>
-        <w:t xml:space="preserve">Eg: </w:t>
-      </w:r>
-      <w:proofErr w:type="gramStart"/>
-      <w:r>
-        <w:t>“</w:t>
-      </w:r>
-      <w:r>
-        <w:t xml:space="preserve"> my</w:t>
-      </w:r>
-      <w:proofErr w:type="gramEnd"/>
-      <w:r>
-        <w:t xml:space="preserve">-scheduler, my-scheduler-my-scheduler   Successfully assigned default/nginx to </w:t>
-      </w:r>
-      <w:proofErr w:type="spellStart"/>
-      <w:r>
-        <w:t>controlplan</w:t>
-      </w:r>
-      <w:proofErr w:type="spellEnd"/>
+        <w:t>Eg: “</w:t>
+      </w:r>
+      <w:r>
+        <w:t xml:space="preserve"> my-scheduler, my-scheduler-my-scheduler   Successfully assigned default/nginx to controlplan</w:t>
+      </w:r>
       <w:r>
         <w:t>”</w:t>
+      </w:r>
+    </w:p>
+    <w:p/>
+    <w:p>
+      <w:pPr>
+        <w:rPr>
+          <w:b/>
+          <w:bCs/>
+        </w:rPr>
+      </w:pPr>
+      <w:r>
+        <w:rPr>
+          <w:b/>
+          <w:bCs/>
+        </w:rPr>
+        <w:t>Kubernetes scheduling Stages</w:t>
+      </w:r>
+    </w:p>
+    <w:p>
+      <w:r>
+        <w:t xml:space="preserve">Kubernetes scheduling involves the scheduler selecting a suitable node for a Pod. The main stages are </w:t>
+      </w:r>
+      <w:r>
+        <w:rPr>
+          <w:b/>
+          <w:bCs/>
+        </w:rPr>
+        <w:t>Queue → Filter → Score → Bind</w:t>
+      </w:r>
+      <w:r>
+        <w:t>. Queue selects a pending Pod, Filter eliminates nodes where the Pod cannot run, Score ranks the remaining nodes, and Bind assigns the Pod to the selected node. The scheduler records the selected node in the Pod object's spec.nodeName field. The kubelet on that node then starts the Pod.</w:t>
+      </w:r>
+    </w:p>
+    <w:p/>
+    <w:p>
+      <w:r>
+        <w:rPr>
+          <w:b/>
+          <w:bCs/>
+        </w:rPr>
+        <w:t>Scheduler profiles</w:t>
+      </w:r>
+    </w:p>
+    <w:p>
+      <w:r>
+        <w:rPr>
+          <w:b/>
+          <w:bCs/>
+        </w:rPr>
+        <w:t>Scheduler profiles</w:t>
+      </w:r>
+      <w:r>
+        <w:t xml:space="preserve"> are different configurations of the same kube-scheduler. Each profile can have its own </w:t>
+      </w:r>
+      <w:r>
+        <w:rPr>
+          <w:b/>
+          <w:bCs/>
+        </w:rPr>
+        <w:t>scheduler plugins</w:t>
+      </w:r>
+      <w:r>
+        <w:t xml:space="preserve"> enabled, disabled, or configured. A Pod selects a profile using spec.schedulerName. Plugins implement scheduling logic at stages such as </w:t>
+      </w:r>
+      <w:r>
+        <w:rPr>
+          <w:b/>
+          <w:bCs/>
+        </w:rPr>
+        <w:t>Filter</w:t>
+      </w:r>
+      <w:r>
+        <w:t xml:space="preserve"> and </w:t>
+      </w:r>
+      <w:r>
+        <w:rPr>
+          <w:b/>
+          <w:bCs/>
+        </w:rPr>
+        <w:t>Score</w:t>
+      </w:r>
+      <w:r>
+        <w:t>. This allows different Pods to use different scheduling behavior.</w:t>
+      </w:r>
+    </w:p>
+    <w:p/>
+    <w:p>
+      <w:r>
+        <w:rPr>
+          <w:b/>
+          <w:bCs/>
+        </w:rPr>
+        <w:t>Admission Controller</w:t>
+      </w:r>
+      <w:r>
+        <w:rPr>
+          <w:b/>
+          <w:bCs/>
+        </w:rPr>
+        <w:t>:</w:t>
+      </w:r>
+      <w:r>
+        <w:rPr>
+          <w:b/>
+          <w:bCs/>
+        </w:rPr>
+        <w:t>s</w:t>
+      </w:r>
+    </w:p>
+    <w:p>
+      <w:r>
+        <w:t xml:space="preserve">An </w:t>
+      </w:r>
+      <w:r>
+        <w:rPr>
+          <w:b/>
+          <w:bCs/>
+        </w:rPr>
+        <w:t>Admission Controller</w:t>
+      </w:r>
+      <w:r>
+        <w:t xml:space="preserve"> intercepts API requests after authentication and authorization but before the object is stored in etcd. It can </w:t>
+      </w:r>
+      <w:r>
+        <w:rPr>
+          <w:b/>
+          <w:bCs/>
+        </w:rPr>
+        <w:t>validate, modify, or reject</w:t>
+      </w:r>
+      <w:r>
+        <w:t xml:space="preserve"> requests. Admission controllers are used to enforce cluster-wide policies such as requiring security settings, labels, resource limits, or approved container images. </w:t>
+      </w:r>
+      <w:r>
+        <w:rPr>
+          <w:b/>
+          <w:bCs/>
+        </w:rPr>
+        <w:t>Real-world use case:</w:t>
+      </w:r>
+      <w:r>
+        <w:t xml:space="preserve"> a company can use an admission controller to reject Pods that use images from untrusted registries and allow only images from its approved private registry.</w:t>
+      </w:r>
+    </w:p>
+    <w:p>
+      <w:r>
+        <w:rPr>
+          <w:b/>
+          <w:bCs/>
+        </w:rPr>
+        <w:t>How Kubernetes determine to allow or deny:</w:t>
+      </w:r>
+      <w:r>
+        <w:rPr>
+          <w:b/>
+          <w:bCs/>
+        </w:rPr>
+        <w:t>s</w:t>
+      </w:r>
+    </w:p>
+    <w:p>
+      <w:r>
+        <w:lastRenderedPageBreak/>
+        <w:t>The ImagePolicyWebhook sends information about the requested container image to an external webhook. The webhook performs its own policy logic and then returns an ImageReview response. Kubernetes does not care how the webhook makes its decision; it expects the decision in the status.allowed field. status.allowed: true allows the image, while status.allowed: false rejects it.</w:t>
       </w:r>
     </w:p>
     <w:p/>
@@ -1401,15 +1216,7 @@
     <w:p/>
     <w:p>
       <w:r>
-        <w:t xml:space="preserve">To delete all pods together: </w:t>
-      </w:r>
-      <w:proofErr w:type="spellStart"/>
-      <w:r>
-        <w:t>kubectl</w:t>
-      </w:r>
-      <w:proofErr w:type="spellEnd"/>
-      <w:r>
-        <w:t xml:space="preserve"> delete pods –all</w:t>
+        <w:t>To delete all pods together: kubectl delete pods –all</w:t>
       </w:r>
     </w:p>
     <w:p>
@@ -1420,27 +1227,17 @@
         <w:t>resources</w:t>
       </w:r>
       <w:r>
-        <w:t xml:space="preserve">: </w:t>
-      </w:r>
-      <w:proofErr w:type="spellStart"/>
-      <w:r>
-        <w:t>kubectl</w:t>
-      </w:r>
-      <w:proofErr w:type="spellEnd"/>
-      <w:r>
-        <w:t xml:space="preserve"> delete pods --all -n &lt;namespace-name&gt;</w:t>
+        <w:t>: kubectl delete pods --all -n &lt;namespace-name&gt;</w:t>
       </w:r>
     </w:p>
     <w:p/>
     <w:p>
-      <w:proofErr w:type="spellStart"/>
       <w:r>
         <w:t>k</w:t>
       </w:r>
       <w:r>
         <w:t>ubectl</w:t>
       </w:r>
-      <w:proofErr w:type="spellEnd"/>
       <w:r>
         <w:t xml:space="preserve"> get pods --show-</w:t>
       </w:r>
@@ -1459,102 +1256,32 @@
     </w:p>
     <w:p/>
     <w:p>
-      <w:proofErr w:type="spellStart"/>
       <w:r>
         <w:t>ku</w:t>
       </w:r>
       <w:r>
-        <w:t>bectl</w:t>
-      </w:r>
-      <w:proofErr w:type="spellEnd"/>
-      <w:r>
-        <w:t xml:space="preserve"> apply -f </w:t>
-      </w:r>
-      <w:proofErr w:type="spellStart"/>
-      <w:proofErr w:type="gramStart"/>
-      <w:r>
-        <w:t>file.yaml</w:t>
-      </w:r>
-      <w:proofErr w:type="spellEnd"/>
-      <w:proofErr w:type="gramEnd"/>
-      <w:r>
-        <w:t xml:space="preserve"> → Creates the resource if it doesn't exist, or updates it if it already exists. </w:t>
-      </w:r>
-    </w:p>
-    <w:p>
-      <w:proofErr w:type="spellStart"/>
-      <w:r>
-        <w:t>kubectl</w:t>
-      </w:r>
-      <w:proofErr w:type="spellEnd"/>
-      <w:r>
-        <w:t xml:space="preserve"> replace -f </w:t>
-      </w:r>
-      <w:proofErr w:type="spellStart"/>
-      <w:proofErr w:type="gramStart"/>
-      <w:r>
-        <w:t>file.yaml</w:t>
-      </w:r>
-      <w:proofErr w:type="spellEnd"/>
-      <w:proofErr w:type="gramEnd"/>
-      <w:r>
-        <w:t xml:space="preserve"> → Replaces an existing resource. It fails if the resource doesn't exist.</w:t>
+        <w:t xml:space="preserve">bectl apply -f file.yaml → Creates the resource if it doesn't exist, or updates it if it already exists. </w:t>
+      </w:r>
+    </w:p>
+    <w:p>
+      <w:r>
+        <w:t>kubectl replace -f file.yaml → Replaces an existing resource. It fails if the resource doesn't exist.</w:t>
       </w:r>
     </w:p>
     <w:p/>
     <w:p>
       <w:r>
-        <w:t xml:space="preserve">You can use the </w:t>
-      </w:r>
-      <w:proofErr w:type="spellStart"/>
-      <w:r>
-        <w:t>kubectl</w:t>
-      </w:r>
-      <w:proofErr w:type="spellEnd"/>
-      <w:r>
-        <w:t xml:space="preserve"> explain to learn more about different resources.</w:t>
-      </w:r>
-    </w:p>
-    <w:p>
-      <w:r>
-        <w:t xml:space="preserve">Eg: </w:t>
-      </w:r>
-      <w:proofErr w:type="spellStart"/>
-      <w:r>
-        <w:t>kubectl</w:t>
-      </w:r>
-      <w:proofErr w:type="spellEnd"/>
-      <w:r>
-        <w:t xml:space="preserve"> explain pod, </w:t>
-      </w:r>
-      <w:proofErr w:type="spellStart"/>
-      <w:r>
-        <w:t>kubectl</w:t>
-      </w:r>
-      <w:proofErr w:type="spellEnd"/>
-      <w:r>
-        <w:t xml:space="preserve"> explain </w:t>
-      </w:r>
-      <w:proofErr w:type="spellStart"/>
-      <w:r>
-        <w:t>pod.spec</w:t>
-      </w:r>
-      <w:proofErr w:type="spellEnd"/>
-      <w:r>
-        <w:t>.</w:t>
-      </w:r>
-    </w:p>
-    <w:p>
-      <w:r>
-        <w:t xml:space="preserve">You can </w:t>
-      </w:r>
-      <w:proofErr w:type="gramStart"/>
-      <w:r>
-        <w:t>use  --</w:t>
-      </w:r>
-      <w:proofErr w:type="gramEnd"/>
-      <w:r>
-        <w:t xml:space="preserve">recursive flag to display all the applicable fields that are part of </w:t>
+        <w:t>You can use the kubectl explain to learn more about different resources.</w:t>
+      </w:r>
+    </w:p>
+    <w:p>
+      <w:r>
+        <w:t>Eg: kubectl explain pod, kubectl explain pod.spec.</w:t>
+      </w:r>
+    </w:p>
+    <w:p>
+      <w:r>
+        <w:t xml:space="preserve">You can use  --recursive flag to display all the applicable fields that are part of </w:t>
       </w:r>
       <w:r>
         <w:t>those resources</w:t>
@@ -1565,34 +1292,29 @@
     </w:p>
     <w:p>
       <w:r>
-        <w:t xml:space="preserve">Eg: </w:t>
-      </w:r>
-      <w:proofErr w:type="spellStart"/>
-      <w:r>
-        <w:t>kubectl</w:t>
-      </w:r>
-      <w:proofErr w:type="spellEnd"/>
-      <w:r>
-        <w:t xml:space="preserve"> explain </w:t>
-      </w:r>
-      <w:proofErr w:type="spellStart"/>
-      <w:proofErr w:type="gramStart"/>
-      <w:r>
-        <w:t>pod.spec</w:t>
-      </w:r>
-      <w:proofErr w:type="spellEnd"/>
-      <w:proofErr w:type="gramEnd"/>
-      <w:r>
-        <w:t xml:space="preserve"> --</w:t>
-      </w:r>
-      <w:proofErr w:type="spellStart"/>
+        <w:t xml:space="preserve">Eg: kubectl explain pod.spec </w:t>
+      </w:r>
+      <w:r>
+        <w:t>–</w:t>
+      </w:r>
       <w:r>
         <w:t>recusrsive</w:t>
       </w:r>
       <w:r>
         <w:t>s</w:t>
       </w:r>
-      <w:proofErr w:type="spellEnd"/>
+    </w:p>
+    <w:p/>
+    <w:p>
+      <w:r>
+        <w:t>s</w:t>
+      </w:r>
+      <w:r>
+        <w:t xml:space="preserve">To log in to a multi container pod:  </w:t>
+      </w:r>
+      <w:r>
+        <w:t>kubectl exec -it &lt;pod-name&gt; -c &lt;container-name&gt; -- /bin/sh</w:t>
+      </w:r>
     </w:p>
     <w:sectPr>
       <w:pgSz w:w="12240" w:h="15840"/>

</xml_diff>

<commit_message>
Learned Deployment and rollback strategies, kubernetes command and args
</commit_message>
<xml_diff>
--- a/9-Interesting_learning_Notes/Learning_Notes.docx
+++ b/9-Interesting_learning_Notes/Learning_Notes.docx
@@ -118,6 +118,7 @@
       <w:r>
         <w:t xml:space="preserve">, Kubernetes assigns it a </w:t>
       </w:r>
+      <w:proofErr w:type="spellStart"/>
       <w:r>
         <w:rPr>
           <w:b/>
@@ -125,6 +126,7 @@
         </w:rPr>
         <w:t>ClusterIP</w:t>
       </w:r>
+      <w:proofErr w:type="spellEnd"/>
       <w:r>
         <w:t xml:space="preserve">. </w:t>
       </w:r>
@@ -178,12 +180,21 @@
           <w:numId w:val="2"/>
         </w:numPr>
       </w:pPr>
-      <w:r>
-        <w:rPr>
-          <w:b/>
-          <w:bCs/>
-        </w:rPr>
-        <w:t>kube-proxy does not assign the Service IP.</w:t>
+      <w:proofErr w:type="spellStart"/>
+      <w:r>
+        <w:rPr>
+          <w:b/>
+          <w:bCs/>
+        </w:rPr>
+        <w:t>kube</w:t>
+      </w:r>
+      <w:proofErr w:type="spellEnd"/>
+      <w:r>
+        <w:rPr>
+          <w:b/>
+          <w:bCs/>
+        </w:rPr>
+        <w:t>-proxy does not assign the Service IP.</w:t>
       </w:r>
       <w:r>
         <w:t xml:space="preserve"> </w:t>
@@ -196,8 +207,13 @@
           <w:numId w:val="2"/>
         </w:numPr>
       </w:pPr>
-      <w:r>
-        <w:t xml:space="preserve">kube-proxy watches Services and creates </w:t>
+      <w:proofErr w:type="spellStart"/>
+      <w:r>
+        <w:t>kube</w:t>
+      </w:r>
+      <w:proofErr w:type="spellEnd"/>
+      <w:r>
+        <w:t xml:space="preserve">-proxy watches Services and creates </w:t>
       </w:r>
       <w:r>
         <w:rPr>
@@ -207,7 +223,15 @@
         <w:t>networking rules</w:t>
       </w:r>
       <w:r>
-        <w:t xml:space="preserve"> (iptables/IPVS/nftables) to route traffic from the Service IP to the backend Pod IPs.</w:t>
+        <w:t xml:space="preserve"> (iptables/IPVS/</w:t>
+      </w:r>
+      <w:proofErr w:type="spellStart"/>
+      <w:r>
+        <w:t>nftables</w:t>
+      </w:r>
+      <w:proofErr w:type="spellEnd"/>
+      <w:r>
+        <w:t>) to route traffic from the Service IP to the backend Pod IPs.</w:t>
       </w:r>
     </w:p>
     <w:p>
@@ -238,12 +262,21 @@
           <w:numId w:val="2"/>
         </w:numPr>
       </w:pPr>
-      <w:r>
-        <w:rPr>
-          <w:b/>
-          <w:bCs/>
-        </w:rPr>
-        <w:t>kube-proxy</w:t>
+      <w:proofErr w:type="spellStart"/>
+      <w:r>
+        <w:rPr>
+          <w:b/>
+          <w:bCs/>
+        </w:rPr>
+        <w:t>kube</w:t>
+      </w:r>
+      <w:proofErr w:type="spellEnd"/>
+      <w:r>
+        <w:rPr>
+          <w:b/>
+          <w:bCs/>
+        </w:rPr>
+        <w:t>-proxy</w:t>
       </w:r>
       <w:r>
         <w:t xml:space="preserve"> creates networking rules that recognize this virtual IP and forward traffic to the Service's backend Pods.</w:t>
@@ -288,19 +321,40 @@
         <w:t xml:space="preserve">: </w:t>
       </w:r>
       <w:r>
-        <w:t>A Kubernetes NodePort does not create a normal listening socket on the node. Instead, Kuberne</w:t>
+        <w:t xml:space="preserve">A Kubernetes </w:t>
+      </w:r>
+      <w:proofErr w:type="spellStart"/>
+      <w:r>
+        <w:t>NodePort</w:t>
+      </w:r>
+      <w:proofErr w:type="spellEnd"/>
+      <w:r>
+        <w:t xml:space="preserve"> does not create a normal listening socket on the node. Instead, </w:t>
+      </w:r>
+      <w:proofErr w:type="spellStart"/>
+      <w:r>
+        <w:t>Kuberne</w:t>
       </w:r>
       <w:r>
         <w:t>s</w:t>
       </w:r>
       <w:r>
-        <w:t>tes configures networking rules to forward traffic arriving on that port to the Service. Therefore, if a host-level application is already listening on the same port, traffic arriving through that node may be handled by the existing application instead of reaching the Kubernetes Service, depending on the networking implementation and rule processing.</w:t>
+        <w:t>tes</w:t>
+      </w:r>
+      <w:proofErr w:type="spellEnd"/>
+      <w:r>
+        <w:t xml:space="preserve"> configures networking rules to forward traffic arriving on that port to the Service. Therefore, if a host-level application is already listening on the same port, traffic arriving through that node may be handled by the existing application instead of reaching the Kubernetes Service, depending on the networking implementation and rule processing.</w:t>
       </w:r>
     </w:p>
     <w:p/>
     <w:p>
-      <w:r>
-        <w:t>NodePort 30005 does NOT mean:</w:t>
+      <w:proofErr w:type="spellStart"/>
+      <w:r>
+        <w:t>NodePort</w:t>
+      </w:r>
+      <w:proofErr w:type="spellEnd"/>
+      <w:r>
+        <w:t xml:space="preserve"> 30005 does NOT mean:</w:t>
       </w:r>
     </w:p>
     <w:p>
@@ -324,12 +378,21 @@
       <w:r>
         <w:t xml:space="preserve">packet gets </w:t>
       </w:r>
-      <w:r>
-        <w:rPr>
-          <w:b/>
-          <w:bCs/>
-        </w:rPr>
-        <w:t>DNAT'ed/redirected by the Kubernetes networking rules before normal socket delivery</w:t>
+      <w:proofErr w:type="spellStart"/>
+      <w:r>
+        <w:rPr>
+          <w:b/>
+          <w:bCs/>
+        </w:rPr>
+        <w:t>DNAT'ed</w:t>
+      </w:r>
+      <w:proofErr w:type="spellEnd"/>
+      <w:r>
+        <w:rPr>
+          <w:b/>
+          <w:bCs/>
+        </w:rPr>
+        <w:t>/redirected by the Kubernetes networking rules before normal socket delivery</w:t>
       </w:r>
       <w:r>
         <w:t>.</w:t>
@@ -346,13 +409,24 @@
       <w:r>
         <w:t xml:space="preserve">The full DNS to refer a service is: </w:t>
       </w:r>
-      <w:r>
-        <w:rPr>
-          <w:b/>
-          <w:bCs/>
-        </w:rPr>
-        <w:t>myservice.default.svc.cluster.local</w:t>
-      </w:r>
+      <w:proofErr w:type="spellStart"/>
+      <w:proofErr w:type="gramStart"/>
+      <w:r>
+        <w:rPr>
+          <w:b/>
+          <w:bCs/>
+        </w:rPr>
+        <w:t>myservice.default.svc.cluster</w:t>
+      </w:r>
+      <w:proofErr w:type="gramEnd"/>
+      <w:r>
+        <w:rPr>
+          <w:b/>
+          <w:bCs/>
+        </w:rPr>
+        <w:t>.local</w:t>
+      </w:r>
+      <w:proofErr w:type="spellEnd"/>
     </w:p>
     <w:p>
       <w:pPr>
@@ -379,8 +453,42 @@
     </w:p>
     <w:p>
       <w:r>
-        <w:t>The Structure of a Kubernetes Service DNS NameEvery Service gets a full DNS address that looks like this:[service-name].[namespace].svc.cluster.local</w:t>
-      </w:r>
+        <w:t xml:space="preserve">The Structure of a Kubernetes Service DNS </w:t>
+      </w:r>
+      <w:proofErr w:type="spellStart"/>
+      <w:r>
+        <w:t>NameEvery</w:t>
+      </w:r>
+      <w:proofErr w:type="spellEnd"/>
+      <w:r>
+        <w:t xml:space="preserve"> Service gets a full DNS address that looks like </w:t>
+      </w:r>
+      <w:proofErr w:type="gramStart"/>
+      <w:r>
+        <w:t>this:[</w:t>
+      </w:r>
+      <w:proofErr w:type="gramEnd"/>
+      <w:r>
+        <w:t>service-name</w:t>
+      </w:r>
+      <w:proofErr w:type="gramStart"/>
+      <w:r>
+        <w:t>].[</w:t>
+      </w:r>
+      <w:proofErr w:type="gramEnd"/>
+      <w:r>
+        <w:t>namespace].</w:t>
+      </w:r>
+      <w:proofErr w:type="spellStart"/>
+      <w:proofErr w:type="gramStart"/>
+      <w:r>
+        <w:t>svc.cluster</w:t>
+      </w:r>
+      <w:proofErr w:type="gramEnd"/>
+      <w:r>
+        <w:t>.local</w:t>
+      </w:r>
+      <w:proofErr w:type="spellEnd"/>
     </w:p>
     <w:p>
       <w:pPr>
@@ -390,8 +498,18 @@
           <w:numId w:val="3"/>
         </w:numPr>
       </w:pPr>
-      <w:r>
-        <w:t>service-name:The name you gave your Service.</w:t>
+      <w:proofErr w:type="spellStart"/>
+      <w:r>
+        <w:t>service-</w:t>
+      </w:r>
+      <w:proofErr w:type="gramStart"/>
+      <w:r>
+        <w:t>name:The</w:t>
+      </w:r>
+      <w:proofErr w:type="spellEnd"/>
+      <w:proofErr w:type="gramEnd"/>
+      <w:r>
+        <w:t xml:space="preserve"> name you gave your Service.</w:t>
       </w:r>
     </w:p>
     <w:p>
@@ -419,24 +537,128 @@
       </w:r>
     </w:p>
     <w:p>
-      <w:r>
-        <w:t>cluster.local: The default local domain name for your entire cluster.</w:t>
+      <w:proofErr w:type="spellStart"/>
+      <w:proofErr w:type="gramStart"/>
+      <w:r>
+        <w:t>cluster.local</w:t>
+      </w:r>
+      <w:proofErr w:type="spellEnd"/>
+      <w:proofErr w:type="gramEnd"/>
+      <w:r>
+        <w:t>: The default local domain name for your entire cluster.</w:t>
       </w:r>
     </w:p>
     <w:p/>
     <w:p>
       <w:r>
-        <w:t>Scenario A Example: A pod in the "frontend" namespace connects to a database in the same namespace using just "db-service".</w:t>
-      </w:r>
-    </w:p>
-    <w:p>
-      <w:r>
-        <w:t>Scenario B Example: A pod in the "frontend" namespace connects to a database in the "backend" namespace using "db-service.backend".</w:t>
-      </w:r>
-    </w:p>
-    <w:p>
-      <w:r>
-        <w:t>The remaining part of the address—.svc.cluster.local—is called the cluster suffix. It is not mandatory because every container running inside a Kubernetes Pod has a hidden configuration file (/etc/resolv.conf) created automatically by the cluster. it contain all the search list.Because of this search list, if you type just db-service, Kubernetes automatically appends the remaining parts (.svc.cluster.local) behind the scenes and tests them one by one until it finds a match!</w:t>
+        <w:t xml:space="preserve">Scenario </w:t>
+      </w:r>
+      <w:proofErr w:type="gramStart"/>
+      <w:r>
+        <w:t>A</w:t>
+      </w:r>
+      <w:proofErr w:type="gramEnd"/>
+      <w:r>
+        <w:t xml:space="preserve"> Example: A pod in the "frontend" namespace connects to a database in the same namespace using just "</w:t>
+      </w:r>
+      <w:proofErr w:type="spellStart"/>
+      <w:r>
+        <w:t>db</w:t>
+      </w:r>
+      <w:proofErr w:type="spellEnd"/>
+      <w:r>
+        <w:t>-service".</w:t>
+      </w:r>
+    </w:p>
+    <w:p>
+      <w:r>
+        <w:t>Scenario B Example: A pod in the "frontend" namespace connects to a database in the "backend" namespace using "</w:t>
+      </w:r>
+      <w:proofErr w:type="spellStart"/>
+      <w:r>
+        <w:t>db-</w:t>
+      </w:r>
+      <w:proofErr w:type="gramStart"/>
+      <w:r>
+        <w:t>service.backend</w:t>
+      </w:r>
+      <w:proofErr w:type="spellEnd"/>
+      <w:proofErr w:type="gramEnd"/>
+      <w:r>
+        <w:t>".</w:t>
+      </w:r>
+    </w:p>
+    <w:p>
+      <w:r>
+        <w:t>The remaining part of the address—.</w:t>
+      </w:r>
+      <w:proofErr w:type="spellStart"/>
+      <w:proofErr w:type="gramStart"/>
+      <w:r>
+        <w:t>svc.cluster</w:t>
+      </w:r>
+      <w:proofErr w:type="gramEnd"/>
+      <w:r>
+        <w:t>.local</w:t>
+      </w:r>
+      <w:proofErr w:type="spellEnd"/>
+      <w:r>
+        <w:t>—is called the cluster suffix. It is not mandatory because every container running inside a Kubernetes Pod has a hidden configuration file (/</w:t>
+      </w:r>
+      <w:proofErr w:type="spellStart"/>
+      <w:r>
+        <w:t>etc</w:t>
+      </w:r>
+      <w:proofErr w:type="spellEnd"/>
+      <w:r>
+        <w:t>/</w:t>
+      </w:r>
+      <w:proofErr w:type="spellStart"/>
+      <w:r>
+        <w:t>resolv.conf</w:t>
+      </w:r>
+      <w:proofErr w:type="spellEnd"/>
+      <w:r>
+        <w:t xml:space="preserve">) created automatically by the cluster. it </w:t>
+      </w:r>
+      <w:proofErr w:type="gramStart"/>
+      <w:r>
+        <w:t>contain</w:t>
+      </w:r>
+      <w:proofErr w:type="gramEnd"/>
+      <w:r>
+        <w:t xml:space="preserve"> all the search </w:t>
+      </w:r>
+      <w:proofErr w:type="spellStart"/>
+      <w:proofErr w:type="gramStart"/>
+      <w:r>
+        <w:t>list.Because</w:t>
+      </w:r>
+      <w:proofErr w:type="spellEnd"/>
+      <w:proofErr w:type="gramEnd"/>
+      <w:r>
+        <w:t xml:space="preserve"> of this search list, if you type just </w:t>
+      </w:r>
+      <w:proofErr w:type="spellStart"/>
+      <w:r>
+        <w:t>db</w:t>
+      </w:r>
+      <w:proofErr w:type="spellEnd"/>
+      <w:r>
+        <w:t>-service, Kubernetes automatically appends the remaining parts (.</w:t>
+      </w:r>
+      <w:proofErr w:type="spellStart"/>
+      <w:proofErr w:type="gramStart"/>
+      <w:r>
+        <w:t>svc.cluster</w:t>
+      </w:r>
+      <w:proofErr w:type="gramEnd"/>
+      <w:r>
+        <w:t>.local</w:t>
+      </w:r>
+      <w:proofErr w:type="spellEnd"/>
+      <w:r>
+        <w:t>) behind the scenes and tests them one by one until it finds a match!</w:t>
       </w:r>
     </w:p>
     <w:p>
@@ -519,8 +741,13 @@
       <w:r>
         <w:t xml:space="preserve"> </w:t>
       </w:r>
-      <w:r>
-        <w:t xml:space="preserve">kubectl </w:t>
+      <w:proofErr w:type="spellStart"/>
+      <w:r>
+        <w:t>kubectl</w:t>
+      </w:r>
+      <w:proofErr w:type="spellEnd"/>
+      <w:r>
+        <w:t xml:space="preserve"> </w:t>
       </w:r>
       <w:r>
         <w:rPr>
@@ -530,7 +757,15 @@
         <w:t>edit</w:t>
       </w:r>
       <w:r>
-        <w:t xml:space="preserve"> svc my-nodeport-service</w:t>
+        <w:t xml:space="preserve"> svc my-</w:t>
+      </w:r>
+      <w:proofErr w:type="spellStart"/>
+      <w:r>
+        <w:t>nodeport</w:t>
+      </w:r>
+      <w:proofErr w:type="spellEnd"/>
+      <w:r>
+        <w:t>-service</w:t>
       </w:r>
     </w:p>
     <w:p>
@@ -549,11 +784,16 @@
       <w:r>
         <w:t xml:space="preserve"> </w:t>
       </w:r>
+      <w:proofErr w:type="spellStart"/>
       <w:r>
         <w:t>k</w:t>
       </w:r>
       <w:r>
-        <w:t xml:space="preserve">ubectl </w:t>
+        <w:t>ubectl</w:t>
+      </w:r>
+      <w:proofErr w:type="spellEnd"/>
+      <w:r>
+        <w:t xml:space="preserve"> </w:t>
       </w:r>
       <w:r>
         <w:t xml:space="preserve">get pods </w:t>
@@ -596,201 +836,345 @@
     </w:p>
     <w:p>
       <w:r>
-        <w:t>It gets metrics from kubelets, which expose cAdvisor</w:t>
-      </w:r>
+        <w:t xml:space="preserve">It gets metrics from </w:t>
+      </w:r>
+      <w:proofErr w:type="spellStart"/>
+      <w:r>
+        <w:t>kubelets</w:t>
+      </w:r>
+      <w:proofErr w:type="spellEnd"/>
+      <w:r>
+        <w:t xml:space="preserve">, which expose </w:t>
+      </w:r>
+      <w:proofErr w:type="spellStart"/>
+      <w:r>
+        <w:t>cAdvisor</w:t>
+      </w:r>
+      <w:proofErr w:type="spellEnd"/>
+      <w:r>
+        <w:t xml:space="preserve"> derived container metrics.</w:t>
+      </w:r>
+    </w:p>
+    <w:p/>
+    <w:p>
+      <w:proofErr w:type="spellStart"/>
+      <w:r>
+        <w:rPr>
+          <w:b/>
+          <w:bCs/>
+        </w:rPr>
+        <w:t>cAdvisor</w:t>
+      </w:r>
+      <w:proofErr w:type="spellEnd"/>
+      <w:r>
+        <w:t xml:space="preserve"> is part of </w:t>
+      </w:r>
+      <w:proofErr w:type="spellStart"/>
+      <w:r>
+        <w:t>kubelet</w:t>
+      </w:r>
+      <w:proofErr w:type="spellEnd"/>
+      <w:r>
+        <w:t xml:space="preserve"> and collects container resource metrics. Metrics Server collects metrics from </w:t>
+      </w:r>
+      <w:proofErr w:type="spellStart"/>
+      <w:r>
+        <w:t>kubelets</w:t>
+      </w:r>
+      <w:proofErr w:type="spellEnd"/>
+      <w:r>
+        <w:t xml:space="preserve"> and provides them through the Kubernetes Metrics API.</w:t>
+      </w:r>
+    </w:p>
+    <w:p>
+      <w:r>
+        <w:t>Following commands are supported:</w:t>
+      </w:r>
+    </w:p>
+    <w:p>
+      <w:proofErr w:type="spellStart"/>
+      <w:r>
+        <w:t>kubectl</w:t>
+      </w:r>
+      <w:proofErr w:type="spellEnd"/>
+      <w:r>
+        <w:t xml:space="preserve"> top pods</w:t>
+      </w:r>
+    </w:p>
+    <w:p>
+      <w:pPr>
+        <w:rPr>
+          <w:b/>
+          <w:bCs/>
+        </w:rPr>
+      </w:pPr>
       <w:r>
         <w:t xml:space="preserve"> </w:t>
       </w:r>
-      <w:r>
-        <w:t>derived container metrics.</w:t>
+      <w:proofErr w:type="spellStart"/>
+      <w:r>
+        <w:t>kubectl</w:t>
+      </w:r>
+      <w:proofErr w:type="spellEnd"/>
+      <w:r>
+        <w:t xml:space="preserve"> top nodes</w:t>
+      </w:r>
+      <w:r>
+        <w:rPr>
+          <w:b/>
+          <w:bCs/>
+        </w:rPr>
+        <w:tab/>
+      </w:r>
+      <w:r>
+        <w:rPr>
+          <w:b/>
+          <w:bCs/>
+        </w:rPr>
+        <w:tab/>
+      </w:r>
+    </w:p>
+    <w:p>
+      <w:pPr>
+        <w:jc w:val="center"/>
+        <w:rPr>
+          <w:b/>
+          <w:bCs/>
+        </w:rPr>
+      </w:pPr>
+    </w:p>
+    <w:p>
+      <w:pPr>
+        <w:jc w:val="center"/>
+        <w:rPr>
+          <w:b/>
+          <w:bCs/>
+        </w:rPr>
+      </w:pPr>
+      <w:r>
+        <w:rPr>
+          <w:b/>
+          <w:bCs/>
+        </w:rPr>
+        <w:t>GENERAL KUBERNETES KNOWLEDGE</w:t>
+      </w:r>
+    </w:p>
+    <w:p>
+      <w:pPr>
+        <w:rPr>
+          <w:b/>
+          <w:bCs/>
+        </w:rPr>
+      </w:pPr>
+    </w:p>
+    <w:p>
+      <w:proofErr w:type="spellStart"/>
+      <w:r>
+        <w:t>kubectl</w:t>
+      </w:r>
+      <w:proofErr w:type="spellEnd"/>
+      <w:r>
+        <w:t xml:space="preserve"> </w:t>
+      </w:r>
+      <w:proofErr w:type="spellStart"/>
+      <w:r>
+        <w:t>api</w:t>
+      </w:r>
+      <w:proofErr w:type="spellEnd"/>
+      <w:r>
+        <w:t xml:space="preserve">-resources -o </w:t>
+      </w:r>
+      <w:proofErr w:type="gramStart"/>
+      <w:r>
+        <w:t>wide</w:t>
+      </w:r>
+      <w:r>
+        <w:t xml:space="preserve"> :</w:t>
+      </w:r>
+      <w:proofErr w:type="gramEnd"/>
+      <w:r>
+        <w:t xml:space="preserve"> shows all resources of Kubernetes. Helps to find the </w:t>
+      </w:r>
+      <w:proofErr w:type="spellStart"/>
+      <w:r>
+        <w:t>apiversion</w:t>
+      </w:r>
+      <w:proofErr w:type="spellEnd"/>
+      <w:r>
+        <w:t xml:space="preserve">.  </w:t>
+      </w:r>
+    </w:p>
+    <w:p>
+      <w:r>
+        <w:t xml:space="preserve">When you run </w:t>
+      </w:r>
+      <w:proofErr w:type="spellStart"/>
+      <w:r>
+        <w:t>kubectl</w:t>
+      </w:r>
+      <w:proofErr w:type="spellEnd"/>
+      <w:r>
+        <w:t xml:space="preserve"> get all, the resources that should be included in the “</w:t>
+      </w:r>
+      <w:r>
+        <w:rPr>
+          <w:b/>
+          <w:bCs/>
+        </w:rPr>
+        <w:t>all</w:t>
+      </w:r>
+      <w:r>
+        <w:t>” can be seen in the output of “</w:t>
+      </w:r>
+      <w:proofErr w:type="spellStart"/>
+      <w:r>
+        <w:t>kubectl</w:t>
+      </w:r>
+      <w:proofErr w:type="spellEnd"/>
+      <w:r>
+        <w:t xml:space="preserve"> </w:t>
+      </w:r>
+      <w:proofErr w:type="spellStart"/>
+      <w:r>
+        <w:t>api</w:t>
+      </w:r>
+      <w:proofErr w:type="spellEnd"/>
+      <w:r>
+        <w:t>-resources -o wide</w:t>
+      </w:r>
+      <w:r>
+        <w:t xml:space="preserve">” command, under the </w:t>
+      </w:r>
+      <w:r>
+        <w:rPr>
+          <w:b/>
+          <w:bCs/>
+        </w:rPr>
+        <w:t>CATEGORIES</w:t>
+      </w:r>
+      <w:r>
+        <w:t xml:space="preserve"> </w:t>
+      </w:r>
+      <w:r>
+        <w:t>columns</w:t>
       </w:r>
     </w:p>
     <w:p/>
     <w:p>
       <w:r>
-        <w:rPr>
-          <w:b/>
-          <w:bCs/>
-        </w:rPr>
-        <w:t>cAdvisor</w:t>
-      </w:r>
-      <w:r>
-        <w:t xml:space="preserve"> is part of kubelet and collects container resource metrics. Metrics Server collects metrics from kubelets and provides them through the Kubernetes Metrics API.</w:t>
-      </w:r>
-    </w:p>
-    <w:p>
-      <w:r>
-        <w:t>Following commands are supported:</w:t>
-      </w:r>
-    </w:p>
-    <w:p>
-      <w:r>
-        <w:t>kubectl top pods</w:t>
-      </w:r>
-    </w:p>
-    <w:p>
-      <w:pPr>
-        <w:rPr>
-          <w:b/>
-          <w:bCs/>
-        </w:rPr>
-      </w:pPr>
-      <w:r>
-        <w:t xml:space="preserve"> kubectl top nodes</w:t>
-      </w:r>
-      <w:r>
-        <w:rPr>
-          <w:b/>
-          <w:bCs/>
-        </w:rPr>
-        <w:tab/>
-      </w:r>
-      <w:r>
-        <w:rPr>
-          <w:b/>
-          <w:bCs/>
-        </w:rPr>
-        <w:tab/>
-      </w:r>
-    </w:p>
-    <w:p>
-      <w:pPr>
-        <w:jc w:val="center"/>
-        <w:rPr>
-          <w:b/>
-          <w:bCs/>
-        </w:rPr>
-      </w:pPr>
-    </w:p>
-    <w:p>
-      <w:pPr>
-        <w:jc w:val="center"/>
-        <w:rPr>
-          <w:b/>
-          <w:bCs/>
-        </w:rPr>
-      </w:pPr>
-      <w:r>
-        <w:rPr>
-          <w:b/>
-          <w:bCs/>
-        </w:rPr>
-        <w:t>GENERAL KUBERNETES KNOWLEDGE</w:t>
-      </w:r>
-    </w:p>
-    <w:p>
-      <w:pPr>
-        <w:rPr>
-          <w:b/>
-          <w:bCs/>
-        </w:rPr>
-      </w:pPr>
-    </w:p>
-    <w:p>
-      <w:r>
-        <w:t>kubectl api-resources -o wide</w:t>
-      </w:r>
-      <w:r>
-        <w:t xml:space="preserve"> : shows all resources of Kubernetes. Helps to find the apiversion.  </w:t>
-      </w:r>
-    </w:p>
-    <w:p>
-      <w:r>
-        <w:t>When you run kubectl get all, the resources that should be included in the “</w:t>
-      </w:r>
-      <w:r>
-        <w:rPr>
-          <w:b/>
-          <w:bCs/>
-        </w:rPr>
-        <w:t>all</w:t>
-      </w:r>
-      <w:r>
-        <w:t>” can be seen in the output of “</w:t>
-      </w:r>
-      <w:r>
-        <w:t>kubectl api-resources -o wide</w:t>
-      </w:r>
-      <w:r>
-        <w:t xml:space="preserve">” command, under the </w:t>
-      </w:r>
-      <w:r>
-        <w:rPr>
-          <w:b/>
-          <w:bCs/>
-        </w:rPr>
-        <w:t>CATEGORIES</w:t>
-      </w:r>
-      <w:r>
-        <w:t xml:space="preserve"> </w:t>
-      </w:r>
-      <w:r>
-        <w:t>columns</w:t>
+        <w:t xml:space="preserve">The cluster-info CA certificate in </w:t>
+      </w:r>
+      <w:proofErr w:type="spellStart"/>
+      <w:r>
+        <w:t>kube</w:t>
+      </w:r>
+      <w:proofErr w:type="spellEnd"/>
+      <w:r>
+        <w:t>-public acts just like the trusted root certificates in your web browser, allowing new clients to safely verify the identity of the Kubernetes API server during a secure TLS connection.</w:t>
       </w:r>
     </w:p>
     <w:p/>
     <w:p>
-      <w:r>
-        <w:t>The cluster-info CA certificate in kube-public acts just like the trusted root certificates in your web browser, allowing new clients to safely verify the identity of the Kubernetes API server during a secure TLS connection.</w:t>
+      <w:pPr>
+        <w:rPr>
+          <w:b/>
+          <w:bCs/>
+        </w:rPr>
+      </w:pPr>
+      <w:r>
+        <w:rPr>
+          <w:b/>
+          <w:bCs/>
+        </w:rPr>
+        <w:t>Service Dependency</w:t>
+      </w:r>
+    </w:p>
+    <w:p>
+      <w:proofErr w:type="spellStart"/>
+      <w:r>
+        <w:t>kubectl</w:t>
+      </w:r>
+      <w:proofErr w:type="spellEnd"/>
+      <w:r>
+        <w:t xml:space="preserve"> apply -f folder/ does not guarantee resource creation order.</w:t>
+      </w:r>
+    </w:p>
+    <w:p>
+      <w:r>
+        <w:t>A Pod may start before its required Service exists.</w:t>
+      </w:r>
+    </w:p>
+    <w:p>
+      <w:r>
+        <w:t>The application should retry the connection until the Service is available.</w:t>
+      </w:r>
+    </w:p>
+    <w:p>
+      <w:r>
+        <w:t>Readiness probes prevent traffic from reaching the Pod until the application is ready.</w:t>
       </w:r>
     </w:p>
     <w:p/>
     <w:p>
-      <w:pPr>
-        <w:rPr>
-          <w:b/>
-          <w:bCs/>
-        </w:rPr>
-      </w:pPr>
-      <w:r>
-        <w:rPr>
-          <w:b/>
-          <w:bCs/>
-        </w:rPr>
-        <w:t>Service Dependency</w:t>
-      </w:r>
-    </w:p>
-    <w:p>
-      <w:r>
-        <w:t>kubectl apply -f folder/ does not guarantee resource creation order.</w:t>
-      </w:r>
-    </w:p>
-    <w:p>
-      <w:r>
-        <w:t>A Pod may start before its required Service exists.</w:t>
-      </w:r>
-    </w:p>
-    <w:p>
-      <w:r>
-        <w:t>The application should retry the connection until the Service is available.</w:t>
-      </w:r>
-    </w:p>
-    <w:p>
-      <w:r>
-        <w:t>Readiness probes prevent traffic from reaching the Pod until the application is ready.</w:t>
+      <w:r>
+        <w:t xml:space="preserve">Remember: Kubernetes doesn't manage dependency order; the application handles </w:t>
+      </w:r>
+      <w:r>
+        <w:t>retry</w:t>
+      </w:r>
+      <w:r>
+        <w:t>.</w:t>
+      </w:r>
+    </w:p>
+    <w:p>
+      <w:r>
+        <w:t xml:space="preserve">When PID 1 exits, the container runtime records its exit code, and </w:t>
+      </w:r>
+      <w:proofErr w:type="spellStart"/>
+      <w:r>
+        <w:t>kubelet</w:t>
+      </w:r>
+      <w:proofErr w:type="spellEnd"/>
+      <w:r>
+        <w:t xml:space="preserve"> uses that result along with the </w:t>
+      </w:r>
+      <w:proofErr w:type="spellStart"/>
+      <w:r>
+        <w:t>restartPolicy</w:t>
+      </w:r>
+      <w:proofErr w:type="spellEnd"/>
+      <w:r>
+        <w:t xml:space="preserve"> to decide whether to restart the container.</w:t>
       </w:r>
     </w:p>
     <w:p/>
     <w:p>
       <w:r>
-        <w:t xml:space="preserve">Remember: Kubernetes doesn't manage dependency order; the application handles </w:t>
-      </w:r>
-      <w:r>
-        <w:t>retry</w:t>
-      </w:r>
-      <w:r>
-        <w:t>.</w:t>
-      </w:r>
-    </w:p>
-    <w:p>
-      <w:r>
-        <w:t>When PID 1 exits, the container runtime records its exit code, and kubelet uses that result along with the restartPolicy to decide whether to restart the container.</w:t>
-      </w:r>
-    </w:p>
-    <w:p/>
-    <w:p>
-      <w:r>
-        <w:t>Kubernetes stores the last applied configuration in the same live object configuration in etcd. It uses this and the actual yaml to decide how modifications need to be performed when using kubectl apply command</w:t>
+        <w:t xml:space="preserve">Kubernetes stores the last applied configuration in the same live object configuration in </w:t>
+      </w:r>
+      <w:proofErr w:type="spellStart"/>
+      <w:r>
+        <w:t>etcd</w:t>
+      </w:r>
+      <w:proofErr w:type="spellEnd"/>
+      <w:r>
+        <w:t xml:space="preserve">. It uses this and the actual </w:t>
+      </w:r>
+      <w:proofErr w:type="spellStart"/>
+      <w:r>
+        <w:t>yaml</w:t>
+      </w:r>
+      <w:proofErr w:type="spellEnd"/>
+      <w:r>
+        <w:t xml:space="preserve"> to decide how modifications need to be performed when using </w:t>
+      </w:r>
+      <w:proofErr w:type="spellStart"/>
+      <w:r>
+        <w:t>kubectl</w:t>
+      </w:r>
+      <w:proofErr w:type="spellEnd"/>
+      <w:r>
+        <w:t xml:space="preserve"> apply command</w:t>
       </w:r>
       <w:r>
         <w:t>s</w:t>
@@ -841,7 +1225,15 @@
     <w:p/>
     <w:p>
       <w:r>
-        <w:t>You can manually schedule a pod using the nodeName property. It can be used</w:t>
+        <w:t xml:space="preserve">You can manually schedule a pod using the </w:t>
+      </w:r>
+      <w:proofErr w:type="spellStart"/>
+      <w:r>
+        <w:t>nodeName</w:t>
+      </w:r>
+      <w:proofErr w:type="spellEnd"/>
+      <w:r>
+        <w:t xml:space="preserve"> property. It can be used</w:t>
       </w:r>
       <w:r>
         <w:t xml:space="preserve"> in situations where s</w:t>
@@ -852,15 +1244,32 @@
     </w:p>
     <w:p/>
     <w:p>
-      <w:r>
-        <w:rPr>
-          <w:b/>
-          <w:bCs/>
-        </w:rPr>
-        <w:t>PriorityClass:</w:t>
-      </w:r>
-      <w:r>
-        <w:t xml:space="preserve"> A Kubernetes object that defines the priority of Pods. Higher-priority Pods are scheduled before lower-priority Pods and can preempt (evict) lower-priority Pods when resources are insufficient.</w:t>
+      <w:proofErr w:type="spellStart"/>
+      <w:r>
+        <w:rPr>
+          <w:b/>
+          <w:bCs/>
+        </w:rPr>
+        <w:t>PriorityClass</w:t>
+      </w:r>
+      <w:proofErr w:type="spellEnd"/>
+      <w:r>
+        <w:rPr>
+          <w:b/>
+          <w:bCs/>
+        </w:rPr>
+        <w:t>:</w:t>
+      </w:r>
+      <w:r>
+        <w:t xml:space="preserve"> A Kubernetes object that defines the priority of Pods. Higher-priority Pods are scheduled before lower-priority Pods and can </w:t>
+      </w:r>
+      <w:proofErr w:type="spellStart"/>
+      <w:r>
+        <w:t>preempt</w:t>
+      </w:r>
+      <w:proofErr w:type="spellEnd"/>
+      <w:r>
+        <w:t xml:space="preserve"> (evict) lower-priority Pods when resources are insufficient.</w:t>
       </w:r>
     </w:p>
     <w:p>
@@ -885,7 +1294,15 @@
         <w:t>-</w:t>
       </w:r>
       <w:r>
-        <w:t xml:space="preserve"> Pod has higher priority → scheduled first and can preempt lower-priority Pods. </w:t>
+        <w:t xml:space="preserve"> Pod has higher priority → scheduled first and can </w:t>
+      </w:r>
+      <w:proofErr w:type="spellStart"/>
+      <w:r>
+        <w:t>preempt</w:t>
+      </w:r>
+      <w:proofErr w:type="spellEnd"/>
+      <w:r>
+        <w:t xml:space="preserve"> lower-priority Pods. </w:t>
       </w:r>
     </w:p>
     <w:p>
@@ -910,7 +1327,15 @@
         <w:t>-</w:t>
       </w:r>
       <w:r>
-        <w:t xml:space="preserve"> Pod has lower priority → scheduled later and can be preempted by higher-priority Pods.</w:t>
+        <w:t xml:space="preserve"> Pod has lower priority → scheduled later and can be </w:t>
+      </w:r>
+      <w:proofErr w:type="spellStart"/>
+      <w:r>
+        <w:t>preempted</w:t>
+      </w:r>
+      <w:proofErr w:type="spellEnd"/>
+      <w:r>
+        <w:t xml:space="preserve"> by higher-priority Pods.</w:t>
       </w:r>
     </w:p>
     <w:p>
@@ -940,24 +1365,50 @@
           <w:numId w:val="4"/>
         </w:numPr>
       </w:pPr>
-      <w:r>
-        <w:t>preemptionPolicy: PreemptLowerPriority</w:t>
-      </w:r>
-      <w:r>
-        <w:t xml:space="preserve">  or </w:t>
-      </w:r>
-      <w:r>
-        <w:t>preemptionPolicy: Never</w:t>
+      <w:proofErr w:type="spellStart"/>
+      <w:r>
+        <w:t>preemptionPolicy</w:t>
+      </w:r>
+      <w:proofErr w:type="spellEnd"/>
+      <w:r>
+        <w:t xml:space="preserve">: </w:t>
+      </w:r>
+      <w:proofErr w:type="spellStart"/>
+      <w:proofErr w:type="gramStart"/>
+      <w:r>
+        <w:t>PreemptLowerPriority</w:t>
+      </w:r>
+      <w:proofErr w:type="spellEnd"/>
+      <w:r>
+        <w:t xml:space="preserve">  or</w:t>
+      </w:r>
+      <w:proofErr w:type="gramEnd"/>
+      <w:r>
+        <w:t xml:space="preserve"> </w:t>
+      </w:r>
+      <w:proofErr w:type="spellStart"/>
+      <w:r>
+        <w:t>preemptionPolicy</w:t>
+      </w:r>
+      <w:proofErr w:type="spellEnd"/>
+      <w:r>
+        <w:t>: Never</w:t>
       </w:r>
       <w:r>
         <w:t>s</w:t>
       </w:r>
     </w:p>
     <w:p>
+      <w:proofErr w:type="spellStart"/>
       <w:r>
         <w:lastRenderedPageBreak/>
-        <w:t xml:space="preserve">kubectl logs commands only displays the applications </w:t>
-      </w:r>
+        <w:t>kubectl</w:t>
+      </w:r>
+      <w:proofErr w:type="spellEnd"/>
+      <w:r>
+        <w:t xml:space="preserve"> logs commands only displays the applications </w:t>
+      </w:r>
+      <w:proofErr w:type="spellStart"/>
       <w:r>
         <w:rPr>
           <w:b/>
@@ -965,6 +1416,7 @@
         </w:rPr>
         <w:t>stdout</w:t>
       </w:r>
+      <w:proofErr w:type="spellEnd"/>
       <w:r>
         <w:t xml:space="preserve"> and </w:t>
       </w:r>
@@ -989,7 +1441,15 @@
         <w:t>logs.</w:t>
       </w:r>
       <w:r>
-        <w:t xml:space="preserve"> etc those stored in /var/</w:t>
+        <w:t xml:space="preserve"> </w:t>
+      </w:r>
+      <w:proofErr w:type="spellStart"/>
+      <w:r>
+        <w:t>etc</w:t>
+      </w:r>
+      <w:proofErr w:type="spellEnd"/>
+      <w:r>
+        <w:t xml:space="preserve"> those stored in /var/</w:t>
       </w:r>
       <w:r>
         <w:t>…</w:t>
@@ -1022,11 +1482,24 @@
     </w:p>
     <w:p>
       <w:r>
-        <w:t>Eg: “</w:t>
-      </w:r>
-      <w:r>
-        <w:t xml:space="preserve"> my-scheduler, my-scheduler-my-scheduler   Successfully assigned default/nginx to controlplan</w:t>
-      </w:r>
+        <w:t xml:space="preserve">Eg: </w:t>
+      </w:r>
+      <w:proofErr w:type="gramStart"/>
+      <w:r>
+        <w:t>“</w:t>
+      </w:r>
+      <w:r>
+        <w:t xml:space="preserve"> my</w:t>
+      </w:r>
+      <w:proofErr w:type="gramEnd"/>
+      <w:r>
+        <w:t xml:space="preserve">-scheduler, my-scheduler-my-scheduler   Successfully assigned default/nginx to </w:t>
+      </w:r>
+      <w:proofErr w:type="spellStart"/>
+      <w:r>
+        <w:t>controlplan</w:t>
+      </w:r>
+      <w:proofErr w:type="spellEnd"/>
       <w:r>
         <w:t>”</w:t>
       </w:r>
@@ -1059,7 +1532,25 @@
         <w:t>Queue → Filter → Score → Bind</w:t>
       </w:r>
       <w:r>
-        <w:t>. Queue selects a pending Pod, Filter eliminates nodes where the Pod cannot run, Score ranks the remaining nodes, and Bind assigns the Pod to the selected node. The scheduler records the selected node in the Pod object's spec.nodeName field. The kubelet on that node then starts the Pod.</w:t>
+        <w:t xml:space="preserve">. Queue selects a pending Pod, Filter eliminates nodes where the Pod cannot run, Score ranks the remaining nodes, and Bind assigns the Pod to the selected node. The scheduler records the selected node in the Pod object's </w:t>
+      </w:r>
+      <w:proofErr w:type="spellStart"/>
+      <w:proofErr w:type="gramStart"/>
+      <w:r>
+        <w:t>spec.nodeName</w:t>
+      </w:r>
+      <w:proofErr w:type="spellEnd"/>
+      <w:proofErr w:type="gramEnd"/>
+      <w:r>
+        <w:t xml:space="preserve"> field. The </w:t>
+      </w:r>
+      <w:proofErr w:type="spellStart"/>
+      <w:r>
+        <w:t>kubelet</w:t>
+      </w:r>
+      <w:proofErr w:type="spellEnd"/>
+      <w:r>
+        <w:t xml:space="preserve"> on that node then starts the Pod.</w:t>
       </w:r>
     </w:p>
     <w:p/>
@@ -1081,7 +1572,15 @@
         <w:t>Scheduler profiles</w:t>
       </w:r>
       <w:r>
-        <w:t xml:space="preserve"> are different configurations of the same kube-scheduler. Each profile can have its own </w:t>
+        <w:t xml:space="preserve"> are different configurations of the same </w:t>
+      </w:r>
+      <w:proofErr w:type="spellStart"/>
+      <w:r>
+        <w:t>kube</w:t>
+      </w:r>
+      <w:proofErr w:type="spellEnd"/>
+      <w:r>
+        <w:t xml:space="preserve">-scheduler. Each profile can have its own </w:t>
       </w:r>
       <w:r>
         <w:rPr>
@@ -1091,7 +1590,17 @@
         <w:t>scheduler plugins</w:t>
       </w:r>
       <w:r>
-        <w:t xml:space="preserve"> enabled, disabled, or configured. A Pod selects a profile using spec.schedulerName. Plugins implement scheduling logic at stages such as </w:t>
+        <w:t xml:space="preserve"> enabled, disabled, or configured. A Pod selects a profile using </w:t>
+      </w:r>
+      <w:proofErr w:type="spellStart"/>
+      <w:proofErr w:type="gramStart"/>
+      <w:r>
+        <w:t>spec.schedulerName</w:t>
+      </w:r>
+      <w:proofErr w:type="spellEnd"/>
+      <w:proofErr w:type="gramEnd"/>
+      <w:r>
+        <w:t xml:space="preserve">. Plugins implement scheduling logic at stages such as </w:t>
       </w:r>
       <w:r>
         <w:rPr>
@@ -1121,14 +1630,93 @@
           <w:b/>
           <w:bCs/>
         </w:rPr>
+        <w:t xml:space="preserve">Admission </w:t>
+      </w:r>
+      <w:proofErr w:type="spellStart"/>
+      <w:proofErr w:type="gramStart"/>
+      <w:r>
+        <w:rPr>
+          <w:b/>
+          <w:bCs/>
+        </w:rPr>
+        <w:t>Controller</w:t>
+      </w:r>
+      <w:r>
+        <w:rPr>
+          <w:b/>
+          <w:bCs/>
+        </w:rPr>
+        <w:t>:</w:t>
+      </w:r>
+      <w:r>
+        <w:rPr>
+          <w:b/>
+          <w:bCs/>
+        </w:rPr>
+        <w:t>s</w:t>
+      </w:r>
+      <w:proofErr w:type="spellEnd"/>
+      <w:proofErr w:type="gramEnd"/>
+    </w:p>
+    <w:p>
+      <w:r>
+        <w:t xml:space="preserve">An </w:t>
+      </w:r>
+      <w:r>
+        <w:rPr>
+          <w:b/>
+          <w:bCs/>
+        </w:rPr>
         <w:t>Admission Controller</w:t>
       </w:r>
       <w:r>
-        <w:rPr>
-          <w:b/>
-          <w:bCs/>
-        </w:rPr>
-        <w:t>:</w:t>
+        <w:t xml:space="preserve"> intercepts API requests after authentication and authorization but before the object is stored in </w:t>
+      </w:r>
+      <w:proofErr w:type="spellStart"/>
+      <w:r>
+        <w:t>etcd</w:t>
+      </w:r>
+      <w:proofErr w:type="spellEnd"/>
+      <w:r>
+        <w:t xml:space="preserve">. It can </w:t>
+      </w:r>
+      <w:r>
+        <w:rPr>
+          <w:b/>
+          <w:bCs/>
+        </w:rPr>
+        <w:t>validate, modify, or reject</w:t>
+      </w:r>
+      <w:r>
+        <w:t xml:space="preserve"> requests. Admission controllers are used to enforce cluster-wide policies such as requiring security settings, labels, resource limits, or approved container images. </w:t>
+      </w:r>
+      <w:r>
+        <w:rPr>
+          <w:b/>
+          <w:bCs/>
+        </w:rPr>
+        <w:t>Real-world use case:</w:t>
+      </w:r>
+      <w:r>
+        <w:t xml:space="preserve"> a company can use an admission controller to reject Pods that use images from untrusted registries and allow only images from its approved private registry.</w:t>
+      </w:r>
+    </w:p>
+    <w:p>
+      <w:r>
+        <w:rPr>
+          <w:b/>
+          <w:bCs/>
+        </w:rPr>
+        <w:t xml:space="preserve">How Kubernetes determine to allow or </w:t>
+      </w:r>
+      <w:proofErr w:type="spellStart"/>
+      <w:proofErr w:type="gramStart"/>
+      <w:r>
+        <w:rPr>
+          <w:b/>
+          <w:bCs/>
+        </w:rPr>
+        <w:t>deny:</w:t>
       </w:r>
       <w:r>
         <w:rPr>
@@ -1137,66 +1725,343 @@
         </w:rPr>
         <w:t>s</w:t>
       </w:r>
-    </w:p>
-    <w:p>
-      <w:r>
-        <w:t xml:space="preserve">An </w:t>
-      </w:r>
-      <w:r>
-        <w:rPr>
-          <w:b/>
-          <w:bCs/>
-        </w:rPr>
-        <w:t>Admission Controller</w:t>
-      </w:r>
-      <w:r>
-        <w:t xml:space="preserve"> intercepts API requests after authentication and authorization but before the object is stored in etcd. It can </w:t>
-      </w:r>
-      <w:r>
-        <w:rPr>
-          <w:b/>
-          <w:bCs/>
-        </w:rPr>
-        <w:t>validate, modify, or reject</w:t>
-      </w:r>
-      <w:r>
-        <w:t xml:space="preserve"> requests. Admission controllers are used to enforce cluster-wide policies such as requiring security settings, labels, resource limits, or approved container images. </w:t>
-      </w:r>
-      <w:r>
-        <w:rPr>
-          <w:b/>
-          <w:bCs/>
-        </w:rPr>
-        <w:t>Real-world use case:</w:t>
-      </w:r>
-      <w:r>
-        <w:t xml:space="preserve"> a company can use an admission controller to reject Pods that use images from untrusted registries and allow only images from its approved private registry.</w:t>
-      </w:r>
-    </w:p>
-    <w:p>
-      <w:r>
-        <w:rPr>
-          <w:b/>
-          <w:bCs/>
-        </w:rPr>
-        <w:t>How Kubernetes determine to allow or deny:</w:t>
-      </w:r>
-      <w:r>
-        <w:rPr>
-          <w:b/>
-          <w:bCs/>
-        </w:rPr>
+      <w:proofErr w:type="spellEnd"/>
+      <w:proofErr w:type="gramEnd"/>
+    </w:p>
+    <w:p>
+      <w:r>
+        <w:lastRenderedPageBreak/>
+        <w:t xml:space="preserve">The </w:t>
+      </w:r>
+      <w:proofErr w:type="spellStart"/>
+      <w:r>
+        <w:t>ImagePolicyWebhook</w:t>
+      </w:r>
+      <w:proofErr w:type="spellEnd"/>
+      <w:r>
+        <w:t xml:space="preserve"> sends information about the requested container image to an external webhook. The webhook performs its own policy logic and then returns an </w:t>
+      </w:r>
+      <w:proofErr w:type="spellStart"/>
+      <w:r>
+        <w:t>ImageReview</w:t>
+      </w:r>
+      <w:proofErr w:type="spellEnd"/>
+      <w:r>
+        <w:t xml:space="preserve"> response. Kubernetes does not care how the webhook makes its decision; it expects the decision in the </w:t>
+      </w:r>
+      <w:proofErr w:type="spellStart"/>
+      <w:proofErr w:type="gramStart"/>
+      <w:r>
+        <w:t>status.allowed</w:t>
+      </w:r>
+      <w:proofErr w:type="spellEnd"/>
+      <w:proofErr w:type="gramEnd"/>
+      <w:r>
+        <w:t xml:space="preserve"> field. </w:t>
+      </w:r>
+      <w:proofErr w:type="spellStart"/>
+      <w:proofErr w:type="gramStart"/>
+      <w:r>
+        <w:t>status.allowed</w:t>
+      </w:r>
+      <w:proofErr w:type="spellEnd"/>
+      <w:proofErr w:type="gramEnd"/>
+      <w:r>
+        <w:t xml:space="preserve">: true allows the image, while </w:t>
+      </w:r>
+      <w:proofErr w:type="spellStart"/>
+      <w:proofErr w:type="gramStart"/>
+      <w:r>
+        <w:t>status.allowed</w:t>
+      </w:r>
+      <w:proofErr w:type="spellEnd"/>
+      <w:proofErr w:type="gramEnd"/>
+      <w:r>
+        <w:t>: false rejects it.</w:t>
+      </w:r>
+    </w:p>
+    <w:p/>
+    <w:p>
+      <w:pPr>
+        <w:rPr>
+          <w:b/>
+          <w:bCs/>
+        </w:rPr>
+      </w:pPr>
+      <w:r>
+        <w:rPr>
+          <w:b/>
+          <w:bCs/>
+        </w:rPr>
+        <w:t>ENTRYPOINT can be written in two forms:</w:t>
+      </w:r>
+    </w:p>
+    <w:p>
+      <w:pPr>
+        <w:rPr>
+          <w:b/>
+          <w:bCs/>
+        </w:rPr>
+      </w:pPr>
+      <w:r>
+        <w:rPr>
+          <w:b/>
+          <w:bCs/>
+        </w:rPr>
+        <w:t>In Docker:</w:t>
+      </w:r>
+    </w:p>
+    <w:p>
+      <w:r>
+        <w:t>Exec form: ENTRYPOINT ["command"] — runs the command directly. CMD or arguments passed with docker run are appended as arguments. Recommended for applications.</w:t>
+      </w:r>
+    </w:p>
+    <w:p>
+      <w:r>
+        <w:t>Shell form: ENTRYPOINT command — runs through /bin/</w:t>
+      </w:r>
+      <w:proofErr w:type="spellStart"/>
+      <w:r>
+        <w:t>sh</w:t>
+      </w:r>
+      <w:proofErr w:type="spellEnd"/>
+      <w:r>
+        <w:t xml:space="preserve"> -c. CMD and runtime arguments are not passed to the </w:t>
+      </w:r>
+      <w:proofErr w:type="spellStart"/>
+      <w:r>
+        <w:t>entrypoint</w:t>
+      </w:r>
+      <w:proofErr w:type="spellEnd"/>
+      <w:r>
+        <w:t xml:space="preserve"> command in the normal way. Useful when shell features such as &amp;&amp;, pipes, or variable expansion are required.</w:t>
+      </w:r>
+    </w:p>
+    <w:p>
+      <w:r>
+        <w:t>Rule: Use exec form for normal applications; use shell form when shell behavior is specifically required.</w:t>
+      </w:r>
+    </w:p>
+    <w:p>
+      <w:r>
+        <w:rPr>
+          <w:b/>
+          <w:bCs/>
+        </w:rPr>
+        <w:t>ENTRYPOINT</w:t>
+      </w:r>
+      <w:r>
+        <w:t xml:space="preserve"> provides the main executable; </w:t>
+      </w:r>
+      <w:r>
+        <w:rPr>
+          <w:b/>
+          <w:bCs/>
+        </w:rPr>
+        <w:t>CMD</w:t>
+      </w:r>
+      <w:r>
+        <w:t xml:space="preserve"> provides default arguments to it, which can be overridden by arguments supplied to docker run.</w:t>
+      </w:r>
+    </w:p>
+    <w:p/>
+    <w:p>
+      <w:r>
+        <w:t xml:space="preserve">To over ride an entry point, use </w:t>
+      </w:r>
+      <w:proofErr w:type="gramStart"/>
+      <w:r>
+        <w:t xml:space="preserve">the  </w:t>
+      </w:r>
+      <w:r>
+        <w:rPr>
+          <w:b/>
+          <w:bCs/>
+        </w:rPr>
+        <w:t>“</w:t>
+      </w:r>
+      <w:proofErr w:type="gramEnd"/>
+      <w:r>
+        <w:rPr>
+          <w:b/>
+          <w:bCs/>
+        </w:rPr>
+        <w:t>--</w:t>
+      </w:r>
+      <w:proofErr w:type="spellStart"/>
+      <w:r>
+        <w:rPr>
+          <w:b/>
+          <w:bCs/>
+        </w:rPr>
+        <w:t>entrypoint</w:t>
+      </w:r>
+      <w:proofErr w:type="spellEnd"/>
+      <w:r>
+        <w:rPr>
+          <w:b/>
+          <w:bCs/>
+        </w:rPr>
+        <w:t>”</w:t>
+      </w:r>
+      <w:r>
+        <w:t xml:space="preserve"> flag.</w:t>
+      </w:r>
+    </w:p>
+    <w:p>
+      <w:proofErr w:type="spellStart"/>
+      <w:r>
+        <w:t>eg</w:t>
+      </w:r>
+      <w:proofErr w:type="spellEnd"/>
+      <w:r>
+        <w:t xml:space="preserve">: </w:t>
+      </w:r>
+      <w:r>
+        <w:t xml:space="preserve">docker run </w:t>
+      </w:r>
+      <w:r>
+        <w:rPr>
+          <w:b/>
+          <w:bCs/>
+        </w:rPr>
+        <w:t>--</w:t>
+      </w:r>
+      <w:proofErr w:type="spellStart"/>
+      <w:r>
+        <w:rPr>
+          <w:b/>
+          <w:bCs/>
+        </w:rPr>
+        <w:t>entrypoint</w:t>
+      </w:r>
+      <w:proofErr w:type="spellEnd"/>
+      <w:r>
+        <w:t xml:space="preserve"> ls </w:t>
+      </w:r>
+      <w:proofErr w:type="gramStart"/>
+      <w:r>
+        <w:t>image</w:t>
+      </w:r>
+      <w:r>
+        <w:t xml:space="preserve">  #</w:t>
+      </w:r>
+      <w:proofErr w:type="gramEnd"/>
+      <w:r>
+        <w:t xml:space="preserve"> This </w:t>
+      </w:r>
+      <w:proofErr w:type="gramStart"/>
+      <w:r>
+        <w:t>override</w:t>
+      </w:r>
+      <w:proofErr w:type="gramEnd"/>
+      <w:r>
+        <w:t xml:space="preserve"> the default entry point with </w:t>
+      </w:r>
+      <w:proofErr w:type="spellStart"/>
+      <w:r>
+        <w:t>ls</w:t>
+      </w:r>
+      <w:r>
         <w:t>s</w:t>
       </w:r>
-    </w:p>
-    <w:p>
-      <w:r>
-        <w:lastRenderedPageBreak/>
-        <w:t>The ImagePolicyWebhook sends information about the requested container image to an external webhook. The webhook performs its own policy logic and then returns an ImageReview response. Kubernetes does not care how the webhook makes its decision; it expects the decision in the status.allowed field. status.allowed: true allows the image, while status.allowed: false rejects it.</w:t>
+      <w:proofErr w:type="spellEnd"/>
+    </w:p>
+    <w:p/>
+    <w:p>
+      <w:pPr>
+        <w:rPr>
+          <w:b/>
+          <w:bCs/>
+        </w:rPr>
+      </w:pPr>
+      <w:r>
+        <w:rPr>
+          <w:b/>
+          <w:bCs/>
+        </w:rPr>
+        <w:t>In Kubernetes:</w:t>
+      </w:r>
+    </w:p>
+    <w:p>
+      <w:r>
+        <w:t xml:space="preserve">Docker’s </w:t>
+      </w:r>
+      <w:r>
+        <w:rPr>
+          <w:b/>
+          <w:bCs/>
+        </w:rPr>
+        <w:t xml:space="preserve">Entry point = </w:t>
+      </w:r>
+      <w:r>
+        <w:t>Kubernetes</w:t>
+      </w:r>
+      <w:r>
+        <w:rPr>
+          <w:b/>
+          <w:bCs/>
+        </w:rPr>
+        <w:t xml:space="preserve"> </w:t>
+      </w:r>
+      <w:r>
+        <w:rPr>
+          <w:b/>
+          <w:bCs/>
+        </w:rPr>
+        <w:t>command</w:t>
+      </w:r>
+      <w:r>
+        <w:t xml:space="preserve">   #This is the base command that run during container start up</w:t>
+      </w:r>
+    </w:p>
+    <w:p>
+      <w:r>
+        <w:t xml:space="preserve">Docker’s </w:t>
+      </w:r>
+      <w:r>
+        <w:rPr>
+          <w:b/>
+          <w:bCs/>
+        </w:rPr>
+        <w:t xml:space="preserve">command = </w:t>
+      </w:r>
+      <w:r>
+        <w:t>Kubernetes</w:t>
+      </w:r>
+      <w:r>
+        <w:rPr>
+          <w:b/>
+          <w:bCs/>
+        </w:rPr>
+        <w:t xml:space="preserve"> </w:t>
+      </w:r>
+      <w:proofErr w:type="spellStart"/>
+      <w:proofErr w:type="gramStart"/>
+      <w:r>
+        <w:rPr>
+          <w:b/>
+          <w:bCs/>
+        </w:rPr>
+        <w:t>args</w:t>
+      </w:r>
+      <w:proofErr w:type="spellEnd"/>
+      <w:r>
+        <w:t xml:space="preserve">  #</w:t>
+      </w:r>
+      <w:proofErr w:type="gramEnd"/>
+      <w:r>
+        <w:t xml:space="preserve"> This is the argument passed to the entry point. This will be appended as an argument to entry point</w:t>
       </w:r>
     </w:p>
     <w:p/>
     <w:p/>
+    <w:p/>
+    <w:p/>
+    <w:p/>
+    <w:p/>
+    <w:p/>
+    <w:p/>
     <w:p>
       <w:pPr>
         <w:jc w:val="center"/>
@@ -1216,7 +2081,15 @@
     <w:p/>
     <w:p>
       <w:r>
-        <w:t>To delete all pods together: kubectl delete pods –all</w:t>
+        <w:t xml:space="preserve">To delete all pods together: </w:t>
+      </w:r>
+      <w:proofErr w:type="spellStart"/>
+      <w:r>
+        <w:t>kubectl</w:t>
+      </w:r>
+      <w:proofErr w:type="spellEnd"/>
+      <w:r>
+        <w:t xml:space="preserve"> delete pods –all</w:t>
       </w:r>
     </w:p>
     <w:p>
@@ -1227,17 +2100,27 @@
         <w:t>resources</w:t>
       </w:r>
       <w:r>
-        <w:t>: kubectl delete pods --all -n &lt;namespace-name&gt;</w:t>
+        <w:t xml:space="preserve">: </w:t>
+      </w:r>
+      <w:proofErr w:type="spellStart"/>
+      <w:r>
+        <w:t>kubectl</w:t>
+      </w:r>
+      <w:proofErr w:type="spellEnd"/>
+      <w:r>
+        <w:t xml:space="preserve"> delete pods --all -n &lt;namespace-name&gt;</w:t>
       </w:r>
     </w:p>
     <w:p/>
     <w:p>
+      <w:proofErr w:type="spellStart"/>
       <w:r>
         <w:t>k</w:t>
       </w:r>
       <w:r>
         <w:t>ubectl</w:t>
       </w:r>
+      <w:proofErr w:type="spellEnd"/>
       <w:r>
         <w:t xml:space="preserve"> get pods --show-</w:t>
       </w:r>
@@ -1256,32 +2139,102 @@
     </w:p>
     <w:p/>
     <w:p>
+      <w:proofErr w:type="spellStart"/>
       <w:r>
         <w:t>ku</w:t>
       </w:r>
       <w:r>
-        <w:t xml:space="preserve">bectl apply -f file.yaml → Creates the resource if it doesn't exist, or updates it if it already exists. </w:t>
-      </w:r>
-    </w:p>
-    <w:p>
-      <w:r>
-        <w:t>kubectl replace -f file.yaml → Replaces an existing resource. It fails if the resource doesn't exist.</w:t>
+        <w:t>bectl</w:t>
+      </w:r>
+      <w:proofErr w:type="spellEnd"/>
+      <w:r>
+        <w:t xml:space="preserve"> apply -f </w:t>
+      </w:r>
+      <w:proofErr w:type="spellStart"/>
+      <w:proofErr w:type="gramStart"/>
+      <w:r>
+        <w:t>file.yaml</w:t>
+      </w:r>
+      <w:proofErr w:type="spellEnd"/>
+      <w:proofErr w:type="gramEnd"/>
+      <w:r>
+        <w:t xml:space="preserve"> → Creates the resource if it doesn't exist, or updates it if it already exists. </w:t>
+      </w:r>
+    </w:p>
+    <w:p>
+      <w:proofErr w:type="spellStart"/>
+      <w:r>
+        <w:t>kubectl</w:t>
+      </w:r>
+      <w:proofErr w:type="spellEnd"/>
+      <w:r>
+        <w:t xml:space="preserve"> replace -f </w:t>
+      </w:r>
+      <w:proofErr w:type="spellStart"/>
+      <w:proofErr w:type="gramStart"/>
+      <w:r>
+        <w:t>file.yaml</w:t>
+      </w:r>
+      <w:proofErr w:type="spellEnd"/>
+      <w:proofErr w:type="gramEnd"/>
+      <w:r>
+        <w:t xml:space="preserve"> → Replaces an existing resource. It fails if the resource doesn't exist.</w:t>
       </w:r>
     </w:p>
     <w:p/>
     <w:p>
       <w:r>
-        <w:t>You can use the kubectl explain to learn more about different resources.</w:t>
-      </w:r>
-    </w:p>
-    <w:p>
-      <w:r>
-        <w:t>Eg: kubectl explain pod, kubectl explain pod.spec.</w:t>
-      </w:r>
-    </w:p>
-    <w:p>
-      <w:r>
-        <w:t xml:space="preserve">You can use  --recursive flag to display all the applicable fields that are part of </w:t>
+        <w:t xml:space="preserve">You can use the </w:t>
+      </w:r>
+      <w:proofErr w:type="spellStart"/>
+      <w:r>
+        <w:t>kubectl</w:t>
+      </w:r>
+      <w:proofErr w:type="spellEnd"/>
+      <w:r>
+        <w:t xml:space="preserve"> explain to learn more about different resources.</w:t>
+      </w:r>
+    </w:p>
+    <w:p>
+      <w:r>
+        <w:t xml:space="preserve">Eg: </w:t>
+      </w:r>
+      <w:proofErr w:type="spellStart"/>
+      <w:r>
+        <w:t>kubectl</w:t>
+      </w:r>
+      <w:proofErr w:type="spellEnd"/>
+      <w:r>
+        <w:t xml:space="preserve"> explain pod, </w:t>
+      </w:r>
+      <w:proofErr w:type="spellStart"/>
+      <w:r>
+        <w:t>kubectl</w:t>
+      </w:r>
+      <w:proofErr w:type="spellEnd"/>
+      <w:r>
+        <w:t xml:space="preserve"> explain </w:t>
+      </w:r>
+      <w:proofErr w:type="spellStart"/>
+      <w:r>
+        <w:t>pod.spec</w:t>
+      </w:r>
+      <w:proofErr w:type="spellEnd"/>
+      <w:r>
+        <w:t>.</w:t>
+      </w:r>
+    </w:p>
+    <w:p>
+      <w:r>
+        <w:t xml:space="preserve">You can </w:t>
+      </w:r>
+      <w:proofErr w:type="gramStart"/>
+      <w:r>
+        <w:t>use  --</w:t>
+      </w:r>
+      <w:proofErr w:type="gramEnd"/>
+      <w:r>
+        <w:t xml:space="preserve">recursive flag to display all the applicable fields that are part of </w:t>
       </w:r>
       <w:r>
         <w:t>those resources</w:t>
@@ -1292,29 +2245,64 @@
     </w:p>
     <w:p>
       <w:r>
-        <w:t xml:space="preserve">Eg: kubectl explain pod.spec </w:t>
+        <w:t xml:space="preserve">Eg: </w:t>
+      </w:r>
+      <w:proofErr w:type="spellStart"/>
+      <w:r>
+        <w:t>kubectl</w:t>
+      </w:r>
+      <w:proofErr w:type="spellEnd"/>
+      <w:r>
+        <w:t xml:space="preserve"> explain </w:t>
+      </w:r>
+      <w:proofErr w:type="spellStart"/>
+      <w:proofErr w:type="gramStart"/>
+      <w:r>
+        <w:t>pod.spec</w:t>
+      </w:r>
+      <w:proofErr w:type="spellEnd"/>
+      <w:proofErr w:type="gramEnd"/>
+      <w:r>
+        <w:t xml:space="preserve"> </w:t>
       </w:r>
       <w:r>
         <w:t>–</w:t>
       </w:r>
+      <w:proofErr w:type="spellStart"/>
       <w:r>
         <w:t>recusrsive</w:t>
       </w:r>
       <w:r>
         <w:t>s</w:t>
       </w:r>
+      <w:proofErr w:type="spellEnd"/>
     </w:p>
     <w:p/>
     <w:p>
+      <w:proofErr w:type="spellStart"/>
       <w:r>
         <w:t>s</w:t>
       </w:r>
       <w:r>
-        <w:t xml:space="preserve">To log in to a multi container pod:  </w:t>
-      </w:r>
-      <w:r>
-        <w:t>kubectl exec -it &lt;pod-name&gt; -c &lt;container-name&gt; -- /bin/sh</w:t>
-      </w:r>
+        <w:t>To</w:t>
+      </w:r>
+      <w:proofErr w:type="spellEnd"/>
+      <w:r>
+        <w:t xml:space="preserve"> log in to a multi container pod:  </w:t>
+      </w:r>
+      <w:proofErr w:type="spellStart"/>
+      <w:r>
+        <w:t>kubectl</w:t>
+      </w:r>
+      <w:proofErr w:type="spellEnd"/>
+      <w:r>
+        <w:t xml:space="preserve"> exec -it &lt;pod-name&gt; -c &lt;container-name&gt; -- /bin/</w:t>
+      </w:r>
+      <w:proofErr w:type="spellStart"/>
+      <w:r>
+        <w:t>sh</w:t>
+      </w:r>
+      <w:proofErr w:type="spellEnd"/>
     </w:p>
     <w:sectPr>
       <w:pgSz w:w="12240" w:h="15840"/>

</xml_diff>

<commit_message>
Learned about etcd and etcd encryption at rest, how to enable encryption, about secret recreation after encryption
</commit_message>
<xml_diff>
--- a/9-Interesting_learning_Notes/Learning_Notes.docx
+++ b/9-Interesting_learning_Notes/Learning_Notes.docx
@@ -673,6 +673,45 @@
         <w:t xml:space="preserve"> are invalid.</w:t>
       </w:r>
     </w:p>
+    <w:p/>
+    <w:p>
+      <w:r>
+        <w:rPr>
+          <w:b/>
+          <w:bCs/>
+          <w:highlight w:val="yellow"/>
+        </w:rPr>
+        <w:t>IMPORTANT INFORMATION</w:t>
+      </w:r>
+      <w:r>
+        <w:t xml:space="preserve">:  </w:t>
+      </w:r>
+      <w:r>
+        <w:t xml:space="preserve">use </w:t>
+      </w:r>
+      <w:r>
+        <w:rPr>
+          <w:b/>
+          <w:bCs/>
+        </w:rPr>
+        <w:t>-h</w:t>
+      </w:r>
+      <w:r>
+        <w:t xml:space="preserve"> flag with commands to get example and explanations</w:t>
+      </w:r>
+      <w:r>
+        <w:t>.</w:t>
+      </w:r>
+    </w:p>
+    <w:p>
+      <w:r>
+        <w:t>k</w:t>
+      </w:r>
+      <w:r>
+        <w:t>ubectl run pods -h  #This will shows example usages and explanations.</w:t>
+      </w:r>
+    </w:p>
+    <w:p/>
     <w:p>
       <w:pPr>
         <w:rPr>
@@ -747,6 +786,7 @@
     </w:p>
     <w:p>
       <w:r>
+        <w:lastRenderedPageBreak/>
         <w:t>kubectl apply -f folder/ does not guarantee resource creation order.</w:t>
       </w:r>
     </w:p>
@@ -996,6 +1036,7 @@
           <w:b/>
           <w:bCs/>
         </w:rPr>
+        <w:lastRenderedPageBreak/>
         <w:t>Custom-Scheduler:</w:t>
       </w:r>
     </w:p>
@@ -1016,477 +1057,703 @@
     </w:p>
     <w:p>
       <w:r>
+        <w:t>Eg: “</w:t>
+      </w:r>
+      <w:r>
+        <w:t xml:space="preserve"> my-scheduler, my-scheduler-my-scheduler   Successfully assigned default/nginx to controlplan</w:t>
+      </w:r>
+      <w:r>
+        <w:t>”</w:t>
+      </w:r>
+    </w:p>
+    <w:p/>
+    <w:p>
+      <w:pPr>
+        <w:rPr>
+          <w:b/>
+          <w:bCs/>
+        </w:rPr>
+      </w:pPr>
+      <w:r>
+        <w:rPr>
+          <w:b/>
+          <w:bCs/>
+        </w:rPr>
+        <w:t>Kubernetes scheduling Stages</w:t>
+      </w:r>
+    </w:p>
+    <w:p>
+      <w:r>
+        <w:t xml:space="preserve">Kubernetes scheduling involves the scheduler selecting a suitable node for a Pod. The main stages are </w:t>
+      </w:r>
+      <w:r>
+        <w:rPr>
+          <w:b/>
+          <w:bCs/>
+        </w:rPr>
+        <w:t>Queue → Filter → Score → Bind</w:t>
+      </w:r>
+      <w:r>
+        <w:t>. Queue selects a pending Pod, Filter eliminates nodes where the Pod cannot run, Score ranks the remaining nodes, and Bind assigns the Pod to the selected node. The scheduler records the selected node in the Pod object's spec.nodeName field. The kubelet on that node then starts the Pod.</w:t>
+      </w:r>
+    </w:p>
+    <w:p/>
+    <w:p>
+      <w:r>
+        <w:rPr>
+          <w:b/>
+          <w:bCs/>
+        </w:rPr>
+        <w:t>Scheduler profiles</w:t>
+      </w:r>
+    </w:p>
+    <w:p>
+      <w:r>
+        <w:rPr>
+          <w:b/>
+          <w:bCs/>
+        </w:rPr>
+        <w:t>Scheduler profiles</w:t>
+      </w:r>
+      <w:r>
+        <w:t xml:space="preserve"> are different configurations of the same kube-scheduler. Each profile can have its own </w:t>
+      </w:r>
+      <w:r>
+        <w:rPr>
+          <w:b/>
+          <w:bCs/>
+        </w:rPr>
+        <w:t>scheduler plugins</w:t>
+      </w:r>
+      <w:r>
+        <w:t xml:space="preserve"> enabled, disabled, or configured. A Pod selects a profile using spec.schedulerName. Plugins implement scheduling logic at stages such as </w:t>
+      </w:r>
+      <w:r>
+        <w:rPr>
+          <w:b/>
+          <w:bCs/>
+        </w:rPr>
+        <w:t>Filter</w:t>
+      </w:r>
+      <w:r>
+        <w:t xml:space="preserve"> and </w:t>
+      </w:r>
+      <w:r>
+        <w:rPr>
+          <w:b/>
+          <w:bCs/>
+        </w:rPr>
+        <w:t>Score</w:t>
+      </w:r>
+      <w:r>
+        <w:t>. This allows different Pods to use different scheduling behavior.</w:t>
+      </w:r>
+    </w:p>
+    <w:p/>
+    <w:p>
+      <w:r>
+        <w:rPr>
+          <w:b/>
+          <w:bCs/>
+        </w:rPr>
+        <w:t>Admission Controller</w:t>
+      </w:r>
+      <w:r>
+        <w:rPr>
+          <w:b/>
+          <w:bCs/>
+        </w:rPr>
+        <w:t>:</w:t>
+      </w:r>
+      <w:r>
+        <w:rPr>
+          <w:b/>
+          <w:bCs/>
+        </w:rPr>
+        <w:t>s</w:t>
+      </w:r>
+    </w:p>
+    <w:p>
+      <w:r>
+        <w:t xml:space="preserve">An </w:t>
+      </w:r>
+      <w:r>
+        <w:rPr>
+          <w:b/>
+          <w:bCs/>
+        </w:rPr>
+        <w:t>Admission Controller</w:t>
+      </w:r>
+      <w:r>
+        <w:t xml:space="preserve"> intercepts API requests after authentication and authorization but before the object is stored in etcd. It can </w:t>
+      </w:r>
+      <w:r>
+        <w:rPr>
+          <w:b/>
+          <w:bCs/>
+        </w:rPr>
+        <w:t>validate, modify, or reject</w:t>
+      </w:r>
+      <w:r>
+        <w:t xml:space="preserve"> requests. Admission controllers are used to enforce cluster-wide policies such as requiring security settings, labels, resource limits, or approved container images. </w:t>
+      </w:r>
+      <w:r>
+        <w:rPr>
+          <w:b/>
+          <w:bCs/>
+        </w:rPr>
+        <w:t>Real-world use case:</w:t>
+      </w:r>
+      <w:r>
+        <w:t xml:space="preserve"> a company can use an admission controller to reject Pods that use images from untrusted registries and allow only images from its approved private registry.</w:t>
+      </w:r>
+    </w:p>
+    <w:p>
+      <w:r>
+        <w:rPr>
+          <w:b/>
+          <w:bCs/>
+        </w:rPr>
+        <w:t>How Kubernetes determine to allow or deny:</w:t>
+      </w:r>
+      <w:r>
+        <w:rPr>
+          <w:b/>
+          <w:bCs/>
+        </w:rPr>
+        <w:t>s</w:t>
+      </w:r>
+    </w:p>
+    <w:p>
+      <w:r>
+        <w:t>The ImagePolicyWebhook sends information about the requested container image to an external webhook. The webhook performs its own policy logic and then returns an ImageReview response. Kubernetes does not care how the webhook makes its decision; it expects the decision in the status.allowed field. status.allowed: true allows the image, while status.allowed: false rejects it.</w:t>
+      </w:r>
+    </w:p>
+    <w:p/>
+    <w:p>
+      <w:pPr>
+        <w:rPr>
+          <w:b/>
+          <w:bCs/>
+        </w:rPr>
+      </w:pPr>
+      <w:r>
+        <w:rPr>
+          <w:b/>
+          <w:bCs/>
+        </w:rPr>
+        <w:t>ENTRYPOINT can be written in two forms:</w:t>
+      </w:r>
+    </w:p>
+    <w:p>
+      <w:pPr>
+        <w:rPr>
+          <w:b/>
+          <w:bCs/>
+        </w:rPr>
+      </w:pPr>
+      <w:r>
+        <w:rPr>
+          <w:b/>
+          <w:bCs/>
+        </w:rPr>
+        <w:t>In Docker:</w:t>
+      </w:r>
+    </w:p>
+    <w:p>
+      <w:r>
+        <w:t>Exec form: ENTRYPOINT ["command"] — runs the command directly. CMD or arguments passed with docker run are appended as arguments. Recommended for applications.</w:t>
+      </w:r>
+    </w:p>
+    <w:p>
+      <w:r>
+        <w:t>Shell form: ENTRYPOINT command — runs through /bin/sh -c. CMD and runtime arguments are not passed to the entrypoint command in the normal way. Useful when shell features such as &amp;&amp;, pipes, or variable expansion are required.</w:t>
+      </w:r>
+    </w:p>
+    <w:p>
+      <w:r>
+        <w:t>Rule: Use exec form for normal applications; use shell form when shell behavior is specifically required.</w:t>
+      </w:r>
+    </w:p>
+    <w:p>
+      <w:r>
+        <w:rPr>
+          <w:b/>
+          <w:bCs/>
+        </w:rPr>
+        <w:t>ENTRYPOINT</w:t>
+      </w:r>
+      <w:r>
+        <w:t xml:space="preserve"> provides the main executable; </w:t>
+      </w:r>
+      <w:r>
+        <w:rPr>
+          <w:b/>
+          <w:bCs/>
+        </w:rPr>
+        <w:t>CMD</w:t>
+      </w:r>
+      <w:r>
+        <w:t xml:space="preserve"> provides default arguments to it, which can be overridden by arguments supplied to docker run.</w:t>
+      </w:r>
+    </w:p>
+    <w:p/>
+    <w:p>
+      <w:r>
+        <w:t xml:space="preserve">To over ride an entry point, use the  </w:t>
+      </w:r>
+      <w:r>
+        <w:rPr>
+          <w:b/>
+          <w:bCs/>
+        </w:rPr>
+        <w:t>“--entrypoint”</w:t>
+      </w:r>
+      <w:r>
+        <w:t xml:space="preserve"> flag.</w:t>
+      </w:r>
+    </w:p>
+    <w:p>
+      <w:r>
+        <w:t xml:space="preserve">eg: </w:t>
+      </w:r>
+      <w:r>
+        <w:t xml:space="preserve">docker run </w:t>
+      </w:r>
+      <w:r>
+        <w:rPr>
+          <w:b/>
+          <w:bCs/>
+        </w:rPr>
+        <w:t>--entrypoint</w:t>
+      </w:r>
+      <w:r>
+        <w:t xml:space="preserve"> ls image</w:t>
+      </w:r>
+      <w:r>
+        <w:t xml:space="preserve">  # This override the default entry point with ls</w:t>
+      </w:r>
+      <w:r>
+        <w:t>s</w:t>
+      </w:r>
+    </w:p>
+    <w:p/>
+    <w:p>
+      <w:pPr>
+        <w:rPr>
+          <w:b/>
+          <w:bCs/>
+        </w:rPr>
+      </w:pPr>
+      <w:r>
+        <w:rPr>
+          <w:b/>
+          <w:bCs/>
+        </w:rPr>
+        <w:t>In Kubernetes:</w:t>
+      </w:r>
+    </w:p>
+    <w:p>
+      <w:r>
+        <w:t xml:space="preserve">Docker’s </w:t>
+      </w:r>
+      <w:r>
+        <w:rPr>
+          <w:b/>
+          <w:bCs/>
+        </w:rPr>
+        <w:t xml:space="preserve">Entry point = </w:t>
+      </w:r>
+      <w:r>
+        <w:t>Kubernetes</w:t>
+      </w:r>
+      <w:r>
+        <w:rPr>
+          <w:b/>
+          <w:bCs/>
+        </w:rPr>
+        <w:t xml:space="preserve"> </w:t>
+      </w:r>
+      <w:r>
+        <w:rPr>
+          <w:b/>
+          <w:bCs/>
+        </w:rPr>
+        <w:t>command</w:t>
+      </w:r>
+      <w:r>
+        <w:t xml:space="preserve">   #This is the base command that run during container start up</w:t>
+      </w:r>
+    </w:p>
+    <w:p>
+      <w:r>
+        <w:t xml:space="preserve">Docker’s </w:t>
+      </w:r>
+      <w:r>
+        <w:rPr>
+          <w:b/>
+          <w:bCs/>
+        </w:rPr>
+        <w:t xml:space="preserve">command = </w:t>
+      </w:r>
+      <w:r>
+        <w:t>Kubernetes</w:t>
+      </w:r>
+      <w:r>
+        <w:rPr>
+          <w:b/>
+          <w:bCs/>
+        </w:rPr>
+        <w:t xml:space="preserve"> </w:t>
+      </w:r>
+      <w:r>
+        <w:rPr>
+          <w:b/>
+          <w:bCs/>
+        </w:rPr>
+        <w:t>args</w:t>
+      </w:r>
+      <w:r>
+        <w:t xml:space="preserve">  # This is the argument passed to the entry point. This will be appended as an argument to entry point</w:t>
+      </w:r>
+    </w:p>
+    <w:p/>
+    <w:p/>
+    <w:p/>
+    <w:p>
+      <w:pPr>
+        <w:rPr>
+          <w:b/>
+          <w:bCs/>
+        </w:rPr>
+      </w:pPr>
+      <w:r>
+        <w:rPr>
+          <w:b/>
+          <w:bCs/>
+        </w:rPr>
+        <w:t>Difference between kubectl create vs kubectl apply</w:t>
+      </w:r>
+    </w:p>
+    <w:p>
+      <w:r>
+        <w:rPr>
+          <w:b/>
+          <w:bCs/>
+        </w:rPr>
+        <w:t>kubectl create</w:t>
+      </w:r>
+      <w:r>
+        <w:t xml:space="preserve"> </w:t>
+      </w:r>
+      <w:r>
+        <w:t>-</w:t>
+      </w:r>
+      <w:r>
+        <w:t xml:space="preserve"> Creates the resource; errors if it already exists. </w:t>
+      </w:r>
+    </w:p>
+    <w:p>
+      <w:r>
+        <w:rPr>
+          <w:b/>
+          <w:bCs/>
+        </w:rPr>
+        <w:t>kubectl apply</w:t>
+      </w:r>
+      <w:r>
+        <w:t xml:space="preserve"> </w:t>
+      </w:r>
+      <w:r>
+        <w:t xml:space="preserve">- </w:t>
+      </w:r>
+      <w:r>
+        <w:t>Creates the resource if absent; updates it if it exists.</w:t>
+      </w:r>
+    </w:p>
+    <w:p/>
+    <w:p>
+      <w:pPr>
+        <w:rPr>
+          <w:b/>
+          <w:bCs/>
+        </w:rPr>
+      </w:pPr>
+      <w:r>
+        <w:rPr>
+          <w:b/>
+          <w:bCs/>
+        </w:rPr>
         <w:lastRenderedPageBreak/>
-        <w:t>Eg: “</w:t>
-      </w:r>
-      <w:r>
-        <w:t xml:space="preserve"> my-scheduler, my-scheduler-my-scheduler   Successfully assigned default/nginx to controlplan</w:t>
-      </w:r>
-      <w:r>
-        <w:t>”</w:t>
-      </w:r>
-    </w:p>
-    <w:p/>
-    <w:p>
-      <w:pPr>
-        <w:rPr>
-          <w:b/>
-          <w:bCs/>
-        </w:rPr>
-      </w:pPr>
-      <w:r>
-        <w:rPr>
-          <w:b/>
-          <w:bCs/>
-        </w:rPr>
-        <w:t>Kubernetes scheduling Stages</w:t>
-      </w:r>
-    </w:p>
-    <w:p>
-      <w:r>
-        <w:t xml:space="preserve">Kubernetes scheduling involves the scheduler selecting a suitable node for a Pod. The main stages are </w:t>
-      </w:r>
-      <w:r>
-        <w:rPr>
-          <w:b/>
-          <w:bCs/>
-        </w:rPr>
-        <w:t>Queue → Filter → Score → Bind</w:t>
-      </w:r>
-      <w:r>
-        <w:t>. Queue selects a pending Pod, Filter eliminates nodes where the Pod cannot run, Score ranks the remaining nodes, and Bind assigns the Pod to the selected node. The scheduler records the selected node in the Pod object's spec.nodeName field. The kubelet on that node then starts the Pod.</w:t>
-      </w:r>
-    </w:p>
-    <w:p/>
-    <w:p>
-      <w:r>
-        <w:rPr>
-          <w:b/>
-          <w:bCs/>
-        </w:rPr>
-        <w:t>Scheduler profiles</w:t>
-      </w:r>
-    </w:p>
-    <w:p>
-      <w:r>
-        <w:rPr>
-          <w:b/>
-          <w:bCs/>
-        </w:rPr>
-        <w:t>Scheduler profiles</w:t>
-      </w:r>
-      <w:r>
-        <w:t xml:space="preserve"> are different configurations of the same kube-scheduler. Each profile can have its own </w:t>
-      </w:r>
-      <w:r>
-        <w:rPr>
-          <w:b/>
-          <w:bCs/>
-        </w:rPr>
-        <w:t>scheduler plugins</w:t>
-      </w:r>
-      <w:r>
-        <w:t xml:space="preserve"> enabled, disabled, or configured. A Pod selects a profile using spec.schedulerName. Plugins implement scheduling logic at stages such as </w:t>
-      </w:r>
-      <w:r>
-        <w:rPr>
-          <w:b/>
-          <w:bCs/>
-        </w:rPr>
-        <w:t>Filter</w:t>
-      </w:r>
-      <w:r>
-        <w:t xml:space="preserve"> and </w:t>
-      </w:r>
-      <w:r>
-        <w:rPr>
-          <w:b/>
-          <w:bCs/>
-        </w:rPr>
-        <w:t>Score</w:t>
-      </w:r>
-      <w:r>
-        <w:t>. This allows different Pods to use different scheduling behavior.</w:t>
-      </w:r>
-    </w:p>
-    <w:p/>
-    <w:p>
-      <w:r>
-        <w:rPr>
-          <w:b/>
-          <w:bCs/>
-        </w:rPr>
-        <w:t>Admission Controller</w:t>
-      </w:r>
-      <w:r>
-        <w:rPr>
-          <w:b/>
-          <w:bCs/>
-        </w:rPr>
-        <w:t>:</w:t>
-      </w:r>
-      <w:r>
-        <w:rPr>
-          <w:b/>
-          <w:bCs/>
-        </w:rPr>
-        <w:t>s</w:t>
-      </w:r>
-    </w:p>
-    <w:p>
-      <w:r>
-        <w:t xml:space="preserve">An </w:t>
-      </w:r>
-      <w:r>
-        <w:rPr>
-          <w:b/>
-          <w:bCs/>
-        </w:rPr>
-        <w:t>Admission Controller</w:t>
-      </w:r>
-      <w:r>
-        <w:t xml:space="preserve"> intercepts API requests after authentication and authorization but before the object is stored in etcd. It can </w:t>
-      </w:r>
-      <w:r>
-        <w:rPr>
-          <w:b/>
-          <w:bCs/>
-        </w:rPr>
-        <w:t>validate, modify, or reject</w:t>
-      </w:r>
-      <w:r>
-        <w:t xml:space="preserve"> requests. Admission controllers are used to enforce cluster-wide policies such as requiring security settings, labels, resource limits, or approved container images. </w:t>
-      </w:r>
-      <w:r>
-        <w:rPr>
-          <w:b/>
-          <w:bCs/>
-        </w:rPr>
-        <w:t>Real-world use case:</w:t>
-      </w:r>
-      <w:r>
-        <w:t xml:space="preserve"> a company can use an admission controller to reject Pods that use images from untrusted registries and allow only images from its approved private registry.</w:t>
-      </w:r>
-    </w:p>
-    <w:p>
-      <w:r>
-        <w:rPr>
-          <w:b/>
-          <w:bCs/>
-        </w:rPr>
-        <w:t>How Kubernetes determine to allow or deny:</w:t>
-      </w:r>
-      <w:r>
-        <w:rPr>
-          <w:b/>
-          <w:bCs/>
-        </w:rPr>
-        <w:t>s</w:t>
-      </w:r>
-    </w:p>
-    <w:p>
-      <w:r>
-        <w:t>The ImagePolicyWebhook sends information about the requested container image to an external webhook. The webhook performs its own policy logic and then returns an ImageReview response. Kubernetes does not care how the webhook makes its decision; it expects the decision in the status.allowed field. status.allowed: true allows the image, while status.allowed: false rejects it.</w:t>
-      </w:r>
-    </w:p>
-    <w:p/>
-    <w:p>
-      <w:pPr>
-        <w:rPr>
-          <w:b/>
-          <w:bCs/>
-        </w:rPr>
-      </w:pPr>
-      <w:r>
-        <w:rPr>
-          <w:b/>
-          <w:bCs/>
-        </w:rPr>
-        <w:t>ENTRYPOINT can be written in two forms:</w:t>
-      </w:r>
-    </w:p>
-    <w:p>
-      <w:pPr>
-        <w:rPr>
-          <w:b/>
-          <w:bCs/>
-        </w:rPr>
-      </w:pPr>
-      <w:r>
-        <w:rPr>
-          <w:b/>
-          <w:bCs/>
-        </w:rPr>
+        <w:t>METRICS SERVER</w:t>
+      </w:r>
+    </w:p>
+    <w:p>
+      <w:r>
+        <w:t>Metrics Server collects resource metrics from the Kubernetes nodes and pods and makes them available through the Kubernetes Metrics API.</w:t>
+      </w:r>
+    </w:p>
+    <w:p>
+      <w:r>
+        <w:t>It gets metrics from kubelets, which expose cAdvisor derived container metrics.</w:t>
+      </w:r>
+    </w:p>
+    <w:p/>
+    <w:p>
+      <w:r>
+        <w:rPr>
+          <w:b/>
+          <w:bCs/>
+        </w:rPr>
+        <w:t>cAdvisor</w:t>
+      </w:r>
+      <w:r>
+        <w:t xml:space="preserve"> is part of kubelet and collects container resource metrics. Metrics Server collects metrics from kubelets and provides them through the Kubernetes Metrics API.</w:t>
+      </w:r>
+    </w:p>
+    <w:p>
+      <w:r>
+        <w:t>Following commands are supported:</w:t>
+      </w:r>
+    </w:p>
+    <w:p>
+      <w:r>
+        <w:t>kubectl top pods</w:t>
+      </w:r>
+    </w:p>
+    <w:p>
+      <w:r>
+        <w:t xml:space="preserve"> kubectl top nodes</w:t>
+      </w:r>
+    </w:p>
+    <w:p/>
+    <w:p>
+      <w:pPr>
+        <w:rPr>
+          <w:b/>
+          <w:bCs/>
+        </w:rPr>
+      </w:pPr>
+      <w:r>
+        <w:rPr>
+          <w:b/>
+          <w:bCs/>
+        </w:rPr>
+        <w:t>CA Certificates in Kubernetes:</w:t>
+      </w:r>
+    </w:p>
+    <w:p>
+      <w:r>
+        <w:t xml:space="preserve">Kubernetes does not use a single CA for all components. Most control plane components (API Server, kube-proxy, scheduler, controller-manager, admin clients) use the </w:t>
+      </w:r>
+      <w:r>
+        <w:rPr>
+          <w:b/>
+          <w:bCs/>
+        </w:rPr>
+        <w:t>Kubernetes CA</w:t>
+      </w:r>
+      <w:r>
+        <w:t xml:space="preserve">, while </w:t>
+      </w:r>
+      <w:r>
+        <w:rPr>
+          <w:b/>
+          <w:bCs/>
+        </w:rPr>
+        <w:t>ETCD</w:t>
+      </w:r>
+      <w:r>
+        <w:t xml:space="preserve"> and the </w:t>
+      </w:r>
+      <w:r>
+        <w:rPr>
+          <w:b/>
+          <w:bCs/>
+        </w:rPr>
+        <w:t>Front-Proxy/Aggregation Layer</w:t>
+      </w:r>
+      <w:r>
+        <w:t xml:space="preserve"> have their own dedicated CAs.</w:t>
+      </w:r>
+    </w:p>
+    <w:p/>
+    <w:p>
+      <w:pPr>
+        <w:jc w:val="center"/>
+      </w:pPr>
+      <w:r>
+        <w:rPr>
+          <w:b/>
+          <w:bCs/>
+        </w:rPr>
+        <w:t xml:space="preserve">ETCD </w:t>
+      </w:r>
+      <w:r>
+        <w:rPr>
+          <w:b/>
+          <w:bCs/>
+        </w:rPr>
+        <w:t>DATABASE</w:t>
+      </w:r>
+    </w:p>
+    <w:p>
+      <w:r>
+        <w:t xml:space="preserve">By </w:t>
+      </w:r>
+      <w:r>
+        <w:t>default,</w:t>
+      </w:r>
+      <w:r>
+        <w:t xml:space="preserve"> etcd </w:t>
+      </w:r>
+      <w:r>
+        <w:rPr>
+          <w:b/>
+          <w:bCs/>
+        </w:rPr>
+        <w:t>is not encrypted</w:t>
+      </w:r>
+      <w:r>
+        <w:t xml:space="preserve"> at rest, so you can see the </w:t>
+      </w:r>
+      <w:r>
+        <w:rPr>
+          <w:b/>
+          <w:bCs/>
+        </w:rPr>
+        <w:t>secrets</w:t>
+      </w:r>
+      <w:r>
+        <w:t xml:space="preserve"> as unencrypted:</w:t>
+      </w:r>
+    </w:p>
+    <w:p>
+      <w:r>
+        <w:drawing>
+          <wp:inline distT="0" distB="0" distL="0" distR="0" wp14:anchorId="28C8B639" wp14:editId="555A1D94">
+            <wp:extent cx="5943600" cy="1991995"/>
+            <wp:effectExtent l="0" t="0" r="0" b="8255"/>
+            <wp:docPr id="1499358193" name="Picture 1"/>
+            <wp:cNvGraphicFramePr>
+              <a:graphicFrameLocks xmlns:a="http://schemas.openxmlformats.org/drawingml/2006/main" noChangeAspect="1"/>
+            </wp:cNvGraphicFramePr>
+            <a:graphic xmlns:a="http://schemas.openxmlformats.org/drawingml/2006/main">
+              <a:graphicData uri="http://schemas.openxmlformats.org/drawingml/2006/picture">
+                <pic:pic xmlns:pic="http://schemas.openxmlformats.org/drawingml/2006/picture">
+                  <pic:nvPicPr>
+                    <pic:cNvPr id="1499358193" name=""/>
+                    <pic:cNvPicPr/>
+                  </pic:nvPicPr>
+                  <pic:blipFill>
+                    <a:blip r:embed="rId8"/>
+                    <a:stretch>
+                      <a:fillRect/>
+                    </a:stretch>
+                  </pic:blipFill>
+                  <pic:spPr>
+                    <a:xfrm>
+                      <a:off x="0" y="0"/>
+                      <a:ext cx="5943600" cy="1991995"/>
+                    </a:xfrm>
+                    <a:prstGeom prst="rect">
+                      <a:avLst/>
+                    </a:prstGeom>
+                  </pic:spPr>
+                </pic:pic>
+              </a:graphicData>
+            </a:graphic>
+          </wp:inline>
+        </w:drawing>
+      </w:r>
+    </w:p>
+    <w:p/>
+    <w:p>
+      <w:r>
+        <w:t xml:space="preserve">ETCD stores Kubernetes objects as raw bytes (protobuf format). In a hexdump, the left side shows the actual hexadecimal byte values, while the right side shows their ASCII </w:t>
+      </w:r>
+      <w:r>
         <w:lastRenderedPageBreak/>
-        <w:t>In Docker:</w:t>
-      </w:r>
-    </w:p>
-    <w:p>
-      <w:r>
-        <w:t>Exec form: ENTRYPOINT ["command"] — runs the command directly. CMD or arguments passed with docker run are appended as arguments. Recommended for applications.</w:t>
-      </w:r>
-    </w:p>
-    <w:p>
-      <w:r>
-        <w:t>Shell form: ENTRYPOINT command — runs through /bin/sh -c. CMD and runtime arguments are not passed to the entrypoint command in the normal way. Useful when shell features such as &amp;&amp;, pipes, or variable expansion are required.</w:t>
-      </w:r>
-    </w:p>
-    <w:p>
-      <w:r>
-        <w:t>Rule: Use exec form for normal applications; use shell form when shell behavior is specifically required.</w:t>
-      </w:r>
-    </w:p>
-    <w:p>
-      <w:r>
-        <w:rPr>
-          <w:b/>
-          <w:bCs/>
-        </w:rPr>
-        <w:t>ENTRYPOINT</w:t>
-      </w:r>
-      <w:r>
-        <w:t xml:space="preserve"> provides the main executable; </w:t>
-      </w:r>
-      <w:r>
-        <w:rPr>
-          <w:b/>
-          <w:bCs/>
-        </w:rPr>
-        <w:t>CMD</w:t>
-      </w:r>
-      <w:r>
-        <w:t xml:space="preserve"> provides default arguments to it, which can be overridden by arguments supplied to docker run.</w:t>
-      </w:r>
-    </w:p>
-    <w:p/>
-    <w:p>
-      <w:r>
-        <w:t xml:space="preserve">To over ride an entry point, use the  </w:t>
-      </w:r>
-      <w:r>
-        <w:rPr>
-          <w:b/>
-          <w:bCs/>
-        </w:rPr>
-        <w:t>“--entrypoint”</w:t>
-      </w:r>
-      <w:r>
-        <w:t xml:space="preserve"> flag.</w:t>
-      </w:r>
-    </w:p>
-    <w:p>
-      <w:r>
-        <w:t xml:space="preserve">eg: </w:t>
-      </w:r>
-      <w:r>
-        <w:t xml:space="preserve">docker run </w:t>
-      </w:r>
-      <w:r>
-        <w:rPr>
-          <w:b/>
-          <w:bCs/>
-        </w:rPr>
-        <w:t>--entrypoint</w:t>
-      </w:r>
-      <w:r>
-        <w:t xml:space="preserve"> ls image</w:t>
-      </w:r>
-      <w:r>
-        <w:t xml:space="preserve">  # This override the default entry point with ls</w:t>
-      </w:r>
-      <w:r>
-        <w:t>s</w:t>
-      </w:r>
-    </w:p>
-    <w:p/>
-    <w:p>
-      <w:pPr>
-        <w:rPr>
-          <w:b/>
-          <w:bCs/>
-        </w:rPr>
-      </w:pPr>
-      <w:r>
-        <w:rPr>
-          <w:b/>
-          <w:bCs/>
-        </w:rPr>
-        <w:t>In Kubernetes:</w:t>
-      </w:r>
-    </w:p>
-    <w:p>
-      <w:r>
-        <w:t xml:space="preserve">Docker’s </w:t>
-      </w:r>
-      <w:r>
-        <w:rPr>
-          <w:b/>
-          <w:bCs/>
-        </w:rPr>
-        <w:t xml:space="preserve">Entry point = </w:t>
-      </w:r>
-      <w:r>
-        <w:t>Kubernetes</w:t>
-      </w:r>
-      <w:r>
-        <w:rPr>
-          <w:b/>
-          <w:bCs/>
-        </w:rPr>
+        <w:t>representation. Printable bytes appear as text, and non-printable protobuf metadata is displayed as dots (.).</w:t>
+      </w:r>
+    </w:p>
+    <w:p>
+      <w:r>
+        <w:rPr>
+          <w:b/>
+          <w:bCs/>
+          <w:highlight w:val="yellow"/>
+        </w:rPr>
+        <w:t>IMPORTANT:</w:t>
+      </w:r>
+      <w:r>
         <w:t xml:space="preserve"> </w:t>
       </w:r>
       <w:r>
-        <w:rPr>
-          <w:b/>
-          <w:bCs/>
-        </w:rPr>
-        <w:t>command</w:t>
-      </w:r>
-      <w:r>
-        <w:t xml:space="preserve">   #This is the base command that run during container start up</w:t>
-      </w:r>
-    </w:p>
-    <w:p>
-      <w:r>
-        <w:t xml:space="preserve">Docker’s </w:t>
-      </w:r>
-      <w:r>
-        <w:rPr>
-          <w:b/>
-          <w:bCs/>
-        </w:rPr>
-        <w:t xml:space="preserve">command = </w:t>
-      </w:r>
-      <w:r>
-        <w:t>Kubernetes</w:t>
-      </w:r>
-      <w:r>
-        <w:rPr>
-          <w:b/>
-          <w:bCs/>
-        </w:rPr>
-        <w:t xml:space="preserve"> </w:t>
-      </w:r>
-      <w:r>
-        <w:rPr>
-          <w:b/>
-          <w:bCs/>
-        </w:rPr>
-        <w:t>args</w:t>
-      </w:r>
-      <w:r>
-        <w:t xml:space="preserve">  # This is the argument passed to the entry point. This will be appended as an argument to entry point</w:t>
-      </w:r>
-    </w:p>
-    <w:p/>
-    <w:p/>
-    <w:p/>
-    <w:p>
-      <w:pPr>
-        <w:rPr>
-          <w:b/>
-          <w:bCs/>
-        </w:rPr>
-      </w:pPr>
-      <w:r>
-        <w:rPr>
-          <w:b/>
-          <w:bCs/>
-        </w:rPr>
-        <w:t>Difference between kubectl create vs kubectl apply</w:t>
-      </w:r>
-    </w:p>
-    <w:p>
-      <w:r>
-        <w:rPr>
-          <w:b/>
-          <w:bCs/>
-        </w:rPr>
-        <w:t>kubectl create</w:t>
-      </w:r>
-      <w:r>
-        <w:t xml:space="preserve"> </w:t>
-      </w:r>
-      <w:r>
-        <w:t>-</w:t>
-      </w:r>
-      <w:r>
-        <w:t xml:space="preserve"> Creates the resource; errors if it already exists. </w:t>
-      </w:r>
-    </w:p>
-    <w:p>
-      <w:r>
-        <w:rPr>
-          <w:b/>
-          <w:bCs/>
-        </w:rPr>
-        <w:t>kubectl apply</w:t>
-      </w:r>
-      <w:r>
-        <w:t xml:space="preserve"> </w:t>
-      </w:r>
-      <w:r>
-        <w:t xml:space="preserve">- </w:t>
-      </w:r>
-      <w:r>
-        <w:t>Creates the resource if absent; updates it if it exists.</w:t>
-      </w:r>
-    </w:p>
-    <w:p/>
-    <w:p>
-      <w:pPr>
-        <w:rPr>
-          <w:b/>
-          <w:bCs/>
-        </w:rPr>
-      </w:pPr>
-      <w:r>
-        <w:rPr>
-          <w:b/>
-          <w:bCs/>
-        </w:rPr>
-        <w:t>METRICS SERVER</w:t>
-      </w:r>
-    </w:p>
-    <w:p>
-      <w:r>
-        <w:lastRenderedPageBreak/>
-        <w:t>Metrics Server collects resource metrics from the Kubernetes nodes and pods and makes them available through the Kubernetes Metrics API.</w:t>
-      </w:r>
-    </w:p>
-    <w:p>
-      <w:r>
-        <w:t>It gets metrics from kubelets, which expose cAdvisor derived container metrics.</w:t>
-      </w:r>
-    </w:p>
-    <w:p/>
-    <w:p>
-      <w:r>
-        <w:rPr>
-          <w:b/>
-          <w:bCs/>
-        </w:rPr>
-        <w:t>cAdvisor</w:t>
-      </w:r>
-      <w:r>
-        <w:t xml:space="preserve"> is part of kubelet and collects container resource metrics. Metrics Server collects metrics from kubelets and provides them through the Kubernetes Metrics API.</w:t>
-      </w:r>
-    </w:p>
-    <w:p>
-      <w:r>
-        <w:t>Following commands are supported:</w:t>
-      </w:r>
-    </w:p>
-    <w:p>
-      <w:r>
-        <w:t>kubectl top pods</w:t>
-      </w:r>
-    </w:p>
-    <w:p>
-      <w:r>
-        <w:t xml:space="preserve"> kubectl top nodes</w:t>
-      </w:r>
-    </w:p>
+        <w:t>Enabling Encryption at Rest does not automatically encrypt existing data in etcd. Only newly created or updated resources are encrypted. Existing resources must be rewritten (updated/recreated) to be stored in encrypted form.</w:t>
+      </w:r>
+    </w:p>
+    <w:p>
+      <w:r>
+        <w:t>To encrypt existing secrets, we use the below command.</w:t>
+      </w:r>
+    </w:p>
+    <w:p>
+      <w:r>
+        <w:drawing>
+          <wp:inline distT="0" distB="0" distL="0" distR="0" wp14:anchorId="3DF02678" wp14:editId="64B4DA3C">
+            <wp:extent cx="5943600" cy="518160"/>
+            <wp:effectExtent l="0" t="0" r="0" b="0"/>
+            <wp:docPr id="1692586409" name="Picture 1"/>
+            <wp:cNvGraphicFramePr>
+              <a:graphicFrameLocks xmlns:a="http://schemas.openxmlformats.org/drawingml/2006/main" noChangeAspect="1"/>
+            </wp:cNvGraphicFramePr>
+            <a:graphic xmlns:a="http://schemas.openxmlformats.org/drawingml/2006/main">
+              <a:graphicData uri="http://schemas.openxmlformats.org/drawingml/2006/picture">
+                <pic:pic xmlns:pic="http://schemas.openxmlformats.org/drawingml/2006/picture">
+                  <pic:nvPicPr>
+                    <pic:cNvPr id="1692586409" name=""/>
+                    <pic:cNvPicPr/>
+                  </pic:nvPicPr>
+                  <pic:blipFill>
+                    <a:blip r:embed="rId9"/>
+                    <a:stretch>
+                      <a:fillRect/>
+                    </a:stretch>
+                  </pic:blipFill>
+                  <pic:spPr>
+                    <a:xfrm>
+                      <a:off x="0" y="0"/>
+                      <a:ext cx="5943600" cy="518160"/>
+                    </a:xfrm>
+                    <a:prstGeom prst="rect">
+                      <a:avLst/>
+                    </a:prstGeom>
+                  </pic:spPr>
+                </pic:pic>
+              </a:graphicData>
+            </a:graphic>
+          </wp:inline>
+        </w:drawing>
+      </w:r>
+    </w:p>
+    <w:p>
+      <w:r>
+        <w:t>It gets the yaml and passes it to kubectl replace -f command: it will recreate the resource.</w:t>
+      </w:r>
+    </w:p>
+    <w:p>
+      <w:r>
+        <w:t>When Encryption at Rest is enabled, back up both the ETCD snapshot and the EncryptionConfiguration (including encryption keys). Without the original key, encrypted data in ETCD cannot be decrypted after a restore.</w:t>
+      </w:r>
+    </w:p>
+    <w:p>
+      <w:r>
+        <w:t>Never replace an encryption key directly. Add the new key alongside the old key for key rotation. If the original encryption key is lost and no backup exists, Kubernetes may be unable to decrypt previously encrypted Secrets stored in etcd.</w:t>
+      </w:r>
+    </w:p>
+    <w:p/>
+    <w:p/>
     <w:p/>
     <w:p>
       <w:pPr>
@@ -1501,7 +1768,7 @@
           <w:b/>
           <w:bCs/>
         </w:rPr>
-        <w:t>ConfigMaps:</w:t>
+        <w:t>CONFIGMAPS</w:t>
       </w:r>
     </w:p>
     <w:p>
@@ -1537,14 +1804,7 @@
           <w:b/>
           <w:bCs/>
         </w:rPr>
-        <w:t>From literals</w:t>
-      </w:r>
-      <w:r>
-        <w:rPr>
-          <w:b/>
-          <w:bCs/>
-        </w:rPr>
-        <w:t>:</w:t>
+        <w:t>From literals:</w:t>
       </w:r>
     </w:p>
     <w:p>
@@ -1570,14 +1830,7 @@
           <w:b/>
           <w:bCs/>
         </w:rPr>
-        <w:t>From a file</w:t>
-      </w:r>
-      <w:r>
-        <w:rPr>
-          <w:b/>
-          <w:bCs/>
-        </w:rPr>
-        <w:t>:</w:t>
+        <w:t>From a file:</w:t>
       </w:r>
     </w:p>
     <w:p>
@@ -1603,14 +1856,8 @@
           <w:b/>
           <w:bCs/>
         </w:rPr>
-        <w:t>From an environment file</w:t>
-      </w:r>
-      <w:r>
-        <w:rPr>
-          <w:b/>
-          <w:bCs/>
-        </w:rPr>
-        <w:t>:</w:t>
+        <w:lastRenderedPageBreak/>
+        <w:t>From an environment file:</w:t>
       </w:r>
     </w:p>
     <w:p>
@@ -1636,19 +1883,14 @@
           <w:b/>
           <w:bCs/>
         </w:rPr>
-        <w:t>From YAML manifest</w:t>
-      </w:r>
-      <w:r>
-        <w:rPr>
-          <w:b/>
-          <w:bCs/>
-        </w:rPr>
-        <w:t>:</w:t>
-      </w:r>
-    </w:p>
-    <w:p>
-      <w:r>
-        <w:lastRenderedPageBreak/>
+        <w:t>From YAML manifest:</w:t>
+      </w:r>
+    </w:p>
+    <w:p>
+      <w:r>
+        <w:rPr>
+          <w:noProof/>
+        </w:rPr>
         <w:drawing>
           <wp:inline distT="0" distB="0" distL="0" distR="0" wp14:anchorId="3B5FA08D" wp14:editId="5E9F1644">
             <wp:extent cx="1981477" cy="1257475"/>
@@ -1665,7 +1907,7 @@
                     <pic:cNvPicPr/>
                   </pic:nvPicPr>
                   <pic:blipFill>
-                    <a:blip r:embed="rId8"/>
+                    <a:blip r:embed="rId10"/>
                     <a:stretch>
                       <a:fillRect/>
                     </a:stretch>
@@ -1782,7 +2024,7 @@
           <w:b/>
           <w:bCs/>
         </w:rPr>
-        <w:t>Secrets:</w:t>
+        <w:t>SECRETS</w:t>
       </w:r>
     </w:p>
     <w:p/>
@@ -1853,6 +2095,9 @@
     </w:p>
     <w:p>
       <w:r>
+        <w:rPr>
+          <w:noProof/>
+        </w:rPr>
         <w:drawing>
           <wp:inline distT="0" distB="0" distL="0" distR="0" wp14:anchorId="4B08613D" wp14:editId="1B873A41">
             <wp:extent cx="3029373" cy="638264"/>
@@ -1869,7 +2114,7 @@
                     <pic:cNvPicPr/>
                   </pic:nvPicPr>
                   <pic:blipFill>
-                    <a:blip r:embed="rId9"/>
+                    <a:blip r:embed="rId11"/>
                     <a:stretch>
                       <a:fillRect/>
                     </a:stretch>
@@ -1896,7 +2141,6 @@
     <w:p/>
     <w:p>
       <w:r>
-        <w:lastRenderedPageBreak/>
         <w:t>Declarative: (</w:t>
       </w:r>
       <w:r>
@@ -1914,6 +2158,9 @@
     </w:p>
     <w:p>
       <w:r>
+        <w:rPr>
+          <w:noProof/>
+        </w:rPr>
         <w:drawing>
           <wp:inline distT="0" distB="0" distL="0" distR="0" wp14:anchorId="43D8ABF3" wp14:editId="6A496057">
             <wp:extent cx="2172003" cy="1657581"/>
@@ -1930,7 +2177,7 @@
                     <pic:cNvPicPr/>
                   </pic:nvPicPr>
                   <pic:blipFill>
-                    <a:blip r:embed="rId10"/>
+                    <a:blip r:embed="rId12"/>
                     <a:stretch>
                       <a:fillRect/>
                     </a:stretch>
@@ -1959,6 +2206,9 @@
     </w:p>
     <w:p>
       <w:r>
+        <w:rPr>
+          <w:noProof/>
+        </w:rPr>
         <w:drawing>
           <wp:inline distT="0" distB="0" distL="0" distR="0" wp14:anchorId="508BC2A4" wp14:editId="1CB6EF10">
             <wp:extent cx="2314898" cy="1581371"/>
@@ -1975,7 +2225,7 @@
                     <pic:cNvPicPr/>
                   </pic:nvPicPr>
                   <pic:blipFill>
-                    <a:blip r:embed="rId11"/>
+                    <a:blip r:embed="rId13"/>
                     <a:stretch>
                       <a:fillRect/>
                     </a:stretch>
@@ -1997,6 +2247,109 @@
       </w:r>
     </w:p>
     <w:p/>
+    <w:p>
+      <w:r>
+        <w:t>Not checking-in secret object definition files to source code repositories.</w:t>
+      </w:r>
+    </w:p>
+    <w:p>
+      <w:pPr>
+        <w:rPr>
+          <w:b/>
+          <w:bCs/>
+        </w:rPr>
+      </w:pPr>
+      <w:r>
+        <w:rPr>
+          <w:b/>
+          <w:bCs/>
+          <w:highlight w:val="yellow"/>
+        </w:rPr>
+        <w:t>IMPORTANT:</w:t>
+      </w:r>
+    </w:p>
+    <w:p>
+      <w:r>
+        <w:t>Secrets encode data in base64 format. Anyone with the base64 encoded secret can easily decode it. As such the secrets can be considered as not very safe.</w:t>
+      </w:r>
+    </w:p>
+    <w:p>
+      <w:pPr>
+        <w:pStyle w:val="ListParagraph"/>
+        <w:numPr>
+          <w:ilvl w:val="0"/>
+          <w:numId w:val="10"/>
+        </w:numPr>
+      </w:pPr>
+      <w:r>
+        <w:t>Never checking-in secret object definition files to source code repositories.</w:t>
+      </w:r>
+    </w:p>
+    <w:p>
+      <w:pPr>
+        <w:pStyle w:val="ListParagraph"/>
+        <w:numPr>
+          <w:ilvl w:val="0"/>
+          <w:numId w:val="10"/>
+        </w:numPr>
+      </w:pPr>
+      <w:r>
+        <w:t xml:space="preserve">Enabling Encryption at Rest for Secrets so they are stored encrypted in ETCD. </w:t>
+      </w:r>
+    </w:p>
+    <w:p/>
+    <w:p>
+      <w:pPr>
+        <w:rPr>
+          <w:b/>
+          <w:bCs/>
+        </w:rPr>
+      </w:pPr>
+      <w:r>
+        <w:rPr>
+          <w:b/>
+          <w:bCs/>
+        </w:rPr>
+        <w:lastRenderedPageBreak/>
+        <w:t>Way kubernetes handles secrets:</w:t>
+      </w:r>
+    </w:p>
+    <w:p>
+      <w:pPr>
+        <w:pStyle w:val="ListParagraph"/>
+        <w:numPr>
+          <w:ilvl w:val="0"/>
+          <w:numId w:val="9"/>
+        </w:numPr>
+      </w:pPr>
+      <w:r>
+        <w:t>A secret is only sent to a node if a pod on that node requires it.</w:t>
+      </w:r>
+    </w:p>
+    <w:p>
+      <w:pPr>
+        <w:pStyle w:val="ListParagraph"/>
+        <w:numPr>
+          <w:ilvl w:val="0"/>
+          <w:numId w:val="9"/>
+        </w:numPr>
+      </w:pPr>
+      <w:r>
+        <w:t>Kubelet stores the secret into a tmpfs so that the secret is not written to disk storage.</w:t>
+      </w:r>
+    </w:p>
+    <w:p>
+      <w:pPr>
+        <w:pStyle w:val="ListParagraph"/>
+        <w:numPr>
+          <w:ilvl w:val="0"/>
+          <w:numId w:val="9"/>
+        </w:numPr>
+      </w:pPr>
+      <w:r>
+        <w:t>Once the Pod that depends on the secret is deleted, kubelet will delete its local copy of the secret data as well.</w:t>
+      </w:r>
+    </w:p>
     <w:p/>
     <w:p>
       <w:pPr>
@@ -2066,7 +2419,6 @@
     </w:p>
     <w:p>
       <w:r>
-        <w:lastRenderedPageBreak/>
         <w:t>kubectl replace -f file.yaml → Replaces an existing resource. It fails if the resource doesn't exist.</w:t>
       </w:r>
     </w:p>
@@ -2333,6 +2685,155 @@
     </w:lvl>
   </w:abstractNum>
   <w:abstractNum w:abstractNumId="2" w15:restartNumberingAfterBreak="0">
+    <w:nsid w:val="1FFB2A39"/>
+    <w:multiLevelType w:val="multilevel"/>
+    <w:tmpl w:val="003AE8A8"/>
+    <w:lvl w:ilvl="0">
+      <w:start w:val="1"/>
+      <w:numFmt w:val="bullet"/>
+      <w:lvlText w:val=""/>
+      <w:lvlJc w:val="left"/>
+      <w:pPr>
+        <w:tabs>
+          <w:tab w:val="num" w:pos="720"/>
+        </w:tabs>
+        <w:ind w:left="720" w:hanging="360"/>
+      </w:pPr>
+      <w:rPr>
+        <w:rFonts w:ascii="Symbol" w:hAnsi="Symbol" w:hint="default"/>
+        <w:sz w:val="20"/>
+      </w:rPr>
+    </w:lvl>
+    <w:lvl w:ilvl="1" w:tentative="1">
+      <w:start w:val="1"/>
+      <w:numFmt w:val="bullet"/>
+      <w:lvlText w:val=""/>
+      <w:lvlJc w:val="left"/>
+      <w:pPr>
+        <w:tabs>
+          <w:tab w:val="num" w:pos="1440"/>
+        </w:tabs>
+        <w:ind w:left="1440" w:hanging="360"/>
+      </w:pPr>
+      <w:rPr>
+        <w:rFonts w:ascii="Symbol" w:hAnsi="Symbol" w:hint="default"/>
+        <w:sz w:val="20"/>
+      </w:rPr>
+    </w:lvl>
+    <w:lvl w:ilvl="2" w:tentative="1">
+      <w:start w:val="1"/>
+      <w:numFmt w:val="bullet"/>
+      <w:lvlText w:val=""/>
+      <w:lvlJc w:val="left"/>
+      <w:pPr>
+        <w:tabs>
+          <w:tab w:val="num" w:pos="2160"/>
+        </w:tabs>
+        <w:ind w:left="2160" w:hanging="360"/>
+      </w:pPr>
+      <w:rPr>
+        <w:rFonts w:ascii="Symbol" w:hAnsi="Symbol" w:hint="default"/>
+        <w:sz w:val="20"/>
+      </w:rPr>
+    </w:lvl>
+    <w:lvl w:ilvl="3" w:tentative="1">
+      <w:start w:val="1"/>
+      <w:numFmt w:val="bullet"/>
+      <w:lvlText w:val=""/>
+      <w:lvlJc w:val="left"/>
+      <w:pPr>
+        <w:tabs>
+          <w:tab w:val="num" w:pos="2880"/>
+        </w:tabs>
+        <w:ind w:left="2880" w:hanging="360"/>
+      </w:pPr>
+      <w:rPr>
+        <w:rFonts w:ascii="Symbol" w:hAnsi="Symbol" w:hint="default"/>
+        <w:sz w:val="20"/>
+      </w:rPr>
+    </w:lvl>
+    <w:lvl w:ilvl="4" w:tentative="1">
+      <w:start w:val="1"/>
+      <w:numFmt w:val="bullet"/>
+      <w:lvlText w:val=""/>
+      <w:lvlJc w:val="left"/>
+      <w:pPr>
+        <w:tabs>
+          <w:tab w:val="num" w:pos="3600"/>
+        </w:tabs>
+        <w:ind w:left="3600" w:hanging="360"/>
+      </w:pPr>
+      <w:rPr>
+        <w:rFonts w:ascii="Symbol" w:hAnsi="Symbol" w:hint="default"/>
+        <w:sz w:val="20"/>
+      </w:rPr>
+    </w:lvl>
+    <w:lvl w:ilvl="5" w:tentative="1">
+      <w:start w:val="1"/>
+      <w:numFmt w:val="bullet"/>
+      <w:lvlText w:val=""/>
+      <w:lvlJc w:val="left"/>
+      <w:pPr>
+        <w:tabs>
+          <w:tab w:val="num" w:pos="4320"/>
+        </w:tabs>
+        <w:ind w:left="4320" w:hanging="360"/>
+      </w:pPr>
+      <w:rPr>
+        <w:rFonts w:ascii="Symbol" w:hAnsi="Symbol" w:hint="default"/>
+        <w:sz w:val="20"/>
+      </w:rPr>
+    </w:lvl>
+    <w:lvl w:ilvl="6" w:tentative="1">
+      <w:start w:val="1"/>
+      <w:numFmt w:val="bullet"/>
+      <w:lvlText w:val=""/>
+      <w:lvlJc w:val="left"/>
+      <w:pPr>
+        <w:tabs>
+          <w:tab w:val="num" w:pos="5040"/>
+        </w:tabs>
+        <w:ind w:left="5040" w:hanging="360"/>
+      </w:pPr>
+      <w:rPr>
+        <w:rFonts w:ascii="Symbol" w:hAnsi="Symbol" w:hint="default"/>
+        <w:sz w:val="20"/>
+      </w:rPr>
+    </w:lvl>
+    <w:lvl w:ilvl="7" w:tentative="1">
+      <w:start w:val="1"/>
+      <w:numFmt w:val="bullet"/>
+      <w:lvlText w:val=""/>
+      <w:lvlJc w:val="left"/>
+      <w:pPr>
+        <w:tabs>
+          <w:tab w:val="num" w:pos="5760"/>
+        </w:tabs>
+        <w:ind w:left="5760" w:hanging="360"/>
+      </w:pPr>
+      <w:rPr>
+        <w:rFonts w:ascii="Symbol" w:hAnsi="Symbol" w:hint="default"/>
+        <w:sz w:val="20"/>
+      </w:rPr>
+    </w:lvl>
+    <w:lvl w:ilvl="8" w:tentative="1">
+      <w:start w:val="1"/>
+      <w:numFmt w:val="bullet"/>
+      <w:lvlText w:val=""/>
+      <w:lvlJc w:val="left"/>
+      <w:pPr>
+        <w:tabs>
+          <w:tab w:val="num" w:pos="6480"/>
+        </w:tabs>
+        <w:ind w:left="6480" w:hanging="360"/>
+      </w:pPr>
+      <w:rPr>
+        <w:rFonts w:ascii="Symbol" w:hAnsi="Symbol" w:hint="default"/>
+        <w:sz w:val="20"/>
+      </w:rPr>
+    </w:lvl>
+  </w:abstractNum>
+  <w:abstractNum w:abstractNumId="3" w15:restartNumberingAfterBreak="0">
     <w:nsid w:val="21A273DA"/>
     <w:multiLevelType w:val="hybridMultilevel"/>
     <w:tmpl w:val="825437A6"/>
@@ -2445,7 +2946,120 @@
       </w:rPr>
     </w:lvl>
   </w:abstractNum>
-  <w:abstractNum w:abstractNumId="3" w15:restartNumberingAfterBreak="0">
+  <w:abstractNum w:abstractNumId="4" w15:restartNumberingAfterBreak="0">
+    <w:nsid w:val="2FF922CF"/>
+    <w:multiLevelType w:val="hybridMultilevel"/>
+    <w:tmpl w:val="13B43BCE"/>
+    <w:lvl w:ilvl="0" w:tplc="10090001">
+      <w:start w:val="1"/>
+      <w:numFmt w:val="bullet"/>
+      <w:lvlText w:val=""/>
+      <w:lvlJc w:val="left"/>
+      <w:pPr>
+        <w:ind w:left="720" w:hanging="360"/>
+      </w:pPr>
+      <w:rPr>
+        <w:rFonts w:ascii="Symbol" w:hAnsi="Symbol" w:hint="default"/>
+      </w:rPr>
+    </w:lvl>
+    <w:lvl w:ilvl="1" w:tplc="10090003" w:tentative="1">
+      <w:start w:val="1"/>
+      <w:numFmt w:val="bullet"/>
+      <w:lvlText w:val="o"/>
+      <w:lvlJc w:val="left"/>
+      <w:pPr>
+        <w:ind w:left="1440" w:hanging="360"/>
+      </w:pPr>
+      <w:rPr>
+        <w:rFonts w:ascii="Courier New" w:hAnsi="Courier New" w:cs="Courier New" w:hint="default"/>
+      </w:rPr>
+    </w:lvl>
+    <w:lvl w:ilvl="2" w:tplc="10090005" w:tentative="1">
+      <w:start w:val="1"/>
+      <w:numFmt w:val="bullet"/>
+      <w:lvlText w:val=""/>
+      <w:lvlJc w:val="left"/>
+      <w:pPr>
+        <w:ind w:left="2160" w:hanging="360"/>
+      </w:pPr>
+      <w:rPr>
+        <w:rFonts w:ascii="Wingdings" w:hAnsi="Wingdings" w:hint="default"/>
+      </w:rPr>
+    </w:lvl>
+    <w:lvl w:ilvl="3" w:tplc="10090001" w:tentative="1">
+      <w:start w:val="1"/>
+      <w:numFmt w:val="bullet"/>
+      <w:lvlText w:val=""/>
+      <w:lvlJc w:val="left"/>
+      <w:pPr>
+        <w:ind w:left="2880" w:hanging="360"/>
+      </w:pPr>
+      <w:rPr>
+        <w:rFonts w:ascii="Symbol" w:hAnsi="Symbol" w:hint="default"/>
+      </w:rPr>
+    </w:lvl>
+    <w:lvl w:ilvl="4" w:tplc="10090003" w:tentative="1">
+      <w:start w:val="1"/>
+      <w:numFmt w:val="bullet"/>
+      <w:lvlText w:val="o"/>
+      <w:lvlJc w:val="left"/>
+      <w:pPr>
+        <w:ind w:left="3600" w:hanging="360"/>
+      </w:pPr>
+      <w:rPr>
+        <w:rFonts w:ascii="Courier New" w:hAnsi="Courier New" w:cs="Courier New" w:hint="default"/>
+      </w:rPr>
+    </w:lvl>
+    <w:lvl w:ilvl="5" w:tplc="10090005" w:tentative="1">
+      <w:start w:val="1"/>
+      <w:numFmt w:val="bullet"/>
+      <w:lvlText w:val=""/>
+      <w:lvlJc w:val="left"/>
+      <w:pPr>
+        <w:ind w:left="4320" w:hanging="360"/>
+      </w:pPr>
+      <w:rPr>
+        <w:rFonts w:ascii="Wingdings" w:hAnsi="Wingdings" w:hint="default"/>
+      </w:rPr>
+    </w:lvl>
+    <w:lvl w:ilvl="6" w:tplc="10090001" w:tentative="1">
+      <w:start w:val="1"/>
+      <w:numFmt w:val="bullet"/>
+      <w:lvlText w:val=""/>
+      <w:lvlJc w:val="left"/>
+      <w:pPr>
+        <w:ind w:left="5040" w:hanging="360"/>
+      </w:pPr>
+      <w:rPr>
+        <w:rFonts w:ascii="Symbol" w:hAnsi="Symbol" w:hint="default"/>
+      </w:rPr>
+    </w:lvl>
+    <w:lvl w:ilvl="7" w:tplc="10090003" w:tentative="1">
+      <w:start w:val="1"/>
+      <w:numFmt w:val="bullet"/>
+      <w:lvlText w:val="o"/>
+      <w:lvlJc w:val="left"/>
+      <w:pPr>
+        <w:ind w:left="5760" w:hanging="360"/>
+      </w:pPr>
+      <w:rPr>
+        <w:rFonts w:ascii="Courier New" w:hAnsi="Courier New" w:cs="Courier New" w:hint="default"/>
+      </w:rPr>
+    </w:lvl>
+    <w:lvl w:ilvl="8" w:tplc="10090005" w:tentative="1">
+      <w:start w:val="1"/>
+      <w:numFmt w:val="bullet"/>
+      <w:lvlText w:val=""/>
+      <w:lvlJc w:val="left"/>
+      <w:pPr>
+        <w:ind w:left="6480" w:hanging="360"/>
+      </w:pPr>
+      <w:rPr>
+        <w:rFonts w:ascii="Wingdings" w:hAnsi="Wingdings" w:hint="default"/>
+      </w:rPr>
+    </w:lvl>
+  </w:abstractNum>
+  <w:abstractNum w:abstractNumId="5" w15:restartNumberingAfterBreak="0">
     <w:nsid w:val="3AD12E15"/>
     <w:multiLevelType w:val="multilevel"/>
     <w:tmpl w:val="1B26CE52"/>
@@ -2558,7 +3172,7 @@
       </w:pPr>
     </w:lvl>
   </w:abstractNum>
-  <w:abstractNum w:abstractNumId="4" w15:restartNumberingAfterBreak="0">
+  <w:abstractNum w:abstractNumId="6" w15:restartNumberingAfterBreak="0">
     <w:nsid w:val="4E251AC9"/>
     <w:multiLevelType w:val="hybridMultilevel"/>
     <w:tmpl w:val="B8BE0B24"/>
@@ -2647,7 +3261,120 @@
       </w:pPr>
     </w:lvl>
   </w:abstractNum>
-  <w:abstractNum w:abstractNumId="5" w15:restartNumberingAfterBreak="0">
+  <w:abstractNum w:abstractNumId="7" w15:restartNumberingAfterBreak="0">
+    <w:nsid w:val="6DAB0C8B"/>
+    <w:multiLevelType w:val="hybridMultilevel"/>
+    <w:tmpl w:val="E6168C9A"/>
+    <w:lvl w:ilvl="0" w:tplc="10090001">
+      <w:start w:val="1"/>
+      <w:numFmt w:val="bullet"/>
+      <w:lvlText w:val=""/>
+      <w:lvlJc w:val="left"/>
+      <w:pPr>
+        <w:ind w:left="720" w:hanging="360"/>
+      </w:pPr>
+      <w:rPr>
+        <w:rFonts w:ascii="Symbol" w:hAnsi="Symbol" w:hint="default"/>
+      </w:rPr>
+    </w:lvl>
+    <w:lvl w:ilvl="1" w:tplc="10090003" w:tentative="1">
+      <w:start w:val="1"/>
+      <w:numFmt w:val="bullet"/>
+      <w:lvlText w:val="o"/>
+      <w:lvlJc w:val="left"/>
+      <w:pPr>
+        <w:ind w:left="1440" w:hanging="360"/>
+      </w:pPr>
+      <w:rPr>
+        <w:rFonts w:ascii="Courier New" w:hAnsi="Courier New" w:cs="Courier New" w:hint="default"/>
+      </w:rPr>
+    </w:lvl>
+    <w:lvl w:ilvl="2" w:tplc="10090005" w:tentative="1">
+      <w:start w:val="1"/>
+      <w:numFmt w:val="bullet"/>
+      <w:lvlText w:val=""/>
+      <w:lvlJc w:val="left"/>
+      <w:pPr>
+        <w:ind w:left="2160" w:hanging="360"/>
+      </w:pPr>
+      <w:rPr>
+        <w:rFonts w:ascii="Wingdings" w:hAnsi="Wingdings" w:hint="default"/>
+      </w:rPr>
+    </w:lvl>
+    <w:lvl w:ilvl="3" w:tplc="10090001" w:tentative="1">
+      <w:start w:val="1"/>
+      <w:numFmt w:val="bullet"/>
+      <w:lvlText w:val=""/>
+      <w:lvlJc w:val="left"/>
+      <w:pPr>
+        <w:ind w:left="2880" w:hanging="360"/>
+      </w:pPr>
+      <w:rPr>
+        <w:rFonts w:ascii="Symbol" w:hAnsi="Symbol" w:hint="default"/>
+      </w:rPr>
+    </w:lvl>
+    <w:lvl w:ilvl="4" w:tplc="10090003" w:tentative="1">
+      <w:start w:val="1"/>
+      <w:numFmt w:val="bullet"/>
+      <w:lvlText w:val="o"/>
+      <w:lvlJc w:val="left"/>
+      <w:pPr>
+        <w:ind w:left="3600" w:hanging="360"/>
+      </w:pPr>
+      <w:rPr>
+        <w:rFonts w:ascii="Courier New" w:hAnsi="Courier New" w:cs="Courier New" w:hint="default"/>
+      </w:rPr>
+    </w:lvl>
+    <w:lvl w:ilvl="5" w:tplc="10090005" w:tentative="1">
+      <w:start w:val="1"/>
+      <w:numFmt w:val="bullet"/>
+      <w:lvlText w:val=""/>
+      <w:lvlJc w:val="left"/>
+      <w:pPr>
+        <w:ind w:left="4320" w:hanging="360"/>
+      </w:pPr>
+      <w:rPr>
+        <w:rFonts w:ascii="Wingdings" w:hAnsi="Wingdings" w:hint="default"/>
+      </w:rPr>
+    </w:lvl>
+    <w:lvl w:ilvl="6" w:tplc="10090001" w:tentative="1">
+      <w:start w:val="1"/>
+      <w:numFmt w:val="bullet"/>
+      <w:lvlText w:val=""/>
+      <w:lvlJc w:val="left"/>
+      <w:pPr>
+        <w:ind w:left="5040" w:hanging="360"/>
+      </w:pPr>
+      <w:rPr>
+        <w:rFonts w:ascii="Symbol" w:hAnsi="Symbol" w:hint="default"/>
+      </w:rPr>
+    </w:lvl>
+    <w:lvl w:ilvl="7" w:tplc="10090003" w:tentative="1">
+      <w:start w:val="1"/>
+      <w:numFmt w:val="bullet"/>
+      <w:lvlText w:val="o"/>
+      <w:lvlJc w:val="left"/>
+      <w:pPr>
+        <w:ind w:left="5760" w:hanging="360"/>
+      </w:pPr>
+      <w:rPr>
+        <w:rFonts w:ascii="Courier New" w:hAnsi="Courier New" w:cs="Courier New" w:hint="default"/>
+      </w:rPr>
+    </w:lvl>
+    <w:lvl w:ilvl="8" w:tplc="10090005" w:tentative="1">
+      <w:start w:val="1"/>
+      <w:numFmt w:val="bullet"/>
+      <w:lvlText w:val=""/>
+      <w:lvlJc w:val="left"/>
+      <w:pPr>
+        <w:ind w:left="6480" w:hanging="360"/>
+      </w:pPr>
+      <w:rPr>
+        <w:rFonts w:ascii="Wingdings" w:hAnsi="Wingdings" w:hint="default"/>
+      </w:rPr>
+    </w:lvl>
+  </w:abstractNum>
+  <w:abstractNum w:abstractNumId="8" w15:restartNumberingAfterBreak="0">
     <w:nsid w:val="6F6B297F"/>
     <w:multiLevelType w:val="hybridMultilevel"/>
     <w:tmpl w:val="90604326"/>
@@ -2759,7 +3486,7 @@
       </w:rPr>
     </w:lvl>
   </w:abstractNum>
-  <w:abstractNum w:abstractNumId="6" w15:restartNumberingAfterBreak="0">
+  <w:abstractNum w:abstractNumId="9" w15:restartNumberingAfterBreak="0">
     <w:nsid w:val="7FE96A27"/>
     <w:multiLevelType w:val="multilevel"/>
     <w:tmpl w:val="2E109BCA"/>
@@ -2909,13 +3636,13 @@
     </w:lvl>
   </w:abstractNum>
   <w:num w:numId="1" w16cid:durableId="1329406315">
-    <w:abstractNumId w:val="5"/>
+    <w:abstractNumId w:val="8"/>
   </w:num>
   <w:num w:numId="2" w16cid:durableId="346176687">
-    <w:abstractNumId w:val="6"/>
+    <w:abstractNumId w:val="9"/>
   </w:num>
   <w:num w:numId="3" w16cid:durableId="588125869">
-    <w:abstractNumId w:val="2"/>
+    <w:abstractNumId w:val="3"/>
   </w:num>
   <w:num w:numId="4" w16cid:durableId="423965292">
     <w:abstractNumId w:val="1"/>
@@ -2924,9 +3651,18 @@
     <w:abstractNumId w:val="0"/>
   </w:num>
   <w:num w:numId="6" w16cid:durableId="1462187803">
-    <w:abstractNumId w:val="3"/>
+    <w:abstractNumId w:val="5"/>
   </w:num>
   <w:num w:numId="7" w16cid:durableId="313225329">
+    <w:abstractNumId w:val="6"/>
+  </w:num>
+  <w:num w:numId="8" w16cid:durableId="11156116">
+    <w:abstractNumId w:val="2"/>
+  </w:num>
+  <w:num w:numId="9" w16cid:durableId="1024936680">
+    <w:abstractNumId w:val="7"/>
+  </w:num>
+  <w:num w:numId="10" w16cid:durableId="1490097057">
     <w:abstractNumId w:val="4"/>
   </w:num>
 </w:numbering>

</xml_diff>

<commit_message>
Learned initContainers, pod deployment patterns, sidecar container etc
</commit_message>
<xml_diff>
--- a/9-Interesting_learning_Notes/Learning_Notes.docx
+++ b/9-Interesting_learning_Notes/Learning_Notes.docx
@@ -118,6 +118,7 @@
       <w:r>
         <w:t xml:space="preserve">, Kubernetes assigns it a </w:t>
       </w:r>
+      <w:proofErr w:type="spellStart"/>
       <w:r>
         <w:rPr>
           <w:b/>
@@ -125,6 +126,7 @@
         </w:rPr>
         <w:t>ClusterIP</w:t>
       </w:r>
+      <w:proofErr w:type="spellEnd"/>
       <w:r>
         <w:t xml:space="preserve">. </w:t>
       </w:r>
@@ -178,12 +180,21 @@
           <w:numId w:val="2"/>
         </w:numPr>
       </w:pPr>
-      <w:r>
-        <w:rPr>
-          <w:b/>
-          <w:bCs/>
-        </w:rPr>
-        <w:t>kube-proxy does not assign the Service IP.</w:t>
+      <w:proofErr w:type="spellStart"/>
+      <w:r>
+        <w:rPr>
+          <w:b/>
+          <w:bCs/>
+        </w:rPr>
+        <w:t>kube</w:t>
+      </w:r>
+      <w:proofErr w:type="spellEnd"/>
+      <w:r>
+        <w:rPr>
+          <w:b/>
+          <w:bCs/>
+        </w:rPr>
+        <w:t>-proxy does not assign the Service IP.</w:t>
       </w:r>
       <w:r>
         <w:t xml:space="preserve"> </w:t>
@@ -196,8 +207,13 @@
           <w:numId w:val="2"/>
         </w:numPr>
       </w:pPr>
-      <w:r>
-        <w:t xml:space="preserve">kube-proxy watches Services and creates </w:t>
+      <w:proofErr w:type="spellStart"/>
+      <w:r>
+        <w:t>kube</w:t>
+      </w:r>
+      <w:proofErr w:type="spellEnd"/>
+      <w:r>
+        <w:t xml:space="preserve">-proxy watches Services and creates </w:t>
       </w:r>
       <w:r>
         <w:rPr>
@@ -207,7 +223,15 @@
         <w:t>networking rules</w:t>
       </w:r>
       <w:r>
-        <w:t xml:space="preserve"> (iptables/IPVS/nftables) to route traffic from the Service IP to the backend Pod IPs.</w:t>
+        <w:t xml:space="preserve"> (iptables/IPVS/</w:t>
+      </w:r>
+      <w:proofErr w:type="spellStart"/>
+      <w:r>
+        <w:t>nftables</w:t>
+      </w:r>
+      <w:proofErr w:type="spellEnd"/>
+      <w:r>
+        <w:t>) to route traffic from the Service IP to the backend Pod IPs.</w:t>
       </w:r>
     </w:p>
     <w:p>
@@ -238,12 +262,21 @@
           <w:numId w:val="2"/>
         </w:numPr>
       </w:pPr>
-      <w:r>
-        <w:rPr>
-          <w:b/>
-          <w:bCs/>
-        </w:rPr>
-        <w:t>kube-proxy</w:t>
+      <w:proofErr w:type="spellStart"/>
+      <w:r>
+        <w:rPr>
+          <w:b/>
+          <w:bCs/>
+        </w:rPr>
+        <w:t>kube</w:t>
+      </w:r>
+      <w:proofErr w:type="spellEnd"/>
+      <w:r>
+        <w:rPr>
+          <w:b/>
+          <w:bCs/>
+        </w:rPr>
+        <w:t>-proxy</w:t>
       </w:r>
       <w:r>
         <w:t xml:space="preserve"> creates networking rules that recognize this virtual IP and forward traffic to the Service's backend Pods.</w:t>
@@ -288,19 +321,40 @@
         <w:t xml:space="preserve">: </w:t>
       </w:r>
       <w:r>
-        <w:t>A Kubernetes NodePort does not create a normal listening socket on the node. Instead, Kuberne</w:t>
+        <w:t xml:space="preserve">A Kubernetes </w:t>
+      </w:r>
+      <w:proofErr w:type="spellStart"/>
+      <w:r>
+        <w:t>NodePort</w:t>
+      </w:r>
+      <w:proofErr w:type="spellEnd"/>
+      <w:r>
+        <w:t xml:space="preserve"> does not create a normal listening socket on the node. Instead, </w:t>
+      </w:r>
+      <w:proofErr w:type="spellStart"/>
+      <w:r>
+        <w:t>Kuberne</w:t>
       </w:r>
       <w:r>
         <w:t>s</w:t>
       </w:r>
       <w:r>
-        <w:t>tes configures networking rules to forward traffic arriving on that port to the Service. Therefore, if a host-level application is already listening on the same port, traffic arriving through that node may be handled by the existing application instead of reaching the Kubernetes Service, depending on the networking implementation and rule processing.</w:t>
+        <w:t>tes</w:t>
+      </w:r>
+      <w:proofErr w:type="spellEnd"/>
+      <w:r>
+        <w:t xml:space="preserve"> configures networking rules to forward traffic arriving on that port to the Service. Therefore, if a host-level application is already listening on the same port, traffic arriving through that node may be handled by the existing application instead of reaching the Kubernetes Service, depending on the networking implementation and rule processing.</w:t>
       </w:r>
     </w:p>
     <w:p/>
     <w:p>
-      <w:r>
-        <w:t>NodePort 30005 does NOT mean:</w:t>
+      <w:proofErr w:type="spellStart"/>
+      <w:r>
+        <w:t>NodePort</w:t>
+      </w:r>
+      <w:proofErr w:type="spellEnd"/>
+      <w:r>
+        <w:t xml:space="preserve"> 30005 does NOT mean:</w:t>
       </w:r>
     </w:p>
     <w:p>
@@ -324,12 +378,21 @@
       <w:r>
         <w:t xml:space="preserve">packet gets </w:t>
       </w:r>
-      <w:r>
-        <w:rPr>
-          <w:b/>
-          <w:bCs/>
-        </w:rPr>
-        <w:t>DNAT'ed/redirected by the Kubernetes networking rules before normal socket delivery</w:t>
+      <w:proofErr w:type="spellStart"/>
+      <w:r>
+        <w:rPr>
+          <w:b/>
+          <w:bCs/>
+        </w:rPr>
+        <w:t>DNAT'ed</w:t>
+      </w:r>
+      <w:proofErr w:type="spellEnd"/>
+      <w:r>
+        <w:rPr>
+          <w:b/>
+          <w:bCs/>
+        </w:rPr>
+        <w:t>/redirected by the Kubernetes networking rules before normal socket delivery</w:t>
       </w:r>
       <w:r>
         <w:t>.</w:t>
@@ -346,6 +409,7 @@
       <w:r>
         <w:t xml:space="preserve">The full DNS to refer a service is: </w:t>
       </w:r>
+      <w:proofErr w:type="spellStart"/>
       <w:r>
         <w:rPr>
           <w:b/>
@@ -353,6 +417,7 @@
         </w:rPr>
         <w:t>myservice.default.svc.cluster.local</w:t>
       </w:r>
+      <w:proofErr w:type="spellEnd"/>
     </w:p>
     <w:p>
       <w:pPr>
@@ -379,8 +444,21 @@
     </w:p>
     <w:p>
       <w:r>
-        <w:t>The Structure of a Kubernetes Service DNS NameEvery Service gets a full DNS address that looks like this:[service-name].[namespace].svc.cluster.local</w:t>
-      </w:r>
+        <w:t xml:space="preserve">The Structure of a Kubernetes Service DNS </w:t>
+      </w:r>
+      <w:proofErr w:type="spellStart"/>
+      <w:r>
+        <w:t>NameEvery</w:t>
+      </w:r>
+      <w:proofErr w:type="spellEnd"/>
+      <w:r>
+        <w:t xml:space="preserve"> Service gets a full DNS address that looks like this:[service-name].[namespace].</w:t>
+      </w:r>
+      <w:proofErr w:type="spellStart"/>
+      <w:r>
+        <w:t>svc.cluster.local</w:t>
+      </w:r>
+      <w:proofErr w:type="spellEnd"/>
     </w:p>
     <w:p>
       <w:pPr>
@@ -390,8 +468,13 @@
           <w:numId w:val="3"/>
         </w:numPr>
       </w:pPr>
-      <w:r>
-        <w:t>service-name:The name you gave your Service.</w:t>
+      <w:proofErr w:type="spellStart"/>
+      <w:r>
+        <w:t>service-name:The</w:t>
+      </w:r>
+      <w:proofErr w:type="spellEnd"/>
+      <w:r>
+        <w:t xml:space="preserve"> name you gave your Service.</w:t>
       </w:r>
     </w:p>
     <w:p>
@@ -419,24 +502,93 @@
       </w:r>
     </w:p>
     <w:p>
-      <w:r>
-        <w:t>cluster.local: The default local domain name for your entire cluster.</w:t>
+      <w:proofErr w:type="spellStart"/>
+      <w:r>
+        <w:t>cluster.local</w:t>
+      </w:r>
+      <w:proofErr w:type="spellEnd"/>
+      <w:r>
+        <w:t>: The default local domain name for your entire cluster.</w:t>
       </w:r>
     </w:p>
     <w:p/>
     <w:p>
       <w:r>
-        <w:t>Scenario A Example: A pod in the "frontend" namespace connects to a database in the same namespace using just "db-service".</w:t>
-      </w:r>
-    </w:p>
-    <w:p>
-      <w:r>
-        <w:t>Scenario B Example: A pod in the "frontend" namespace connects to a database in the "backend" namespace using "db-service.backend".</w:t>
-      </w:r>
-    </w:p>
-    <w:p>
-      <w:r>
-        <w:t>The remaining part of the address—.svc.cluster.local—is called the cluster suffix. It is not mandatory because every container running inside a Kubernetes Pod has a hidden configuration file (/etc/resolv.conf) created automatically by the cluster. it contain all the search list.Because of this search list, if you type just db-service, Kubernetes automatically appends the remaining parts (.svc.cluster.local) behind the scenes and tests them one by one until it finds a match!</w:t>
+        <w:t>Scenario A Example: A pod in the "frontend" namespace connects to a database in the same namespace using just "</w:t>
+      </w:r>
+      <w:proofErr w:type="spellStart"/>
+      <w:r>
+        <w:t>db</w:t>
+      </w:r>
+      <w:proofErr w:type="spellEnd"/>
+      <w:r>
+        <w:t>-service".</w:t>
+      </w:r>
+    </w:p>
+    <w:p>
+      <w:r>
+        <w:t>Scenario B Example: A pod in the "frontend" namespace connects to a database in the "backend" namespace using "</w:t>
+      </w:r>
+      <w:proofErr w:type="spellStart"/>
+      <w:r>
+        <w:t>db-service.backend</w:t>
+      </w:r>
+      <w:proofErr w:type="spellEnd"/>
+      <w:r>
+        <w:t>".</w:t>
+      </w:r>
+    </w:p>
+    <w:p>
+      <w:r>
+        <w:t>The remaining part of the address—.</w:t>
+      </w:r>
+      <w:proofErr w:type="spellStart"/>
+      <w:r>
+        <w:t>svc.cluster.local</w:t>
+      </w:r>
+      <w:proofErr w:type="spellEnd"/>
+      <w:r>
+        <w:t>—is called the cluster suffix. It is not mandatory because every container running inside a Kubernetes Pod has a hidden configuration file (/</w:t>
+      </w:r>
+      <w:proofErr w:type="spellStart"/>
+      <w:r>
+        <w:t>etc</w:t>
+      </w:r>
+      <w:proofErr w:type="spellEnd"/>
+      <w:r>
+        <w:t>/</w:t>
+      </w:r>
+      <w:proofErr w:type="spellStart"/>
+      <w:r>
+        <w:t>resolv.conf</w:t>
+      </w:r>
+      <w:proofErr w:type="spellEnd"/>
+      <w:r>
+        <w:t xml:space="preserve">) created automatically by the cluster. it contain all the search </w:t>
+      </w:r>
+      <w:proofErr w:type="spellStart"/>
+      <w:r>
+        <w:t>list.Because</w:t>
+      </w:r>
+      <w:proofErr w:type="spellEnd"/>
+      <w:r>
+        <w:t xml:space="preserve"> of this search list, if you type just </w:t>
+      </w:r>
+      <w:proofErr w:type="spellStart"/>
+      <w:r>
+        <w:t>db</w:t>
+      </w:r>
+      <w:proofErr w:type="spellEnd"/>
+      <w:r>
+        <w:t>-service, Kubernetes automatically appends the remaining parts (.</w:t>
+      </w:r>
+      <w:proofErr w:type="spellStart"/>
+      <w:r>
+        <w:t>svc.cluster.local</w:t>
+      </w:r>
+      <w:proofErr w:type="spellEnd"/>
+      <w:r>
+        <w:t>) behind the scenes and tests them one by one until it finds a match!</w:t>
       </w:r>
     </w:p>
     <w:p>
@@ -468,7 +620,7 @@
                     <pic:cNvPicPr/>
                   </pic:nvPicPr>
                   <pic:blipFill>
-                    <a:blip r:embed="rId6"/>
+                    <a:blip r:embed="rId8"/>
                     <a:stretch>
                       <a:fillRect/>
                     </a:stretch>
@@ -519,8 +671,13 @@
       <w:r>
         <w:t xml:space="preserve"> </w:t>
       </w:r>
-      <w:r>
-        <w:t xml:space="preserve">kubectl </w:t>
+      <w:proofErr w:type="spellStart"/>
+      <w:r>
+        <w:t>kubectl</w:t>
+      </w:r>
+      <w:proofErr w:type="spellEnd"/>
+      <w:r>
+        <w:t xml:space="preserve"> </w:t>
       </w:r>
       <w:r>
         <w:rPr>
@@ -530,7 +687,15 @@
         <w:t>edit</w:t>
       </w:r>
       <w:r>
-        <w:t xml:space="preserve"> svc my-nodeport-service</w:t>
+        <w:t xml:space="preserve"> svc my-</w:t>
+      </w:r>
+      <w:proofErr w:type="spellStart"/>
+      <w:r>
+        <w:t>nodeport</w:t>
+      </w:r>
+      <w:proofErr w:type="spellEnd"/>
+      <w:r>
+        <w:t>-service</w:t>
       </w:r>
     </w:p>
     <w:p>
@@ -549,11 +714,16 @@
       <w:r>
         <w:t xml:space="preserve"> </w:t>
       </w:r>
+      <w:proofErr w:type="spellStart"/>
       <w:r>
         <w:t>k</w:t>
       </w:r>
       <w:r>
-        <w:t xml:space="preserve">ubectl </w:t>
+        <w:t>ubectl</w:t>
+      </w:r>
+      <w:proofErr w:type="spellEnd"/>
+      <w:r>
+        <w:t xml:space="preserve"> </w:t>
       </w:r>
       <w:r>
         <w:t xml:space="preserve">get pods </w:t>
@@ -684,10 +854,7 @@
         <w:t>IMPORTANT INFORMATION</w:t>
       </w:r>
       <w:r>
-        <w:t xml:space="preserve">:  </w:t>
-      </w:r>
-      <w:r>
-        <w:t xml:space="preserve">use </w:t>
+        <w:t xml:space="preserve">:  use </w:t>
       </w:r>
       <w:r>
         <w:rPr>
@@ -704,11 +871,16 @@
       </w:r>
     </w:p>
     <w:p>
+      <w:proofErr w:type="spellStart"/>
       <w:r>
         <w:t>k</w:t>
       </w:r>
       <w:r>
-        <w:t>ubectl run pods -h  #This will shows example usages and explanations.</w:t>
+        <w:t>ubectl</w:t>
+      </w:r>
+      <w:proofErr w:type="spellEnd"/>
+      <w:r>
+        <w:t xml:space="preserve"> run pods -h  #This will shows example usages and explanations.</w:t>
       </w:r>
     </w:p>
     <w:p/>
@@ -721,16 +893,45 @@
       </w:pPr>
     </w:p>
     <w:p>
-      <w:r>
-        <w:t>kubectl api-resources -o wide</w:t>
-      </w:r>
-      <w:r>
-        <w:t xml:space="preserve"> : shows all resources of Kubernetes. Helps to find the apiversion.  </w:t>
-      </w:r>
-    </w:p>
-    <w:p>
-      <w:r>
-        <w:t>When you run kubectl get all, the resources that should be included in the “</w:t>
+      <w:proofErr w:type="spellStart"/>
+      <w:r>
+        <w:t>kubectl</w:t>
+      </w:r>
+      <w:proofErr w:type="spellEnd"/>
+      <w:r>
+        <w:t xml:space="preserve"> </w:t>
+      </w:r>
+      <w:proofErr w:type="spellStart"/>
+      <w:r>
+        <w:t>api</w:t>
+      </w:r>
+      <w:proofErr w:type="spellEnd"/>
+      <w:r>
+        <w:t>-resources -o wide</w:t>
+      </w:r>
+      <w:r>
+        <w:t xml:space="preserve"> : shows all resources of Kubernetes. Helps to find the </w:t>
+      </w:r>
+      <w:proofErr w:type="spellStart"/>
+      <w:r>
+        <w:t>apiversion</w:t>
+      </w:r>
+      <w:proofErr w:type="spellEnd"/>
+      <w:r>
+        <w:t xml:space="preserve">.  </w:t>
+      </w:r>
+    </w:p>
+    <w:p>
+      <w:r>
+        <w:t xml:space="preserve">When you run </w:t>
+      </w:r>
+      <w:proofErr w:type="spellStart"/>
+      <w:r>
+        <w:t>kubectl</w:t>
+      </w:r>
+      <w:proofErr w:type="spellEnd"/>
+      <w:r>
+        <w:t xml:space="preserve"> get all, the resources that should be included in the “</w:t>
       </w:r>
       <w:r>
         <w:rPr>
@@ -742,8 +943,21 @@
       <w:r>
         <w:t>” can be seen in the output of “</w:t>
       </w:r>
-      <w:r>
-        <w:t>kubectl api-resources -o wide</w:t>
+      <w:proofErr w:type="spellStart"/>
+      <w:r>
+        <w:t>kubectl</w:t>
+      </w:r>
+      <w:proofErr w:type="spellEnd"/>
+      <w:r>
+        <w:t xml:space="preserve"> </w:t>
+      </w:r>
+      <w:proofErr w:type="spellStart"/>
+      <w:r>
+        <w:t>api</w:t>
+      </w:r>
+      <w:proofErr w:type="spellEnd"/>
+      <w:r>
+        <w:t>-resources -o wide</w:t>
       </w:r>
       <w:r>
         <w:t xml:space="preserve">” command, under the </w:t>
@@ -765,7 +979,15 @@
     <w:p/>
     <w:p>
       <w:r>
-        <w:t>The cluster-info CA certificate in kube-public acts just like the trusted root certificates in your web browser, allowing new clients to safely verify the identity of the Kubernetes API server during a secure TLS connection.</w:t>
+        <w:t xml:space="preserve">The cluster-info CA certificate in </w:t>
+      </w:r>
+      <w:proofErr w:type="spellStart"/>
+      <w:r>
+        <w:t>kube</w:t>
+      </w:r>
+      <w:proofErr w:type="spellEnd"/>
+      <w:r>
+        <w:t>-public acts just like the trusted root certificates in your web browser, allowing new clients to safely verify the identity of the Kubernetes API server during a secure TLS connection.</w:t>
       </w:r>
     </w:p>
     <w:p/>
@@ -785,9 +1007,14 @@
       </w:r>
     </w:p>
     <w:p>
+      <w:proofErr w:type="spellStart"/>
       <w:r>
         <w:lastRenderedPageBreak/>
-        <w:t>kubectl apply -f folder/ does not guarantee resource creation order.</w:t>
+        <w:t>kubectl</w:t>
+      </w:r>
+      <w:proofErr w:type="spellEnd"/>
+      <w:r>
+        <w:t xml:space="preserve"> apply -f folder/ does not guarantee resource creation order.</w:t>
       </w:r>
     </w:p>
     <w:p>
@@ -819,13 +1046,53 @@
     </w:p>
     <w:p>
       <w:r>
-        <w:t>When PID 1 exits, the container runtime records its exit code, and kubelet uses that result along with the restartPolicy to decide whether to restart the container.</w:t>
+        <w:t xml:space="preserve">When PID 1 exits, the container runtime records its exit code, and </w:t>
+      </w:r>
+      <w:proofErr w:type="spellStart"/>
+      <w:r>
+        <w:t>kubelet</w:t>
+      </w:r>
+      <w:proofErr w:type="spellEnd"/>
+      <w:r>
+        <w:t xml:space="preserve"> uses that result along with the </w:t>
+      </w:r>
+      <w:proofErr w:type="spellStart"/>
+      <w:r>
+        <w:t>restartPolicy</w:t>
+      </w:r>
+      <w:proofErr w:type="spellEnd"/>
+      <w:r>
+        <w:t xml:space="preserve"> to decide whether to restart the container.</w:t>
       </w:r>
     </w:p>
     <w:p/>
     <w:p>
       <w:r>
-        <w:t>Kubernetes stores the last applied configuration in the same live object configuration in etcd. It uses this and the actual yaml to decide how modifications need to be performed when using kubectl apply command</w:t>
+        <w:t xml:space="preserve">Kubernetes stores the last applied configuration in the same live object configuration in </w:t>
+      </w:r>
+      <w:proofErr w:type="spellStart"/>
+      <w:r>
+        <w:t>etcd</w:t>
+      </w:r>
+      <w:proofErr w:type="spellEnd"/>
+      <w:r>
+        <w:t xml:space="preserve">. It uses this and the actual </w:t>
+      </w:r>
+      <w:proofErr w:type="spellStart"/>
+      <w:r>
+        <w:t>yaml</w:t>
+      </w:r>
+      <w:proofErr w:type="spellEnd"/>
+      <w:r>
+        <w:t xml:space="preserve"> to decide how modifications need to be performed when using </w:t>
+      </w:r>
+      <w:proofErr w:type="spellStart"/>
+      <w:r>
+        <w:t>kubectl</w:t>
+      </w:r>
+      <w:proofErr w:type="spellEnd"/>
+      <w:r>
+        <w:t xml:space="preserve"> apply command</w:t>
       </w:r>
       <w:r>
         <w:t>s</w:t>
@@ -852,7 +1119,7 @@
                     <pic:cNvPicPr/>
                   </pic:nvPicPr>
                   <pic:blipFill>
-                    <a:blip r:embed="rId7"/>
+                    <a:blip r:embed="rId9"/>
                     <a:stretch>
                       <a:fillRect/>
                     </a:stretch>
@@ -876,7 +1143,15 @@
     <w:p/>
     <w:p>
       <w:r>
-        <w:t>You can manually schedule a pod using the nodeName property. It can be used</w:t>
+        <w:t xml:space="preserve">You can manually schedule a pod using the </w:t>
+      </w:r>
+      <w:proofErr w:type="spellStart"/>
+      <w:r>
+        <w:t>nodeName</w:t>
+      </w:r>
+      <w:proofErr w:type="spellEnd"/>
+      <w:r>
+        <w:t xml:space="preserve"> property. It can be used</w:t>
       </w:r>
       <w:r>
         <w:t xml:space="preserve"> in situations where s</w:t>
@@ -887,15 +1162,32 @@
     </w:p>
     <w:p/>
     <w:p>
-      <w:r>
-        <w:rPr>
-          <w:b/>
-          <w:bCs/>
-        </w:rPr>
-        <w:t>PriorityClass:</w:t>
-      </w:r>
-      <w:r>
-        <w:t xml:space="preserve"> A Kubernetes object that defines the priority of Pods. Higher-priority Pods are scheduled before lower-priority Pods and can preempt (evict) lower-priority Pods when resources are insufficient.</w:t>
+      <w:proofErr w:type="spellStart"/>
+      <w:r>
+        <w:rPr>
+          <w:b/>
+          <w:bCs/>
+        </w:rPr>
+        <w:t>PriorityClass</w:t>
+      </w:r>
+      <w:proofErr w:type="spellEnd"/>
+      <w:r>
+        <w:rPr>
+          <w:b/>
+          <w:bCs/>
+        </w:rPr>
+        <w:t>:</w:t>
+      </w:r>
+      <w:r>
+        <w:t xml:space="preserve"> A Kubernetes object that defines the priority of Pods. Higher-priority Pods are scheduled before lower-priority Pods and can </w:t>
+      </w:r>
+      <w:proofErr w:type="spellStart"/>
+      <w:r>
+        <w:t>preempt</w:t>
+      </w:r>
+      <w:proofErr w:type="spellEnd"/>
+      <w:r>
+        <w:t xml:space="preserve"> (evict) lower-priority Pods when resources are insufficient.</w:t>
       </w:r>
     </w:p>
     <w:p>
@@ -920,7 +1212,15 @@
         <w:t>-</w:t>
       </w:r>
       <w:r>
-        <w:t xml:space="preserve"> Pod has higher priority → scheduled first and can preempt lower-priority Pods. </w:t>
+        <w:t xml:space="preserve"> Pod has higher priority → scheduled first and can </w:t>
+      </w:r>
+      <w:proofErr w:type="spellStart"/>
+      <w:r>
+        <w:t>preempt</w:t>
+      </w:r>
+      <w:proofErr w:type="spellEnd"/>
+      <w:r>
+        <w:t xml:space="preserve"> lower-priority Pods. </w:t>
       </w:r>
     </w:p>
     <w:p>
@@ -945,7 +1245,15 @@
         <w:t>-</w:t>
       </w:r>
       <w:r>
-        <w:t xml:space="preserve"> Pod has lower priority → scheduled later and can be preempted by higher-priority Pods.</w:t>
+        <w:t xml:space="preserve"> Pod has lower priority → scheduled later and can be </w:t>
+      </w:r>
+      <w:proofErr w:type="spellStart"/>
+      <w:r>
+        <w:t>preempted</w:t>
+      </w:r>
+      <w:proofErr w:type="spellEnd"/>
+      <w:r>
+        <w:t xml:space="preserve"> by higher-priority Pods.</w:t>
       </w:r>
     </w:p>
     <w:p>
@@ -975,23 +1283,44 @@
           <w:numId w:val="4"/>
         </w:numPr>
       </w:pPr>
-      <w:r>
-        <w:t>preemptionPolicy: PreemptLowerPriority</w:t>
-      </w:r>
+      <w:proofErr w:type="spellStart"/>
+      <w:r>
+        <w:t>preemptionPolicy</w:t>
+      </w:r>
+      <w:proofErr w:type="spellEnd"/>
+      <w:r>
+        <w:t xml:space="preserve">: </w:t>
+      </w:r>
+      <w:proofErr w:type="spellStart"/>
+      <w:r>
+        <w:t>PreemptLowerPriority</w:t>
+      </w:r>
+      <w:proofErr w:type="spellEnd"/>
       <w:r>
         <w:t xml:space="preserve">  or </w:t>
       </w:r>
-      <w:r>
-        <w:t>preemptionPolicy: Never</w:t>
+      <w:proofErr w:type="spellStart"/>
+      <w:r>
+        <w:t>preemptionPolicy</w:t>
+      </w:r>
+      <w:proofErr w:type="spellEnd"/>
+      <w:r>
+        <w:t>: Never</w:t>
       </w:r>
       <w:r>
         <w:t>s</w:t>
       </w:r>
     </w:p>
     <w:p>
-      <w:r>
-        <w:t xml:space="preserve">kubectl logs commands only displays the applications </w:t>
-      </w:r>
+      <w:proofErr w:type="spellStart"/>
+      <w:r>
+        <w:t>kubectl</w:t>
+      </w:r>
+      <w:proofErr w:type="spellEnd"/>
+      <w:r>
+        <w:t xml:space="preserve"> logs commands only displays the applications </w:t>
+      </w:r>
+      <w:proofErr w:type="spellStart"/>
       <w:r>
         <w:rPr>
           <w:b/>
@@ -999,6 +1328,7 @@
         </w:rPr>
         <w:t>stdout</w:t>
       </w:r>
+      <w:proofErr w:type="spellEnd"/>
       <w:r>
         <w:t xml:space="preserve"> and </w:t>
       </w:r>
@@ -1023,7 +1353,15 @@
         <w:t>logs.</w:t>
       </w:r>
       <w:r>
-        <w:t xml:space="preserve"> etc those stored in /var/</w:t>
+        <w:t xml:space="preserve"> </w:t>
+      </w:r>
+      <w:proofErr w:type="spellStart"/>
+      <w:r>
+        <w:t>etc</w:t>
+      </w:r>
+      <w:proofErr w:type="spellEnd"/>
+      <w:r>
+        <w:t xml:space="preserve"> those stored in /var/</w:t>
       </w:r>
       <w:r>
         <w:t>…</w:t>
@@ -1060,8 +1398,13 @@
         <w:t>Eg: “</w:t>
       </w:r>
       <w:r>
-        <w:t xml:space="preserve"> my-scheduler, my-scheduler-my-scheduler   Successfully assigned default/nginx to controlplan</w:t>
-      </w:r>
+        <w:t xml:space="preserve"> my-scheduler, my-scheduler-my-scheduler   Successfully assigned default/nginx to </w:t>
+      </w:r>
+      <w:proofErr w:type="spellStart"/>
+      <w:r>
+        <w:t>controlplan</w:t>
+      </w:r>
+      <w:proofErr w:type="spellEnd"/>
       <w:r>
         <w:t>”</w:t>
       </w:r>
@@ -1094,7 +1437,23 @@
         <w:t>Queue → Filter → Score → Bind</w:t>
       </w:r>
       <w:r>
-        <w:t>. Queue selects a pending Pod, Filter eliminates nodes where the Pod cannot run, Score ranks the remaining nodes, and Bind assigns the Pod to the selected node. The scheduler records the selected node in the Pod object's spec.nodeName field. The kubelet on that node then starts the Pod.</w:t>
+        <w:t xml:space="preserve">. Queue selects a pending Pod, Filter eliminates nodes where the Pod cannot run, Score ranks the remaining nodes, and Bind assigns the Pod to the selected node. The scheduler records the selected node in the Pod object's </w:t>
+      </w:r>
+      <w:proofErr w:type="spellStart"/>
+      <w:r>
+        <w:t>spec.nodeName</w:t>
+      </w:r>
+      <w:proofErr w:type="spellEnd"/>
+      <w:r>
+        <w:t xml:space="preserve"> field. The </w:t>
+      </w:r>
+      <w:proofErr w:type="spellStart"/>
+      <w:r>
+        <w:t>kubelet</w:t>
+      </w:r>
+      <w:proofErr w:type="spellEnd"/>
+      <w:r>
+        <w:t xml:space="preserve"> on that node then starts the Pod.</w:t>
       </w:r>
     </w:p>
     <w:p/>
@@ -1116,7 +1475,15 @@
         <w:t>Scheduler profiles</w:t>
       </w:r>
       <w:r>
-        <w:t xml:space="preserve"> are different configurations of the same kube-scheduler. Each profile can have its own </w:t>
+        <w:t xml:space="preserve"> are different configurations of the same </w:t>
+      </w:r>
+      <w:proofErr w:type="spellStart"/>
+      <w:r>
+        <w:t>kube</w:t>
+      </w:r>
+      <w:proofErr w:type="spellEnd"/>
+      <w:r>
+        <w:t xml:space="preserve">-scheduler. Each profile can have its own </w:t>
       </w:r>
       <w:r>
         <w:rPr>
@@ -1126,7 +1493,15 @@
         <w:t>scheduler plugins</w:t>
       </w:r>
       <w:r>
-        <w:t xml:space="preserve"> enabled, disabled, or configured. A Pod selects a profile using spec.schedulerName. Plugins implement scheduling logic at stages such as </w:t>
+        <w:t xml:space="preserve"> enabled, disabled, or configured. A Pod selects a profile using </w:t>
+      </w:r>
+      <w:proofErr w:type="spellStart"/>
+      <w:r>
+        <w:t>spec.schedulerName</w:t>
+      </w:r>
+      <w:proofErr w:type="spellEnd"/>
+      <w:r>
+        <w:t xml:space="preserve">. Plugins implement scheduling logic at stages such as </w:t>
       </w:r>
       <w:r>
         <w:rPr>
@@ -1165,6 +1540,66 @@
         </w:rPr>
         <w:t>:</w:t>
       </w:r>
+    </w:p>
+    <w:p>
+      <w:r>
+        <w:t xml:space="preserve">An </w:t>
+      </w:r>
+      <w:r>
+        <w:rPr>
+          <w:b/>
+          <w:bCs/>
+        </w:rPr>
+        <w:t>Admission Controller</w:t>
+      </w:r>
+      <w:r>
+        <w:t xml:space="preserve"> intercepts API requests after authentication and authorization but before the object is stored in </w:t>
+      </w:r>
+      <w:proofErr w:type="spellStart"/>
+      <w:r>
+        <w:t>etcd</w:t>
+      </w:r>
+      <w:proofErr w:type="spellEnd"/>
+      <w:r>
+        <w:t xml:space="preserve">. It can </w:t>
+      </w:r>
+      <w:r>
+        <w:rPr>
+          <w:b/>
+          <w:bCs/>
+        </w:rPr>
+        <w:t>validate, modify, or reject</w:t>
+      </w:r>
+      <w:r>
+        <w:t xml:space="preserve"> requests. Admission controllers are used to enforce cluster-wide policies such as requiring security settings, labels, resource limits, or approved container images. </w:t>
+      </w:r>
+      <w:r>
+        <w:rPr>
+          <w:b/>
+          <w:bCs/>
+        </w:rPr>
+        <w:t>Real-world use case:</w:t>
+      </w:r>
+      <w:r>
+        <w:t xml:space="preserve"> a company can use an admission controller to reject Pods that use images from untrusted registries and allow only images from its approved private registry.</w:t>
+      </w:r>
+    </w:p>
+    <w:p>
+      <w:r>
+        <w:rPr>
+          <w:b/>
+          <w:bCs/>
+        </w:rPr>
+        <w:t xml:space="preserve">How Kubernetes determine to allow or </w:t>
+      </w:r>
+      <w:proofErr w:type="spellStart"/>
+      <w:r>
+        <w:rPr>
+          <w:b/>
+          <w:bCs/>
+        </w:rPr>
+        <w:t>deny:</w:t>
+      </w:r>
       <w:r>
         <w:rPr>
           <w:b/>
@@ -1172,62 +1607,211 @@
         </w:rPr>
         <w:t>s</w:t>
       </w:r>
-    </w:p>
-    <w:p>
-      <w:r>
-        <w:t xml:space="preserve">An </w:t>
-      </w:r>
-      <w:r>
-        <w:rPr>
-          <w:b/>
-          <w:bCs/>
-        </w:rPr>
-        <w:t>Admission Controller</w:t>
-      </w:r>
-      <w:r>
-        <w:t xml:space="preserve"> intercepts API requests after authentication and authorization but before the object is stored in etcd. It can </w:t>
-      </w:r>
-      <w:r>
-        <w:rPr>
-          <w:b/>
-          <w:bCs/>
-        </w:rPr>
-        <w:t>validate, modify, or reject</w:t>
-      </w:r>
-      <w:r>
-        <w:t xml:space="preserve"> requests. Admission controllers are used to enforce cluster-wide policies such as requiring security settings, labels, resource limits, or approved container images. </w:t>
-      </w:r>
-      <w:r>
-        <w:rPr>
-          <w:b/>
-          <w:bCs/>
-        </w:rPr>
-        <w:t>Real-world use case:</w:t>
-      </w:r>
-      <w:r>
-        <w:t xml:space="preserve"> a company can use an admission controller to reject Pods that use images from untrusted registries and allow only images from its approved private registry.</w:t>
-      </w:r>
-    </w:p>
-    <w:p>
-      <w:r>
-        <w:rPr>
-          <w:b/>
-          <w:bCs/>
-        </w:rPr>
-        <w:t>How Kubernetes determine to allow or deny:</w:t>
-      </w:r>
-      <w:r>
-        <w:rPr>
-          <w:b/>
-          <w:bCs/>
-        </w:rPr>
+      <w:proofErr w:type="spellEnd"/>
+    </w:p>
+    <w:p>
+      <w:r>
+        <w:t xml:space="preserve">The </w:t>
+      </w:r>
+      <w:proofErr w:type="spellStart"/>
+      <w:r>
+        <w:t>ImagePolicyWebhook</w:t>
+      </w:r>
+      <w:proofErr w:type="spellEnd"/>
+      <w:r>
+        <w:t xml:space="preserve"> sends information about the requested container image to an external webhook. The webhook performs its own policy logic and then returns an </w:t>
+      </w:r>
+      <w:proofErr w:type="spellStart"/>
+      <w:r>
+        <w:t>ImageReview</w:t>
+      </w:r>
+      <w:proofErr w:type="spellEnd"/>
+      <w:r>
+        <w:t xml:space="preserve"> response. Kubernetes does not care how the webhook makes its decision; it expects the decision in the </w:t>
+      </w:r>
+      <w:proofErr w:type="spellStart"/>
+      <w:r>
+        <w:t>status.allowed</w:t>
+      </w:r>
+      <w:proofErr w:type="spellEnd"/>
+      <w:r>
+        <w:t xml:space="preserve"> field. </w:t>
+      </w:r>
+      <w:proofErr w:type="spellStart"/>
+      <w:r>
+        <w:t>status.allowed</w:t>
+      </w:r>
+      <w:proofErr w:type="spellEnd"/>
+      <w:r>
+        <w:t xml:space="preserve">: true allows the image, while </w:t>
+      </w:r>
+      <w:proofErr w:type="spellStart"/>
+      <w:r>
+        <w:t>status.allowed</w:t>
+      </w:r>
+      <w:proofErr w:type="spellEnd"/>
+      <w:r>
+        <w:t>: false rejects it.</w:t>
+      </w:r>
+    </w:p>
+    <w:p/>
+    <w:p>
+      <w:pPr>
+        <w:rPr>
+          <w:b/>
+          <w:bCs/>
+        </w:rPr>
+      </w:pPr>
+      <w:r>
+        <w:rPr>
+          <w:b/>
+          <w:bCs/>
+        </w:rPr>
+        <w:t>ENTRYPOINT can be written in two forms:</w:t>
+      </w:r>
+    </w:p>
+    <w:p>
+      <w:pPr>
+        <w:rPr>
+          <w:b/>
+          <w:bCs/>
+        </w:rPr>
+      </w:pPr>
+      <w:r>
+        <w:rPr>
+          <w:b/>
+          <w:bCs/>
+        </w:rPr>
+        <w:t>In Docker:</w:t>
+      </w:r>
+    </w:p>
+    <w:p>
+      <w:r>
+        <w:t>Exec form: ENTRYPOINT ["command"] — runs the command directly. CMD or arguments passed with docker run are appended as arguments. Recommended for applications.</w:t>
+      </w:r>
+    </w:p>
+    <w:p>
+      <w:r>
+        <w:t>Shell form: ENTRYPOINT command — runs through /bin/</w:t>
+      </w:r>
+      <w:proofErr w:type="spellStart"/>
+      <w:r>
+        <w:t>sh</w:t>
+      </w:r>
+      <w:proofErr w:type="spellEnd"/>
+      <w:r>
+        <w:t xml:space="preserve"> -c. CMD and runtime arguments are not passed to the </w:t>
+      </w:r>
+      <w:proofErr w:type="spellStart"/>
+      <w:r>
+        <w:t>entrypoint</w:t>
+      </w:r>
+      <w:proofErr w:type="spellEnd"/>
+      <w:r>
+        <w:t xml:space="preserve"> command in the normal way. Useful when shell features such as &amp;&amp;, pipes, or variable expansion are required.</w:t>
+      </w:r>
+    </w:p>
+    <w:p>
+      <w:r>
+        <w:t>Rule: Use exec form for normal applications; use shell form when shell behavior is specifically required.</w:t>
+      </w:r>
+    </w:p>
+    <w:p>
+      <w:r>
+        <w:rPr>
+          <w:b/>
+          <w:bCs/>
+        </w:rPr>
+        <w:t>ENTRYPOINT</w:t>
+      </w:r>
+      <w:r>
+        <w:t xml:space="preserve"> provides the main executable; </w:t>
+      </w:r>
+      <w:r>
+        <w:rPr>
+          <w:b/>
+          <w:bCs/>
+        </w:rPr>
+        <w:t>CMD</w:t>
+      </w:r>
+      <w:r>
+        <w:t xml:space="preserve"> provides default arguments to it, which can be overridden by arguments supplied to docker run.</w:t>
+      </w:r>
+    </w:p>
+    <w:p/>
+    <w:p>
+      <w:r>
+        <w:t xml:space="preserve">To over ride an entry point, use the  </w:t>
+      </w:r>
+      <w:r>
+        <w:rPr>
+          <w:b/>
+          <w:bCs/>
+        </w:rPr>
+        <w:t>“--</w:t>
+      </w:r>
+      <w:proofErr w:type="spellStart"/>
+      <w:r>
+        <w:rPr>
+          <w:b/>
+          <w:bCs/>
+        </w:rPr>
+        <w:t>entrypoint</w:t>
+      </w:r>
+      <w:proofErr w:type="spellEnd"/>
+      <w:r>
+        <w:rPr>
+          <w:b/>
+          <w:bCs/>
+        </w:rPr>
+        <w:t>”</w:t>
+      </w:r>
+      <w:r>
+        <w:t xml:space="preserve"> flag.</w:t>
+      </w:r>
+    </w:p>
+    <w:p>
+      <w:proofErr w:type="spellStart"/>
+      <w:r>
+        <w:t>eg</w:t>
+      </w:r>
+      <w:proofErr w:type="spellEnd"/>
+      <w:r>
+        <w:t xml:space="preserve">: </w:t>
+      </w:r>
+      <w:r>
+        <w:t xml:space="preserve">docker run </w:t>
+      </w:r>
+      <w:r>
+        <w:rPr>
+          <w:b/>
+          <w:bCs/>
+        </w:rPr>
+        <w:t>--</w:t>
+      </w:r>
+      <w:proofErr w:type="spellStart"/>
+      <w:r>
+        <w:rPr>
+          <w:b/>
+          <w:bCs/>
+        </w:rPr>
+        <w:t>entrypoint</w:t>
+      </w:r>
+      <w:proofErr w:type="spellEnd"/>
+      <w:r>
+        <w:t xml:space="preserve"> ls image</w:t>
+      </w:r>
+      <w:r>
+        <w:t xml:space="preserve">  # This override the default entry point with </w:t>
+      </w:r>
+      <w:proofErr w:type="spellStart"/>
+      <w:r>
+        <w:t>ls</w:t>
+      </w:r>
+      <w:r>
         <w:t>s</w:t>
       </w:r>
-    </w:p>
-    <w:p>
-      <w:r>
-        <w:t>The ImagePolicyWebhook sends information about the requested container image to an external webhook. The webhook performs its own policy logic and then returns an ImageReview response. Kubernetes does not care how the webhook makes its decision; it expects the decision in the status.allowed field. status.allowed: true allows the image, while status.allowed: false rejects it.</w:t>
-      </w:r>
+      <w:proofErr w:type="spellEnd"/>
     </w:p>
     <w:p/>
     <w:p>
@@ -1242,114 +1826,6 @@
           <w:b/>
           <w:bCs/>
         </w:rPr>
-        <w:t>ENTRYPOINT can be written in two forms:</w:t>
-      </w:r>
-    </w:p>
-    <w:p>
-      <w:pPr>
-        <w:rPr>
-          <w:b/>
-          <w:bCs/>
-        </w:rPr>
-      </w:pPr>
-      <w:r>
-        <w:rPr>
-          <w:b/>
-          <w:bCs/>
-        </w:rPr>
-        <w:t>In Docker:</w:t>
-      </w:r>
-    </w:p>
-    <w:p>
-      <w:r>
-        <w:t>Exec form: ENTRYPOINT ["command"] — runs the command directly. CMD or arguments passed with docker run are appended as arguments. Recommended for applications.</w:t>
-      </w:r>
-    </w:p>
-    <w:p>
-      <w:r>
-        <w:t>Shell form: ENTRYPOINT command — runs through /bin/sh -c. CMD and runtime arguments are not passed to the entrypoint command in the normal way. Useful when shell features such as &amp;&amp;, pipes, or variable expansion are required.</w:t>
-      </w:r>
-    </w:p>
-    <w:p>
-      <w:r>
-        <w:t>Rule: Use exec form for normal applications; use shell form when shell behavior is specifically required.</w:t>
-      </w:r>
-    </w:p>
-    <w:p>
-      <w:r>
-        <w:rPr>
-          <w:b/>
-          <w:bCs/>
-        </w:rPr>
-        <w:t>ENTRYPOINT</w:t>
-      </w:r>
-      <w:r>
-        <w:t xml:space="preserve"> provides the main executable; </w:t>
-      </w:r>
-      <w:r>
-        <w:rPr>
-          <w:b/>
-          <w:bCs/>
-        </w:rPr>
-        <w:t>CMD</w:t>
-      </w:r>
-      <w:r>
-        <w:t xml:space="preserve"> provides default arguments to it, which can be overridden by arguments supplied to docker run.</w:t>
-      </w:r>
-    </w:p>
-    <w:p/>
-    <w:p>
-      <w:r>
-        <w:t xml:space="preserve">To over ride an entry point, use the  </w:t>
-      </w:r>
-      <w:r>
-        <w:rPr>
-          <w:b/>
-          <w:bCs/>
-        </w:rPr>
-        <w:t>“--entrypoint”</w:t>
-      </w:r>
-      <w:r>
-        <w:t xml:space="preserve"> flag.</w:t>
-      </w:r>
-    </w:p>
-    <w:p>
-      <w:r>
-        <w:t xml:space="preserve">eg: </w:t>
-      </w:r>
-      <w:r>
-        <w:t xml:space="preserve">docker run </w:t>
-      </w:r>
-      <w:r>
-        <w:rPr>
-          <w:b/>
-          <w:bCs/>
-        </w:rPr>
-        <w:t>--entrypoint</w:t>
-      </w:r>
-      <w:r>
-        <w:t xml:space="preserve"> ls image</w:t>
-      </w:r>
-      <w:r>
-        <w:t xml:space="preserve">  # This override the default entry point with ls</w:t>
-      </w:r>
-      <w:r>
-        <w:t>s</w:t>
-      </w:r>
-    </w:p>
-    <w:p/>
-    <w:p>
-      <w:pPr>
-        <w:rPr>
-          <w:b/>
-          <w:bCs/>
-        </w:rPr>
-      </w:pPr>
-      <w:r>
-        <w:rPr>
-          <w:b/>
-          <w:bCs/>
-        </w:rPr>
         <w:t>In Kubernetes:</w:t>
       </w:r>
     </w:p>
@@ -1406,6 +1882,7 @@
         </w:rPr>
         <w:t xml:space="preserve"> </w:t>
       </w:r>
+      <w:proofErr w:type="spellStart"/>
       <w:r>
         <w:rPr>
           <w:b/>
@@ -1413,6 +1890,7 @@
         </w:rPr>
         <w:t>args</w:t>
       </w:r>
+      <w:proofErr w:type="spellEnd"/>
       <w:r>
         <w:t xml:space="preserve">  # This is the argument passed to the entry point. This will be appended as an argument to entry point</w:t>
       </w:r>
@@ -1432,16 +1910,57 @@
           <w:b/>
           <w:bCs/>
         </w:rPr>
-        <w:t>Difference between kubectl create vs kubectl apply</w:t>
-      </w:r>
-    </w:p>
-    <w:p>
-      <w:r>
-        <w:rPr>
-          <w:b/>
-          <w:bCs/>
-        </w:rPr>
-        <w:t>kubectl create</w:t>
+        <w:t xml:space="preserve">Difference between </w:t>
+      </w:r>
+      <w:proofErr w:type="spellStart"/>
+      <w:r>
+        <w:rPr>
+          <w:b/>
+          <w:bCs/>
+        </w:rPr>
+        <w:t>kubectl</w:t>
+      </w:r>
+      <w:proofErr w:type="spellEnd"/>
+      <w:r>
+        <w:rPr>
+          <w:b/>
+          <w:bCs/>
+        </w:rPr>
+        <w:t xml:space="preserve"> create vs </w:t>
+      </w:r>
+      <w:proofErr w:type="spellStart"/>
+      <w:r>
+        <w:rPr>
+          <w:b/>
+          <w:bCs/>
+        </w:rPr>
+        <w:t>kubectl</w:t>
+      </w:r>
+      <w:proofErr w:type="spellEnd"/>
+      <w:r>
+        <w:rPr>
+          <w:b/>
+          <w:bCs/>
+        </w:rPr>
+        <w:t xml:space="preserve"> apply</w:t>
+      </w:r>
+    </w:p>
+    <w:p>
+      <w:proofErr w:type="spellStart"/>
+      <w:r>
+        <w:rPr>
+          <w:b/>
+          <w:bCs/>
+        </w:rPr>
+        <w:t>kubectl</w:t>
+      </w:r>
+      <w:proofErr w:type="spellEnd"/>
+      <w:r>
+        <w:rPr>
+          <w:b/>
+          <w:bCs/>
+        </w:rPr>
+        <w:t xml:space="preserve"> create</w:t>
       </w:r>
       <w:r>
         <w:t xml:space="preserve"> </w:t>
@@ -1454,12 +1973,21 @@
       </w:r>
     </w:p>
     <w:p>
-      <w:r>
-        <w:rPr>
-          <w:b/>
-          <w:bCs/>
-        </w:rPr>
-        <w:t>kubectl apply</w:t>
+      <w:proofErr w:type="spellStart"/>
+      <w:r>
+        <w:rPr>
+          <w:b/>
+          <w:bCs/>
+        </w:rPr>
+        <w:t>kubectl</w:t>
+      </w:r>
+      <w:proofErr w:type="spellEnd"/>
+      <w:r>
+        <w:rPr>
+          <w:b/>
+          <w:bCs/>
+        </w:rPr>
+        <w:t xml:space="preserve"> apply</w:t>
       </w:r>
       <w:r>
         <w:t xml:space="preserve"> </w:t>
@@ -1495,11 +2023,28 @@
     </w:p>
     <w:p>
       <w:r>
-        <w:t>It gets metrics from kubelets, which expose cAdvisor derived container metrics.</w:t>
+        <w:t xml:space="preserve">It gets metrics from </w:t>
+      </w:r>
+      <w:proofErr w:type="spellStart"/>
+      <w:r>
+        <w:t>kubelets</w:t>
+      </w:r>
+      <w:proofErr w:type="spellEnd"/>
+      <w:r>
+        <w:t xml:space="preserve">, which expose </w:t>
+      </w:r>
+      <w:proofErr w:type="spellStart"/>
+      <w:r>
+        <w:t>cAdvisor</w:t>
+      </w:r>
+      <w:proofErr w:type="spellEnd"/>
+      <w:r>
+        <w:t xml:space="preserve"> derived container metrics.</w:t>
       </w:r>
     </w:p>
     <w:p/>
     <w:p>
+      <w:proofErr w:type="spellStart"/>
       <w:r>
         <w:rPr>
           <w:b/>
@@ -1507,8 +2052,25 @@
         </w:rPr>
         <w:t>cAdvisor</w:t>
       </w:r>
-      <w:r>
-        <w:t xml:space="preserve"> is part of kubelet and collects container resource metrics. Metrics Server collects metrics from kubelets and provides them through the Kubernetes Metrics API.</w:t>
+      <w:proofErr w:type="spellEnd"/>
+      <w:r>
+        <w:t xml:space="preserve"> is part of </w:t>
+      </w:r>
+      <w:proofErr w:type="spellStart"/>
+      <w:r>
+        <w:t>kubelet</w:t>
+      </w:r>
+      <w:proofErr w:type="spellEnd"/>
+      <w:r>
+        <w:t xml:space="preserve"> and collects container resource metrics. Metrics Server collects metrics from </w:t>
+      </w:r>
+      <w:proofErr w:type="spellStart"/>
+      <w:r>
+        <w:t>kubelets</w:t>
+      </w:r>
+      <w:proofErr w:type="spellEnd"/>
+      <w:r>
+        <w:t xml:space="preserve"> and provides them through the Kubernetes Metrics API.</w:t>
       </w:r>
     </w:p>
     <w:p>
@@ -1517,13 +2079,26 @@
       </w:r>
     </w:p>
     <w:p>
-      <w:r>
-        <w:t>kubectl top pods</w:t>
-      </w:r>
-    </w:p>
-    <w:p>
-      <w:r>
-        <w:t xml:space="preserve"> kubectl top nodes</w:t>
+      <w:proofErr w:type="spellStart"/>
+      <w:r>
+        <w:t>kubectl</w:t>
+      </w:r>
+      <w:proofErr w:type="spellEnd"/>
+      <w:r>
+        <w:t xml:space="preserve"> top pods</w:t>
+      </w:r>
+    </w:p>
+    <w:p>
+      <w:r>
+        <w:t xml:space="preserve"> </w:t>
+      </w:r>
+      <w:proofErr w:type="spellStart"/>
+      <w:r>
+        <w:t>kubectl</w:t>
+      </w:r>
+      <w:proofErr w:type="spellEnd"/>
+      <w:r>
+        <w:t xml:space="preserve"> top nodes</w:t>
       </w:r>
     </w:p>
     <w:p/>
@@ -1544,7 +2119,15 @@
     </w:p>
     <w:p>
       <w:r>
-        <w:t xml:space="preserve">Kubernetes does not use a single CA for all components. Most control plane components (API Server, kube-proxy, scheduler, controller-manager, admin clients) use the </w:t>
+        <w:t xml:space="preserve">Kubernetes does not use a single CA for all components. Most control plane components (API Server, </w:t>
+      </w:r>
+      <w:proofErr w:type="spellStart"/>
+      <w:r>
+        <w:t>kube</w:t>
+      </w:r>
+      <w:proofErr w:type="spellEnd"/>
+      <w:r>
+        <w:t xml:space="preserve">-proxy, scheduler, controller-manager, admin clients) use the </w:t>
       </w:r>
       <w:r>
         <w:rPr>
@@ -1578,6 +2161,235 @@
       </w:r>
     </w:p>
     <w:p/>
+    <w:p/>
+    <w:p>
+      <w:pPr>
+        <w:rPr>
+          <w:b/>
+          <w:bCs/>
+        </w:rPr>
+      </w:pPr>
+      <w:r>
+        <w:rPr>
+          <w:b/>
+          <w:bCs/>
+        </w:rPr>
+        <w:t>Init Container vs Sidecar Container</w:t>
+      </w:r>
+      <w:r>
+        <w:rPr>
+          <w:b/>
+          <w:bCs/>
+        </w:rPr>
+        <w:t xml:space="preserve"> (POD Deployment Patterns)</w:t>
+      </w:r>
+    </w:p>
+    <w:p>
+      <w:pPr>
+        <w:pStyle w:val="ListParagraph"/>
+        <w:numPr>
+          <w:ilvl w:val="0"/>
+          <w:numId w:val="11"/>
+        </w:numPr>
+      </w:pPr>
+      <w:r>
+        <w:rPr>
+          <w:b/>
+          <w:bCs/>
+        </w:rPr>
+        <w:t>Init Container:</w:t>
+      </w:r>
+      <w:r>
+        <w:t xml:space="preserve"> Runs before the main container, completes its task, then exits.</w:t>
+      </w:r>
+    </w:p>
+    <w:p>
+      <w:r>
+        <w:t>Initialization tasks</w:t>
+      </w:r>
+      <w:r>
+        <w:t xml:space="preserve">: </w:t>
+      </w:r>
+      <w:r>
+        <w:t xml:space="preserve"> download files, prepare configuration, wait for dependencies.</w:t>
+      </w:r>
+    </w:p>
+    <w:p>
+      <w:pPr>
+        <w:pStyle w:val="ListParagraph"/>
+        <w:numPr>
+          <w:ilvl w:val="0"/>
+          <w:numId w:val="11"/>
+        </w:numPr>
+      </w:pPr>
+      <w:r>
+        <w:rPr>
+          <w:b/>
+          <w:bCs/>
+        </w:rPr>
+        <w:t>Sidecar Container:</w:t>
+      </w:r>
+      <w:r>
+        <w:t xml:space="preserve"> A </w:t>
+      </w:r>
+      <w:proofErr w:type="spellStart"/>
+      <w:r>
+        <w:t>restartable</w:t>
+      </w:r>
+      <w:proofErr w:type="spellEnd"/>
+      <w:r>
+        <w:t xml:space="preserve"> </w:t>
+      </w:r>
+      <w:proofErr w:type="spellStart"/>
+      <w:r>
+        <w:t>init</w:t>
+      </w:r>
+      <w:proofErr w:type="spellEnd"/>
+      <w:r>
+        <w:t xml:space="preserve"> container (</w:t>
+      </w:r>
+      <w:proofErr w:type="spellStart"/>
+      <w:r>
+        <w:t>restartPolicy</w:t>
+      </w:r>
+      <w:proofErr w:type="spellEnd"/>
+      <w:r>
+        <w:t>: Always) that starts during Pod initialization and continues running alongside the main container.</w:t>
+      </w:r>
+    </w:p>
+    <w:p>
+      <w:r>
+        <w:t>Ongoing support</w:t>
+      </w:r>
+      <w:r>
+        <w:t xml:space="preserve">: </w:t>
+      </w:r>
+      <w:r>
+        <w:t>log collection, proxy, monitoring, or traffic handling.</w:t>
+      </w:r>
+    </w:p>
+    <w:p/>
+    <w:p/>
+    <w:p/>
+    <w:p/>
+    <w:p>
+      <w:r>
+        <w:lastRenderedPageBreak/>
+        <w:t xml:space="preserve">This is the sidecar container. It is an </w:t>
+      </w:r>
+      <w:proofErr w:type="spellStart"/>
+      <w:r>
+        <w:rPr>
+          <w:b/>
+          <w:bCs/>
+        </w:rPr>
+        <w:t>init</w:t>
+      </w:r>
+      <w:proofErr w:type="spellEnd"/>
+      <w:r>
+        <w:rPr>
+          <w:b/>
+          <w:bCs/>
+        </w:rPr>
+        <w:t xml:space="preserve"> container</w:t>
+      </w:r>
+      <w:r>
+        <w:t xml:space="preserve"> </w:t>
+      </w:r>
+      <w:r>
+        <w:t>with</w:t>
+      </w:r>
+      <w:r>
+        <w:rPr>
+          <w:b/>
+          <w:bCs/>
+        </w:rPr>
+        <w:t xml:space="preserve"> </w:t>
+      </w:r>
+      <w:proofErr w:type="spellStart"/>
+      <w:r>
+        <w:rPr>
+          <w:b/>
+          <w:bCs/>
+        </w:rPr>
+        <w:t>restartPolicy</w:t>
+      </w:r>
+      <w:proofErr w:type="spellEnd"/>
+      <w:r>
+        <w:t xml:space="preserve"> set to </w:t>
+      </w:r>
+      <w:r>
+        <w:rPr>
+          <w:b/>
+          <w:bCs/>
+        </w:rPr>
+        <w:t>Always</w:t>
+      </w:r>
+    </w:p>
+    <w:p>
+      <w:r>
+        <w:drawing>
+          <wp:inline distT="0" distB="0" distL="0" distR="0" wp14:anchorId="13E7C990" wp14:editId="0F50F41B">
+            <wp:extent cx="5943600" cy="2802890"/>
+            <wp:effectExtent l="0" t="0" r="0" b="0"/>
+            <wp:docPr id="1067287718" name="Picture 1"/>
+            <wp:cNvGraphicFramePr>
+              <a:graphicFrameLocks xmlns:a="http://schemas.openxmlformats.org/drawingml/2006/main" noChangeAspect="1"/>
+            </wp:cNvGraphicFramePr>
+            <a:graphic xmlns:a="http://schemas.openxmlformats.org/drawingml/2006/main">
+              <a:graphicData uri="http://schemas.openxmlformats.org/drawingml/2006/picture">
+                <pic:pic xmlns:pic="http://schemas.openxmlformats.org/drawingml/2006/picture">
+                  <pic:nvPicPr>
+                    <pic:cNvPr id="1067287718" name=""/>
+                    <pic:cNvPicPr/>
+                  </pic:nvPicPr>
+                  <pic:blipFill>
+                    <a:blip r:embed="rId10"/>
+                    <a:stretch>
+                      <a:fillRect/>
+                    </a:stretch>
+                  </pic:blipFill>
+                  <pic:spPr>
+                    <a:xfrm>
+                      <a:off x="0" y="0"/>
+                      <a:ext cx="5943600" cy="2802890"/>
+                    </a:xfrm>
+                    <a:prstGeom prst="rect">
+                      <a:avLst/>
+                    </a:prstGeom>
+                  </pic:spPr>
+                </pic:pic>
+              </a:graphicData>
+            </a:graphic>
+          </wp:inline>
+        </w:drawing>
+      </w:r>
+    </w:p>
+    <w:p>
+      <w:r>
+        <w:t xml:space="preserve">A sidecar is an </w:t>
+      </w:r>
+      <w:proofErr w:type="spellStart"/>
+      <w:r>
+        <w:t>init</w:t>
+      </w:r>
+      <w:proofErr w:type="spellEnd"/>
+      <w:r>
+        <w:t xml:space="preserve"> container with </w:t>
+      </w:r>
+      <w:proofErr w:type="spellStart"/>
+      <w:r>
+        <w:t>restartPolicy</w:t>
+      </w:r>
+      <w:proofErr w:type="spellEnd"/>
+      <w:r>
+        <w:t>: Always. It starts during Pod initialization and continues running alongside the main container, restarting if it exits.</w:t>
+      </w:r>
+    </w:p>
+    <w:p/>
+    <w:p/>
+    <w:p/>
+    <w:p/>
     <w:p>
       <w:pPr>
         <w:jc w:val="center"/>
@@ -1605,7 +2417,15 @@
         <w:t>default,</w:t>
       </w:r>
       <w:r>
-        <w:t xml:space="preserve"> etcd </w:t>
+        <w:t xml:space="preserve"> </w:t>
+      </w:r>
+      <w:proofErr w:type="spellStart"/>
+      <w:r>
+        <w:t>etcd</w:t>
+      </w:r>
+      <w:proofErr w:type="spellEnd"/>
+      <w:r>
+        <w:t xml:space="preserve"> </w:t>
       </w:r>
       <w:r>
         <w:rPr>
@@ -1630,6 +2450,9 @@
     </w:p>
     <w:p>
       <w:r>
+        <w:rPr>
+          <w:noProof/>
+        </w:rPr>
         <w:drawing>
           <wp:inline distT="0" distB="0" distL="0" distR="0" wp14:anchorId="28C8B639" wp14:editId="555A1D94">
             <wp:extent cx="5943600" cy="1991995"/>
@@ -1646,7 +2469,7 @@
                     <pic:cNvPicPr/>
                   </pic:nvPicPr>
                   <pic:blipFill>
-                    <a:blip r:embed="rId8"/>
+                    <a:blip r:embed="rId11"/>
                     <a:stretch>
                       <a:fillRect/>
                     </a:stretch>
@@ -1670,11 +2493,32 @@
     <w:p/>
     <w:p>
       <w:r>
-        <w:t xml:space="preserve">ETCD stores Kubernetes objects as raw bytes (protobuf format). In a hexdump, the left side shows the actual hexadecimal byte values, while the right side shows their ASCII </w:t>
-      </w:r>
-      <w:r>
         <w:lastRenderedPageBreak/>
-        <w:t>representation. Printable bytes appear as text, and non-printable protobuf metadata is displayed as dots (.).</w:t>
+        <w:t>ETCD stores Kubernetes objects as raw bytes (</w:t>
+      </w:r>
+      <w:proofErr w:type="spellStart"/>
+      <w:r>
+        <w:t>protobuf</w:t>
+      </w:r>
+      <w:proofErr w:type="spellEnd"/>
+      <w:r>
+        <w:t xml:space="preserve"> format). In a </w:t>
+      </w:r>
+      <w:proofErr w:type="spellStart"/>
+      <w:r>
+        <w:t>hexdump</w:t>
+      </w:r>
+      <w:proofErr w:type="spellEnd"/>
+      <w:r>
+        <w:t xml:space="preserve">, the left side shows the actual hexadecimal byte values, while the right side shows their ASCII representation. Printable bytes appear as text, and non-printable </w:t>
+      </w:r>
+      <w:proofErr w:type="spellStart"/>
+      <w:r>
+        <w:t>protobuf</w:t>
+      </w:r>
+      <w:proofErr w:type="spellEnd"/>
+      <w:r>
+        <w:t xml:space="preserve"> metadata is displayed as dots (.).</w:t>
       </w:r>
     </w:p>
     <w:p>
@@ -1690,7 +2534,15 @@
         <w:t xml:space="preserve"> </w:t>
       </w:r>
       <w:r>
-        <w:t>Enabling Encryption at Rest does not automatically encrypt existing data in etcd. Only newly created or updated resources are encrypted. Existing resources must be rewritten (updated/recreated) to be stored in encrypted form.</w:t>
+        <w:t xml:space="preserve">Enabling Encryption at Rest does not automatically encrypt existing data in </w:t>
+      </w:r>
+      <w:proofErr w:type="spellStart"/>
+      <w:r>
+        <w:t>etcd</w:t>
+      </w:r>
+      <w:proofErr w:type="spellEnd"/>
+      <w:r>
+        <w:t>. Only newly created or updated resources are encrypted. Existing resources must be rewritten (updated/recreated) to be stored in encrypted form.</w:t>
       </w:r>
     </w:p>
     <w:p>
@@ -1700,6 +2552,9 @@
     </w:p>
     <w:p>
       <w:r>
+        <w:rPr>
+          <w:noProof/>
+        </w:rPr>
         <w:drawing>
           <wp:inline distT="0" distB="0" distL="0" distR="0" wp14:anchorId="3DF02678" wp14:editId="64B4DA3C">
             <wp:extent cx="5943600" cy="518160"/>
@@ -1716,7 +2571,7 @@
                     <pic:cNvPicPr/>
                   </pic:nvPicPr>
                   <pic:blipFill>
-                    <a:blip r:embed="rId9"/>
+                    <a:blip r:embed="rId12"/>
                     <a:stretch>
                       <a:fillRect/>
                     </a:stretch>
@@ -1739,17 +2594,49 @@
     </w:p>
     <w:p>
       <w:r>
-        <w:t>It gets the yaml and passes it to kubectl replace -f command: it will recreate the resource.</w:t>
-      </w:r>
-    </w:p>
-    <w:p>
-      <w:r>
-        <w:t>When Encryption at Rest is enabled, back up both the ETCD snapshot and the EncryptionConfiguration (including encryption keys). Without the original key, encrypted data in ETCD cannot be decrypted after a restore.</w:t>
-      </w:r>
-    </w:p>
-    <w:p>
-      <w:r>
-        <w:t>Never replace an encryption key directly. Add the new key alongside the old key for key rotation. If the original encryption key is lost and no backup exists, Kubernetes may be unable to decrypt previously encrypted Secrets stored in etcd.</w:t>
+        <w:t xml:space="preserve">It gets the </w:t>
+      </w:r>
+      <w:proofErr w:type="spellStart"/>
+      <w:r>
+        <w:t>yaml</w:t>
+      </w:r>
+      <w:proofErr w:type="spellEnd"/>
+      <w:r>
+        <w:t xml:space="preserve"> and passes it to </w:t>
+      </w:r>
+      <w:proofErr w:type="spellStart"/>
+      <w:r>
+        <w:t>kubectl</w:t>
+      </w:r>
+      <w:proofErr w:type="spellEnd"/>
+      <w:r>
+        <w:t xml:space="preserve"> replace -f command: it will recreate the resource.</w:t>
+      </w:r>
+    </w:p>
+    <w:p>
+      <w:r>
+        <w:t xml:space="preserve">When Encryption at Rest is enabled, back up both the ETCD snapshot and the </w:t>
+      </w:r>
+      <w:proofErr w:type="spellStart"/>
+      <w:r>
+        <w:t>EncryptionConfiguration</w:t>
+      </w:r>
+      <w:proofErr w:type="spellEnd"/>
+      <w:r>
+        <w:t xml:space="preserve"> (including encryption keys). Without the original key, encrypted data in ETCD cannot be decrypted after a restore.</w:t>
+      </w:r>
+    </w:p>
+    <w:p>
+      <w:r>
+        <w:t xml:space="preserve">Never replace an encryption key directly. Add the new key alongside the old key for key rotation. If the original encryption key is lost and no backup exists, Kubernetes may be unable to decrypt previously encrypted Secrets stored in </w:t>
+      </w:r>
+      <w:proofErr w:type="spellStart"/>
+      <w:r>
+        <w:t>etcd</w:t>
+      </w:r>
+      <w:proofErr w:type="spellEnd"/>
+      <w:r>
+        <w:t>.</w:t>
       </w:r>
     </w:p>
     <w:p/>
@@ -1773,7 +2660,15 @@
     </w:p>
     <w:p>
       <w:r>
-        <w:t>A ConfigMap stores non-sensitive configuration data for applications, such as environment variables, configuration files, or command-line arguments.</w:t>
+        <w:t xml:space="preserve">A </w:t>
+      </w:r>
+      <w:proofErr w:type="spellStart"/>
+      <w:r>
+        <w:t>ConfigMap</w:t>
+      </w:r>
+      <w:proofErr w:type="spellEnd"/>
+      <w:r>
+        <w:t xml:space="preserve"> stores non-sensitive configuration data for applications, such as environment variables, configuration files, or command-line arguments.</w:t>
       </w:r>
     </w:p>
     <w:p>
@@ -1808,8 +2703,21 @@
       </w:r>
     </w:p>
     <w:p>
-      <w:r>
-        <w:t>kubectl create configmap app-config --from-literal=APP_COLOR=blue</w:t>
+      <w:proofErr w:type="spellStart"/>
+      <w:r>
+        <w:t>kubectl</w:t>
+      </w:r>
+      <w:proofErr w:type="spellEnd"/>
+      <w:r>
+        <w:t xml:space="preserve"> create </w:t>
+      </w:r>
+      <w:proofErr w:type="spellStart"/>
+      <w:r>
+        <w:t>configmap</w:t>
+      </w:r>
+      <w:proofErr w:type="spellEnd"/>
+      <w:r>
+        <w:t xml:space="preserve"> app-config --from-literal=APP_COLOR=blue</w:t>
       </w:r>
     </w:p>
     <w:p/>
@@ -1834,8 +2742,21 @@
       </w:r>
     </w:p>
     <w:p>
-      <w:r>
-        <w:t>kubectl create configmap app-config --from-file=config.txt</w:t>
+      <w:proofErr w:type="spellStart"/>
+      <w:r>
+        <w:t>kubectl</w:t>
+      </w:r>
+      <w:proofErr w:type="spellEnd"/>
+      <w:r>
+        <w:t xml:space="preserve"> create </w:t>
+      </w:r>
+      <w:proofErr w:type="spellStart"/>
+      <w:r>
+        <w:t>configmap</w:t>
+      </w:r>
+      <w:proofErr w:type="spellEnd"/>
+      <w:r>
+        <w:t xml:space="preserve"> app-config --from-file=config.txt</w:t>
       </w:r>
     </w:p>
     <w:p/>
@@ -1856,14 +2777,31 @@
           <w:b/>
           <w:bCs/>
         </w:rPr>
-        <w:lastRenderedPageBreak/>
         <w:t>From an environment file:</w:t>
       </w:r>
     </w:p>
     <w:p>
-      <w:r>
-        <w:t>kubectl create configmap app-config --from-env-file=app.env</w:t>
-      </w:r>
+      <w:proofErr w:type="spellStart"/>
+      <w:r>
+        <w:t>kubectl</w:t>
+      </w:r>
+      <w:proofErr w:type="spellEnd"/>
+      <w:r>
+        <w:t xml:space="preserve"> create </w:t>
+      </w:r>
+      <w:proofErr w:type="spellStart"/>
+      <w:r>
+        <w:t>configmap</w:t>
+      </w:r>
+      <w:proofErr w:type="spellEnd"/>
+      <w:r>
+        <w:t xml:space="preserve"> app-config --from-env-file=</w:t>
+      </w:r>
+      <w:proofErr w:type="spellStart"/>
+      <w:r>
+        <w:t>app.env</w:t>
+      </w:r>
+      <w:proofErr w:type="spellEnd"/>
     </w:p>
     <w:p/>
     <w:p>
@@ -1907,7 +2845,7 @@
                     <pic:cNvPicPr/>
                   </pic:nvPicPr>
                   <pic:blipFill>
-                    <a:blip r:embed="rId10"/>
+                    <a:blip r:embed="rId13"/>
                     <a:stretch>
                       <a:fillRect/>
                     </a:stretch>
@@ -1941,8 +2879,17 @@
           <w:b/>
           <w:bCs/>
         </w:rPr>
-        <w:t>injecting a ConfigMap</w:t>
-      </w:r>
+        <w:t xml:space="preserve">injecting a </w:t>
+      </w:r>
+      <w:proofErr w:type="spellStart"/>
+      <w:r>
+        <w:rPr>
+          <w:b/>
+          <w:bCs/>
+        </w:rPr>
+        <w:t>ConfigMap</w:t>
+      </w:r>
+      <w:proofErr w:type="spellEnd"/>
       <w:r>
         <w:t xml:space="preserve">, it is specified at the </w:t>
       </w:r>
@@ -1958,8 +2905,21 @@
       </w:r>
     </w:p>
     <w:p>
-      <w:r>
-        <w:t xml:space="preserve">ConfigMap can be consumed through environment variables, command/args, or a </w:t>
+      <w:proofErr w:type="spellStart"/>
+      <w:r>
+        <w:t>ConfigMap</w:t>
+      </w:r>
+      <w:proofErr w:type="spellEnd"/>
+      <w:r>
+        <w:t xml:space="preserve"> can be consumed through environment variables, command/</w:t>
+      </w:r>
+      <w:proofErr w:type="spellStart"/>
+      <w:r>
+        <w:t>args</w:t>
+      </w:r>
+      <w:proofErr w:type="spellEnd"/>
+      <w:r>
+        <w:t xml:space="preserve">, or a </w:t>
       </w:r>
       <w:r>
         <w:rPr>
@@ -1969,12 +2929,33 @@
         <w:t>volume</w:t>
       </w:r>
       <w:r>
-        <w:t>. Workloads like Deployments and StatefulSets use ConfigMaps through their Pod templates.</w:t>
-      </w:r>
-    </w:p>
-    <w:p>
-      <w:r>
-        <w:t xml:space="preserve">configMapKeyRef </w:t>
+        <w:t xml:space="preserve">. Workloads like Deployments and </w:t>
+      </w:r>
+      <w:proofErr w:type="spellStart"/>
+      <w:r>
+        <w:t>StatefulSets</w:t>
+      </w:r>
+      <w:proofErr w:type="spellEnd"/>
+      <w:r>
+        <w:t xml:space="preserve"> use </w:t>
+      </w:r>
+      <w:proofErr w:type="spellStart"/>
+      <w:r>
+        <w:t>ConfigMaps</w:t>
+      </w:r>
+      <w:proofErr w:type="spellEnd"/>
+      <w:r>
+        <w:t xml:space="preserve"> through their Pod templates.</w:t>
+      </w:r>
+    </w:p>
+    <w:p>
+      <w:proofErr w:type="spellStart"/>
+      <w:r>
+        <w:t>configMapKeyRef</w:t>
+      </w:r>
+      <w:proofErr w:type="spellEnd"/>
+      <w:r>
+        <w:t xml:space="preserve"> </w:t>
       </w:r>
       <w:r>
         <w:t>-</w:t>
@@ -1990,8 +2971,13 @@
       </w:r>
     </w:p>
     <w:p>
-      <w:r>
-        <w:t xml:space="preserve">configMapRef </w:t>
+      <w:proofErr w:type="spellStart"/>
+      <w:r>
+        <w:t>configMapRef</w:t>
+      </w:r>
+      <w:proofErr w:type="spellEnd"/>
+      <w:r>
+        <w:t xml:space="preserve"> </w:t>
       </w:r>
       <w:r>
         <w:t xml:space="preserve">-  Inject </w:t>
@@ -2051,7 +3037,15 @@
         <w:t>Base64-encoded</w:t>
       </w:r>
       <w:r>
-        <w:t xml:space="preserve"> values, while stringData accepts </w:t>
+        <w:t xml:space="preserve"> values, while </w:t>
+      </w:r>
+      <w:proofErr w:type="spellStart"/>
+      <w:r>
+        <w:t>stringData</w:t>
+      </w:r>
+      <w:proofErr w:type="spellEnd"/>
+      <w:r>
+        <w:t xml:space="preserve"> accepts </w:t>
       </w:r>
       <w:r>
         <w:rPr>
@@ -2098,6 +3092,7 @@
         <w:rPr>
           <w:noProof/>
         </w:rPr>
+        <w:lastRenderedPageBreak/>
         <w:drawing>
           <wp:inline distT="0" distB="0" distL="0" distR="0" wp14:anchorId="4B08613D" wp14:editId="1B873A41">
             <wp:extent cx="3029373" cy="638264"/>
@@ -2114,7 +3109,7 @@
                     <pic:cNvPicPr/>
                   </pic:nvPicPr>
                   <pic:blipFill>
-                    <a:blip r:embed="rId11"/>
+                    <a:blip r:embed="rId14"/>
                     <a:stretch>
                       <a:fillRect/>
                     </a:stretch>
@@ -2144,7 +3139,15 @@
         <w:t>Declarative: (</w:t>
       </w:r>
       <w:r>
-        <w:t xml:space="preserve">Using stringData </w:t>
+        <w:t xml:space="preserve">Using </w:t>
+      </w:r>
+      <w:proofErr w:type="spellStart"/>
+      <w:r>
+        <w:t>stringData</w:t>
+      </w:r>
+      <w:proofErr w:type="spellEnd"/>
+      <w:r>
+        <w:t xml:space="preserve"> </w:t>
       </w:r>
       <w:r>
         <w:t xml:space="preserve">- </w:t>
@@ -2177,7 +3180,7 @@
                     <pic:cNvPicPr/>
                   </pic:nvPicPr>
                   <pic:blipFill>
-                    <a:blip r:embed="rId12"/>
+                    <a:blip r:embed="rId15"/>
                     <a:stretch>
                       <a:fillRect/>
                     </a:stretch>
@@ -2225,7 +3228,7 @@
                     <pic:cNvPicPr/>
                   </pic:nvPicPr>
                   <pic:blipFill>
-                    <a:blip r:embed="rId13"/>
+                    <a:blip r:embed="rId16"/>
                     <a:stretch>
                       <a:fillRect/>
                     </a:stretch>
@@ -2294,6 +3297,7 @@
         </w:numPr>
       </w:pPr>
       <w:r>
+        <w:lastRenderedPageBreak/>
         <w:t xml:space="preserve">Enabling Encryption at Rest for Secrets so they are stored encrypted in ETCD. </w:t>
       </w:r>
     </w:p>
@@ -2310,8 +3314,23 @@
           <w:b/>
           <w:bCs/>
         </w:rPr>
-        <w:lastRenderedPageBreak/>
-        <w:t>Way kubernetes handles secrets:</w:t>
+        <w:t xml:space="preserve">Way </w:t>
+      </w:r>
+      <w:proofErr w:type="spellStart"/>
+      <w:r>
+        <w:rPr>
+          <w:b/>
+          <w:bCs/>
+        </w:rPr>
+        <w:t>kubernetes</w:t>
+      </w:r>
+      <w:proofErr w:type="spellEnd"/>
+      <w:r>
+        <w:rPr>
+          <w:b/>
+          <w:bCs/>
+        </w:rPr>
+        <w:t xml:space="preserve"> handles secrets:</w:t>
       </w:r>
     </w:p>
     <w:p>
@@ -2334,8 +3353,21 @@
           <w:numId w:val="9"/>
         </w:numPr>
       </w:pPr>
-      <w:r>
-        <w:t>Kubelet stores the secret into a tmpfs so that the secret is not written to disk storage.</w:t>
+      <w:proofErr w:type="spellStart"/>
+      <w:r>
+        <w:t>Kubelet</w:t>
+      </w:r>
+      <w:proofErr w:type="spellEnd"/>
+      <w:r>
+        <w:t xml:space="preserve"> stores the secret into a </w:t>
+      </w:r>
+      <w:proofErr w:type="spellStart"/>
+      <w:r>
+        <w:t>tmpfs</w:t>
+      </w:r>
+      <w:proofErr w:type="spellEnd"/>
+      <w:r>
+        <w:t xml:space="preserve"> so that the secret is not written to disk storage.</w:t>
       </w:r>
     </w:p>
     <w:p>
@@ -2347,7 +3379,15 @@
         </w:numPr>
       </w:pPr>
       <w:r>
-        <w:t>Once the Pod that depends on the secret is deleted, kubelet will delete its local copy of the secret data as well.</w:t>
+        <w:t xml:space="preserve">Once the Pod that depends on the secret is deleted, </w:t>
+      </w:r>
+      <w:proofErr w:type="spellStart"/>
+      <w:r>
+        <w:t>kubelet</w:t>
+      </w:r>
+      <w:proofErr w:type="spellEnd"/>
+      <w:r>
+        <w:t xml:space="preserve"> will delete its local copy of the secret data as well.</w:t>
       </w:r>
     </w:p>
     <w:p/>
@@ -2370,7 +3410,15 @@
     <w:p/>
     <w:p>
       <w:r>
-        <w:t>To delete all pods together: kubectl delete pods –all</w:t>
+        <w:t xml:space="preserve">To delete all pods together: </w:t>
+      </w:r>
+      <w:proofErr w:type="spellStart"/>
+      <w:r>
+        <w:t>kubectl</w:t>
+      </w:r>
+      <w:proofErr w:type="spellEnd"/>
+      <w:r>
+        <w:t xml:space="preserve"> delete pods –all</w:t>
       </w:r>
     </w:p>
     <w:p>
@@ -2381,17 +3429,27 @@
         <w:t>resources</w:t>
       </w:r>
       <w:r>
-        <w:t>: kubectl delete pods --all -n &lt;namespace-name&gt;</w:t>
+        <w:t xml:space="preserve">: </w:t>
+      </w:r>
+      <w:proofErr w:type="spellStart"/>
+      <w:r>
+        <w:t>kubectl</w:t>
+      </w:r>
+      <w:proofErr w:type="spellEnd"/>
+      <w:r>
+        <w:t xml:space="preserve"> delete pods --all -n &lt;namespace-name&gt;</w:t>
       </w:r>
     </w:p>
     <w:p/>
     <w:p>
+      <w:proofErr w:type="spellStart"/>
       <w:r>
         <w:t>k</w:t>
       </w:r>
       <w:r>
         <w:t>ubectl</w:t>
       </w:r>
+      <w:proofErr w:type="spellEnd"/>
       <w:r>
         <w:t xml:space="preserve"> get pods --show-</w:t>
       </w:r>
@@ -2410,27 +3468,85 @@
     </w:p>
     <w:p/>
     <w:p>
+      <w:proofErr w:type="spellStart"/>
       <w:r>
         <w:t>ku</w:t>
       </w:r>
       <w:r>
-        <w:t xml:space="preserve">bectl apply -f file.yaml → Creates the resource if it doesn't exist, or updates it if it already exists. </w:t>
-      </w:r>
-    </w:p>
-    <w:p>
-      <w:r>
-        <w:t>kubectl replace -f file.yaml → Replaces an existing resource. It fails if the resource doesn't exist.</w:t>
+        <w:t>bectl</w:t>
+      </w:r>
+      <w:proofErr w:type="spellEnd"/>
+      <w:r>
+        <w:t xml:space="preserve"> apply -f </w:t>
+      </w:r>
+      <w:proofErr w:type="spellStart"/>
+      <w:r>
+        <w:t>file.yaml</w:t>
+      </w:r>
+      <w:proofErr w:type="spellEnd"/>
+      <w:r>
+        <w:t xml:space="preserve"> → Creates the resource if it doesn't exist, or updates it if it already exists. </w:t>
+      </w:r>
+    </w:p>
+    <w:p>
+      <w:proofErr w:type="spellStart"/>
+      <w:r>
+        <w:t>kubectl</w:t>
+      </w:r>
+      <w:proofErr w:type="spellEnd"/>
+      <w:r>
+        <w:t xml:space="preserve"> replace -f </w:t>
+      </w:r>
+      <w:proofErr w:type="spellStart"/>
+      <w:r>
+        <w:t>file.yaml</w:t>
+      </w:r>
+      <w:proofErr w:type="spellEnd"/>
+      <w:r>
+        <w:t xml:space="preserve"> → Replaces an existing resource. It fails if the resource doesn't exist.</w:t>
       </w:r>
     </w:p>
     <w:p/>
     <w:p>
       <w:r>
-        <w:t>You can use the kubectl explain to learn more about different resources.</w:t>
-      </w:r>
-    </w:p>
-    <w:p>
-      <w:r>
-        <w:t>Eg: kubectl explain pod, kubectl explain pod.spec.</w:t>
+        <w:t xml:space="preserve">You can use the </w:t>
+      </w:r>
+      <w:proofErr w:type="spellStart"/>
+      <w:r>
+        <w:t>kubectl</w:t>
+      </w:r>
+      <w:proofErr w:type="spellEnd"/>
+      <w:r>
+        <w:t xml:space="preserve"> explain to learn more about different resources.</w:t>
+      </w:r>
+    </w:p>
+    <w:p>
+      <w:r>
+        <w:t xml:space="preserve">Eg: </w:t>
+      </w:r>
+      <w:proofErr w:type="spellStart"/>
+      <w:r>
+        <w:t>kubectl</w:t>
+      </w:r>
+      <w:proofErr w:type="spellEnd"/>
+      <w:r>
+        <w:t xml:space="preserve"> explain pod, </w:t>
+      </w:r>
+      <w:proofErr w:type="spellStart"/>
+      <w:r>
+        <w:t>kubectl</w:t>
+      </w:r>
+      <w:proofErr w:type="spellEnd"/>
+      <w:r>
+        <w:t xml:space="preserve"> explain </w:t>
+      </w:r>
+      <w:proofErr w:type="spellStart"/>
+      <w:r>
+        <w:t>pod.spec</w:t>
+      </w:r>
+      <w:proofErr w:type="spellEnd"/>
+      <w:r>
+        <w:t>.</w:t>
       </w:r>
     </w:p>
     <w:p>
@@ -2446,29 +3562,63 @@
     </w:p>
     <w:p>
       <w:r>
-        <w:t xml:space="preserve">Eg: kubectl explain pod.spec </w:t>
+        <w:t xml:space="preserve">Eg: </w:t>
+      </w:r>
+      <w:proofErr w:type="spellStart"/>
+      <w:r>
+        <w:t>kubectl</w:t>
+      </w:r>
+      <w:proofErr w:type="spellEnd"/>
+      <w:r>
+        <w:t xml:space="preserve"> explain </w:t>
+      </w:r>
+      <w:proofErr w:type="spellStart"/>
+      <w:r>
+        <w:t>pod.spec</w:t>
+      </w:r>
+      <w:proofErr w:type="spellEnd"/>
+      <w:r>
+        <w:t xml:space="preserve"> </w:t>
       </w:r>
       <w:r>
         <w:t>–</w:t>
       </w:r>
+      <w:proofErr w:type="spellStart"/>
       <w:r>
         <w:t>recusrsive</w:t>
       </w:r>
       <w:r>
         <w:t>s</w:t>
       </w:r>
+      <w:proofErr w:type="spellEnd"/>
     </w:p>
     <w:p/>
     <w:p>
-      <w:r>
+      <w:proofErr w:type="spellStart"/>
+      <w:r>
+        <w:lastRenderedPageBreak/>
         <w:t>s</w:t>
       </w:r>
       <w:r>
-        <w:t xml:space="preserve">To log in to a multi container pod:  </w:t>
-      </w:r>
-      <w:r>
-        <w:t>kubectl exec -it &lt;pod-name&gt; -c &lt;container-name&gt; -- /bin/sh</w:t>
-      </w:r>
+        <w:t>To</w:t>
+      </w:r>
+      <w:proofErr w:type="spellEnd"/>
+      <w:r>
+        <w:t xml:space="preserve"> log in to a multi container pod:  </w:t>
+      </w:r>
+      <w:proofErr w:type="spellStart"/>
+      <w:r>
+        <w:t>kubectl</w:t>
+      </w:r>
+      <w:proofErr w:type="spellEnd"/>
+      <w:r>
+        <w:t xml:space="preserve"> exec -it &lt;pod-name&gt; -c &lt;container-name&gt; -- /bin/</w:t>
+      </w:r>
+      <w:proofErr w:type="spellStart"/>
+      <w:r>
+        <w:t>sh</w:t>
+      </w:r>
+      <w:proofErr w:type="spellEnd"/>
     </w:p>
     <w:sectPr>
       <w:pgSz w:w="12240" w:h="15840"/>
@@ -2480,6 +3630,56 @@
 </w:document>
 </file>
 
+<file path=word/endnotes.xml><?xml version="1.0" encoding="utf-8"?>
+<w:endnotes xmlns:wpc="http://schemas.microsoft.com/office/word/2010/wordprocessingCanvas" xmlns:cx="http://schemas.microsoft.com/office/drawing/2014/chartex" xmlns:cx1="http://schemas.microsoft.com/office/drawing/2015/9/8/chartex" xmlns:cx2="http://schemas.microsoft.com/office/drawing/2015/10/21/chartex" xmlns:cx3="http://schemas.microsoft.com/office/drawing/2016/5/9/chartex" xmlns:cx4="http://schemas.microsoft.com/office/drawing/2016/5/10/chartex" xmlns:cx5="http://schemas.microsoft.com/office/drawing/2016/5/11/chartex" xmlns:cx6="http://schemas.microsoft.com/office/drawing/2016/5/12/chartex" xmlns:cx7="http://schemas.microsoft.com/office/drawing/2016/5/13/chartex" xmlns:cx8="http://schemas.microsoft.com/office/drawing/2016/5/14/chartex" xmlns:mc="http://schemas.openxmlformats.org/markup-compatibility/2006" xmlns:aink="http://schemas.microsoft.com/office/drawing/2016/ink" xmlns:am3d="http://schemas.microsoft.com/office/drawing/2017/model3d" xmlns:o="urn:schemas-microsoft-com:office:office" xmlns:oel="http://schemas.microsoft.com/office/2019/extlst" xmlns:r="http://schemas.openxmlformats.org/officeDocument/2006/relationships" xmlns:m="http://schemas.openxmlformats.org/officeDocument/2006/math" xmlns:v="urn:schemas-microsoft-com:vml" xmlns:wp14="http://schemas.microsoft.com/office/word/2010/wordprocessingDrawing" xmlns:wp="http://schemas.openxmlformats.org/drawingml/2006/wordprocessingDrawing" xmlns:w10="urn:schemas-microsoft-com:office:word" xmlns:w="http://schemas.openxmlformats.org/wordprocessingml/2006/main" xmlns:w14="http://schemas.microsoft.com/office/word/2010/wordml" xmlns:w15="http://schemas.microsoft.com/office/word/2012/wordml" xmlns:w16cex="http://schemas.microsoft.com/office/word/2018/wordml/cex" xmlns:w16cid="http://schemas.microsoft.com/office/word/2016/wordml/cid" xmlns:w16="http://schemas.microsoft.com/office/word/2018/wordml" xmlns:w16du="http://schemas.microsoft.com/office/word/2023/wordml/word16du" xmlns:w16sdtdh="http://schemas.microsoft.com/office/word/2020/wordml/sdtdatahash" xmlns:w16sdtfl="http://schemas.microsoft.com/office/word/2024/wordml/sdtformatlock" xmlns:w16se="http://schemas.microsoft.com/office/word/2015/wordml/symex" xmlns:wpg="http://schemas.microsoft.com/office/word/2010/wordprocessingGroup" xmlns:wpi="http://schemas.microsoft.com/office/word/2010/wordprocessingInk" xmlns:wne="http://schemas.microsoft.com/office/word/2006/wordml" xmlns:wps="http://schemas.microsoft.com/office/word/2010/wordprocessingShape" mc:Ignorable="w14 w15 w16se w16cid w16 w16cex w16sdtdh w16sdtfl w16du wp14">
+  <w:endnote w:type="separator" w:id="-1">
+    <w:p>
+      <w:pPr>
+        <w:spacing w:after="0" w:line="240" w:lineRule="auto"/>
+      </w:pPr>
+      <w:r>
+        <w:separator/>
+      </w:r>
+    </w:p>
+  </w:endnote>
+  <w:endnote w:type="continuationSeparator" w:id="0">
+    <w:p>
+      <w:pPr>
+        <w:spacing w:after="0" w:line="240" w:lineRule="auto"/>
+      </w:pPr>
+      <w:r>
+        <w:continuationSeparator/>
+      </w:r>
+    </w:p>
+  </w:endnote>
+</w:endnotes>
+</file>
+
+<file path=word/footnotes.xml><?xml version="1.0" encoding="utf-8"?>
+<w:footnotes xmlns:wpc="http://schemas.microsoft.com/office/word/2010/wordprocessingCanvas" xmlns:cx="http://schemas.microsoft.com/office/drawing/2014/chartex" xmlns:cx1="http://schemas.microsoft.com/office/drawing/2015/9/8/chartex" xmlns:cx2="http://schemas.microsoft.com/office/drawing/2015/10/21/chartex" xmlns:cx3="http://schemas.microsoft.com/office/drawing/2016/5/9/chartex" xmlns:cx4="http://schemas.microsoft.com/office/drawing/2016/5/10/chartex" xmlns:cx5="http://schemas.microsoft.com/office/drawing/2016/5/11/chartex" xmlns:cx6="http://schemas.microsoft.com/office/drawing/2016/5/12/chartex" xmlns:cx7="http://schemas.microsoft.com/office/drawing/2016/5/13/chartex" xmlns:cx8="http://schemas.microsoft.com/office/drawing/2016/5/14/chartex" xmlns:mc="http://schemas.openxmlformats.org/markup-compatibility/2006" xmlns:aink="http://schemas.microsoft.com/office/drawing/2016/ink" xmlns:am3d="http://schemas.microsoft.com/office/drawing/2017/model3d" xmlns:o="urn:schemas-microsoft-com:office:office" xmlns:oel="http://schemas.microsoft.com/office/2019/extlst" xmlns:r="http://schemas.openxmlformats.org/officeDocument/2006/relationships" xmlns:m="http://schemas.openxmlformats.org/officeDocument/2006/math" xmlns:v="urn:schemas-microsoft-com:vml" xmlns:wp14="http://schemas.microsoft.com/office/word/2010/wordprocessingDrawing" xmlns:wp="http://schemas.openxmlformats.org/drawingml/2006/wordprocessingDrawing" xmlns:w10="urn:schemas-microsoft-com:office:word" xmlns:w="http://schemas.openxmlformats.org/wordprocessingml/2006/main" xmlns:w14="http://schemas.microsoft.com/office/word/2010/wordml" xmlns:w15="http://schemas.microsoft.com/office/word/2012/wordml" xmlns:w16cex="http://schemas.microsoft.com/office/word/2018/wordml/cex" xmlns:w16cid="http://schemas.microsoft.com/office/word/2016/wordml/cid" xmlns:w16="http://schemas.microsoft.com/office/word/2018/wordml" xmlns:w16du="http://schemas.microsoft.com/office/word/2023/wordml/word16du" xmlns:w16sdtdh="http://schemas.microsoft.com/office/word/2020/wordml/sdtdatahash" xmlns:w16sdtfl="http://schemas.microsoft.com/office/word/2024/wordml/sdtformatlock" xmlns:w16se="http://schemas.microsoft.com/office/word/2015/wordml/symex" xmlns:wpg="http://schemas.microsoft.com/office/word/2010/wordprocessingGroup" xmlns:wpi="http://schemas.microsoft.com/office/word/2010/wordprocessingInk" xmlns:wne="http://schemas.microsoft.com/office/word/2006/wordml" xmlns:wps="http://schemas.microsoft.com/office/word/2010/wordprocessingShape" mc:Ignorable="w14 w15 w16se w16cid w16 w16cex w16sdtdh w16sdtfl w16du wp14">
+  <w:footnote w:type="separator" w:id="-1">
+    <w:p>
+      <w:pPr>
+        <w:spacing w:after="0" w:line="240" w:lineRule="auto"/>
+      </w:pPr>
+      <w:r>
+        <w:separator/>
+      </w:r>
+    </w:p>
+  </w:footnote>
+  <w:footnote w:type="continuationSeparator" w:id="0">
+    <w:p>
+      <w:pPr>
+        <w:spacing w:after="0" w:line="240" w:lineRule="auto"/>
+      </w:pPr>
+      <w:r>
+        <w:continuationSeparator/>
+      </w:r>
+    </w:p>
+  </w:footnote>
+</w:footnotes>
+</file>
+
 <file path=word/numbering.xml><?xml version="1.0" encoding="utf-8"?>
 <w:numbering xmlns:wpc="http://schemas.microsoft.com/office/word/2010/wordprocessingCanvas" xmlns:cx="http://schemas.microsoft.com/office/drawing/2014/chartex" xmlns:cx1="http://schemas.microsoft.com/office/drawing/2015/9/8/chartex" xmlns:cx2="http://schemas.microsoft.com/office/drawing/2015/10/21/chartex" xmlns:cx3="http://schemas.microsoft.com/office/drawing/2016/5/9/chartex" xmlns:cx4="http://schemas.microsoft.com/office/drawing/2016/5/10/chartex" xmlns:cx5="http://schemas.microsoft.com/office/drawing/2016/5/11/chartex" xmlns:cx6="http://schemas.microsoft.com/office/drawing/2016/5/12/chartex" xmlns:cx7="http://schemas.microsoft.com/office/drawing/2016/5/13/chartex" xmlns:cx8="http://schemas.microsoft.com/office/drawing/2016/5/14/chartex" xmlns:mc="http://schemas.openxmlformats.org/markup-compatibility/2006" xmlns:aink="http://schemas.microsoft.com/office/drawing/2016/ink" xmlns:am3d="http://schemas.microsoft.com/office/drawing/2017/model3d" xmlns:o="urn:schemas-microsoft-com:office:office" xmlns:oel="http://schemas.microsoft.com/office/2019/extlst" xmlns:r="http://schemas.openxmlformats.org/officeDocument/2006/relationships" xmlns:m="http://schemas.openxmlformats.org/officeDocument/2006/math" xmlns:v="urn:schemas-microsoft-com:vml" xmlns:wp14="http://schemas.microsoft.com/office/word/2010/wordprocessingDrawing" xmlns:wp="http://schemas.openxmlformats.org/drawingml/2006/wordprocessingDrawing" xmlns:w10="urn:schemas-microsoft-com:office:word" xmlns:w="http://schemas.openxmlformats.org/wordprocessingml/2006/main" xmlns:w14="http://schemas.microsoft.com/office/word/2010/wordml" xmlns:w15="http://schemas.microsoft.com/office/word/2012/wordml" xmlns:w16cex="http://schemas.microsoft.com/office/word/2018/wordml/cex" xmlns:w16cid="http://schemas.microsoft.com/office/word/2016/wordml/cid" xmlns:w16="http://schemas.microsoft.com/office/word/2018/wordml" xmlns:w16du="http://schemas.microsoft.com/office/word/2023/wordml/word16du" xmlns:w16sdtdh="http://schemas.microsoft.com/office/word/2020/wordml/sdtdatahash" xmlns:w16sdtfl="http://schemas.microsoft.com/office/word/2024/wordml/sdtformatlock" xmlns:w16se="http://schemas.microsoft.com/office/word/2015/wordml/symex" xmlns:wpg="http://schemas.microsoft.com/office/word/2010/wordprocessingGroup" xmlns:wpi="http://schemas.microsoft.com/office/word/2010/wordprocessingInk" xmlns:wne="http://schemas.microsoft.com/office/word/2006/wordml" xmlns:wps="http://schemas.microsoft.com/office/word/2010/wordprocessingShape" mc:Ignorable="w14 w15 w16se w16cid w16 w16cex w16sdtdh w16sdtfl w16du wp14">
   <w:abstractNum w:abstractNumId="0" w15:restartNumberingAfterBreak="0">
@@ -3173,6 +4373,119 @@
     </w:lvl>
   </w:abstractNum>
   <w:abstractNum w:abstractNumId="6" w15:restartNumberingAfterBreak="0">
+    <w:nsid w:val="4C687D05"/>
+    <w:multiLevelType w:val="hybridMultilevel"/>
+    <w:tmpl w:val="ECD2D0D8"/>
+    <w:lvl w:ilvl="0" w:tplc="10090001">
+      <w:start w:val="1"/>
+      <w:numFmt w:val="bullet"/>
+      <w:lvlText w:val=""/>
+      <w:lvlJc w:val="left"/>
+      <w:pPr>
+        <w:ind w:left="720" w:hanging="360"/>
+      </w:pPr>
+      <w:rPr>
+        <w:rFonts w:ascii="Symbol" w:hAnsi="Symbol" w:hint="default"/>
+      </w:rPr>
+    </w:lvl>
+    <w:lvl w:ilvl="1" w:tplc="10090003" w:tentative="1">
+      <w:start w:val="1"/>
+      <w:numFmt w:val="bullet"/>
+      <w:lvlText w:val="o"/>
+      <w:lvlJc w:val="left"/>
+      <w:pPr>
+        <w:ind w:left="1440" w:hanging="360"/>
+      </w:pPr>
+      <w:rPr>
+        <w:rFonts w:ascii="Courier New" w:hAnsi="Courier New" w:cs="Courier New" w:hint="default"/>
+      </w:rPr>
+    </w:lvl>
+    <w:lvl w:ilvl="2" w:tplc="10090005" w:tentative="1">
+      <w:start w:val="1"/>
+      <w:numFmt w:val="bullet"/>
+      <w:lvlText w:val=""/>
+      <w:lvlJc w:val="left"/>
+      <w:pPr>
+        <w:ind w:left="2160" w:hanging="360"/>
+      </w:pPr>
+      <w:rPr>
+        <w:rFonts w:ascii="Wingdings" w:hAnsi="Wingdings" w:hint="default"/>
+      </w:rPr>
+    </w:lvl>
+    <w:lvl w:ilvl="3" w:tplc="10090001" w:tentative="1">
+      <w:start w:val="1"/>
+      <w:numFmt w:val="bullet"/>
+      <w:lvlText w:val=""/>
+      <w:lvlJc w:val="left"/>
+      <w:pPr>
+        <w:ind w:left="2880" w:hanging="360"/>
+      </w:pPr>
+      <w:rPr>
+        <w:rFonts w:ascii="Symbol" w:hAnsi="Symbol" w:hint="default"/>
+      </w:rPr>
+    </w:lvl>
+    <w:lvl w:ilvl="4" w:tplc="10090003" w:tentative="1">
+      <w:start w:val="1"/>
+      <w:numFmt w:val="bullet"/>
+      <w:lvlText w:val="o"/>
+      <w:lvlJc w:val="left"/>
+      <w:pPr>
+        <w:ind w:left="3600" w:hanging="360"/>
+      </w:pPr>
+      <w:rPr>
+        <w:rFonts w:ascii="Courier New" w:hAnsi="Courier New" w:cs="Courier New" w:hint="default"/>
+      </w:rPr>
+    </w:lvl>
+    <w:lvl w:ilvl="5" w:tplc="10090005" w:tentative="1">
+      <w:start w:val="1"/>
+      <w:numFmt w:val="bullet"/>
+      <w:lvlText w:val=""/>
+      <w:lvlJc w:val="left"/>
+      <w:pPr>
+        <w:ind w:left="4320" w:hanging="360"/>
+      </w:pPr>
+      <w:rPr>
+        <w:rFonts w:ascii="Wingdings" w:hAnsi="Wingdings" w:hint="default"/>
+      </w:rPr>
+    </w:lvl>
+    <w:lvl w:ilvl="6" w:tplc="10090001" w:tentative="1">
+      <w:start w:val="1"/>
+      <w:numFmt w:val="bullet"/>
+      <w:lvlText w:val=""/>
+      <w:lvlJc w:val="left"/>
+      <w:pPr>
+        <w:ind w:left="5040" w:hanging="360"/>
+      </w:pPr>
+      <w:rPr>
+        <w:rFonts w:ascii="Symbol" w:hAnsi="Symbol" w:hint="default"/>
+      </w:rPr>
+    </w:lvl>
+    <w:lvl w:ilvl="7" w:tplc="10090003" w:tentative="1">
+      <w:start w:val="1"/>
+      <w:numFmt w:val="bullet"/>
+      <w:lvlText w:val="o"/>
+      <w:lvlJc w:val="left"/>
+      <w:pPr>
+        <w:ind w:left="5760" w:hanging="360"/>
+      </w:pPr>
+      <w:rPr>
+        <w:rFonts w:ascii="Courier New" w:hAnsi="Courier New" w:cs="Courier New" w:hint="default"/>
+      </w:rPr>
+    </w:lvl>
+    <w:lvl w:ilvl="8" w:tplc="10090005" w:tentative="1">
+      <w:start w:val="1"/>
+      <w:numFmt w:val="bullet"/>
+      <w:lvlText w:val=""/>
+      <w:lvlJc w:val="left"/>
+      <w:pPr>
+        <w:ind w:left="6480" w:hanging="360"/>
+      </w:pPr>
+      <w:rPr>
+        <w:rFonts w:ascii="Wingdings" w:hAnsi="Wingdings" w:hint="default"/>
+      </w:rPr>
+    </w:lvl>
+  </w:abstractNum>
+  <w:abstractNum w:abstractNumId="7" w15:restartNumberingAfterBreak="0">
     <w:nsid w:val="4E251AC9"/>
     <w:multiLevelType w:val="hybridMultilevel"/>
     <w:tmpl w:val="B8BE0B24"/>
@@ -3261,7 +4574,7 @@
       </w:pPr>
     </w:lvl>
   </w:abstractNum>
-  <w:abstractNum w:abstractNumId="7" w15:restartNumberingAfterBreak="0">
+  <w:abstractNum w:abstractNumId="8" w15:restartNumberingAfterBreak="0">
     <w:nsid w:val="6DAB0C8B"/>
     <w:multiLevelType w:val="hybridMultilevel"/>
     <w:tmpl w:val="E6168C9A"/>
@@ -3374,7 +4687,7 @@
       </w:rPr>
     </w:lvl>
   </w:abstractNum>
-  <w:abstractNum w:abstractNumId="8" w15:restartNumberingAfterBreak="0">
+  <w:abstractNum w:abstractNumId="9" w15:restartNumberingAfterBreak="0">
     <w:nsid w:val="6F6B297F"/>
     <w:multiLevelType w:val="hybridMultilevel"/>
     <w:tmpl w:val="90604326"/>
@@ -3486,7 +4799,7 @@
       </w:rPr>
     </w:lvl>
   </w:abstractNum>
-  <w:abstractNum w:abstractNumId="9" w15:restartNumberingAfterBreak="0">
+  <w:abstractNum w:abstractNumId="10" w15:restartNumberingAfterBreak="0">
     <w:nsid w:val="7FE96A27"/>
     <w:multiLevelType w:val="multilevel"/>
     <w:tmpl w:val="2E109BCA"/>
@@ -3636,10 +4949,10 @@
     </w:lvl>
   </w:abstractNum>
   <w:num w:numId="1" w16cid:durableId="1329406315">
-    <w:abstractNumId w:val="8"/>
+    <w:abstractNumId w:val="9"/>
   </w:num>
   <w:num w:numId="2" w16cid:durableId="346176687">
-    <w:abstractNumId w:val="9"/>
+    <w:abstractNumId w:val="10"/>
   </w:num>
   <w:num w:numId="3" w16cid:durableId="588125869">
     <w:abstractNumId w:val="3"/>
@@ -3654,16 +4967,19 @@
     <w:abstractNumId w:val="5"/>
   </w:num>
   <w:num w:numId="7" w16cid:durableId="313225329">
-    <w:abstractNumId w:val="6"/>
+    <w:abstractNumId w:val="7"/>
   </w:num>
   <w:num w:numId="8" w16cid:durableId="11156116">
     <w:abstractNumId w:val="2"/>
   </w:num>
   <w:num w:numId="9" w16cid:durableId="1024936680">
-    <w:abstractNumId w:val="7"/>
+    <w:abstractNumId w:val="8"/>
   </w:num>
   <w:num w:numId="10" w16cid:durableId="1490097057">
     <w:abstractNumId w:val="4"/>
+  </w:num>
+  <w:num w:numId="11" w16cid:durableId="1170869400">
+    <w:abstractNumId w:val="6"/>
   </w:num>
 </w:numbering>
 </file>
@@ -4584,6 +5900,50 @@
       <w:spacing w:val="5"/>
     </w:rPr>
   </w:style>
+  <w:style w:type="paragraph" w:styleId="Header">
+    <w:name w:val="header"/>
+    <w:basedOn w:val="Normal"/>
+    <w:link w:val="HeaderChar"/>
+    <w:uiPriority w:val="99"/>
+    <w:unhideWhenUsed/>
+    <w:rsid w:val="003A58D4"/>
+    <w:pPr>
+      <w:tabs>
+        <w:tab w:val="center" w:pos="4680"/>
+        <w:tab w:val="right" w:pos="9360"/>
+      </w:tabs>
+      <w:spacing w:after="0" w:line="240" w:lineRule="auto"/>
+    </w:pPr>
+  </w:style>
+  <w:style w:type="character" w:customStyle="1" w:styleId="HeaderChar">
+    <w:name w:val="Header Char"/>
+    <w:basedOn w:val="DefaultParagraphFont"/>
+    <w:link w:val="Header"/>
+    <w:uiPriority w:val="99"/>
+    <w:rsid w:val="003A58D4"/>
+  </w:style>
+  <w:style w:type="paragraph" w:styleId="Footer">
+    <w:name w:val="footer"/>
+    <w:basedOn w:val="Normal"/>
+    <w:link w:val="FooterChar"/>
+    <w:uiPriority w:val="99"/>
+    <w:unhideWhenUsed/>
+    <w:rsid w:val="003A58D4"/>
+    <w:pPr>
+      <w:tabs>
+        <w:tab w:val="center" w:pos="4680"/>
+        <w:tab w:val="right" w:pos="9360"/>
+      </w:tabs>
+      <w:spacing w:after="0" w:line="240" w:lineRule="auto"/>
+    </w:pPr>
+  </w:style>
+  <w:style w:type="character" w:customStyle="1" w:styleId="FooterChar">
+    <w:name w:val="Footer Char"/>
+    <w:basedOn w:val="DefaultParagraphFont"/>
+    <w:link w:val="Footer"/>
+    <w:uiPriority w:val="99"/>
+    <w:rsid w:val="003A58D4"/>
+  </w:style>
 </w:styles>
 </file>
 

</xml_diff>

<commit_message>
Learned about kubernetes upgrades, etcd backup and restore, pod disruption budget-PDB
</commit_message>
<xml_diff>
--- a/9-Interesting_learning_Notes/Learning_Notes.docx
+++ b/9-Interesting_learning_Notes/Learning_Notes.docx
@@ -15,6 +15,7 @@
         <w:rPr>
           <w:b/>
           <w:bCs/>
+          <w:highlight w:val="yellow"/>
         </w:rPr>
         <w:t>KUBE PROXY</w:t>
       </w:r>
@@ -304,6 +305,7 @@
         <w:rPr>
           <w:b/>
           <w:bCs/>
+          <w:highlight w:val="yellow"/>
         </w:rPr>
         <w:t>SERVICES</w:t>
       </w:r>
@@ -812,7 +814,7 @@
         <w:rPr>
           <w:b/>
           <w:bCs/>
-          <w:highlight w:val="yellow"/>
+          <w:highlight w:val="cyan"/>
         </w:rPr>
         <w:t>IMPORTANT INFORMATION</w:t>
       </w:r>
@@ -849,12 +851,18 @@
         <w:rPr>
           <w:b/>
           <w:bCs/>
-          <w:highlight w:val="yellow"/>
+          <w:highlight w:val="cyan"/>
         </w:rPr>
         <w:t>IMPORTANT INFORMATION</w:t>
       </w:r>
       <w:r>
-        <w:t xml:space="preserve">:  use </w:t>
+        <w:rPr>
+          <w:highlight w:val="cyan"/>
+        </w:rPr>
+        <w:t>:</w:t>
+      </w:r>
+      <w:r>
+        <w:t xml:space="preserve">  use </w:t>
       </w:r>
       <w:r>
         <w:rPr>
@@ -998,18 +1006,34 @@
           <w:bCs/>
         </w:rPr>
       </w:pPr>
-      <w:r>
-        <w:rPr>
-          <w:b/>
-          <w:bCs/>
-        </w:rPr>
+    </w:p>
+    <w:p>
+      <w:pPr>
+        <w:rPr>
+          <w:b/>
+          <w:bCs/>
+        </w:rPr>
+      </w:pPr>
+      <w:r>
+        <w:rPr>
+          <w:b/>
+          <w:bCs/>
+        </w:rPr>
+        <w:lastRenderedPageBreak/>
         <w:t>Service Dependency</w:t>
       </w:r>
     </w:p>
     <w:p>
-      <w:proofErr w:type="spellStart"/>
-      <w:r>
-        <w:lastRenderedPageBreak/>
+      <w:pPr>
+        <w:rPr>
+          <w:b/>
+          <w:bCs/>
+        </w:rPr>
+      </w:pPr>
+    </w:p>
+    <w:p>
+      <w:proofErr w:type="spellStart"/>
+      <w:r>
         <w:t>kubectl</w:t>
       </w:r>
       <w:proofErr w:type="spellEnd"/>
@@ -1314,6 +1338,7 @@
     <w:p>
       <w:proofErr w:type="spellStart"/>
       <w:r>
+        <w:lastRenderedPageBreak/>
         <w:t>kubectl</w:t>
       </w:r>
       <w:proofErr w:type="spellEnd"/>
@@ -1374,445 +1399,445 @@
           <w:b/>
           <w:bCs/>
         </w:rPr>
+        <w:t>Custom-Scheduler:</w:t>
+      </w:r>
+    </w:p>
+    <w:p>
+      <w:r>
+        <w:t xml:space="preserve">After using a customer-scheduler, if you want to see the evidence that the pod used it, you can get the events of the po along with -o wide flag. Check the </w:t>
+      </w:r>
+      <w:r>
+        <w:rPr>
+          <w:b/>
+          <w:bCs/>
+        </w:rPr>
+        <w:t>SOURCE</w:t>
+      </w:r>
+      <w:r>
+        <w:t xml:space="preserve"> field.</w:t>
+      </w:r>
+    </w:p>
+    <w:p>
+      <w:r>
+        <w:t>Eg: “</w:t>
+      </w:r>
+      <w:r>
+        <w:t xml:space="preserve"> my-scheduler, my-scheduler-my-scheduler   Successfully assigned default/nginx to </w:t>
+      </w:r>
+      <w:proofErr w:type="spellStart"/>
+      <w:r>
+        <w:t>controlplan</w:t>
+      </w:r>
+      <w:proofErr w:type="spellEnd"/>
+      <w:r>
+        <w:t>”</w:t>
+      </w:r>
+    </w:p>
+    <w:p/>
+    <w:p>
+      <w:pPr>
+        <w:rPr>
+          <w:b/>
+          <w:bCs/>
+        </w:rPr>
+      </w:pPr>
+      <w:r>
+        <w:rPr>
+          <w:b/>
+          <w:bCs/>
+        </w:rPr>
+        <w:t>Kubernetes scheduling Stages</w:t>
+      </w:r>
+    </w:p>
+    <w:p>
+      <w:r>
+        <w:t xml:space="preserve">Kubernetes scheduling involves the scheduler selecting a suitable node for a Pod. The main stages are </w:t>
+      </w:r>
+      <w:r>
+        <w:rPr>
+          <w:b/>
+          <w:bCs/>
+        </w:rPr>
+        <w:t>Queue → Filter → Score → Bind</w:t>
+      </w:r>
+      <w:r>
+        <w:t xml:space="preserve">. Queue selects a pending Pod, Filter eliminates nodes where the Pod cannot run, Score ranks the remaining nodes, and Bind assigns the Pod to the selected node. The scheduler records the selected node in the Pod object's </w:t>
+      </w:r>
+      <w:proofErr w:type="spellStart"/>
+      <w:r>
+        <w:t>spec.nodeName</w:t>
+      </w:r>
+      <w:proofErr w:type="spellEnd"/>
+      <w:r>
+        <w:t xml:space="preserve"> field. The </w:t>
+      </w:r>
+      <w:proofErr w:type="spellStart"/>
+      <w:r>
+        <w:t>kubelet</w:t>
+      </w:r>
+      <w:proofErr w:type="spellEnd"/>
+      <w:r>
+        <w:t xml:space="preserve"> on that node then starts the Pod.</w:t>
+      </w:r>
+    </w:p>
+    <w:p/>
+    <w:p>
+      <w:r>
+        <w:rPr>
+          <w:b/>
+          <w:bCs/>
+        </w:rPr>
+        <w:t>Scheduler profiles</w:t>
+      </w:r>
+    </w:p>
+    <w:p>
+      <w:r>
+        <w:rPr>
+          <w:b/>
+          <w:bCs/>
+        </w:rPr>
+        <w:t>Scheduler profiles</w:t>
+      </w:r>
+      <w:r>
+        <w:t xml:space="preserve"> are different configurations of the same </w:t>
+      </w:r>
+      <w:proofErr w:type="spellStart"/>
+      <w:r>
+        <w:t>kube</w:t>
+      </w:r>
+      <w:proofErr w:type="spellEnd"/>
+      <w:r>
+        <w:t xml:space="preserve">-scheduler. Each profile can have its own </w:t>
+      </w:r>
+      <w:r>
+        <w:rPr>
+          <w:b/>
+          <w:bCs/>
+        </w:rPr>
+        <w:t>scheduler plugins</w:t>
+      </w:r>
+      <w:r>
+        <w:t xml:space="preserve"> enabled, disabled, or configured. A Pod selects a profile using </w:t>
+      </w:r>
+      <w:proofErr w:type="spellStart"/>
+      <w:r>
+        <w:t>spec.schedulerName</w:t>
+      </w:r>
+      <w:proofErr w:type="spellEnd"/>
+      <w:r>
+        <w:t xml:space="preserve">. Plugins implement scheduling logic at stages such as </w:t>
+      </w:r>
+      <w:r>
+        <w:rPr>
+          <w:b/>
+          <w:bCs/>
+        </w:rPr>
+        <w:t>Filter</w:t>
+      </w:r>
+      <w:r>
+        <w:t xml:space="preserve"> and </w:t>
+      </w:r>
+      <w:r>
+        <w:rPr>
+          <w:b/>
+          <w:bCs/>
+        </w:rPr>
+        <w:t>Score</w:t>
+      </w:r>
+      <w:r>
+        <w:t>. This allows different Pods to use different scheduling behavior.</w:t>
+      </w:r>
+    </w:p>
+    <w:p/>
+    <w:p>
+      <w:r>
+        <w:rPr>
+          <w:b/>
+          <w:bCs/>
+        </w:rPr>
+        <w:t>Admission Controller</w:t>
+      </w:r>
+      <w:r>
+        <w:rPr>
+          <w:b/>
+          <w:bCs/>
+        </w:rPr>
+        <w:t>:</w:t>
+      </w:r>
+    </w:p>
+    <w:p>
+      <w:r>
+        <w:t xml:space="preserve">An </w:t>
+      </w:r>
+      <w:r>
+        <w:rPr>
+          <w:b/>
+          <w:bCs/>
+        </w:rPr>
+        <w:t>Admission Controller</w:t>
+      </w:r>
+      <w:r>
+        <w:t xml:space="preserve"> intercepts API requests after authentication and authorization but before the object is stored in </w:t>
+      </w:r>
+      <w:proofErr w:type="spellStart"/>
+      <w:r>
+        <w:t>etcd</w:t>
+      </w:r>
+      <w:proofErr w:type="spellEnd"/>
+      <w:r>
+        <w:t xml:space="preserve">. It can </w:t>
+      </w:r>
+      <w:r>
+        <w:rPr>
+          <w:b/>
+          <w:bCs/>
+        </w:rPr>
+        <w:t>validate, modify, or reject</w:t>
+      </w:r>
+      <w:r>
+        <w:t xml:space="preserve"> requests. Admission controllers are used to enforce cluster-wide policies such as requiring security settings, labels, resource limits, or approved container images. </w:t>
+      </w:r>
+      <w:r>
+        <w:rPr>
+          <w:b/>
+          <w:bCs/>
+        </w:rPr>
+        <w:t>Real-world use case:</w:t>
+      </w:r>
+      <w:r>
+        <w:t xml:space="preserve"> a company can use an admission controller to reject Pods that use images from untrusted registries and allow only images from its approved private registry.</w:t>
+      </w:r>
+    </w:p>
+    <w:p>
+      <w:r>
+        <w:rPr>
+          <w:b/>
+          <w:bCs/>
+        </w:rPr>
+        <w:t xml:space="preserve">How Kubernetes determine to allow or </w:t>
+      </w:r>
+      <w:proofErr w:type="spellStart"/>
+      <w:r>
+        <w:rPr>
+          <w:b/>
+          <w:bCs/>
+        </w:rPr>
+        <w:t>deny:</w:t>
+      </w:r>
+      <w:r>
+        <w:rPr>
+          <w:b/>
+          <w:bCs/>
+        </w:rPr>
+        <w:t>s</w:t>
+      </w:r>
+      <w:proofErr w:type="spellEnd"/>
+    </w:p>
+    <w:p>
+      <w:r>
         <w:lastRenderedPageBreak/>
-        <w:t>Custom-Scheduler:</w:t>
-      </w:r>
-    </w:p>
-    <w:p>
-      <w:r>
-        <w:t xml:space="preserve">After using a customer-scheduler, if you want to see the evidence that the pod used it, you can get the events of the po along with -o wide flag. Check the </w:t>
-      </w:r>
-      <w:r>
-        <w:rPr>
-          <w:b/>
-          <w:bCs/>
-        </w:rPr>
-        <w:t>SOURCE</w:t>
-      </w:r>
-      <w:r>
-        <w:t xml:space="preserve"> field.</w:t>
-      </w:r>
-    </w:p>
-    <w:p>
-      <w:r>
-        <w:t>Eg: “</w:t>
-      </w:r>
-      <w:r>
-        <w:t xml:space="preserve"> my-scheduler, my-scheduler-my-scheduler   Successfully assigned default/nginx to </w:t>
-      </w:r>
-      <w:proofErr w:type="spellStart"/>
-      <w:r>
-        <w:t>controlplan</w:t>
-      </w:r>
-      <w:proofErr w:type="spellEnd"/>
-      <w:r>
+        <w:t xml:space="preserve">The </w:t>
+      </w:r>
+      <w:proofErr w:type="spellStart"/>
+      <w:r>
+        <w:t>ImagePolicyWebhook</w:t>
+      </w:r>
+      <w:proofErr w:type="spellEnd"/>
+      <w:r>
+        <w:t xml:space="preserve"> sends information about the requested container image to an external webhook. The webhook performs its own policy logic and then returns an </w:t>
+      </w:r>
+      <w:proofErr w:type="spellStart"/>
+      <w:r>
+        <w:t>ImageReview</w:t>
+      </w:r>
+      <w:proofErr w:type="spellEnd"/>
+      <w:r>
+        <w:t xml:space="preserve"> response. Kubernetes does not care how the webhook makes its decision; it expects the decision in the </w:t>
+      </w:r>
+      <w:proofErr w:type="spellStart"/>
+      <w:r>
+        <w:t>status.allowed</w:t>
+      </w:r>
+      <w:proofErr w:type="spellEnd"/>
+      <w:r>
+        <w:t xml:space="preserve"> field. </w:t>
+      </w:r>
+      <w:proofErr w:type="spellStart"/>
+      <w:r>
+        <w:t>status.allowed</w:t>
+      </w:r>
+      <w:proofErr w:type="spellEnd"/>
+      <w:r>
+        <w:t xml:space="preserve">: true allows the image, while </w:t>
+      </w:r>
+      <w:proofErr w:type="spellStart"/>
+      <w:r>
+        <w:t>status.allowed</w:t>
+      </w:r>
+      <w:proofErr w:type="spellEnd"/>
+      <w:r>
+        <w:t>: false rejects it.</w:t>
+      </w:r>
+    </w:p>
+    <w:p/>
+    <w:p>
+      <w:pPr>
+        <w:rPr>
+          <w:b/>
+          <w:bCs/>
+        </w:rPr>
+      </w:pPr>
+      <w:r>
+        <w:rPr>
+          <w:b/>
+          <w:bCs/>
+        </w:rPr>
+        <w:t>ENTRYPOINT can be written in two forms:</w:t>
+      </w:r>
+    </w:p>
+    <w:p>
+      <w:pPr>
+        <w:rPr>
+          <w:b/>
+          <w:bCs/>
+        </w:rPr>
+      </w:pPr>
+      <w:r>
+        <w:rPr>
+          <w:b/>
+          <w:bCs/>
+        </w:rPr>
+        <w:t>In Docker:</w:t>
+      </w:r>
+    </w:p>
+    <w:p>
+      <w:r>
+        <w:t>Exec form: ENTRYPOINT ["command"] — runs the command directly. CMD or arguments passed with docker run are appended as arguments. Recommended for applications.</w:t>
+      </w:r>
+    </w:p>
+    <w:p>
+      <w:r>
+        <w:t>Shell form: ENTRYPOINT command — runs through /bin/</w:t>
+      </w:r>
+      <w:proofErr w:type="spellStart"/>
+      <w:r>
+        <w:t>sh</w:t>
+      </w:r>
+      <w:proofErr w:type="spellEnd"/>
+      <w:r>
+        <w:t xml:space="preserve"> -c. CMD and runtime arguments are not passed to the </w:t>
+      </w:r>
+      <w:proofErr w:type="spellStart"/>
+      <w:r>
+        <w:t>entrypoint</w:t>
+      </w:r>
+      <w:proofErr w:type="spellEnd"/>
+      <w:r>
+        <w:t xml:space="preserve"> command in the normal way. Useful when shell features such as &amp;&amp;, pipes, or variable expansion are required.</w:t>
+      </w:r>
+    </w:p>
+    <w:p>
+      <w:r>
+        <w:t>Rule: Use exec form for normal applications; use shell form when shell behavior is specifically required.</w:t>
+      </w:r>
+    </w:p>
+    <w:p>
+      <w:r>
+        <w:rPr>
+          <w:b/>
+          <w:bCs/>
+        </w:rPr>
+        <w:t>ENTRYPOINT</w:t>
+      </w:r>
+      <w:r>
+        <w:t xml:space="preserve"> provides the main executable; </w:t>
+      </w:r>
+      <w:r>
+        <w:rPr>
+          <w:b/>
+          <w:bCs/>
+        </w:rPr>
+        <w:t>CMD</w:t>
+      </w:r>
+      <w:r>
+        <w:t xml:space="preserve"> provides default arguments to it, which can be overridden by arguments supplied to docker run.</w:t>
+      </w:r>
+    </w:p>
+    <w:p/>
+    <w:p>
+      <w:r>
+        <w:t xml:space="preserve">To over ride an entry point, use the  </w:t>
+      </w:r>
+      <w:r>
+        <w:rPr>
+          <w:b/>
+          <w:bCs/>
+        </w:rPr>
+        <w:t>“--</w:t>
+      </w:r>
+      <w:proofErr w:type="spellStart"/>
+      <w:r>
+        <w:rPr>
+          <w:b/>
+          <w:bCs/>
+        </w:rPr>
+        <w:t>entrypoint</w:t>
+      </w:r>
+      <w:proofErr w:type="spellEnd"/>
+      <w:r>
+        <w:rPr>
+          <w:b/>
+          <w:bCs/>
+        </w:rPr>
         <w:t>”</w:t>
       </w:r>
-    </w:p>
-    <w:p/>
-    <w:p>
-      <w:pPr>
-        <w:rPr>
-          <w:b/>
-          <w:bCs/>
-        </w:rPr>
-      </w:pPr>
-      <w:r>
-        <w:rPr>
-          <w:b/>
-          <w:bCs/>
-        </w:rPr>
-        <w:t>Kubernetes scheduling Stages</w:t>
-      </w:r>
-    </w:p>
-    <w:p>
-      <w:r>
-        <w:t xml:space="preserve">Kubernetes scheduling involves the scheduler selecting a suitable node for a Pod. The main stages are </w:t>
-      </w:r>
-      <w:r>
-        <w:rPr>
-          <w:b/>
-          <w:bCs/>
-        </w:rPr>
-        <w:t>Queue → Filter → Score → Bind</w:t>
-      </w:r>
-      <w:r>
-        <w:t xml:space="preserve">. Queue selects a pending Pod, Filter eliminates nodes where the Pod cannot run, Score ranks the remaining nodes, and Bind assigns the Pod to the selected node. The scheduler records the selected node in the Pod object's </w:t>
-      </w:r>
-      <w:proofErr w:type="spellStart"/>
-      <w:r>
-        <w:t>spec.nodeName</w:t>
-      </w:r>
-      <w:proofErr w:type="spellEnd"/>
-      <w:r>
-        <w:t xml:space="preserve"> field. The </w:t>
-      </w:r>
-      <w:proofErr w:type="spellStart"/>
-      <w:r>
-        <w:t>kubelet</w:t>
-      </w:r>
-      <w:proofErr w:type="spellEnd"/>
-      <w:r>
-        <w:t xml:space="preserve"> on that node then starts the Pod.</w:t>
-      </w:r>
-    </w:p>
-    <w:p/>
-    <w:p>
-      <w:r>
-        <w:rPr>
-          <w:b/>
-          <w:bCs/>
-        </w:rPr>
-        <w:t>Scheduler profiles</w:t>
-      </w:r>
-    </w:p>
-    <w:p>
-      <w:r>
-        <w:rPr>
-          <w:b/>
-          <w:bCs/>
-        </w:rPr>
-        <w:t>Scheduler profiles</w:t>
-      </w:r>
-      <w:r>
-        <w:t xml:space="preserve"> are different configurations of the same </w:t>
-      </w:r>
-      <w:proofErr w:type="spellStart"/>
-      <w:r>
-        <w:t>kube</w:t>
-      </w:r>
-      <w:proofErr w:type="spellEnd"/>
-      <w:r>
-        <w:t xml:space="preserve">-scheduler. Each profile can have its own </w:t>
-      </w:r>
-      <w:r>
-        <w:rPr>
-          <w:b/>
-          <w:bCs/>
-        </w:rPr>
-        <w:t>scheduler plugins</w:t>
-      </w:r>
-      <w:r>
-        <w:t xml:space="preserve"> enabled, disabled, or configured. A Pod selects a profile using </w:t>
-      </w:r>
-      <w:proofErr w:type="spellStart"/>
-      <w:r>
-        <w:t>spec.schedulerName</w:t>
-      </w:r>
-      <w:proofErr w:type="spellEnd"/>
-      <w:r>
-        <w:t xml:space="preserve">. Plugins implement scheduling logic at stages such as </w:t>
-      </w:r>
-      <w:r>
-        <w:rPr>
-          <w:b/>
-          <w:bCs/>
-        </w:rPr>
-        <w:t>Filter</w:t>
-      </w:r>
-      <w:r>
-        <w:t xml:space="preserve"> and </w:t>
-      </w:r>
-      <w:r>
-        <w:rPr>
-          <w:b/>
-          <w:bCs/>
-        </w:rPr>
-        <w:t>Score</w:t>
-      </w:r>
-      <w:r>
-        <w:t>. This allows different Pods to use different scheduling behavior.</w:t>
-      </w:r>
-    </w:p>
-    <w:p/>
-    <w:p>
-      <w:r>
-        <w:rPr>
-          <w:b/>
-          <w:bCs/>
-        </w:rPr>
-        <w:t>Admission Controller</w:t>
-      </w:r>
-      <w:r>
-        <w:rPr>
-          <w:b/>
-          <w:bCs/>
-        </w:rPr>
-        <w:t>:</w:t>
-      </w:r>
-    </w:p>
-    <w:p>
-      <w:r>
-        <w:t xml:space="preserve">An </w:t>
-      </w:r>
-      <w:r>
-        <w:rPr>
-          <w:b/>
-          <w:bCs/>
-        </w:rPr>
-        <w:t>Admission Controller</w:t>
-      </w:r>
-      <w:r>
-        <w:t xml:space="preserve"> intercepts API requests after authentication and authorization but before the object is stored in </w:t>
-      </w:r>
-      <w:proofErr w:type="spellStart"/>
-      <w:r>
-        <w:t>etcd</w:t>
-      </w:r>
-      <w:proofErr w:type="spellEnd"/>
-      <w:r>
-        <w:t xml:space="preserve">. It can </w:t>
-      </w:r>
-      <w:r>
-        <w:rPr>
-          <w:b/>
-          <w:bCs/>
-        </w:rPr>
-        <w:t>validate, modify, or reject</w:t>
-      </w:r>
-      <w:r>
-        <w:t xml:space="preserve"> requests. Admission controllers are used to enforce cluster-wide policies such as requiring security settings, labels, resource limits, or approved container images. </w:t>
-      </w:r>
-      <w:r>
-        <w:rPr>
-          <w:b/>
-          <w:bCs/>
-        </w:rPr>
-        <w:t>Real-world use case:</w:t>
-      </w:r>
-      <w:r>
-        <w:t xml:space="preserve"> a company can use an admission controller to reject Pods that use images from untrusted registries and allow only images from its approved private registry.</w:t>
-      </w:r>
-    </w:p>
-    <w:p>
-      <w:r>
-        <w:rPr>
-          <w:b/>
-          <w:bCs/>
-        </w:rPr>
-        <w:t xml:space="preserve">How Kubernetes determine to allow or </w:t>
-      </w:r>
-      <w:proofErr w:type="spellStart"/>
-      <w:r>
-        <w:rPr>
-          <w:b/>
-          <w:bCs/>
-        </w:rPr>
-        <w:t>deny:</w:t>
-      </w:r>
-      <w:r>
-        <w:rPr>
-          <w:b/>
-          <w:bCs/>
-        </w:rPr>
+      <w:r>
+        <w:t xml:space="preserve"> flag.</w:t>
+      </w:r>
+    </w:p>
+    <w:p>
+      <w:proofErr w:type="spellStart"/>
+      <w:r>
+        <w:t>eg</w:t>
+      </w:r>
+      <w:proofErr w:type="spellEnd"/>
+      <w:r>
+        <w:t xml:space="preserve">: </w:t>
+      </w:r>
+      <w:r>
+        <w:t xml:space="preserve">docker run </w:t>
+      </w:r>
+      <w:r>
+        <w:rPr>
+          <w:b/>
+          <w:bCs/>
+        </w:rPr>
+        <w:t>--</w:t>
+      </w:r>
+      <w:proofErr w:type="spellStart"/>
+      <w:r>
+        <w:rPr>
+          <w:b/>
+          <w:bCs/>
+        </w:rPr>
+        <w:t>entrypoint</w:t>
+      </w:r>
+      <w:proofErr w:type="spellEnd"/>
+      <w:r>
+        <w:t xml:space="preserve"> ls image</w:t>
+      </w:r>
+      <w:r>
+        <w:t xml:space="preserve">  # This override the default entry point with </w:t>
+      </w:r>
+      <w:proofErr w:type="spellStart"/>
+      <w:r>
+        <w:t>ls</w:t>
+      </w:r>
+      <w:r>
         <w:t>s</w:t>
       </w:r>
       <w:proofErr w:type="spellEnd"/>
     </w:p>
-    <w:p>
-      <w:r>
-        <w:t xml:space="preserve">The </w:t>
-      </w:r>
-      <w:proofErr w:type="spellStart"/>
-      <w:r>
-        <w:t>ImagePolicyWebhook</w:t>
-      </w:r>
-      <w:proofErr w:type="spellEnd"/>
-      <w:r>
-        <w:t xml:space="preserve"> sends information about the requested container image to an external webhook. The webhook performs its own policy logic and then returns an </w:t>
-      </w:r>
-      <w:proofErr w:type="spellStart"/>
-      <w:r>
-        <w:t>ImageReview</w:t>
-      </w:r>
-      <w:proofErr w:type="spellEnd"/>
-      <w:r>
-        <w:t xml:space="preserve"> response. Kubernetes does not care how the webhook makes its decision; it expects the decision in the </w:t>
-      </w:r>
-      <w:proofErr w:type="spellStart"/>
-      <w:r>
-        <w:t>status.allowed</w:t>
-      </w:r>
-      <w:proofErr w:type="spellEnd"/>
-      <w:r>
-        <w:t xml:space="preserve"> field. </w:t>
-      </w:r>
-      <w:proofErr w:type="spellStart"/>
-      <w:r>
-        <w:t>status.allowed</w:t>
-      </w:r>
-      <w:proofErr w:type="spellEnd"/>
-      <w:r>
-        <w:t xml:space="preserve">: true allows the image, while </w:t>
-      </w:r>
-      <w:proofErr w:type="spellStart"/>
-      <w:r>
-        <w:t>status.allowed</w:t>
-      </w:r>
-      <w:proofErr w:type="spellEnd"/>
-      <w:r>
-        <w:t>: false rejects it.</w:t>
-      </w:r>
-    </w:p>
-    <w:p/>
-    <w:p>
-      <w:pPr>
-        <w:rPr>
-          <w:b/>
-          <w:bCs/>
-        </w:rPr>
-      </w:pPr>
-      <w:r>
-        <w:rPr>
-          <w:b/>
-          <w:bCs/>
-        </w:rPr>
-        <w:t>ENTRYPOINT can be written in two forms:</w:t>
-      </w:r>
-    </w:p>
-    <w:p>
-      <w:pPr>
-        <w:rPr>
-          <w:b/>
-          <w:bCs/>
-        </w:rPr>
-      </w:pPr>
-      <w:r>
-        <w:rPr>
-          <w:b/>
-          <w:bCs/>
-        </w:rPr>
-        <w:t>In Docker:</w:t>
-      </w:r>
-    </w:p>
-    <w:p>
-      <w:r>
-        <w:t>Exec form: ENTRYPOINT ["command"] — runs the command directly. CMD or arguments passed with docker run are appended as arguments. Recommended for applications.</w:t>
-      </w:r>
-    </w:p>
-    <w:p>
-      <w:r>
-        <w:t>Shell form: ENTRYPOINT command — runs through /bin/</w:t>
-      </w:r>
-      <w:proofErr w:type="spellStart"/>
-      <w:r>
-        <w:t>sh</w:t>
-      </w:r>
-      <w:proofErr w:type="spellEnd"/>
-      <w:r>
-        <w:t xml:space="preserve"> -c. CMD and runtime arguments are not passed to the </w:t>
-      </w:r>
-      <w:proofErr w:type="spellStart"/>
-      <w:r>
-        <w:t>entrypoint</w:t>
-      </w:r>
-      <w:proofErr w:type="spellEnd"/>
-      <w:r>
-        <w:t xml:space="preserve"> command in the normal way. Useful when shell features such as &amp;&amp;, pipes, or variable expansion are required.</w:t>
-      </w:r>
-    </w:p>
-    <w:p>
-      <w:r>
-        <w:t>Rule: Use exec form for normal applications; use shell form when shell behavior is specifically required.</w:t>
-      </w:r>
-    </w:p>
-    <w:p>
-      <w:r>
-        <w:rPr>
-          <w:b/>
-          <w:bCs/>
-        </w:rPr>
-        <w:t>ENTRYPOINT</w:t>
-      </w:r>
-      <w:r>
-        <w:t xml:space="preserve"> provides the main executable; </w:t>
-      </w:r>
-      <w:r>
-        <w:rPr>
-          <w:b/>
-          <w:bCs/>
-        </w:rPr>
-        <w:t>CMD</w:t>
-      </w:r>
-      <w:r>
-        <w:t xml:space="preserve"> provides default arguments to it, which can be overridden by arguments supplied to docker run.</w:t>
-      </w:r>
-    </w:p>
-    <w:p/>
-    <w:p>
-      <w:r>
-        <w:t xml:space="preserve">To over ride an entry point, use the  </w:t>
-      </w:r>
-      <w:r>
-        <w:rPr>
-          <w:b/>
-          <w:bCs/>
-        </w:rPr>
-        <w:t>“--</w:t>
-      </w:r>
-      <w:proofErr w:type="spellStart"/>
-      <w:r>
-        <w:rPr>
-          <w:b/>
-          <w:bCs/>
-        </w:rPr>
-        <w:t>entrypoint</w:t>
-      </w:r>
-      <w:proofErr w:type="spellEnd"/>
-      <w:r>
-        <w:rPr>
-          <w:b/>
-          <w:bCs/>
-        </w:rPr>
-        <w:t>”</w:t>
-      </w:r>
-      <w:r>
-        <w:t xml:space="preserve"> flag.</w:t>
-      </w:r>
-    </w:p>
-    <w:p>
-      <w:proofErr w:type="spellStart"/>
-      <w:r>
-        <w:t>eg</w:t>
-      </w:r>
-      <w:proofErr w:type="spellEnd"/>
-      <w:r>
-        <w:t xml:space="preserve">: </w:t>
-      </w:r>
-      <w:r>
-        <w:t xml:space="preserve">docker run </w:t>
-      </w:r>
-      <w:r>
-        <w:rPr>
-          <w:b/>
-          <w:bCs/>
-        </w:rPr>
-        <w:t>--</w:t>
-      </w:r>
-      <w:proofErr w:type="spellStart"/>
-      <w:r>
-        <w:rPr>
-          <w:b/>
-          <w:bCs/>
-        </w:rPr>
-        <w:t>entrypoint</w:t>
-      </w:r>
-      <w:proofErr w:type="spellEnd"/>
-      <w:r>
-        <w:t xml:space="preserve"> ls image</w:t>
-      </w:r>
-      <w:r>
-        <w:t xml:space="preserve">  # This override the default entry point with </w:t>
-      </w:r>
-      <w:proofErr w:type="spellStart"/>
-      <w:r>
-        <w:t>ls</w:t>
-      </w:r>
-      <w:r>
-        <w:t>s</w:t>
-      </w:r>
-      <w:proofErr w:type="spellEnd"/>
-    </w:p>
     <w:p/>
     <w:p>
       <w:pPr>
@@ -1910,6 +1935,7 @@
           <w:b/>
           <w:bCs/>
         </w:rPr>
+        <w:lastRenderedPageBreak/>
         <w:t xml:space="preserve">Difference between </w:t>
       </w:r>
       <w:proofErr w:type="spellStart"/>
@@ -2012,7 +2038,6 @@
           <w:b/>
           <w:bCs/>
         </w:rPr>
-        <w:lastRenderedPageBreak/>
         <w:t>METRICS SERVER</w:t>
       </w:r>
     </w:p>
@@ -2274,7 +2299,6 @@
     <w:p/>
     <w:p>
       <w:r>
-        <w:lastRenderedPageBreak/>
         <w:t xml:space="preserve">This is the sidecar container. It is an </w:t>
       </w:r>
       <w:proofErr w:type="spellStart"/>
@@ -2328,6 +2352,9 @@
     </w:p>
     <w:p>
       <w:r>
+        <w:rPr>
+          <w:noProof/>
+        </w:rPr>
         <w:drawing>
           <wp:inline distT="0" distB="0" distL="0" distR="0" wp14:anchorId="13E7C990" wp14:editId="0F50F41B">
             <wp:extent cx="5943600" cy="2802890"/>
@@ -2387,6 +2414,372 @@
       </w:r>
     </w:p>
     <w:p/>
+    <w:p>
+      <w:r>
+        <w:rPr>
+          <w:b/>
+          <w:bCs/>
+        </w:rPr>
+        <w:t xml:space="preserve">Vertical Pod </w:t>
+      </w:r>
+      <w:proofErr w:type="spellStart"/>
+      <w:r>
+        <w:rPr>
+          <w:b/>
+          <w:bCs/>
+        </w:rPr>
+        <w:t>Autoscaler</w:t>
+      </w:r>
+      <w:proofErr w:type="spellEnd"/>
+      <w:r>
+        <w:t>: It is not an inbuilt resource. You have to deploy them separately.</w:t>
+      </w:r>
+    </w:p>
+    <w:p>
+      <w:r>
+        <w:rPr>
+          <w:noProof/>
+        </w:rPr>
+        <w:lastRenderedPageBreak/>
+        <w:drawing>
+          <wp:inline distT="0" distB="0" distL="0" distR="0" wp14:anchorId="26C2E81C" wp14:editId="2095FD7C">
+            <wp:extent cx="5943600" cy="2859405"/>
+            <wp:effectExtent l="0" t="0" r="0" b="0"/>
+            <wp:docPr id="1414560642" name="Picture 1"/>
+            <wp:cNvGraphicFramePr>
+              <a:graphicFrameLocks xmlns:a="http://schemas.openxmlformats.org/drawingml/2006/main" noChangeAspect="1"/>
+            </wp:cNvGraphicFramePr>
+            <a:graphic xmlns:a="http://schemas.openxmlformats.org/drawingml/2006/main">
+              <a:graphicData uri="http://schemas.openxmlformats.org/drawingml/2006/picture">
+                <pic:pic xmlns:pic="http://schemas.openxmlformats.org/drawingml/2006/picture">
+                  <pic:nvPicPr>
+                    <pic:cNvPr id="1414560642" name=""/>
+                    <pic:cNvPicPr/>
+                  </pic:nvPicPr>
+                  <pic:blipFill>
+                    <a:blip r:embed="rId11"/>
+                    <a:stretch>
+                      <a:fillRect/>
+                    </a:stretch>
+                  </pic:blipFill>
+                  <pic:spPr>
+                    <a:xfrm>
+                      <a:off x="0" y="0"/>
+                      <a:ext cx="5943600" cy="2859405"/>
+                    </a:xfrm>
+                    <a:prstGeom prst="rect">
+                      <a:avLst/>
+                    </a:prstGeom>
+                  </pic:spPr>
+                </pic:pic>
+              </a:graphicData>
+            </a:graphic>
+          </wp:inline>
+        </w:drawing>
+      </w:r>
+    </w:p>
+    <w:p/>
+    <w:p>
+      <w:r>
+        <w:rPr>
+          <w:noProof/>
+        </w:rPr>
+        <w:drawing>
+          <wp:inline distT="0" distB="0" distL="0" distR="0" wp14:anchorId="2B8C344E" wp14:editId="0391BC2E">
+            <wp:extent cx="5943600" cy="2762885"/>
+            <wp:effectExtent l="0" t="0" r="0" b="0"/>
+            <wp:docPr id="924652105" name="Picture 1"/>
+            <wp:cNvGraphicFramePr>
+              <a:graphicFrameLocks xmlns:a="http://schemas.openxmlformats.org/drawingml/2006/main" noChangeAspect="1"/>
+            </wp:cNvGraphicFramePr>
+            <a:graphic xmlns:a="http://schemas.openxmlformats.org/drawingml/2006/main">
+              <a:graphicData uri="http://schemas.openxmlformats.org/drawingml/2006/picture">
+                <pic:pic xmlns:pic="http://schemas.openxmlformats.org/drawingml/2006/picture">
+                  <pic:nvPicPr>
+                    <pic:cNvPr id="924652105" name=""/>
+                    <pic:cNvPicPr/>
+                  </pic:nvPicPr>
+                  <pic:blipFill>
+                    <a:blip r:embed="rId12"/>
+                    <a:stretch>
+                      <a:fillRect/>
+                    </a:stretch>
+                  </pic:blipFill>
+                  <pic:spPr>
+                    <a:xfrm>
+                      <a:off x="0" y="0"/>
+                      <a:ext cx="5943600" cy="2762885"/>
+                    </a:xfrm>
+                    <a:prstGeom prst="rect">
+                      <a:avLst/>
+                    </a:prstGeom>
+                  </pic:spPr>
+                </pic:pic>
+              </a:graphicData>
+            </a:graphic>
+          </wp:inline>
+        </w:drawing>
+      </w:r>
+    </w:p>
+    <w:p/>
+    <w:p>
+      <w:r>
+        <w:rPr>
+          <w:b/>
+          <w:bCs/>
+        </w:rPr>
+        <w:t xml:space="preserve">Vertical Pod </w:t>
+      </w:r>
+      <w:proofErr w:type="spellStart"/>
+      <w:r>
+        <w:rPr>
+          <w:b/>
+          <w:bCs/>
+        </w:rPr>
+        <w:t>Autoscaler</w:t>
+      </w:r>
+      <w:proofErr w:type="spellEnd"/>
+      <w:r>
+        <w:rPr>
+          <w:b/>
+          <w:bCs/>
+        </w:rPr>
+        <w:t xml:space="preserve"> (VPA)</w:t>
+      </w:r>
+      <w:r>
+        <w:t xml:space="preserve"> automatically adjusts the CPU and memory requests/limits of Pods based on their actual usage. It is installed as a Kubernetes add-on and has three main components: the </w:t>
+      </w:r>
+      <w:r>
+        <w:rPr>
+          <w:b/>
+          <w:bCs/>
+        </w:rPr>
+        <w:t>Recommender</w:t>
+      </w:r>
+      <w:r>
+        <w:t xml:space="preserve"> analyzes resource usage and calculates recommended values, the </w:t>
+      </w:r>
+      <w:r>
+        <w:rPr>
+          <w:b/>
+          <w:bCs/>
+        </w:rPr>
+        <w:t>Updater</w:t>
+      </w:r>
+      <w:r>
+        <w:t xml:space="preserve"> evicts Pods when their resources need to change, and the </w:t>
+      </w:r>
+      <w:r>
+        <w:rPr>
+          <w:b/>
+          <w:bCs/>
+        </w:rPr>
+        <w:t>Admission Controller</w:t>
+      </w:r>
+      <w:r>
+        <w:t xml:space="preserve"> applies the recommended resources when replacement Pods are created. VPA is configured using a </w:t>
+      </w:r>
+      <w:proofErr w:type="spellStart"/>
+      <w:r>
+        <w:t>VerticalPodAutoscaler</w:t>
+      </w:r>
+      <w:proofErr w:type="spellEnd"/>
+      <w:r>
+        <w:t xml:space="preserve"> </w:t>
+      </w:r>
+      <w:r>
+        <w:t xml:space="preserve">custom </w:t>
+      </w:r>
+      <w:proofErr w:type="spellStart"/>
+      <w:r>
+        <w:t>resourcedefinition</w:t>
+      </w:r>
+      <w:proofErr w:type="spellEnd"/>
+      <w:r>
+        <w:t xml:space="preserve"> </w:t>
+      </w:r>
+      <w:r>
+        <w:t>that specifies which workload it should manage.</w:t>
+      </w:r>
+    </w:p>
+    <w:p/>
+    <w:p/>
+    <w:p>
+      <w:r>
+        <w:t>3 parts of VPA</w:t>
+      </w:r>
+    </w:p>
+    <w:p>
+      <w:pPr>
+        <w:pStyle w:val="ListParagraph"/>
+        <w:numPr>
+          <w:ilvl w:val="0"/>
+          <w:numId w:val="11"/>
+        </w:numPr>
+      </w:pPr>
+      <w:r>
+        <w:t xml:space="preserve">Recommender </w:t>
+      </w:r>
+      <w:r>
+        <w:t>-</w:t>
+      </w:r>
+      <w:r>
+        <w:t xml:space="preserve">calculates resource recommendation </w:t>
+      </w:r>
+    </w:p>
+    <w:p>
+      <w:pPr>
+        <w:pStyle w:val="ListParagraph"/>
+        <w:numPr>
+          <w:ilvl w:val="0"/>
+          <w:numId w:val="11"/>
+        </w:numPr>
+      </w:pPr>
+      <w:r>
+        <w:t xml:space="preserve">Updater </w:t>
+      </w:r>
+      <w:r>
+        <w:t>-</w:t>
+      </w:r>
+      <w:r>
+        <w:t xml:space="preserve"> evicts Pods that need new resources </w:t>
+      </w:r>
+    </w:p>
+    <w:p>
+      <w:pPr>
+        <w:pStyle w:val="ListParagraph"/>
+        <w:numPr>
+          <w:ilvl w:val="0"/>
+          <w:numId w:val="11"/>
+        </w:numPr>
+      </w:pPr>
+      <w:r>
+        <w:t xml:space="preserve">Admission Controller </w:t>
+      </w:r>
+      <w:r>
+        <w:t>-</w:t>
+      </w:r>
+      <w:r>
+        <w:t xml:space="preserve"> applies recommendation to newly created Pods</w:t>
+      </w:r>
+    </w:p>
+    <w:p/>
+    <w:p>
+      <w:r>
+        <w:rPr>
+          <w:b/>
+          <w:bCs/>
+        </w:rPr>
+        <w:t>Problem:</w:t>
+      </w:r>
+      <w:r>
+        <w:t xml:space="preserve"> VPA may need to evict an existing Pod to apply new resource recommendations. With only </w:t>
+      </w:r>
+      <w:r>
+        <w:rPr>
+          <w:b/>
+          <w:bCs/>
+        </w:rPr>
+        <w:t>1 replica</w:t>
+      </w:r>
+      <w:r>
+        <w:t xml:space="preserve">, Kubernetes may block the eviction with </w:t>
+      </w:r>
+      <w:r>
+        <w:rPr>
+          <w:b/>
+          <w:bCs/>
+        </w:rPr>
+        <w:t>“too few replicas”</w:t>
+      </w:r>
+      <w:r>
+        <w:t xml:space="preserve"> to prevent downtime.</w:t>
+      </w:r>
+    </w:p>
+    <w:p>
+      <w:r>
+        <w:rPr>
+          <w:b/>
+          <w:bCs/>
+        </w:rPr>
+        <w:t>Fix:</w:t>
+      </w:r>
+      <w:r>
+        <w:t xml:space="preserve"> Increase the Deployment to </w:t>
+      </w:r>
+      <w:r>
+        <w:rPr>
+          <w:b/>
+          <w:bCs/>
+        </w:rPr>
+        <w:t>2 or more replicas</w:t>
+      </w:r>
+      <w:r>
+        <w:t>, allowing VPA to evict and recreate one Pod while another continues serving traffic.</w:t>
+      </w:r>
+    </w:p>
+    <w:p>
+      <w:pPr>
+        <w:rPr>
+          <w:b/>
+          <w:bCs/>
+        </w:rPr>
+      </w:pPr>
+      <w:proofErr w:type="spellStart"/>
+      <w:r>
+        <w:rPr>
+          <w:b/>
+          <w:bCs/>
+        </w:rPr>
+        <w:t>PodDisruptionBudget</w:t>
+      </w:r>
+      <w:proofErr w:type="spellEnd"/>
+      <w:r>
+        <w:rPr>
+          <w:b/>
+          <w:bCs/>
+        </w:rPr>
+        <w:t xml:space="preserve"> (PDB)</w:t>
+      </w:r>
+    </w:p>
+    <w:p/>
+    <w:p>
+      <w:r>
+        <w:t xml:space="preserve">A </w:t>
+      </w:r>
+      <w:proofErr w:type="spellStart"/>
+      <w:r>
+        <w:t>PodDisruptionBudget</w:t>
+      </w:r>
+      <w:proofErr w:type="spellEnd"/>
+      <w:r>
+        <w:t xml:space="preserve"> (PDB) protects application availability during voluntary disruptions such as node draining, maintenance, and upgrades. It defines the minimum number of Pods that must remain available, preventing Kubernetes from voluntarily evicting too many Pods at the same time. For example, if an application has 3 replicas and </w:t>
+      </w:r>
+      <w:proofErr w:type="spellStart"/>
+      <w:r>
+        <w:t>minAvailable</w:t>
+      </w:r>
+      <w:proofErr w:type="spellEnd"/>
+      <w:r>
+        <w:t>: 2, Kubernetes can evict one Pod, but it will not allow another voluntary eviction until the replacement Pod becomes available and the application returns to 3 available Pods.</w:t>
+      </w:r>
+    </w:p>
+    <w:p/>
+    <w:p>
+      <w:r>
+        <w:t xml:space="preserve">For example, with 3 replicas and </w:t>
+      </w:r>
+      <w:proofErr w:type="spellStart"/>
+      <w:r>
+        <w:t>minAvailable</w:t>
+      </w:r>
+      <w:proofErr w:type="spellEnd"/>
+      <w:r>
+        <w:t>: 2, Kubernetes allows one Pod to be evicted during a node drain while ensuring at least 2 Pods remain available; the Deployment creates a replacement Pod and once it becomes Ready, the next Pod can be evicted.</w:t>
+      </w:r>
+    </w:p>
+    <w:p/>
+    <w:p/>
     <w:p/>
     <w:p/>
     <w:p/>
@@ -2398,6 +2791,7 @@
         <w:rPr>
           <w:b/>
           <w:bCs/>
+          <w:highlight w:val="yellow"/>
         </w:rPr>
         <w:t xml:space="preserve">ETCD </w:t>
       </w:r>
@@ -2405,12 +2799,14 @@
         <w:rPr>
           <w:b/>
           <w:bCs/>
+          <w:highlight w:val="yellow"/>
         </w:rPr>
         <w:t>DATABASE</w:t>
       </w:r>
     </w:p>
     <w:p>
       <w:r>
+        <w:lastRenderedPageBreak/>
         <w:t xml:space="preserve">By </w:t>
       </w:r>
       <w:r>
@@ -2469,7 +2865,7 @@
                     <pic:cNvPicPr/>
                   </pic:nvPicPr>
                   <pic:blipFill>
-                    <a:blip r:embed="rId11"/>
+                    <a:blip r:embed="rId13"/>
                     <a:stretch>
                       <a:fillRect/>
                     </a:stretch>
@@ -2493,7 +2889,6 @@
     <w:p/>
     <w:p>
       <w:r>
-        <w:lastRenderedPageBreak/>
         <w:t>ETCD stores Kubernetes objects as raw bytes (</w:t>
       </w:r>
       <w:proofErr w:type="spellStart"/>
@@ -2526,7 +2921,7 @@
         <w:rPr>
           <w:b/>
           <w:bCs/>
-          <w:highlight w:val="yellow"/>
+          <w:highlight w:val="cyan"/>
         </w:rPr>
         <w:t>IMPORTANT:</w:t>
       </w:r>
@@ -2571,7 +2966,7 @@
                     <pic:cNvPicPr/>
                   </pic:nvPicPr>
                   <pic:blipFill>
-                    <a:blip r:embed="rId12"/>
+                    <a:blip r:embed="rId14"/>
                     <a:stretch>
                       <a:fillRect/>
                     </a:stretch>
@@ -2654,7 +3049,9 @@
         <w:rPr>
           <w:b/>
           <w:bCs/>
-        </w:rPr>
+          <w:highlight w:val="yellow"/>
+        </w:rPr>
+        <w:lastRenderedPageBreak/>
         <w:t>CONFIGMAPS</w:t>
       </w:r>
     </w:p>
@@ -2845,7 +3242,7 @@
                     <pic:cNvPicPr/>
                   </pic:nvPicPr>
                   <pic:blipFill>
-                    <a:blip r:embed="rId13"/>
+                    <a:blip r:embed="rId15"/>
                     <a:stretch>
                       <a:fillRect/>
                     </a:stretch>
@@ -3009,6 +3406,7 @@
         <w:rPr>
           <w:b/>
           <w:bCs/>
+          <w:highlight w:val="yellow"/>
         </w:rPr>
         <w:t>SECRETS</w:t>
       </w:r>
@@ -3092,7 +3490,6 @@
         <w:rPr>
           <w:noProof/>
         </w:rPr>
-        <w:lastRenderedPageBreak/>
         <w:drawing>
           <wp:inline distT="0" distB="0" distL="0" distR="0" wp14:anchorId="4B08613D" wp14:editId="1B873A41">
             <wp:extent cx="3029373" cy="638264"/>
@@ -3109,7 +3506,7 @@
                     <pic:cNvPicPr/>
                   </pic:nvPicPr>
                   <pic:blipFill>
-                    <a:blip r:embed="rId14"/>
+                    <a:blip r:embed="rId16"/>
                     <a:stretch>
                       <a:fillRect/>
                     </a:stretch>
@@ -3180,7 +3577,7 @@
                     <pic:cNvPicPr/>
                   </pic:nvPicPr>
                   <pic:blipFill>
-                    <a:blip r:embed="rId15"/>
+                    <a:blip r:embed="rId17"/>
                     <a:stretch>
                       <a:fillRect/>
                     </a:stretch>
@@ -3212,6 +3609,7 @@
         <w:rPr>
           <w:noProof/>
         </w:rPr>
+        <w:lastRenderedPageBreak/>
         <w:drawing>
           <wp:inline distT="0" distB="0" distL="0" distR="0" wp14:anchorId="508BC2A4" wp14:editId="1CB6EF10">
             <wp:extent cx="2314898" cy="1581371"/>
@@ -3228,7 +3626,7 @@
                     <pic:cNvPicPr/>
                   </pic:nvPicPr>
                   <pic:blipFill>
-                    <a:blip r:embed="rId16"/>
+                    <a:blip r:embed="rId18"/>
                     <a:stretch>
                       <a:fillRect/>
                     </a:stretch>
@@ -3266,7 +3664,7 @@
         <w:rPr>
           <w:b/>
           <w:bCs/>
-          <w:highlight w:val="yellow"/>
+          <w:highlight w:val="cyan"/>
         </w:rPr>
         <w:t>IMPORTANT:</w:t>
       </w:r>
@@ -3297,7 +3695,6 @@
         </w:numPr>
       </w:pPr>
       <w:r>
-        <w:lastRenderedPageBreak/>
         <w:t xml:space="preserve">Enabling Encryption at Rest for Secrets so they are stored encrypted in ETCD. </w:t>
       </w:r>
     </w:p>
@@ -3403,6 +3800,7 @@
         <w:rPr>
           <w:b/>
           <w:bCs/>
+          <w:highlight w:val="yellow"/>
         </w:rPr>
         <w:t>KUBECTL COMMANDS RELATED</w:t>
       </w:r>
@@ -3470,6 +3868,7 @@
     <w:p>
       <w:proofErr w:type="spellStart"/>
       <w:r>
+        <w:lastRenderedPageBreak/>
         <w:t>ku</w:t>
       </w:r>
       <w:r>
@@ -3594,17 +3993,8 @@
     </w:p>
     <w:p/>
     <w:p>
-      <w:proofErr w:type="spellStart"/>
-      <w:r>
-        <w:lastRenderedPageBreak/>
-        <w:t>s</w:t>
-      </w:r>
-      <w:r>
-        <w:t>To</w:t>
-      </w:r>
-      <w:proofErr w:type="spellEnd"/>
-      <w:r>
-        <w:t xml:space="preserve"> log in to a multi container pod:  </w:t>
+      <w:r>
+        <w:t xml:space="preserve">To log in to a multi container pod:  </w:t>
       </w:r>
       <w:proofErr w:type="spellStart"/>
       <w:r>
@@ -4375,7 +4765,7 @@
   <w:abstractNum w:abstractNumId="6" w15:restartNumberingAfterBreak="0">
     <w:nsid w:val="4C687D05"/>
     <w:multiLevelType w:val="hybridMultilevel"/>
-    <w:tmpl w:val="ECD2D0D8"/>
+    <w:tmpl w:val="3E06CC0A"/>
     <w:lvl w:ilvl="0" w:tplc="10090001">
       <w:start w:val="1"/>
       <w:numFmt w:val="bullet"/>

</xml_diff>

<commit_message>
How to pull image from private registry added
</commit_message>
<xml_diff>
--- a/9-Interesting_learning_Notes/Learning_Notes.docx
+++ b/9-Interesting_learning_Notes/Learning_Notes.docx
@@ -119,7 +119,6 @@
       <w:r>
         <w:t xml:space="preserve">, Kubernetes assigns it a </w:t>
       </w:r>
-      <w:proofErr w:type="spellStart"/>
       <w:r>
         <w:rPr>
           <w:b/>
@@ -127,7 +126,6 @@
         </w:rPr>
         <w:t>ClusterIP</w:t>
       </w:r>
-      <w:proofErr w:type="spellEnd"/>
       <w:r>
         <w:t xml:space="preserve">. </w:t>
       </w:r>
@@ -181,21 +179,12 @@
           <w:numId w:val="2"/>
         </w:numPr>
       </w:pPr>
-      <w:proofErr w:type="spellStart"/>
-      <w:r>
-        <w:rPr>
-          <w:b/>
-          <w:bCs/>
-        </w:rPr>
-        <w:t>kube</w:t>
-      </w:r>
-      <w:proofErr w:type="spellEnd"/>
-      <w:r>
-        <w:rPr>
-          <w:b/>
-          <w:bCs/>
-        </w:rPr>
-        <w:t>-proxy does not assign the Service IP.</w:t>
+      <w:r>
+        <w:rPr>
+          <w:b/>
+          <w:bCs/>
+        </w:rPr>
+        <w:t>kube-proxy does not assign the Service IP.</w:t>
       </w:r>
       <w:r>
         <w:t xml:space="preserve"> </w:t>
@@ -208,13 +197,8 @@
           <w:numId w:val="2"/>
         </w:numPr>
       </w:pPr>
-      <w:proofErr w:type="spellStart"/>
-      <w:r>
-        <w:t>kube</w:t>
-      </w:r>
-      <w:proofErr w:type="spellEnd"/>
-      <w:r>
-        <w:t xml:space="preserve">-proxy watches Services and creates </w:t>
+      <w:r>
+        <w:t xml:space="preserve">kube-proxy watches Services and creates </w:t>
       </w:r>
       <w:r>
         <w:rPr>
@@ -224,15 +208,7 @@
         <w:t>networking rules</w:t>
       </w:r>
       <w:r>
-        <w:t xml:space="preserve"> (iptables/IPVS/</w:t>
-      </w:r>
-      <w:proofErr w:type="spellStart"/>
-      <w:r>
-        <w:t>nftables</w:t>
-      </w:r>
-      <w:proofErr w:type="spellEnd"/>
-      <w:r>
-        <w:t>) to route traffic from the Service IP to the backend Pod IPs.</w:t>
+        <w:t xml:space="preserve"> (iptables/IPVS/nftables) to route traffic from the Service IP to the backend Pod IPs.</w:t>
       </w:r>
     </w:p>
     <w:p>
@@ -263,21 +239,12 @@
           <w:numId w:val="2"/>
         </w:numPr>
       </w:pPr>
-      <w:proofErr w:type="spellStart"/>
-      <w:r>
-        <w:rPr>
-          <w:b/>
-          <w:bCs/>
-        </w:rPr>
-        <w:t>kube</w:t>
-      </w:r>
-      <w:proofErr w:type="spellEnd"/>
-      <w:r>
-        <w:rPr>
-          <w:b/>
-          <w:bCs/>
-        </w:rPr>
-        <w:t>-proxy</w:t>
+      <w:r>
+        <w:rPr>
+          <w:b/>
+          <w:bCs/>
+        </w:rPr>
+        <w:t>kube-proxy</w:t>
       </w:r>
       <w:r>
         <w:t xml:space="preserve"> creates networking rules that recognize this virtual IP and forward traffic to the Service's backend Pods.</w:t>
@@ -323,40 +290,19 @@
         <w:t xml:space="preserve">: </w:t>
       </w:r>
       <w:r>
-        <w:t xml:space="preserve">A Kubernetes </w:t>
-      </w:r>
-      <w:proofErr w:type="spellStart"/>
-      <w:r>
-        <w:t>NodePort</w:t>
-      </w:r>
-      <w:proofErr w:type="spellEnd"/>
-      <w:r>
-        <w:t xml:space="preserve"> does not create a normal listening socket on the node. Instead, </w:t>
-      </w:r>
-      <w:proofErr w:type="spellStart"/>
-      <w:r>
-        <w:t>Kuberne</w:t>
+        <w:t>A Kubernetes NodePort does not create a normal listening socket on the node. Instead, Kuberne</w:t>
       </w:r>
       <w:r>
         <w:t>s</w:t>
       </w:r>
       <w:r>
-        <w:t>tes</w:t>
-      </w:r>
-      <w:proofErr w:type="spellEnd"/>
-      <w:r>
-        <w:t xml:space="preserve"> configures networking rules to forward traffic arriving on that port to the Service. Therefore, if a host-level application is already listening on the same port, traffic arriving through that node may be handled by the existing application instead of reaching the Kubernetes Service, depending on the networking implementation and rule processing.</w:t>
-      </w:r>
-    </w:p>
-    <w:p/>
-    <w:p>
-      <w:proofErr w:type="spellStart"/>
-      <w:r>
-        <w:t>NodePort</w:t>
-      </w:r>
-      <w:proofErr w:type="spellEnd"/>
-      <w:r>
-        <w:t xml:space="preserve"> 30005 does NOT mean:</w:t>
+        <w:t>tes configures networking rules to forward traffic arriving on that port to the Service. Therefore, if a host-level application is already listening on the same port, traffic arriving through that node may be handled by the existing application instead of reaching the Kubernetes Service, depending on the networking implementation and rule processing.</w:t>
+      </w:r>
+    </w:p>
+    <w:p/>
+    <w:p>
+      <w:r>
+        <w:t>NodePort 30005 does NOT mean:</w:t>
       </w:r>
     </w:p>
     <w:p>
@@ -380,21 +326,12 @@
       <w:r>
         <w:t xml:space="preserve">packet gets </w:t>
       </w:r>
-      <w:proofErr w:type="spellStart"/>
-      <w:r>
-        <w:rPr>
-          <w:b/>
-          <w:bCs/>
-        </w:rPr>
-        <w:t>DNAT'ed</w:t>
-      </w:r>
-      <w:proofErr w:type="spellEnd"/>
-      <w:r>
-        <w:rPr>
-          <w:b/>
-          <w:bCs/>
-        </w:rPr>
-        <w:t>/redirected by the Kubernetes networking rules before normal socket delivery</w:t>
+      <w:r>
+        <w:rPr>
+          <w:b/>
+          <w:bCs/>
+        </w:rPr>
+        <w:t>DNAT'ed/redirected by the Kubernetes networking rules before normal socket delivery</w:t>
       </w:r>
       <w:r>
         <w:t>.</w:t>
@@ -411,7 +348,6 @@
       <w:r>
         <w:t xml:space="preserve">The full DNS to refer a service is: </w:t>
       </w:r>
-      <w:proofErr w:type="spellStart"/>
       <w:r>
         <w:rPr>
           <w:b/>
@@ -419,7 +355,6 @@
         </w:rPr>
         <w:t>myservice.default.svc.cluster.local</w:t>
       </w:r>
-      <w:proofErr w:type="spellEnd"/>
     </w:p>
     <w:p>
       <w:pPr>
@@ -446,21 +381,8 @@
     </w:p>
     <w:p>
       <w:r>
-        <w:t xml:space="preserve">The Structure of a Kubernetes Service DNS </w:t>
-      </w:r>
-      <w:proofErr w:type="spellStart"/>
-      <w:r>
-        <w:t>NameEvery</w:t>
-      </w:r>
-      <w:proofErr w:type="spellEnd"/>
-      <w:r>
-        <w:t xml:space="preserve"> Service gets a full DNS address that looks like this:[service-name].[namespace].</w:t>
-      </w:r>
-      <w:proofErr w:type="spellStart"/>
-      <w:r>
-        <w:t>svc.cluster.local</w:t>
-      </w:r>
-      <w:proofErr w:type="spellEnd"/>
+        <w:t>The Structure of a Kubernetes Service DNS NameEvery Service gets a full DNS address that looks like this:[service-name].[namespace].svc.cluster.local</w:t>
+      </w:r>
     </w:p>
     <w:p>
       <w:pPr>
@@ -470,13 +392,8 @@
           <w:numId w:val="3"/>
         </w:numPr>
       </w:pPr>
-      <w:proofErr w:type="spellStart"/>
-      <w:r>
-        <w:t>service-name:The</w:t>
-      </w:r>
-      <w:proofErr w:type="spellEnd"/>
-      <w:r>
-        <w:t xml:space="preserve"> name you gave your Service.</w:t>
+      <w:r>
+        <w:t>service-name:The name you gave your Service.</w:t>
       </w:r>
     </w:p>
     <w:p>
@@ -504,93 +421,24 @@
       </w:r>
     </w:p>
     <w:p>
-      <w:proofErr w:type="spellStart"/>
-      <w:r>
-        <w:t>cluster.local</w:t>
-      </w:r>
-      <w:proofErr w:type="spellEnd"/>
-      <w:r>
-        <w:t>: The default local domain name for your entire cluster.</w:t>
-      </w:r>
-    </w:p>
-    <w:p/>
-    <w:p>
-      <w:r>
-        <w:t>Scenario A Example: A pod in the "frontend" namespace connects to a database in the same namespace using just "</w:t>
-      </w:r>
-      <w:proofErr w:type="spellStart"/>
-      <w:r>
-        <w:t>db</w:t>
-      </w:r>
-      <w:proofErr w:type="spellEnd"/>
-      <w:r>
-        <w:t>-service".</w:t>
-      </w:r>
-    </w:p>
-    <w:p>
-      <w:r>
-        <w:t>Scenario B Example: A pod in the "frontend" namespace connects to a database in the "backend" namespace using "</w:t>
-      </w:r>
-      <w:proofErr w:type="spellStart"/>
-      <w:r>
-        <w:t>db-service.backend</w:t>
-      </w:r>
-      <w:proofErr w:type="spellEnd"/>
-      <w:r>
-        <w:t>".</w:t>
-      </w:r>
-    </w:p>
-    <w:p>
-      <w:r>
-        <w:t>The remaining part of the address—.</w:t>
-      </w:r>
-      <w:proofErr w:type="spellStart"/>
-      <w:r>
-        <w:t>svc.cluster.local</w:t>
-      </w:r>
-      <w:proofErr w:type="spellEnd"/>
-      <w:r>
-        <w:t>—is called the cluster suffix. It is not mandatory because every container running inside a Kubernetes Pod has a hidden configuration file (/</w:t>
-      </w:r>
-      <w:proofErr w:type="spellStart"/>
-      <w:r>
-        <w:t>etc</w:t>
-      </w:r>
-      <w:proofErr w:type="spellEnd"/>
-      <w:r>
-        <w:t>/</w:t>
-      </w:r>
-      <w:proofErr w:type="spellStart"/>
-      <w:r>
-        <w:t>resolv.conf</w:t>
-      </w:r>
-      <w:proofErr w:type="spellEnd"/>
-      <w:r>
-        <w:t xml:space="preserve">) created automatically by the cluster. it contain all the search </w:t>
-      </w:r>
-      <w:proofErr w:type="spellStart"/>
-      <w:r>
-        <w:t>list.Because</w:t>
-      </w:r>
-      <w:proofErr w:type="spellEnd"/>
-      <w:r>
-        <w:t xml:space="preserve"> of this search list, if you type just </w:t>
-      </w:r>
-      <w:proofErr w:type="spellStart"/>
-      <w:r>
-        <w:t>db</w:t>
-      </w:r>
-      <w:proofErr w:type="spellEnd"/>
-      <w:r>
-        <w:t>-service, Kubernetes automatically appends the remaining parts (.</w:t>
-      </w:r>
-      <w:proofErr w:type="spellStart"/>
-      <w:r>
-        <w:t>svc.cluster.local</w:t>
-      </w:r>
-      <w:proofErr w:type="spellEnd"/>
-      <w:r>
-        <w:t>) behind the scenes and tests them one by one until it finds a match!</w:t>
+      <w:r>
+        <w:t>cluster.local: The default local domain name for your entire cluster.</w:t>
+      </w:r>
+    </w:p>
+    <w:p/>
+    <w:p>
+      <w:r>
+        <w:t>Scenario A Example: A pod in the "frontend" namespace connects to a database in the same namespace using just "db-service".</w:t>
+      </w:r>
+    </w:p>
+    <w:p>
+      <w:r>
+        <w:t>Scenario B Example: A pod in the "frontend" namespace connects to a database in the "backend" namespace using "db-service.backend".</w:t>
+      </w:r>
+    </w:p>
+    <w:p>
+      <w:r>
+        <w:t>The remaining part of the address—.svc.cluster.local—is called the cluster suffix. It is not mandatory because every container running inside a Kubernetes Pod has a hidden configuration file (/etc/resolv.conf) created automatically by the cluster. it contain all the search list.Because of this search list, if you type just db-service, Kubernetes automatically appends the remaining parts (.svc.cluster.local) behind the scenes and tests them one by one until it finds a match!</w:t>
       </w:r>
     </w:p>
     <w:p>
@@ -673,313 +521,248 @@
       <w:r>
         <w:t xml:space="preserve"> </w:t>
       </w:r>
-      <w:proofErr w:type="spellStart"/>
-      <w:r>
-        <w:t>kubectl</w:t>
-      </w:r>
-      <w:proofErr w:type="spellEnd"/>
+      <w:r>
+        <w:t xml:space="preserve">kubectl </w:t>
+      </w:r>
+      <w:r>
+        <w:rPr>
+          <w:b/>
+          <w:bCs/>
+        </w:rPr>
+        <w:t>edit</w:t>
+      </w:r>
+      <w:r>
+        <w:t xml:space="preserve"> svc my-nodeport-service</w:t>
+      </w:r>
+    </w:p>
+    <w:p>
+      <w:pPr>
+        <w:rPr>
+          <w:b/>
+          <w:bCs/>
+        </w:rPr>
+      </w:pPr>
+      <w:r>
+        <w:t xml:space="preserve">Under the selector section, add the label of the pod. The pod label can be found </w:t>
+      </w:r>
+      <w:r>
+        <w:t>using:</w:t>
+      </w:r>
       <w:r>
         <w:t xml:space="preserve"> </w:t>
       </w:r>
       <w:r>
-        <w:rPr>
-          <w:b/>
-          <w:bCs/>
-        </w:rPr>
-        <w:t>edit</w:t>
-      </w:r>
-      <w:r>
-        <w:t xml:space="preserve"> svc my-</w:t>
-      </w:r>
-      <w:proofErr w:type="spellStart"/>
-      <w:r>
-        <w:t>nodeport</w:t>
-      </w:r>
-      <w:proofErr w:type="spellEnd"/>
-      <w:r>
-        <w:t>-service</w:t>
-      </w:r>
-    </w:p>
-    <w:p>
-      <w:pPr>
-        <w:rPr>
-          <w:b/>
-          <w:bCs/>
-        </w:rPr>
-      </w:pPr>
-      <w:r>
-        <w:t xml:space="preserve">Under the selector section, add the label of the pod. The pod label can be found </w:t>
-      </w:r>
-      <w:r>
-        <w:t>using:</w:t>
+        <w:t>k</w:t>
+      </w:r>
+      <w:r>
+        <w:t xml:space="preserve">ubectl </w:t>
+      </w:r>
+      <w:r>
+        <w:t xml:space="preserve">get pods </w:t>
+      </w:r>
+      <w:r>
+        <w:rPr>
+          <w:b/>
+          <w:bCs/>
+        </w:rPr>
+        <w:t>--show-labels</w:t>
+      </w:r>
+    </w:p>
+    <w:p>
+      <w:pPr>
+        <w:rPr>
+          <w:b/>
+          <w:bCs/>
+        </w:rPr>
+      </w:pPr>
+    </w:p>
+    <w:p>
+      <w:pPr>
+        <w:rPr>
+          <w:b/>
+          <w:bCs/>
+        </w:rPr>
+      </w:pPr>
+      <w:r>
+        <w:rPr>
+          <w:b/>
+          <w:bCs/>
+        </w:rPr>
+        <w:tab/>
+      </w:r>
+      <w:r>
+        <w:rPr>
+          <w:b/>
+          <w:bCs/>
+        </w:rPr>
+        <w:tab/>
+      </w:r>
+    </w:p>
+    <w:p>
+      <w:pPr>
+        <w:jc w:val="center"/>
+        <w:rPr>
+          <w:b/>
+          <w:bCs/>
+        </w:rPr>
+      </w:pPr>
+    </w:p>
+    <w:p>
+      <w:pPr>
+        <w:jc w:val="center"/>
+        <w:rPr>
+          <w:b/>
+          <w:bCs/>
+        </w:rPr>
+      </w:pPr>
+      <w:r>
+        <w:rPr>
+          <w:b/>
+          <w:bCs/>
+        </w:rPr>
+        <w:t>GENERAL KUBERNETES KNOWLEDGE</w:t>
+      </w:r>
+    </w:p>
+    <w:p>
+      <w:pPr>
+        <w:rPr>
+          <w:b/>
+          <w:bCs/>
+        </w:rPr>
+      </w:pPr>
+    </w:p>
+    <w:p>
+      <w:pPr>
+        <w:rPr>
+          <w:b/>
+          <w:bCs/>
+        </w:rPr>
+      </w:pPr>
+    </w:p>
+    <w:p>
+      <w:r>
+        <w:rPr>
+          <w:b/>
+          <w:bCs/>
+          <w:highlight w:val="cyan"/>
+        </w:rPr>
+        <w:t>IMPORTANT INFORMATION</w:t>
+      </w:r>
+      <w:r>
+        <w:t xml:space="preserve">:  </w:t>
+      </w:r>
+      <w:r>
+        <w:t xml:space="preserve">YAML uses </w:t>
+      </w:r>
+      <w:r>
+        <w:rPr>
+          <w:b/>
+          <w:bCs/>
+        </w:rPr>
+        <w:t>spaces</w:t>
+      </w:r>
+      <w:r>
+        <w:t xml:space="preserve"> for indentation; </w:t>
+      </w:r>
+      <w:r>
+        <w:rPr>
+          <w:b/>
+          <w:bCs/>
+        </w:rPr>
+        <w:t>tabs</w:t>
+      </w:r>
+      <w:r>
+        <w:t xml:space="preserve"> are invalid.</w:t>
+      </w:r>
+    </w:p>
+    <w:p/>
+    <w:p>
+      <w:r>
+        <w:rPr>
+          <w:b/>
+          <w:bCs/>
+          <w:highlight w:val="cyan"/>
+        </w:rPr>
+        <w:t>IMPORTANT INFORMATION</w:t>
+      </w:r>
+      <w:r>
+        <w:rPr>
+          <w:highlight w:val="cyan"/>
+        </w:rPr>
+        <w:t>:</w:t>
+      </w:r>
+      <w:r>
+        <w:t xml:space="preserve">  use </w:t>
+      </w:r>
+      <w:r>
+        <w:rPr>
+          <w:b/>
+          <w:bCs/>
+        </w:rPr>
+        <w:t>-h</w:t>
+      </w:r>
+      <w:r>
+        <w:t xml:space="preserve"> flag with commands to get example and explanations</w:t>
+      </w:r>
+      <w:r>
+        <w:t>.</w:t>
+      </w:r>
+    </w:p>
+    <w:p>
+      <w:r>
+        <w:t>k</w:t>
+      </w:r>
+      <w:r>
+        <w:t>ubectl run pods -h  #This will shows example usages and explanations.</w:t>
+      </w:r>
+    </w:p>
+    <w:p/>
+    <w:p>
+      <w:pPr>
+        <w:rPr>
+          <w:b/>
+          <w:bCs/>
+        </w:rPr>
+      </w:pPr>
+    </w:p>
+    <w:p>
+      <w:r>
+        <w:t>kubectl api-resources -o wide</w:t>
+      </w:r>
+      <w:r>
+        <w:t xml:space="preserve"> : shows all resources of Kubernetes. Helps to find the apiversion.  </w:t>
+      </w:r>
+    </w:p>
+    <w:p>
+      <w:r>
+        <w:t>When you run kubectl get all, the resources that should be included in the “</w:t>
+      </w:r>
+      <w:r>
+        <w:rPr>
+          <w:b/>
+          <w:bCs/>
+        </w:rPr>
+        <w:t>all</w:t>
+      </w:r>
+      <w:r>
+        <w:t>” can be seen in the output of “</w:t>
+      </w:r>
+      <w:r>
+        <w:t>kubectl api-resources -o wide</w:t>
+      </w:r>
+      <w:r>
+        <w:t xml:space="preserve">” command, under the </w:t>
+      </w:r>
+      <w:r>
+        <w:rPr>
+          <w:b/>
+          <w:bCs/>
+        </w:rPr>
+        <w:t>CATEGORIES</w:t>
       </w:r>
       <w:r>
         <w:t xml:space="preserve"> </w:t>
       </w:r>
-      <w:proofErr w:type="spellStart"/>
-      <w:r>
-        <w:t>k</w:t>
-      </w:r>
-      <w:r>
-        <w:t>ubectl</w:t>
-      </w:r>
-      <w:proofErr w:type="spellEnd"/>
-      <w:r>
-        <w:t xml:space="preserve"> </w:t>
-      </w:r>
-      <w:r>
-        <w:t xml:space="preserve">get pods </w:t>
-      </w:r>
-      <w:r>
-        <w:rPr>
-          <w:b/>
-          <w:bCs/>
-        </w:rPr>
-        <w:t>--show-labels</w:t>
-      </w:r>
-    </w:p>
-    <w:p>
-      <w:pPr>
-        <w:rPr>
-          <w:b/>
-          <w:bCs/>
-        </w:rPr>
-      </w:pPr>
-    </w:p>
-    <w:p>
-      <w:pPr>
-        <w:rPr>
-          <w:b/>
-          <w:bCs/>
-        </w:rPr>
-      </w:pPr>
-      <w:r>
-        <w:rPr>
-          <w:b/>
-          <w:bCs/>
-        </w:rPr>
-        <w:tab/>
-      </w:r>
-      <w:r>
-        <w:rPr>
-          <w:b/>
-          <w:bCs/>
-        </w:rPr>
-        <w:tab/>
-      </w:r>
-    </w:p>
-    <w:p>
-      <w:pPr>
-        <w:jc w:val="center"/>
-        <w:rPr>
-          <w:b/>
-          <w:bCs/>
-        </w:rPr>
-      </w:pPr>
-    </w:p>
-    <w:p>
-      <w:pPr>
-        <w:jc w:val="center"/>
-        <w:rPr>
-          <w:b/>
-          <w:bCs/>
-        </w:rPr>
-      </w:pPr>
-      <w:r>
-        <w:rPr>
-          <w:b/>
-          <w:bCs/>
-        </w:rPr>
-        <w:t>GENERAL KUBERNETES KNOWLEDGE</w:t>
-      </w:r>
-    </w:p>
-    <w:p>
-      <w:pPr>
-        <w:rPr>
-          <w:b/>
-          <w:bCs/>
-        </w:rPr>
-      </w:pPr>
-    </w:p>
-    <w:p>
-      <w:pPr>
-        <w:rPr>
-          <w:b/>
-          <w:bCs/>
-        </w:rPr>
-      </w:pPr>
-    </w:p>
-    <w:p>
-      <w:r>
-        <w:rPr>
-          <w:b/>
-          <w:bCs/>
-          <w:highlight w:val="cyan"/>
-        </w:rPr>
-        <w:t>IMPORTANT INFORMATION</w:t>
-      </w:r>
-      <w:r>
-        <w:t xml:space="preserve">:  </w:t>
-      </w:r>
-      <w:r>
-        <w:t xml:space="preserve">YAML uses </w:t>
-      </w:r>
-      <w:r>
-        <w:rPr>
-          <w:b/>
-          <w:bCs/>
-        </w:rPr>
-        <w:t>spaces</w:t>
-      </w:r>
-      <w:r>
-        <w:t xml:space="preserve"> for indentation; </w:t>
-      </w:r>
-      <w:r>
-        <w:rPr>
-          <w:b/>
-          <w:bCs/>
-        </w:rPr>
-        <w:t>tabs</w:t>
-      </w:r>
-      <w:r>
-        <w:t xml:space="preserve"> are invalid.</w:t>
-      </w:r>
-    </w:p>
-    <w:p/>
-    <w:p>
-      <w:r>
-        <w:rPr>
-          <w:b/>
-          <w:bCs/>
-          <w:highlight w:val="cyan"/>
-        </w:rPr>
-        <w:t>IMPORTANT INFORMATION</w:t>
-      </w:r>
-      <w:r>
-        <w:rPr>
-          <w:highlight w:val="cyan"/>
-        </w:rPr>
-        <w:t>:</w:t>
-      </w:r>
-      <w:r>
-        <w:t xml:space="preserve">  use </w:t>
-      </w:r>
-      <w:r>
-        <w:rPr>
-          <w:b/>
-          <w:bCs/>
-        </w:rPr>
-        <w:t>-h</w:t>
-      </w:r>
-      <w:r>
-        <w:t xml:space="preserve"> flag with commands to get example and explanations</w:t>
-      </w:r>
-      <w:r>
-        <w:t>.</w:t>
-      </w:r>
-    </w:p>
-    <w:p>
-      <w:proofErr w:type="spellStart"/>
-      <w:r>
-        <w:t>k</w:t>
-      </w:r>
-      <w:r>
-        <w:t>ubectl</w:t>
-      </w:r>
-      <w:proofErr w:type="spellEnd"/>
-      <w:r>
-        <w:t xml:space="preserve"> run pods -h  #This will shows example usages and explanations.</w:t>
-      </w:r>
-    </w:p>
-    <w:p/>
-    <w:p>
-      <w:pPr>
-        <w:rPr>
-          <w:b/>
-          <w:bCs/>
-        </w:rPr>
-      </w:pPr>
-    </w:p>
-    <w:p>
-      <w:proofErr w:type="spellStart"/>
-      <w:r>
-        <w:t>kubectl</w:t>
-      </w:r>
-      <w:proofErr w:type="spellEnd"/>
-      <w:r>
-        <w:t xml:space="preserve"> </w:t>
-      </w:r>
-      <w:proofErr w:type="spellStart"/>
-      <w:r>
-        <w:t>api</w:t>
-      </w:r>
-      <w:proofErr w:type="spellEnd"/>
-      <w:r>
-        <w:t>-resources -o wide</w:t>
-      </w:r>
-      <w:r>
-        <w:t xml:space="preserve"> : shows all resources of Kubernetes. Helps to find the </w:t>
-      </w:r>
-      <w:proofErr w:type="spellStart"/>
-      <w:r>
-        <w:t>apiversion</w:t>
-      </w:r>
-      <w:proofErr w:type="spellEnd"/>
-      <w:r>
-        <w:t xml:space="preserve">.  </w:t>
-      </w:r>
-    </w:p>
-    <w:p>
-      <w:r>
-        <w:t xml:space="preserve">When you run </w:t>
-      </w:r>
-      <w:proofErr w:type="spellStart"/>
-      <w:r>
-        <w:t>kubectl</w:t>
-      </w:r>
-      <w:proofErr w:type="spellEnd"/>
-      <w:r>
-        <w:t xml:space="preserve"> get all, the resources that should be included in the “</w:t>
-      </w:r>
-      <w:r>
-        <w:rPr>
-          <w:b/>
-          <w:bCs/>
-        </w:rPr>
-        <w:t>all</w:t>
-      </w:r>
-      <w:r>
-        <w:t>” can be seen in the output of “</w:t>
-      </w:r>
-      <w:proofErr w:type="spellStart"/>
-      <w:r>
-        <w:t>kubectl</w:t>
-      </w:r>
-      <w:proofErr w:type="spellEnd"/>
-      <w:r>
-        <w:t xml:space="preserve"> </w:t>
-      </w:r>
-      <w:proofErr w:type="spellStart"/>
-      <w:r>
-        <w:t>api</w:t>
-      </w:r>
-      <w:proofErr w:type="spellEnd"/>
-      <w:r>
-        <w:t>-resources -o wide</w:t>
-      </w:r>
-      <w:r>
-        <w:t xml:space="preserve">” command, under the </w:t>
-      </w:r>
-      <w:r>
-        <w:rPr>
-          <w:b/>
-          <w:bCs/>
-        </w:rPr>
-        <w:t>CATEGORIES</w:t>
-      </w:r>
-      <w:r>
-        <w:t xml:space="preserve"> </w:t>
-      </w:r>
       <w:r>
         <w:t>columns</w:t>
       </w:r>
@@ -987,15 +770,7 @@
     <w:p/>
     <w:p>
       <w:r>
-        <w:t xml:space="preserve">The cluster-info CA certificate in </w:t>
-      </w:r>
-      <w:proofErr w:type="spellStart"/>
-      <w:r>
-        <w:t>kube</w:t>
-      </w:r>
-      <w:proofErr w:type="spellEnd"/>
-      <w:r>
-        <w:t>-public acts just like the trusted root certificates in your web browser, allowing new clients to safely verify the identity of the Kubernetes API server during a secure TLS connection.</w:t>
+        <w:t>The cluster-info CA certificate in kube-public acts just like the trusted root certificates in your web browser, allowing new clients to safely verify the identity of the Kubernetes API server during a secure TLS connection.</w:t>
       </w:r>
     </w:p>
     <w:p/>
@@ -1032,13 +807,8 @@
       </w:pPr>
     </w:p>
     <w:p>
-      <w:proofErr w:type="spellStart"/>
-      <w:r>
-        <w:t>kubectl</w:t>
-      </w:r>
-      <w:proofErr w:type="spellEnd"/>
-      <w:r>
-        <w:t xml:space="preserve"> apply -f folder/ does not guarantee resource creation order.</w:t>
+      <w:r>
+        <w:t>kubectl apply -f folder/ does not guarantee resource creation order.</w:t>
       </w:r>
     </w:p>
     <w:p>
@@ -1070,53 +840,13 @@
     </w:p>
     <w:p>
       <w:r>
-        <w:t xml:space="preserve">When PID 1 exits, the container runtime records its exit code, and </w:t>
-      </w:r>
-      <w:proofErr w:type="spellStart"/>
-      <w:r>
-        <w:t>kubelet</w:t>
-      </w:r>
-      <w:proofErr w:type="spellEnd"/>
-      <w:r>
-        <w:t xml:space="preserve"> uses that result along with the </w:t>
-      </w:r>
-      <w:proofErr w:type="spellStart"/>
-      <w:r>
-        <w:t>restartPolicy</w:t>
-      </w:r>
-      <w:proofErr w:type="spellEnd"/>
-      <w:r>
-        <w:t xml:space="preserve"> to decide whether to restart the container.</w:t>
-      </w:r>
-    </w:p>
-    <w:p/>
-    <w:p>
-      <w:r>
-        <w:t xml:space="preserve">Kubernetes stores the last applied configuration in the same live object configuration in </w:t>
-      </w:r>
-      <w:proofErr w:type="spellStart"/>
-      <w:r>
-        <w:t>etcd</w:t>
-      </w:r>
-      <w:proofErr w:type="spellEnd"/>
-      <w:r>
-        <w:t xml:space="preserve">. It uses this and the actual </w:t>
-      </w:r>
-      <w:proofErr w:type="spellStart"/>
-      <w:r>
-        <w:t>yaml</w:t>
-      </w:r>
-      <w:proofErr w:type="spellEnd"/>
-      <w:r>
-        <w:t xml:space="preserve"> to decide how modifications need to be performed when using </w:t>
-      </w:r>
-      <w:proofErr w:type="spellStart"/>
-      <w:r>
-        <w:t>kubectl</w:t>
-      </w:r>
-      <w:proofErr w:type="spellEnd"/>
-      <w:r>
-        <w:t xml:space="preserve"> apply command</w:t>
+        <w:t>When PID 1 exits, the container runtime records its exit code, and kubelet uses that result along with the restartPolicy to decide whether to restart the container.</w:t>
+      </w:r>
+    </w:p>
+    <w:p/>
+    <w:p>
+      <w:r>
+        <w:t>Kubernetes stores the last applied configuration in the same live object configuration in etcd. It uses this and the actual yaml to decide how modifications need to be performed when using kubectl apply command</w:t>
       </w:r>
       <w:r>
         <w:t>s</w:t>
@@ -1167,15 +897,7 @@
     <w:p/>
     <w:p>
       <w:r>
-        <w:t xml:space="preserve">You can manually schedule a pod using the </w:t>
-      </w:r>
-      <w:proofErr w:type="spellStart"/>
-      <w:r>
-        <w:t>nodeName</w:t>
-      </w:r>
-      <w:proofErr w:type="spellEnd"/>
-      <w:r>
-        <w:t xml:space="preserve"> property. It can be used</w:t>
+        <w:t>You can manually schedule a pod using the nodeName property. It can be used</w:t>
       </w:r>
       <w:r>
         <w:t xml:space="preserve"> in situations where s</w:t>
@@ -1186,32 +908,15 @@
     </w:p>
     <w:p/>
     <w:p>
-      <w:proofErr w:type="spellStart"/>
-      <w:r>
-        <w:rPr>
-          <w:b/>
-          <w:bCs/>
-        </w:rPr>
-        <w:t>PriorityClass</w:t>
-      </w:r>
-      <w:proofErr w:type="spellEnd"/>
-      <w:r>
-        <w:rPr>
-          <w:b/>
-          <w:bCs/>
-        </w:rPr>
-        <w:t>:</w:t>
-      </w:r>
-      <w:r>
-        <w:t xml:space="preserve"> A Kubernetes object that defines the priority of Pods. Higher-priority Pods are scheduled before lower-priority Pods and can </w:t>
-      </w:r>
-      <w:proofErr w:type="spellStart"/>
-      <w:r>
-        <w:t>preempt</w:t>
-      </w:r>
-      <w:proofErr w:type="spellEnd"/>
-      <w:r>
-        <w:t xml:space="preserve"> (evict) lower-priority Pods when resources are insufficient.</w:t>
+      <w:r>
+        <w:rPr>
+          <w:b/>
+          <w:bCs/>
+        </w:rPr>
+        <w:t>PriorityClass:</w:t>
+      </w:r>
+      <w:r>
+        <w:t xml:space="preserve"> A Kubernetes object that defines the priority of Pods. Higher-priority Pods are scheduled before lower-priority Pods and can preempt (evict) lower-priority Pods when resources are insufficient.</w:t>
       </w:r>
     </w:p>
     <w:p>
@@ -1236,15 +941,7 @@
         <w:t>-</w:t>
       </w:r>
       <w:r>
-        <w:t xml:space="preserve"> Pod has higher priority → scheduled first and can </w:t>
-      </w:r>
-      <w:proofErr w:type="spellStart"/>
-      <w:r>
-        <w:t>preempt</w:t>
-      </w:r>
-      <w:proofErr w:type="spellEnd"/>
-      <w:r>
-        <w:t xml:space="preserve"> lower-priority Pods. </w:t>
+        <w:t xml:space="preserve"> Pod has higher priority → scheduled first and can preempt lower-priority Pods. </w:t>
       </w:r>
     </w:p>
     <w:p>
@@ -1269,15 +966,7 @@
         <w:t>-</w:t>
       </w:r>
       <w:r>
-        <w:t xml:space="preserve"> Pod has lower priority → scheduled later and can be </w:t>
-      </w:r>
-      <w:proofErr w:type="spellStart"/>
-      <w:r>
-        <w:t>preempted</w:t>
-      </w:r>
-      <w:proofErr w:type="spellEnd"/>
-      <w:r>
-        <w:t xml:space="preserve"> by higher-priority Pods.</w:t>
+        <w:t xml:space="preserve"> Pod has lower priority → scheduled later and can be preempted by higher-priority Pods.</w:t>
       </w:r>
     </w:p>
     <w:p>
@@ -1307,45 +996,24 @@
           <w:numId w:val="4"/>
         </w:numPr>
       </w:pPr>
-      <w:proofErr w:type="spellStart"/>
-      <w:r>
-        <w:t>preemptionPolicy</w:t>
-      </w:r>
-      <w:proofErr w:type="spellEnd"/>
-      <w:r>
-        <w:t xml:space="preserve">: </w:t>
-      </w:r>
-      <w:proofErr w:type="spellStart"/>
-      <w:r>
-        <w:t>PreemptLowerPriority</w:t>
-      </w:r>
-      <w:proofErr w:type="spellEnd"/>
+      <w:r>
+        <w:t>preemptionPolicy: PreemptLowerPriority</w:t>
+      </w:r>
       <w:r>
         <w:t xml:space="preserve">  or </w:t>
       </w:r>
-      <w:proofErr w:type="spellStart"/>
-      <w:r>
-        <w:t>preemptionPolicy</w:t>
-      </w:r>
-      <w:proofErr w:type="spellEnd"/>
-      <w:r>
-        <w:t>: Never</w:t>
+      <w:r>
+        <w:t>preemptionPolicy: Never</w:t>
       </w:r>
       <w:r>
         <w:t>s</w:t>
       </w:r>
     </w:p>
     <w:p>
-      <w:proofErr w:type="spellStart"/>
       <w:r>
         <w:lastRenderedPageBreak/>
-        <w:t>kubectl</w:t>
-      </w:r>
-      <w:proofErr w:type="spellEnd"/>
-      <w:r>
-        <w:t xml:space="preserve"> logs commands only displays the applications </w:t>
-      </w:r>
-      <w:proofErr w:type="spellStart"/>
+        <w:t xml:space="preserve">kubectl logs commands only displays the applications </w:t>
+      </w:r>
       <w:r>
         <w:rPr>
           <w:b/>
@@ -1353,7 +1021,6 @@
         </w:rPr>
         <w:t>stdout</w:t>
       </w:r>
-      <w:proofErr w:type="spellEnd"/>
       <w:r>
         <w:t xml:space="preserve"> and </w:t>
       </w:r>
@@ -1378,646 +1045,441 @@
         <w:t>logs.</w:t>
       </w:r>
       <w:r>
+        <w:t xml:space="preserve"> etc those stored in /var/</w:t>
+      </w:r>
+      <w:r>
+        <w:t>…</w:t>
+      </w:r>
+    </w:p>
+    <w:p/>
+    <w:p>
+      <w:r>
+        <w:rPr>
+          <w:b/>
+          <w:bCs/>
+        </w:rPr>
+        <w:t>Custom-Scheduler:</w:t>
+      </w:r>
+    </w:p>
+    <w:p>
+      <w:r>
+        <w:t xml:space="preserve">After using a customer-scheduler, if you want to see the evidence that the pod used it, you can get the events of the po along with -o wide flag. Check the </w:t>
+      </w:r>
+      <w:r>
+        <w:rPr>
+          <w:b/>
+          <w:bCs/>
+        </w:rPr>
+        <w:t>SOURCE</w:t>
+      </w:r>
+      <w:r>
+        <w:t xml:space="preserve"> field.</w:t>
+      </w:r>
+    </w:p>
+    <w:p>
+      <w:r>
+        <w:t>Eg: “</w:t>
+      </w:r>
+      <w:r>
+        <w:t xml:space="preserve"> my-scheduler, my-scheduler-my-scheduler   Successfully assigned default/nginx to controlplan</w:t>
+      </w:r>
+      <w:r>
+        <w:t>”</w:t>
+      </w:r>
+    </w:p>
+    <w:p/>
+    <w:p>
+      <w:pPr>
+        <w:rPr>
+          <w:b/>
+          <w:bCs/>
+        </w:rPr>
+      </w:pPr>
+      <w:r>
+        <w:rPr>
+          <w:b/>
+          <w:bCs/>
+        </w:rPr>
+        <w:t>Kubernetes scheduling Stages</w:t>
+      </w:r>
+    </w:p>
+    <w:p>
+      <w:r>
+        <w:t xml:space="preserve">Kubernetes scheduling involves the scheduler selecting a suitable node for a Pod. The main stages are </w:t>
+      </w:r>
+      <w:r>
+        <w:rPr>
+          <w:b/>
+          <w:bCs/>
+        </w:rPr>
+        <w:t>Queue → Filter → Score → Bind</w:t>
+      </w:r>
+      <w:r>
+        <w:t>. Queue selects a pending Pod, Filter eliminates nodes where the Pod cannot run, Score ranks the remaining nodes, and Bind assigns the Pod to the selected node. The scheduler records the selected node in the Pod object's spec.nodeName field. The kubelet on that node then starts the Pod.</w:t>
+      </w:r>
+    </w:p>
+    <w:p/>
+    <w:p>
+      <w:r>
+        <w:rPr>
+          <w:b/>
+          <w:bCs/>
+        </w:rPr>
+        <w:t>Scheduler profiles</w:t>
+      </w:r>
+    </w:p>
+    <w:p>
+      <w:r>
+        <w:rPr>
+          <w:b/>
+          <w:bCs/>
+        </w:rPr>
+        <w:t>Scheduler profiles</w:t>
+      </w:r>
+      <w:r>
+        <w:t xml:space="preserve"> are different configurations of the same kube-scheduler. Each profile can have its own </w:t>
+      </w:r>
+      <w:r>
+        <w:rPr>
+          <w:b/>
+          <w:bCs/>
+        </w:rPr>
+        <w:t>scheduler plugins</w:t>
+      </w:r>
+      <w:r>
+        <w:t xml:space="preserve"> enabled, disabled, or configured. A Pod selects a profile using spec.schedulerName. Plugins implement scheduling logic at stages such as </w:t>
+      </w:r>
+      <w:r>
+        <w:rPr>
+          <w:b/>
+          <w:bCs/>
+        </w:rPr>
+        <w:t>Filter</w:t>
+      </w:r>
+      <w:r>
+        <w:t xml:space="preserve"> and </w:t>
+      </w:r>
+      <w:r>
+        <w:rPr>
+          <w:b/>
+          <w:bCs/>
+        </w:rPr>
+        <w:t>Score</w:t>
+      </w:r>
+      <w:r>
+        <w:t>. This allows different Pods to use different scheduling behavior.</w:t>
+      </w:r>
+    </w:p>
+    <w:p/>
+    <w:p>
+      <w:r>
+        <w:rPr>
+          <w:b/>
+          <w:bCs/>
+        </w:rPr>
+        <w:t>Admission Controller</w:t>
+      </w:r>
+      <w:r>
+        <w:rPr>
+          <w:b/>
+          <w:bCs/>
+        </w:rPr>
+        <w:t>:</w:t>
+      </w:r>
+    </w:p>
+    <w:p>
+      <w:r>
+        <w:t xml:space="preserve">An </w:t>
+      </w:r>
+      <w:r>
+        <w:rPr>
+          <w:b/>
+          <w:bCs/>
+        </w:rPr>
+        <w:t>Admission Controller</w:t>
+      </w:r>
+      <w:r>
+        <w:t xml:space="preserve"> intercepts API requests after authentication and authorization but before the object is stored in etcd. It can </w:t>
+      </w:r>
+      <w:r>
+        <w:rPr>
+          <w:b/>
+          <w:bCs/>
+        </w:rPr>
+        <w:t>validate, modify, or reject</w:t>
+      </w:r>
+      <w:r>
+        <w:t xml:space="preserve"> requests. Admission controllers are used to enforce cluster-wide policies such as requiring security settings, labels, resource limits, or approved container images. </w:t>
+      </w:r>
+      <w:r>
+        <w:rPr>
+          <w:b/>
+          <w:bCs/>
+        </w:rPr>
+        <w:t>Real-world use case:</w:t>
+      </w:r>
+      <w:r>
+        <w:t xml:space="preserve"> a company can use an admission controller to reject Pods that use images from untrusted registries and allow only images from its approved private registry.</w:t>
+      </w:r>
+    </w:p>
+    <w:p>
+      <w:r>
+        <w:rPr>
+          <w:b/>
+          <w:bCs/>
+        </w:rPr>
+        <w:t>How Kubernetes determine to allow or deny:</w:t>
+      </w:r>
+      <w:r>
+        <w:rPr>
+          <w:b/>
+          <w:bCs/>
+        </w:rPr>
+        <w:t>s</w:t>
+      </w:r>
+    </w:p>
+    <w:p>
+      <w:r>
+        <w:lastRenderedPageBreak/>
+        <w:t>The ImagePolicyWebhook sends information about the requested container image to an external webhook. The webhook performs its own policy logic and then returns an ImageReview response. Kubernetes does not care how the webhook makes its decision; it expects the decision in the status.allowed field. status.allowed: true allows the image, while status.allowed: false rejects it.</w:t>
+      </w:r>
+    </w:p>
+    <w:p/>
+    <w:p>
+      <w:pPr>
+        <w:rPr>
+          <w:b/>
+          <w:bCs/>
+        </w:rPr>
+      </w:pPr>
+      <w:r>
+        <w:rPr>
+          <w:b/>
+          <w:bCs/>
+        </w:rPr>
+        <w:t>ENTRYPOINT can be written in two forms:</w:t>
+      </w:r>
+    </w:p>
+    <w:p>
+      <w:pPr>
+        <w:rPr>
+          <w:b/>
+          <w:bCs/>
+        </w:rPr>
+      </w:pPr>
+      <w:r>
+        <w:rPr>
+          <w:b/>
+          <w:bCs/>
+        </w:rPr>
+        <w:t>In Docker:</w:t>
+      </w:r>
+    </w:p>
+    <w:p>
+      <w:r>
+        <w:t>Exec form: ENTRYPOINT ["command"] — runs the command directly. CMD or arguments passed with docker run are appended as arguments. Recommended for applications.</w:t>
+      </w:r>
+    </w:p>
+    <w:p>
+      <w:r>
+        <w:t>Shell form: ENTRYPOINT command — runs through /bin/sh -c. CMD and runtime arguments are not passed to the entrypoint command in the normal way. Useful when shell features such as &amp;&amp;, pipes, or variable expansion are required.</w:t>
+      </w:r>
+    </w:p>
+    <w:p>
+      <w:r>
+        <w:t>Rule: Use exec form for normal applications; use shell form when shell behavior is specifically required.</w:t>
+      </w:r>
+    </w:p>
+    <w:p>
+      <w:r>
+        <w:rPr>
+          <w:b/>
+          <w:bCs/>
+        </w:rPr>
+        <w:t>ENTRYPOINT</w:t>
+      </w:r>
+      <w:r>
+        <w:t xml:space="preserve"> provides the main executable; </w:t>
+      </w:r>
+      <w:r>
+        <w:rPr>
+          <w:b/>
+          <w:bCs/>
+        </w:rPr>
+        <w:t>CMD</w:t>
+      </w:r>
+      <w:r>
+        <w:t xml:space="preserve"> provides default arguments to it, which can be overridden by arguments supplied to docker run.</w:t>
+      </w:r>
+    </w:p>
+    <w:p/>
+    <w:p>
+      <w:r>
+        <w:t xml:space="preserve">To over ride an entry point, use the  </w:t>
+      </w:r>
+      <w:r>
+        <w:rPr>
+          <w:b/>
+          <w:bCs/>
+        </w:rPr>
+        <w:t>“--entrypoint”</w:t>
+      </w:r>
+      <w:r>
+        <w:t xml:space="preserve"> flag.</w:t>
+      </w:r>
+    </w:p>
+    <w:p>
+      <w:r>
+        <w:t xml:space="preserve">eg: </w:t>
+      </w:r>
+      <w:r>
+        <w:t xml:space="preserve">docker run </w:t>
+      </w:r>
+      <w:r>
+        <w:rPr>
+          <w:b/>
+          <w:bCs/>
+        </w:rPr>
+        <w:t>--entrypoint</w:t>
+      </w:r>
+      <w:r>
+        <w:t xml:space="preserve"> ls image</w:t>
+      </w:r>
+      <w:r>
+        <w:t xml:space="preserve">  # This override the default entry point with ls</w:t>
+      </w:r>
+      <w:r>
+        <w:t>s</w:t>
+      </w:r>
+    </w:p>
+    <w:p/>
+    <w:p>
+      <w:pPr>
+        <w:rPr>
+          <w:b/>
+          <w:bCs/>
+        </w:rPr>
+      </w:pPr>
+      <w:r>
+        <w:rPr>
+          <w:b/>
+          <w:bCs/>
+        </w:rPr>
+        <w:t>In Kubernetes:</w:t>
+      </w:r>
+    </w:p>
+    <w:p>
+      <w:r>
+        <w:t xml:space="preserve">Docker’s </w:t>
+      </w:r>
+      <w:r>
+        <w:rPr>
+          <w:b/>
+          <w:bCs/>
+        </w:rPr>
+        <w:t xml:space="preserve">Entry point = </w:t>
+      </w:r>
+      <w:r>
+        <w:t>Kubernetes</w:t>
+      </w:r>
+      <w:r>
+        <w:rPr>
+          <w:b/>
+          <w:bCs/>
+        </w:rPr>
         <w:t xml:space="preserve"> </w:t>
       </w:r>
-      <w:proofErr w:type="spellStart"/>
-      <w:r>
-        <w:t>etc</w:t>
-      </w:r>
-      <w:proofErr w:type="spellEnd"/>
-      <w:r>
-        <w:t xml:space="preserve"> those stored in /var/</w:t>
-      </w:r>
-      <w:r>
-        <w:t>…</w:t>
-      </w:r>
-    </w:p>
-    <w:p/>
-    <w:p>
-      <w:r>
-        <w:rPr>
-          <w:b/>
-          <w:bCs/>
-        </w:rPr>
-        <w:t>Custom-Scheduler:</w:t>
-      </w:r>
-    </w:p>
-    <w:p>
-      <w:r>
-        <w:t xml:space="preserve">After using a customer-scheduler, if you want to see the evidence that the pod used it, you can get the events of the po along with -o wide flag. Check the </w:t>
-      </w:r>
-      <w:r>
-        <w:rPr>
-          <w:b/>
-          <w:bCs/>
-        </w:rPr>
-        <w:t>SOURCE</w:t>
-      </w:r>
-      <w:r>
-        <w:t xml:space="preserve"> field.</w:t>
-      </w:r>
-    </w:p>
-    <w:p>
-      <w:r>
-        <w:t>Eg: “</w:t>
-      </w:r>
-      <w:r>
-        <w:t xml:space="preserve"> my-scheduler, my-scheduler-my-scheduler   Successfully assigned default/nginx to </w:t>
-      </w:r>
-      <w:proofErr w:type="spellStart"/>
-      <w:r>
-        <w:t>controlplan</w:t>
-      </w:r>
-      <w:proofErr w:type="spellEnd"/>
-      <w:r>
-        <w:t>”</w:t>
-      </w:r>
-    </w:p>
-    <w:p/>
-    <w:p>
-      <w:pPr>
-        <w:rPr>
-          <w:b/>
-          <w:bCs/>
-        </w:rPr>
-      </w:pPr>
-      <w:r>
-        <w:rPr>
-          <w:b/>
-          <w:bCs/>
-        </w:rPr>
-        <w:t>Kubernetes scheduling Stages</w:t>
-      </w:r>
-    </w:p>
-    <w:p>
-      <w:r>
-        <w:t xml:space="preserve">Kubernetes scheduling involves the scheduler selecting a suitable node for a Pod. The main stages are </w:t>
-      </w:r>
-      <w:r>
-        <w:rPr>
-          <w:b/>
-          <w:bCs/>
-        </w:rPr>
-        <w:t>Queue → Filter → Score → Bind</w:t>
-      </w:r>
-      <w:r>
-        <w:t xml:space="preserve">. Queue selects a pending Pod, Filter eliminates nodes where the Pod cannot run, Score ranks the remaining nodes, and Bind assigns the Pod to the selected node. The scheduler records the selected node in the Pod object's </w:t>
-      </w:r>
-      <w:proofErr w:type="spellStart"/>
-      <w:r>
-        <w:t>spec.nodeName</w:t>
-      </w:r>
-      <w:proofErr w:type="spellEnd"/>
-      <w:r>
-        <w:t xml:space="preserve"> field. The </w:t>
-      </w:r>
-      <w:proofErr w:type="spellStart"/>
-      <w:r>
-        <w:t>kubelet</w:t>
-      </w:r>
-      <w:proofErr w:type="spellEnd"/>
-      <w:r>
-        <w:t xml:space="preserve"> on that node then starts the Pod.</w:t>
-      </w:r>
-    </w:p>
-    <w:p/>
-    <w:p>
-      <w:r>
-        <w:rPr>
-          <w:b/>
-          <w:bCs/>
-        </w:rPr>
-        <w:t>Scheduler profiles</w:t>
-      </w:r>
-    </w:p>
-    <w:p>
-      <w:r>
-        <w:rPr>
-          <w:b/>
-          <w:bCs/>
-        </w:rPr>
-        <w:t>Scheduler profiles</w:t>
-      </w:r>
-      <w:r>
-        <w:t xml:space="preserve"> are different configurations of the same </w:t>
-      </w:r>
-      <w:proofErr w:type="spellStart"/>
-      <w:r>
-        <w:t>kube</w:t>
-      </w:r>
-      <w:proofErr w:type="spellEnd"/>
-      <w:r>
-        <w:t xml:space="preserve">-scheduler. Each profile can have its own </w:t>
-      </w:r>
-      <w:r>
-        <w:rPr>
-          <w:b/>
-          <w:bCs/>
-        </w:rPr>
-        <w:t>scheduler plugins</w:t>
-      </w:r>
-      <w:r>
-        <w:t xml:space="preserve"> enabled, disabled, or configured. A Pod selects a profile using </w:t>
-      </w:r>
-      <w:proofErr w:type="spellStart"/>
-      <w:r>
-        <w:t>spec.schedulerName</w:t>
-      </w:r>
-      <w:proofErr w:type="spellEnd"/>
-      <w:r>
-        <w:t xml:space="preserve">. Plugins implement scheduling logic at stages such as </w:t>
-      </w:r>
-      <w:r>
-        <w:rPr>
-          <w:b/>
-          <w:bCs/>
-        </w:rPr>
-        <w:t>Filter</w:t>
-      </w:r>
-      <w:r>
-        <w:t xml:space="preserve"> and </w:t>
-      </w:r>
-      <w:r>
-        <w:rPr>
-          <w:b/>
-          <w:bCs/>
-        </w:rPr>
-        <w:t>Score</w:t>
-      </w:r>
-      <w:r>
-        <w:t>. This allows different Pods to use different scheduling behavior.</w:t>
-      </w:r>
-    </w:p>
-    <w:p/>
-    <w:p>
-      <w:r>
-        <w:rPr>
-          <w:b/>
-          <w:bCs/>
-        </w:rPr>
-        <w:t>Admission Controller</w:t>
-      </w:r>
-      <w:r>
-        <w:rPr>
-          <w:b/>
-          <w:bCs/>
-        </w:rPr>
-        <w:t>:</w:t>
-      </w:r>
-    </w:p>
-    <w:p>
-      <w:r>
-        <w:t xml:space="preserve">An </w:t>
-      </w:r>
-      <w:r>
-        <w:rPr>
-          <w:b/>
-          <w:bCs/>
-        </w:rPr>
-        <w:t>Admission Controller</w:t>
-      </w:r>
-      <w:r>
-        <w:t xml:space="preserve"> intercepts API requests after authentication and authorization but before the object is stored in </w:t>
-      </w:r>
-      <w:proofErr w:type="spellStart"/>
-      <w:r>
-        <w:t>etcd</w:t>
-      </w:r>
-      <w:proofErr w:type="spellEnd"/>
-      <w:r>
-        <w:t xml:space="preserve">. It can </w:t>
-      </w:r>
-      <w:r>
-        <w:rPr>
-          <w:b/>
-          <w:bCs/>
-        </w:rPr>
-        <w:t>validate, modify, or reject</w:t>
-      </w:r>
-      <w:r>
-        <w:t xml:space="preserve"> requests. Admission controllers are used to enforce cluster-wide policies such as requiring security settings, labels, resource limits, or approved container images. </w:t>
-      </w:r>
-      <w:r>
-        <w:rPr>
-          <w:b/>
-          <w:bCs/>
-        </w:rPr>
-        <w:t>Real-world use case:</w:t>
-      </w:r>
-      <w:r>
-        <w:t xml:space="preserve"> a company can use an admission controller to reject Pods that use images from untrusted registries and allow only images from its approved private registry.</w:t>
-      </w:r>
-    </w:p>
-    <w:p>
-      <w:r>
-        <w:rPr>
-          <w:b/>
-          <w:bCs/>
-        </w:rPr>
-        <w:t xml:space="preserve">How Kubernetes determine to allow or </w:t>
-      </w:r>
-      <w:proofErr w:type="spellStart"/>
-      <w:r>
-        <w:rPr>
-          <w:b/>
-          <w:bCs/>
-        </w:rPr>
-        <w:t>deny:</w:t>
-      </w:r>
-      <w:r>
-        <w:rPr>
-          <w:b/>
-          <w:bCs/>
-        </w:rPr>
-        <w:t>s</w:t>
-      </w:r>
-      <w:proofErr w:type="spellEnd"/>
-    </w:p>
-    <w:p>
-      <w:r>
+      <w:r>
+        <w:rPr>
+          <w:b/>
+          <w:bCs/>
+        </w:rPr>
+        <w:t>command</w:t>
+      </w:r>
+      <w:r>
+        <w:t xml:space="preserve">   #This is the base command that run during container start up</w:t>
+      </w:r>
+    </w:p>
+    <w:p>
+      <w:r>
+        <w:t xml:space="preserve">Docker’s </w:t>
+      </w:r>
+      <w:r>
+        <w:rPr>
+          <w:b/>
+          <w:bCs/>
+        </w:rPr>
+        <w:t xml:space="preserve">command = </w:t>
+      </w:r>
+      <w:r>
+        <w:t>Kubernetes</w:t>
+      </w:r>
+      <w:r>
+        <w:rPr>
+          <w:b/>
+          <w:bCs/>
+        </w:rPr>
+        <w:t xml:space="preserve"> </w:t>
+      </w:r>
+      <w:r>
+        <w:rPr>
+          <w:b/>
+          <w:bCs/>
+        </w:rPr>
+        <w:t>args</w:t>
+      </w:r>
+      <w:r>
+        <w:t xml:space="preserve">  # This is the argument passed to the entry point. This will be appended as an argument to entry point</w:t>
+      </w:r>
+    </w:p>
+    <w:p/>
+    <w:p/>
+    <w:p/>
+    <w:p>
+      <w:pPr>
+        <w:rPr>
+          <w:b/>
+          <w:bCs/>
+        </w:rPr>
+      </w:pPr>
+      <w:r>
+        <w:rPr>
+          <w:b/>
+          <w:bCs/>
+        </w:rPr>
         <w:lastRenderedPageBreak/>
-        <w:t xml:space="preserve">The </w:t>
-      </w:r>
-      <w:proofErr w:type="spellStart"/>
-      <w:r>
-        <w:t>ImagePolicyWebhook</w:t>
-      </w:r>
-      <w:proofErr w:type="spellEnd"/>
-      <w:r>
-        <w:t xml:space="preserve"> sends information about the requested container image to an external webhook. The webhook performs its own policy logic and then returns an </w:t>
-      </w:r>
-      <w:proofErr w:type="spellStart"/>
-      <w:r>
-        <w:t>ImageReview</w:t>
-      </w:r>
-      <w:proofErr w:type="spellEnd"/>
-      <w:r>
-        <w:t xml:space="preserve"> response. Kubernetes does not care how the webhook makes its decision; it expects the decision in the </w:t>
-      </w:r>
-      <w:proofErr w:type="spellStart"/>
-      <w:r>
-        <w:t>status.allowed</w:t>
-      </w:r>
-      <w:proofErr w:type="spellEnd"/>
-      <w:r>
-        <w:t xml:space="preserve"> field. </w:t>
-      </w:r>
-      <w:proofErr w:type="spellStart"/>
-      <w:r>
-        <w:t>status.allowed</w:t>
-      </w:r>
-      <w:proofErr w:type="spellEnd"/>
-      <w:r>
-        <w:t xml:space="preserve">: true allows the image, while </w:t>
-      </w:r>
-      <w:proofErr w:type="spellStart"/>
-      <w:r>
-        <w:t>status.allowed</w:t>
-      </w:r>
-      <w:proofErr w:type="spellEnd"/>
-      <w:r>
-        <w:t>: false rejects it.</w:t>
-      </w:r>
-    </w:p>
-    <w:p/>
-    <w:p>
-      <w:pPr>
-        <w:rPr>
-          <w:b/>
-          <w:bCs/>
-        </w:rPr>
-      </w:pPr>
-      <w:r>
-        <w:rPr>
-          <w:b/>
-          <w:bCs/>
-        </w:rPr>
-        <w:t>ENTRYPOINT can be written in two forms:</w:t>
-      </w:r>
-    </w:p>
-    <w:p>
-      <w:pPr>
-        <w:rPr>
-          <w:b/>
-          <w:bCs/>
-        </w:rPr>
-      </w:pPr>
-      <w:r>
-        <w:rPr>
-          <w:b/>
-          <w:bCs/>
-        </w:rPr>
-        <w:t>In Docker:</w:t>
-      </w:r>
-    </w:p>
-    <w:p>
-      <w:r>
-        <w:t>Exec form: ENTRYPOINT ["command"] — runs the command directly. CMD or arguments passed with docker run are appended as arguments. Recommended for applications.</w:t>
-      </w:r>
-    </w:p>
-    <w:p>
-      <w:r>
-        <w:t>Shell form: ENTRYPOINT command — runs through /bin/</w:t>
-      </w:r>
-      <w:proofErr w:type="spellStart"/>
-      <w:r>
-        <w:t>sh</w:t>
-      </w:r>
-      <w:proofErr w:type="spellEnd"/>
-      <w:r>
-        <w:t xml:space="preserve"> -c. CMD and runtime arguments are not passed to the </w:t>
-      </w:r>
-      <w:proofErr w:type="spellStart"/>
-      <w:r>
-        <w:t>entrypoint</w:t>
-      </w:r>
-      <w:proofErr w:type="spellEnd"/>
-      <w:r>
-        <w:t xml:space="preserve"> command in the normal way. Useful when shell features such as &amp;&amp;, pipes, or variable expansion are required.</w:t>
-      </w:r>
-    </w:p>
-    <w:p>
-      <w:r>
-        <w:t>Rule: Use exec form for normal applications; use shell form when shell behavior is specifically required.</w:t>
-      </w:r>
-    </w:p>
-    <w:p>
-      <w:r>
-        <w:rPr>
-          <w:b/>
-          <w:bCs/>
-        </w:rPr>
-        <w:t>ENTRYPOINT</w:t>
-      </w:r>
-      <w:r>
-        <w:t xml:space="preserve"> provides the main executable; </w:t>
-      </w:r>
-      <w:r>
-        <w:rPr>
-          <w:b/>
-          <w:bCs/>
-        </w:rPr>
-        <w:t>CMD</w:t>
-      </w:r>
-      <w:r>
-        <w:t xml:space="preserve"> provides default arguments to it, which can be overridden by arguments supplied to docker run.</w:t>
-      </w:r>
-    </w:p>
-    <w:p/>
-    <w:p>
-      <w:r>
-        <w:t xml:space="preserve">To over ride an entry point, use the  </w:t>
-      </w:r>
-      <w:r>
-        <w:rPr>
-          <w:b/>
-          <w:bCs/>
-        </w:rPr>
-        <w:t>“--</w:t>
-      </w:r>
-      <w:proofErr w:type="spellStart"/>
-      <w:r>
-        <w:rPr>
-          <w:b/>
-          <w:bCs/>
-        </w:rPr>
-        <w:t>entrypoint</w:t>
-      </w:r>
-      <w:proofErr w:type="spellEnd"/>
-      <w:r>
-        <w:rPr>
-          <w:b/>
-          <w:bCs/>
-        </w:rPr>
-        <w:t>”</w:t>
-      </w:r>
-      <w:r>
-        <w:t xml:space="preserve"> flag.</w:t>
-      </w:r>
-    </w:p>
-    <w:p>
-      <w:proofErr w:type="spellStart"/>
-      <w:r>
-        <w:t>eg</w:t>
-      </w:r>
-      <w:proofErr w:type="spellEnd"/>
-      <w:r>
-        <w:t xml:space="preserve">: </w:t>
-      </w:r>
-      <w:r>
-        <w:t xml:space="preserve">docker run </w:t>
-      </w:r>
-      <w:r>
-        <w:rPr>
-          <w:b/>
-          <w:bCs/>
-        </w:rPr>
-        <w:t>--</w:t>
-      </w:r>
-      <w:proofErr w:type="spellStart"/>
-      <w:r>
-        <w:rPr>
-          <w:b/>
-          <w:bCs/>
-        </w:rPr>
-        <w:t>entrypoint</w:t>
-      </w:r>
-      <w:proofErr w:type="spellEnd"/>
-      <w:r>
-        <w:t xml:space="preserve"> ls image</w:t>
-      </w:r>
-      <w:r>
-        <w:t xml:space="preserve">  # This override the default entry point with </w:t>
-      </w:r>
-      <w:proofErr w:type="spellStart"/>
-      <w:r>
-        <w:t>ls</w:t>
-      </w:r>
-      <w:r>
-        <w:t>s</w:t>
-      </w:r>
-      <w:proofErr w:type="spellEnd"/>
-    </w:p>
-    <w:p/>
-    <w:p>
-      <w:pPr>
-        <w:rPr>
-          <w:b/>
-          <w:bCs/>
-        </w:rPr>
-      </w:pPr>
-      <w:r>
-        <w:rPr>
-          <w:b/>
-          <w:bCs/>
-        </w:rPr>
-        <w:t>In Kubernetes:</w:t>
-      </w:r>
-    </w:p>
-    <w:p>
-      <w:r>
-        <w:t xml:space="preserve">Docker’s </w:t>
-      </w:r>
-      <w:r>
-        <w:rPr>
-          <w:b/>
-          <w:bCs/>
-        </w:rPr>
-        <w:t xml:space="preserve">Entry point = </w:t>
-      </w:r>
-      <w:r>
-        <w:t>Kubernetes</w:t>
-      </w:r>
-      <w:r>
-        <w:rPr>
-          <w:b/>
-          <w:bCs/>
-        </w:rPr>
+        <w:t>Difference between kubectl create vs kubectl apply</w:t>
+      </w:r>
+    </w:p>
+    <w:p>
+      <w:r>
+        <w:rPr>
+          <w:b/>
+          <w:bCs/>
+        </w:rPr>
+        <w:t>kubectl create</w:t>
+      </w:r>
+      <w:r>
         <w:t xml:space="preserve"> </w:t>
       </w:r>
       <w:r>
-        <w:rPr>
-          <w:b/>
-          <w:bCs/>
-        </w:rPr>
-        <w:t>command</w:t>
-      </w:r>
-      <w:r>
-        <w:t xml:space="preserve">   #This is the base command that run during container start up</w:t>
-      </w:r>
-    </w:p>
-    <w:p>
-      <w:r>
-        <w:t xml:space="preserve">Docker’s </w:t>
-      </w:r>
-      <w:r>
-        <w:rPr>
-          <w:b/>
-          <w:bCs/>
-        </w:rPr>
-        <w:t xml:space="preserve">command = </w:t>
-      </w:r>
-      <w:r>
-        <w:t>Kubernetes</w:t>
-      </w:r>
-      <w:r>
-        <w:rPr>
-          <w:b/>
-          <w:bCs/>
-        </w:rPr>
+        <w:t>-</w:t>
+      </w:r>
+      <w:r>
+        <w:t xml:space="preserve"> Creates the resource; errors if it already exists. </w:t>
+      </w:r>
+    </w:p>
+    <w:p>
+      <w:r>
+        <w:rPr>
+          <w:b/>
+          <w:bCs/>
+        </w:rPr>
+        <w:t>kubectl apply</w:t>
+      </w:r>
+      <w:r>
         <w:t xml:space="preserve"> </w:t>
       </w:r>
-      <w:proofErr w:type="spellStart"/>
-      <w:r>
-        <w:rPr>
-          <w:b/>
-          <w:bCs/>
-        </w:rPr>
-        <w:t>args</w:t>
-      </w:r>
-      <w:proofErr w:type="spellEnd"/>
-      <w:r>
-        <w:t xml:space="preserve">  # This is the argument passed to the entry point. This will be appended as an argument to entry point</w:t>
-      </w:r>
-    </w:p>
-    <w:p/>
-    <w:p/>
-    <w:p/>
-    <w:p>
-      <w:pPr>
-        <w:rPr>
-          <w:b/>
-          <w:bCs/>
-        </w:rPr>
-      </w:pPr>
-      <w:r>
-        <w:rPr>
-          <w:b/>
-          <w:bCs/>
-        </w:rPr>
-        <w:lastRenderedPageBreak/>
-        <w:t xml:space="preserve">Difference between </w:t>
-      </w:r>
-      <w:proofErr w:type="spellStart"/>
-      <w:r>
-        <w:rPr>
-          <w:b/>
-          <w:bCs/>
-        </w:rPr>
-        <w:t>kubectl</w:t>
-      </w:r>
-      <w:proofErr w:type="spellEnd"/>
-      <w:r>
-        <w:rPr>
-          <w:b/>
-          <w:bCs/>
-        </w:rPr>
-        <w:t xml:space="preserve"> create vs </w:t>
-      </w:r>
-      <w:proofErr w:type="spellStart"/>
-      <w:r>
-        <w:rPr>
-          <w:b/>
-          <w:bCs/>
-        </w:rPr>
-        <w:t>kubectl</w:t>
-      </w:r>
-      <w:proofErr w:type="spellEnd"/>
-      <w:r>
-        <w:rPr>
-          <w:b/>
-          <w:bCs/>
-        </w:rPr>
-        <w:t xml:space="preserve"> apply</w:t>
-      </w:r>
-    </w:p>
-    <w:p>
-      <w:proofErr w:type="spellStart"/>
-      <w:r>
-        <w:rPr>
-          <w:b/>
-          <w:bCs/>
-        </w:rPr>
-        <w:t>kubectl</w:t>
-      </w:r>
-      <w:proofErr w:type="spellEnd"/>
-      <w:r>
-        <w:rPr>
-          <w:b/>
-          <w:bCs/>
-        </w:rPr>
-        <w:t xml:space="preserve"> create</w:t>
-      </w:r>
-      <w:r>
-        <w:t xml:space="preserve"> </w:t>
-      </w:r>
-      <w:r>
-        <w:t>-</w:t>
-      </w:r>
-      <w:r>
-        <w:t xml:space="preserve"> Creates the resource; errors if it already exists. </w:t>
-      </w:r>
-    </w:p>
-    <w:p>
-      <w:proofErr w:type="spellStart"/>
-      <w:r>
-        <w:rPr>
-          <w:b/>
-          <w:bCs/>
-        </w:rPr>
-        <w:t>kubectl</w:t>
-      </w:r>
-      <w:proofErr w:type="spellEnd"/>
-      <w:r>
-        <w:rPr>
-          <w:b/>
-          <w:bCs/>
-        </w:rPr>
-        <w:t xml:space="preserve"> apply</w:t>
-      </w:r>
-      <w:r>
-        <w:t xml:space="preserve"> </w:t>
-      </w:r>
       <w:r>
         <w:t xml:space="preserve">- </w:t>
       </w:r>
@@ -2048,54 +1510,20 @@
     </w:p>
     <w:p>
       <w:r>
-        <w:t xml:space="preserve">It gets metrics from </w:t>
-      </w:r>
-      <w:proofErr w:type="spellStart"/>
-      <w:r>
-        <w:t>kubelets</w:t>
-      </w:r>
-      <w:proofErr w:type="spellEnd"/>
-      <w:r>
-        <w:t xml:space="preserve">, which expose </w:t>
-      </w:r>
-      <w:proofErr w:type="spellStart"/>
-      <w:r>
+        <w:t>It gets metrics from kubelets, which expose cAdvisor derived container metrics.</w:t>
+      </w:r>
+    </w:p>
+    <w:p/>
+    <w:p>
+      <w:r>
+        <w:rPr>
+          <w:b/>
+          <w:bCs/>
+        </w:rPr>
         <w:t>cAdvisor</w:t>
       </w:r>
-      <w:proofErr w:type="spellEnd"/>
-      <w:r>
-        <w:t xml:space="preserve"> derived container metrics.</w:t>
-      </w:r>
-    </w:p>
-    <w:p/>
-    <w:p>
-      <w:proofErr w:type="spellStart"/>
-      <w:r>
-        <w:rPr>
-          <w:b/>
-          <w:bCs/>
-        </w:rPr>
-        <w:t>cAdvisor</w:t>
-      </w:r>
-      <w:proofErr w:type="spellEnd"/>
-      <w:r>
-        <w:t xml:space="preserve"> is part of </w:t>
-      </w:r>
-      <w:proofErr w:type="spellStart"/>
-      <w:r>
-        <w:t>kubelet</w:t>
-      </w:r>
-      <w:proofErr w:type="spellEnd"/>
-      <w:r>
-        <w:t xml:space="preserve"> and collects container resource metrics. Metrics Server collects metrics from </w:t>
-      </w:r>
-      <w:proofErr w:type="spellStart"/>
-      <w:r>
-        <w:t>kubelets</w:t>
-      </w:r>
-      <w:proofErr w:type="spellEnd"/>
-      <w:r>
-        <w:t xml:space="preserve"> and provides them through the Kubernetes Metrics API.</w:t>
+      <w:r>
+        <w:t xml:space="preserve"> is part of kubelet and collects container resource metrics. Metrics Server collects metrics from kubelets and provides them through the Kubernetes Metrics API.</w:t>
       </w:r>
     </w:p>
     <w:p>
@@ -2104,26 +1532,13 @@
       </w:r>
     </w:p>
     <w:p>
-      <w:proofErr w:type="spellStart"/>
-      <w:r>
-        <w:t>kubectl</w:t>
-      </w:r>
-      <w:proofErr w:type="spellEnd"/>
-      <w:r>
-        <w:t xml:space="preserve"> top pods</w:t>
-      </w:r>
-    </w:p>
-    <w:p>
-      <w:r>
-        <w:t xml:space="preserve"> </w:t>
-      </w:r>
-      <w:proofErr w:type="spellStart"/>
-      <w:r>
-        <w:t>kubectl</w:t>
-      </w:r>
-      <w:proofErr w:type="spellEnd"/>
-      <w:r>
-        <w:t xml:space="preserve"> top nodes</w:t>
+      <w:r>
+        <w:t>kubectl top pods</w:t>
+      </w:r>
+    </w:p>
+    <w:p>
+      <w:r>
+        <w:t xml:space="preserve"> kubectl top nodes</w:t>
       </w:r>
     </w:p>
     <w:p/>
@@ -2144,15 +1559,7 @@
     </w:p>
     <w:p>
       <w:r>
-        <w:t xml:space="preserve">Kubernetes does not use a single CA for all components. Most control plane components (API Server, </w:t>
-      </w:r>
-      <w:proofErr w:type="spellStart"/>
-      <w:r>
-        <w:t>kube</w:t>
-      </w:r>
-      <w:proofErr w:type="spellEnd"/>
-      <w:r>
-        <w:t xml:space="preserve">-proxy, scheduler, controller-manager, admin clients) use the </w:t>
+        <w:t xml:space="preserve">Kubernetes does not use a single CA for all components. Most control plane components (API Server, kube-proxy, scheduler, controller-manager, admin clients) use the </w:t>
       </w:r>
       <w:r>
         <w:rPr>
@@ -2255,71 +1662,38 @@
         <w:t>Sidecar Container:</w:t>
       </w:r>
       <w:r>
-        <w:t xml:space="preserve"> A </w:t>
-      </w:r>
-      <w:proofErr w:type="spellStart"/>
-      <w:r>
-        <w:t>restartable</w:t>
-      </w:r>
-      <w:proofErr w:type="spellEnd"/>
+        <w:t xml:space="preserve"> A restartable init container (restartPolicy: Always) that starts during Pod initialization and continues running alongside the main container.</w:t>
+      </w:r>
+    </w:p>
+    <w:p>
+      <w:r>
+        <w:t>Ongoing support</w:t>
+      </w:r>
+      <w:r>
+        <w:t xml:space="preserve">: </w:t>
+      </w:r>
+      <w:r>
+        <w:t>log collection, proxy, monitoring, or traffic handling.</w:t>
+      </w:r>
+    </w:p>
+    <w:p/>
+    <w:p/>
+    <w:p/>
+    <w:p/>
+    <w:p>
+      <w:r>
+        <w:t xml:space="preserve">This is the sidecar container. It is an </w:t>
+      </w:r>
+      <w:r>
+        <w:rPr>
+          <w:b/>
+          <w:bCs/>
+        </w:rPr>
+        <w:t>init container</w:t>
+      </w:r>
       <w:r>
         <w:t xml:space="preserve"> </w:t>
       </w:r>
-      <w:proofErr w:type="spellStart"/>
-      <w:r>
-        <w:t>init</w:t>
-      </w:r>
-      <w:proofErr w:type="spellEnd"/>
-      <w:r>
-        <w:t xml:space="preserve"> container (</w:t>
-      </w:r>
-      <w:proofErr w:type="spellStart"/>
-      <w:r>
-        <w:t>restartPolicy</w:t>
-      </w:r>
-      <w:proofErr w:type="spellEnd"/>
-      <w:r>
-        <w:t>: Always) that starts during Pod initialization and continues running alongside the main container.</w:t>
-      </w:r>
-    </w:p>
-    <w:p>
-      <w:r>
-        <w:t>Ongoing support</w:t>
-      </w:r>
-      <w:r>
-        <w:t xml:space="preserve">: </w:t>
-      </w:r>
-      <w:r>
-        <w:t>log collection, proxy, monitoring, or traffic handling.</w:t>
-      </w:r>
-    </w:p>
-    <w:p/>
-    <w:p/>
-    <w:p/>
-    <w:p/>
-    <w:p>
-      <w:r>
-        <w:t xml:space="preserve">This is the sidecar container. It is an </w:t>
-      </w:r>
-      <w:proofErr w:type="spellStart"/>
-      <w:r>
-        <w:rPr>
-          <w:b/>
-          <w:bCs/>
-        </w:rPr>
-        <w:t>init</w:t>
-      </w:r>
-      <w:proofErr w:type="spellEnd"/>
-      <w:r>
-        <w:rPr>
-          <w:b/>
-          <w:bCs/>
-        </w:rPr>
-        <w:t xml:space="preserve"> container</w:t>
-      </w:r>
-      <w:r>
-        <w:t xml:space="preserve"> </w:t>
-      </w:r>
       <w:r>
         <w:t>with</w:t>
       </w:r>
@@ -2328,17 +1702,8 @@
           <w:b/>
           <w:bCs/>
         </w:rPr>
-        <w:t xml:space="preserve"> </w:t>
-      </w:r>
-      <w:proofErr w:type="spellStart"/>
-      <w:r>
-        <w:rPr>
-          <w:b/>
-          <w:bCs/>
-        </w:rPr>
-        <w:t>restartPolicy</w:t>
-      </w:r>
-      <w:proofErr w:type="spellEnd"/>
+        <w:t xml:space="preserve"> restartPolicy</w:t>
+      </w:r>
       <w:r>
         <w:t xml:space="preserve"> set to </w:t>
       </w:r>
@@ -2394,43 +1759,18 @@
     </w:p>
     <w:p>
       <w:r>
-        <w:t xml:space="preserve">A sidecar is an </w:t>
-      </w:r>
-      <w:proofErr w:type="spellStart"/>
-      <w:r>
-        <w:t>init</w:t>
-      </w:r>
-      <w:proofErr w:type="spellEnd"/>
-      <w:r>
-        <w:t xml:space="preserve"> container with </w:t>
-      </w:r>
-      <w:proofErr w:type="spellStart"/>
-      <w:r>
-        <w:t>restartPolicy</w:t>
-      </w:r>
-      <w:proofErr w:type="spellEnd"/>
-      <w:r>
-        <w:t>: Always. It starts during Pod initialization and continues running alongside the main container, restarting if it exits.</w:t>
-      </w:r>
-    </w:p>
-    <w:p/>
-    <w:p>
-      <w:r>
-        <w:rPr>
-          <w:b/>
-          <w:bCs/>
-        </w:rPr>
-        <w:t xml:space="preserve">Vertical Pod </w:t>
-      </w:r>
-      <w:proofErr w:type="spellStart"/>
-      <w:r>
-        <w:rPr>
-          <w:b/>
-          <w:bCs/>
-        </w:rPr>
-        <w:t>Autoscaler</w:t>
-      </w:r>
-      <w:proofErr w:type="spellEnd"/>
+        <w:t>A sidecar is an init container with restartPolicy: Always. It starts during Pod initialization and continues running alongside the main container, restarting if it exits.</w:t>
+      </w:r>
+    </w:p>
+    <w:p/>
+    <w:p>
+      <w:r>
+        <w:rPr>
+          <w:b/>
+          <w:bCs/>
+        </w:rPr>
+        <w:t>Vertical Pod Autoscaler</w:t>
+      </w:r>
       <w:r>
         <w:t>: It is not an inbuilt resource. You have to deploy them separately.</w:t>
       </w:r>
@@ -2528,23 +1868,7 @@
           <w:b/>
           <w:bCs/>
         </w:rPr>
-        <w:t xml:space="preserve">Vertical Pod </w:t>
-      </w:r>
-      <w:proofErr w:type="spellStart"/>
-      <w:r>
-        <w:rPr>
-          <w:b/>
-          <w:bCs/>
-        </w:rPr>
-        <w:t>Autoscaler</w:t>
-      </w:r>
-      <w:proofErr w:type="spellEnd"/>
-      <w:r>
-        <w:rPr>
-          <w:b/>
-          <w:bCs/>
-        </w:rPr>
-        <w:t xml:space="preserve"> (VPA)</w:t>
+        <w:t>Vertical Pod Autoscaler (VPA)</w:t>
       </w:r>
       <w:r>
         <w:t xml:space="preserve"> automatically adjusts the CPU and memory requests/limits of Pods based on their actual usage. It is installed as a Kubernetes add-on and has three main components: the </w:t>
@@ -2577,24 +1901,14 @@
         <w:t>Admission Controller</w:t>
       </w:r>
       <w:r>
-        <w:t xml:space="preserve"> applies the recommended resources when replacement Pods are created. VPA is configured using a </w:t>
-      </w:r>
-      <w:proofErr w:type="spellStart"/>
-      <w:r>
-        <w:t>VerticalPodAutoscaler</w:t>
-      </w:r>
-      <w:proofErr w:type="spellEnd"/>
-      <w:r>
-        <w:t xml:space="preserve"> </w:t>
+        <w:t xml:space="preserve"> applies the recommended resources when replacement Pods are created. VPA is configured using a VerticalPodAutoscaler </w:t>
       </w:r>
       <w:r>
         <w:t xml:space="preserve">custom </w:t>
       </w:r>
-      <w:proofErr w:type="spellStart"/>
       <w:r>
         <w:t>resourcedefinition</w:t>
       </w:r>
-      <w:proofErr w:type="spellEnd"/>
       <w:r>
         <w:t xml:space="preserve"> </w:t>
       </w:r>
@@ -2725,61 +2039,455 @@
           <w:bCs/>
         </w:rPr>
       </w:pPr>
-      <w:proofErr w:type="spellStart"/>
-      <w:r>
-        <w:rPr>
-          <w:b/>
-          <w:bCs/>
-        </w:rPr>
-        <w:t>PodDisruptionBudget</w:t>
-      </w:r>
-      <w:proofErr w:type="spellEnd"/>
-      <w:r>
-        <w:rPr>
-          <w:b/>
-          <w:bCs/>
-        </w:rPr>
-        <w:t xml:space="preserve"> (PDB)</w:t>
-      </w:r>
-    </w:p>
-    <w:p/>
-    <w:p>
-      <w:r>
-        <w:t xml:space="preserve">A </w:t>
-      </w:r>
-      <w:proofErr w:type="spellStart"/>
-      <w:r>
-        <w:t>PodDisruptionBudget</w:t>
-      </w:r>
-      <w:proofErr w:type="spellEnd"/>
-      <w:r>
-        <w:t xml:space="preserve"> (PDB) protects application availability during voluntary disruptions such as node draining, maintenance, and upgrades. It defines the minimum number of Pods that must remain available, preventing Kubernetes from voluntarily evicting too many Pods at the same time. For example, if an application has 3 replicas and </w:t>
-      </w:r>
-      <w:proofErr w:type="spellStart"/>
-      <w:r>
-        <w:t>minAvailable</w:t>
-      </w:r>
-      <w:proofErr w:type="spellEnd"/>
-      <w:r>
-        <w:t>: 2, Kubernetes can evict one Pod, but it will not allow another voluntary eviction until the replacement Pod becomes available and the application returns to 3 available Pods.</w:t>
-      </w:r>
-    </w:p>
-    <w:p/>
-    <w:p>
-      <w:r>
-        <w:t xml:space="preserve">For example, with 3 replicas and </w:t>
-      </w:r>
-      <w:proofErr w:type="spellStart"/>
-      <w:r>
-        <w:t>minAvailable</w:t>
-      </w:r>
-      <w:proofErr w:type="spellEnd"/>
-      <w:r>
-        <w:t>: 2, Kubernetes allows one Pod to be evicted during a node drain while ensuring at least 2 Pods remain available; the Deployment creates a replacement Pod and once it becomes Ready, the next Pod can be evicted.</w:t>
-      </w:r>
-    </w:p>
-    <w:p/>
-    <w:p/>
+      <w:r>
+        <w:rPr>
+          <w:b/>
+          <w:bCs/>
+        </w:rPr>
+        <w:t>PodDisruptionBudget (PDB)</w:t>
+      </w:r>
+    </w:p>
+    <w:p/>
+    <w:p>
+      <w:r>
+        <w:t>A PodDisruptionBudget (PDB) protects application availability during voluntary disruptions such as node draining, maintenance, and upgrades. It defines the minimum number of Pods that must remain available, preventing Kubernetes from voluntarily evicting too many Pods at the same time. For example, if an application has 3 replicas and minAvailable: 2, Kubernetes can evict one Pod, but it will not allow another voluntary eviction until the replacement Pod becomes available and the application returns to 3 available Pods.</w:t>
+      </w:r>
+    </w:p>
+    <w:p/>
+    <w:p>
+      <w:r>
+        <w:t>For example, with 3 replicas and minAvailable: 2, Kubernetes allows one Pod to be evicted during a node drain while ensuring at least 2 Pods remain available; the Deployment creates a replacement Pod and once it becomes Ready, the next Pod can be evicted.</w:t>
+      </w:r>
+    </w:p>
+    <w:p/>
+    <w:p/>
+    <w:p>
+      <w:pPr>
+        <w:rPr>
+          <w:b/>
+          <w:bCs/>
+          <w:highlight w:val="cyan"/>
+        </w:rPr>
+      </w:pPr>
+    </w:p>
+    <w:p>
+      <w:pPr>
+        <w:rPr>
+          <w:b/>
+          <w:bCs/>
+          <w:highlight w:val="cyan"/>
+        </w:rPr>
+      </w:pPr>
+    </w:p>
+    <w:p>
+      <w:pPr>
+        <w:rPr>
+          <w:b/>
+          <w:bCs/>
+          <w:highlight w:val="cyan"/>
+        </w:rPr>
+      </w:pPr>
+    </w:p>
+    <w:p>
+      <w:pPr>
+        <w:rPr>
+          <w:b/>
+          <w:bCs/>
+          <w:highlight w:val="cyan"/>
+        </w:rPr>
+      </w:pPr>
+    </w:p>
+    <w:p>
+      <w:pPr>
+        <w:rPr>
+          <w:b/>
+          <w:bCs/>
+        </w:rPr>
+      </w:pPr>
+      <w:r>
+        <w:rPr>
+          <w:b/>
+          <w:bCs/>
+          <w:highlight w:val="cyan"/>
+        </w:rPr>
+        <w:lastRenderedPageBreak/>
+        <w:t>Exposing a pod with out any services:</w:t>
+      </w:r>
+    </w:p>
+    <w:p>
+      <w:pPr>
+        <w:rPr>
+          <w:b/>
+          <w:bCs/>
+        </w:rPr>
+      </w:pPr>
+    </w:p>
+    <w:p>
+      <w:r>
+        <w:t>With hostNetwork: true, a Pod shares the node's network namespace, so it uses the node's IP address directly. The application inside the Pod can therefore listen on the node's ports and receive traffic without a NodePort Service.</w:t>
+      </w:r>
+    </w:p>
+    <w:p>
+      <w:r>
+        <w:t>For example, if the node IP is 192.168.49.2 and nginx listens on port 80, you can access it directly using 192.168.49.2:80.</w:t>
+      </w:r>
+    </w:p>
+    <w:p>
+      <w:r>
+        <w:t>A normal Pod has its own Pod IP and network namespace, so external clients cannot normally access it through the node IP directly. NodePort provides a way to expose such normal Pods through a node IP and port without using hostNetwork.</w:t>
+      </w:r>
+    </w:p>
+    <w:p>
+      <w:r>
+        <w:rPr>
+          <w:noProof/>
+        </w:rPr>
+        <w:drawing>
+          <wp:inline distT="0" distB="0" distL="0" distR="0" wp14:anchorId="22D4B03C" wp14:editId="5479A2D8">
+            <wp:extent cx="4210638" cy="1686160"/>
+            <wp:effectExtent l="0" t="0" r="0" b="9525"/>
+            <wp:docPr id="1749942767" name="Picture 1"/>
+            <wp:cNvGraphicFramePr>
+              <a:graphicFrameLocks xmlns:a="http://schemas.openxmlformats.org/drawingml/2006/main" noChangeAspect="1"/>
+            </wp:cNvGraphicFramePr>
+            <a:graphic xmlns:a="http://schemas.openxmlformats.org/drawingml/2006/main">
+              <a:graphicData uri="http://schemas.openxmlformats.org/drawingml/2006/picture">
+                <pic:pic xmlns:pic="http://schemas.openxmlformats.org/drawingml/2006/picture">
+                  <pic:nvPicPr>
+                    <pic:cNvPr id="1749942767" name=""/>
+                    <pic:cNvPicPr/>
+                  </pic:nvPicPr>
+                  <pic:blipFill>
+                    <a:blip r:embed="rId13"/>
+                    <a:stretch>
+                      <a:fillRect/>
+                    </a:stretch>
+                  </pic:blipFill>
+                  <pic:spPr>
+                    <a:xfrm>
+                      <a:off x="0" y="0"/>
+                      <a:ext cx="4210638" cy="1686160"/>
+                    </a:xfrm>
+                    <a:prstGeom prst="rect">
+                      <a:avLst/>
+                    </a:prstGeom>
+                  </pic:spPr>
+                </pic:pic>
+              </a:graphicData>
+            </a:graphic>
+          </wp:inline>
+        </w:drawing>
+      </w:r>
+    </w:p>
+    <w:p>
+      <w:r>
+        <w:rPr>
+          <w:noProof/>
+        </w:rPr>
+        <w:drawing>
+          <wp:inline distT="0" distB="0" distL="0" distR="0" wp14:anchorId="2175538B" wp14:editId="21CDB136">
+            <wp:extent cx="5943600" cy="3197225"/>
+            <wp:effectExtent l="0" t="0" r="0" b="3175"/>
+            <wp:docPr id="424351067" name="Picture 1"/>
+            <wp:cNvGraphicFramePr>
+              <a:graphicFrameLocks xmlns:a="http://schemas.openxmlformats.org/drawingml/2006/main" noChangeAspect="1"/>
+            </wp:cNvGraphicFramePr>
+            <a:graphic xmlns:a="http://schemas.openxmlformats.org/drawingml/2006/main">
+              <a:graphicData uri="http://schemas.openxmlformats.org/drawingml/2006/picture">
+                <pic:pic xmlns:pic="http://schemas.openxmlformats.org/drawingml/2006/picture">
+                  <pic:nvPicPr>
+                    <pic:cNvPr id="424351067" name=""/>
+                    <pic:cNvPicPr/>
+                  </pic:nvPicPr>
+                  <pic:blipFill>
+                    <a:blip r:embed="rId14"/>
+                    <a:stretch>
+                      <a:fillRect/>
+                    </a:stretch>
+                  </pic:blipFill>
+                  <pic:spPr>
+                    <a:xfrm>
+                      <a:off x="0" y="0"/>
+                      <a:ext cx="5943600" cy="3197225"/>
+                    </a:xfrm>
+                    <a:prstGeom prst="rect">
+                      <a:avLst/>
+                    </a:prstGeom>
+                  </pic:spPr>
+                </pic:pic>
+              </a:graphicData>
+            </a:graphic>
+          </wp:inline>
+        </w:drawing>
+      </w:r>
+    </w:p>
+    <w:p/>
+    <w:p>
+      <w:pPr>
+        <w:rPr>
+          <w:b/>
+          <w:bCs/>
+        </w:rPr>
+      </w:pPr>
+      <w:r>
+        <w:rPr>
+          <w:b/>
+          <w:bCs/>
+          <w:highlight w:val="cyan"/>
+        </w:rPr>
+        <w:lastRenderedPageBreak/>
+        <w:t>Startup probe vs Readiness/Liveness Probes:</w:t>
+      </w:r>
+    </w:p>
+    <w:p>
+      <w:r>
+        <w:rPr>
+          <w:b/>
+          <w:bCs/>
+        </w:rPr>
+        <w:t>Startup probe</w:t>
+      </w:r>
+      <w:r>
+        <w:t xml:space="preserve"> checks whether the application has finished starting; </w:t>
+      </w:r>
+      <w:r>
+        <w:rPr>
+          <w:b/>
+          <w:bCs/>
+        </w:rPr>
+        <w:t>until it succeeds, Kubernetes does not run the liveness or readiness probes,</w:t>
+      </w:r>
+      <w:r>
+        <w:t xml:space="preserve"> and if it keeps failing, the container is restarted. </w:t>
+      </w:r>
+      <w:r>
+        <w:rPr>
+          <w:b/>
+          <w:bCs/>
+        </w:rPr>
+        <w:t>Readiness probe</w:t>
+      </w:r>
+      <w:r>
+        <w:t xml:space="preserve"> checks whether the already-started application is currently ready to receive traffic; if it fails, Kubernetes removes the Pod from the Service endpoints, but does </w:t>
+      </w:r>
+      <w:r>
+        <w:rPr>
+          <w:b/>
+          <w:bCs/>
+        </w:rPr>
+        <w:t>not</w:t>
+      </w:r>
+      <w:r>
+        <w:t xml:space="preserve"> restart the container.</w:t>
+      </w:r>
+    </w:p>
+    <w:p/>
+    <w:p>
+      <w:r>
+        <w:rPr>
+          <w:b/>
+          <w:bCs/>
+        </w:rPr>
+        <w:t>Use case:</w:t>
+      </w:r>
+      <w:r>
+        <w:t xml:space="preserve"> </w:t>
+      </w:r>
+      <w:r>
+        <w:t>Used for an application that takes a long time to start, so Kubernetes waits for the application to become ready before applying the liveness and readiness checks.</w:t>
+      </w:r>
+    </w:p>
+    <w:p/>
+    <w:p>
+      <w:pPr>
+        <w:rPr>
+          <w:b/>
+          <w:bCs/>
+        </w:rPr>
+      </w:pPr>
+      <w:r>
+        <w:rPr>
+          <w:b/>
+          <w:bCs/>
+          <w:highlight w:val="cyan"/>
+        </w:rPr>
+        <w:t>How to pull an image from a private registry</w:t>
+      </w:r>
+    </w:p>
+    <w:p>
+      <w:pPr>
+        <w:rPr>
+          <w:b/>
+          <w:bCs/>
+        </w:rPr>
+      </w:pPr>
+    </w:p>
+    <w:p>
+      <w:pPr>
+        <w:rPr>
+          <w:b/>
+          <w:bCs/>
+        </w:rPr>
+      </w:pPr>
+      <w:r>
+        <w:rPr>
+          <w:b/>
+          <w:bCs/>
+        </w:rPr>
+        <w:t>Step 1: Create a Secret</w:t>
+      </w:r>
+    </w:p>
+    <w:p>
+      <w:r>
+        <w:t xml:space="preserve">kubectl create secret docker-registry </w:t>
+      </w:r>
+      <w:r>
+        <w:rPr>
+          <w:b/>
+          <w:bCs/>
+        </w:rPr>
+        <w:t>regcred</w:t>
+      </w:r>
+      <w:r>
+        <w:t xml:space="preserve"> \</w:t>
+      </w:r>
+    </w:p>
+    <w:p>
+      <w:r>
+        <w:t xml:space="preserve">  --docker-server=registry.example.com \</w:t>
+      </w:r>
+    </w:p>
+    <w:p>
+      <w:r>
+        <w:t xml:space="preserve">  --docker-username=myuser \</w:t>
+      </w:r>
+    </w:p>
+    <w:p>
+      <w:r>
+        <w:t xml:space="preserve">  --docker-password=mypassword \</w:t>
+      </w:r>
+    </w:p>
+    <w:p>
+      <w:r>
+        <w:t xml:space="preserve">  </w:t>
+      </w:r>
+      <w:hyperlink r:id="rId15" w:history="1">
+        <w:r>
+          <w:rPr>
+            <w:rStyle w:val="Hyperlink"/>
+          </w:rPr>
+          <w:t>--docker-email=myuser@example.com</w:t>
+        </w:r>
+      </w:hyperlink>
+    </w:p>
+    <w:p/>
+    <w:p>
+      <w:pPr>
+        <w:rPr>
+          <w:b/>
+          <w:bCs/>
+        </w:rPr>
+      </w:pPr>
+      <w:r>
+        <w:rPr>
+          <w:b/>
+          <w:bCs/>
+        </w:rPr>
+        <w:t>Step 2: Use the Secret in a Pod</w:t>
+      </w:r>
+      <w:r>
+        <w:rPr>
+          <w:b/>
+          <w:bCs/>
+        </w:rPr>
+        <w:t xml:space="preserve">. </w:t>
+      </w:r>
+    </w:p>
+    <w:p>
+      <w:r>
+        <w:t>apiVersion: v1</w:t>
+      </w:r>
+    </w:p>
+    <w:p>
+      <w:r>
+        <w:t>kind: Pod</w:t>
+      </w:r>
+    </w:p>
+    <w:p>
+      <w:r>
+        <w:t>metadata:</w:t>
+      </w:r>
+    </w:p>
+    <w:p>
+      <w:r>
+        <w:t xml:space="preserve">  name: private-pod</w:t>
+      </w:r>
+    </w:p>
+    <w:p>
+      <w:r>
+        <w:t>spec:</w:t>
+      </w:r>
+    </w:p>
+    <w:p>
+      <w:r>
+        <w:t xml:space="preserve">  containers:</w:t>
+      </w:r>
+    </w:p>
+    <w:p>
+      <w:r>
+        <w:t xml:space="preserve">    - name: app</w:t>
+      </w:r>
+    </w:p>
+    <w:p>
+      <w:r>
+        <w:lastRenderedPageBreak/>
+        <w:t xml:space="preserve">      image: registry.example.com/myapp:v1</w:t>
+      </w:r>
+    </w:p>
+    <w:p>
+      <w:pPr>
+        <w:rPr>
+          <w:b/>
+          <w:bCs/>
+        </w:rPr>
+      </w:pPr>
+      <w:r>
+        <w:rPr>
+          <w:b/>
+          <w:bCs/>
+        </w:rPr>
+        <w:t xml:space="preserve">  imagePullSecrets:</w:t>
+      </w:r>
+      <w:r>
+        <w:rPr>
+          <w:b/>
+          <w:bCs/>
+        </w:rPr>
+        <w:t xml:space="preserve">   #This will allow to reference that secret</w:t>
+      </w:r>
+      <w:r>
+        <w:rPr>
+          <w:b/>
+          <w:bCs/>
+        </w:rPr>
+        <w:t>.</w:t>
+      </w:r>
+    </w:p>
+    <w:p>
+      <w:pPr>
+        <w:rPr>
+          <w:b/>
+          <w:bCs/>
+        </w:rPr>
+      </w:pPr>
+      <w:r>
+        <w:rPr>
+          <w:b/>
+          <w:bCs/>
+        </w:rPr>
+        <w:t xml:space="preserve">    - name: regcred</w:t>
+      </w:r>
+    </w:p>
     <w:p/>
     <w:p/>
     <w:p/>
@@ -2806,22 +2514,13 @@
     </w:p>
     <w:p>
       <w:r>
-        <w:lastRenderedPageBreak/>
         <w:t xml:space="preserve">By </w:t>
       </w:r>
       <w:r>
         <w:t>default,</w:t>
       </w:r>
       <w:r>
-        <w:t xml:space="preserve"> </w:t>
-      </w:r>
-      <w:proofErr w:type="spellStart"/>
-      <w:r>
-        <w:t>etcd</w:t>
-      </w:r>
-      <w:proofErr w:type="spellEnd"/>
-      <w:r>
-        <w:t xml:space="preserve"> </w:t>
+        <w:t xml:space="preserve"> etcd </w:t>
       </w:r>
       <w:r>
         <w:rPr>
@@ -2865,7 +2564,7 @@
                     <pic:cNvPicPr/>
                   </pic:nvPicPr>
                   <pic:blipFill>
-                    <a:blip r:embed="rId13"/>
+                    <a:blip r:embed="rId16"/>
                     <a:stretch>
                       <a:fillRect/>
                     </a:stretch>
@@ -2889,31 +2588,7 @@
     <w:p/>
     <w:p>
       <w:r>
-        <w:t>ETCD stores Kubernetes objects as raw bytes (</w:t>
-      </w:r>
-      <w:proofErr w:type="spellStart"/>
-      <w:r>
-        <w:t>protobuf</w:t>
-      </w:r>
-      <w:proofErr w:type="spellEnd"/>
-      <w:r>
-        <w:t xml:space="preserve"> format). In a </w:t>
-      </w:r>
-      <w:proofErr w:type="spellStart"/>
-      <w:r>
-        <w:t>hexdump</w:t>
-      </w:r>
-      <w:proofErr w:type="spellEnd"/>
-      <w:r>
-        <w:t xml:space="preserve">, the left side shows the actual hexadecimal byte values, while the right side shows their ASCII representation. Printable bytes appear as text, and non-printable </w:t>
-      </w:r>
-      <w:proofErr w:type="spellStart"/>
-      <w:r>
-        <w:t>protobuf</w:t>
-      </w:r>
-      <w:proofErr w:type="spellEnd"/>
-      <w:r>
-        <w:t xml:space="preserve"> metadata is displayed as dots (.).</w:t>
+        <w:t>ETCD stores Kubernetes objects as raw bytes (protobuf format). In a hexdump, the left side shows the actual hexadecimal byte values, while the right side shows their ASCII representation. Printable bytes appear as text, and non-printable protobuf metadata is displayed as dots (.).</w:t>
       </w:r>
     </w:p>
     <w:p>
@@ -2929,15 +2604,7 @@
         <w:t xml:space="preserve"> </w:t>
       </w:r>
       <w:r>
-        <w:t xml:space="preserve">Enabling Encryption at Rest does not automatically encrypt existing data in </w:t>
-      </w:r>
-      <w:proofErr w:type="spellStart"/>
-      <w:r>
-        <w:t>etcd</w:t>
-      </w:r>
-      <w:proofErr w:type="spellEnd"/>
-      <w:r>
-        <w:t>. Only newly created or updated resources are encrypted. Existing resources must be rewritten (updated/recreated) to be stored in encrypted form.</w:t>
+        <w:t>Enabling Encryption at Rest does not automatically encrypt existing data in etcd. Only newly created or updated resources are encrypted. Existing resources must be rewritten (updated/recreated) to be stored in encrypted form.</w:t>
       </w:r>
     </w:p>
     <w:p>
@@ -2966,7 +2633,7 @@
                     <pic:cNvPicPr/>
                   </pic:nvPicPr>
                   <pic:blipFill>
-                    <a:blip r:embed="rId14"/>
+                    <a:blip r:embed="rId17"/>
                     <a:stretch>
                       <a:fillRect/>
                     </a:stretch>
@@ -2989,49 +2656,18 @@
     </w:p>
     <w:p>
       <w:r>
-        <w:t xml:space="preserve">It gets the </w:t>
-      </w:r>
-      <w:proofErr w:type="spellStart"/>
-      <w:r>
-        <w:t>yaml</w:t>
-      </w:r>
-      <w:proofErr w:type="spellEnd"/>
-      <w:r>
-        <w:t xml:space="preserve"> and passes it to </w:t>
-      </w:r>
-      <w:proofErr w:type="spellStart"/>
-      <w:r>
-        <w:t>kubectl</w:t>
-      </w:r>
-      <w:proofErr w:type="spellEnd"/>
-      <w:r>
-        <w:t xml:space="preserve"> replace -f command: it will recreate the resource.</w:t>
-      </w:r>
-    </w:p>
-    <w:p>
-      <w:r>
-        <w:t xml:space="preserve">When Encryption at Rest is enabled, back up both the ETCD snapshot and the </w:t>
-      </w:r>
-      <w:proofErr w:type="spellStart"/>
-      <w:r>
-        <w:t>EncryptionConfiguration</w:t>
-      </w:r>
-      <w:proofErr w:type="spellEnd"/>
-      <w:r>
-        <w:t xml:space="preserve"> (including encryption keys). Without the original key, encrypted data in ETCD cannot be decrypted after a restore.</w:t>
-      </w:r>
-    </w:p>
-    <w:p>
-      <w:r>
-        <w:t xml:space="preserve">Never replace an encryption key directly. Add the new key alongside the old key for key rotation. If the original encryption key is lost and no backup exists, Kubernetes may be unable to decrypt previously encrypted Secrets stored in </w:t>
-      </w:r>
-      <w:proofErr w:type="spellStart"/>
-      <w:r>
-        <w:t>etcd</w:t>
-      </w:r>
-      <w:proofErr w:type="spellEnd"/>
-      <w:r>
-        <w:t>.</w:t>
+        <w:t>It gets the yaml and passes it to kubectl replace -f command: it will recreate the resource.</w:t>
+      </w:r>
+    </w:p>
+    <w:p>
+      <w:r>
+        <w:lastRenderedPageBreak/>
+        <w:t>When Encryption at Rest is enabled, back up both the ETCD snapshot and the EncryptionConfiguration (including encryption keys). Without the original key, encrypted data in ETCD cannot be decrypted after a restore.</w:t>
+      </w:r>
+    </w:p>
+    <w:p>
+      <w:r>
+        <w:t>Never replace an encryption key directly. Add the new key alongside the old key for key rotation. If the original encryption key is lost and no backup exists, Kubernetes may be unable to decrypt previously encrypted Secrets stored in etcd.</w:t>
       </w:r>
     </w:p>
     <w:p/>
@@ -3051,21 +2687,12 @@
           <w:bCs/>
           <w:highlight w:val="yellow"/>
         </w:rPr>
-        <w:lastRenderedPageBreak/>
         <w:t>CONFIGMAPS</w:t>
       </w:r>
     </w:p>
     <w:p>
       <w:r>
-        <w:t xml:space="preserve">A </w:t>
-      </w:r>
-      <w:proofErr w:type="spellStart"/>
-      <w:r>
-        <w:t>ConfigMap</w:t>
-      </w:r>
-      <w:proofErr w:type="spellEnd"/>
-      <w:r>
-        <w:t xml:space="preserve"> stores non-sensitive configuration data for applications, such as environment variables, configuration files, or command-line arguments.</w:t>
+        <w:t>A ConfigMap stores non-sensitive configuration data for applications, such as environment variables, configuration files, or command-line arguments.</w:t>
       </w:r>
     </w:p>
     <w:p>
@@ -3100,21 +2727,8 @@
       </w:r>
     </w:p>
     <w:p>
-      <w:proofErr w:type="spellStart"/>
-      <w:r>
-        <w:t>kubectl</w:t>
-      </w:r>
-      <w:proofErr w:type="spellEnd"/>
-      <w:r>
-        <w:t xml:space="preserve"> create </w:t>
-      </w:r>
-      <w:proofErr w:type="spellStart"/>
-      <w:r>
-        <w:t>configmap</w:t>
-      </w:r>
-      <w:proofErr w:type="spellEnd"/>
-      <w:r>
-        <w:t xml:space="preserve"> app-config --from-literal=APP_COLOR=blue</w:t>
+      <w:r>
+        <w:t>kubectl create configmap app-config --from-literal=APP_COLOR=blue</w:t>
       </w:r>
     </w:p>
     <w:p/>
@@ -3139,21 +2753,8 @@
       </w:r>
     </w:p>
     <w:p>
-      <w:proofErr w:type="spellStart"/>
-      <w:r>
-        <w:t>kubectl</w:t>
-      </w:r>
-      <w:proofErr w:type="spellEnd"/>
-      <w:r>
-        <w:t xml:space="preserve"> create </w:t>
-      </w:r>
-      <w:proofErr w:type="spellStart"/>
-      <w:r>
-        <w:t>configmap</w:t>
-      </w:r>
-      <w:proofErr w:type="spellEnd"/>
-      <w:r>
-        <w:t xml:space="preserve"> app-config --from-file=config.txt</w:t>
+      <w:r>
+        <w:t>kubectl create configmap app-config --from-file=config.txt</w:t>
       </w:r>
     </w:p>
     <w:p/>
@@ -3178,27 +2779,9 @@
       </w:r>
     </w:p>
     <w:p>
-      <w:proofErr w:type="spellStart"/>
-      <w:r>
-        <w:t>kubectl</w:t>
-      </w:r>
-      <w:proofErr w:type="spellEnd"/>
-      <w:r>
-        <w:t xml:space="preserve"> create </w:t>
-      </w:r>
-      <w:proofErr w:type="spellStart"/>
-      <w:r>
-        <w:t>configmap</w:t>
-      </w:r>
-      <w:proofErr w:type="spellEnd"/>
-      <w:r>
-        <w:t xml:space="preserve"> app-config --from-env-file=</w:t>
-      </w:r>
-      <w:proofErr w:type="spellStart"/>
-      <w:r>
-        <w:t>app.env</w:t>
-      </w:r>
-      <w:proofErr w:type="spellEnd"/>
+      <w:r>
+        <w:t>kubectl create configmap app-config --from-env-file=app.env</w:t>
+      </w:r>
     </w:p>
     <w:p/>
     <w:p>
@@ -3242,7 +2825,7 @@
                     <pic:cNvPicPr/>
                   </pic:nvPicPr>
                   <pic:blipFill>
-                    <a:blip r:embed="rId15"/>
+                    <a:blip r:embed="rId18"/>
                     <a:stretch>
                       <a:fillRect/>
                     </a:stretch>
@@ -3276,17 +2859,8 @@
           <w:b/>
           <w:bCs/>
         </w:rPr>
-        <w:t xml:space="preserve">injecting a </w:t>
-      </w:r>
-      <w:proofErr w:type="spellStart"/>
-      <w:r>
-        <w:rPr>
-          <w:b/>
-          <w:bCs/>
-        </w:rPr>
-        <w:t>ConfigMap</w:t>
-      </w:r>
-      <w:proofErr w:type="spellEnd"/>
+        <w:t>injecting a ConfigMap</w:t>
+      </w:r>
       <w:r>
         <w:t xml:space="preserve">, it is specified at the </w:t>
       </w:r>
@@ -3302,21 +2876,8 @@
       </w:r>
     </w:p>
     <w:p>
-      <w:proofErr w:type="spellStart"/>
-      <w:r>
-        <w:t>ConfigMap</w:t>
-      </w:r>
-      <w:proofErr w:type="spellEnd"/>
-      <w:r>
-        <w:t xml:space="preserve"> can be consumed through environment variables, command/</w:t>
-      </w:r>
-      <w:proofErr w:type="spellStart"/>
-      <w:r>
-        <w:t>args</w:t>
-      </w:r>
-      <w:proofErr w:type="spellEnd"/>
-      <w:r>
-        <w:t xml:space="preserve">, or a </w:t>
+      <w:r>
+        <w:t xml:space="preserve">ConfigMap can be consumed through environment variables, command/args, or a </w:t>
       </w:r>
       <w:r>
         <w:rPr>
@@ -3326,41 +2887,20 @@
         <w:t>volume</w:t>
       </w:r>
       <w:r>
-        <w:t xml:space="preserve">. Workloads like Deployments and </w:t>
-      </w:r>
-      <w:proofErr w:type="spellStart"/>
-      <w:r>
-        <w:t>StatefulSets</w:t>
-      </w:r>
-      <w:proofErr w:type="spellEnd"/>
-      <w:r>
-        <w:t xml:space="preserve"> use </w:t>
-      </w:r>
-      <w:proofErr w:type="spellStart"/>
-      <w:r>
-        <w:t>ConfigMaps</w:t>
-      </w:r>
-      <w:proofErr w:type="spellEnd"/>
-      <w:r>
-        <w:t xml:space="preserve"> through their Pod templates.</w:t>
-      </w:r>
-    </w:p>
-    <w:p>
-      <w:proofErr w:type="spellStart"/>
-      <w:r>
-        <w:t>configMapKeyRef</w:t>
-      </w:r>
-      <w:proofErr w:type="spellEnd"/>
+        <w:t>. Workloads like Deployments and StatefulSets use ConfigMaps through their Pod templates.</w:t>
+      </w:r>
+    </w:p>
+    <w:p>
+      <w:r>
+        <w:t xml:space="preserve">configMapKeyRef </w:t>
+      </w:r>
+      <w:r>
+        <w:t>-</w:t>
+      </w:r>
       <w:r>
         <w:t xml:space="preserve"> </w:t>
       </w:r>
       <w:r>
-        <w:t>-</w:t>
-      </w:r>
-      <w:r>
-        <w:t xml:space="preserve"> </w:t>
-      </w:r>
-      <w:r>
         <w:t xml:space="preserve"> Inject </w:t>
       </w:r>
       <w:r>
@@ -3368,13 +2908,8 @@
       </w:r>
     </w:p>
     <w:p>
-      <w:proofErr w:type="spellStart"/>
-      <w:r>
-        <w:t>configMapRef</w:t>
-      </w:r>
-      <w:proofErr w:type="spellEnd"/>
-      <w:r>
-        <w:t xml:space="preserve"> </w:t>
+      <w:r>
+        <w:t xml:space="preserve">configMapRef </w:t>
       </w:r>
       <w:r>
         <w:t xml:space="preserve">-  Inject </w:t>
@@ -3435,15 +2970,7 @@
         <w:t>Base64-encoded</w:t>
       </w:r>
       <w:r>
-        <w:t xml:space="preserve"> values, while </w:t>
-      </w:r>
-      <w:proofErr w:type="spellStart"/>
-      <w:r>
-        <w:t>stringData</w:t>
-      </w:r>
-      <w:proofErr w:type="spellEnd"/>
-      <w:r>
-        <w:t xml:space="preserve"> accepts </w:t>
+        <w:t xml:space="preserve"> values, while stringData accepts </w:t>
       </w:r>
       <w:r>
         <w:rPr>
@@ -3506,7 +3033,7 @@
                     <pic:cNvPicPr/>
                   </pic:nvPicPr>
                   <pic:blipFill>
-                    <a:blip r:embed="rId16"/>
+                    <a:blip r:embed="rId19"/>
                     <a:stretch>
                       <a:fillRect/>
                     </a:stretch>
@@ -3536,15 +3063,7 @@
         <w:t>Declarative: (</w:t>
       </w:r>
       <w:r>
-        <w:t xml:space="preserve">Using </w:t>
-      </w:r>
-      <w:proofErr w:type="spellStart"/>
-      <w:r>
-        <w:t>stringData</w:t>
-      </w:r>
-      <w:proofErr w:type="spellEnd"/>
-      <w:r>
-        <w:t xml:space="preserve"> </w:t>
+        <w:t xml:space="preserve">Using stringData </w:t>
       </w:r>
       <w:r>
         <w:t xml:space="preserve">- </w:t>
@@ -3561,6 +3080,7 @@
         <w:rPr>
           <w:noProof/>
         </w:rPr>
+        <w:lastRenderedPageBreak/>
         <w:drawing>
           <wp:inline distT="0" distB="0" distL="0" distR="0" wp14:anchorId="43D8ABF3" wp14:editId="6A496057">
             <wp:extent cx="2172003" cy="1657581"/>
@@ -3577,7 +3097,7 @@
                     <pic:cNvPicPr/>
                   </pic:nvPicPr>
                   <pic:blipFill>
-                    <a:blip r:embed="rId17"/>
+                    <a:blip r:embed="rId20"/>
                     <a:stretch>
                       <a:fillRect/>
                     </a:stretch>
@@ -3609,7 +3129,6 @@
         <w:rPr>
           <w:noProof/>
         </w:rPr>
-        <w:lastRenderedPageBreak/>
         <w:drawing>
           <wp:inline distT="0" distB="0" distL="0" distR="0" wp14:anchorId="508BC2A4" wp14:editId="1CB6EF10">
             <wp:extent cx="2314898" cy="1581371"/>
@@ -3626,7 +3145,7 @@
                     <pic:cNvPicPr/>
                   </pic:nvPicPr>
                   <pic:blipFill>
-                    <a:blip r:embed="rId18"/>
+                    <a:blip r:embed="rId21"/>
                     <a:stretch>
                       <a:fillRect/>
                     </a:stretch>
@@ -3711,23 +3230,7 @@
           <w:b/>
           <w:bCs/>
         </w:rPr>
-        <w:t xml:space="preserve">Way </w:t>
-      </w:r>
-      <w:proofErr w:type="spellStart"/>
-      <w:r>
-        <w:rPr>
-          <w:b/>
-          <w:bCs/>
-        </w:rPr>
-        <w:t>kubernetes</w:t>
-      </w:r>
-      <w:proofErr w:type="spellEnd"/>
-      <w:r>
-        <w:rPr>
-          <w:b/>
-          <w:bCs/>
-        </w:rPr>
-        <w:t xml:space="preserve"> handles secrets:</w:t>
+        <w:t>Way kubernetes handles secrets:</w:t>
       </w:r>
     </w:p>
     <w:p>
@@ -3750,21 +3253,8 @@
           <w:numId w:val="9"/>
         </w:numPr>
       </w:pPr>
-      <w:proofErr w:type="spellStart"/>
-      <w:r>
-        <w:t>Kubelet</w:t>
-      </w:r>
-      <w:proofErr w:type="spellEnd"/>
-      <w:r>
-        <w:t xml:space="preserve"> stores the secret into a </w:t>
-      </w:r>
-      <w:proofErr w:type="spellStart"/>
-      <w:r>
-        <w:t>tmpfs</w:t>
-      </w:r>
-      <w:proofErr w:type="spellEnd"/>
-      <w:r>
-        <w:t xml:space="preserve"> so that the secret is not written to disk storage.</w:t>
+      <w:r>
+        <w:t>Kubelet stores the secret into a tmpfs so that the secret is not written to disk storage.</w:t>
       </w:r>
     </w:p>
     <w:p>
@@ -3776,15 +3266,7 @@
         </w:numPr>
       </w:pPr>
       <w:r>
-        <w:t xml:space="preserve">Once the Pod that depends on the secret is deleted, </w:t>
-      </w:r>
-      <w:proofErr w:type="spellStart"/>
-      <w:r>
-        <w:t>kubelet</w:t>
-      </w:r>
-      <w:proofErr w:type="spellEnd"/>
-      <w:r>
-        <w:t xml:space="preserve"> will delete its local copy of the secret data as well.</w:t>
+        <w:t>Once the Pod that depends on the secret is deleted, kubelet will delete its local copy of the secret data as well.</w:t>
       </w:r>
     </w:p>
     <w:p/>
@@ -3802,21 +3284,14 @@
           <w:bCs/>
           <w:highlight w:val="yellow"/>
         </w:rPr>
+        <w:lastRenderedPageBreak/>
         <w:t>KUBECTL COMMANDS RELATED</w:t>
       </w:r>
     </w:p>
     <w:p/>
     <w:p>
       <w:r>
-        <w:t xml:space="preserve">To delete all pods together: </w:t>
-      </w:r>
-      <w:proofErr w:type="spellStart"/>
-      <w:r>
-        <w:t>kubectl</w:t>
-      </w:r>
-      <w:proofErr w:type="spellEnd"/>
-      <w:r>
-        <w:t xml:space="preserve"> delete pods –all</w:t>
+        <w:t>To delete all pods together: kubectl delete pods –all</w:t>
       </w:r>
     </w:p>
     <w:p>
@@ -3827,27 +3302,17 @@
         <w:t>resources</w:t>
       </w:r>
       <w:r>
-        <w:t xml:space="preserve">: </w:t>
-      </w:r>
-      <w:proofErr w:type="spellStart"/>
-      <w:r>
-        <w:t>kubectl</w:t>
-      </w:r>
-      <w:proofErr w:type="spellEnd"/>
-      <w:r>
-        <w:t xml:space="preserve"> delete pods --all -n &lt;namespace-name&gt;</w:t>
-      </w:r>
-    </w:p>
-    <w:p/>
-    <w:p>
-      <w:proofErr w:type="spellStart"/>
+        <w:t>: kubectl delete pods --all -n &lt;namespace-name&gt;</w:t>
+      </w:r>
+    </w:p>
+    <w:p/>
+    <w:p>
       <w:r>
         <w:t>k</w:t>
       </w:r>
       <w:r>
         <w:t>ubectl</w:t>
       </w:r>
-      <w:proofErr w:type="spellEnd"/>
       <w:r>
         <w:t xml:space="preserve"> get pods --show-</w:t>
       </w:r>
@@ -3866,86 +3331,27 @@
     </w:p>
     <w:p/>
     <w:p>
-      <w:proofErr w:type="spellStart"/>
-      <w:r>
-        <w:lastRenderedPageBreak/>
+      <w:r>
         <w:t>ku</w:t>
       </w:r>
       <w:r>
-        <w:t>bectl</w:t>
-      </w:r>
-      <w:proofErr w:type="spellEnd"/>
-      <w:r>
-        <w:t xml:space="preserve"> apply -f </w:t>
-      </w:r>
-      <w:proofErr w:type="spellStart"/>
-      <w:r>
-        <w:t>file.yaml</w:t>
-      </w:r>
-      <w:proofErr w:type="spellEnd"/>
-      <w:r>
-        <w:t xml:space="preserve"> → Creates the resource if it doesn't exist, or updates it if it already exists. </w:t>
-      </w:r>
-    </w:p>
-    <w:p>
-      <w:proofErr w:type="spellStart"/>
-      <w:r>
-        <w:t>kubectl</w:t>
-      </w:r>
-      <w:proofErr w:type="spellEnd"/>
-      <w:r>
-        <w:t xml:space="preserve"> replace -f </w:t>
-      </w:r>
-      <w:proofErr w:type="spellStart"/>
-      <w:r>
-        <w:t>file.yaml</w:t>
-      </w:r>
-      <w:proofErr w:type="spellEnd"/>
-      <w:r>
-        <w:t xml:space="preserve"> → Replaces an existing resource. It fails if the resource doesn't exist.</w:t>
-      </w:r>
-    </w:p>
-    <w:p/>
-    <w:p>
-      <w:r>
-        <w:t xml:space="preserve">You can use the </w:t>
-      </w:r>
-      <w:proofErr w:type="spellStart"/>
-      <w:r>
-        <w:t>kubectl</w:t>
-      </w:r>
-      <w:proofErr w:type="spellEnd"/>
-      <w:r>
-        <w:t xml:space="preserve"> explain to learn more about different resources.</w:t>
-      </w:r>
-    </w:p>
-    <w:p>
-      <w:r>
-        <w:t xml:space="preserve">Eg: </w:t>
-      </w:r>
-      <w:proofErr w:type="spellStart"/>
-      <w:r>
-        <w:t>kubectl</w:t>
-      </w:r>
-      <w:proofErr w:type="spellEnd"/>
-      <w:r>
-        <w:t xml:space="preserve"> explain pod, </w:t>
-      </w:r>
-      <w:proofErr w:type="spellStart"/>
-      <w:r>
-        <w:t>kubectl</w:t>
-      </w:r>
-      <w:proofErr w:type="spellEnd"/>
-      <w:r>
-        <w:t xml:space="preserve"> explain </w:t>
-      </w:r>
-      <w:proofErr w:type="spellStart"/>
-      <w:r>
-        <w:t>pod.spec</w:t>
-      </w:r>
-      <w:proofErr w:type="spellEnd"/>
-      <w:r>
-        <w:t>.</w:t>
+        <w:t xml:space="preserve">bectl apply -f file.yaml → Creates the resource if it doesn't exist, or updates it if it already exists. </w:t>
+      </w:r>
+    </w:p>
+    <w:p>
+      <w:r>
+        <w:t>kubectl replace -f file.yaml → Replaces an existing resource. It fails if the resource doesn't exist.</w:t>
+      </w:r>
+    </w:p>
+    <w:p/>
+    <w:p>
+      <w:r>
+        <w:t>You can use the kubectl explain to learn more about different resources.</w:t>
+      </w:r>
+    </w:p>
+    <w:p>
+      <w:r>
+        <w:t>Eg: kubectl explain pod, kubectl explain pod.spec.</w:t>
       </w:r>
     </w:p>
     <w:p>
@@ -3961,54 +3367,26 @@
     </w:p>
     <w:p>
       <w:r>
-        <w:t xml:space="preserve">Eg: </w:t>
-      </w:r>
-      <w:proofErr w:type="spellStart"/>
-      <w:r>
-        <w:t>kubectl</w:t>
-      </w:r>
-      <w:proofErr w:type="spellEnd"/>
-      <w:r>
-        <w:t xml:space="preserve"> explain </w:t>
-      </w:r>
-      <w:proofErr w:type="spellStart"/>
-      <w:r>
-        <w:t>pod.spec</w:t>
-      </w:r>
-      <w:proofErr w:type="spellEnd"/>
-      <w:r>
-        <w:t xml:space="preserve"> </w:t>
+        <w:t xml:space="preserve">Eg: kubectl explain pod.spec </w:t>
       </w:r>
       <w:r>
         <w:t>–</w:t>
       </w:r>
-      <w:proofErr w:type="spellStart"/>
       <w:r>
         <w:t>recusrsive</w:t>
       </w:r>
       <w:r>
         <w:t>s</w:t>
       </w:r>
-      <w:proofErr w:type="spellEnd"/>
     </w:p>
     <w:p/>
     <w:p>
       <w:r>
         <w:t xml:space="preserve">To log in to a multi container pod:  </w:t>
       </w:r>
-      <w:proofErr w:type="spellStart"/>
-      <w:r>
-        <w:t>kubectl</w:t>
-      </w:r>
-      <w:proofErr w:type="spellEnd"/>
-      <w:r>
-        <w:t xml:space="preserve"> exec -it &lt;pod-name&gt; -c &lt;container-name&gt; -- /bin/</w:t>
-      </w:r>
-      <w:proofErr w:type="spellStart"/>
-      <w:r>
-        <w:t>sh</w:t>
-      </w:r>
-      <w:proofErr w:type="spellEnd"/>
+      <w:r>
+        <w:t>kubectl exec -it &lt;pod-name&gt; -c &lt;container-name&gt; -- /bin/sh</w:t>
+      </w:r>
     </w:p>
     <w:sectPr>
       <w:pgSz w:w="12240" w:h="15840"/>
@@ -5190,6 +4568,95 @@
     </w:lvl>
   </w:abstractNum>
   <w:abstractNum w:abstractNumId="10" w15:restartNumberingAfterBreak="0">
+    <w:nsid w:val="74815055"/>
+    <w:multiLevelType w:val="hybridMultilevel"/>
+    <w:tmpl w:val="2FD09D60"/>
+    <w:lvl w:ilvl="0" w:tplc="1009000F">
+      <w:start w:val="1"/>
+      <w:numFmt w:val="decimal"/>
+      <w:lvlText w:val="%1."/>
+      <w:lvlJc w:val="left"/>
+      <w:pPr>
+        <w:ind w:left="720" w:hanging="360"/>
+      </w:pPr>
+      <w:rPr>
+        <w:rFonts w:hint="default"/>
+      </w:rPr>
+    </w:lvl>
+    <w:lvl w:ilvl="1" w:tplc="10090019" w:tentative="1">
+      <w:start w:val="1"/>
+      <w:numFmt w:val="lowerLetter"/>
+      <w:lvlText w:val="%2."/>
+      <w:lvlJc w:val="left"/>
+      <w:pPr>
+        <w:ind w:left="1440" w:hanging="360"/>
+      </w:pPr>
+    </w:lvl>
+    <w:lvl w:ilvl="2" w:tplc="1009001B" w:tentative="1">
+      <w:start w:val="1"/>
+      <w:numFmt w:val="lowerRoman"/>
+      <w:lvlText w:val="%3."/>
+      <w:lvlJc w:val="right"/>
+      <w:pPr>
+        <w:ind w:left="2160" w:hanging="180"/>
+      </w:pPr>
+    </w:lvl>
+    <w:lvl w:ilvl="3" w:tplc="1009000F" w:tentative="1">
+      <w:start w:val="1"/>
+      <w:numFmt w:val="decimal"/>
+      <w:lvlText w:val="%4."/>
+      <w:lvlJc w:val="left"/>
+      <w:pPr>
+        <w:ind w:left="2880" w:hanging="360"/>
+      </w:pPr>
+    </w:lvl>
+    <w:lvl w:ilvl="4" w:tplc="10090019" w:tentative="1">
+      <w:start w:val="1"/>
+      <w:numFmt w:val="lowerLetter"/>
+      <w:lvlText w:val="%5."/>
+      <w:lvlJc w:val="left"/>
+      <w:pPr>
+        <w:ind w:left="3600" w:hanging="360"/>
+      </w:pPr>
+    </w:lvl>
+    <w:lvl w:ilvl="5" w:tplc="1009001B" w:tentative="1">
+      <w:start w:val="1"/>
+      <w:numFmt w:val="lowerRoman"/>
+      <w:lvlText w:val="%6."/>
+      <w:lvlJc w:val="right"/>
+      <w:pPr>
+        <w:ind w:left="4320" w:hanging="180"/>
+      </w:pPr>
+    </w:lvl>
+    <w:lvl w:ilvl="6" w:tplc="1009000F" w:tentative="1">
+      <w:start w:val="1"/>
+      <w:numFmt w:val="decimal"/>
+      <w:lvlText w:val="%7."/>
+      <w:lvlJc w:val="left"/>
+      <w:pPr>
+        <w:ind w:left="5040" w:hanging="360"/>
+      </w:pPr>
+    </w:lvl>
+    <w:lvl w:ilvl="7" w:tplc="10090019" w:tentative="1">
+      <w:start w:val="1"/>
+      <w:numFmt w:val="lowerLetter"/>
+      <w:lvlText w:val="%8."/>
+      <w:lvlJc w:val="left"/>
+      <w:pPr>
+        <w:ind w:left="5760" w:hanging="360"/>
+      </w:pPr>
+    </w:lvl>
+    <w:lvl w:ilvl="8" w:tplc="1009001B" w:tentative="1">
+      <w:start w:val="1"/>
+      <w:numFmt w:val="lowerRoman"/>
+      <w:lvlText w:val="%9."/>
+      <w:lvlJc w:val="right"/>
+      <w:pPr>
+        <w:ind w:left="6480" w:hanging="180"/>
+      </w:pPr>
+    </w:lvl>
+  </w:abstractNum>
+  <w:abstractNum w:abstractNumId="11" w15:restartNumberingAfterBreak="0">
     <w:nsid w:val="7FE96A27"/>
     <w:multiLevelType w:val="multilevel"/>
     <w:tmpl w:val="2E109BCA"/>
@@ -5342,7 +4809,7 @@
     <w:abstractNumId w:val="9"/>
   </w:num>
   <w:num w:numId="2" w16cid:durableId="346176687">
-    <w:abstractNumId w:val="10"/>
+    <w:abstractNumId w:val="11"/>
   </w:num>
   <w:num w:numId="3" w16cid:durableId="588125869">
     <w:abstractNumId w:val="3"/>
@@ -5370,6 +4837,9 @@
   </w:num>
   <w:num w:numId="11" w16cid:durableId="1170869400">
     <w:abstractNumId w:val="6"/>
+  </w:num>
+  <w:num w:numId="12" w16cid:durableId="2014062361">
+    <w:abstractNumId w:val="10"/>
   </w:num>
 </w:numbering>
 </file>
@@ -6334,6 +5804,29 @@
     <w:uiPriority w:val="99"/>
     <w:rsid w:val="003A58D4"/>
   </w:style>
+  <w:style w:type="character" w:styleId="Hyperlink">
+    <w:name w:val="Hyperlink"/>
+    <w:basedOn w:val="DefaultParagraphFont"/>
+    <w:uiPriority w:val="99"/>
+    <w:unhideWhenUsed/>
+    <w:rsid w:val="00E21C68"/>
+    <w:rPr>
+      <w:color w:val="467886" w:themeColor="hyperlink"/>
+      <w:u w:val="single"/>
+    </w:rPr>
+  </w:style>
+  <w:style w:type="character" w:styleId="UnresolvedMention">
+    <w:name w:val="Unresolved Mention"/>
+    <w:basedOn w:val="DefaultParagraphFont"/>
+    <w:uiPriority w:val="99"/>
+    <w:semiHidden/>
+    <w:unhideWhenUsed/>
+    <w:rsid w:val="00E21C68"/>
+    <w:rPr>
+      <w:color w:val="605E5C"/>
+      <w:shd w:val="clear" w:color="auto" w:fill="E1DFDD"/>
+    </w:rPr>
+  </w:style>
 </w:styles>
 </file>
 

</xml_diff>

<commit_message>
Learned docker and kubernetes capabilities
</commit_message>
<xml_diff>
--- a/9-Interesting_learning_Notes/Learning_Notes.docx
+++ b/9-Interesting_learning_Notes/Learning_Notes.docx
@@ -119,6 +119,7 @@
       <w:r>
         <w:t xml:space="preserve">, Kubernetes assigns it a </w:t>
       </w:r>
+      <w:proofErr w:type="spellStart"/>
       <w:r>
         <w:rPr>
           <w:b/>
@@ -126,6 +127,7 @@
         </w:rPr>
         <w:t>ClusterIP</w:t>
       </w:r>
+      <w:proofErr w:type="spellEnd"/>
       <w:r>
         <w:t xml:space="preserve">. </w:t>
       </w:r>
@@ -179,12 +181,21 @@
           <w:numId w:val="2"/>
         </w:numPr>
       </w:pPr>
-      <w:r>
-        <w:rPr>
-          <w:b/>
-          <w:bCs/>
-        </w:rPr>
-        <w:t>kube-proxy does not assign the Service IP.</w:t>
+      <w:proofErr w:type="spellStart"/>
+      <w:r>
+        <w:rPr>
+          <w:b/>
+          <w:bCs/>
+        </w:rPr>
+        <w:t>kube</w:t>
+      </w:r>
+      <w:proofErr w:type="spellEnd"/>
+      <w:r>
+        <w:rPr>
+          <w:b/>
+          <w:bCs/>
+        </w:rPr>
+        <w:t>-proxy does not assign the Service IP.</w:t>
       </w:r>
       <w:r>
         <w:t xml:space="preserve"> </w:t>
@@ -197,8 +208,13 @@
           <w:numId w:val="2"/>
         </w:numPr>
       </w:pPr>
-      <w:r>
-        <w:t xml:space="preserve">kube-proxy watches Services and creates </w:t>
+      <w:proofErr w:type="spellStart"/>
+      <w:r>
+        <w:t>kube</w:t>
+      </w:r>
+      <w:proofErr w:type="spellEnd"/>
+      <w:r>
+        <w:t xml:space="preserve">-proxy watches Services and creates </w:t>
       </w:r>
       <w:r>
         <w:rPr>
@@ -208,7 +224,15 @@
         <w:t>networking rules</w:t>
       </w:r>
       <w:r>
-        <w:t xml:space="preserve"> (iptables/IPVS/nftables) to route traffic from the Service IP to the backend Pod IPs.</w:t>
+        <w:t xml:space="preserve"> (iptables/IPVS/</w:t>
+      </w:r>
+      <w:proofErr w:type="spellStart"/>
+      <w:r>
+        <w:t>nftables</w:t>
+      </w:r>
+      <w:proofErr w:type="spellEnd"/>
+      <w:r>
+        <w:t>) to route traffic from the Service IP to the backend Pod IPs.</w:t>
       </w:r>
     </w:p>
     <w:p>
@@ -239,12 +263,21 @@
           <w:numId w:val="2"/>
         </w:numPr>
       </w:pPr>
-      <w:r>
-        <w:rPr>
-          <w:b/>
-          <w:bCs/>
-        </w:rPr>
-        <w:t>kube-proxy</w:t>
+      <w:proofErr w:type="spellStart"/>
+      <w:r>
+        <w:rPr>
+          <w:b/>
+          <w:bCs/>
+        </w:rPr>
+        <w:t>kube</w:t>
+      </w:r>
+      <w:proofErr w:type="spellEnd"/>
+      <w:r>
+        <w:rPr>
+          <w:b/>
+          <w:bCs/>
+        </w:rPr>
+        <w:t>-proxy</w:t>
       </w:r>
       <w:r>
         <w:t xml:space="preserve"> creates networking rules that recognize this virtual IP and forward traffic to the Service's backend Pods.</w:t>
@@ -290,19 +323,40 @@
         <w:t xml:space="preserve">: </w:t>
       </w:r>
       <w:r>
-        <w:t>A Kubernetes NodePort does not create a normal listening socket on the node. Instead, Kuberne</w:t>
+        <w:t xml:space="preserve">A Kubernetes </w:t>
+      </w:r>
+      <w:proofErr w:type="spellStart"/>
+      <w:r>
+        <w:t>NodePort</w:t>
+      </w:r>
+      <w:proofErr w:type="spellEnd"/>
+      <w:r>
+        <w:t xml:space="preserve"> does not create a normal listening socket on the node. Instead, </w:t>
+      </w:r>
+      <w:proofErr w:type="spellStart"/>
+      <w:r>
+        <w:t>Kuberne</w:t>
       </w:r>
       <w:r>
         <w:t>s</w:t>
       </w:r>
       <w:r>
-        <w:t>tes configures networking rules to forward traffic arriving on that port to the Service. Therefore, if a host-level application is already listening on the same port, traffic arriving through that node may be handled by the existing application instead of reaching the Kubernetes Service, depending on the networking implementation and rule processing.</w:t>
-      </w:r>
-    </w:p>
-    <w:p/>
-    <w:p>
-      <w:r>
-        <w:t>NodePort 30005 does NOT mean:</w:t>
+        <w:t>tes</w:t>
+      </w:r>
+      <w:proofErr w:type="spellEnd"/>
+      <w:r>
+        <w:t xml:space="preserve"> configures networking rules to forward traffic arriving on that port to the Service. Therefore, if a host-level application is already listening on the same port, traffic arriving through that node may be handled by the existing application instead of reaching the Kubernetes Service, depending on the networking implementation and rule processing.</w:t>
+      </w:r>
+    </w:p>
+    <w:p/>
+    <w:p>
+      <w:proofErr w:type="spellStart"/>
+      <w:r>
+        <w:t>NodePort</w:t>
+      </w:r>
+      <w:proofErr w:type="spellEnd"/>
+      <w:r>
+        <w:t xml:space="preserve"> 30005 does NOT mean:</w:t>
       </w:r>
     </w:p>
     <w:p>
@@ -326,12 +380,21 @@
       <w:r>
         <w:t xml:space="preserve">packet gets </w:t>
       </w:r>
-      <w:r>
-        <w:rPr>
-          <w:b/>
-          <w:bCs/>
-        </w:rPr>
-        <w:t>DNAT'ed/redirected by the Kubernetes networking rules before normal socket delivery</w:t>
+      <w:proofErr w:type="spellStart"/>
+      <w:r>
+        <w:rPr>
+          <w:b/>
+          <w:bCs/>
+        </w:rPr>
+        <w:t>DNAT'ed</w:t>
+      </w:r>
+      <w:proofErr w:type="spellEnd"/>
+      <w:r>
+        <w:rPr>
+          <w:b/>
+          <w:bCs/>
+        </w:rPr>
+        <w:t>/redirected by the Kubernetes networking rules before normal socket delivery</w:t>
       </w:r>
       <w:r>
         <w:t>.</w:t>
@@ -348,13 +411,24 @@
       <w:r>
         <w:t xml:space="preserve">The full DNS to refer a service is: </w:t>
       </w:r>
-      <w:r>
-        <w:rPr>
-          <w:b/>
-          <w:bCs/>
-        </w:rPr>
-        <w:t>myservice.default.svc.cluster.local</w:t>
-      </w:r>
+      <w:proofErr w:type="spellStart"/>
+      <w:proofErr w:type="gramStart"/>
+      <w:r>
+        <w:rPr>
+          <w:b/>
+          <w:bCs/>
+        </w:rPr>
+        <w:t>myservice.default.svc.cluster</w:t>
+      </w:r>
+      <w:proofErr w:type="gramEnd"/>
+      <w:r>
+        <w:rPr>
+          <w:b/>
+          <w:bCs/>
+        </w:rPr>
+        <w:t>.local</w:t>
+      </w:r>
+      <w:proofErr w:type="spellEnd"/>
     </w:p>
     <w:p>
       <w:pPr>
@@ -381,8 +455,42 @@
     </w:p>
     <w:p>
       <w:r>
-        <w:t>The Structure of a Kubernetes Service DNS NameEvery Service gets a full DNS address that looks like this:[service-name].[namespace].svc.cluster.local</w:t>
-      </w:r>
+        <w:t xml:space="preserve">The Structure of a Kubernetes Service DNS </w:t>
+      </w:r>
+      <w:proofErr w:type="spellStart"/>
+      <w:r>
+        <w:t>NameEvery</w:t>
+      </w:r>
+      <w:proofErr w:type="spellEnd"/>
+      <w:r>
+        <w:t xml:space="preserve"> Service gets a full DNS address that looks like </w:t>
+      </w:r>
+      <w:proofErr w:type="gramStart"/>
+      <w:r>
+        <w:t>this:[</w:t>
+      </w:r>
+      <w:proofErr w:type="gramEnd"/>
+      <w:r>
+        <w:t>service-name</w:t>
+      </w:r>
+      <w:proofErr w:type="gramStart"/>
+      <w:r>
+        <w:t>].[</w:t>
+      </w:r>
+      <w:proofErr w:type="gramEnd"/>
+      <w:r>
+        <w:t>namespace].</w:t>
+      </w:r>
+      <w:proofErr w:type="spellStart"/>
+      <w:proofErr w:type="gramStart"/>
+      <w:r>
+        <w:t>svc.cluster</w:t>
+      </w:r>
+      <w:proofErr w:type="gramEnd"/>
+      <w:r>
+        <w:t>.local</w:t>
+      </w:r>
+      <w:proofErr w:type="spellEnd"/>
     </w:p>
     <w:p>
       <w:pPr>
@@ -392,8 +500,18 @@
           <w:numId w:val="3"/>
         </w:numPr>
       </w:pPr>
-      <w:r>
-        <w:t>service-name:The name you gave your Service.</w:t>
+      <w:proofErr w:type="spellStart"/>
+      <w:r>
+        <w:t>service-</w:t>
+      </w:r>
+      <w:proofErr w:type="gramStart"/>
+      <w:r>
+        <w:t>name:The</w:t>
+      </w:r>
+      <w:proofErr w:type="spellEnd"/>
+      <w:proofErr w:type="gramEnd"/>
+      <w:r>
+        <w:t xml:space="preserve"> name you gave your Service.</w:t>
       </w:r>
     </w:p>
     <w:p>
@@ -421,24 +539,128 @@
       </w:r>
     </w:p>
     <w:p>
-      <w:r>
-        <w:t>cluster.local: The default local domain name for your entire cluster.</w:t>
-      </w:r>
-    </w:p>
-    <w:p/>
-    <w:p>
-      <w:r>
-        <w:t>Scenario A Example: A pod in the "frontend" namespace connects to a database in the same namespace using just "db-service".</w:t>
-      </w:r>
-    </w:p>
-    <w:p>
-      <w:r>
-        <w:t>Scenario B Example: A pod in the "frontend" namespace connects to a database in the "backend" namespace using "db-service.backend".</w:t>
-      </w:r>
-    </w:p>
-    <w:p>
-      <w:r>
-        <w:t>The remaining part of the address—.svc.cluster.local—is called the cluster suffix. It is not mandatory because every container running inside a Kubernetes Pod has a hidden configuration file (/etc/resolv.conf) created automatically by the cluster. it contain all the search list.Because of this search list, if you type just db-service, Kubernetes automatically appends the remaining parts (.svc.cluster.local) behind the scenes and tests them one by one until it finds a match!</w:t>
+      <w:proofErr w:type="spellStart"/>
+      <w:proofErr w:type="gramStart"/>
+      <w:r>
+        <w:t>cluster.local</w:t>
+      </w:r>
+      <w:proofErr w:type="spellEnd"/>
+      <w:proofErr w:type="gramEnd"/>
+      <w:r>
+        <w:t>: The default local domain name for your entire cluster.</w:t>
+      </w:r>
+    </w:p>
+    <w:p/>
+    <w:p>
+      <w:r>
+        <w:t xml:space="preserve">Scenario </w:t>
+      </w:r>
+      <w:proofErr w:type="gramStart"/>
+      <w:r>
+        <w:t>A</w:t>
+      </w:r>
+      <w:proofErr w:type="gramEnd"/>
+      <w:r>
+        <w:t xml:space="preserve"> Example: A pod in the "frontend" namespace connects to a database in the same namespace using just "</w:t>
+      </w:r>
+      <w:proofErr w:type="spellStart"/>
+      <w:r>
+        <w:t>db</w:t>
+      </w:r>
+      <w:proofErr w:type="spellEnd"/>
+      <w:r>
+        <w:t>-service".</w:t>
+      </w:r>
+    </w:p>
+    <w:p>
+      <w:r>
+        <w:t>Scenario B Example: A pod in the "frontend" namespace connects to a database in the "backend" namespace using "</w:t>
+      </w:r>
+      <w:proofErr w:type="spellStart"/>
+      <w:r>
+        <w:t>db-</w:t>
+      </w:r>
+      <w:proofErr w:type="gramStart"/>
+      <w:r>
+        <w:t>service.backend</w:t>
+      </w:r>
+      <w:proofErr w:type="spellEnd"/>
+      <w:proofErr w:type="gramEnd"/>
+      <w:r>
+        <w:t>".</w:t>
+      </w:r>
+    </w:p>
+    <w:p>
+      <w:r>
+        <w:t>The remaining part of the address—.</w:t>
+      </w:r>
+      <w:proofErr w:type="spellStart"/>
+      <w:proofErr w:type="gramStart"/>
+      <w:r>
+        <w:t>svc.cluster</w:t>
+      </w:r>
+      <w:proofErr w:type="gramEnd"/>
+      <w:r>
+        <w:t>.local</w:t>
+      </w:r>
+      <w:proofErr w:type="spellEnd"/>
+      <w:r>
+        <w:t>—is called the cluster suffix. It is not mandatory because every container running inside a Kubernetes Pod has a hidden configuration file (/</w:t>
+      </w:r>
+      <w:proofErr w:type="spellStart"/>
+      <w:r>
+        <w:t>etc</w:t>
+      </w:r>
+      <w:proofErr w:type="spellEnd"/>
+      <w:r>
+        <w:t>/</w:t>
+      </w:r>
+      <w:proofErr w:type="spellStart"/>
+      <w:r>
+        <w:t>resolv.conf</w:t>
+      </w:r>
+      <w:proofErr w:type="spellEnd"/>
+      <w:r>
+        <w:t xml:space="preserve">) created automatically by the cluster. it </w:t>
+      </w:r>
+      <w:proofErr w:type="gramStart"/>
+      <w:r>
+        <w:t>contain</w:t>
+      </w:r>
+      <w:proofErr w:type="gramEnd"/>
+      <w:r>
+        <w:t xml:space="preserve"> all the search </w:t>
+      </w:r>
+      <w:proofErr w:type="spellStart"/>
+      <w:proofErr w:type="gramStart"/>
+      <w:r>
+        <w:t>list.Because</w:t>
+      </w:r>
+      <w:proofErr w:type="spellEnd"/>
+      <w:proofErr w:type="gramEnd"/>
+      <w:r>
+        <w:t xml:space="preserve"> of this search list, if you type just </w:t>
+      </w:r>
+      <w:proofErr w:type="spellStart"/>
+      <w:r>
+        <w:t>db</w:t>
+      </w:r>
+      <w:proofErr w:type="spellEnd"/>
+      <w:r>
+        <w:t>-service, Kubernetes automatically appends the remaining parts (.</w:t>
+      </w:r>
+      <w:proofErr w:type="spellStart"/>
+      <w:proofErr w:type="gramStart"/>
+      <w:r>
+        <w:t>svc.cluster</w:t>
+      </w:r>
+      <w:proofErr w:type="gramEnd"/>
+      <w:r>
+        <w:t>.local</w:t>
+      </w:r>
+      <w:proofErr w:type="spellEnd"/>
+      <w:r>
+        <w:t>) behind the scenes and tests them one by one until it finds a match!</w:t>
       </w:r>
     </w:p>
     <w:p>
@@ -521,8 +743,13 @@
       <w:r>
         <w:t xml:space="preserve"> </w:t>
       </w:r>
-      <w:r>
-        <w:t xml:space="preserve">kubectl </w:t>
+      <w:proofErr w:type="spellStart"/>
+      <w:r>
+        <w:t>kubectl</w:t>
+      </w:r>
+      <w:proofErr w:type="spellEnd"/>
+      <w:r>
+        <w:t xml:space="preserve"> </w:t>
       </w:r>
       <w:r>
         <w:rPr>
@@ -532,7 +759,15 @@
         <w:t>edit</w:t>
       </w:r>
       <w:r>
-        <w:t xml:space="preserve"> svc my-nodeport-service</w:t>
+        <w:t xml:space="preserve"> svc my-</w:t>
+      </w:r>
+      <w:proofErr w:type="spellStart"/>
+      <w:r>
+        <w:t>nodeport</w:t>
+      </w:r>
+      <w:proofErr w:type="spellEnd"/>
+      <w:r>
+        <w:t>-service</w:t>
       </w:r>
     </w:p>
     <w:p>
@@ -551,11 +786,16 @@
       <w:r>
         <w:t xml:space="preserve"> </w:t>
       </w:r>
+      <w:proofErr w:type="spellStart"/>
       <w:r>
         <w:t>k</w:t>
       </w:r>
       <w:r>
-        <w:t xml:space="preserve">ubectl </w:t>
+        <w:t>ubectl</w:t>
+      </w:r>
+      <w:proofErr w:type="spellEnd"/>
+      <w:r>
+        <w:t xml:space="preserve"> </w:t>
       </w:r>
       <w:r>
         <w:t xml:space="preserve">get pods </w:t>
@@ -709,33 +949,91 @@
       </w:r>
     </w:p>
     <w:p>
+      <w:proofErr w:type="spellStart"/>
       <w:r>
         <w:t>k</w:t>
       </w:r>
       <w:r>
-        <w:t>ubectl run pods -h  #This will shows example usages and explanations.</w:t>
-      </w:r>
-    </w:p>
-    <w:p/>
-    <w:p>
-      <w:pPr>
-        <w:rPr>
-          <w:b/>
-          <w:bCs/>
-        </w:rPr>
-      </w:pPr>
-    </w:p>
-    <w:p>
-      <w:r>
-        <w:t>kubectl api-resources -o wide</w:t>
-      </w:r>
-      <w:r>
-        <w:t xml:space="preserve"> : shows all resources of Kubernetes. Helps to find the apiversion.  </w:t>
-      </w:r>
-    </w:p>
-    <w:p>
-      <w:r>
-        <w:t>When you run kubectl get all, the resources that should be included in the “</w:t>
+        <w:t>ubectl</w:t>
+      </w:r>
+      <w:proofErr w:type="spellEnd"/>
+      <w:r>
+        <w:t xml:space="preserve"> run pods -</w:t>
+      </w:r>
+      <w:proofErr w:type="gramStart"/>
+      <w:r>
+        <w:t>h  #</w:t>
+      </w:r>
+      <w:proofErr w:type="gramEnd"/>
+      <w:r>
+        <w:t xml:space="preserve">This will </w:t>
+      </w:r>
+      <w:proofErr w:type="gramStart"/>
+      <w:r>
+        <w:t>shows</w:t>
+      </w:r>
+      <w:proofErr w:type="gramEnd"/>
+      <w:r>
+        <w:t xml:space="preserve"> example usages and explanations.</w:t>
+      </w:r>
+    </w:p>
+    <w:p/>
+    <w:p>
+      <w:pPr>
+        <w:rPr>
+          <w:b/>
+          <w:bCs/>
+        </w:rPr>
+      </w:pPr>
+    </w:p>
+    <w:p>
+      <w:proofErr w:type="spellStart"/>
+      <w:r>
+        <w:t>kubectl</w:t>
+      </w:r>
+      <w:proofErr w:type="spellEnd"/>
+      <w:r>
+        <w:t xml:space="preserve"> </w:t>
+      </w:r>
+      <w:proofErr w:type="spellStart"/>
+      <w:r>
+        <w:t>api</w:t>
+      </w:r>
+      <w:proofErr w:type="spellEnd"/>
+      <w:r>
+        <w:t xml:space="preserve">-resources -o </w:t>
+      </w:r>
+      <w:proofErr w:type="gramStart"/>
+      <w:r>
+        <w:t>wide</w:t>
+      </w:r>
+      <w:r>
+        <w:t xml:space="preserve"> :</w:t>
+      </w:r>
+      <w:proofErr w:type="gramEnd"/>
+      <w:r>
+        <w:t xml:space="preserve"> shows all resources of Kubernetes. Helps to find the </w:t>
+      </w:r>
+      <w:proofErr w:type="spellStart"/>
+      <w:r>
+        <w:t>apiversion</w:t>
+      </w:r>
+      <w:proofErr w:type="spellEnd"/>
+      <w:r>
+        <w:t xml:space="preserve">.  </w:t>
+      </w:r>
+    </w:p>
+    <w:p>
+      <w:r>
+        <w:t xml:space="preserve">When you run </w:t>
+      </w:r>
+      <w:proofErr w:type="spellStart"/>
+      <w:r>
+        <w:t>kubectl</w:t>
+      </w:r>
+      <w:proofErr w:type="spellEnd"/>
+      <w:r>
+        <w:t xml:space="preserve"> get all, the resources that should be included in the “</w:t>
       </w:r>
       <w:r>
         <w:rPr>
@@ -747,8 +1045,21 @@
       <w:r>
         <w:t>” can be seen in the output of “</w:t>
       </w:r>
-      <w:r>
-        <w:t>kubectl api-resources -o wide</w:t>
+      <w:proofErr w:type="spellStart"/>
+      <w:r>
+        <w:t>kubectl</w:t>
+      </w:r>
+      <w:proofErr w:type="spellEnd"/>
+      <w:r>
+        <w:t xml:space="preserve"> </w:t>
+      </w:r>
+      <w:proofErr w:type="spellStart"/>
+      <w:r>
+        <w:t>api</w:t>
+      </w:r>
+      <w:proofErr w:type="spellEnd"/>
+      <w:r>
+        <w:t>-resources -o wide</w:t>
       </w:r>
       <w:r>
         <w:t xml:space="preserve">” command, under the </w:t>
@@ -770,7 +1081,15 @@
     <w:p/>
     <w:p>
       <w:r>
-        <w:t>The cluster-info CA certificate in kube-public acts just like the trusted root certificates in your web browser, allowing new clients to safely verify the identity of the Kubernetes API server during a secure TLS connection.</w:t>
+        <w:t xml:space="preserve">The cluster-info CA certificate in </w:t>
+      </w:r>
+      <w:proofErr w:type="spellStart"/>
+      <w:r>
+        <w:t>kube</w:t>
+      </w:r>
+      <w:proofErr w:type="spellEnd"/>
+      <w:r>
+        <w:t>-public acts just like the trusted root certificates in your web browser, allowing new clients to safely verify the identity of the Kubernetes API server during a secure TLS connection.</w:t>
       </w:r>
     </w:p>
     <w:p/>
@@ -807,8 +1126,13 @@
       </w:pPr>
     </w:p>
     <w:p>
-      <w:r>
-        <w:t>kubectl apply -f folder/ does not guarantee resource creation order.</w:t>
+      <w:proofErr w:type="spellStart"/>
+      <w:r>
+        <w:t>kubectl</w:t>
+      </w:r>
+      <w:proofErr w:type="spellEnd"/>
+      <w:r>
+        <w:t xml:space="preserve"> apply -f folder/ does not guarantee resource creation order.</w:t>
       </w:r>
     </w:p>
     <w:p>
@@ -840,13 +1164,53 @@
     </w:p>
     <w:p>
       <w:r>
-        <w:t>When PID 1 exits, the container runtime records its exit code, and kubelet uses that result along with the restartPolicy to decide whether to restart the container.</w:t>
-      </w:r>
-    </w:p>
-    <w:p/>
-    <w:p>
-      <w:r>
-        <w:t>Kubernetes stores the last applied configuration in the same live object configuration in etcd. It uses this and the actual yaml to decide how modifications need to be performed when using kubectl apply command</w:t>
+        <w:t xml:space="preserve">When PID 1 exits, the container runtime records its exit code, and </w:t>
+      </w:r>
+      <w:proofErr w:type="spellStart"/>
+      <w:r>
+        <w:t>kubelet</w:t>
+      </w:r>
+      <w:proofErr w:type="spellEnd"/>
+      <w:r>
+        <w:t xml:space="preserve"> uses that result along with the </w:t>
+      </w:r>
+      <w:proofErr w:type="spellStart"/>
+      <w:r>
+        <w:t>restartPolicy</w:t>
+      </w:r>
+      <w:proofErr w:type="spellEnd"/>
+      <w:r>
+        <w:t xml:space="preserve"> to decide whether to restart the container.</w:t>
+      </w:r>
+    </w:p>
+    <w:p/>
+    <w:p>
+      <w:r>
+        <w:t xml:space="preserve">Kubernetes stores the last applied configuration in the same live object configuration in </w:t>
+      </w:r>
+      <w:proofErr w:type="spellStart"/>
+      <w:r>
+        <w:t>etcd</w:t>
+      </w:r>
+      <w:proofErr w:type="spellEnd"/>
+      <w:r>
+        <w:t xml:space="preserve">. It uses this and the actual </w:t>
+      </w:r>
+      <w:proofErr w:type="spellStart"/>
+      <w:r>
+        <w:t>yaml</w:t>
+      </w:r>
+      <w:proofErr w:type="spellEnd"/>
+      <w:r>
+        <w:t xml:space="preserve"> to decide how modifications need to be performed when using </w:t>
+      </w:r>
+      <w:proofErr w:type="spellStart"/>
+      <w:r>
+        <w:t>kubectl</w:t>
+      </w:r>
+      <w:proofErr w:type="spellEnd"/>
+      <w:r>
+        <w:t xml:space="preserve"> apply command</w:t>
       </w:r>
       <w:r>
         <w:t>s</w:t>
@@ -897,7 +1261,15 @@
     <w:p/>
     <w:p>
       <w:r>
-        <w:t>You can manually schedule a pod using the nodeName property. It can be used</w:t>
+        <w:t xml:space="preserve">You can manually schedule a pod using the </w:t>
+      </w:r>
+      <w:proofErr w:type="spellStart"/>
+      <w:r>
+        <w:t>nodeName</w:t>
+      </w:r>
+      <w:proofErr w:type="spellEnd"/>
+      <w:r>
+        <w:t xml:space="preserve"> property. It can be used</w:t>
       </w:r>
       <w:r>
         <w:t xml:space="preserve"> in situations where s</w:t>
@@ -908,15 +1280,32 @@
     </w:p>
     <w:p/>
     <w:p>
-      <w:r>
-        <w:rPr>
-          <w:b/>
-          <w:bCs/>
-        </w:rPr>
-        <w:t>PriorityClass:</w:t>
-      </w:r>
-      <w:r>
-        <w:t xml:space="preserve"> A Kubernetes object that defines the priority of Pods. Higher-priority Pods are scheduled before lower-priority Pods and can preempt (evict) lower-priority Pods when resources are insufficient.</w:t>
+      <w:proofErr w:type="spellStart"/>
+      <w:r>
+        <w:rPr>
+          <w:b/>
+          <w:bCs/>
+        </w:rPr>
+        <w:t>PriorityClass</w:t>
+      </w:r>
+      <w:proofErr w:type="spellEnd"/>
+      <w:r>
+        <w:rPr>
+          <w:b/>
+          <w:bCs/>
+        </w:rPr>
+        <w:t>:</w:t>
+      </w:r>
+      <w:r>
+        <w:t xml:space="preserve"> A Kubernetes object that defines the priority of Pods. Higher-priority Pods are scheduled before lower-priority Pods and can </w:t>
+      </w:r>
+      <w:proofErr w:type="spellStart"/>
+      <w:r>
+        <w:t>preempt</w:t>
+      </w:r>
+      <w:proofErr w:type="spellEnd"/>
+      <w:r>
+        <w:t xml:space="preserve"> (evict) lower-priority Pods when resources are insufficient.</w:t>
       </w:r>
     </w:p>
     <w:p>
@@ -941,7 +1330,15 @@
         <w:t>-</w:t>
       </w:r>
       <w:r>
-        <w:t xml:space="preserve"> Pod has higher priority → scheduled first and can preempt lower-priority Pods. </w:t>
+        <w:t xml:space="preserve"> Pod has higher priority → scheduled first and can </w:t>
+      </w:r>
+      <w:proofErr w:type="spellStart"/>
+      <w:r>
+        <w:t>preempt</w:t>
+      </w:r>
+      <w:proofErr w:type="spellEnd"/>
+      <w:r>
+        <w:t xml:space="preserve"> lower-priority Pods. </w:t>
       </w:r>
     </w:p>
     <w:p>
@@ -966,7 +1363,15 @@
         <w:t>-</w:t>
       </w:r>
       <w:r>
-        <w:t xml:space="preserve"> Pod has lower priority → scheduled later and can be preempted by higher-priority Pods.</w:t>
+        <w:t xml:space="preserve"> Pod has lower priority → scheduled later and can be </w:t>
+      </w:r>
+      <w:proofErr w:type="spellStart"/>
+      <w:r>
+        <w:t>preempted</w:t>
+      </w:r>
+      <w:proofErr w:type="spellEnd"/>
+      <w:r>
+        <w:t xml:space="preserve"> by higher-priority Pods.</w:t>
       </w:r>
     </w:p>
     <w:p>
@@ -996,24 +1401,50 @@
           <w:numId w:val="4"/>
         </w:numPr>
       </w:pPr>
-      <w:r>
-        <w:t>preemptionPolicy: PreemptLowerPriority</w:t>
-      </w:r>
-      <w:r>
-        <w:t xml:space="preserve">  or </w:t>
-      </w:r>
-      <w:r>
-        <w:t>preemptionPolicy: Never</w:t>
+      <w:proofErr w:type="spellStart"/>
+      <w:r>
+        <w:t>preemptionPolicy</w:t>
+      </w:r>
+      <w:proofErr w:type="spellEnd"/>
+      <w:r>
+        <w:t xml:space="preserve">: </w:t>
+      </w:r>
+      <w:proofErr w:type="spellStart"/>
+      <w:proofErr w:type="gramStart"/>
+      <w:r>
+        <w:t>PreemptLowerPriority</w:t>
+      </w:r>
+      <w:proofErr w:type="spellEnd"/>
+      <w:r>
+        <w:t xml:space="preserve">  or</w:t>
+      </w:r>
+      <w:proofErr w:type="gramEnd"/>
+      <w:r>
+        <w:t xml:space="preserve"> </w:t>
+      </w:r>
+      <w:proofErr w:type="spellStart"/>
+      <w:r>
+        <w:t>preemptionPolicy</w:t>
+      </w:r>
+      <w:proofErr w:type="spellEnd"/>
+      <w:r>
+        <w:t>: Never</w:t>
       </w:r>
       <w:r>
         <w:t>s</w:t>
       </w:r>
     </w:p>
     <w:p>
+      <w:proofErr w:type="spellStart"/>
       <w:r>
         <w:lastRenderedPageBreak/>
-        <w:t xml:space="preserve">kubectl logs commands only displays the applications </w:t>
-      </w:r>
+        <w:t>kubectl</w:t>
+      </w:r>
+      <w:proofErr w:type="spellEnd"/>
+      <w:r>
+        <w:t xml:space="preserve"> logs commands only displays the applications </w:t>
+      </w:r>
+      <w:proofErr w:type="spellStart"/>
       <w:r>
         <w:rPr>
           <w:b/>
@@ -1021,6 +1452,7 @@
         </w:rPr>
         <w:t>stdout</w:t>
       </w:r>
+      <w:proofErr w:type="spellEnd"/>
       <w:r>
         <w:t xml:space="preserve"> and </w:t>
       </w:r>
@@ -1045,7 +1477,15 @@
         <w:t>logs.</w:t>
       </w:r>
       <w:r>
-        <w:t xml:space="preserve"> etc those stored in /var/</w:t>
+        <w:t xml:space="preserve"> </w:t>
+      </w:r>
+      <w:proofErr w:type="spellStart"/>
+      <w:r>
+        <w:t>etc</w:t>
+      </w:r>
+      <w:proofErr w:type="spellEnd"/>
+      <w:r>
+        <w:t xml:space="preserve"> those stored in /var/</w:t>
       </w:r>
       <w:r>
         <w:t>…</w:t>
@@ -1078,11 +1518,24 @@
     </w:p>
     <w:p>
       <w:r>
-        <w:t>Eg: “</w:t>
-      </w:r>
-      <w:r>
-        <w:t xml:space="preserve"> my-scheduler, my-scheduler-my-scheduler   Successfully assigned default/nginx to controlplan</w:t>
-      </w:r>
+        <w:t xml:space="preserve">Eg: </w:t>
+      </w:r>
+      <w:proofErr w:type="gramStart"/>
+      <w:r>
+        <w:t>“</w:t>
+      </w:r>
+      <w:r>
+        <w:t xml:space="preserve"> my</w:t>
+      </w:r>
+      <w:proofErr w:type="gramEnd"/>
+      <w:r>
+        <w:t xml:space="preserve">-scheduler, my-scheduler-my-scheduler   Successfully assigned default/nginx to </w:t>
+      </w:r>
+      <w:proofErr w:type="spellStart"/>
+      <w:r>
+        <w:t>controlplan</w:t>
+      </w:r>
+      <w:proofErr w:type="spellEnd"/>
       <w:r>
         <w:t>”</w:t>
       </w:r>
@@ -1115,7 +1568,25 @@
         <w:t>Queue → Filter → Score → Bind</w:t>
       </w:r>
       <w:r>
-        <w:t>. Queue selects a pending Pod, Filter eliminates nodes where the Pod cannot run, Score ranks the remaining nodes, and Bind assigns the Pod to the selected node. The scheduler records the selected node in the Pod object's spec.nodeName field. The kubelet on that node then starts the Pod.</w:t>
+        <w:t xml:space="preserve">. Queue selects a pending Pod, Filter eliminates nodes where the Pod cannot run, Score ranks the remaining nodes, and Bind assigns the Pod to the selected node. The scheduler records the selected node in the Pod object's </w:t>
+      </w:r>
+      <w:proofErr w:type="spellStart"/>
+      <w:proofErr w:type="gramStart"/>
+      <w:r>
+        <w:t>spec.nodeName</w:t>
+      </w:r>
+      <w:proofErr w:type="spellEnd"/>
+      <w:proofErr w:type="gramEnd"/>
+      <w:r>
+        <w:t xml:space="preserve"> field. The </w:t>
+      </w:r>
+      <w:proofErr w:type="spellStart"/>
+      <w:r>
+        <w:t>kubelet</w:t>
+      </w:r>
+      <w:proofErr w:type="spellEnd"/>
+      <w:r>
+        <w:t xml:space="preserve"> on that node then starts the Pod.</w:t>
       </w:r>
     </w:p>
     <w:p/>
@@ -1137,7 +1608,15 @@
         <w:t>Scheduler profiles</w:t>
       </w:r>
       <w:r>
-        <w:t xml:space="preserve"> are different configurations of the same kube-scheduler. Each profile can have its own </w:t>
+        <w:t xml:space="preserve"> are different configurations of the same </w:t>
+      </w:r>
+      <w:proofErr w:type="spellStart"/>
+      <w:r>
+        <w:t>kube</w:t>
+      </w:r>
+      <w:proofErr w:type="spellEnd"/>
+      <w:r>
+        <w:t xml:space="preserve">-scheduler. Each profile can have its own </w:t>
       </w:r>
       <w:r>
         <w:rPr>
@@ -1147,7 +1626,17 @@
         <w:t>scheduler plugins</w:t>
       </w:r>
       <w:r>
-        <w:t xml:space="preserve"> enabled, disabled, or configured. A Pod selects a profile using spec.schedulerName. Plugins implement scheduling logic at stages such as </w:t>
+        <w:t xml:space="preserve"> enabled, disabled, or configured. A Pod selects a profile using </w:t>
+      </w:r>
+      <w:proofErr w:type="spellStart"/>
+      <w:proofErr w:type="gramStart"/>
+      <w:r>
+        <w:t>spec.schedulerName</w:t>
+      </w:r>
+      <w:proofErr w:type="spellEnd"/>
+      <w:proofErr w:type="gramEnd"/>
+      <w:r>
+        <w:t xml:space="preserve">. Plugins implement scheduling logic at stages such as </w:t>
       </w:r>
       <w:r>
         <w:rPr>
@@ -1199,7 +1688,15 @@
         <w:t>Admission Controller</w:t>
       </w:r>
       <w:r>
-        <w:t xml:space="preserve"> intercepts API requests after authentication and authorization but before the object is stored in etcd. It can </w:t>
+        <w:t xml:space="preserve"> intercepts API requests after authentication and authorization but before the object is stored in </w:t>
+      </w:r>
+      <w:proofErr w:type="spellStart"/>
+      <w:r>
+        <w:t>etcd</w:t>
+      </w:r>
+      <w:proofErr w:type="spellEnd"/>
+      <w:r>
+        <w:t xml:space="preserve">. It can </w:t>
       </w:r>
       <w:r>
         <w:rPr>
@@ -1228,7 +1725,16 @@
           <w:b/>
           <w:bCs/>
         </w:rPr>
-        <w:t>How Kubernetes determine to allow or deny:</w:t>
+        <w:t xml:space="preserve">How Kubernetes determine to allow or </w:t>
+      </w:r>
+      <w:proofErr w:type="spellStart"/>
+      <w:proofErr w:type="gramStart"/>
+      <w:r>
+        <w:rPr>
+          <w:b/>
+          <w:bCs/>
+        </w:rPr>
+        <w:t>deny:</w:t>
       </w:r>
       <w:r>
         <w:rPr>
@@ -1237,11 +1743,59 @@
         </w:rPr>
         <w:t>s</w:t>
       </w:r>
+      <w:proofErr w:type="spellEnd"/>
+      <w:proofErr w:type="gramEnd"/>
     </w:p>
     <w:p>
       <w:r>
         <w:lastRenderedPageBreak/>
-        <w:t>The ImagePolicyWebhook sends information about the requested container image to an external webhook. The webhook performs its own policy logic and then returns an ImageReview response. Kubernetes does not care how the webhook makes its decision; it expects the decision in the status.allowed field. status.allowed: true allows the image, while status.allowed: false rejects it.</w:t>
+        <w:t xml:space="preserve">The </w:t>
+      </w:r>
+      <w:proofErr w:type="spellStart"/>
+      <w:r>
+        <w:t>ImagePolicyWebhook</w:t>
+      </w:r>
+      <w:proofErr w:type="spellEnd"/>
+      <w:r>
+        <w:t xml:space="preserve"> sends information about the requested container image to an external webhook. The webhook performs its own policy logic and then returns an </w:t>
+      </w:r>
+      <w:proofErr w:type="spellStart"/>
+      <w:r>
+        <w:t>ImageReview</w:t>
+      </w:r>
+      <w:proofErr w:type="spellEnd"/>
+      <w:r>
+        <w:t xml:space="preserve"> response. Kubernetes does not care how the webhook makes its decision; it expects the decision in the </w:t>
+      </w:r>
+      <w:proofErr w:type="spellStart"/>
+      <w:proofErr w:type="gramStart"/>
+      <w:r>
+        <w:t>status.allowed</w:t>
+      </w:r>
+      <w:proofErr w:type="spellEnd"/>
+      <w:proofErr w:type="gramEnd"/>
+      <w:r>
+        <w:t xml:space="preserve"> field. </w:t>
+      </w:r>
+      <w:proofErr w:type="spellStart"/>
+      <w:proofErr w:type="gramStart"/>
+      <w:r>
+        <w:t>status.allowed</w:t>
+      </w:r>
+      <w:proofErr w:type="spellEnd"/>
+      <w:proofErr w:type="gramEnd"/>
+      <w:r>
+        <w:t xml:space="preserve">: true allows the image, while </w:t>
+      </w:r>
+      <w:proofErr w:type="spellStart"/>
+      <w:proofErr w:type="gramStart"/>
+      <w:r>
+        <w:t>status.allowed</w:t>
+      </w:r>
+      <w:proofErr w:type="spellEnd"/>
+      <w:proofErr w:type="gramEnd"/>
+      <w:r>
+        <w:t>: false rejects it.</w:t>
       </w:r>
     </w:p>
     <w:p/>
@@ -1282,7 +1836,23 @@
     </w:p>
     <w:p>
       <w:r>
-        <w:t>Shell form: ENTRYPOINT command — runs through /bin/sh -c. CMD and runtime arguments are not passed to the entrypoint command in the normal way. Useful when shell features such as &amp;&amp;, pipes, or variable expansion are required.</w:t>
+        <w:t>Shell form: ENTRYPOINT command — runs through /bin/</w:t>
+      </w:r>
+      <w:proofErr w:type="spellStart"/>
+      <w:r>
+        <w:t>sh</w:t>
+      </w:r>
+      <w:proofErr w:type="spellEnd"/>
+      <w:r>
+        <w:t xml:space="preserve"> -c. CMD and runtime arguments are not passed to the </w:t>
+      </w:r>
+      <w:proofErr w:type="spellStart"/>
+      <w:r>
+        <w:t>entrypoint</w:t>
+      </w:r>
+      <w:proofErr w:type="spellEnd"/>
+      <w:r>
+        <w:t xml:space="preserve"> command in the normal way. Useful when shell features such as &amp;&amp;, pipes, or variable expansion are required.</w:t>
       </w:r>
     </w:p>
     <w:p>
@@ -1315,22 +1885,55 @@
     <w:p/>
     <w:p>
       <w:r>
-        <w:t xml:space="preserve">To over ride an entry point, use the  </w:t>
-      </w:r>
-      <w:r>
-        <w:rPr>
-          <w:b/>
-          <w:bCs/>
-        </w:rPr>
-        <w:t>“--entrypoint”</w:t>
+        <w:t xml:space="preserve">To over ride an entry point, use </w:t>
+      </w:r>
+      <w:proofErr w:type="gramStart"/>
+      <w:r>
+        <w:t xml:space="preserve">the  </w:t>
+      </w:r>
+      <w:r>
+        <w:rPr>
+          <w:b/>
+          <w:bCs/>
+        </w:rPr>
+        <w:t>“</w:t>
+      </w:r>
+      <w:proofErr w:type="gramEnd"/>
+      <w:r>
+        <w:rPr>
+          <w:b/>
+          <w:bCs/>
+        </w:rPr>
+        <w:t>--</w:t>
+      </w:r>
+      <w:proofErr w:type="spellStart"/>
+      <w:r>
+        <w:rPr>
+          <w:b/>
+          <w:bCs/>
+        </w:rPr>
+        <w:t>entrypoint</w:t>
+      </w:r>
+      <w:proofErr w:type="spellEnd"/>
+      <w:r>
+        <w:rPr>
+          <w:b/>
+          <w:bCs/>
+        </w:rPr>
+        <w:t>”</w:t>
       </w:r>
       <w:r>
         <w:t xml:space="preserve"> flag.</w:t>
       </w:r>
     </w:p>
     <w:p>
-      <w:r>
-        <w:t xml:space="preserve">eg: </w:t>
+      <w:proofErr w:type="spellStart"/>
+      <w:r>
+        <w:t>eg</w:t>
+      </w:r>
+      <w:proofErr w:type="spellEnd"/>
+      <w:r>
+        <w:t xml:space="preserve">: </w:t>
       </w:r>
       <w:r>
         <w:t xml:space="preserve">docker run </w:t>
@@ -1340,17 +1943,47 @@
           <w:b/>
           <w:bCs/>
         </w:rPr>
-        <w:t>--entrypoint</w:t>
-      </w:r>
-      <w:r>
-        <w:t xml:space="preserve"> ls image</w:t>
-      </w:r>
-      <w:r>
-        <w:t xml:space="preserve">  # This override the default entry point with ls</w:t>
+        <w:t>--</w:t>
+      </w:r>
+      <w:proofErr w:type="spellStart"/>
+      <w:r>
+        <w:rPr>
+          <w:b/>
+          <w:bCs/>
+        </w:rPr>
+        <w:t>entrypoint</w:t>
+      </w:r>
+      <w:proofErr w:type="spellEnd"/>
+      <w:r>
+        <w:t xml:space="preserve"> ls </w:t>
+      </w:r>
+      <w:proofErr w:type="gramStart"/>
+      <w:r>
+        <w:t>image</w:t>
+      </w:r>
+      <w:r>
+        <w:t xml:space="preserve">  #</w:t>
+      </w:r>
+      <w:proofErr w:type="gramEnd"/>
+      <w:r>
+        <w:t xml:space="preserve"> This </w:t>
+      </w:r>
+      <w:proofErr w:type="gramStart"/>
+      <w:r>
+        <w:t>override</w:t>
+      </w:r>
+      <w:proofErr w:type="gramEnd"/>
+      <w:r>
+        <w:t xml:space="preserve"> the default entry point with </w:t>
+      </w:r>
+      <w:proofErr w:type="spellStart"/>
+      <w:r>
+        <w:t>ls</w:t>
       </w:r>
       <w:r>
         <w:t>s</w:t>
       </w:r>
+      <w:proofErr w:type="spellEnd"/>
     </w:p>
     <w:p/>
     <w:p>
@@ -1421,6 +2054,8 @@
         </w:rPr>
         <w:t xml:space="preserve"> </w:t>
       </w:r>
+      <w:proofErr w:type="spellStart"/>
+      <w:proofErr w:type="gramStart"/>
       <w:r>
         <w:rPr>
           <w:b/>
@@ -1428,8 +2063,13 @@
         </w:rPr>
         <w:t>args</w:t>
       </w:r>
-      <w:r>
-        <w:t xml:space="preserve">  # This is the argument passed to the entry point. This will be appended as an argument to entry point</w:t>
+      <w:proofErr w:type="spellEnd"/>
+      <w:r>
+        <w:t xml:space="preserve">  #</w:t>
+      </w:r>
+      <w:proofErr w:type="gramEnd"/>
+      <w:r>
+        <w:t xml:space="preserve"> This is the argument passed to the entry point. This will be appended as an argument to entry point</w:t>
       </w:r>
     </w:p>
     <w:p/>
@@ -1448,16 +2088,57 @@
           <w:bCs/>
         </w:rPr>
         <w:lastRenderedPageBreak/>
-        <w:t>Difference between kubectl create vs kubectl apply</w:t>
-      </w:r>
-    </w:p>
-    <w:p>
-      <w:r>
-        <w:rPr>
-          <w:b/>
-          <w:bCs/>
-        </w:rPr>
-        <w:t>kubectl create</w:t>
+        <w:t xml:space="preserve">Difference between </w:t>
+      </w:r>
+      <w:proofErr w:type="spellStart"/>
+      <w:r>
+        <w:rPr>
+          <w:b/>
+          <w:bCs/>
+        </w:rPr>
+        <w:t>kubectl</w:t>
+      </w:r>
+      <w:proofErr w:type="spellEnd"/>
+      <w:r>
+        <w:rPr>
+          <w:b/>
+          <w:bCs/>
+        </w:rPr>
+        <w:t xml:space="preserve"> create vs </w:t>
+      </w:r>
+      <w:proofErr w:type="spellStart"/>
+      <w:r>
+        <w:rPr>
+          <w:b/>
+          <w:bCs/>
+        </w:rPr>
+        <w:t>kubectl</w:t>
+      </w:r>
+      <w:proofErr w:type="spellEnd"/>
+      <w:r>
+        <w:rPr>
+          <w:b/>
+          <w:bCs/>
+        </w:rPr>
+        <w:t xml:space="preserve"> apply</w:t>
+      </w:r>
+    </w:p>
+    <w:p>
+      <w:proofErr w:type="spellStart"/>
+      <w:r>
+        <w:rPr>
+          <w:b/>
+          <w:bCs/>
+        </w:rPr>
+        <w:t>kubectl</w:t>
+      </w:r>
+      <w:proofErr w:type="spellEnd"/>
+      <w:r>
+        <w:rPr>
+          <w:b/>
+          <w:bCs/>
+        </w:rPr>
+        <w:t xml:space="preserve"> create</w:t>
       </w:r>
       <w:r>
         <w:t xml:space="preserve"> </w:t>
@@ -1470,12 +2151,21 @@
       </w:r>
     </w:p>
     <w:p>
-      <w:r>
-        <w:rPr>
-          <w:b/>
-          <w:bCs/>
-        </w:rPr>
-        <w:t>kubectl apply</w:t>
+      <w:proofErr w:type="spellStart"/>
+      <w:r>
+        <w:rPr>
+          <w:b/>
+          <w:bCs/>
+        </w:rPr>
+        <w:t>kubectl</w:t>
+      </w:r>
+      <w:proofErr w:type="spellEnd"/>
+      <w:r>
+        <w:rPr>
+          <w:b/>
+          <w:bCs/>
+        </w:rPr>
+        <w:t xml:space="preserve"> apply</w:t>
       </w:r>
       <w:r>
         <w:t xml:space="preserve"> </w:t>
@@ -1510,20 +2200,54 @@
     </w:p>
     <w:p>
       <w:r>
-        <w:t>It gets metrics from kubelets, which expose cAdvisor derived container metrics.</w:t>
-      </w:r>
-    </w:p>
-    <w:p/>
-    <w:p>
-      <w:r>
-        <w:rPr>
-          <w:b/>
-          <w:bCs/>
-        </w:rPr>
+        <w:t xml:space="preserve">It gets metrics from </w:t>
+      </w:r>
+      <w:proofErr w:type="spellStart"/>
+      <w:r>
+        <w:t>kubelets</w:t>
+      </w:r>
+      <w:proofErr w:type="spellEnd"/>
+      <w:r>
+        <w:t xml:space="preserve">, which expose </w:t>
+      </w:r>
+      <w:proofErr w:type="spellStart"/>
+      <w:r>
         <w:t>cAdvisor</w:t>
       </w:r>
-      <w:r>
-        <w:t xml:space="preserve"> is part of kubelet and collects container resource metrics. Metrics Server collects metrics from kubelets and provides them through the Kubernetes Metrics API.</w:t>
+      <w:proofErr w:type="spellEnd"/>
+      <w:r>
+        <w:t xml:space="preserve"> derived container metrics.</w:t>
+      </w:r>
+    </w:p>
+    <w:p/>
+    <w:p>
+      <w:proofErr w:type="spellStart"/>
+      <w:r>
+        <w:rPr>
+          <w:b/>
+          <w:bCs/>
+        </w:rPr>
+        <w:t>cAdvisor</w:t>
+      </w:r>
+      <w:proofErr w:type="spellEnd"/>
+      <w:r>
+        <w:t xml:space="preserve"> is part of </w:t>
+      </w:r>
+      <w:proofErr w:type="spellStart"/>
+      <w:r>
+        <w:t>kubelet</w:t>
+      </w:r>
+      <w:proofErr w:type="spellEnd"/>
+      <w:r>
+        <w:t xml:space="preserve"> and collects container resource metrics. Metrics Server collects metrics from </w:t>
+      </w:r>
+      <w:proofErr w:type="spellStart"/>
+      <w:r>
+        <w:t>kubelets</w:t>
+      </w:r>
+      <w:proofErr w:type="spellEnd"/>
+      <w:r>
+        <w:t xml:space="preserve"> and provides them through the Kubernetes Metrics API.</w:t>
       </w:r>
     </w:p>
     <w:p>
@@ -1532,13 +2256,26 @@
       </w:r>
     </w:p>
     <w:p>
-      <w:r>
-        <w:t>kubectl top pods</w:t>
-      </w:r>
-    </w:p>
-    <w:p>
-      <w:r>
-        <w:t xml:space="preserve"> kubectl top nodes</w:t>
+      <w:proofErr w:type="spellStart"/>
+      <w:r>
+        <w:t>kubectl</w:t>
+      </w:r>
+      <w:proofErr w:type="spellEnd"/>
+      <w:r>
+        <w:t xml:space="preserve"> top pods</w:t>
+      </w:r>
+    </w:p>
+    <w:p>
+      <w:r>
+        <w:t xml:space="preserve"> </w:t>
+      </w:r>
+      <w:proofErr w:type="spellStart"/>
+      <w:r>
+        <w:t>kubectl</w:t>
+      </w:r>
+      <w:proofErr w:type="spellEnd"/>
+      <w:r>
+        <w:t xml:space="preserve"> top nodes</w:t>
       </w:r>
     </w:p>
     <w:p/>
@@ -1559,7 +2296,15 @@
     </w:p>
     <w:p>
       <w:r>
-        <w:t xml:space="preserve">Kubernetes does not use a single CA for all components. Most control plane components (API Server, kube-proxy, scheduler, controller-manager, admin clients) use the </w:t>
+        <w:t xml:space="preserve">Kubernetes does not use a single CA for all components. Most control plane components (API Server, </w:t>
+      </w:r>
+      <w:proofErr w:type="spellStart"/>
+      <w:r>
+        <w:t>kube</w:t>
+      </w:r>
+      <w:proofErr w:type="spellEnd"/>
+      <w:r>
+        <w:t xml:space="preserve">-proxy, scheduler, controller-manager, admin clients) use the </w:t>
       </w:r>
       <w:r>
         <w:rPr>
@@ -1662,7 +2407,31 @@
         <w:t>Sidecar Container:</w:t>
       </w:r>
       <w:r>
-        <w:t xml:space="preserve"> A restartable init container (restartPolicy: Always) that starts during Pod initialization and continues running alongside the main container.</w:t>
+        <w:t xml:space="preserve"> A </w:t>
+      </w:r>
+      <w:proofErr w:type="spellStart"/>
+      <w:r>
+        <w:t>restartable</w:t>
+      </w:r>
+      <w:proofErr w:type="spellEnd"/>
+      <w:r>
+        <w:t xml:space="preserve"> </w:t>
+      </w:r>
+      <w:proofErr w:type="spellStart"/>
+      <w:r>
+        <w:t>init</w:t>
+      </w:r>
+      <w:proofErr w:type="spellEnd"/>
+      <w:r>
+        <w:t xml:space="preserve"> container (</w:t>
+      </w:r>
+      <w:proofErr w:type="spellStart"/>
+      <w:r>
+        <w:t>restartPolicy</w:t>
+      </w:r>
+      <w:proofErr w:type="spellEnd"/>
+      <w:r>
+        <w:t>: Always) that starts during Pod initialization and continues running alongside the main container.</w:t>
       </w:r>
     </w:p>
     <w:p>
@@ -1684,12 +2453,21 @@
       <w:r>
         <w:t xml:space="preserve">This is the sidecar container. It is an </w:t>
       </w:r>
-      <w:r>
-        <w:rPr>
-          <w:b/>
-          <w:bCs/>
-        </w:rPr>
-        <w:t>init container</w:t>
+      <w:proofErr w:type="spellStart"/>
+      <w:r>
+        <w:rPr>
+          <w:b/>
+          <w:bCs/>
+        </w:rPr>
+        <w:t>init</w:t>
+      </w:r>
+      <w:proofErr w:type="spellEnd"/>
+      <w:r>
+        <w:rPr>
+          <w:b/>
+          <w:bCs/>
+        </w:rPr>
+        <w:t xml:space="preserve"> container</w:t>
       </w:r>
       <w:r>
         <w:t xml:space="preserve"> </w:t>
@@ -1702,8 +2480,17 @@
           <w:b/>
           <w:bCs/>
         </w:rPr>
-        <w:t xml:space="preserve"> restartPolicy</w:t>
-      </w:r>
+        <w:t xml:space="preserve"> </w:t>
+      </w:r>
+      <w:proofErr w:type="spellStart"/>
+      <w:r>
+        <w:rPr>
+          <w:b/>
+          <w:bCs/>
+        </w:rPr>
+        <w:t>restartPolicy</w:t>
+      </w:r>
+      <w:proofErr w:type="spellEnd"/>
       <w:r>
         <w:t xml:space="preserve"> set to </w:t>
       </w:r>
@@ -1759,18 +2546,43 @@
     </w:p>
     <w:p>
       <w:r>
-        <w:t>A sidecar is an init container with restartPolicy: Always. It starts during Pod initialization and continues running alongside the main container, restarting if it exits.</w:t>
-      </w:r>
-    </w:p>
-    <w:p/>
-    <w:p>
-      <w:r>
-        <w:rPr>
-          <w:b/>
-          <w:bCs/>
-        </w:rPr>
-        <w:t>Vertical Pod Autoscaler</w:t>
-      </w:r>
+        <w:t xml:space="preserve">A sidecar is an </w:t>
+      </w:r>
+      <w:proofErr w:type="spellStart"/>
+      <w:r>
+        <w:t>init</w:t>
+      </w:r>
+      <w:proofErr w:type="spellEnd"/>
+      <w:r>
+        <w:t xml:space="preserve"> container with </w:t>
+      </w:r>
+      <w:proofErr w:type="spellStart"/>
+      <w:r>
+        <w:t>restartPolicy</w:t>
+      </w:r>
+      <w:proofErr w:type="spellEnd"/>
+      <w:r>
+        <w:t>: Always. It starts during Pod initialization and continues running alongside the main container, restarting if it exits.</w:t>
+      </w:r>
+    </w:p>
+    <w:p/>
+    <w:p>
+      <w:r>
+        <w:rPr>
+          <w:b/>
+          <w:bCs/>
+        </w:rPr>
+        <w:t xml:space="preserve">Vertical Pod </w:t>
+      </w:r>
+      <w:proofErr w:type="spellStart"/>
+      <w:r>
+        <w:rPr>
+          <w:b/>
+          <w:bCs/>
+        </w:rPr>
+        <w:t>Autoscaler</w:t>
+      </w:r>
+      <w:proofErr w:type="spellEnd"/>
       <w:r>
         <w:t>: It is not an inbuilt resource. You have to deploy them separately.</w:t>
       </w:r>
@@ -1868,7 +2680,23 @@
           <w:b/>
           <w:bCs/>
         </w:rPr>
-        <w:t>Vertical Pod Autoscaler (VPA)</w:t>
+        <w:t xml:space="preserve">Vertical Pod </w:t>
+      </w:r>
+      <w:proofErr w:type="spellStart"/>
+      <w:r>
+        <w:rPr>
+          <w:b/>
+          <w:bCs/>
+        </w:rPr>
+        <w:t>Autoscaler</w:t>
+      </w:r>
+      <w:proofErr w:type="spellEnd"/>
+      <w:r>
+        <w:rPr>
+          <w:b/>
+          <w:bCs/>
+        </w:rPr>
+        <w:t xml:space="preserve"> (VPA)</w:t>
       </w:r>
       <w:r>
         <w:t xml:space="preserve"> automatically adjusts the CPU and memory requests/limits of Pods based on their actual usage. It is installed as a Kubernetes add-on and has three main components: the </w:t>
@@ -1901,14 +2729,24 @@
         <w:t>Admission Controller</w:t>
       </w:r>
       <w:r>
-        <w:t xml:space="preserve"> applies the recommended resources when replacement Pods are created. VPA is configured using a VerticalPodAutoscaler </w:t>
+        <w:t xml:space="preserve"> applies the recommended resources when replacement Pods are created. VPA is configured using a </w:t>
+      </w:r>
+      <w:proofErr w:type="spellStart"/>
+      <w:r>
+        <w:t>VerticalPodAutoscaler</w:t>
+      </w:r>
+      <w:proofErr w:type="spellEnd"/>
+      <w:r>
+        <w:t xml:space="preserve"> </w:t>
       </w:r>
       <w:r>
         <w:t xml:space="preserve">custom </w:t>
       </w:r>
+      <w:proofErr w:type="spellStart"/>
       <w:r>
         <w:t>resourcedefinition</w:t>
       </w:r>
+      <w:proofErr w:type="spellEnd"/>
       <w:r>
         <w:t xml:space="preserve"> </w:t>
       </w:r>
@@ -2039,24 +2877,57 @@
           <w:bCs/>
         </w:rPr>
       </w:pPr>
-      <w:r>
-        <w:rPr>
-          <w:b/>
-          <w:bCs/>
-        </w:rPr>
-        <w:t>PodDisruptionBudget (PDB)</w:t>
-      </w:r>
-    </w:p>
-    <w:p/>
-    <w:p>
-      <w:r>
-        <w:t>A PodDisruptionBudget (PDB) protects application availability during voluntary disruptions such as node draining, maintenance, and upgrades. It defines the minimum number of Pods that must remain available, preventing Kubernetes from voluntarily evicting too many Pods at the same time. For example, if an application has 3 replicas and minAvailable: 2, Kubernetes can evict one Pod, but it will not allow another voluntary eviction until the replacement Pod becomes available and the application returns to 3 available Pods.</w:t>
-      </w:r>
-    </w:p>
-    <w:p/>
-    <w:p>
-      <w:r>
-        <w:t>For example, with 3 replicas and minAvailable: 2, Kubernetes allows one Pod to be evicted during a node drain while ensuring at least 2 Pods remain available; the Deployment creates a replacement Pod and once it becomes Ready, the next Pod can be evicted.</w:t>
+      <w:proofErr w:type="spellStart"/>
+      <w:r>
+        <w:rPr>
+          <w:b/>
+          <w:bCs/>
+        </w:rPr>
+        <w:t>PodDisruptionBudget</w:t>
+      </w:r>
+      <w:proofErr w:type="spellEnd"/>
+      <w:r>
+        <w:rPr>
+          <w:b/>
+          <w:bCs/>
+        </w:rPr>
+        <w:t xml:space="preserve"> (PDB)</w:t>
+      </w:r>
+    </w:p>
+    <w:p/>
+    <w:p>
+      <w:r>
+        <w:t xml:space="preserve">A </w:t>
+      </w:r>
+      <w:proofErr w:type="spellStart"/>
+      <w:r>
+        <w:t>PodDisruptionBudget</w:t>
+      </w:r>
+      <w:proofErr w:type="spellEnd"/>
+      <w:r>
+        <w:t xml:space="preserve"> (PDB) protects application availability during voluntary disruptions such as node draining, maintenance, and upgrades. It defines the minimum number of Pods that must remain available, preventing Kubernetes from voluntarily evicting too many Pods at the same time. For example, if an application has 3 replicas and </w:t>
+      </w:r>
+      <w:proofErr w:type="spellStart"/>
+      <w:r>
+        <w:t>minAvailable</w:t>
+      </w:r>
+      <w:proofErr w:type="spellEnd"/>
+      <w:r>
+        <w:t>: 2, Kubernetes can evict one Pod, but it will not allow another voluntary eviction until the replacement Pod becomes available and the application returns to 3 available Pods.</w:t>
+      </w:r>
+    </w:p>
+    <w:p/>
+    <w:p>
+      <w:r>
+        <w:t xml:space="preserve">For example, with 3 replicas and </w:t>
+      </w:r>
+      <w:proofErr w:type="spellStart"/>
+      <w:r>
+        <w:t>minAvailable</w:t>
+      </w:r>
+      <w:proofErr w:type="spellEnd"/>
+      <w:r>
+        <w:t>: 2, Kubernetes allows one Pod to be evicted during a node drain while ensuring at least 2 Pods remain available; the Deployment creates a replacement Pod and once it becomes Ready, the next Pod can be evicted.</w:t>
       </w:r>
     </w:p>
     <w:p/>
@@ -2124,7 +2995,23 @@
     </w:p>
     <w:p>
       <w:r>
-        <w:t>With hostNetwork: true, a Pod shares the node's network namespace, so it uses the node's IP address directly. The application inside the Pod can therefore listen on the node's ports and receive traffic without a NodePort Service.</w:t>
+        <w:t xml:space="preserve">With </w:t>
+      </w:r>
+      <w:proofErr w:type="spellStart"/>
+      <w:r>
+        <w:t>hostNetwork</w:t>
+      </w:r>
+      <w:proofErr w:type="spellEnd"/>
+      <w:r>
+        <w:t xml:space="preserve">: true, a Pod shares the node's network namespace, so it uses the node's IP address directly. The application inside the Pod can therefore listen on the node's ports and receive traffic without a </w:t>
+      </w:r>
+      <w:proofErr w:type="spellStart"/>
+      <w:r>
+        <w:t>NodePort</w:t>
+      </w:r>
+      <w:proofErr w:type="spellEnd"/>
+      <w:r>
+        <w:t xml:space="preserve"> Service.</w:t>
       </w:r>
     </w:p>
     <w:p>
@@ -2134,7 +3021,23 @@
     </w:p>
     <w:p>
       <w:r>
-        <w:t>A normal Pod has its own Pod IP and network namespace, so external clients cannot normally access it through the node IP directly. NodePort provides a way to expose such normal Pods through a node IP and port without using hostNetwork.</w:t>
+        <w:t xml:space="preserve">A normal Pod has its own Pod IP and network namespace, so external clients cannot normally access it through the node IP directly. </w:t>
+      </w:r>
+      <w:proofErr w:type="spellStart"/>
+      <w:r>
+        <w:t>NodePort</w:t>
+      </w:r>
+      <w:proofErr w:type="spellEnd"/>
+      <w:r>
+        <w:t xml:space="preserve"> provides a way to expose such normal Pods through a node IP and port without using </w:t>
+      </w:r>
+      <w:proofErr w:type="spellStart"/>
+      <w:r>
+        <w:t>hostNetwork</w:t>
+      </w:r>
+      <w:proofErr w:type="spellEnd"/>
+      <w:r>
+        <w:t>.</w:t>
       </w:r>
     </w:p>
     <w:p>
@@ -2338,9 +3241,15 @@
       </w:r>
     </w:p>
     <w:p>
-      <w:r>
-        <w:t xml:space="preserve">kubectl create secret docker-registry </w:t>
-      </w:r>
+      <w:proofErr w:type="spellStart"/>
+      <w:r>
+        <w:t>kubectl</w:t>
+      </w:r>
+      <w:proofErr w:type="spellEnd"/>
+      <w:r>
+        <w:t xml:space="preserve"> create secret docker-registry </w:t>
+      </w:r>
+      <w:proofErr w:type="spellStart"/>
       <w:r>
         <w:rPr>
           <w:b/>
@@ -2348,6 +3257,7 @@
         </w:rPr>
         <w:t>regcred</w:t>
       </w:r>
+      <w:proofErr w:type="spellEnd"/>
       <w:r>
         <w:t xml:space="preserve"> \</w:t>
       </w:r>
@@ -2359,12 +3269,28 @@
     </w:p>
     <w:p>
       <w:r>
-        <w:t xml:space="preserve">  --docker-username=myuser \</w:t>
-      </w:r>
-    </w:p>
-    <w:p>
-      <w:r>
-        <w:t xml:space="preserve">  --docker-password=mypassword \</w:t>
+        <w:t xml:space="preserve">  --docker-username=</w:t>
+      </w:r>
+      <w:proofErr w:type="spellStart"/>
+      <w:r>
+        <w:t>myuser</w:t>
+      </w:r>
+      <w:proofErr w:type="spellEnd"/>
+      <w:r>
+        <w:t xml:space="preserve"> \</w:t>
+      </w:r>
+    </w:p>
+    <w:p>
+      <w:r>
+        <w:t xml:space="preserve">  --docker-password=</w:t>
+      </w:r>
+      <w:proofErr w:type="spellStart"/>
+      <w:r>
+        <w:t>mypassword</w:t>
+      </w:r>
+      <w:proofErr w:type="spellEnd"/>
+      <w:r>
+        <w:t xml:space="preserve"> \</w:t>
       </w:r>
     </w:p>
     <w:p>
@@ -2404,8 +3330,13 @@
       </w:r>
     </w:p>
     <w:p>
-      <w:r>
-        <w:t>apiVersion: v1</w:t>
+      <w:proofErr w:type="spellStart"/>
+      <w:r>
+        <w:t>apiVersion</w:t>
+      </w:r>
+      <w:proofErr w:type="spellEnd"/>
+      <w:r>
+        <w:t>: v1</w:t>
       </w:r>
     </w:p>
     <w:p>
@@ -2441,22 +3372,46 @@
     <w:p>
       <w:r>
         <w:lastRenderedPageBreak/>
-        <w:t xml:space="preserve">      image: registry.example.com/myapp:v1</w:t>
-      </w:r>
-    </w:p>
-    <w:p>
-      <w:pPr>
-        <w:rPr>
-          <w:b/>
-          <w:bCs/>
-        </w:rPr>
-      </w:pPr>
-      <w:r>
-        <w:rPr>
-          <w:b/>
-          <w:bCs/>
-        </w:rPr>
-        <w:t xml:space="preserve">  imagePullSecrets:</w:t>
+        <w:t xml:space="preserve">      image: registry.example.com/</w:t>
+      </w:r>
+      <w:proofErr w:type="gramStart"/>
+      <w:r>
+        <w:t>myapp:v</w:t>
+      </w:r>
+      <w:proofErr w:type="gramEnd"/>
+      <w:r>
+        <w:t>1</w:t>
+      </w:r>
+    </w:p>
+    <w:p>
+      <w:pPr>
+        <w:rPr>
+          <w:b/>
+          <w:bCs/>
+        </w:rPr>
+      </w:pPr>
+      <w:r>
+        <w:rPr>
+          <w:b/>
+          <w:bCs/>
+        </w:rPr>
+        <w:t xml:space="preserve">  </w:t>
+      </w:r>
+      <w:proofErr w:type="spellStart"/>
+      <w:r>
+        <w:rPr>
+          <w:b/>
+          <w:bCs/>
+        </w:rPr>
+        <w:t>imagePullSecrets</w:t>
+      </w:r>
+      <w:proofErr w:type="spellEnd"/>
+      <w:r>
+        <w:rPr>
+          <w:b/>
+          <w:bCs/>
+        </w:rPr>
+        <w:t>:</w:t>
       </w:r>
       <w:r>
         <w:rPr>
@@ -2485,16 +3440,236 @@
           <w:b/>
           <w:bCs/>
         </w:rPr>
-        <w:t xml:space="preserve">    - name: regcred</w:t>
-      </w:r>
-    </w:p>
-    <w:p/>
-    <w:p/>
-    <w:p/>
+        <w:t xml:space="preserve">    - name: </w:t>
+      </w:r>
+      <w:proofErr w:type="spellStart"/>
+      <w:r>
+        <w:rPr>
+          <w:b/>
+          <w:bCs/>
+        </w:rPr>
+        <w:t>regcred</w:t>
+      </w:r>
+      <w:proofErr w:type="spellEnd"/>
+    </w:p>
+    <w:p/>
+    <w:p/>
+    <w:p>
+      <w:pPr>
+        <w:rPr>
+          <w:b/>
+          <w:bCs/>
+        </w:rPr>
+      </w:pPr>
+      <w:r>
+        <w:rPr>
+          <w:b/>
+          <w:bCs/>
+          <w:highlight w:val="cyan"/>
+        </w:rPr>
+        <w:t>Docker and Linux Capabilities</w:t>
+      </w:r>
+    </w:p>
+    <w:p/>
+    <w:p>
+      <w:r>
+        <w:t>Linux capabilities divide the privileges traditionally held by root into smaller, specific permissions.</w:t>
+      </w:r>
+    </w:p>
+    <w:p/>
+    <w:p>
+      <w:r>
+        <w:t>Docker uses capabilities to give containers only the privileges they need instead of granting them full root-level privileges.</w:t>
+      </w:r>
+    </w:p>
+    <w:p/>
+    <w:p>
+      <w:pPr>
+        <w:rPr>
+          <w:b/>
+          <w:bCs/>
+        </w:rPr>
+      </w:pPr>
+      <w:r>
+        <w:rPr>
+          <w:b/>
+          <w:bCs/>
+        </w:rPr>
+        <w:t>Examples:</w:t>
+      </w:r>
+    </w:p>
+    <w:p>
+      <w:r>
+        <w:t>- CAP_NET_BIND_SERVICE — allows binding to ports below 1024.</w:t>
+      </w:r>
+    </w:p>
+    <w:p>
+      <w:r>
+        <w:t>- CAP_NET_ADMIN — allows network administration.</w:t>
+      </w:r>
+    </w:p>
+    <w:p>
+      <w:r>
+        <w:t>- CAP_SYS_ADMIN — grants a broad set of system administration privileges.</w:t>
+      </w:r>
+    </w:p>
+    <w:p/>
+    <w:p>
+      <w:pPr>
+        <w:rPr>
+          <w:b/>
+          <w:bCs/>
+        </w:rPr>
+      </w:pPr>
+      <w:r>
+        <w:rPr>
+          <w:b/>
+          <w:bCs/>
+        </w:rPr>
+        <w:t>Useful Docker commands:</w:t>
+      </w:r>
+    </w:p>
     <w:p>
       <w:pPr>
         <w:jc w:val="center"/>
       </w:pPr>
+    </w:p>
+    <w:p>
+      <w:r>
+        <w:t># Add a capability</w:t>
+      </w:r>
+    </w:p>
+    <w:p>
+      <w:r>
+        <w:t>docker run --cap-add NET_ADMIN nginx</w:t>
+      </w:r>
+    </w:p>
+    <w:p>
+      <w:r>
+        <w:t># Drop all capabilities</w:t>
+      </w:r>
+    </w:p>
+    <w:p>
+      <w:r>
+        <w:t>docker run --cap-drop ALL nginx</w:t>
+      </w:r>
+    </w:p>
+    <w:p>
+      <w:r>
+        <w:t># Drop all, then add only the required capability</w:t>
+      </w:r>
+    </w:p>
+    <w:p>
+      <w:r>
+        <w:t>docker run --cap-drop ALL --cap-add NET_BIND_SERVICE nginx</w:t>
+      </w:r>
+    </w:p>
+    <w:p>
+      <w:pPr>
+        <w:jc w:val="center"/>
+      </w:pPr>
+    </w:p>
+    <w:p>
+      <w:pPr>
+        <w:rPr>
+          <w:b/>
+          <w:bCs/>
+        </w:rPr>
+      </w:pPr>
+      <w:r>
+        <w:rPr>
+          <w:b/>
+          <w:bCs/>
+        </w:rPr>
+        <w:lastRenderedPageBreak/>
+        <w:t>Kubernetes equivalent:</w:t>
+      </w:r>
+    </w:p>
+    <w:p>
+      <w:proofErr w:type="spellStart"/>
+      <w:r>
+        <w:t>securityContext</w:t>
+      </w:r>
+      <w:proofErr w:type="spellEnd"/>
+      <w:r>
+        <w:t>:</w:t>
+      </w:r>
+    </w:p>
+    <w:p>
+      <w:r>
+        <w:t xml:space="preserve">  capabilities:</w:t>
+      </w:r>
+    </w:p>
+    <w:p>
+      <w:r>
+        <w:t xml:space="preserve">    drop:</w:t>
+      </w:r>
+    </w:p>
+    <w:p>
+      <w:r>
+        <w:t xml:space="preserve">      - ALL</w:t>
+      </w:r>
+    </w:p>
+    <w:p>
+      <w:r>
+        <w:t xml:space="preserve">    add:</w:t>
+      </w:r>
+    </w:p>
+    <w:p>
+      <w:r>
+        <w:t xml:space="preserve">      - NET_BIND_SERVICE</w:t>
+      </w:r>
+    </w:p>
+    <w:p>
+      <w:pPr>
+        <w:jc w:val="center"/>
+      </w:pPr>
+    </w:p>
+    <w:p>
+      <w:r>
+        <w:drawing>
+          <wp:inline distT="0" distB="0" distL="0" distR="0" wp14:anchorId="52647456" wp14:editId="72CFFBFA">
+            <wp:extent cx="4077269" cy="2429214"/>
+            <wp:effectExtent l="0" t="0" r="0" b="9525"/>
+            <wp:docPr id="1079053340" name="Picture 1"/>
+            <wp:cNvGraphicFramePr>
+              <a:graphicFrameLocks xmlns:a="http://schemas.openxmlformats.org/drawingml/2006/main" noChangeAspect="1"/>
+            </wp:cNvGraphicFramePr>
+            <a:graphic xmlns:a="http://schemas.openxmlformats.org/drawingml/2006/main">
+              <a:graphicData uri="http://schemas.openxmlformats.org/drawingml/2006/picture">
+                <pic:pic xmlns:pic="http://schemas.openxmlformats.org/drawingml/2006/picture">
+                  <pic:nvPicPr>
+                    <pic:cNvPr id="1079053340" name=""/>
+                    <pic:cNvPicPr/>
+                  </pic:nvPicPr>
+                  <pic:blipFill>
+                    <a:blip r:embed="rId16"/>
+                    <a:stretch>
+                      <a:fillRect/>
+                    </a:stretch>
+                  </pic:blipFill>
+                  <pic:spPr>
+                    <a:xfrm>
+                      <a:off x="0" y="0"/>
+                      <a:ext cx="4077269" cy="2429214"/>
+                    </a:xfrm>
+                    <a:prstGeom prst="rect">
+                      <a:avLst/>
+                    </a:prstGeom>
+                  </pic:spPr>
+                </pic:pic>
+              </a:graphicData>
+            </a:graphic>
+          </wp:inline>
+        </w:drawing>
+      </w:r>
+    </w:p>
+    <w:p/>
+    <w:p/>
+    <w:p>
+      <w:pPr>
+        <w:jc w:val="center"/>
+      </w:pPr>
       <w:r>
         <w:rPr>
           <w:b/>
@@ -2520,7 +3695,15 @@
         <w:t>default,</w:t>
       </w:r>
       <w:r>
-        <w:t xml:space="preserve"> etcd </w:t>
+        <w:t xml:space="preserve"> </w:t>
+      </w:r>
+      <w:proofErr w:type="spellStart"/>
+      <w:r>
+        <w:t>etcd</w:t>
+      </w:r>
+      <w:proofErr w:type="spellEnd"/>
+      <w:r>
+        <w:t xml:space="preserve"> </w:t>
       </w:r>
       <w:r>
         <w:rPr>
@@ -2548,6 +3731,7 @@
         <w:rPr>
           <w:noProof/>
         </w:rPr>
+        <w:lastRenderedPageBreak/>
         <w:drawing>
           <wp:inline distT="0" distB="0" distL="0" distR="0" wp14:anchorId="28C8B639" wp14:editId="555A1D94">
             <wp:extent cx="5943600" cy="1991995"/>
@@ -2564,7 +3748,7 @@
                     <pic:cNvPicPr/>
                   </pic:nvPicPr>
                   <pic:blipFill>
-                    <a:blip r:embed="rId16"/>
+                    <a:blip r:embed="rId17"/>
                     <a:stretch>
                       <a:fillRect/>
                     </a:stretch>
@@ -2588,7 +3772,31 @@
     <w:p/>
     <w:p>
       <w:r>
-        <w:t>ETCD stores Kubernetes objects as raw bytes (protobuf format). In a hexdump, the left side shows the actual hexadecimal byte values, while the right side shows their ASCII representation. Printable bytes appear as text, and non-printable protobuf metadata is displayed as dots (.).</w:t>
+        <w:t>ETCD stores Kubernetes objects as raw bytes (</w:t>
+      </w:r>
+      <w:proofErr w:type="spellStart"/>
+      <w:r>
+        <w:t>protobuf</w:t>
+      </w:r>
+      <w:proofErr w:type="spellEnd"/>
+      <w:r>
+        <w:t xml:space="preserve"> format). In a </w:t>
+      </w:r>
+      <w:proofErr w:type="spellStart"/>
+      <w:r>
+        <w:t>hexdump</w:t>
+      </w:r>
+      <w:proofErr w:type="spellEnd"/>
+      <w:r>
+        <w:t xml:space="preserve">, the left side shows the actual hexadecimal byte values, while the right side shows their ASCII representation. Printable bytes appear as text, and non-printable </w:t>
+      </w:r>
+      <w:proofErr w:type="spellStart"/>
+      <w:r>
+        <w:t>protobuf</w:t>
+      </w:r>
+      <w:proofErr w:type="spellEnd"/>
+      <w:r>
+        <w:t xml:space="preserve"> metadata is displayed as dots (.).</w:t>
       </w:r>
     </w:p>
     <w:p>
@@ -2604,7 +3812,15 @@
         <w:t xml:space="preserve"> </w:t>
       </w:r>
       <w:r>
-        <w:t>Enabling Encryption at Rest does not automatically encrypt existing data in etcd. Only newly created or updated resources are encrypted. Existing resources must be rewritten (updated/recreated) to be stored in encrypted form.</w:t>
+        <w:t xml:space="preserve">Enabling Encryption at Rest does not automatically encrypt existing data in </w:t>
+      </w:r>
+      <w:proofErr w:type="spellStart"/>
+      <w:r>
+        <w:t>etcd</w:t>
+      </w:r>
+      <w:proofErr w:type="spellEnd"/>
+      <w:r>
+        <w:t>. Only newly created or updated resources are encrypted. Existing resources must be rewritten (updated/recreated) to be stored in encrypted form.</w:t>
       </w:r>
     </w:p>
     <w:p>
@@ -2633,7 +3849,7 @@
                     <pic:cNvPicPr/>
                   </pic:nvPicPr>
                   <pic:blipFill>
-                    <a:blip r:embed="rId17"/>
+                    <a:blip r:embed="rId18"/>
                     <a:stretch>
                       <a:fillRect/>
                     </a:stretch>
@@ -2656,43 +3872,83 @@
     </w:p>
     <w:p>
       <w:r>
-        <w:t>It gets the yaml and passes it to kubectl replace -f command: it will recreate the resource.</w:t>
+        <w:t xml:space="preserve">It gets the </w:t>
+      </w:r>
+      <w:proofErr w:type="spellStart"/>
+      <w:r>
+        <w:t>yaml</w:t>
+      </w:r>
+      <w:proofErr w:type="spellEnd"/>
+      <w:r>
+        <w:t xml:space="preserve"> and passes it to </w:t>
+      </w:r>
+      <w:proofErr w:type="spellStart"/>
+      <w:r>
+        <w:t>kubectl</w:t>
+      </w:r>
+      <w:proofErr w:type="spellEnd"/>
+      <w:r>
+        <w:t xml:space="preserve"> replace -f command: it will recreate the resource.</w:t>
+      </w:r>
+    </w:p>
+    <w:p>
+      <w:r>
+        <w:t xml:space="preserve">When Encryption at Rest is enabled, back up both the ETCD snapshot and the </w:t>
+      </w:r>
+      <w:proofErr w:type="spellStart"/>
+      <w:r>
+        <w:t>EncryptionConfiguration</w:t>
+      </w:r>
+      <w:proofErr w:type="spellEnd"/>
+      <w:r>
+        <w:t xml:space="preserve"> (including encryption keys). Without the original key, encrypted data in ETCD cannot be decrypted after a restore.</w:t>
+      </w:r>
+    </w:p>
+    <w:p>
+      <w:r>
+        <w:t xml:space="preserve">Never replace an encryption key directly. Add the new key alongside the old key for key rotation. If the original encryption key is lost and no backup exists, Kubernetes may be unable to decrypt previously encrypted Secrets stored in </w:t>
+      </w:r>
+      <w:proofErr w:type="spellStart"/>
+      <w:r>
+        <w:t>etcd</w:t>
+      </w:r>
+      <w:proofErr w:type="spellEnd"/>
+      <w:r>
+        <w:t>.</w:t>
+      </w:r>
+    </w:p>
+    <w:p/>
+    <w:p/>
+    <w:p/>
+    <w:p>
+      <w:pPr>
+        <w:jc w:val="center"/>
+        <w:rPr>
+          <w:b/>
+          <w:bCs/>
+        </w:rPr>
+      </w:pPr>
+      <w:r>
+        <w:rPr>
+          <w:b/>
+          <w:bCs/>
+          <w:highlight w:val="yellow"/>
+        </w:rPr>
+        <w:t>CONFIGMAPS</w:t>
       </w:r>
     </w:p>
     <w:p>
       <w:r>
         <w:lastRenderedPageBreak/>
-        <w:t>When Encryption at Rest is enabled, back up both the ETCD snapshot and the EncryptionConfiguration (including encryption keys). Without the original key, encrypted data in ETCD cannot be decrypted after a restore.</w:t>
-      </w:r>
-    </w:p>
-    <w:p>
-      <w:r>
-        <w:t>Never replace an encryption key directly. Add the new key alongside the old key for key rotation. If the original encryption key is lost and no backup exists, Kubernetes may be unable to decrypt previously encrypted Secrets stored in etcd.</w:t>
-      </w:r>
-    </w:p>
-    <w:p/>
-    <w:p/>
-    <w:p/>
-    <w:p>
-      <w:pPr>
-        <w:jc w:val="center"/>
-        <w:rPr>
-          <w:b/>
-          <w:bCs/>
-        </w:rPr>
-      </w:pPr>
-      <w:r>
-        <w:rPr>
-          <w:b/>
-          <w:bCs/>
-          <w:highlight w:val="yellow"/>
-        </w:rPr>
-        <w:t>CONFIGMAPS</w:t>
-      </w:r>
-    </w:p>
-    <w:p>
-      <w:r>
-        <w:t>A ConfigMap stores non-sensitive configuration data for applications, such as environment variables, configuration files, or command-line arguments.</w:t>
+        <w:t xml:space="preserve">A </w:t>
+      </w:r>
+      <w:proofErr w:type="spellStart"/>
+      <w:r>
+        <w:t>ConfigMap</w:t>
+      </w:r>
+      <w:proofErr w:type="spellEnd"/>
+      <w:r>
+        <w:t xml:space="preserve"> stores non-sensitive configuration data for applications, such as environment variables, configuration files, or command-line arguments.</w:t>
       </w:r>
     </w:p>
     <w:p>
@@ -2727,8 +3983,21 @@
       </w:r>
     </w:p>
     <w:p>
-      <w:r>
-        <w:t>kubectl create configmap app-config --from-literal=APP_COLOR=blue</w:t>
+      <w:proofErr w:type="spellStart"/>
+      <w:r>
+        <w:t>kubectl</w:t>
+      </w:r>
+      <w:proofErr w:type="spellEnd"/>
+      <w:r>
+        <w:t xml:space="preserve"> create </w:t>
+      </w:r>
+      <w:proofErr w:type="spellStart"/>
+      <w:r>
+        <w:t>configmap</w:t>
+      </w:r>
+      <w:proofErr w:type="spellEnd"/>
+      <w:r>
+        <w:t xml:space="preserve"> app-config --from-literal=APP_COLOR=blue</w:t>
       </w:r>
     </w:p>
     <w:p/>
@@ -2753,8 +4022,21 @@
       </w:r>
     </w:p>
     <w:p>
-      <w:r>
-        <w:t>kubectl create configmap app-config --from-file=config.txt</w:t>
+      <w:proofErr w:type="spellStart"/>
+      <w:r>
+        <w:t>kubectl</w:t>
+      </w:r>
+      <w:proofErr w:type="spellEnd"/>
+      <w:r>
+        <w:t xml:space="preserve"> create </w:t>
+      </w:r>
+      <w:proofErr w:type="spellStart"/>
+      <w:r>
+        <w:t>configmap</w:t>
+      </w:r>
+      <w:proofErr w:type="spellEnd"/>
+      <w:r>
+        <w:t xml:space="preserve"> app-config --from-file=config.txt</w:t>
       </w:r>
     </w:p>
     <w:p/>
@@ -2779,9 +4061,27 @@
       </w:r>
     </w:p>
     <w:p>
-      <w:r>
-        <w:t>kubectl create configmap app-config --from-env-file=app.env</w:t>
-      </w:r>
+      <w:proofErr w:type="spellStart"/>
+      <w:r>
+        <w:t>kubectl</w:t>
+      </w:r>
+      <w:proofErr w:type="spellEnd"/>
+      <w:r>
+        <w:t xml:space="preserve"> create </w:t>
+      </w:r>
+      <w:proofErr w:type="spellStart"/>
+      <w:r>
+        <w:t>configmap</w:t>
+      </w:r>
+      <w:proofErr w:type="spellEnd"/>
+      <w:r>
+        <w:t xml:space="preserve"> app-config --from-env-file=</w:t>
+      </w:r>
+      <w:proofErr w:type="spellStart"/>
+      <w:r>
+        <w:t>app.env</w:t>
+      </w:r>
+      <w:proofErr w:type="spellEnd"/>
     </w:p>
     <w:p/>
     <w:p>
@@ -2825,7 +4125,7 @@
                     <pic:cNvPicPr/>
                   </pic:nvPicPr>
                   <pic:blipFill>
-                    <a:blip r:embed="rId18"/>
+                    <a:blip r:embed="rId19"/>
                     <a:stretch>
                       <a:fillRect/>
                     </a:stretch>
@@ -2859,8 +4159,17 @@
           <w:b/>
           <w:bCs/>
         </w:rPr>
-        <w:t>injecting a ConfigMap</w:t>
-      </w:r>
+        <w:t xml:space="preserve">injecting a </w:t>
+      </w:r>
+      <w:proofErr w:type="spellStart"/>
+      <w:r>
+        <w:rPr>
+          <w:b/>
+          <w:bCs/>
+        </w:rPr>
+        <w:t>ConfigMap</w:t>
+      </w:r>
+      <w:proofErr w:type="spellEnd"/>
       <w:r>
         <w:t xml:space="preserve">, it is specified at the </w:t>
       </w:r>
@@ -2876,8 +4185,21 @@
       </w:r>
     </w:p>
     <w:p>
-      <w:r>
-        <w:t xml:space="preserve">ConfigMap can be consumed through environment variables, command/args, or a </w:t>
+      <w:proofErr w:type="spellStart"/>
+      <w:r>
+        <w:t>ConfigMap</w:t>
+      </w:r>
+      <w:proofErr w:type="spellEnd"/>
+      <w:r>
+        <w:t xml:space="preserve"> can be consumed through environment variables, command/</w:t>
+      </w:r>
+      <w:proofErr w:type="spellStart"/>
+      <w:r>
+        <w:t>args</w:t>
+      </w:r>
+      <w:proofErr w:type="spellEnd"/>
+      <w:r>
+        <w:t xml:space="preserve">, or a </w:t>
       </w:r>
       <w:r>
         <w:rPr>
@@ -2887,13 +4209,35 @@
         <w:t>volume</w:t>
       </w:r>
       <w:r>
-        <w:t>. Workloads like Deployments and StatefulSets use ConfigMaps through their Pod templates.</w:t>
-      </w:r>
-    </w:p>
-    <w:p>
-      <w:r>
-        <w:t xml:space="preserve">configMapKeyRef </w:t>
-      </w:r>
+        <w:t xml:space="preserve">. Workloads like Deployments and </w:t>
+      </w:r>
+      <w:proofErr w:type="spellStart"/>
+      <w:r>
+        <w:t>StatefulSets</w:t>
+      </w:r>
+      <w:proofErr w:type="spellEnd"/>
+      <w:r>
+        <w:t xml:space="preserve"> use </w:t>
+      </w:r>
+      <w:proofErr w:type="spellStart"/>
+      <w:r>
+        <w:t>ConfigMaps</w:t>
+      </w:r>
+      <w:proofErr w:type="spellEnd"/>
+      <w:r>
+        <w:t xml:space="preserve"> through their Pod templates.</w:t>
+      </w:r>
+    </w:p>
+    <w:p>
+      <w:proofErr w:type="spellStart"/>
+      <w:r>
+        <w:t>configMapKeyRef</w:t>
+      </w:r>
+      <w:proofErr w:type="spellEnd"/>
+      <w:r>
+        <w:t xml:space="preserve"> </w:t>
+      </w:r>
+      <w:proofErr w:type="gramStart"/>
       <w:r>
         <w:t>-</w:t>
       </w:r>
@@ -2901,18 +4245,32 @@
         <w:t xml:space="preserve"> </w:t>
       </w:r>
       <w:r>
-        <w:t xml:space="preserve"> Inject </w:t>
+        <w:t xml:space="preserve"> Inject</w:t>
+      </w:r>
+      <w:proofErr w:type="gramEnd"/>
+      <w:r>
+        <w:t xml:space="preserve"> </w:t>
       </w:r>
       <w:r>
         <w:t xml:space="preserve">specific key </w:t>
       </w:r>
     </w:p>
     <w:p>
-      <w:r>
-        <w:t xml:space="preserve">configMapRef </w:t>
-      </w:r>
-      <w:r>
-        <w:t xml:space="preserve">-  Inject </w:t>
+      <w:proofErr w:type="spellStart"/>
+      <w:r>
+        <w:t>configMapRef</w:t>
+      </w:r>
+      <w:proofErr w:type="spellEnd"/>
+      <w:r>
+        <w:t xml:space="preserve"> </w:t>
+      </w:r>
+      <w:proofErr w:type="gramStart"/>
+      <w:r>
+        <w:t>-  Inject</w:t>
+      </w:r>
+      <w:proofErr w:type="gramEnd"/>
+      <w:r>
+        <w:t xml:space="preserve"> </w:t>
       </w:r>
       <w:r>
         <w:t>all keys</w:t>
@@ -2970,7 +4328,15 @@
         <w:t>Base64-encoded</w:t>
       </w:r>
       <w:r>
-        <w:t xml:space="preserve"> values, while stringData accepts </w:t>
+        <w:t xml:space="preserve"> values, while </w:t>
+      </w:r>
+      <w:proofErr w:type="spellStart"/>
+      <w:r>
+        <w:t>stringData</w:t>
+      </w:r>
+      <w:proofErr w:type="spellEnd"/>
+      <w:r>
+        <w:t xml:space="preserve"> accepts </w:t>
       </w:r>
       <w:r>
         <w:rPr>
@@ -3033,7 +4399,7 @@
                     <pic:cNvPicPr/>
                   </pic:nvPicPr>
                   <pic:blipFill>
-                    <a:blip r:embed="rId19"/>
+                    <a:blip r:embed="rId20"/>
                     <a:stretch>
                       <a:fillRect/>
                     </a:stretch>
@@ -3063,7 +4429,15 @@
         <w:t>Declarative: (</w:t>
       </w:r>
       <w:r>
-        <w:t xml:space="preserve">Using stringData </w:t>
+        <w:t xml:space="preserve">Using </w:t>
+      </w:r>
+      <w:proofErr w:type="spellStart"/>
+      <w:r>
+        <w:t>stringData</w:t>
+      </w:r>
+      <w:proofErr w:type="spellEnd"/>
+      <w:r>
+        <w:t xml:space="preserve"> </w:t>
       </w:r>
       <w:r>
         <w:t xml:space="preserve">- </w:t>
@@ -3080,7 +4454,6 @@
         <w:rPr>
           <w:noProof/>
         </w:rPr>
-        <w:lastRenderedPageBreak/>
         <w:drawing>
           <wp:inline distT="0" distB="0" distL="0" distR="0" wp14:anchorId="43D8ABF3" wp14:editId="6A496057">
             <wp:extent cx="2172003" cy="1657581"/>
@@ -3097,7 +4470,7 @@
                     <pic:cNvPicPr/>
                   </pic:nvPicPr>
                   <pic:blipFill>
-                    <a:blip r:embed="rId20"/>
+                    <a:blip r:embed="rId21"/>
                     <a:stretch>
                       <a:fillRect/>
                     </a:stretch>
@@ -3129,6 +4502,7 @@
         <w:rPr>
           <w:noProof/>
         </w:rPr>
+        <w:lastRenderedPageBreak/>
         <w:drawing>
           <wp:inline distT="0" distB="0" distL="0" distR="0" wp14:anchorId="508BC2A4" wp14:editId="1CB6EF10">
             <wp:extent cx="2314898" cy="1581371"/>
@@ -3145,7 +4519,7 @@
                     <pic:cNvPicPr/>
                   </pic:nvPicPr>
                   <pic:blipFill>
-                    <a:blip r:embed="rId21"/>
+                    <a:blip r:embed="rId22"/>
                     <a:stretch>
                       <a:fillRect/>
                     </a:stretch>
@@ -3230,7 +4604,23 @@
           <w:b/>
           <w:bCs/>
         </w:rPr>
-        <w:t>Way kubernetes handles secrets:</w:t>
+        <w:t xml:space="preserve">Way </w:t>
+      </w:r>
+      <w:proofErr w:type="spellStart"/>
+      <w:r>
+        <w:rPr>
+          <w:b/>
+          <w:bCs/>
+        </w:rPr>
+        <w:t>kubernetes</w:t>
+      </w:r>
+      <w:proofErr w:type="spellEnd"/>
+      <w:r>
+        <w:rPr>
+          <w:b/>
+          <w:bCs/>
+        </w:rPr>
+        <w:t xml:space="preserve"> handles secrets:</w:t>
       </w:r>
     </w:p>
     <w:p>
@@ -3253,8 +4643,21 @@
           <w:numId w:val="9"/>
         </w:numPr>
       </w:pPr>
-      <w:r>
-        <w:t>Kubelet stores the secret into a tmpfs so that the secret is not written to disk storage.</w:t>
+      <w:proofErr w:type="spellStart"/>
+      <w:r>
+        <w:t>Kubelet</w:t>
+      </w:r>
+      <w:proofErr w:type="spellEnd"/>
+      <w:r>
+        <w:t xml:space="preserve"> stores the secret into a </w:t>
+      </w:r>
+      <w:proofErr w:type="spellStart"/>
+      <w:r>
+        <w:t>tmpfs</w:t>
+      </w:r>
+      <w:proofErr w:type="spellEnd"/>
+      <w:r>
+        <w:t xml:space="preserve"> so that the secret is not written to disk storage.</w:t>
       </w:r>
     </w:p>
     <w:p>
@@ -3266,7 +4669,15 @@
         </w:numPr>
       </w:pPr>
       <w:r>
-        <w:t>Once the Pod that depends on the secret is deleted, kubelet will delete its local copy of the secret data as well.</w:t>
+        <w:t xml:space="preserve">Once the Pod that depends on the secret is deleted, </w:t>
+      </w:r>
+      <w:proofErr w:type="spellStart"/>
+      <w:r>
+        <w:t>kubelet</w:t>
+      </w:r>
+      <w:proofErr w:type="spellEnd"/>
+      <w:r>
+        <w:t xml:space="preserve"> will delete its local copy of the secret data as well.</w:t>
       </w:r>
     </w:p>
     <w:p/>
@@ -3284,79 +4695,167 @@
           <w:bCs/>
           <w:highlight w:val="yellow"/>
         </w:rPr>
+        <w:t>KUBECTL COMMANDS RELATED</w:t>
+      </w:r>
+    </w:p>
+    <w:p/>
+    <w:p>
+      <w:r>
+        <w:t xml:space="preserve">To delete all pods together: </w:t>
+      </w:r>
+      <w:proofErr w:type="spellStart"/>
+      <w:r>
+        <w:t>kubectl</w:t>
+      </w:r>
+      <w:proofErr w:type="spellEnd"/>
+      <w:r>
+        <w:t xml:space="preserve"> delete pods –all</w:t>
+      </w:r>
+    </w:p>
+    <w:p>
+      <w:r>
+        <w:t xml:space="preserve">For namespace specific </w:t>
+      </w:r>
+      <w:r>
+        <w:t>resources</w:t>
+      </w:r>
+      <w:r>
+        <w:t xml:space="preserve">: </w:t>
+      </w:r>
+      <w:proofErr w:type="spellStart"/>
+      <w:r>
+        <w:t>kubectl</w:t>
+      </w:r>
+      <w:proofErr w:type="spellEnd"/>
+      <w:r>
+        <w:t xml:space="preserve"> delete pods --all -n &lt;namespace-name&gt;</w:t>
+      </w:r>
+    </w:p>
+    <w:p/>
+    <w:p>
+      <w:proofErr w:type="spellStart"/>
+      <w:r>
+        <w:t>k</w:t>
+      </w:r>
+      <w:r>
+        <w:t>ubectl</w:t>
+      </w:r>
+      <w:proofErr w:type="spellEnd"/>
+      <w:r>
+        <w:t xml:space="preserve"> get pods --show-</w:t>
+      </w:r>
+      <w:r>
+        <w:t>labels:</w:t>
+      </w:r>
+      <w:r>
+        <w:t xml:space="preserve">  This helps to see the labels attached to a resource. Useful to se</w:t>
+      </w:r>
+      <w:r>
+        <w:t xml:space="preserve">e </w:t>
+      </w:r>
+      <w:r>
+        <w:t>labels.</w:t>
+      </w:r>
+    </w:p>
+    <w:p/>
+    <w:p>
+      <w:proofErr w:type="spellStart"/>
+      <w:r>
         <w:lastRenderedPageBreak/>
-        <w:t>KUBECTL COMMANDS RELATED</w:t>
-      </w:r>
-    </w:p>
-    <w:p/>
-    <w:p>
-      <w:r>
-        <w:t>To delete all pods together: kubectl delete pods –all</w:t>
-      </w:r>
-    </w:p>
-    <w:p>
-      <w:r>
-        <w:t xml:space="preserve">For namespace specific </w:t>
-      </w:r>
-      <w:r>
-        <w:t>resources</w:t>
-      </w:r>
-      <w:r>
-        <w:t>: kubectl delete pods --all -n &lt;namespace-name&gt;</w:t>
-      </w:r>
-    </w:p>
-    <w:p/>
-    <w:p>
-      <w:r>
-        <w:t>k</w:t>
-      </w:r>
-      <w:r>
-        <w:t>ubectl</w:t>
-      </w:r>
-      <w:r>
-        <w:t xml:space="preserve"> get pods --show-</w:t>
-      </w:r>
-      <w:r>
-        <w:t>labels:</w:t>
-      </w:r>
-      <w:r>
-        <w:t xml:space="preserve">  This helps to see the labels attached to a resource. Useful to se</w:t>
-      </w:r>
-      <w:r>
-        <w:t xml:space="preserve">e </w:t>
-      </w:r>
-      <w:r>
-        <w:t>labels.</w:t>
-      </w:r>
-    </w:p>
-    <w:p/>
-    <w:p>
-      <w:r>
         <w:t>ku</w:t>
       </w:r>
       <w:r>
-        <w:t xml:space="preserve">bectl apply -f file.yaml → Creates the resource if it doesn't exist, or updates it if it already exists. </w:t>
-      </w:r>
-    </w:p>
-    <w:p>
-      <w:r>
-        <w:t>kubectl replace -f file.yaml → Replaces an existing resource. It fails if the resource doesn't exist.</w:t>
-      </w:r>
-    </w:p>
-    <w:p/>
-    <w:p>
-      <w:r>
-        <w:t>You can use the kubectl explain to learn more about different resources.</w:t>
-      </w:r>
-    </w:p>
-    <w:p>
-      <w:r>
-        <w:t>Eg: kubectl explain pod, kubectl explain pod.spec.</w:t>
-      </w:r>
-    </w:p>
-    <w:p>
-      <w:r>
-        <w:t xml:space="preserve">You can use  --recursive flag to display all the applicable fields that are part of </w:t>
+        <w:t>bectl</w:t>
+      </w:r>
+      <w:proofErr w:type="spellEnd"/>
+      <w:r>
+        <w:t xml:space="preserve"> apply -f </w:t>
+      </w:r>
+      <w:proofErr w:type="spellStart"/>
+      <w:proofErr w:type="gramStart"/>
+      <w:r>
+        <w:t>file.yaml</w:t>
+      </w:r>
+      <w:proofErr w:type="spellEnd"/>
+      <w:proofErr w:type="gramEnd"/>
+      <w:r>
+        <w:t xml:space="preserve"> → Creates the resource if it doesn't exist, or updates it if it already exists. </w:t>
+      </w:r>
+    </w:p>
+    <w:p>
+      <w:proofErr w:type="spellStart"/>
+      <w:r>
+        <w:t>kubectl</w:t>
+      </w:r>
+      <w:proofErr w:type="spellEnd"/>
+      <w:r>
+        <w:t xml:space="preserve"> replace -f </w:t>
+      </w:r>
+      <w:proofErr w:type="spellStart"/>
+      <w:proofErr w:type="gramStart"/>
+      <w:r>
+        <w:t>file.yaml</w:t>
+      </w:r>
+      <w:proofErr w:type="spellEnd"/>
+      <w:proofErr w:type="gramEnd"/>
+      <w:r>
+        <w:t xml:space="preserve"> → Replaces an existing resource. It fails if the resource doesn't exist.</w:t>
+      </w:r>
+    </w:p>
+    <w:p/>
+    <w:p>
+      <w:r>
+        <w:t xml:space="preserve">You can use the </w:t>
+      </w:r>
+      <w:proofErr w:type="spellStart"/>
+      <w:r>
+        <w:t>kubectl</w:t>
+      </w:r>
+      <w:proofErr w:type="spellEnd"/>
+      <w:r>
+        <w:t xml:space="preserve"> explain to learn more about different resources.</w:t>
+      </w:r>
+    </w:p>
+    <w:p>
+      <w:r>
+        <w:t xml:space="preserve">Eg: </w:t>
+      </w:r>
+      <w:proofErr w:type="spellStart"/>
+      <w:r>
+        <w:t>kubectl</w:t>
+      </w:r>
+      <w:proofErr w:type="spellEnd"/>
+      <w:r>
+        <w:t xml:space="preserve"> explain pod, </w:t>
+      </w:r>
+      <w:proofErr w:type="spellStart"/>
+      <w:r>
+        <w:t>kubectl</w:t>
+      </w:r>
+      <w:proofErr w:type="spellEnd"/>
+      <w:r>
+        <w:t xml:space="preserve"> explain </w:t>
+      </w:r>
+      <w:proofErr w:type="spellStart"/>
+      <w:r>
+        <w:t>pod.spec</w:t>
+      </w:r>
+      <w:proofErr w:type="spellEnd"/>
+      <w:r>
+        <w:t>.</w:t>
+      </w:r>
+    </w:p>
+    <w:p>
+      <w:r>
+        <w:t xml:space="preserve">You can </w:t>
+      </w:r>
+      <w:proofErr w:type="gramStart"/>
+      <w:r>
+        <w:t>use  --</w:t>
+      </w:r>
+      <w:proofErr w:type="gramEnd"/>
+      <w:r>
+        <w:t xml:space="preserve">recursive flag to display all the applicable fields that are part of </w:t>
       </w:r>
       <w:r>
         <w:t>those resources</w:t>
@@ -3367,26 +4866,56 @@
     </w:p>
     <w:p>
       <w:r>
-        <w:t xml:space="preserve">Eg: kubectl explain pod.spec </w:t>
+        <w:t xml:space="preserve">Eg: </w:t>
+      </w:r>
+      <w:proofErr w:type="spellStart"/>
+      <w:r>
+        <w:t>kubectl</w:t>
+      </w:r>
+      <w:proofErr w:type="spellEnd"/>
+      <w:r>
+        <w:t xml:space="preserve"> explain </w:t>
+      </w:r>
+      <w:proofErr w:type="spellStart"/>
+      <w:proofErr w:type="gramStart"/>
+      <w:r>
+        <w:t>pod.spec</w:t>
+      </w:r>
+      <w:proofErr w:type="spellEnd"/>
+      <w:proofErr w:type="gramEnd"/>
+      <w:r>
+        <w:t xml:space="preserve"> </w:t>
       </w:r>
       <w:r>
         <w:t>–</w:t>
       </w:r>
+      <w:proofErr w:type="spellStart"/>
       <w:r>
         <w:t>recusrsive</w:t>
       </w:r>
       <w:r>
         <w:t>s</w:t>
       </w:r>
+      <w:proofErr w:type="spellEnd"/>
     </w:p>
     <w:p/>
     <w:p>
       <w:r>
         <w:t xml:space="preserve">To log in to a multi container pod:  </w:t>
       </w:r>
-      <w:r>
-        <w:t>kubectl exec -it &lt;pod-name&gt; -c &lt;container-name&gt; -- /bin/sh</w:t>
-      </w:r>
+      <w:proofErr w:type="spellStart"/>
+      <w:r>
+        <w:t>kubectl</w:t>
+      </w:r>
+      <w:proofErr w:type="spellEnd"/>
+      <w:r>
+        <w:t xml:space="preserve"> exec -it &lt;pod-name&gt; -c &lt;container-name&gt; -- /bin/</w:t>
+      </w:r>
+      <w:proofErr w:type="spellStart"/>
+      <w:r>
+        <w:t>sh</w:t>
+      </w:r>
+      <w:proofErr w:type="spellEnd"/>
     </w:p>
     <w:sectPr>
       <w:pgSz w:w="12240" w:h="15840"/>

</xml_diff>

<commit_message>
Learned Custom Resource Definition, Network policy and example
</commit_message>
<xml_diff>
--- a/9-Interesting_learning_Notes/Learning_Notes.docx
+++ b/9-Interesting_learning_Notes/Learning_Notes.docx
@@ -3627,6 +3627,9 @@
     </w:p>
     <w:p>
       <w:r>
+        <w:rPr>
+          <w:noProof/>
+        </w:rPr>
         <w:drawing>
           <wp:inline distT="0" distB="0" distL="0" distR="0" wp14:anchorId="52647456" wp14:editId="72CFFBFA">
             <wp:extent cx="4077269" cy="2429214"/>
@@ -3667,6 +3670,173 @@
     <w:p/>
     <w:p/>
     <w:p>
+      <w:proofErr w:type="spellStart"/>
+      <w:r>
+        <w:rPr>
+          <w:b/>
+          <w:bCs/>
+          <w:highlight w:val="cyan"/>
+        </w:rPr>
+        <w:t>CustomResourceDefinition</w:t>
+      </w:r>
+      <w:proofErr w:type="spellEnd"/>
+      <w:r>
+        <w:rPr>
+          <w:b/>
+          <w:bCs/>
+          <w:highlight w:val="cyan"/>
+        </w:rPr>
+        <w:t xml:space="preserve"> (CRD)</w:t>
+      </w:r>
+      <w:r>
+        <w:rPr>
+          <w:b/>
+          <w:bCs/>
+        </w:rPr>
+        <w:t xml:space="preserve"> </w:t>
+      </w:r>
+    </w:p>
+    <w:p>
+      <w:r>
+        <w:t>Extends the Kubernetes API by defining a new resource type.</w:t>
+      </w:r>
+    </w:p>
+    <w:p>
+      <w:pPr>
+        <w:pStyle w:val="ListParagraph"/>
+        <w:numPr>
+          <w:ilvl w:val="0"/>
+          <w:numId w:val="14"/>
+        </w:numPr>
+      </w:pPr>
+      <w:r>
+        <w:t xml:space="preserve">Custom Resource (CR): </w:t>
+      </w:r>
+      <w:r>
+        <w:t>An actual object created using that new resource type</w:t>
+      </w:r>
+    </w:p>
+    <w:p>
+      <w:pPr>
+        <w:pStyle w:val="ListParagraph"/>
+        <w:numPr>
+          <w:ilvl w:val="0"/>
+          <w:numId w:val="14"/>
+        </w:numPr>
+      </w:pPr>
+      <w:r>
+        <w:t xml:space="preserve">Custom Controller: </w:t>
+      </w:r>
+      <w:r>
+        <w:t>Optional software that watches custom resources and performs actions.</w:t>
+      </w:r>
+    </w:p>
+    <w:p/>
+    <w:p/>
+    <w:p/>
+    <w:p>
+      <w:pPr>
+        <w:rPr>
+          <w:b/>
+          <w:bCs/>
+        </w:rPr>
+      </w:pPr>
+      <w:proofErr w:type="spellStart"/>
+      <w:r>
+        <w:rPr>
+          <w:b/>
+          <w:bCs/>
+        </w:rPr>
+        <w:lastRenderedPageBreak/>
+        <w:t>Usecase</w:t>
+      </w:r>
+      <w:proofErr w:type="spellEnd"/>
+      <w:r>
+        <w:rPr>
+          <w:b/>
+          <w:bCs/>
+        </w:rPr>
+        <w:t>:</w:t>
+      </w:r>
+    </w:p>
+    <w:p>
+      <w:pPr>
+        <w:pStyle w:val="ListParagraph"/>
+        <w:numPr>
+          <w:ilvl w:val="0"/>
+          <w:numId w:val="13"/>
+        </w:numPr>
+      </w:pPr>
+      <w:r>
+        <w:t xml:space="preserve">Suppose Kubernetes does not have a built-in </w:t>
+      </w:r>
+      <w:proofErr w:type="spellStart"/>
+      <w:r>
+        <w:t>FlightBooking</w:t>
+      </w:r>
+      <w:proofErr w:type="spellEnd"/>
+      <w:r>
+        <w:t xml:space="preserve"> resource.</w:t>
+      </w:r>
+    </w:p>
+    <w:p>
+      <w:pPr>
+        <w:pStyle w:val="ListParagraph"/>
+        <w:numPr>
+          <w:ilvl w:val="0"/>
+          <w:numId w:val="13"/>
+        </w:numPr>
+      </w:pPr>
+      <w:r>
+        <w:t xml:space="preserve">CRD: Defines the </w:t>
+      </w:r>
+      <w:proofErr w:type="spellStart"/>
+      <w:r>
+        <w:t>FlightBooking</w:t>
+      </w:r>
+      <w:proofErr w:type="spellEnd"/>
+      <w:r>
+        <w:t xml:space="preserve"> resource type.</w:t>
+      </w:r>
+    </w:p>
+    <w:p>
+      <w:pPr>
+        <w:pStyle w:val="ListParagraph"/>
+        <w:numPr>
+          <w:ilvl w:val="0"/>
+          <w:numId w:val="13"/>
+        </w:numPr>
+      </w:pPr>
+      <w:r>
+        <w:t>Custom Resource (CR): An actual booking, such as Toronto</w:t>
+      </w:r>
+      <w:r>
+        <w:t xml:space="preserve"> </w:t>
+      </w:r>
+      <w:r>
+        <w:t>to London</w:t>
+      </w:r>
+      <w:r>
+        <w:t>.</w:t>
+      </w:r>
+    </w:p>
+    <w:p>
+      <w:pPr>
+        <w:pStyle w:val="ListParagraph"/>
+        <w:numPr>
+          <w:ilvl w:val="0"/>
+          <w:numId w:val="13"/>
+        </w:numPr>
+      </w:pPr>
+      <w:r>
+        <w:t>Custom Controller: Processes the booking request and reserves a seat.</w:t>
+      </w:r>
+    </w:p>
+    <w:p/>
+    <w:p/>
+    <w:p/>
+    <w:p/>
+    <w:p>
       <w:pPr>
         <w:jc w:val="center"/>
       </w:pPr>
@@ -3731,7 +3901,6 @@
         <w:rPr>
           <w:noProof/>
         </w:rPr>
-        <w:lastRenderedPageBreak/>
         <w:drawing>
           <wp:inline distT="0" distB="0" distL="0" distR="0" wp14:anchorId="28C8B639" wp14:editId="555A1D94">
             <wp:extent cx="5943600" cy="1991995"/>
@@ -3872,6 +4041,7 @@
     </w:p>
     <w:p>
       <w:r>
+        <w:lastRenderedPageBreak/>
         <w:t xml:space="preserve">It gets the </w:t>
       </w:r>
       <w:proofErr w:type="spellStart"/>
@@ -3939,7 +4109,6 @@
     </w:p>
     <w:p>
       <w:r>
-        <w:lastRenderedPageBreak/>
         <w:t xml:space="preserve">A </w:t>
       </w:r>
       <w:proofErr w:type="spellStart"/>
@@ -4109,6 +4278,7 @@
         <w:rPr>
           <w:noProof/>
         </w:rPr>
+        <w:lastRenderedPageBreak/>
         <w:drawing>
           <wp:inline distT="0" distB="0" distL="0" distR="0" wp14:anchorId="3B5FA08D" wp14:editId="5E9F1644">
             <wp:extent cx="1981477" cy="1257475"/>
@@ -4426,6 +4596,7 @@
     <w:p/>
     <w:p>
       <w:r>
+        <w:lastRenderedPageBreak/>
         <w:t>Declarative: (</w:t>
       </w:r>
       <w:r>
@@ -4502,7 +4673,6 @@
         <w:rPr>
           <w:noProof/>
         </w:rPr>
-        <w:lastRenderedPageBreak/>
         <w:drawing>
           <wp:inline distT="0" distB="0" distL="0" distR="0" wp14:anchorId="508BC2A4" wp14:editId="1CB6EF10">
             <wp:extent cx="2314898" cy="1581371"/>
@@ -4761,7 +4931,6 @@
     <w:p>
       <w:proofErr w:type="spellStart"/>
       <w:r>
-        <w:lastRenderedPageBreak/>
         <w:t>ku</w:t>
       </w:r>
       <w:r>
@@ -5444,6 +5613,119 @@
     </w:lvl>
   </w:abstractNum>
   <w:abstractNum w:abstractNumId="4" w15:restartNumberingAfterBreak="0">
+    <w:nsid w:val="2F254815"/>
+    <w:multiLevelType w:val="hybridMultilevel"/>
+    <w:tmpl w:val="3814D6FA"/>
+    <w:lvl w:ilvl="0" w:tplc="10090001">
+      <w:start w:val="1"/>
+      <w:numFmt w:val="bullet"/>
+      <w:lvlText w:val=""/>
+      <w:lvlJc w:val="left"/>
+      <w:pPr>
+        <w:ind w:left="720" w:hanging="360"/>
+      </w:pPr>
+      <w:rPr>
+        <w:rFonts w:ascii="Symbol" w:hAnsi="Symbol" w:hint="default"/>
+      </w:rPr>
+    </w:lvl>
+    <w:lvl w:ilvl="1" w:tplc="10090003" w:tentative="1">
+      <w:start w:val="1"/>
+      <w:numFmt w:val="bullet"/>
+      <w:lvlText w:val="o"/>
+      <w:lvlJc w:val="left"/>
+      <w:pPr>
+        <w:ind w:left="1440" w:hanging="360"/>
+      </w:pPr>
+      <w:rPr>
+        <w:rFonts w:ascii="Courier New" w:hAnsi="Courier New" w:cs="Courier New" w:hint="default"/>
+      </w:rPr>
+    </w:lvl>
+    <w:lvl w:ilvl="2" w:tplc="10090005" w:tentative="1">
+      <w:start w:val="1"/>
+      <w:numFmt w:val="bullet"/>
+      <w:lvlText w:val=""/>
+      <w:lvlJc w:val="left"/>
+      <w:pPr>
+        <w:ind w:left="2160" w:hanging="360"/>
+      </w:pPr>
+      <w:rPr>
+        <w:rFonts w:ascii="Wingdings" w:hAnsi="Wingdings" w:hint="default"/>
+      </w:rPr>
+    </w:lvl>
+    <w:lvl w:ilvl="3" w:tplc="10090001" w:tentative="1">
+      <w:start w:val="1"/>
+      <w:numFmt w:val="bullet"/>
+      <w:lvlText w:val=""/>
+      <w:lvlJc w:val="left"/>
+      <w:pPr>
+        <w:ind w:left="2880" w:hanging="360"/>
+      </w:pPr>
+      <w:rPr>
+        <w:rFonts w:ascii="Symbol" w:hAnsi="Symbol" w:hint="default"/>
+      </w:rPr>
+    </w:lvl>
+    <w:lvl w:ilvl="4" w:tplc="10090003" w:tentative="1">
+      <w:start w:val="1"/>
+      <w:numFmt w:val="bullet"/>
+      <w:lvlText w:val="o"/>
+      <w:lvlJc w:val="left"/>
+      <w:pPr>
+        <w:ind w:left="3600" w:hanging="360"/>
+      </w:pPr>
+      <w:rPr>
+        <w:rFonts w:ascii="Courier New" w:hAnsi="Courier New" w:cs="Courier New" w:hint="default"/>
+      </w:rPr>
+    </w:lvl>
+    <w:lvl w:ilvl="5" w:tplc="10090005" w:tentative="1">
+      <w:start w:val="1"/>
+      <w:numFmt w:val="bullet"/>
+      <w:lvlText w:val=""/>
+      <w:lvlJc w:val="left"/>
+      <w:pPr>
+        <w:ind w:left="4320" w:hanging="360"/>
+      </w:pPr>
+      <w:rPr>
+        <w:rFonts w:ascii="Wingdings" w:hAnsi="Wingdings" w:hint="default"/>
+      </w:rPr>
+    </w:lvl>
+    <w:lvl w:ilvl="6" w:tplc="10090001" w:tentative="1">
+      <w:start w:val="1"/>
+      <w:numFmt w:val="bullet"/>
+      <w:lvlText w:val=""/>
+      <w:lvlJc w:val="left"/>
+      <w:pPr>
+        <w:ind w:left="5040" w:hanging="360"/>
+      </w:pPr>
+      <w:rPr>
+        <w:rFonts w:ascii="Symbol" w:hAnsi="Symbol" w:hint="default"/>
+      </w:rPr>
+    </w:lvl>
+    <w:lvl w:ilvl="7" w:tplc="10090003" w:tentative="1">
+      <w:start w:val="1"/>
+      <w:numFmt w:val="bullet"/>
+      <w:lvlText w:val="o"/>
+      <w:lvlJc w:val="left"/>
+      <w:pPr>
+        <w:ind w:left="5760" w:hanging="360"/>
+      </w:pPr>
+      <w:rPr>
+        <w:rFonts w:ascii="Courier New" w:hAnsi="Courier New" w:cs="Courier New" w:hint="default"/>
+      </w:rPr>
+    </w:lvl>
+    <w:lvl w:ilvl="8" w:tplc="10090005" w:tentative="1">
+      <w:start w:val="1"/>
+      <w:numFmt w:val="bullet"/>
+      <w:lvlText w:val=""/>
+      <w:lvlJc w:val="left"/>
+      <w:pPr>
+        <w:ind w:left="6480" w:hanging="360"/>
+      </w:pPr>
+      <w:rPr>
+        <w:rFonts w:ascii="Wingdings" w:hAnsi="Wingdings" w:hint="default"/>
+      </w:rPr>
+    </w:lvl>
+  </w:abstractNum>
+  <w:abstractNum w:abstractNumId="5" w15:restartNumberingAfterBreak="0">
     <w:nsid w:val="2FF922CF"/>
     <w:multiLevelType w:val="hybridMultilevel"/>
     <w:tmpl w:val="13B43BCE"/>
@@ -5556,7 +5838,7 @@
       </w:rPr>
     </w:lvl>
   </w:abstractNum>
-  <w:abstractNum w:abstractNumId="5" w15:restartNumberingAfterBreak="0">
+  <w:abstractNum w:abstractNumId="6" w15:restartNumberingAfterBreak="0">
     <w:nsid w:val="3AD12E15"/>
     <w:multiLevelType w:val="multilevel"/>
     <w:tmpl w:val="1B26CE52"/>
@@ -5669,7 +5951,7 @@
       </w:pPr>
     </w:lvl>
   </w:abstractNum>
-  <w:abstractNum w:abstractNumId="6" w15:restartNumberingAfterBreak="0">
+  <w:abstractNum w:abstractNumId="7" w15:restartNumberingAfterBreak="0">
     <w:nsid w:val="4C687D05"/>
     <w:multiLevelType w:val="hybridMultilevel"/>
     <w:tmpl w:val="3E06CC0A"/>
@@ -5782,7 +6064,7 @@
       </w:rPr>
     </w:lvl>
   </w:abstractNum>
-  <w:abstractNum w:abstractNumId="7" w15:restartNumberingAfterBreak="0">
+  <w:abstractNum w:abstractNumId="8" w15:restartNumberingAfterBreak="0">
     <w:nsid w:val="4E251AC9"/>
     <w:multiLevelType w:val="hybridMultilevel"/>
     <w:tmpl w:val="B8BE0B24"/>
@@ -5871,7 +6153,120 @@
       </w:pPr>
     </w:lvl>
   </w:abstractNum>
-  <w:abstractNum w:abstractNumId="8" w15:restartNumberingAfterBreak="0">
+  <w:abstractNum w:abstractNumId="9" w15:restartNumberingAfterBreak="0">
+    <w:nsid w:val="65052AC2"/>
+    <w:multiLevelType w:val="hybridMultilevel"/>
+    <w:tmpl w:val="2A207D80"/>
+    <w:lvl w:ilvl="0" w:tplc="10090001">
+      <w:start w:val="1"/>
+      <w:numFmt w:val="bullet"/>
+      <w:lvlText w:val=""/>
+      <w:lvlJc w:val="left"/>
+      <w:pPr>
+        <w:ind w:left="720" w:hanging="360"/>
+      </w:pPr>
+      <w:rPr>
+        <w:rFonts w:ascii="Symbol" w:hAnsi="Symbol" w:hint="default"/>
+      </w:rPr>
+    </w:lvl>
+    <w:lvl w:ilvl="1" w:tplc="10090003" w:tentative="1">
+      <w:start w:val="1"/>
+      <w:numFmt w:val="bullet"/>
+      <w:lvlText w:val="o"/>
+      <w:lvlJc w:val="left"/>
+      <w:pPr>
+        <w:ind w:left="1440" w:hanging="360"/>
+      </w:pPr>
+      <w:rPr>
+        <w:rFonts w:ascii="Courier New" w:hAnsi="Courier New" w:cs="Courier New" w:hint="default"/>
+      </w:rPr>
+    </w:lvl>
+    <w:lvl w:ilvl="2" w:tplc="10090005" w:tentative="1">
+      <w:start w:val="1"/>
+      <w:numFmt w:val="bullet"/>
+      <w:lvlText w:val=""/>
+      <w:lvlJc w:val="left"/>
+      <w:pPr>
+        <w:ind w:left="2160" w:hanging="360"/>
+      </w:pPr>
+      <w:rPr>
+        <w:rFonts w:ascii="Wingdings" w:hAnsi="Wingdings" w:hint="default"/>
+      </w:rPr>
+    </w:lvl>
+    <w:lvl w:ilvl="3" w:tplc="10090001" w:tentative="1">
+      <w:start w:val="1"/>
+      <w:numFmt w:val="bullet"/>
+      <w:lvlText w:val=""/>
+      <w:lvlJc w:val="left"/>
+      <w:pPr>
+        <w:ind w:left="2880" w:hanging="360"/>
+      </w:pPr>
+      <w:rPr>
+        <w:rFonts w:ascii="Symbol" w:hAnsi="Symbol" w:hint="default"/>
+      </w:rPr>
+    </w:lvl>
+    <w:lvl w:ilvl="4" w:tplc="10090003" w:tentative="1">
+      <w:start w:val="1"/>
+      <w:numFmt w:val="bullet"/>
+      <w:lvlText w:val="o"/>
+      <w:lvlJc w:val="left"/>
+      <w:pPr>
+        <w:ind w:left="3600" w:hanging="360"/>
+      </w:pPr>
+      <w:rPr>
+        <w:rFonts w:ascii="Courier New" w:hAnsi="Courier New" w:cs="Courier New" w:hint="default"/>
+      </w:rPr>
+    </w:lvl>
+    <w:lvl w:ilvl="5" w:tplc="10090005" w:tentative="1">
+      <w:start w:val="1"/>
+      <w:numFmt w:val="bullet"/>
+      <w:lvlText w:val=""/>
+      <w:lvlJc w:val="left"/>
+      <w:pPr>
+        <w:ind w:left="4320" w:hanging="360"/>
+      </w:pPr>
+      <w:rPr>
+        <w:rFonts w:ascii="Wingdings" w:hAnsi="Wingdings" w:hint="default"/>
+      </w:rPr>
+    </w:lvl>
+    <w:lvl w:ilvl="6" w:tplc="10090001" w:tentative="1">
+      <w:start w:val="1"/>
+      <w:numFmt w:val="bullet"/>
+      <w:lvlText w:val=""/>
+      <w:lvlJc w:val="left"/>
+      <w:pPr>
+        <w:ind w:left="5040" w:hanging="360"/>
+      </w:pPr>
+      <w:rPr>
+        <w:rFonts w:ascii="Symbol" w:hAnsi="Symbol" w:hint="default"/>
+      </w:rPr>
+    </w:lvl>
+    <w:lvl w:ilvl="7" w:tplc="10090003" w:tentative="1">
+      <w:start w:val="1"/>
+      <w:numFmt w:val="bullet"/>
+      <w:lvlText w:val="o"/>
+      <w:lvlJc w:val="left"/>
+      <w:pPr>
+        <w:ind w:left="5760" w:hanging="360"/>
+      </w:pPr>
+      <w:rPr>
+        <w:rFonts w:ascii="Courier New" w:hAnsi="Courier New" w:cs="Courier New" w:hint="default"/>
+      </w:rPr>
+    </w:lvl>
+    <w:lvl w:ilvl="8" w:tplc="10090005" w:tentative="1">
+      <w:start w:val="1"/>
+      <w:numFmt w:val="bullet"/>
+      <w:lvlText w:val=""/>
+      <w:lvlJc w:val="left"/>
+      <w:pPr>
+        <w:ind w:left="6480" w:hanging="360"/>
+      </w:pPr>
+      <w:rPr>
+        <w:rFonts w:ascii="Wingdings" w:hAnsi="Wingdings" w:hint="default"/>
+      </w:rPr>
+    </w:lvl>
+  </w:abstractNum>
+  <w:abstractNum w:abstractNumId="10" w15:restartNumberingAfterBreak="0">
     <w:nsid w:val="6DAB0C8B"/>
     <w:multiLevelType w:val="hybridMultilevel"/>
     <w:tmpl w:val="E6168C9A"/>
@@ -5984,7 +6379,7 @@
       </w:rPr>
     </w:lvl>
   </w:abstractNum>
-  <w:abstractNum w:abstractNumId="9" w15:restartNumberingAfterBreak="0">
+  <w:abstractNum w:abstractNumId="11" w15:restartNumberingAfterBreak="0">
     <w:nsid w:val="6F6B297F"/>
     <w:multiLevelType w:val="hybridMultilevel"/>
     <w:tmpl w:val="90604326"/>
@@ -6096,7 +6491,7 @@
       </w:rPr>
     </w:lvl>
   </w:abstractNum>
-  <w:abstractNum w:abstractNumId="10" w15:restartNumberingAfterBreak="0">
+  <w:abstractNum w:abstractNumId="12" w15:restartNumberingAfterBreak="0">
     <w:nsid w:val="74815055"/>
     <w:multiLevelType w:val="hybridMultilevel"/>
     <w:tmpl w:val="2FD09D60"/>
@@ -6185,7 +6580,7 @@
       </w:pPr>
     </w:lvl>
   </w:abstractNum>
-  <w:abstractNum w:abstractNumId="11" w15:restartNumberingAfterBreak="0">
+  <w:abstractNum w:abstractNumId="13" w15:restartNumberingAfterBreak="0">
     <w:nsid w:val="7FE96A27"/>
     <w:multiLevelType w:val="multilevel"/>
     <w:tmpl w:val="2E109BCA"/>
@@ -6335,10 +6730,10 @@
     </w:lvl>
   </w:abstractNum>
   <w:num w:numId="1" w16cid:durableId="1329406315">
-    <w:abstractNumId w:val="9"/>
+    <w:abstractNumId w:val="11"/>
   </w:num>
   <w:num w:numId="2" w16cid:durableId="346176687">
-    <w:abstractNumId w:val="11"/>
+    <w:abstractNumId w:val="13"/>
   </w:num>
   <w:num w:numId="3" w16cid:durableId="588125869">
     <w:abstractNumId w:val="3"/>
@@ -6350,25 +6745,31 @@
     <w:abstractNumId w:val="0"/>
   </w:num>
   <w:num w:numId="6" w16cid:durableId="1462187803">
-    <w:abstractNumId w:val="5"/>
+    <w:abstractNumId w:val="6"/>
   </w:num>
   <w:num w:numId="7" w16cid:durableId="313225329">
-    <w:abstractNumId w:val="7"/>
+    <w:abstractNumId w:val="8"/>
   </w:num>
   <w:num w:numId="8" w16cid:durableId="11156116">
     <w:abstractNumId w:val="2"/>
   </w:num>
   <w:num w:numId="9" w16cid:durableId="1024936680">
-    <w:abstractNumId w:val="8"/>
+    <w:abstractNumId w:val="10"/>
   </w:num>
   <w:num w:numId="10" w16cid:durableId="1490097057">
-    <w:abstractNumId w:val="4"/>
+    <w:abstractNumId w:val="5"/>
   </w:num>
   <w:num w:numId="11" w16cid:durableId="1170869400">
-    <w:abstractNumId w:val="6"/>
+    <w:abstractNumId w:val="7"/>
   </w:num>
   <w:num w:numId="12" w16cid:durableId="2014062361">
-    <w:abstractNumId w:val="10"/>
+    <w:abstractNumId w:val="12"/>
+  </w:num>
+  <w:num w:numId="13" w16cid:durableId="241136983">
+    <w:abstractNumId w:val="9"/>
+  </w:num>
+  <w:num w:numId="14" w16cid:durableId="529539341">
+    <w:abstractNumId w:val="4"/>
   </w:num>
 </w:numbering>
 </file>
@@ -6976,6 +7377,7 @@
   <w:style w:type="character" w:default="1" w:styleId="DefaultParagraphFont">
     <w:name w:val="Default Paragraph Font"/>
     <w:uiPriority w:val="1"/>
+    <w:semiHidden/>
     <w:unhideWhenUsed/>
   </w:style>
   <w:style w:type="table" w:default="1" w:styleId="TableNormal">

</xml_diff>

<commit_message>
Learned Dynamic provisioning using storage class
</commit_message>
<xml_diff>
--- a/9-Interesting_learning_Notes/Learning_Notes.docx
+++ b/9-Interesting_learning_Notes/Learning_Notes.docx
@@ -3808,10 +3808,7 @@
         </w:numPr>
       </w:pPr>
       <w:r>
-        <w:t>Custom Resource (CR): An actual booking, such as Toronto</w:t>
-      </w:r>
-      <w:r>
-        <w:t xml:space="preserve"> </w:t>
+        <w:t xml:space="preserve">Custom Resource (CR): An actual booking, such as Toronto </w:t>
       </w:r>
       <w:r>
         <w:t>to London</w:t>
@@ -4850,7 +4847,6 @@
         <w:t xml:space="preserve"> will delete its local copy of the secret data as well.</w:t>
       </w:r>
     </w:p>
-    <w:p/>
     <w:p>
       <w:pPr>
         <w:jc w:val="center"/>
@@ -4865,6 +4861,344 @@
           <w:bCs/>
           <w:highlight w:val="yellow"/>
         </w:rPr>
+        <w:lastRenderedPageBreak/>
+        <w:t>VOLUMES</w:t>
+      </w:r>
+    </w:p>
+    <w:p/>
+    <w:p>
+      <w:pPr>
+        <w:rPr>
+          <w:b/>
+          <w:bCs/>
+        </w:rPr>
+      </w:pPr>
+      <w:r>
+        <w:rPr>
+          <w:b/>
+          <w:bCs/>
+        </w:rPr>
+        <w:t xml:space="preserve">Types of Volume </w:t>
+      </w:r>
+      <w:proofErr w:type="spellStart"/>
+      <w:r>
+        <w:rPr>
+          <w:b/>
+          <w:bCs/>
+        </w:rPr>
+        <w:t>Provissioning</w:t>
+      </w:r>
+      <w:proofErr w:type="spellEnd"/>
+      <w:r>
+        <w:rPr>
+          <w:b/>
+          <w:bCs/>
+        </w:rPr>
+        <w:t>:</w:t>
+      </w:r>
+    </w:p>
+    <w:p>
+      <w:pPr>
+        <w:rPr>
+          <w:b/>
+          <w:bCs/>
+        </w:rPr>
+      </w:pPr>
+    </w:p>
+    <w:p>
+      <w:r>
+        <w:rPr>
+          <w:b/>
+          <w:bCs/>
+        </w:rPr>
+        <w:t>Static provisioning</w:t>
+      </w:r>
+      <w:r>
+        <w:t>: An administrator manually creates a PV before a PVC requests storage.</w:t>
+      </w:r>
+    </w:p>
+    <w:p/>
+    <w:p>
+      <w:r>
+        <w:rPr>
+          <w:b/>
+          <w:bCs/>
+        </w:rPr>
+        <w:t>Dynamic provisioning:</w:t>
+      </w:r>
+      <w:r>
+        <w:t xml:space="preserve"> Kubernetes automatically creates a PV when a PVC requests storage.</w:t>
+      </w:r>
+    </w:p>
+    <w:p/>
+    <w:p>
+      <w:pPr>
+        <w:rPr>
+          <w:b/>
+          <w:bCs/>
+        </w:rPr>
+      </w:pPr>
+      <w:r>
+        <w:rPr>
+          <w:b/>
+          <w:bCs/>
+        </w:rPr>
+        <w:t>Storage Class</w:t>
+      </w:r>
+      <w:r>
+        <w:rPr>
+          <w:b/>
+          <w:bCs/>
+        </w:rPr>
+        <w:t>:</w:t>
+      </w:r>
+    </w:p>
+    <w:p>
+      <w:pPr>
+        <w:pStyle w:val="ListParagraph"/>
+        <w:numPr>
+          <w:ilvl w:val="0"/>
+          <w:numId w:val="15"/>
+        </w:numPr>
+      </w:pPr>
+      <w:r>
+        <w:t>Defines how Kubernetes should provision storage.</w:t>
+      </w:r>
+    </w:p>
+    <w:p>
+      <w:pPr>
+        <w:pStyle w:val="ListParagraph"/>
+        <w:numPr>
+          <w:ilvl w:val="0"/>
+          <w:numId w:val="15"/>
+        </w:numPr>
+      </w:pPr>
+      <w:r>
+        <w:t>Specifies the provisioner and storage parameters, such as disk type.</w:t>
+      </w:r>
+    </w:p>
+    <w:p>
+      <w:pPr>
+        <w:pStyle w:val="ListParagraph"/>
+        <w:numPr>
+          <w:ilvl w:val="0"/>
+          <w:numId w:val="15"/>
+        </w:numPr>
+      </w:pPr>
+      <w:r>
+        <w:t>Does not create a disk by itself.</w:t>
+      </w:r>
+    </w:p>
+    <w:p/>
+    <w:p>
+      <w:pPr>
+        <w:rPr>
+          <w:b/>
+          <w:bCs/>
+        </w:rPr>
+      </w:pPr>
+      <w:r>
+        <w:rPr>
+          <w:b/>
+          <w:bCs/>
+        </w:rPr>
+        <w:t>Dynamic Provisioning</w:t>
+      </w:r>
+    </w:p>
+    <w:p>
+      <w:pPr>
+        <w:pStyle w:val="ListParagraph"/>
+        <w:numPr>
+          <w:ilvl w:val="0"/>
+          <w:numId w:val="16"/>
+        </w:numPr>
+      </w:pPr>
+      <w:r>
+        <w:t xml:space="preserve">Automatically creates a </w:t>
+      </w:r>
+      <w:proofErr w:type="spellStart"/>
+      <w:r>
+        <w:t>PersistentVolume</w:t>
+      </w:r>
+      <w:proofErr w:type="spellEnd"/>
+      <w:r>
+        <w:t xml:space="preserve"> (PV) when a </w:t>
+      </w:r>
+      <w:proofErr w:type="spellStart"/>
+      <w:r>
+        <w:t>PersistentVolumeClaim</w:t>
+      </w:r>
+      <w:proofErr w:type="spellEnd"/>
+      <w:r>
+        <w:t xml:space="preserve"> (PVC) requests storage.</w:t>
+      </w:r>
+    </w:p>
+    <w:p>
+      <w:pPr>
+        <w:pStyle w:val="ListParagraph"/>
+        <w:numPr>
+          <w:ilvl w:val="0"/>
+          <w:numId w:val="16"/>
+        </w:numPr>
+      </w:pPr>
+      <w:r>
+        <w:t xml:space="preserve">Uses a </w:t>
+      </w:r>
+      <w:proofErr w:type="spellStart"/>
+      <w:r>
+        <w:t>StorageClass</w:t>
+      </w:r>
+      <w:proofErr w:type="spellEnd"/>
+      <w:r>
+        <w:t xml:space="preserve"> to determine how the storage should be created.</w:t>
+      </w:r>
+    </w:p>
+    <w:p>
+      <w:pPr>
+        <w:pStyle w:val="ListParagraph"/>
+        <w:numPr>
+          <w:ilvl w:val="0"/>
+          <w:numId w:val="16"/>
+        </w:numPr>
+      </w:pPr>
+      <w:r>
+        <w:t>Removes the need to manually create a PV beforehand.</w:t>
+      </w:r>
+    </w:p>
+    <w:p/>
+    <w:p>
+      <w:pPr>
+        <w:rPr>
+          <w:b/>
+          <w:bCs/>
+        </w:rPr>
+      </w:pPr>
+      <w:r>
+        <w:rPr>
+          <w:b/>
+          <w:bCs/>
+        </w:rPr>
+        <w:t>Example flow:</w:t>
+      </w:r>
+    </w:p>
+    <w:p>
+      <w:r>
+        <w:t xml:space="preserve">PVC → </w:t>
+      </w:r>
+      <w:proofErr w:type="spellStart"/>
+      <w:r>
+        <w:t>StorageClass</w:t>
+      </w:r>
+      <w:proofErr w:type="spellEnd"/>
+      <w:r>
+        <w:t xml:space="preserve"> → Provisioner → PV → Pod uses storage</w:t>
+      </w:r>
+    </w:p>
+    <w:p/>
+    <w:p>
+      <w:r>
+        <w:t>Example of Storage class for GCP</w:t>
+      </w:r>
+    </w:p>
+    <w:p>
+      <w:proofErr w:type="spellStart"/>
+      <w:r>
+        <w:t>apiVersion</w:t>
+      </w:r>
+      <w:proofErr w:type="spellEnd"/>
+      <w:r>
+        <w:t>: storage.k8s.io/v1</w:t>
+      </w:r>
+    </w:p>
+    <w:p>
+      <w:r>
+        <w:t xml:space="preserve">kind: </w:t>
+      </w:r>
+      <w:proofErr w:type="spellStart"/>
+      <w:r>
+        <w:t>StorageClass</w:t>
+      </w:r>
+      <w:proofErr w:type="spellEnd"/>
+    </w:p>
+    <w:p>
+      <w:r>
+        <w:t>metadata:</w:t>
+      </w:r>
+    </w:p>
+    <w:p>
+      <w:r>
+        <w:lastRenderedPageBreak/>
+        <w:t xml:space="preserve">  name: </w:t>
+      </w:r>
+      <w:proofErr w:type="spellStart"/>
+      <w:r>
+        <w:t>gcp</w:t>
+      </w:r>
+      <w:proofErr w:type="spellEnd"/>
+      <w:r>
+        <w:t>-balanced</w:t>
+      </w:r>
+    </w:p>
+    <w:p>
+      <w:r>
+        <w:t>provisioner: pd.csi.storage.gke.io</w:t>
+      </w:r>
+      <w:r>
+        <w:t xml:space="preserve">   #GCP </w:t>
+      </w:r>
+      <w:proofErr w:type="spellStart"/>
+      <w:r>
+        <w:t>provissioner</w:t>
+      </w:r>
+      <w:proofErr w:type="spellEnd"/>
+    </w:p>
+    <w:p>
+      <w:r>
+        <w:t>parameters:</w:t>
+      </w:r>
+    </w:p>
+    <w:p>
+      <w:r>
+        <w:t xml:space="preserve">  type: pd-balanced</w:t>
+      </w:r>
+      <w:r>
+        <w:t xml:space="preserve">  </w:t>
+      </w:r>
+    </w:p>
+    <w:p/>
+    <w:p>
+      <w:r>
+        <w:t xml:space="preserve">Note: </w:t>
+      </w:r>
+      <w:proofErr w:type="spellStart"/>
+      <w:r>
+        <w:t>StorageClass</w:t>
+      </w:r>
+      <w:proofErr w:type="spellEnd"/>
+      <w:r>
+        <w:t xml:space="preserve"> is the configuration; dynamic provisioning is the process</w:t>
+      </w:r>
+    </w:p>
+    <w:p/>
+    <w:p/>
+    <w:p/>
+    <w:p/>
+    <w:p/>
+    <w:p/>
+    <w:p>
+      <w:pPr>
+        <w:jc w:val="center"/>
+        <w:rPr>
+          <w:b/>
+          <w:bCs/>
+        </w:rPr>
+      </w:pPr>
+      <w:r>
+        <w:rPr>
+          <w:b/>
+          <w:bCs/>
+          <w:highlight w:val="yellow"/>
+        </w:rPr>
         <w:t>KUBECTL COMMANDS RELATED</w:t>
       </w:r>
     </w:p>
@@ -5016,6 +5350,7 @@
     </w:p>
     <w:p>
       <w:r>
+        <w:lastRenderedPageBreak/>
         <w:t xml:space="preserve">You can </w:t>
       </w:r>
       <w:proofErr w:type="gramStart"/>
@@ -5952,6 +6287,119 @@
     </w:lvl>
   </w:abstractNum>
   <w:abstractNum w:abstractNumId="7" w15:restartNumberingAfterBreak="0">
+    <w:nsid w:val="46851638"/>
+    <w:multiLevelType w:val="hybridMultilevel"/>
+    <w:tmpl w:val="5002E234"/>
+    <w:lvl w:ilvl="0" w:tplc="10090001">
+      <w:start w:val="1"/>
+      <w:numFmt w:val="bullet"/>
+      <w:lvlText w:val=""/>
+      <w:lvlJc w:val="left"/>
+      <w:pPr>
+        <w:ind w:left="720" w:hanging="360"/>
+      </w:pPr>
+      <w:rPr>
+        <w:rFonts w:ascii="Symbol" w:hAnsi="Symbol" w:hint="default"/>
+      </w:rPr>
+    </w:lvl>
+    <w:lvl w:ilvl="1" w:tplc="10090003" w:tentative="1">
+      <w:start w:val="1"/>
+      <w:numFmt w:val="bullet"/>
+      <w:lvlText w:val="o"/>
+      <w:lvlJc w:val="left"/>
+      <w:pPr>
+        <w:ind w:left="1440" w:hanging="360"/>
+      </w:pPr>
+      <w:rPr>
+        <w:rFonts w:ascii="Courier New" w:hAnsi="Courier New" w:cs="Courier New" w:hint="default"/>
+      </w:rPr>
+    </w:lvl>
+    <w:lvl w:ilvl="2" w:tplc="10090005" w:tentative="1">
+      <w:start w:val="1"/>
+      <w:numFmt w:val="bullet"/>
+      <w:lvlText w:val=""/>
+      <w:lvlJc w:val="left"/>
+      <w:pPr>
+        <w:ind w:left="2160" w:hanging="360"/>
+      </w:pPr>
+      <w:rPr>
+        <w:rFonts w:ascii="Wingdings" w:hAnsi="Wingdings" w:hint="default"/>
+      </w:rPr>
+    </w:lvl>
+    <w:lvl w:ilvl="3" w:tplc="10090001" w:tentative="1">
+      <w:start w:val="1"/>
+      <w:numFmt w:val="bullet"/>
+      <w:lvlText w:val=""/>
+      <w:lvlJc w:val="left"/>
+      <w:pPr>
+        <w:ind w:left="2880" w:hanging="360"/>
+      </w:pPr>
+      <w:rPr>
+        <w:rFonts w:ascii="Symbol" w:hAnsi="Symbol" w:hint="default"/>
+      </w:rPr>
+    </w:lvl>
+    <w:lvl w:ilvl="4" w:tplc="10090003" w:tentative="1">
+      <w:start w:val="1"/>
+      <w:numFmt w:val="bullet"/>
+      <w:lvlText w:val="o"/>
+      <w:lvlJc w:val="left"/>
+      <w:pPr>
+        <w:ind w:left="3600" w:hanging="360"/>
+      </w:pPr>
+      <w:rPr>
+        <w:rFonts w:ascii="Courier New" w:hAnsi="Courier New" w:cs="Courier New" w:hint="default"/>
+      </w:rPr>
+    </w:lvl>
+    <w:lvl w:ilvl="5" w:tplc="10090005" w:tentative="1">
+      <w:start w:val="1"/>
+      <w:numFmt w:val="bullet"/>
+      <w:lvlText w:val=""/>
+      <w:lvlJc w:val="left"/>
+      <w:pPr>
+        <w:ind w:left="4320" w:hanging="360"/>
+      </w:pPr>
+      <w:rPr>
+        <w:rFonts w:ascii="Wingdings" w:hAnsi="Wingdings" w:hint="default"/>
+      </w:rPr>
+    </w:lvl>
+    <w:lvl w:ilvl="6" w:tplc="10090001" w:tentative="1">
+      <w:start w:val="1"/>
+      <w:numFmt w:val="bullet"/>
+      <w:lvlText w:val=""/>
+      <w:lvlJc w:val="left"/>
+      <w:pPr>
+        <w:ind w:left="5040" w:hanging="360"/>
+      </w:pPr>
+      <w:rPr>
+        <w:rFonts w:ascii="Symbol" w:hAnsi="Symbol" w:hint="default"/>
+      </w:rPr>
+    </w:lvl>
+    <w:lvl w:ilvl="7" w:tplc="10090003" w:tentative="1">
+      <w:start w:val="1"/>
+      <w:numFmt w:val="bullet"/>
+      <w:lvlText w:val="o"/>
+      <w:lvlJc w:val="left"/>
+      <w:pPr>
+        <w:ind w:left="5760" w:hanging="360"/>
+      </w:pPr>
+      <w:rPr>
+        <w:rFonts w:ascii="Courier New" w:hAnsi="Courier New" w:cs="Courier New" w:hint="default"/>
+      </w:rPr>
+    </w:lvl>
+    <w:lvl w:ilvl="8" w:tplc="10090005" w:tentative="1">
+      <w:start w:val="1"/>
+      <w:numFmt w:val="bullet"/>
+      <w:lvlText w:val=""/>
+      <w:lvlJc w:val="left"/>
+      <w:pPr>
+        <w:ind w:left="6480" w:hanging="360"/>
+      </w:pPr>
+      <w:rPr>
+        <w:rFonts w:ascii="Wingdings" w:hAnsi="Wingdings" w:hint="default"/>
+      </w:rPr>
+    </w:lvl>
+  </w:abstractNum>
+  <w:abstractNum w:abstractNumId="8" w15:restartNumberingAfterBreak="0">
     <w:nsid w:val="4C687D05"/>
     <w:multiLevelType w:val="hybridMultilevel"/>
     <w:tmpl w:val="3E06CC0A"/>
@@ -6064,7 +6512,7 @@
       </w:rPr>
     </w:lvl>
   </w:abstractNum>
-  <w:abstractNum w:abstractNumId="8" w15:restartNumberingAfterBreak="0">
+  <w:abstractNum w:abstractNumId="9" w15:restartNumberingAfterBreak="0">
     <w:nsid w:val="4E251AC9"/>
     <w:multiLevelType w:val="hybridMultilevel"/>
     <w:tmpl w:val="B8BE0B24"/>
@@ -6153,7 +6601,7 @@
       </w:pPr>
     </w:lvl>
   </w:abstractNum>
-  <w:abstractNum w:abstractNumId="9" w15:restartNumberingAfterBreak="0">
+  <w:abstractNum w:abstractNumId="10" w15:restartNumberingAfterBreak="0">
     <w:nsid w:val="65052AC2"/>
     <w:multiLevelType w:val="hybridMultilevel"/>
     <w:tmpl w:val="2A207D80"/>
@@ -6266,7 +6714,7 @@
       </w:rPr>
     </w:lvl>
   </w:abstractNum>
-  <w:abstractNum w:abstractNumId="10" w15:restartNumberingAfterBreak="0">
+  <w:abstractNum w:abstractNumId="11" w15:restartNumberingAfterBreak="0">
     <w:nsid w:val="6DAB0C8B"/>
     <w:multiLevelType w:val="hybridMultilevel"/>
     <w:tmpl w:val="E6168C9A"/>
@@ -6379,7 +6827,7 @@
       </w:rPr>
     </w:lvl>
   </w:abstractNum>
-  <w:abstractNum w:abstractNumId="11" w15:restartNumberingAfterBreak="0">
+  <w:abstractNum w:abstractNumId="12" w15:restartNumberingAfterBreak="0">
     <w:nsid w:val="6F6B297F"/>
     <w:multiLevelType w:val="hybridMultilevel"/>
     <w:tmpl w:val="90604326"/>
@@ -6491,7 +6939,120 @@
       </w:rPr>
     </w:lvl>
   </w:abstractNum>
-  <w:abstractNum w:abstractNumId="12" w15:restartNumberingAfterBreak="0">
+  <w:abstractNum w:abstractNumId="13" w15:restartNumberingAfterBreak="0">
+    <w:nsid w:val="71231961"/>
+    <w:multiLevelType w:val="hybridMultilevel"/>
+    <w:tmpl w:val="856A9720"/>
+    <w:lvl w:ilvl="0" w:tplc="10090001">
+      <w:start w:val="1"/>
+      <w:numFmt w:val="bullet"/>
+      <w:lvlText w:val=""/>
+      <w:lvlJc w:val="left"/>
+      <w:pPr>
+        <w:ind w:left="720" w:hanging="360"/>
+      </w:pPr>
+      <w:rPr>
+        <w:rFonts w:ascii="Symbol" w:hAnsi="Symbol" w:hint="default"/>
+      </w:rPr>
+    </w:lvl>
+    <w:lvl w:ilvl="1" w:tplc="10090003" w:tentative="1">
+      <w:start w:val="1"/>
+      <w:numFmt w:val="bullet"/>
+      <w:lvlText w:val="o"/>
+      <w:lvlJc w:val="left"/>
+      <w:pPr>
+        <w:ind w:left="1440" w:hanging="360"/>
+      </w:pPr>
+      <w:rPr>
+        <w:rFonts w:ascii="Courier New" w:hAnsi="Courier New" w:cs="Courier New" w:hint="default"/>
+      </w:rPr>
+    </w:lvl>
+    <w:lvl w:ilvl="2" w:tplc="10090005" w:tentative="1">
+      <w:start w:val="1"/>
+      <w:numFmt w:val="bullet"/>
+      <w:lvlText w:val=""/>
+      <w:lvlJc w:val="left"/>
+      <w:pPr>
+        <w:ind w:left="2160" w:hanging="360"/>
+      </w:pPr>
+      <w:rPr>
+        <w:rFonts w:ascii="Wingdings" w:hAnsi="Wingdings" w:hint="default"/>
+      </w:rPr>
+    </w:lvl>
+    <w:lvl w:ilvl="3" w:tplc="10090001" w:tentative="1">
+      <w:start w:val="1"/>
+      <w:numFmt w:val="bullet"/>
+      <w:lvlText w:val=""/>
+      <w:lvlJc w:val="left"/>
+      <w:pPr>
+        <w:ind w:left="2880" w:hanging="360"/>
+      </w:pPr>
+      <w:rPr>
+        <w:rFonts w:ascii="Symbol" w:hAnsi="Symbol" w:hint="default"/>
+      </w:rPr>
+    </w:lvl>
+    <w:lvl w:ilvl="4" w:tplc="10090003" w:tentative="1">
+      <w:start w:val="1"/>
+      <w:numFmt w:val="bullet"/>
+      <w:lvlText w:val="o"/>
+      <w:lvlJc w:val="left"/>
+      <w:pPr>
+        <w:ind w:left="3600" w:hanging="360"/>
+      </w:pPr>
+      <w:rPr>
+        <w:rFonts w:ascii="Courier New" w:hAnsi="Courier New" w:cs="Courier New" w:hint="default"/>
+      </w:rPr>
+    </w:lvl>
+    <w:lvl w:ilvl="5" w:tplc="10090005" w:tentative="1">
+      <w:start w:val="1"/>
+      <w:numFmt w:val="bullet"/>
+      <w:lvlText w:val=""/>
+      <w:lvlJc w:val="left"/>
+      <w:pPr>
+        <w:ind w:left="4320" w:hanging="360"/>
+      </w:pPr>
+      <w:rPr>
+        <w:rFonts w:ascii="Wingdings" w:hAnsi="Wingdings" w:hint="default"/>
+      </w:rPr>
+    </w:lvl>
+    <w:lvl w:ilvl="6" w:tplc="10090001" w:tentative="1">
+      <w:start w:val="1"/>
+      <w:numFmt w:val="bullet"/>
+      <w:lvlText w:val=""/>
+      <w:lvlJc w:val="left"/>
+      <w:pPr>
+        <w:ind w:left="5040" w:hanging="360"/>
+      </w:pPr>
+      <w:rPr>
+        <w:rFonts w:ascii="Symbol" w:hAnsi="Symbol" w:hint="default"/>
+      </w:rPr>
+    </w:lvl>
+    <w:lvl w:ilvl="7" w:tplc="10090003" w:tentative="1">
+      <w:start w:val="1"/>
+      <w:numFmt w:val="bullet"/>
+      <w:lvlText w:val="o"/>
+      <w:lvlJc w:val="left"/>
+      <w:pPr>
+        <w:ind w:left="5760" w:hanging="360"/>
+      </w:pPr>
+      <w:rPr>
+        <w:rFonts w:ascii="Courier New" w:hAnsi="Courier New" w:cs="Courier New" w:hint="default"/>
+      </w:rPr>
+    </w:lvl>
+    <w:lvl w:ilvl="8" w:tplc="10090005" w:tentative="1">
+      <w:start w:val="1"/>
+      <w:numFmt w:val="bullet"/>
+      <w:lvlText w:val=""/>
+      <w:lvlJc w:val="left"/>
+      <w:pPr>
+        <w:ind w:left="6480" w:hanging="360"/>
+      </w:pPr>
+      <w:rPr>
+        <w:rFonts w:ascii="Wingdings" w:hAnsi="Wingdings" w:hint="default"/>
+      </w:rPr>
+    </w:lvl>
+  </w:abstractNum>
+  <w:abstractNum w:abstractNumId="14" w15:restartNumberingAfterBreak="0">
     <w:nsid w:val="74815055"/>
     <w:multiLevelType w:val="hybridMultilevel"/>
     <w:tmpl w:val="2FD09D60"/>
@@ -6580,7 +7141,7 @@
       </w:pPr>
     </w:lvl>
   </w:abstractNum>
-  <w:abstractNum w:abstractNumId="13" w15:restartNumberingAfterBreak="0">
+  <w:abstractNum w:abstractNumId="15" w15:restartNumberingAfterBreak="0">
     <w:nsid w:val="7FE96A27"/>
     <w:multiLevelType w:val="multilevel"/>
     <w:tmpl w:val="2E109BCA"/>
@@ -6730,10 +7291,10 @@
     </w:lvl>
   </w:abstractNum>
   <w:num w:numId="1" w16cid:durableId="1329406315">
-    <w:abstractNumId w:val="11"/>
+    <w:abstractNumId w:val="12"/>
   </w:num>
   <w:num w:numId="2" w16cid:durableId="346176687">
-    <w:abstractNumId w:val="13"/>
+    <w:abstractNumId w:val="15"/>
   </w:num>
   <w:num w:numId="3" w16cid:durableId="588125869">
     <w:abstractNumId w:val="3"/>
@@ -6748,28 +7309,34 @@
     <w:abstractNumId w:val="6"/>
   </w:num>
   <w:num w:numId="7" w16cid:durableId="313225329">
-    <w:abstractNumId w:val="8"/>
+    <w:abstractNumId w:val="9"/>
   </w:num>
   <w:num w:numId="8" w16cid:durableId="11156116">
     <w:abstractNumId w:val="2"/>
   </w:num>
   <w:num w:numId="9" w16cid:durableId="1024936680">
-    <w:abstractNumId w:val="10"/>
+    <w:abstractNumId w:val="11"/>
   </w:num>
   <w:num w:numId="10" w16cid:durableId="1490097057">
     <w:abstractNumId w:val="5"/>
   </w:num>
   <w:num w:numId="11" w16cid:durableId="1170869400">
-    <w:abstractNumId w:val="7"/>
+    <w:abstractNumId w:val="8"/>
   </w:num>
   <w:num w:numId="12" w16cid:durableId="2014062361">
-    <w:abstractNumId w:val="12"/>
+    <w:abstractNumId w:val="14"/>
   </w:num>
   <w:num w:numId="13" w16cid:durableId="241136983">
-    <w:abstractNumId w:val="9"/>
+    <w:abstractNumId w:val="10"/>
   </w:num>
   <w:num w:numId="14" w16cid:durableId="529539341">
     <w:abstractNumId w:val="4"/>
+  </w:num>
+  <w:num w:numId="15" w16cid:durableId="1436974733">
+    <w:abstractNumId w:val="7"/>
+  </w:num>
+  <w:num w:numId="16" w16cid:durableId="46534208">
+    <w:abstractNumId w:val="13"/>
   </w:num>
 </w:numbering>
 </file>
@@ -7377,7 +7944,6 @@
   <w:style w:type="character" w:default="1" w:styleId="DefaultParagraphFont">
     <w:name w:val="Default Paragraph Font"/>
     <w:uiPriority w:val="1"/>
-    <w:semiHidden/>
     <w:unhideWhenUsed/>
   </w:style>
   <w:style w:type="table" w:default="1" w:styleId="TableNormal">

</xml_diff>

<commit_message>
Learned network namespace, coredns fundamentals, controlplane ports, CNI basics
</commit_message>
<xml_diff>
--- a/9-Interesting_learning_Notes/Learning_Notes.docx
+++ b/9-Interesting_learning_Notes/Learning_Notes.docx
@@ -823,6 +823,153 @@
           <w:bCs/>
         </w:rPr>
       </w:pPr>
+      <w:proofErr w:type="spellStart"/>
+      <w:r>
+        <w:rPr>
+          <w:b/>
+          <w:bCs/>
+          <w:highlight w:val="cyan"/>
+        </w:rPr>
+        <w:t>ExternalName</w:t>
+      </w:r>
+      <w:proofErr w:type="spellEnd"/>
+      <w:r>
+        <w:rPr>
+          <w:b/>
+          <w:bCs/>
+          <w:highlight w:val="cyan"/>
+        </w:rPr>
+        <w:t xml:space="preserve"> </w:t>
+      </w:r>
+      <w:proofErr w:type="spellStart"/>
+      <w:r>
+        <w:rPr>
+          <w:b/>
+          <w:bCs/>
+          <w:highlight w:val="cyan"/>
+        </w:rPr>
+        <w:t>Sevice</w:t>
+      </w:r>
+      <w:proofErr w:type="spellEnd"/>
+    </w:p>
+    <w:p>
+      <w:r>
+        <w:t xml:space="preserve">An </w:t>
+      </w:r>
+      <w:proofErr w:type="spellStart"/>
+      <w:r>
+        <w:t>ExternalName</w:t>
+      </w:r>
+      <w:proofErr w:type="spellEnd"/>
+      <w:r>
+        <w:t xml:space="preserve"> Service maps an internal Kubernetes DNS name to an external domain name using a CNAME record, allowing applications inside the cluster to access external resources without hardcoding external URLs.</w:t>
+      </w:r>
+    </w:p>
+    <w:p>
+      <w:pPr>
+        <w:rPr>
+          <w:b/>
+          <w:bCs/>
+        </w:rPr>
+      </w:pPr>
+    </w:p>
+    <w:p>
+      <w:pPr>
+        <w:rPr>
+          <w:b/>
+          <w:bCs/>
+        </w:rPr>
+      </w:pPr>
+      <w:r>
+        <w:rPr>
+          <w:b/>
+          <w:bCs/>
+        </w:rPr>
+        <w:drawing>
+          <wp:inline distT="0" distB="0" distL="0" distR="0" wp14:anchorId="3086F31D" wp14:editId="4429704F">
+            <wp:extent cx="4182059" cy="2267266"/>
+            <wp:effectExtent l="0" t="0" r="9525" b="0"/>
+            <wp:docPr id="378752925" name="Picture 1"/>
+            <wp:cNvGraphicFramePr>
+              <a:graphicFrameLocks xmlns:a="http://schemas.openxmlformats.org/drawingml/2006/main" noChangeAspect="1"/>
+            </wp:cNvGraphicFramePr>
+            <a:graphic xmlns:a="http://schemas.openxmlformats.org/drawingml/2006/main">
+              <a:graphicData uri="http://schemas.openxmlformats.org/drawingml/2006/picture">
+                <pic:pic xmlns:pic="http://schemas.openxmlformats.org/drawingml/2006/picture">
+                  <pic:nvPicPr>
+                    <pic:cNvPr id="378752925" name=""/>
+                    <pic:cNvPicPr/>
+                  </pic:nvPicPr>
+                  <pic:blipFill>
+                    <a:blip r:embed="rId9"/>
+                    <a:stretch>
+                      <a:fillRect/>
+                    </a:stretch>
+                  </pic:blipFill>
+                  <pic:spPr>
+                    <a:xfrm>
+                      <a:off x="0" y="0"/>
+                      <a:ext cx="4182059" cy="2267266"/>
+                    </a:xfrm>
+                    <a:prstGeom prst="rect">
+                      <a:avLst/>
+                    </a:prstGeom>
+                  </pic:spPr>
+                </pic:pic>
+              </a:graphicData>
+            </a:graphic>
+          </wp:inline>
+        </w:drawing>
+      </w:r>
+    </w:p>
+    <w:p>
+      <w:pPr>
+        <w:rPr>
+          <w:b/>
+          <w:bCs/>
+        </w:rPr>
+      </w:pPr>
+      <w:r>
+        <w:rPr>
+          <w:b/>
+          <w:bCs/>
+        </w:rPr>
+        <w:drawing>
+          <wp:inline distT="0" distB="0" distL="0" distR="0" wp14:anchorId="42ABF307" wp14:editId="075D060A">
+            <wp:extent cx="5943600" cy="1932305"/>
+            <wp:effectExtent l="0" t="0" r="0" b="0"/>
+            <wp:docPr id="1704741796" name="Picture 1"/>
+            <wp:cNvGraphicFramePr>
+              <a:graphicFrameLocks xmlns:a="http://schemas.openxmlformats.org/drawingml/2006/main" noChangeAspect="1"/>
+            </wp:cNvGraphicFramePr>
+            <a:graphic xmlns:a="http://schemas.openxmlformats.org/drawingml/2006/main">
+              <a:graphicData uri="http://schemas.openxmlformats.org/drawingml/2006/picture">
+                <pic:pic xmlns:pic="http://schemas.openxmlformats.org/drawingml/2006/picture">
+                  <pic:nvPicPr>
+                    <pic:cNvPr id="1704741796" name=""/>
+                    <pic:cNvPicPr/>
+                  </pic:nvPicPr>
+                  <pic:blipFill>
+                    <a:blip r:embed="rId10"/>
+                    <a:stretch>
+                      <a:fillRect/>
+                    </a:stretch>
+                  </pic:blipFill>
+                  <pic:spPr>
+                    <a:xfrm>
+                      <a:off x="0" y="0"/>
+                      <a:ext cx="5943600" cy="1932305"/>
+                    </a:xfrm>
+                    <a:prstGeom prst="rect">
+                      <a:avLst/>
+                    </a:prstGeom>
+                  </pic:spPr>
+                </pic:pic>
+              </a:graphicData>
+            </a:graphic>
+          </wp:inline>
+        </w:drawing>
+      </w:r>
       <w:r>
         <w:rPr>
           <w:b/>
@@ -860,6 +1007,7 @@
           <w:b/>
           <w:bCs/>
         </w:rPr>
+        <w:lastRenderedPageBreak/>
         <w:t>GENERAL KUBERNETES KNOWLEDGE</w:t>
       </w:r>
     </w:p>
@@ -1113,46 +1261,46 @@
           <w:b/>
           <w:bCs/>
         </w:rPr>
+        <w:t>Service Dependency</w:t>
+      </w:r>
+    </w:p>
+    <w:p>
+      <w:pPr>
+        <w:rPr>
+          <w:b/>
+          <w:bCs/>
+        </w:rPr>
+      </w:pPr>
+    </w:p>
+    <w:p>
+      <w:proofErr w:type="spellStart"/>
+      <w:r>
+        <w:t>kubectl</w:t>
+      </w:r>
+      <w:proofErr w:type="spellEnd"/>
+      <w:r>
+        <w:t xml:space="preserve"> apply -f folder/ does not guarantee resource creation order.</w:t>
+      </w:r>
+    </w:p>
+    <w:p>
+      <w:r>
+        <w:t>A Pod may start before its required Service exists.</w:t>
+      </w:r>
+    </w:p>
+    <w:p>
+      <w:r>
+        <w:t>The application should retry the connection until the Service is available.</w:t>
+      </w:r>
+    </w:p>
+    <w:p>
+      <w:r>
+        <w:t>Readiness probes prevent traffic from reaching the Pod until the application is ready.</w:t>
+      </w:r>
+    </w:p>
+    <w:p/>
+    <w:p>
+      <w:r>
         <w:lastRenderedPageBreak/>
-        <w:t>Service Dependency</w:t>
-      </w:r>
-    </w:p>
-    <w:p>
-      <w:pPr>
-        <w:rPr>
-          <w:b/>
-          <w:bCs/>
-        </w:rPr>
-      </w:pPr>
-    </w:p>
-    <w:p>
-      <w:proofErr w:type="spellStart"/>
-      <w:r>
-        <w:t>kubectl</w:t>
-      </w:r>
-      <w:proofErr w:type="spellEnd"/>
-      <w:r>
-        <w:t xml:space="preserve"> apply -f folder/ does not guarantee resource creation order.</w:t>
-      </w:r>
-    </w:p>
-    <w:p>
-      <w:r>
-        <w:t>A Pod may start before its required Service exists.</w:t>
-      </w:r>
-    </w:p>
-    <w:p>
-      <w:r>
-        <w:t>The application should retry the connection until the Service is available.</w:t>
-      </w:r>
-    </w:p>
-    <w:p>
-      <w:r>
-        <w:t>Readiness probes prevent traffic from reaching the Pod until the application is ready.</w:t>
-      </w:r>
-    </w:p>
-    <w:p/>
-    <w:p>
-      <w:r>
         <w:t xml:space="preserve">Remember: Kubernetes doesn't manage dependency order; the application handles </w:t>
       </w:r>
       <w:r>
@@ -1237,7 +1385,7 @@
                     <pic:cNvPicPr/>
                   </pic:nvPicPr>
                   <pic:blipFill>
-                    <a:blip r:embed="rId9"/>
+                    <a:blip r:embed="rId11"/>
                     <a:stretch>
                       <a:fillRect/>
                     </a:stretch>
@@ -1437,758 +1585,911 @@
     <w:p>
       <w:proofErr w:type="spellStart"/>
       <w:r>
+        <w:t>kubectl</w:t>
+      </w:r>
+      <w:proofErr w:type="spellEnd"/>
+      <w:r>
+        <w:t xml:space="preserve"> logs commands only displays the applications </w:t>
+      </w:r>
+      <w:proofErr w:type="spellStart"/>
+      <w:r>
+        <w:rPr>
+          <w:b/>
+          <w:bCs/>
+        </w:rPr>
+        <w:t>stdout</w:t>
+      </w:r>
+      <w:proofErr w:type="spellEnd"/>
+      <w:r>
+        <w:t xml:space="preserve"> and </w:t>
+      </w:r>
+      <w:r>
+        <w:rPr>
+          <w:b/>
+          <w:bCs/>
+        </w:rPr>
+        <w:t>stderr</w:t>
+      </w:r>
+      <w:r>
+        <w:rPr>
+          <w:b/>
+          <w:bCs/>
+        </w:rPr>
+        <w:t xml:space="preserve">. </w:t>
+      </w:r>
+      <w:r>
+        <w:t xml:space="preserve">It does not include application specific </w:t>
+      </w:r>
+      <w:r>
+        <w:t>logs.</w:t>
+      </w:r>
+      <w:r>
+        <w:t xml:space="preserve"> </w:t>
+      </w:r>
+      <w:proofErr w:type="spellStart"/>
+      <w:r>
+        <w:t>etc</w:t>
+      </w:r>
+      <w:proofErr w:type="spellEnd"/>
+      <w:r>
+        <w:t xml:space="preserve"> those stored in /var/</w:t>
+      </w:r>
+      <w:r>
+        <w:t>…</w:t>
+      </w:r>
+    </w:p>
+    <w:p/>
+    <w:p>
+      <w:r>
+        <w:rPr>
+          <w:b/>
+          <w:bCs/>
+        </w:rPr>
+        <w:t>Custom-Scheduler:</w:t>
+      </w:r>
+    </w:p>
+    <w:p>
+      <w:r>
+        <w:t xml:space="preserve">After using a customer-scheduler, if you want to see the evidence that the pod used it, you can get the events of the po along with -o wide flag. Check the </w:t>
+      </w:r>
+      <w:r>
+        <w:rPr>
+          <w:b/>
+          <w:bCs/>
+        </w:rPr>
+        <w:t>SOURCE</w:t>
+      </w:r>
+      <w:r>
+        <w:t xml:space="preserve"> field.</w:t>
+      </w:r>
+    </w:p>
+    <w:p>
+      <w:r>
+        <w:t xml:space="preserve">Eg: </w:t>
+      </w:r>
+      <w:proofErr w:type="gramStart"/>
+      <w:r>
+        <w:t>“</w:t>
+      </w:r>
+      <w:r>
+        <w:t xml:space="preserve"> my</w:t>
+      </w:r>
+      <w:proofErr w:type="gramEnd"/>
+      <w:r>
+        <w:t xml:space="preserve">-scheduler, my-scheduler-my-scheduler   Successfully assigned default/nginx to </w:t>
+      </w:r>
+      <w:proofErr w:type="spellStart"/>
+      <w:r>
+        <w:t>controlplan</w:t>
+      </w:r>
+      <w:proofErr w:type="spellEnd"/>
+      <w:r>
+        <w:t>”</w:t>
+      </w:r>
+    </w:p>
+    <w:p/>
+    <w:p>
+      <w:pPr>
+        <w:rPr>
+          <w:b/>
+          <w:bCs/>
+        </w:rPr>
+      </w:pPr>
+      <w:r>
+        <w:rPr>
+          <w:b/>
+          <w:bCs/>
+        </w:rPr>
+        <w:t>Kubernetes scheduling Stages</w:t>
+      </w:r>
+    </w:p>
+    <w:p>
+      <w:r>
+        <w:t xml:space="preserve">Kubernetes scheduling involves the scheduler selecting a suitable node for a Pod. The main stages are </w:t>
+      </w:r>
+      <w:r>
+        <w:rPr>
+          <w:b/>
+          <w:bCs/>
+        </w:rPr>
+        <w:t>Queue → Filter → Score → Bind</w:t>
+      </w:r>
+      <w:r>
+        <w:t xml:space="preserve">. Queue selects a pending Pod, Filter eliminates nodes where the Pod cannot run, Score ranks the remaining nodes, and Bind assigns the Pod to the selected node. The scheduler records the selected node in the Pod object's </w:t>
+      </w:r>
+      <w:proofErr w:type="spellStart"/>
+      <w:proofErr w:type="gramStart"/>
+      <w:r>
+        <w:t>spec.nodeName</w:t>
+      </w:r>
+      <w:proofErr w:type="spellEnd"/>
+      <w:proofErr w:type="gramEnd"/>
+      <w:r>
+        <w:t xml:space="preserve"> field. The </w:t>
+      </w:r>
+      <w:proofErr w:type="spellStart"/>
+      <w:r>
+        <w:t>kubelet</w:t>
+      </w:r>
+      <w:proofErr w:type="spellEnd"/>
+      <w:r>
+        <w:t xml:space="preserve"> on that node then starts the Pod.</w:t>
+      </w:r>
+    </w:p>
+    <w:p/>
+    <w:p>
+      <w:r>
+        <w:rPr>
+          <w:b/>
+          <w:bCs/>
+        </w:rPr>
+        <w:t>Scheduler profiles</w:t>
+      </w:r>
+    </w:p>
+    <w:p>
+      <w:r>
+        <w:rPr>
+          <w:b/>
+          <w:bCs/>
+        </w:rPr>
+        <w:t>Scheduler profiles</w:t>
+      </w:r>
+      <w:r>
+        <w:t xml:space="preserve"> are different configurations of the same </w:t>
+      </w:r>
+      <w:proofErr w:type="spellStart"/>
+      <w:r>
+        <w:t>kube</w:t>
+      </w:r>
+      <w:proofErr w:type="spellEnd"/>
+      <w:r>
+        <w:t xml:space="preserve">-scheduler. Each profile can have its own </w:t>
+      </w:r>
+      <w:r>
+        <w:rPr>
+          <w:b/>
+          <w:bCs/>
+        </w:rPr>
+        <w:t>scheduler plugins</w:t>
+      </w:r>
+      <w:r>
+        <w:t xml:space="preserve"> enabled, disabled, or configured. A Pod selects a profile using </w:t>
+      </w:r>
+      <w:proofErr w:type="spellStart"/>
+      <w:proofErr w:type="gramStart"/>
+      <w:r>
+        <w:t>spec.schedulerName</w:t>
+      </w:r>
+      <w:proofErr w:type="spellEnd"/>
+      <w:proofErr w:type="gramEnd"/>
+      <w:r>
+        <w:t xml:space="preserve">. Plugins implement scheduling logic at stages such as </w:t>
+      </w:r>
+      <w:r>
+        <w:rPr>
+          <w:b/>
+          <w:bCs/>
+        </w:rPr>
+        <w:t>Filter</w:t>
+      </w:r>
+      <w:r>
+        <w:t xml:space="preserve"> and </w:t>
+      </w:r>
+      <w:r>
+        <w:rPr>
+          <w:b/>
+          <w:bCs/>
+        </w:rPr>
+        <w:t>Score</w:t>
+      </w:r>
+      <w:r>
+        <w:t>. This allows different Pods to use different scheduling behavior.</w:t>
+      </w:r>
+    </w:p>
+    <w:p/>
+    <w:p>
+      <w:r>
+        <w:rPr>
+          <w:b/>
+          <w:bCs/>
+        </w:rPr>
+        <w:t>Admission Controller</w:t>
+      </w:r>
+      <w:r>
+        <w:rPr>
+          <w:b/>
+          <w:bCs/>
+        </w:rPr>
+        <w:t>:</w:t>
+      </w:r>
+    </w:p>
+    <w:p>
+      <w:r>
+        <w:t xml:space="preserve">An </w:t>
+      </w:r>
+      <w:r>
+        <w:rPr>
+          <w:b/>
+          <w:bCs/>
+        </w:rPr>
+        <w:t>Admission Controller</w:t>
+      </w:r>
+      <w:r>
+        <w:t xml:space="preserve"> intercepts API requests after authentication and authorization but before the object is stored in </w:t>
+      </w:r>
+      <w:proofErr w:type="spellStart"/>
+      <w:r>
+        <w:t>etcd</w:t>
+      </w:r>
+      <w:proofErr w:type="spellEnd"/>
+      <w:r>
+        <w:t xml:space="preserve">. It can </w:t>
+      </w:r>
+      <w:r>
+        <w:rPr>
+          <w:b/>
+          <w:bCs/>
+        </w:rPr>
+        <w:t>validate, modify, or reject</w:t>
+      </w:r>
+      <w:r>
+        <w:t xml:space="preserve"> requests. Admission controllers are used to enforce cluster-wide policies such as requiring security settings, labels, resource limits, or approved container images. </w:t>
+      </w:r>
+      <w:r>
+        <w:rPr>
+          <w:b/>
+          <w:bCs/>
+        </w:rPr>
+        <w:t>Real-world use case:</w:t>
+      </w:r>
+      <w:r>
+        <w:t xml:space="preserve"> a company can use an admission controller to reject Pods that use images from untrusted registries and allow only images from its approved private registry.</w:t>
+      </w:r>
+    </w:p>
+    <w:p>
+      <w:r>
+        <w:rPr>
+          <w:b/>
+          <w:bCs/>
+        </w:rPr>
+        <w:t xml:space="preserve">How Kubernetes determine to allow or </w:t>
+      </w:r>
+      <w:proofErr w:type="spellStart"/>
+      <w:proofErr w:type="gramStart"/>
+      <w:r>
+        <w:rPr>
+          <w:b/>
+          <w:bCs/>
+        </w:rPr>
+        <w:t>deny:</w:t>
+      </w:r>
+      <w:r>
+        <w:rPr>
+          <w:b/>
+          <w:bCs/>
+        </w:rPr>
+        <w:t>s</w:t>
+      </w:r>
+      <w:proofErr w:type="spellEnd"/>
+      <w:proofErr w:type="gramEnd"/>
+    </w:p>
+    <w:p>
+      <w:r>
+        <w:t xml:space="preserve">The </w:t>
+      </w:r>
+      <w:proofErr w:type="spellStart"/>
+      <w:r>
+        <w:t>ImagePolicyWebhook</w:t>
+      </w:r>
+      <w:proofErr w:type="spellEnd"/>
+      <w:r>
+        <w:t xml:space="preserve"> sends information about the requested container image to an external webhook. The webhook performs its own policy logic and then returns an </w:t>
+      </w:r>
+      <w:proofErr w:type="spellStart"/>
+      <w:r>
+        <w:t>ImageReview</w:t>
+      </w:r>
+      <w:proofErr w:type="spellEnd"/>
+      <w:r>
+        <w:t xml:space="preserve"> response. Kubernetes does not care how the webhook makes its decision; it expects the decision in the </w:t>
+      </w:r>
+      <w:proofErr w:type="spellStart"/>
+      <w:proofErr w:type="gramStart"/>
+      <w:r>
+        <w:t>status.allowed</w:t>
+      </w:r>
+      <w:proofErr w:type="spellEnd"/>
+      <w:proofErr w:type="gramEnd"/>
+      <w:r>
+        <w:t xml:space="preserve"> field. </w:t>
+      </w:r>
+      <w:proofErr w:type="spellStart"/>
+      <w:proofErr w:type="gramStart"/>
+      <w:r>
+        <w:t>status.allowed</w:t>
+      </w:r>
+      <w:proofErr w:type="spellEnd"/>
+      <w:proofErr w:type="gramEnd"/>
+      <w:r>
+        <w:t xml:space="preserve">: true allows the image, while </w:t>
+      </w:r>
+      <w:proofErr w:type="spellStart"/>
+      <w:proofErr w:type="gramStart"/>
+      <w:r>
+        <w:t>status.allowed</w:t>
+      </w:r>
+      <w:proofErr w:type="spellEnd"/>
+      <w:proofErr w:type="gramEnd"/>
+      <w:r>
+        <w:t>: false rejects it.</w:t>
+      </w:r>
+    </w:p>
+    <w:p/>
+    <w:p>
+      <w:pPr>
+        <w:rPr>
+          <w:b/>
+          <w:bCs/>
+        </w:rPr>
+      </w:pPr>
+      <w:r>
+        <w:rPr>
+          <w:b/>
+          <w:bCs/>
+        </w:rPr>
+        <w:t>ENTRYPOINT can be written in two forms:</w:t>
+      </w:r>
+    </w:p>
+    <w:p>
+      <w:pPr>
+        <w:rPr>
+          <w:b/>
+          <w:bCs/>
+        </w:rPr>
+      </w:pPr>
+      <w:r>
+        <w:rPr>
+          <w:b/>
+          <w:bCs/>
+        </w:rPr>
+        <w:t>In Docker:</w:t>
+      </w:r>
+    </w:p>
+    <w:p>
+      <w:r>
         <w:lastRenderedPageBreak/>
+        <w:t>Exec form: ENTRYPOINT ["command"] — runs the command directly. CMD or arguments passed with docker run are appended as arguments. Recommended for applications.</w:t>
+      </w:r>
+    </w:p>
+    <w:p>
+      <w:r>
+        <w:t>Shell form: ENTRYPOINT command — runs through /bin/</w:t>
+      </w:r>
+      <w:proofErr w:type="spellStart"/>
+      <w:r>
+        <w:t>sh</w:t>
+      </w:r>
+      <w:proofErr w:type="spellEnd"/>
+      <w:r>
+        <w:t xml:space="preserve"> -c. CMD and runtime arguments are not passed to the </w:t>
+      </w:r>
+      <w:proofErr w:type="spellStart"/>
+      <w:r>
+        <w:t>entrypoint</w:t>
+      </w:r>
+      <w:proofErr w:type="spellEnd"/>
+      <w:r>
+        <w:t xml:space="preserve"> command in the normal way. Useful when shell features such as &amp;&amp;, pipes, or variable expansion are required.</w:t>
+      </w:r>
+    </w:p>
+    <w:p>
+      <w:r>
+        <w:t>Rule: Use exec form for normal applications; use shell form when shell behavior is specifically required.</w:t>
+      </w:r>
+    </w:p>
+    <w:p>
+      <w:r>
+        <w:rPr>
+          <w:b/>
+          <w:bCs/>
+        </w:rPr>
+        <w:t>ENTRYPOINT</w:t>
+      </w:r>
+      <w:r>
+        <w:t xml:space="preserve"> provides the main executable; </w:t>
+      </w:r>
+      <w:r>
+        <w:rPr>
+          <w:b/>
+          <w:bCs/>
+        </w:rPr>
+        <w:t>CMD</w:t>
+      </w:r>
+      <w:r>
+        <w:t xml:space="preserve"> provides default arguments to it, which can be overridden by arguments supplied to docker run.</w:t>
+      </w:r>
+    </w:p>
+    <w:p/>
+    <w:p>
+      <w:r>
+        <w:t xml:space="preserve">To over ride an entry point, use </w:t>
+      </w:r>
+      <w:proofErr w:type="gramStart"/>
+      <w:r>
+        <w:t xml:space="preserve">the  </w:t>
+      </w:r>
+      <w:r>
+        <w:rPr>
+          <w:b/>
+          <w:bCs/>
+        </w:rPr>
+        <w:t>“</w:t>
+      </w:r>
+      <w:proofErr w:type="gramEnd"/>
+      <w:r>
+        <w:rPr>
+          <w:b/>
+          <w:bCs/>
+        </w:rPr>
+        <w:t>--</w:t>
+      </w:r>
+      <w:proofErr w:type="spellStart"/>
+      <w:r>
+        <w:rPr>
+          <w:b/>
+          <w:bCs/>
+        </w:rPr>
+        <w:t>entrypoint</w:t>
+      </w:r>
+      <w:proofErr w:type="spellEnd"/>
+      <w:r>
+        <w:rPr>
+          <w:b/>
+          <w:bCs/>
+        </w:rPr>
+        <w:t>”</w:t>
+      </w:r>
+      <w:r>
+        <w:t xml:space="preserve"> flag.</w:t>
+      </w:r>
+    </w:p>
+    <w:p>
+      <w:proofErr w:type="spellStart"/>
+      <w:r>
+        <w:t>eg</w:t>
+      </w:r>
+      <w:proofErr w:type="spellEnd"/>
+      <w:r>
+        <w:t xml:space="preserve">: </w:t>
+      </w:r>
+      <w:r>
+        <w:t xml:space="preserve">docker run </w:t>
+      </w:r>
+      <w:r>
+        <w:rPr>
+          <w:b/>
+          <w:bCs/>
+        </w:rPr>
+        <w:t>--</w:t>
+      </w:r>
+      <w:proofErr w:type="spellStart"/>
+      <w:r>
+        <w:rPr>
+          <w:b/>
+          <w:bCs/>
+        </w:rPr>
+        <w:t>entrypoint</w:t>
+      </w:r>
+      <w:proofErr w:type="spellEnd"/>
+      <w:r>
+        <w:t xml:space="preserve"> ls </w:t>
+      </w:r>
+      <w:proofErr w:type="gramStart"/>
+      <w:r>
+        <w:t>image</w:t>
+      </w:r>
+      <w:r>
+        <w:t xml:space="preserve">  #</w:t>
+      </w:r>
+      <w:proofErr w:type="gramEnd"/>
+      <w:r>
+        <w:t xml:space="preserve"> This </w:t>
+      </w:r>
+      <w:proofErr w:type="gramStart"/>
+      <w:r>
+        <w:t>override</w:t>
+      </w:r>
+      <w:proofErr w:type="gramEnd"/>
+      <w:r>
+        <w:t xml:space="preserve"> the default entry point with </w:t>
+      </w:r>
+      <w:proofErr w:type="spellStart"/>
+      <w:r>
+        <w:t>ls</w:t>
+      </w:r>
+      <w:r>
+        <w:t>s</w:t>
+      </w:r>
+      <w:proofErr w:type="spellEnd"/>
+    </w:p>
+    <w:p/>
+    <w:p>
+      <w:pPr>
+        <w:rPr>
+          <w:b/>
+          <w:bCs/>
+        </w:rPr>
+      </w:pPr>
+      <w:r>
+        <w:rPr>
+          <w:b/>
+          <w:bCs/>
+        </w:rPr>
+        <w:t>In Kubernetes:</w:t>
+      </w:r>
+    </w:p>
+    <w:p>
+      <w:r>
+        <w:t xml:space="preserve">Docker’s </w:t>
+      </w:r>
+      <w:r>
+        <w:rPr>
+          <w:b/>
+          <w:bCs/>
+        </w:rPr>
+        <w:t xml:space="preserve">Entry point = </w:t>
+      </w:r>
+      <w:r>
+        <w:t>Kubernetes</w:t>
+      </w:r>
+      <w:r>
+        <w:rPr>
+          <w:b/>
+          <w:bCs/>
+        </w:rPr>
+        <w:t xml:space="preserve"> </w:t>
+      </w:r>
+      <w:r>
+        <w:rPr>
+          <w:b/>
+          <w:bCs/>
+        </w:rPr>
+        <w:t>command</w:t>
+      </w:r>
+      <w:r>
+        <w:t xml:space="preserve">   #This is the base command that run during container start up</w:t>
+      </w:r>
+    </w:p>
+    <w:p>
+      <w:r>
+        <w:t xml:space="preserve">Docker’s </w:t>
+      </w:r>
+      <w:r>
+        <w:rPr>
+          <w:b/>
+          <w:bCs/>
+        </w:rPr>
+        <w:t xml:space="preserve">command = </w:t>
+      </w:r>
+      <w:r>
+        <w:t>Kubernetes</w:t>
+      </w:r>
+      <w:r>
+        <w:rPr>
+          <w:b/>
+          <w:bCs/>
+        </w:rPr>
+        <w:t xml:space="preserve"> </w:t>
+      </w:r>
+      <w:proofErr w:type="spellStart"/>
+      <w:proofErr w:type="gramStart"/>
+      <w:r>
+        <w:rPr>
+          <w:b/>
+          <w:bCs/>
+        </w:rPr>
+        <w:t>args</w:t>
+      </w:r>
+      <w:proofErr w:type="spellEnd"/>
+      <w:r>
+        <w:t xml:space="preserve">  #</w:t>
+      </w:r>
+      <w:proofErr w:type="gramEnd"/>
+      <w:r>
+        <w:t xml:space="preserve"> This is the argument passed to the entry point. This will be appended as an argument to entry point</w:t>
+      </w:r>
+    </w:p>
+    <w:p/>
+    <w:p/>
+    <w:p/>
+    <w:p>
+      <w:pPr>
+        <w:rPr>
+          <w:b/>
+          <w:bCs/>
+        </w:rPr>
+      </w:pPr>
+      <w:r>
+        <w:rPr>
+          <w:b/>
+          <w:bCs/>
+        </w:rPr>
+        <w:t xml:space="preserve">Difference between </w:t>
+      </w:r>
+      <w:proofErr w:type="spellStart"/>
+      <w:r>
+        <w:rPr>
+          <w:b/>
+          <w:bCs/>
+        </w:rPr>
         <w:t>kubectl</w:t>
       </w:r>
       <w:proofErr w:type="spellEnd"/>
       <w:r>
-        <w:t xml:space="preserve"> logs commands only displays the applications </w:t>
-      </w:r>
-      <w:proofErr w:type="spellStart"/>
-      <w:r>
-        <w:rPr>
-          <w:b/>
-          <w:bCs/>
-        </w:rPr>
-        <w:t>stdout</w:t>
-      </w:r>
-      <w:proofErr w:type="spellEnd"/>
-      <w:r>
-        <w:t xml:space="preserve"> and </w:t>
-      </w:r>
-      <w:r>
-        <w:rPr>
-          <w:b/>
-          <w:bCs/>
-        </w:rPr>
-        <w:t>stderr</w:t>
-      </w:r>
-      <w:r>
-        <w:rPr>
-          <w:b/>
-          <w:bCs/>
-        </w:rPr>
-        <w:t xml:space="preserve">. </w:t>
-      </w:r>
-      <w:r>
-        <w:t xml:space="preserve">It does not include application specific </w:t>
-      </w:r>
-      <w:r>
-        <w:t>logs.</w:t>
+        <w:rPr>
+          <w:b/>
+          <w:bCs/>
+        </w:rPr>
+        <w:t xml:space="preserve"> create vs </w:t>
+      </w:r>
+      <w:proofErr w:type="spellStart"/>
+      <w:r>
+        <w:rPr>
+          <w:b/>
+          <w:bCs/>
+        </w:rPr>
+        <w:t>kubectl</w:t>
+      </w:r>
+      <w:proofErr w:type="spellEnd"/>
+      <w:r>
+        <w:rPr>
+          <w:b/>
+          <w:bCs/>
+        </w:rPr>
+        <w:t xml:space="preserve"> apply</w:t>
+      </w:r>
+    </w:p>
+    <w:p>
+      <w:proofErr w:type="spellStart"/>
+      <w:r>
+        <w:rPr>
+          <w:b/>
+          <w:bCs/>
+        </w:rPr>
+        <w:t>kubectl</w:t>
+      </w:r>
+      <w:proofErr w:type="spellEnd"/>
+      <w:r>
+        <w:rPr>
+          <w:b/>
+          <w:bCs/>
+        </w:rPr>
+        <w:t xml:space="preserve"> create</w:t>
       </w:r>
       <w:r>
         <w:t xml:space="preserve"> </w:t>
       </w:r>
-      <w:proofErr w:type="spellStart"/>
-      <w:r>
-        <w:t>etc</w:t>
-      </w:r>
-      <w:proofErr w:type="spellEnd"/>
-      <w:r>
-        <w:t xml:space="preserve"> those stored in /var/</w:t>
-      </w:r>
-      <w:r>
-        <w:t>…</w:t>
-      </w:r>
-    </w:p>
-    <w:p/>
-    <w:p>
-      <w:r>
-        <w:rPr>
-          <w:b/>
-          <w:bCs/>
-        </w:rPr>
-        <w:t>Custom-Scheduler:</w:t>
-      </w:r>
-    </w:p>
-    <w:p>
-      <w:r>
-        <w:t xml:space="preserve">After using a customer-scheduler, if you want to see the evidence that the pod used it, you can get the events of the po along with -o wide flag. Check the </w:t>
-      </w:r>
-      <w:r>
-        <w:rPr>
-          <w:b/>
-          <w:bCs/>
-        </w:rPr>
-        <w:t>SOURCE</w:t>
-      </w:r>
-      <w:r>
-        <w:t xml:space="preserve"> field.</w:t>
-      </w:r>
-    </w:p>
-    <w:p>
-      <w:r>
-        <w:t xml:space="preserve">Eg: </w:t>
-      </w:r>
-      <w:proofErr w:type="gramStart"/>
-      <w:r>
-        <w:t>“</w:t>
-      </w:r>
-      <w:r>
-        <w:t xml:space="preserve"> my</w:t>
-      </w:r>
-      <w:proofErr w:type="gramEnd"/>
-      <w:r>
-        <w:t xml:space="preserve">-scheduler, my-scheduler-my-scheduler   Successfully assigned default/nginx to </w:t>
-      </w:r>
-      <w:proofErr w:type="spellStart"/>
-      <w:r>
-        <w:t>controlplan</w:t>
-      </w:r>
-      <w:proofErr w:type="spellEnd"/>
-      <w:r>
-        <w:t>”</w:t>
-      </w:r>
-    </w:p>
-    <w:p/>
-    <w:p>
-      <w:pPr>
-        <w:rPr>
-          <w:b/>
-          <w:bCs/>
-        </w:rPr>
-      </w:pPr>
-      <w:r>
-        <w:rPr>
-          <w:b/>
-          <w:bCs/>
-        </w:rPr>
-        <w:t>Kubernetes scheduling Stages</w:t>
-      </w:r>
-    </w:p>
-    <w:p>
-      <w:r>
-        <w:t xml:space="preserve">Kubernetes scheduling involves the scheduler selecting a suitable node for a Pod. The main stages are </w:t>
-      </w:r>
-      <w:r>
-        <w:rPr>
-          <w:b/>
-          <w:bCs/>
-        </w:rPr>
-        <w:t>Queue → Filter → Score → Bind</w:t>
-      </w:r>
-      <w:r>
-        <w:t xml:space="preserve">. Queue selects a pending Pod, Filter eliminates nodes where the Pod cannot run, Score ranks the remaining nodes, and Bind assigns the Pod to the selected node. The scheduler records the selected node in the Pod object's </w:t>
-      </w:r>
-      <w:proofErr w:type="spellStart"/>
-      <w:proofErr w:type="gramStart"/>
-      <w:r>
-        <w:t>spec.nodeName</w:t>
-      </w:r>
-      <w:proofErr w:type="spellEnd"/>
-      <w:proofErr w:type="gramEnd"/>
-      <w:r>
-        <w:t xml:space="preserve"> field. The </w:t>
-      </w:r>
-      <w:proofErr w:type="spellStart"/>
-      <w:r>
-        <w:t>kubelet</w:t>
-      </w:r>
-      <w:proofErr w:type="spellEnd"/>
-      <w:r>
-        <w:t xml:space="preserve"> on that node then starts the Pod.</w:t>
-      </w:r>
-    </w:p>
-    <w:p/>
-    <w:p>
-      <w:r>
-        <w:rPr>
-          <w:b/>
-          <w:bCs/>
-        </w:rPr>
-        <w:t>Scheduler profiles</w:t>
-      </w:r>
-    </w:p>
-    <w:p>
-      <w:r>
-        <w:rPr>
-          <w:b/>
-          <w:bCs/>
-        </w:rPr>
-        <w:t>Scheduler profiles</w:t>
-      </w:r>
-      <w:r>
-        <w:t xml:space="preserve"> are different configurations of the same </w:t>
-      </w:r>
-      <w:proofErr w:type="spellStart"/>
-      <w:r>
-        <w:t>kube</w:t>
-      </w:r>
-      <w:proofErr w:type="spellEnd"/>
-      <w:r>
-        <w:t xml:space="preserve">-scheduler. Each profile can have its own </w:t>
-      </w:r>
-      <w:r>
-        <w:rPr>
-          <w:b/>
-          <w:bCs/>
-        </w:rPr>
-        <w:t>scheduler plugins</w:t>
-      </w:r>
-      <w:r>
-        <w:t xml:space="preserve"> enabled, disabled, or configured. A Pod selects a profile using </w:t>
-      </w:r>
-      <w:proofErr w:type="spellStart"/>
-      <w:proofErr w:type="gramStart"/>
-      <w:r>
-        <w:t>spec.schedulerName</w:t>
-      </w:r>
-      <w:proofErr w:type="spellEnd"/>
-      <w:proofErr w:type="gramEnd"/>
-      <w:r>
-        <w:t xml:space="preserve">. Plugins implement scheduling logic at stages such as </w:t>
-      </w:r>
-      <w:r>
-        <w:rPr>
-          <w:b/>
-          <w:bCs/>
-        </w:rPr>
-        <w:t>Filter</w:t>
-      </w:r>
-      <w:r>
-        <w:t xml:space="preserve"> and </w:t>
-      </w:r>
-      <w:r>
-        <w:rPr>
-          <w:b/>
-          <w:bCs/>
-        </w:rPr>
-        <w:t>Score</w:t>
-      </w:r>
-      <w:r>
-        <w:t>. This allows different Pods to use different scheduling behavior.</w:t>
-      </w:r>
-    </w:p>
-    <w:p/>
-    <w:p>
-      <w:r>
-        <w:rPr>
-          <w:b/>
-          <w:bCs/>
-        </w:rPr>
-        <w:t>Admission Controller</w:t>
-      </w:r>
-      <w:r>
-        <w:rPr>
-          <w:b/>
-          <w:bCs/>
-        </w:rPr>
-        <w:t>:</w:t>
-      </w:r>
-    </w:p>
-    <w:p>
-      <w:r>
-        <w:t xml:space="preserve">An </w:t>
-      </w:r>
-      <w:r>
-        <w:rPr>
-          <w:b/>
-          <w:bCs/>
-        </w:rPr>
-        <w:t>Admission Controller</w:t>
-      </w:r>
-      <w:r>
-        <w:t xml:space="preserve"> intercepts API requests after authentication and authorization but before the object is stored in </w:t>
-      </w:r>
-      <w:proofErr w:type="spellStart"/>
-      <w:r>
-        <w:t>etcd</w:t>
-      </w:r>
-      <w:proofErr w:type="spellEnd"/>
-      <w:r>
-        <w:t xml:space="preserve">. It can </w:t>
-      </w:r>
-      <w:r>
-        <w:rPr>
-          <w:b/>
-          <w:bCs/>
-        </w:rPr>
-        <w:t>validate, modify, or reject</w:t>
-      </w:r>
-      <w:r>
-        <w:t xml:space="preserve"> requests. Admission controllers are used to enforce cluster-wide policies such as requiring security settings, labels, resource limits, or approved container images. </w:t>
-      </w:r>
-      <w:r>
-        <w:rPr>
-          <w:b/>
-          <w:bCs/>
-        </w:rPr>
-        <w:t>Real-world use case:</w:t>
-      </w:r>
-      <w:r>
-        <w:t xml:space="preserve"> a company can use an admission controller to reject Pods that use images from untrusted registries and allow only images from its approved private registry.</w:t>
-      </w:r>
-    </w:p>
-    <w:p>
-      <w:r>
-        <w:rPr>
-          <w:b/>
-          <w:bCs/>
-        </w:rPr>
-        <w:t xml:space="preserve">How Kubernetes determine to allow or </w:t>
-      </w:r>
-      <w:proofErr w:type="spellStart"/>
-      <w:proofErr w:type="gramStart"/>
-      <w:r>
-        <w:rPr>
-          <w:b/>
-          <w:bCs/>
-        </w:rPr>
-        <w:t>deny:</w:t>
-      </w:r>
-      <w:r>
-        <w:rPr>
-          <w:b/>
-          <w:bCs/>
-        </w:rPr>
-        <w:t>s</w:t>
-      </w:r>
-      <w:proofErr w:type="spellEnd"/>
-      <w:proofErr w:type="gramEnd"/>
-    </w:p>
-    <w:p>
-      <w:r>
+      <w:r>
+        <w:t>-</w:t>
+      </w:r>
+      <w:r>
+        <w:t xml:space="preserve"> Creates the resource; errors if it already exists. </w:t>
+      </w:r>
+    </w:p>
+    <w:p>
+      <w:proofErr w:type="spellStart"/>
+      <w:r>
+        <w:rPr>
+          <w:b/>
+          <w:bCs/>
+        </w:rPr>
+        <w:t>kubectl</w:t>
+      </w:r>
+      <w:proofErr w:type="spellEnd"/>
+      <w:r>
+        <w:rPr>
+          <w:b/>
+          <w:bCs/>
+        </w:rPr>
+        <w:t xml:space="preserve"> apply</w:t>
+      </w:r>
+      <w:r>
+        <w:t xml:space="preserve"> </w:t>
+      </w:r>
+      <w:r>
+        <w:t xml:space="preserve">- </w:t>
+      </w:r>
+      <w:r>
+        <w:t>Creates the resource if absent; updates it if it exists.</w:t>
+      </w:r>
+    </w:p>
+    <w:p/>
+    <w:p>
+      <w:pPr>
+        <w:rPr>
+          <w:b/>
+          <w:bCs/>
+        </w:rPr>
+      </w:pPr>
+    </w:p>
+    <w:p>
+      <w:pPr>
+        <w:rPr>
+          <w:b/>
+          <w:bCs/>
+        </w:rPr>
+      </w:pPr>
+    </w:p>
+    <w:p>
+      <w:pPr>
+        <w:rPr>
+          <w:b/>
+          <w:bCs/>
+        </w:rPr>
+      </w:pPr>
+    </w:p>
+    <w:p>
+      <w:pPr>
+        <w:rPr>
+          <w:b/>
+          <w:bCs/>
+        </w:rPr>
+      </w:pPr>
+      <w:r>
+        <w:rPr>
+          <w:b/>
+          <w:bCs/>
+          <w:highlight w:val="cyan"/>
+        </w:rPr>
         <w:lastRenderedPageBreak/>
-        <w:t xml:space="preserve">The </w:t>
-      </w:r>
-      <w:proofErr w:type="spellStart"/>
-      <w:r>
-        <w:t>ImagePolicyWebhook</w:t>
-      </w:r>
-      <w:proofErr w:type="spellEnd"/>
-      <w:r>
-        <w:t xml:space="preserve"> sends information about the requested container image to an external webhook. The webhook performs its own policy logic and then returns an </w:t>
-      </w:r>
-      <w:proofErr w:type="spellStart"/>
-      <w:r>
-        <w:t>ImageReview</w:t>
-      </w:r>
-      <w:proofErr w:type="spellEnd"/>
-      <w:r>
-        <w:t xml:space="preserve"> response. Kubernetes does not care how the webhook makes its decision; it expects the decision in the </w:t>
-      </w:r>
-      <w:proofErr w:type="spellStart"/>
-      <w:proofErr w:type="gramStart"/>
-      <w:r>
-        <w:t>status.allowed</w:t>
-      </w:r>
-      <w:proofErr w:type="spellEnd"/>
-      <w:proofErr w:type="gramEnd"/>
-      <w:r>
-        <w:t xml:space="preserve"> field. </w:t>
-      </w:r>
-      <w:proofErr w:type="spellStart"/>
-      <w:proofErr w:type="gramStart"/>
-      <w:r>
-        <w:t>status.allowed</w:t>
-      </w:r>
-      <w:proofErr w:type="spellEnd"/>
-      <w:proofErr w:type="gramEnd"/>
-      <w:r>
-        <w:t xml:space="preserve">: true allows the image, while </w:t>
-      </w:r>
-      <w:proofErr w:type="spellStart"/>
-      <w:proofErr w:type="gramStart"/>
-      <w:r>
-        <w:t>status.allowed</w:t>
-      </w:r>
-      <w:proofErr w:type="spellEnd"/>
-      <w:proofErr w:type="gramEnd"/>
-      <w:r>
-        <w:t>: false rejects it.</w:t>
-      </w:r>
-    </w:p>
-    <w:p/>
-    <w:p>
-      <w:pPr>
-        <w:rPr>
-          <w:b/>
-          <w:bCs/>
-        </w:rPr>
-      </w:pPr>
-      <w:r>
-        <w:rPr>
-          <w:b/>
-          <w:bCs/>
-        </w:rPr>
-        <w:t>ENTRYPOINT can be written in two forms:</w:t>
-      </w:r>
-    </w:p>
-    <w:p>
-      <w:pPr>
-        <w:rPr>
-          <w:b/>
-          <w:bCs/>
-        </w:rPr>
-      </w:pPr>
-      <w:r>
-        <w:rPr>
-          <w:b/>
-          <w:bCs/>
-        </w:rPr>
-        <w:t>In Docker:</w:t>
-      </w:r>
-    </w:p>
-    <w:p>
-      <w:r>
-        <w:t>Exec form: ENTRYPOINT ["command"] — runs the command directly. CMD or arguments passed with docker run are appended as arguments. Recommended for applications.</w:t>
-      </w:r>
-    </w:p>
-    <w:p>
-      <w:r>
-        <w:t>Shell form: ENTRYPOINT command — runs through /bin/</w:t>
-      </w:r>
-      <w:proofErr w:type="spellStart"/>
-      <w:r>
-        <w:t>sh</w:t>
-      </w:r>
-      <w:proofErr w:type="spellEnd"/>
-      <w:r>
-        <w:t xml:space="preserve"> -c. CMD and runtime arguments are not passed to the </w:t>
-      </w:r>
-      <w:proofErr w:type="spellStart"/>
-      <w:r>
-        <w:t>entrypoint</w:t>
-      </w:r>
-      <w:proofErr w:type="spellEnd"/>
-      <w:r>
-        <w:t xml:space="preserve"> command in the normal way. Useful when shell features such as &amp;&amp;, pipes, or variable expansion are required.</w:t>
-      </w:r>
-    </w:p>
-    <w:p>
-      <w:r>
-        <w:t>Rule: Use exec form for normal applications; use shell form when shell behavior is specifically required.</w:t>
-      </w:r>
-    </w:p>
-    <w:p>
-      <w:r>
-        <w:rPr>
-          <w:b/>
-          <w:bCs/>
-        </w:rPr>
-        <w:t>ENTRYPOINT</w:t>
-      </w:r>
-      <w:r>
-        <w:t xml:space="preserve"> provides the main executable; </w:t>
-      </w:r>
-      <w:r>
-        <w:rPr>
-          <w:b/>
-          <w:bCs/>
-        </w:rPr>
-        <w:t>CMD</w:t>
-      </w:r>
-      <w:r>
-        <w:t xml:space="preserve"> provides default arguments to it, which can be overridden by arguments supplied to docker run.</w:t>
-      </w:r>
-    </w:p>
-    <w:p/>
-    <w:p>
-      <w:r>
-        <w:t xml:space="preserve">To over ride an entry point, use </w:t>
-      </w:r>
-      <w:proofErr w:type="gramStart"/>
-      <w:r>
-        <w:t xml:space="preserve">the  </w:t>
-      </w:r>
-      <w:r>
-        <w:rPr>
-          <w:b/>
-          <w:bCs/>
-        </w:rPr>
-        <w:t>“</w:t>
-      </w:r>
-      <w:proofErr w:type="gramEnd"/>
-      <w:r>
-        <w:rPr>
-          <w:b/>
-          <w:bCs/>
-        </w:rPr>
-        <w:t>--</w:t>
-      </w:r>
-      <w:proofErr w:type="spellStart"/>
-      <w:r>
-        <w:rPr>
-          <w:b/>
-          <w:bCs/>
-        </w:rPr>
-        <w:t>entrypoint</w:t>
-      </w:r>
-      <w:proofErr w:type="spellEnd"/>
-      <w:r>
-        <w:rPr>
-          <w:b/>
-          <w:bCs/>
-        </w:rPr>
-        <w:t>”</w:t>
-      </w:r>
-      <w:r>
-        <w:t xml:space="preserve"> flag.</w:t>
-      </w:r>
-    </w:p>
-    <w:p>
-      <w:proofErr w:type="spellStart"/>
-      <w:r>
-        <w:t>eg</w:t>
-      </w:r>
-      <w:proofErr w:type="spellEnd"/>
-      <w:r>
-        <w:t xml:space="preserve">: </w:t>
-      </w:r>
-      <w:r>
-        <w:t xml:space="preserve">docker run </w:t>
-      </w:r>
-      <w:r>
-        <w:rPr>
-          <w:b/>
-          <w:bCs/>
-        </w:rPr>
-        <w:t>--</w:t>
-      </w:r>
-      <w:proofErr w:type="spellStart"/>
-      <w:r>
-        <w:rPr>
-          <w:b/>
-          <w:bCs/>
-        </w:rPr>
-        <w:t>entrypoint</w:t>
-      </w:r>
-      <w:proofErr w:type="spellEnd"/>
-      <w:r>
-        <w:t xml:space="preserve"> ls </w:t>
-      </w:r>
-      <w:proofErr w:type="gramStart"/>
-      <w:r>
-        <w:t>image</w:t>
-      </w:r>
-      <w:r>
-        <w:t xml:space="preserve">  #</w:t>
-      </w:r>
-      <w:proofErr w:type="gramEnd"/>
-      <w:r>
-        <w:t xml:space="preserve"> This </w:t>
-      </w:r>
-      <w:proofErr w:type="gramStart"/>
-      <w:r>
-        <w:t>override</w:t>
-      </w:r>
-      <w:proofErr w:type="gramEnd"/>
-      <w:r>
-        <w:t xml:space="preserve"> the default entry point with </w:t>
-      </w:r>
-      <w:proofErr w:type="spellStart"/>
-      <w:r>
-        <w:t>ls</w:t>
-      </w:r>
-      <w:r>
-        <w:t>s</w:t>
-      </w:r>
-      <w:proofErr w:type="spellEnd"/>
-    </w:p>
-    <w:p/>
-    <w:p>
-      <w:pPr>
-        <w:rPr>
-          <w:b/>
-          <w:bCs/>
-        </w:rPr>
-      </w:pPr>
-      <w:r>
-        <w:rPr>
-          <w:b/>
-          <w:bCs/>
-        </w:rPr>
-        <w:t>In Kubernetes:</w:t>
-      </w:r>
-    </w:p>
-    <w:p>
-      <w:r>
-        <w:t xml:space="preserve">Docker’s </w:t>
-      </w:r>
-      <w:r>
-        <w:rPr>
-          <w:b/>
-          <w:bCs/>
-        </w:rPr>
-        <w:t xml:space="preserve">Entry point = </w:t>
-      </w:r>
-      <w:r>
-        <w:t>Kubernetes</w:t>
-      </w:r>
-      <w:r>
-        <w:rPr>
-          <w:b/>
-          <w:bCs/>
-        </w:rPr>
-        <w:t xml:space="preserve"> </w:t>
-      </w:r>
-      <w:r>
-        <w:rPr>
-          <w:b/>
-          <w:bCs/>
-        </w:rPr>
-        <w:t>command</w:t>
-      </w:r>
-      <w:r>
-        <w:t xml:space="preserve">   #This is the base command that run during container start up</w:t>
-      </w:r>
-    </w:p>
-    <w:p>
-      <w:r>
-        <w:t xml:space="preserve">Docker’s </w:t>
-      </w:r>
-      <w:r>
-        <w:rPr>
-          <w:b/>
-          <w:bCs/>
-        </w:rPr>
-        <w:t xml:space="preserve">command = </w:t>
-      </w:r>
-      <w:r>
-        <w:t>Kubernetes</w:t>
-      </w:r>
-      <w:r>
-        <w:rPr>
-          <w:b/>
-          <w:bCs/>
-        </w:rPr>
-        <w:t xml:space="preserve"> </w:t>
-      </w:r>
-      <w:proofErr w:type="spellStart"/>
-      <w:proofErr w:type="gramStart"/>
-      <w:r>
-        <w:rPr>
-          <w:b/>
-          <w:bCs/>
-        </w:rPr>
-        <w:t>args</w:t>
-      </w:r>
-      <w:proofErr w:type="spellEnd"/>
-      <w:r>
-        <w:t xml:space="preserve">  #</w:t>
-      </w:r>
-      <w:proofErr w:type="gramEnd"/>
-      <w:r>
-        <w:t xml:space="preserve"> This is the argument passed to the entry point. This will be appended as an argument to entry point</w:t>
-      </w:r>
-    </w:p>
-    <w:p/>
-    <w:p/>
-    <w:p/>
-    <w:p>
-      <w:pPr>
-        <w:rPr>
-          <w:b/>
-          <w:bCs/>
-        </w:rPr>
-      </w:pPr>
-      <w:r>
-        <w:rPr>
-          <w:b/>
-          <w:bCs/>
-        </w:rPr>
-        <w:lastRenderedPageBreak/>
-        <w:t xml:space="preserve">Difference between </w:t>
-      </w:r>
-      <w:proofErr w:type="spellStart"/>
-      <w:r>
-        <w:rPr>
-          <w:b/>
-          <w:bCs/>
-        </w:rPr>
-        <w:t>kubectl</w:t>
-      </w:r>
-      <w:proofErr w:type="spellEnd"/>
-      <w:r>
-        <w:rPr>
-          <w:b/>
-          <w:bCs/>
-        </w:rPr>
-        <w:t xml:space="preserve"> create vs </w:t>
-      </w:r>
-      <w:proofErr w:type="spellStart"/>
-      <w:r>
-        <w:rPr>
-          <w:b/>
-          <w:bCs/>
-        </w:rPr>
-        <w:t>kubectl</w:t>
-      </w:r>
-      <w:proofErr w:type="spellEnd"/>
-      <w:r>
-        <w:rPr>
-          <w:b/>
-          <w:bCs/>
-        </w:rPr>
-        <w:t xml:space="preserve"> apply</w:t>
-      </w:r>
-    </w:p>
-    <w:p>
-      <w:proofErr w:type="spellStart"/>
-      <w:r>
-        <w:rPr>
-          <w:b/>
-          <w:bCs/>
-        </w:rPr>
-        <w:t>kubectl</w:t>
-      </w:r>
-      <w:proofErr w:type="spellEnd"/>
-      <w:r>
-        <w:rPr>
-          <w:b/>
-          <w:bCs/>
-        </w:rPr>
-        <w:t xml:space="preserve"> create</w:t>
-      </w:r>
-      <w:r>
-        <w:t xml:space="preserve"> </w:t>
-      </w:r>
-      <w:r>
-        <w:t>-</w:t>
-      </w:r>
-      <w:r>
-        <w:t xml:space="preserve"> Creates the resource; errors if it already exists. </w:t>
-      </w:r>
-    </w:p>
-    <w:p>
-      <w:proofErr w:type="spellStart"/>
-      <w:r>
-        <w:rPr>
-          <w:b/>
-          <w:bCs/>
-        </w:rPr>
-        <w:t>kubectl</w:t>
-      </w:r>
-      <w:proofErr w:type="spellEnd"/>
-      <w:r>
-        <w:rPr>
-          <w:b/>
-          <w:bCs/>
-        </w:rPr>
-        <w:t xml:space="preserve"> apply</w:t>
-      </w:r>
-      <w:r>
-        <w:t xml:space="preserve"> </w:t>
-      </w:r>
-      <w:r>
-        <w:t xml:space="preserve">- </w:t>
-      </w:r>
-      <w:r>
-        <w:t>Creates the resource if absent; updates it if it exists.</w:t>
-      </w:r>
-    </w:p>
-    <w:p/>
-    <w:p>
-      <w:pPr>
-        <w:rPr>
-          <w:b/>
-          <w:bCs/>
-        </w:rPr>
-      </w:pPr>
-      <w:r>
-        <w:rPr>
-          <w:b/>
-          <w:bCs/>
+        <w:t>PORTS</w:t>
+      </w:r>
+    </w:p>
+    <w:p>
+      <w:r>
+        <w:rPr>
+          <w:noProof/>
+        </w:rPr>
+        <w:drawing>
+          <wp:inline distT="0" distB="0" distL="0" distR="0" wp14:anchorId="0F859901" wp14:editId="0E93E40B">
+            <wp:extent cx="5943600" cy="3636645"/>
+            <wp:effectExtent l="0" t="0" r="0" b="1905"/>
+            <wp:docPr id="1589803056" name="Picture 1"/>
+            <wp:cNvGraphicFramePr>
+              <a:graphicFrameLocks xmlns:a="http://schemas.openxmlformats.org/drawingml/2006/main" noChangeAspect="1"/>
+            </wp:cNvGraphicFramePr>
+            <a:graphic xmlns:a="http://schemas.openxmlformats.org/drawingml/2006/main">
+              <a:graphicData uri="http://schemas.openxmlformats.org/drawingml/2006/picture">
+                <pic:pic xmlns:pic="http://schemas.openxmlformats.org/drawingml/2006/picture">
+                  <pic:nvPicPr>
+                    <pic:cNvPr id="0" name="Picture 1"/>
+                    <pic:cNvPicPr>
+                      <a:picLocks noChangeAspect="1" noChangeArrowheads="1"/>
+                    </pic:cNvPicPr>
+                  </pic:nvPicPr>
+                  <pic:blipFill>
+                    <a:blip r:embed="rId12" cstate="print">
+                      <a:extLst>
+                        <a:ext uri="{28A0092B-C50C-407E-A947-70E740481C1C}">
+                          <a14:useLocalDpi xmlns:a14="http://schemas.microsoft.com/office/drawing/2010/main" val="0"/>
+                        </a:ext>
+                      </a:extLst>
+                    </a:blip>
+                    <a:srcRect/>
+                    <a:stretch>
+                      <a:fillRect/>
+                    </a:stretch>
+                  </pic:blipFill>
+                  <pic:spPr bwMode="auto">
+                    <a:xfrm>
+                      <a:off x="0" y="0"/>
+                      <a:ext cx="5943600" cy="3636645"/>
+                    </a:xfrm>
+                    <a:prstGeom prst="rect">
+                      <a:avLst/>
+                    </a:prstGeom>
+                    <a:noFill/>
+                    <a:ln>
+                      <a:noFill/>
+                    </a:ln>
+                  </pic:spPr>
+                </pic:pic>
+              </a:graphicData>
+            </a:graphic>
+          </wp:inline>
+        </w:drawing>
+      </w:r>
+    </w:p>
+    <w:p>
+      <w:r>
+        <w:rPr>
+          <w:noProof/>
+        </w:rPr>
+        <w:drawing>
+          <wp:inline distT="0" distB="0" distL="0" distR="0" wp14:anchorId="097944D0" wp14:editId="0BE941F4">
+            <wp:extent cx="5943600" cy="3713480"/>
+            <wp:effectExtent l="0" t="0" r="0" b="1270"/>
+            <wp:docPr id="207782970" name="Picture 2"/>
+            <wp:cNvGraphicFramePr>
+              <a:graphicFrameLocks xmlns:a="http://schemas.openxmlformats.org/drawingml/2006/main" noChangeAspect="1"/>
+            </wp:cNvGraphicFramePr>
+            <a:graphic xmlns:a="http://schemas.openxmlformats.org/drawingml/2006/main">
+              <a:graphicData uri="http://schemas.openxmlformats.org/drawingml/2006/picture">
+                <pic:pic xmlns:pic="http://schemas.openxmlformats.org/drawingml/2006/picture">
+                  <pic:nvPicPr>
+                    <pic:cNvPr id="0" name="Picture 3"/>
+                    <pic:cNvPicPr>
+                      <a:picLocks noChangeAspect="1" noChangeArrowheads="1"/>
+                    </pic:cNvPicPr>
+                  </pic:nvPicPr>
+                  <pic:blipFill>
+                    <a:blip r:embed="rId13" cstate="print">
+                      <a:extLst>
+                        <a:ext uri="{28A0092B-C50C-407E-A947-70E740481C1C}">
+                          <a14:useLocalDpi xmlns:a14="http://schemas.microsoft.com/office/drawing/2010/main" val="0"/>
+                        </a:ext>
+                      </a:extLst>
+                    </a:blip>
+                    <a:srcRect/>
+                    <a:stretch>
+                      <a:fillRect/>
+                    </a:stretch>
+                  </pic:blipFill>
+                  <pic:spPr bwMode="auto">
+                    <a:xfrm>
+                      <a:off x="0" y="0"/>
+                      <a:ext cx="5943600" cy="3713480"/>
+                    </a:xfrm>
+                    <a:prstGeom prst="rect">
+                      <a:avLst/>
+                    </a:prstGeom>
+                    <a:noFill/>
+                    <a:ln>
+                      <a:noFill/>
+                    </a:ln>
+                  </pic:spPr>
+                </pic:pic>
+              </a:graphicData>
+            </a:graphic>
+          </wp:inline>
+        </w:drawing>
+      </w:r>
+    </w:p>
+    <w:p/>
+    <w:p/>
+    <w:p/>
+    <w:p>
+      <w:pPr>
+        <w:rPr>
+          <w:b/>
+          <w:bCs/>
+        </w:rPr>
+      </w:pPr>
+      <w:r>
+        <w:rPr>
+          <w:b/>
+          <w:bCs/>
+          <w:highlight w:val="cyan"/>
         </w:rPr>
         <w:t>METRICS SERVER</w:t>
       </w:r>
@@ -2523,7 +2824,7 @@
                     <pic:cNvPicPr/>
                   </pic:nvPicPr>
                   <pic:blipFill>
-                    <a:blip r:embed="rId10"/>
+                    <a:blip r:embed="rId14"/>
                     <a:stretch>
                       <a:fillRect/>
                     </a:stretch>
@@ -2592,7 +2893,6 @@
         <w:rPr>
           <w:noProof/>
         </w:rPr>
-        <w:lastRenderedPageBreak/>
         <w:drawing>
           <wp:inline distT="0" distB="0" distL="0" distR="0" wp14:anchorId="26C2E81C" wp14:editId="2095FD7C">
             <wp:extent cx="5943600" cy="2859405"/>
@@ -2609,7 +2909,7 @@
                     <pic:cNvPicPr/>
                   </pic:nvPicPr>
                   <pic:blipFill>
-                    <a:blip r:embed="rId11"/>
+                    <a:blip r:embed="rId15"/>
                     <a:stretch>
                       <a:fillRect/>
                     </a:stretch>
@@ -2636,6 +2936,7 @@
         <w:rPr>
           <w:noProof/>
         </w:rPr>
+        <w:lastRenderedPageBreak/>
         <w:drawing>
           <wp:inline distT="0" distB="0" distL="0" distR="0" wp14:anchorId="2B8C344E" wp14:editId="0391BC2E">
             <wp:extent cx="5943600" cy="2762885"/>
@@ -2652,7 +2953,7 @@
                     <pic:cNvPicPr/>
                   </pic:nvPicPr>
                   <pic:blipFill>
-                    <a:blip r:embed="rId12"/>
+                    <a:blip r:embed="rId16"/>
                     <a:stretch>
                       <a:fillRect/>
                     </a:stretch>
@@ -2883,6 +3184,7 @@
           <w:b/>
           <w:bCs/>
         </w:rPr>
+        <w:lastRenderedPageBreak/>
         <w:t>PodDisruptionBudget</w:t>
       </w:r>
       <w:proofErr w:type="spellEnd"/>
@@ -2981,70 +3283,70 @@
           <w:bCs/>
           <w:highlight w:val="cyan"/>
         </w:rPr>
+        <w:t>Exposing a pod with out any services:</w:t>
+      </w:r>
+    </w:p>
+    <w:p>
+      <w:pPr>
+        <w:rPr>
+          <w:b/>
+          <w:bCs/>
+        </w:rPr>
+      </w:pPr>
+    </w:p>
+    <w:p>
+      <w:r>
+        <w:t xml:space="preserve">With </w:t>
+      </w:r>
+      <w:proofErr w:type="spellStart"/>
+      <w:r>
+        <w:t>hostNetwork</w:t>
+      </w:r>
+      <w:proofErr w:type="spellEnd"/>
+      <w:r>
+        <w:t xml:space="preserve">: true, a Pod shares the node's network namespace, so it uses the node's IP address directly. The application inside the Pod can therefore listen on the node's ports and receive traffic without a </w:t>
+      </w:r>
+      <w:proofErr w:type="spellStart"/>
+      <w:r>
+        <w:t>NodePort</w:t>
+      </w:r>
+      <w:proofErr w:type="spellEnd"/>
+      <w:r>
+        <w:t xml:space="preserve"> Service.</w:t>
+      </w:r>
+    </w:p>
+    <w:p>
+      <w:r>
+        <w:t>For example, if the node IP is 192.168.49.2 and nginx listens on port 80, you can access it directly using 192.168.49.2:80.</w:t>
+      </w:r>
+    </w:p>
+    <w:p>
+      <w:r>
+        <w:t xml:space="preserve">A normal Pod has its own Pod IP and network namespace, so external clients cannot normally access it through the node IP directly. </w:t>
+      </w:r>
+      <w:proofErr w:type="spellStart"/>
+      <w:r>
+        <w:t>NodePort</w:t>
+      </w:r>
+      <w:proofErr w:type="spellEnd"/>
+      <w:r>
+        <w:t xml:space="preserve"> provides a way to expose such normal Pods through a node IP and port without using </w:t>
+      </w:r>
+      <w:proofErr w:type="spellStart"/>
+      <w:r>
+        <w:t>hostNetwork</w:t>
+      </w:r>
+      <w:proofErr w:type="spellEnd"/>
+      <w:r>
+        <w:t>.</w:t>
+      </w:r>
+    </w:p>
+    <w:p>
+      <w:r>
+        <w:rPr>
+          <w:noProof/>
+        </w:rPr>
         <w:lastRenderedPageBreak/>
-        <w:t>Exposing a pod with out any services:</w:t>
-      </w:r>
-    </w:p>
-    <w:p>
-      <w:pPr>
-        <w:rPr>
-          <w:b/>
-          <w:bCs/>
-        </w:rPr>
-      </w:pPr>
-    </w:p>
-    <w:p>
-      <w:r>
-        <w:t xml:space="preserve">With </w:t>
-      </w:r>
-      <w:proofErr w:type="spellStart"/>
-      <w:r>
-        <w:t>hostNetwork</w:t>
-      </w:r>
-      <w:proofErr w:type="spellEnd"/>
-      <w:r>
-        <w:t xml:space="preserve">: true, a Pod shares the node's network namespace, so it uses the node's IP address directly. The application inside the Pod can therefore listen on the node's ports and receive traffic without a </w:t>
-      </w:r>
-      <w:proofErr w:type="spellStart"/>
-      <w:r>
-        <w:t>NodePort</w:t>
-      </w:r>
-      <w:proofErr w:type="spellEnd"/>
-      <w:r>
-        <w:t xml:space="preserve"> Service.</w:t>
-      </w:r>
-    </w:p>
-    <w:p>
-      <w:r>
-        <w:t>For example, if the node IP is 192.168.49.2 and nginx listens on port 80, you can access it directly using 192.168.49.2:80.</w:t>
-      </w:r>
-    </w:p>
-    <w:p>
-      <w:r>
-        <w:t xml:space="preserve">A normal Pod has its own Pod IP and network namespace, so external clients cannot normally access it through the node IP directly. </w:t>
-      </w:r>
-      <w:proofErr w:type="spellStart"/>
-      <w:r>
-        <w:t>NodePort</w:t>
-      </w:r>
-      <w:proofErr w:type="spellEnd"/>
-      <w:r>
-        <w:t xml:space="preserve"> provides a way to expose such normal Pods through a node IP and port without using </w:t>
-      </w:r>
-      <w:proofErr w:type="spellStart"/>
-      <w:r>
-        <w:t>hostNetwork</w:t>
-      </w:r>
-      <w:proofErr w:type="spellEnd"/>
-      <w:r>
-        <w:t>.</w:t>
-      </w:r>
-    </w:p>
-    <w:p>
-      <w:r>
-        <w:rPr>
-          <w:noProof/>
-        </w:rPr>
         <w:drawing>
           <wp:inline distT="0" distB="0" distL="0" distR="0" wp14:anchorId="22D4B03C" wp14:editId="5479A2D8">
             <wp:extent cx="4210638" cy="1686160"/>
@@ -3061,7 +3363,7 @@
                     <pic:cNvPicPr/>
                   </pic:nvPicPr>
                   <pic:blipFill>
-                    <a:blip r:embed="rId13"/>
+                    <a:blip r:embed="rId17"/>
                     <a:stretch>
                       <a:fillRect/>
                     </a:stretch>
@@ -3103,7 +3405,7 @@
                     <pic:cNvPicPr/>
                   </pic:nvPicPr>
                   <pic:blipFill>
-                    <a:blip r:embed="rId14"/>
+                    <a:blip r:embed="rId18"/>
                     <a:stretch>
                       <a:fillRect/>
                     </a:stretch>
@@ -3138,82 +3440,82 @@
           <w:bCs/>
           <w:highlight w:val="cyan"/>
         </w:rPr>
+        <w:t>Startup probe vs Readiness/Liveness Probes:</w:t>
+      </w:r>
+    </w:p>
+    <w:p>
+      <w:r>
+        <w:rPr>
+          <w:b/>
+          <w:bCs/>
+        </w:rPr>
+        <w:t>Startup probe</w:t>
+      </w:r>
+      <w:r>
+        <w:t xml:space="preserve"> checks whether the application has finished starting; </w:t>
+      </w:r>
+      <w:r>
+        <w:rPr>
+          <w:b/>
+          <w:bCs/>
+        </w:rPr>
+        <w:t>until it succeeds, Kubernetes does not run the liveness or readiness probes,</w:t>
+      </w:r>
+      <w:r>
+        <w:t xml:space="preserve"> and if it keeps failing, the container is restarted. </w:t>
+      </w:r>
+      <w:r>
+        <w:rPr>
+          <w:b/>
+          <w:bCs/>
+        </w:rPr>
+        <w:t>Readiness probe</w:t>
+      </w:r>
+      <w:r>
+        <w:t xml:space="preserve"> checks whether the already-started application is currently ready to receive traffic; if it fails, Kubernetes removes the Pod from the Service endpoints, but does </w:t>
+      </w:r>
+      <w:r>
+        <w:rPr>
+          <w:b/>
+          <w:bCs/>
+        </w:rPr>
+        <w:t>not</w:t>
+      </w:r>
+      <w:r>
+        <w:t xml:space="preserve"> restart the container.</w:t>
+      </w:r>
+    </w:p>
+    <w:p/>
+    <w:p>
+      <w:r>
+        <w:rPr>
+          <w:b/>
+          <w:bCs/>
+        </w:rPr>
+        <w:t>Use case:</w:t>
+      </w:r>
+      <w:r>
+        <w:t xml:space="preserve"> </w:t>
+      </w:r>
+      <w:r>
+        <w:t>Used for an application that takes a long time to start, so Kubernetes waits for the application to become ready before applying the liveness and readiness checks.</w:t>
+      </w:r>
+    </w:p>
+    <w:p/>
+    <w:p>
+      <w:pPr>
+        <w:rPr>
+          <w:b/>
+          <w:bCs/>
+        </w:rPr>
+      </w:pPr>
+      <w:r>
+        <w:rPr>
+          <w:b/>
+          <w:bCs/>
+          <w:highlight w:val="cyan"/>
+        </w:rPr>
         <w:lastRenderedPageBreak/>
-        <w:t>Startup probe vs Readiness/Liveness Probes:</w:t>
-      </w:r>
-    </w:p>
-    <w:p>
-      <w:r>
-        <w:rPr>
-          <w:b/>
-          <w:bCs/>
-        </w:rPr>
-        <w:t>Startup probe</w:t>
-      </w:r>
-      <w:r>
-        <w:t xml:space="preserve"> checks whether the application has finished starting; </w:t>
-      </w:r>
-      <w:r>
-        <w:rPr>
-          <w:b/>
-          <w:bCs/>
-        </w:rPr>
-        <w:t>until it succeeds, Kubernetes does not run the liveness or readiness probes,</w:t>
-      </w:r>
-      <w:r>
-        <w:t xml:space="preserve"> and if it keeps failing, the container is restarted. </w:t>
-      </w:r>
-      <w:r>
-        <w:rPr>
-          <w:b/>
-          <w:bCs/>
-        </w:rPr>
-        <w:t>Readiness probe</w:t>
-      </w:r>
-      <w:r>
-        <w:t xml:space="preserve"> checks whether the already-started application is currently ready to receive traffic; if it fails, Kubernetes removes the Pod from the Service endpoints, but does </w:t>
-      </w:r>
-      <w:r>
-        <w:rPr>
-          <w:b/>
-          <w:bCs/>
-        </w:rPr>
-        <w:t>not</w:t>
-      </w:r>
-      <w:r>
-        <w:t xml:space="preserve"> restart the container.</w:t>
-      </w:r>
-    </w:p>
-    <w:p/>
-    <w:p>
-      <w:r>
-        <w:rPr>
-          <w:b/>
-          <w:bCs/>
-        </w:rPr>
-        <w:t>Use case:</w:t>
-      </w:r>
-      <w:r>
-        <w:t xml:space="preserve"> </w:t>
-      </w:r>
-      <w:r>
-        <w:t>Used for an application that takes a long time to start, so Kubernetes waits for the application to become ready before applying the liveness and readiness checks.</w:t>
-      </w:r>
-    </w:p>
-    <w:p/>
-    <w:p>
-      <w:pPr>
-        <w:rPr>
-          <w:b/>
-          <w:bCs/>
-        </w:rPr>
-      </w:pPr>
-      <w:r>
-        <w:rPr>
-          <w:b/>
-          <w:bCs/>
-          <w:highlight w:val="cyan"/>
-        </w:rPr>
         <w:t>How to pull an image from a private registry</w:t>
       </w:r>
     </w:p>
@@ -3297,7 +3599,7 @@
       <w:r>
         <w:t xml:space="preserve">  </w:t>
       </w:r>
-      <w:hyperlink r:id="rId15" w:history="1">
+      <w:hyperlink r:id="rId19" w:history="1">
         <w:r>
           <w:rPr>
             <w:rStyle w:val="Hyperlink"/>
@@ -3371,265 +3673,264 @@
     </w:p>
     <w:p>
       <w:r>
+        <w:t xml:space="preserve">      image: registry.example.com/</w:t>
+      </w:r>
+      <w:proofErr w:type="gramStart"/>
+      <w:r>
+        <w:t>myapp:v</w:t>
+      </w:r>
+      <w:proofErr w:type="gramEnd"/>
+      <w:r>
+        <w:t>1</w:t>
+      </w:r>
+    </w:p>
+    <w:p>
+      <w:pPr>
+        <w:rPr>
+          <w:b/>
+          <w:bCs/>
+        </w:rPr>
+      </w:pPr>
+      <w:r>
+        <w:rPr>
+          <w:b/>
+          <w:bCs/>
+        </w:rPr>
+        <w:t xml:space="preserve">  </w:t>
+      </w:r>
+      <w:proofErr w:type="spellStart"/>
+      <w:r>
+        <w:rPr>
+          <w:b/>
+          <w:bCs/>
+        </w:rPr>
+        <w:t>imagePullSecrets</w:t>
+      </w:r>
+      <w:proofErr w:type="spellEnd"/>
+      <w:r>
+        <w:rPr>
+          <w:b/>
+          <w:bCs/>
+        </w:rPr>
+        <w:t>:</w:t>
+      </w:r>
+      <w:r>
+        <w:rPr>
+          <w:b/>
+          <w:bCs/>
+        </w:rPr>
+        <w:t xml:space="preserve">   #This will allow to reference that secret</w:t>
+      </w:r>
+      <w:r>
+        <w:rPr>
+          <w:b/>
+          <w:bCs/>
+        </w:rPr>
+        <w:t>.</w:t>
+      </w:r>
+    </w:p>
+    <w:p>
+      <w:pPr>
+        <w:rPr>
+          <w:b/>
+          <w:bCs/>
+        </w:rPr>
+      </w:pPr>
+      <w:r>
+        <w:rPr>
+          <w:b/>
+          <w:bCs/>
+        </w:rPr>
+        <w:t xml:space="preserve">    - name: </w:t>
+      </w:r>
+      <w:proofErr w:type="spellStart"/>
+      <w:r>
+        <w:rPr>
+          <w:b/>
+          <w:bCs/>
+        </w:rPr>
+        <w:t>regcred</w:t>
+      </w:r>
+      <w:proofErr w:type="spellEnd"/>
+    </w:p>
+    <w:p/>
+    <w:p/>
+    <w:p>
+      <w:pPr>
+        <w:rPr>
+          <w:b/>
+          <w:bCs/>
+        </w:rPr>
+      </w:pPr>
+      <w:r>
+        <w:rPr>
+          <w:b/>
+          <w:bCs/>
+          <w:highlight w:val="cyan"/>
+        </w:rPr>
+        <w:t>Docker and Linux Capabilities</w:t>
+      </w:r>
+    </w:p>
+    <w:p/>
+    <w:p>
+      <w:r>
+        <w:t>Linux capabilities divide the privileges traditionally held by root into smaller, specific permissions.</w:t>
+      </w:r>
+    </w:p>
+    <w:p/>
+    <w:p>
+      <w:r>
+        <w:t>Docker uses capabilities to give containers only the privileges they need instead of granting them full root-level privileges.</w:t>
+      </w:r>
+    </w:p>
+    <w:p/>
+    <w:p>
+      <w:pPr>
+        <w:rPr>
+          <w:b/>
+          <w:bCs/>
+        </w:rPr>
+      </w:pPr>
+      <w:r>
+        <w:rPr>
+          <w:b/>
+          <w:bCs/>
+        </w:rPr>
+        <w:t>Examples:</w:t>
+      </w:r>
+    </w:p>
+    <w:p>
+      <w:r>
+        <w:t>- CAP_NET_BIND_SERVICE — allows binding to ports below 1024.</w:t>
+      </w:r>
+    </w:p>
+    <w:p>
+      <w:r>
+        <w:t>- CAP_NET_ADMIN — allows network administration.</w:t>
+      </w:r>
+    </w:p>
+    <w:p>
+      <w:r>
+        <w:t>- CAP_SYS_ADMIN — grants a broad set of system administration privileges.</w:t>
+      </w:r>
+    </w:p>
+    <w:p/>
+    <w:p>
+      <w:pPr>
+        <w:rPr>
+          <w:b/>
+          <w:bCs/>
+        </w:rPr>
+      </w:pPr>
+      <w:r>
+        <w:rPr>
+          <w:b/>
+          <w:bCs/>
+        </w:rPr>
+        <w:t>Useful Docker commands:</w:t>
+      </w:r>
+    </w:p>
+    <w:p>
+      <w:pPr>
+        <w:jc w:val="center"/>
+      </w:pPr>
+    </w:p>
+    <w:p>
+      <w:r>
+        <w:t># Add a capability</w:t>
+      </w:r>
+    </w:p>
+    <w:p>
+      <w:r>
+        <w:t>docker run --cap-add NET_ADMIN nginx</w:t>
+      </w:r>
+    </w:p>
+    <w:p>
+      <w:r>
+        <w:t># Drop all capabilities</w:t>
+      </w:r>
+    </w:p>
+    <w:p>
+      <w:r>
+        <w:t>docker run --cap-drop ALL nginx</w:t>
+      </w:r>
+    </w:p>
+    <w:p>
+      <w:r>
+        <w:t># Drop all, then add only the required capability</w:t>
+      </w:r>
+    </w:p>
+    <w:p>
+      <w:r>
+        <w:t>docker run --cap-drop ALL --cap-add NET_BIND_SERVICE nginx</w:t>
+      </w:r>
+    </w:p>
+    <w:p>
+      <w:pPr>
+        <w:jc w:val="center"/>
+      </w:pPr>
+    </w:p>
+    <w:p>
+      <w:pPr>
+        <w:rPr>
+          <w:b/>
+          <w:bCs/>
+        </w:rPr>
+      </w:pPr>
+      <w:r>
+        <w:rPr>
+          <w:b/>
+          <w:bCs/>
+        </w:rPr>
+        <w:t>Kubernetes equivalent:</w:t>
+      </w:r>
+    </w:p>
+    <w:p>
+      <w:proofErr w:type="spellStart"/>
+      <w:r>
+        <w:t>securityContext</w:t>
+      </w:r>
+      <w:proofErr w:type="spellEnd"/>
+      <w:r>
+        <w:t>:</w:t>
+      </w:r>
+    </w:p>
+    <w:p>
+      <w:r>
+        <w:t xml:space="preserve">  capabilities:</w:t>
+      </w:r>
+    </w:p>
+    <w:p>
+      <w:r>
+        <w:t xml:space="preserve">    drop:</w:t>
+      </w:r>
+    </w:p>
+    <w:p>
+      <w:r>
+        <w:t xml:space="preserve">      - ALL</w:t>
+      </w:r>
+    </w:p>
+    <w:p>
+      <w:r>
+        <w:t xml:space="preserve">    add:</w:t>
+      </w:r>
+    </w:p>
+    <w:p>
+      <w:r>
+        <w:t xml:space="preserve">      - NET_BIND_SERVICE</w:t>
+      </w:r>
+    </w:p>
+    <w:p>
+      <w:pPr>
+        <w:jc w:val="center"/>
+      </w:pPr>
+    </w:p>
+    <w:p>
+      <w:r>
+        <w:rPr>
+          <w:noProof/>
+        </w:rPr>
         <w:lastRenderedPageBreak/>
-        <w:t xml:space="preserve">      image: registry.example.com/</w:t>
-      </w:r>
-      <w:proofErr w:type="gramStart"/>
-      <w:r>
-        <w:t>myapp:v</w:t>
-      </w:r>
-      <w:proofErr w:type="gramEnd"/>
-      <w:r>
-        <w:t>1</w:t>
-      </w:r>
-    </w:p>
-    <w:p>
-      <w:pPr>
-        <w:rPr>
-          <w:b/>
-          <w:bCs/>
-        </w:rPr>
-      </w:pPr>
-      <w:r>
-        <w:rPr>
-          <w:b/>
-          <w:bCs/>
-        </w:rPr>
-        <w:t xml:space="preserve">  </w:t>
-      </w:r>
-      <w:proofErr w:type="spellStart"/>
-      <w:r>
-        <w:rPr>
-          <w:b/>
-          <w:bCs/>
-        </w:rPr>
-        <w:t>imagePullSecrets</w:t>
-      </w:r>
-      <w:proofErr w:type="spellEnd"/>
-      <w:r>
-        <w:rPr>
-          <w:b/>
-          <w:bCs/>
-        </w:rPr>
-        <w:t>:</w:t>
-      </w:r>
-      <w:r>
-        <w:rPr>
-          <w:b/>
-          <w:bCs/>
-        </w:rPr>
-        <w:t xml:space="preserve">   #This will allow to reference that secret</w:t>
-      </w:r>
-      <w:r>
-        <w:rPr>
-          <w:b/>
-          <w:bCs/>
-        </w:rPr>
-        <w:t>.</w:t>
-      </w:r>
-    </w:p>
-    <w:p>
-      <w:pPr>
-        <w:rPr>
-          <w:b/>
-          <w:bCs/>
-        </w:rPr>
-      </w:pPr>
-      <w:r>
-        <w:rPr>
-          <w:b/>
-          <w:bCs/>
-        </w:rPr>
-        <w:t xml:space="preserve">    - name: </w:t>
-      </w:r>
-      <w:proofErr w:type="spellStart"/>
-      <w:r>
-        <w:rPr>
-          <w:b/>
-          <w:bCs/>
-        </w:rPr>
-        <w:t>regcred</w:t>
-      </w:r>
-      <w:proofErr w:type="spellEnd"/>
-    </w:p>
-    <w:p/>
-    <w:p/>
-    <w:p>
-      <w:pPr>
-        <w:rPr>
-          <w:b/>
-          <w:bCs/>
-        </w:rPr>
-      </w:pPr>
-      <w:r>
-        <w:rPr>
-          <w:b/>
-          <w:bCs/>
-          <w:highlight w:val="cyan"/>
-        </w:rPr>
-        <w:t>Docker and Linux Capabilities</w:t>
-      </w:r>
-    </w:p>
-    <w:p/>
-    <w:p>
-      <w:r>
-        <w:t>Linux capabilities divide the privileges traditionally held by root into smaller, specific permissions.</w:t>
-      </w:r>
-    </w:p>
-    <w:p/>
-    <w:p>
-      <w:r>
-        <w:t>Docker uses capabilities to give containers only the privileges they need instead of granting them full root-level privileges.</w:t>
-      </w:r>
-    </w:p>
-    <w:p/>
-    <w:p>
-      <w:pPr>
-        <w:rPr>
-          <w:b/>
-          <w:bCs/>
-        </w:rPr>
-      </w:pPr>
-      <w:r>
-        <w:rPr>
-          <w:b/>
-          <w:bCs/>
-        </w:rPr>
-        <w:t>Examples:</w:t>
-      </w:r>
-    </w:p>
-    <w:p>
-      <w:r>
-        <w:t>- CAP_NET_BIND_SERVICE — allows binding to ports below 1024.</w:t>
-      </w:r>
-    </w:p>
-    <w:p>
-      <w:r>
-        <w:t>- CAP_NET_ADMIN — allows network administration.</w:t>
-      </w:r>
-    </w:p>
-    <w:p>
-      <w:r>
-        <w:t>- CAP_SYS_ADMIN — grants a broad set of system administration privileges.</w:t>
-      </w:r>
-    </w:p>
-    <w:p/>
-    <w:p>
-      <w:pPr>
-        <w:rPr>
-          <w:b/>
-          <w:bCs/>
-        </w:rPr>
-      </w:pPr>
-      <w:r>
-        <w:rPr>
-          <w:b/>
-          <w:bCs/>
-        </w:rPr>
-        <w:t>Useful Docker commands:</w:t>
-      </w:r>
-    </w:p>
-    <w:p>
-      <w:pPr>
-        <w:jc w:val="center"/>
-      </w:pPr>
-    </w:p>
-    <w:p>
-      <w:r>
-        <w:t># Add a capability</w:t>
-      </w:r>
-    </w:p>
-    <w:p>
-      <w:r>
-        <w:t>docker run --cap-add NET_ADMIN nginx</w:t>
-      </w:r>
-    </w:p>
-    <w:p>
-      <w:r>
-        <w:t># Drop all capabilities</w:t>
-      </w:r>
-    </w:p>
-    <w:p>
-      <w:r>
-        <w:t>docker run --cap-drop ALL nginx</w:t>
-      </w:r>
-    </w:p>
-    <w:p>
-      <w:r>
-        <w:t># Drop all, then add only the required capability</w:t>
-      </w:r>
-    </w:p>
-    <w:p>
-      <w:r>
-        <w:t>docker run --cap-drop ALL --cap-add NET_BIND_SERVICE nginx</w:t>
-      </w:r>
-    </w:p>
-    <w:p>
-      <w:pPr>
-        <w:jc w:val="center"/>
-      </w:pPr>
-    </w:p>
-    <w:p>
-      <w:pPr>
-        <w:rPr>
-          <w:b/>
-          <w:bCs/>
-        </w:rPr>
-      </w:pPr>
-      <w:r>
-        <w:rPr>
-          <w:b/>
-          <w:bCs/>
-        </w:rPr>
-        <w:lastRenderedPageBreak/>
-        <w:t>Kubernetes equivalent:</w:t>
-      </w:r>
-    </w:p>
-    <w:p>
-      <w:proofErr w:type="spellStart"/>
-      <w:r>
-        <w:t>securityContext</w:t>
-      </w:r>
-      <w:proofErr w:type="spellEnd"/>
-      <w:r>
-        <w:t>:</w:t>
-      </w:r>
-    </w:p>
-    <w:p>
-      <w:r>
-        <w:t xml:space="preserve">  capabilities:</w:t>
-      </w:r>
-    </w:p>
-    <w:p>
-      <w:r>
-        <w:t xml:space="preserve">    drop:</w:t>
-      </w:r>
-    </w:p>
-    <w:p>
-      <w:r>
-        <w:t xml:space="preserve">      - ALL</w:t>
-      </w:r>
-    </w:p>
-    <w:p>
-      <w:r>
-        <w:t xml:space="preserve">    add:</w:t>
-      </w:r>
-    </w:p>
-    <w:p>
-      <w:r>
-        <w:t xml:space="preserve">      - NET_BIND_SERVICE</w:t>
-      </w:r>
-    </w:p>
-    <w:p>
-      <w:pPr>
-        <w:jc w:val="center"/>
-      </w:pPr>
-    </w:p>
-    <w:p>
-      <w:r>
-        <w:rPr>
-          <w:noProof/>
-        </w:rPr>
         <w:drawing>
           <wp:inline distT="0" distB="0" distL="0" distR="0" wp14:anchorId="52647456" wp14:editId="72CFFBFA">
             <wp:extent cx="4077269" cy="2429214"/>
@@ -3646,7 +3947,7 @@
                     <pic:cNvPicPr/>
                   </pic:nvPicPr>
                   <pic:blipFill>
-                    <a:blip r:embed="rId16"/>
+                    <a:blip r:embed="rId20"/>
                     <a:stretch>
                       <a:fillRect/>
                     </a:stretch>
@@ -3747,7 +4048,6 @@
           <w:b/>
           <w:bCs/>
         </w:rPr>
-        <w:lastRenderedPageBreak/>
         <w:t>Usecase</w:t>
       </w:r>
       <w:proofErr w:type="spellEnd"/>
@@ -3843,6 +4143,7 @@
           <w:bCs/>
           <w:highlight w:val="yellow"/>
         </w:rPr>
+        <w:lastRenderedPageBreak/>
         <w:t xml:space="preserve">ETCD </w:t>
       </w:r>
       <w:r>
@@ -3914,7 +4215,7 @@
                     <pic:cNvPicPr/>
                   </pic:nvPicPr>
                   <pic:blipFill>
-                    <a:blip r:embed="rId17"/>
+                    <a:blip r:embed="rId21"/>
                     <a:stretch>
                       <a:fillRect/>
                     </a:stretch>
@@ -4015,7 +4316,7 @@
                     <pic:cNvPicPr/>
                   </pic:nvPicPr>
                   <pic:blipFill>
-                    <a:blip r:embed="rId18"/>
+                    <a:blip r:embed="rId22"/>
                     <a:stretch>
                       <a:fillRect/>
                     </a:stretch>
@@ -4038,7 +4339,6 @@
     </w:p>
     <w:p>
       <w:r>
-        <w:lastRenderedPageBreak/>
         <w:t xml:space="preserve">It gets the </w:t>
       </w:r>
       <w:proofErr w:type="spellStart"/>
@@ -4275,7 +4575,6 @@
         <w:rPr>
           <w:noProof/>
         </w:rPr>
-        <w:lastRenderedPageBreak/>
         <w:drawing>
           <wp:inline distT="0" distB="0" distL="0" distR="0" wp14:anchorId="3B5FA08D" wp14:editId="5E9F1644">
             <wp:extent cx="1981477" cy="1257475"/>
@@ -4292,7 +4591,7 @@
                     <pic:cNvPicPr/>
                   </pic:nvPicPr>
                   <pic:blipFill>
-                    <a:blip r:embed="rId19"/>
+                    <a:blip r:embed="rId23"/>
                     <a:stretch>
                       <a:fillRect/>
                     </a:stretch>
@@ -4566,7 +4865,7 @@
                     <pic:cNvPicPr/>
                   </pic:nvPicPr>
                   <pic:blipFill>
-                    <a:blip r:embed="rId20"/>
+                    <a:blip r:embed="rId24"/>
                     <a:stretch>
                       <a:fillRect/>
                     </a:stretch>
@@ -4593,7 +4892,6 @@
     <w:p/>
     <w:p>
       <w:r>
-        <w:lastRenderedPageBreak/>
         <w:t>Declarative: (</w:t>
       </w:r>
       <w:r>
@@ -4638,7 +4936,7 @@
                     <pic:cNvPicPr/>
                   </pic:nvPicPr>
                   <pic:blipFill>
-                    <a:blip r:embed="rId21"/>
+                    <a:blip r:embed="rId25"/>
                     <a:stretch>
                       <a:fillRect/>
                     </a:stretch>
@@ -4670,6 +4968,7 @@
         <w:rPr>
           <w:noProof/>
         </w:rPr>
+        <w:lastRenderedPageBreak/>
         <w:drawing>
           <wp:inline distT="0" distB="0" distL="0" distR="0" wp14:anchorId="508BC2A4" wp14:editId="1CB6EF10">
             <wp:extent cx="2314898" cy="1581371"/>
@@ -4686,7 +4985,7 @@
                     <pic:cNvPicPr/>
                   </pic:nvPicPr>
                   <pic:blipFill>
-                    <a:blip r:embed="rId22"/>
+                    <a:blip r:embed="rId26"/>
                     <a:stretch>
                       <a:fillRect/>
                     </a:stretch>
@@ -4861,7 +5160,6 @@
           <w:bCs/>
           <w:highlight w:val="yellow"/>
         </w:rPr>
-        <w:lastRenderedPageBreak/>
         <w:t>VOLUMES</w:t>
       </w:r>
     </w:p>
@@ -5127,7 +5425,6 @@
     </w:p>
     <w:p>
       <w:r>
-        <w:lastRenderedPageBreak/>
         <w:t xml:space="preserve">  name: </w:t>
       </w:r>
       <w:proofErr w:type="spellStart"/>
@@ -5350,7 +5647,6 @@
     </w:p>
     <w:p>
       <w:r>
-        <w:lastRenderedPageBreak/>
         <w:t xml:space="preserve">You can </w:t>
       </w:r>
       <w:proofErr w:type="gramStart"/>
@@ -7944,6 +8240,7 @@
   <w:style w:type="character" w:default="1" w:styleId="DefaultParagraphFont">
     <w:name w:val="Default Paragraph Font"/>
     <w:uiPriority w:val="1"/>
+    <w:semiHidden/>
     <w:unhideWhenUsed/>
   </w:style>
   <w:style w:type="table" w:default="1" w:styleId="TableNormal">

</xml_diff>

<commit_message>
Learned network primitives such as namespaces, CNI implementations etc.
</commit_message>
<xml_diff>
--- a/9-Interesting_learning_Notes/Learning_Notes.docx
+++ b/9-Interesting_learning_Notes/Learning_Notes.docx
@@ -412,21 +412,12 @@
         <w:t xml:space="preserve">The full DNS to refer a service is: </w:t>
       </w:r>
       <w:proofErr w:type="spellStart"/>
-      <w:proofErr w:type="gramStart"/>
-      <w:r>
-        <w:rPr>
-          <w:b/>
-          <w:bCs/>
-        </w:rPr>
-        <w:t>myservice.default.svc.cluster</w:t>
-      </w:r>
-      <w:proofErr w:type="gramEnd"/>
-      <w:r>
-        <w:rPr>
-          <w:b/>
-          <w:bCs/>
-        </w:rPr>
-        <w:t>.local</w:t>
+      <w:r>
+        <w:rPr>
+          <w:b/>
+          <w:bCs/>
+        </w:rPr>
+        <w:t>myservice.default.svc.cluster.local</w:t>
       </w:r>
       <w:proofErr w:type="spellEnd"/>
     </w:p>
@@ -463,32 +454,11 @@
       </w:r>
       <w:proofErr w:type="spellEnd"/>
       <w:r>
-        <w:t xml:space="preserve"> Service gets a full DNS address that looks like </w:t>
-      </w:r>
-      <w:proofErr w:type="gramStart"/>
-      <w:r>
-        <w:t>this:[</w:t>
-      </w:r>
-      <w:proofErr w:type="gramEnd"/>
-      <w:r>
-        <w:t>service-name</w:t>
-      </w:r>
-      <w:proofErr w:type="gramStart"/>
-      <w:r>
-        <w:t>].[</w:t>
-      </w:r>
-      <w:proofErr w:type="gramEnd"/>
-      <w:r>
-        <w:t>namespace].</w:t>
-      </w:r>
-      <w:proofErr w:type="spellStart"/>
-      <w:proofErr w:type="gramStart"/>
-      <w:r>
-        <w:t>svc.cluster</w:t>
-      </w:r>
-      <w:proofErr w:type="gramEnd"/>
-      <w:r>
-        <w:t>.local</w:t>
+        <w:t xml:space="preserve"> Service gets a full DNS address that looks like this:[service-name].[namespace].</w:t>
+      </w:r>
+      <w:proofErr w:type="spellStart"/>
+      <w:r>
+        <w:t>svc.cluster.local</w:t>
       </w:r>
       <w:proofErr w:type="spellEnd"/>
     </w:p>
@@ -502,14 +472,9 @@
       </w:pPr>
       <w:proofErr w:type="spellStart"/>
       <w:r>
-        <w:t>service-</w:t>
-      </w:r>
-      <w:proofErr w:type="gramStart"/>
-      <w:r>
-        <w:t>name:The</w:t>
-      </w:r>
-      <w:proofErr w:type="spellEnd"/>
-      <w:proofErr w:type="gramEnd"/>
+        <w:t>service-name:The</w:t>
+      </w:r>
+      <w:proofErr w:type="spellEnd"/>
       <w:r>
         <w:t xml:space="preserve"> name you gave your Service.</w:t>
       </w:r>
@@ -540,12 +505,10 @@
     </w:p>
     <w:p>
       <w:proofErr w:type="spellStart"/>
-      <w:proofErr w:type="gramStart"/>
       <w:r>
         <w:t>cluster.local</w:t>
       </w:r>
       <w:proofErr w:type="spellEnd"/>
-      <w:proofErr w:type="gramEnd"/>
       <w:r>
         <w:t>: The default local domain name for your entire cluster.</w:t>
       </w:r>
@@ -553,15 +516,7 @@
     <w:p/>
     <w:p>
       <w:r>
-        <w:t xml:space="preserve">Scenario </w:t>
-      </w:r>
-      <w:proofErr w:type="gramStart"/>
-      <w:r>
-        <w:t>A</w:t>
-      </w:r>
-      <w:proofErr w:type="gramEnd"/>
-      <w:r>
-        <w:t xml:space="preserve"> Example: A pod in the "frontend" namespace connects to a database in the same namespace using just "</w:t>
+        <w:t>Scenario A Example: A pod in the "frontend" namespace connects to a database in the same namespace using just "</w:t>
       </w:r>
       <w:proofErr w:type="spellStart"/>
       <w:r>
@@ -578,14 +533,9 @@
       </w:r>
       <w:proofErr w:type="spellStart"/>
       <w:r>
-        <w:t>db-</w:t>
-      </w:r>
-      <w:proofErr w:type="gramStart"/>
-      <w:r>
-        <w:t>service.backend</w:t>
-      </w:r>
-      <w:proofErr w:type="spellEnd"/>
-      <w:proofErr w:type="gramEnd"/>
+        <w:t>db-service.backend</w:t>
+      </w:r>
+      <w:proofErr w:type="spellEnd"/>
       <w:r>
         <w:t>".</w:t>
       </w:r>
@@ -595,13 +545,8 @@
         <w:t>The remaining part of the address—.</w:t>
       </w:r>
       <w:proofErr w:type="spellStart"/>
-      <w:proofErr w:type="gramStart"/>
-      <w:r>
-        <w:t>svc.cluster</w:t>
-      </w:r>
-      <w:proofErr w:type="gramEnd"/>
-      <w:r>
-        <w:t>.local</w:t>
+      <w:r>
+        <w:t>svc.cluster.local</w:t>
       </w:r>
       <w:proofErr w:type="spellEnd"/>
       <w:r>
@@ -621,23 +566,13 @@
       </w:r>
       <w:proofErr w:type="spellEnd"/>
       <w:r>
-        <w:t xml:space="preserve">) created automatically by the cluster. it </w:t>
-      </w:r>
-      <w:proofErr w:type="gramStart"/>
-      <w:r>
-        <w:t>contain</w:t>
-      </w:r>
-      <w:proofErr w:type="gramEnd"/>
-      <w:r>
-        <w:t xml:space="preserve"> all the search </w:t>
-      </w:r>
-      <w:proofErr w:type="spellStart"/>
-      <w:proofErr w:type="gramStart"/>
+        <w:t xml:space="preserve">) created automatically by the cluster. it contain all the search </w:t>
+      </w:r>
+      <w:proofErr w:type="spellStart"/>
       <w:r>
         <w:t>list.Because</w:t>
       </w:r>
       <w:proofErr w:type="spellEnd"/>
-      <w:proofErr w:type="gramEnd"/>
       <w:r>
         <w:t xml:space="preserve"> of this search list, if you type just </w:t>
       </w:r>
@@ -650,13 +585,8 @@
         <w:t>-service, Kubernetes automatically appends the remaining parts (.</w:t>
       </w:r>
       <w:proofErr w:type="spellStart"/>
-      <w:proofErr w:type="gramStart"/>
-      <w:r>
-        <w:t>svc.cluster</w:t>
-      </w:r>
-      <w:proofErr w:type="gramEnd"/>
-      <w:r>
-        <w:t>.local</w:t>
+      <w:r>
+        <w:t>svc.cluster.local</w:t>
       </w:r>
       <w:proofErr w:type="spellEnd"/>
       <w:r>
@@ -884,6 +814,7 @@
         <w:rPr>
           <w:b/>
           <w:bCs/>
+          <w:noProof/>
         </w:rPr>
         <w:drawing>
           <wp:inline distT="0" distB="0" distL="0" distR="0" wp14:anchorId="3086F31D" wp14:editId="4429704F">
@@ -933,6 +864,7 @@
         <w:rPr>
           <w:b/>
           <w:bCs/>
+          <w:noProof/>
         </w:rPr>
         <w:drawing>
           <wp:inline distT="0" distB="0" distL="0" distR="0" wp14:anchorId="42ABF307" wp14:editId="075D060A">
@@ -1002,130 +934,307 @@
           <w:bCs/>
         </w:rPr>
       </w:pPr>
+    </w:p>
+    <w:p>
+      <w:pPr>
+        <w:jc w:val="center"/>
+        <w:rPr>
+          <w:b/>
+          <w:bCs/>
+        </w:rPr>
+      </w:pPr>
+    </w:p>
+    <w:p>
+      <w:pPr>
+        <w:jc w:val="center"/>
+        <w:rPr>
+          <w:b/>
+          <w:bCs/>
+        </w:rPr>
+      </w:pPr>
+    </w:p>
+    <w:p>
+      <w:pPr>
+        <w:jc w:val="center"/>
+        <w:rPr>
+          <w:b/>
+          <w:bCs/>
+        </w:rPr>
+      </w:pPr>
+    </w:p>
+    <w:p>
+      <w:pPr>
+        <w:jc w:val="center"/>
+        <w:rPr>
+          <w:b/>
+          <w:bCs/>
+        </w:rPr>
+      </w:pPr>
+    </w:p>
+    <w:p>
+      <w:pPr>
+        <w:jc w:val="center"/>
+        <w:rPr>
+          <w:b/>
+          <w:bCs/>
+        </w:rPr>
+      </w:pPr>
+    </w:p>
+    <w:p>
+      <w:pPr>
+        <w:jc w:val="center"/>
+        <w:rPr>
+          <w:b/>
+          <w:bCs/>
+        </w:rPr>
+      </w:pPr>
+    </w:p>
+    <w:p>
+      <w:pPr>
+        <w:jc w:val="center"/>
+        <w:rPr>
+          <w:b/>
+          <w:bCs/>
+        </w:rPr>
+      </w:pPr>
+      <w:r>
+        <w:rPr>
+          <w:b/>
+          <w:bCs/>
+        </w:rPr>
+        <w:t>GENERAL KUBERNETES KNOWLEDGE</w:t>
+      </w:r>
+    </w:p>
+    <w:p>
+      <w:pPr>
+        <w:rPr>
+          <w:b/>
+          <w:bCs/>
+        </w:rPr>
+      </w:pPr>
+    </w:p>
+    <w:p>
+      <w:pPr>
+        <w:rPr>
+          <w:b/>
+          <w:bCs/>
+        </w:rPr>
+      </w:pPr>
+    </w:p>
+    <w:p>
+      <w:r>
+        <w:rPr>
+          <w:b/>
+          <w:bCs/>
+          <w:highlight w:val="cyan"/>
+        </w:rPr>
+        <w:t>IMPORTANT INFORMATION</w:t>
+      </w:r>
+      <w:r>
+        <w:t xml:space="preserve">:  </w:t>
+      </w:r>
+      <w:r>
+        <w:t xml:space="preserve">YAML uses </w:t>
+      </w:r>
+      <w:r>
+        <w:rPr>
+          <w:b/>
+          <w:bCs/>
+        </w:rPr>
+        <w:t>spaces</w:t>
+      </w:r>
+      <w:r>
+        <w:t xml:space="preserve"> for indentation; </w:t>
+      </w:r>
+      <w:r>
+        <w:rPr>
+          <w:b/>
+          <w:bCs/>
+        </w:rPr>
+        <w:t>tabs</w:t>
+      </w:r>
+      <w:r>
+        <w:t xml:space="preserve"> are invalid.</w:t>
+      </w:r>
+    </w:p>
+    <w:p/>
+    <w:p>
+      <w:r>
+        <w:rPr>
+          <w:b/>
+          <w:bCs/>
+          <w:highlight w:val="cyan"/>
+        </w:rPr>
+        <w:t>IMPORTANT INFORMATION</w:t>
+      </w:r>
+      <w:r>
+        <w:rPr>
+          <w:highlight w:val="cyan"/>
+        </w:rPr>
+        <w:t>:</w:t>
+      </w:r>
+      <w:r>
+        <w:t xml:space="preserve">  use </w:t>
+      </w:r>
+      <w:r>
+        <w:rPr>
+          <w:b/>
+          <w:bCs/>
+        </w:rPr>
+        <w:t>-h</w:t>
+      </w:r>
+      <w:r>
+        <w:t xml:space="preserve"> flag with commands to get example and explanations</w:t>
+      </w:r>
+      <w:r>
+        <w:t>.</w:t>
+      </w:r>
+    </w:p>
+    <w:p>
+      <w:proofErr w:type="spellStart"/>
+      <w:r>
+        <w:t>k</w:t>
+      </w:r>
+      <w:r>
+        <w:t>ubectl</w:t>
+      </w:r>
+      <w:proofErr w:type="spellEnd"/>
+      <w:r>
+        <w:t xml:space="preserve"> run pods -h  #This will shows example usages and explanations.</w:t>
+      </w:r>
+    </w:p>
+    <w:p/>
+    <w:p>
+      <w:pPr>
+        <w:rPr>
+          <w:b/>
+          <w:bCs/>
+        </w:rPr>
+      </w:pPr>
+    </w:p>
+    <w:p>
+      <w:proofErr w:type="spellStart"/>
+      <w:r>
+        <w:t>kubectl</w:t>
+      </w:r>
+      <w:proofErr w:type="spellEnd"/>
+      <w:r>
+        <w:t xml:space="preserve"> </w:t>
+      </w:r>
+      <w:proofErr w:type="spellStart"/>
+      <w:r>
+        <w:t>api</w:t>
+      </w:r>
+      <w:proofErr w:type="spellEnd"/>
+      <w:r>
+        <w:t>-resources -o wide</w:t>
+      </w:r>
+      <w:r>
+        <w:t xml:space="preserve"> : shows all resources of Kubernetes. Helps to find the </w:t>
+      </w:r>
+      <w:proofErr w:type="spellStart"/>
+      <w:r>
+        <w:t>apiversion</w:t>
+      </w:r>
+      <w:proofErr w:type="spellEnd"/>
+      <w:r>
+        <w:t xml:space="preserve">.  </w:t>
+      </w:r>
+    </w:p>
+    <w:p>
+      <w:r>
+        <w:t xml:space="preserve">When you run </w:t>
+      </w:r>
+      <w:proofErr w:type="spellStart"/>
+      <w:r>
+        <w:t>kubectl</w:t>
+      </w:r>
+      <w:proofErr w:type="spellEnd"/>
+      <w:r>
+        <w:t xml:space="preserve"> get all, the resources that should be included in the “</w:t>
+      </w:r>
+      <w:r>
+        <w:rPr>
+          <w:b/>
+          <w:bCs/>
+        </w:rPr>
+        <w:t>all</w:t>
+      </w:r>
+      <w:r>
+        <w:t>” can be seen in the output of “</w:t>
+      </w:r>
+      <w:proofErr w:type="spellStart"/>
+      <w:r>
+        <w:t>kubectl</w:t>
+      </w:r>
+      <w:proofErr w:type="spellEnd"/>
+      <w:r>
+        <w:t xml:space="preserve"> </w:t>
+      </w:r>
+      <w:proofErr w:type="spellStart"/>
+      <w:r>
+        <w:t>api</w:t>
+      </w:r>
+      <w:proofErr w:type="spellEnd"/>
+      <w:r>
+        <w:t>-resources -o wide</w:t>
+      </w:r>
+      <w:r>
+        <w:t xml:space="preserve">” command, under the </w:t>
+      </w:r>
+      <w:r>
+        <w:rPr>
+          <w:b/>
+          <w:bCs/>
+        </w:rPr>
+        <w:t>CATEGORIES</w:t>
+      </w:r>
+      <w:r>
+        <w:t xml:space="preserve"> </w:t>
+      </w:r>
+      <w:r>
+        <w:t>columns</w:t>
+      </w:r>
+    </w:p>
+    <w:p/>
+    <w:p>
+      <w:r>
+        <w:t xml:space="preserve">The cluster-info CA certificate in </w:t>
+      </w:r>
+      <w:proofErr w:type="spellStart"/>
+      <w:r>
+        <w:t>kube</w:t>
+      </w:r>
+      <w:proofErr w:type="spellEnd"/>
+      <w:r>
+        <w:t>-public acts just like the trusted root certificates in your web browser, allowing new clients to safely verify the identity of the Kubernetes API server during a secure TLS connection.</w:t>
+      </w:r>
+    </w:p>
+    <w:p/>
+    <w:p>
+      <w:pPr>
+        <w:rPr>
+          <w:b/>
+          <w:bCs/>
+        </w:rPr>
+      </w:pPr>
+    </w:p>
+    <w:p>
+      <w:pPr>
+        <w:rPr>
+          <w:b/>
+          <w:bCs/>
+        </w:rPr>
+      </w:pPr>
       <w:r>
         <w:rPr>
           <w:b/>
           <w:bCs/>
         </w:rPr>
         <w:lastRenderedPageBreak/>
-        <w:t>GENERAL KUBERNETES KNOWLEDGE</w:t>
-      </w:r>
-    </w:p>
-    <w:p>
-      <w:pPr>
-        <w:rPr>
-          <w:b/>
-          <w:bCs/>
-        </w:rPr>
-      </w:pPr>
-    </w:p>
-    <w:p>
-      <w:pPr>
-        <w:rPr>
-          <w:b/>
-          <w:bCs/>
-        </w:rPr>
-      </w:pPr>
-    </w:p>
-    <w:p>
-      <w:r>
-        <w:rPr>
-          <w:b/>
-          <w:bCs/>
-          <w:highlight w:val="cyan"/>
-        </w:rPr>
-        <w:t>IMPORTANT INFORMATION</w:t>
-      </w:r>
-      <w:r>
-        <w:t xml:space="preserve">:  </w:t>
-      </w:r>
-      <w:r>
-        <w:t xml:space="preserve">YAML uses </w:t>
-      </w:r>
-      <w:r>
-        <w:rPr>
-          <w:b/>
-          <w:bCs/>
-        </w:rPr>
-        <w:t>spaces</w:t>
-      </w:r>
-      <w:r>
-        <w:t xml:space="preserve"> for indentation; </w:t>
-      </w:r>
-      <w:r>
-        <w:rPr>
-          <w:b/>
-          <w:bCs/>
-        </w:rPr>
-        <w:t>tabs</w:t>
-      </w:r>
-      <w:r>
-        <w:t xml:space="preserve"> are invalid.</w:t>
-      </w:r>
-    </w:p>
-    <w:p/>
-    <w:p>
-      <w:r>
-        <w:rPr>
-          <w:b/>
-          <w:bCs/>
-          <w:highlight w:val="cyan"/>
-        </w:rPr>
-        <w:t>IMPORTANT INFORMATION</w:t>
-      </w:r>
-      <w:r>
-        <w:rPr>
-          <w:highlight w:val="cyan"/>
-        </w:rPr>
-        <w:t>:</w:t>
-      </w:r>
-      <w:r>
-        <w:t xml:space="preserve">  use </w:t>
-      </w:r>
-      <w:r>
-        <w:rPr>
-          <w:b/>
-          <w:bCs/>
-        </w:rPr>
-        <w:t>-h</w:t>
-      </w:r>
-      <w:r>
-        <w:t xml:space="preserve"> flag with commands to get example and explanations</w:t>
-      </w:r>
-      <w:r>
-        <w:t>.</w:t>
-      </w:r>
-    </w:p>
-    <w:p>
-      <w:proofErr w:type="spellStart"/>
-      <w:r>
-        <w:t>k</w:t>
-      </w:r>
-      <w:r>
-        <w:t>ubectl</w:t>
-      </w:r>
-      <w:proofErr w:type="spellEnd"/>
-      <w:r>
-        <w:t xml:space="preserve"> run pods -</w:t>
-      </w:r>
-      <w:proofErr w:type="gramStart"/>
-      <w:r>
-        <w:t>h  #</w:t>
-      </w:r>
-      <w:proofErr w:type="gramEnd"/>
-      <w:r>
-        <w:t xml:space="preserve">This will </w:t>
-      </w:r>
-      <w:proofErr w:type="gramStart"/>
-      <w:r>
-        <w:t>shows</w:t>
-      </w:r>
-      <w:proofErr w:type="gramEnd"/>
-      <w:r>
-        <w:t xml:space="preserve"> example usages and explanations.</w:t>
-      </w:r>
-    </w:p>
-    <w:p/>
+        <w:t>Service Dependency</w:t>
+      </w:r>
+    </w:p>
     <w:p>
       <w:pPr>
         <w:rPr>
@@ -1141,144 +1250,6 @@
       </w:r>
       <w:proofErr w:type="spellEnd"/>
       <w:r>
-        <w:t xml:space="preserve"> </w:t>
-      </w:r>
-      <w:proofErr w:type="spellStart"/>
-      <w:r>
-        <w:t>api</w:t>
-      </w:r>
-      <w:proofErr w:type="spellEnd"/>
-      <w:r>
-        <w:t xml:space="preserve">-resources -o </w:t>
-      </w:r>
-      <w:proofErr w:type="gramStart"/>
-      <w:r>
-        <w:t>wide</w:t>
-      </w:r>
-      <w:r>
-        <w:t xml:space="preserve"> :</w:t>
-      </w:r>
-      <w:proofErr w:type="gramEnd"/>
-      <w:r>
-        <w:t xml:space="preserve"> shows all resources of Kubernetes. Helps to find the </w:t>
-      </w:r>
-      <w:proofErr w:type="spellStart"/>
-      <w:r>
-        <w:t>apiversion</w:t>
-      </w:r>
-      <w:proofErr w:type="spellEnd"/>
-      <w:r>
-        <w:t xml:space="preserve">.  </w:t>
-      </w:r>
-    </w:p>
-    <w:p>
-      <w:r>
-        <w:t xml:space="preserve">When you run </w:t>
-      </w:r>
-      <w:proofErr w:type="spellStart"/>
-      <w:r>
-        <w:t>kubectl</w:t>
-      </w:r>
-      <w:proofErr w:type="spellEnd"/>
-      <w:r>
-        <w:t xml:space="preserve"> get all, the resources that should be included in the “</w:t>
-      </w:r>
-      <w:r>
-        <w:rPr>
-          <w:b/>
-          <w:bCs/>
-        </w:rPr>
-        <w:t>all</w:t>
-      </w:r>
-      <w:r>
-        <w:t>” can be seen in the output of “</w:t>
-      </w:r>
-      <w:proofErr w:type="spellStart"/>
-      <w:r>
-        <w:t>kubectl</w:t>
-      </w:r>
-      <w:proofErr w:type="spellEnd"/>
-      <w:r>
-        <w:t xml:space="preserve"> </w:t>
-      </w:r>
-      <w:proofErr w:type="spellStart"/>
-      <w:r>
-        <w:t>api</w:t>
-      </w:r>
-      <w:proofErr w:type="spellEnd"/>
-      <w:r>
-        <w:t>-resources -o wide</w:t>
-      </w:r>
-      <w:r>
-        <w:t xml:space="preserve">” command, under the </w:t>
-      </w:r>
-      <w:r>
-        <w:rPr>
-          <w:b/>
-          <w:bCs/>
-        </w:rPr>
-        <w:t>CATEGORIES</w:t>
-      </w:r>
-      <w:r>
-        <w:t xml:space="preserve"> </w:t>
-      </w:r>
-      <w:r>
-        <w:t>columns</w:t>
-      </w:r>
-    </w:p>
-    <w:p/>
-    <w:p>
-      <w:r>
-        <w:t xml:space="preserve">The cluster-info CA certificate in </w:t>
-      </w:r>
-      <w:proofErr w:type="spellStart"/>
-      <w:r>
-        <w:t>kube</w:t>
-      </w:r>
-      <w:proofErr w:type="spellEnd"/>
-      <w:r>
-        <w:t>-public acts just like the trusted root certificates in your web browser, allowing new clients to safely verify the identity of the Kubernetes API server during a secure TLS connection.</w:t>
-      </w:r>
-    </w:p>
-    <w:p/>
-    <w:p>
-      <w:pPr>
-        <w:rPr>
-          <w:b/>
-          <w:bCs/>
-        </w:rPr>
-      </w:pPr>
-    </w:p>
-    <w:p>
-      <w:pPr>
-        <w:rPr>
-          <w:b/>
-          <w:bCs/>
-        </w:rPr>
-      </w:pPr>
-      <w:r>
-        <w:rPr>
-          <w:b/>
-          <w:bCs/>
-        </w:rPr>
-        <w:t>Service Dependency</w:t>
-      </w:r>
-    </w:p>
-    <w:p>
-      <w:pPr>
-        <w:rPr>
-          <w:b/>
-          <w:bCs/>
-        </w:rPr>
-      </w:pPr>
-    </w:p>
-    <w:p>
-      <w:proofErr w:type="spellStart"/>
-      <w:r>
-        <w:t>kubectl</w:t>
-      </w:r>
-      <w:proofErr w:type="spellEnd"/>
-      <w:r>
         <w:t xml:space="preserve"> apply -f folder/ does not guarantee resource creation order.</w:t>
       </w:r>
     </w:p>
@@ -1300,7 +1271,6 @@
     <w:p/>
     <w:p>
       <w:r>
-        <w:lastRenderedPageBreak/>
         <w:t xml:space="preserve">Remember: Kubernetes doesn't manage dependency order; the application handles </w:t>
       </w:r>
       <w:r>
@@ -1558,765 +1528,709 @@
         <w:t xml:space="preserve">: </w:t>
       </w:r>
       <w:proofErr w:type="spellStart"/>
-      <w:proofErr w:type="gramStart"/>
       <w:r>
         <w:t>PreemptLowerPriority</w:t>
       </w:r>
       <w:proofErr w:type="spellEnd"/>
       <w:r>
-        <w:t xml:space="preserve">  or</w:t>
-      </w:r>
-      <w:proofErr w:type="gramEnd"/>
+        <w:t xml:space="preserve">  or </w:t>
+      </w:r>
+      <w:proofErr w:type="spellStart"/>
+      <w:r>
+        <w:t>preemptionPolicy</w:t>
+      </w:r>
+      <w:proofErr w:type="spellEnd"/>
+      <w:r>
+        <w:t>: Never</w:t>
+      </w:r>
+      <w:r>
+        <w:t>s</w:t>
+      </w:r>
+    </w:p>
+    <w:p>
+      <w:proofErr w:type="spellStart"/>
+      <w:r>
+        <w:lastRenderedPageBreak/>
+        <w:t>kubectl</w:t>
+      </w:r>
+      <w:proofErr w:type="spellEnd"/>
+      <w:r>
+        <w:t xml:space="preserve"> logs commands only displays the applications </w:t>
+      </w:r>
+      <w:proofErr w:type="spellStart"/>
+      <w:r>
+        <w:rPr>
+          <w:b/>
+          <w:bCs/>
+        </w:rPr>
+        <w:t>stdout</w:t>
+      </w:r>
+      <w:proofErr w:type="spellEnd"/>
+      <w:r>
+        <w:t xml:space="preserve"> and </w:t>
+      </w:r>
+      <w:r>
+        <w:rPr>
+          <w:b/>
+          <w:bCs/>
+        </w:rPr>
+        <w:t>stderr</w:t>
+      </w:r>
+      <w:r>
+        <w:rPr>
+          <w:b/>
+          <w:bCs/>
+        </w:rPr>
+        <w:t xml:space="preserve">. </w:t>
+      </w:r>
+      <w:r>
+        <w:t xml:space="preserve">It does not include application specific </w:t>
+      </w:r>
+      <w:r>
+        <w:t>logs.</w:t>
+      </w:r>
       <w:r>
         <w:t xml:space="preserve"> </w:t>
       </w:r>
       <w:proofErr w:type="spellStart"/>
       <w:r>
-        <w:t>preemptionPolicy</w:t>
-      </w:r>
-      <w:proofErr w:type="spellEnd"/>
-      <w:r>
-        <w:t>: Never</w:t>
-      </w:r>
-      <w:r>
+        <w:t>etc</w:t>
+      </w:r>
+      <w:proofErr w:type="spellEnd"/>
+      <w:r>
+        <w:t xml:space="preserve"> those stored in /var/</w:t>
+      </w:r>
+      <w:r>
+        <w:t>…</w:t>
+      </w:r>
+    </w:p>
+    <w:p/>
+    <w:p>
+      <w:r>
+        <w:rPr>
+          <w:b/>
+          <w:bCs/>
+        </w:rPr>
+        <w:t>Custom-Scheduler:</w:t>
+      </w:r>
+    </w:p>
+    <w:p>
+      <w:r>
+        <w:t xml:space="preserve">After using a customer-scheduler, if you want to see the evidence that the pod used it, you can get the events of the po along with -o wide flag. Check the </w:t>
+      </w:r>
+      <w:r>
+        <w:rPr>
+          <w:b/>
+          <w:bCs/>
+        </w:rPr>
+        <w:t>SOURCE</w:t>
+      </w:r>
+      <w:r>
+        <w:t xml:space="preserve"> field.</w:t>
+      </w:r>
+    </w:p>
+    <w:p>
+      <w:r>
+        <w:t>Eg: “</w:t>
+      </w:r>
+      <w:r>
+        <w:t xml:space="preserve"> my-scheduler, my-scheduler-my-scheduler   Successfully assigned default/nginx to </w:t>
+      </w:r>
+      <w:proofErr w:type="spellStart"/>
+      <w:r>
+        <w:t>controlplan</w:t>
+      </w:r>
+      <w:proofErr w:type="spellEnd"/>
+      <w:r>
+        <w:t>”</w:t>
+      </w:r>
+    </w:p>
+    <w:p/>
+    <w:p>
+      <w:pPr>
+        <w:rPr>
+          <w:b/>
+          <w:bCs/>
+        </w:rPr>
+      </w:pPr>
+      <w:r>
+        <w:rPr>
+          <w:b/>
+          <w:bCs/>
+        </w:rPr>
+        <w:t>Kubernetes scheduling Stages</w:t>
+      </w:r>
+    </w:p>
+    <w:p>
+      <w:r>
+        <w:t xml:space="preserve">Kubernetes scheduling involves the scheduler selecting a suitable node for a Pod. The main stages are </w:t>
+      </w:r>
+      <w:r>
+        <w:rPr>
+          <w:b/>
+          <w:bCs/>
+        </w:rPr>
+        <w:t>Queue → Filter → Score → Bind</w:t>
+      </w:r>
+      <w:r>
+        <w:t xml:space="preserve">. Queue selects a pending Pod, Filter eliminates nodes where the Pod cannot run, Score ranks the remaining nodes, and Bind assigns the Pod to the selected node. The scheduler records the selected node in the Pod object's </w:t>
+      </w:r>
+      <w:proofErr w:type="spellStart"/>
+      <w:r>
+        <w:t>spec.nodeName</w:t>
+      </w:r>
+      <w:proofErr w:type="spellEnd"/>
+      <w:r>
+        <w:t xml:space="preserve"> field. The </w:t>
+      </w:r>
+      <w:proofErr w:type="spellStart"/>
+      <w:r>
+        <w:t>kubelet</w:t>
+      </w:r>
+      <w:proofErr w:type="spellEnd"/>
+      <w:r>
+        <w:t xml:space="preserve"> on that node then starts the Pod.</w:t>
+      </w:r>
+    </w:p>
+    <w:p/>
+    <w:p>
+      <w:r>
+        <w:rPr>
+          <w:b/>
+          <w:bCs/>
+        </w:rPr>
+        <w:t>Scheduler profiles</w:t>
+      </w:r>
+    </w:p>
+    <w:p>
+      <w:r>
+        <w:rPr>
+          <w:b/>
+          <w:bCs/>
+        </w:rPr>
+        <w:t>Scheduler profiles</w:t>
+      </w:r>
+      <w:r>
+        <w:t xml:space="preserve"> are different configurations of the same </w:t>
+      </w:r>
+      <w:proofErr w:type="spellStart"/>
+      <w:r>
+        <w:t>kube</w:t>
+      </w:r>
+      <w:proofErr w:type="spellEnd"/>
+      <w:r>
+        <w:t xml:space="preserve">-scheduler. Each profile can have its own </w:t>
+      </w:r>
+      <w:r>
+        <w:rPr>
+          <w:b/>
+          <w:bCs/>
+        </w:rPr>
+        <w:t>scheduler plugins</w:t>
+      </w:r>
+      <w:r>
+        <w:t xml:space="preserve"> enabled, disabled, or configured. A Pod selects a profile using </w:t>
+      </w:r>
+      <w:proofErr w:type="spellStart"/>
+      <w:r>
+        <w:t>spec.schedulerName</w:t>
+      </w:r>
+      <w:proofErr w:type="spellEnd"/>
+      <w:r>
+        <w:t xml:space="preserve">. Plugins implement scheduling logic at stages such as </w:t>
+      </w:r>
+      <w:r>
+        <w:rPr>
+          <w:b/>
+          <w:bCs/>
+        </w:rPr>
+        <w:t>Filter</w:t>
+      </w:r>
+      <w:r>
+        <w:t xml:space="preserve"> and </w:t>
+      </w:r>
+      <w:r>
+        <w:rPr>
+          <w:b/>
+          <w:bCs/>
+        </w:rPr>
+        <w:t>Score</w:t>
+      </w:r>
+      <w:r>
+        <w:t>. This allows different Pods to use different scheduling behavior.</w:t>
+      </w:r>
+    </w:p>
+    <w:p/>
+    <w:p>
+      <w:r>
+        <w:rPr>
+          <w:b/>
+          <w:bCs/>
+        </w:rPr>
+        <w:t>Admission Controller</w:t>
+      </w:r>
+      <w:r>
+        <w:rPr>
+          <w:b/>
+          <w:bCs/>
+        </w:rPr>
+        <w:t>:</w:t>
+      </w:r>
+    </w:p>
+    <w:p>
+      <w:r>
+        <w:t xml:space="preserve">An </w:t>
+      </w:r>
+      <w:r>
+        <w:rPr>
+          <w:b/>
+          <w:bCs/>
+        </w:rPr>
+        <w:t>Admission Controller</w:t>
+      </w:r>
+      <w:r>
+        <w:t xml:space="preserve"> intercepts API requests after authentication and authorization but before the object is stored in </w:t>
+      </w:r>
+      <w:proofErr w:type="spellStart"/>
+      <w:r>
+        <w:t>etcd</w:t>
+      </w:r>
+      <w:proofErr w:type="spellEnd"/>
+      <w:r>
+        <w:t xml:space="preserve">. It can </w:t>
+      </w:r>
+      <w:r>
+        <w:rPr>
+          <w:b/>
+          <w:bCs/>
+        </w:rPr>
+        <w:t>validate, modify, or reject</w:t>
+      </w:r>
+      <w:r>
+        <w:t xml:space="preserve"> requests. Admission controllers are used to enforce cluster-wide policies such as requiring security settings, labels, resource limits, or approved container images. </w:t>
+      </w:r>
+      <w:r>
+        <w:rPr>
+          <w:b/>
+          <w:bCs/>
+        </w:rPr>
+        <w:t>Real-world use case:</w:t>
+      </w:r>
+      <w:r>
+        <w:t xml:space="preserve"> a company can use an admission controller to reject Pods that use images from untrusted registries and allow only images from its approved private registry.</w:t>
+      </w:r>
+    </w:p>
+    <w:p>
+      <w:r>
+        <w:rPr>
+          <w:b/>
+          <w:bCs/>
+        </w:rPr>
+        <w:t xml:space="preserve">How Kubernetes determine to allow or </w:t>
+      </w:r>
+      <w:proofErr w:type="spellStart"/>
+      <w:r>
+        <w:rPr>
+          <w:b/>
+          <w:bCs/>
+        </w:rPr>
+        <w:t>deny:</w:t>
+      </w:r>
+      <w:r>
+        <w:rPr>
+          <w:b/>
+          <w:bCs/>
+        </w:rPr>
         <w:t>s</w:t>
       </w:r>
-    </w:p>
-    <w:p>
-      <w:proofErr w:type="spellStart"/>
-      <w:r>
+      <w:proofErr w:type="spellEnd"/>
+    </w:p>
+    <w:p>
+      <w:r>
+        <w:lastRenderedPageBreak/>
+        <w:t xml:space="preserve">The </w:t>
+      </w:r>
+      <w:proofErr w:type="spellStart"/>
+      <w:r>
+        <w:t>ImagePolicyWebhook</w:t>
+      </w:r>
+      <w:proofErr w:type="spellEnd"/>
+      <w:r>
+        <w:t xml:space="preserve"> sends information about the requested container image to an external webhook. The webhook performs its own policy logic and then returns an </w:t>
+      </w:r>
+      <w:proofErr w:type="spellStart"/>
+      <w:r>
+        <w:t>ImageReview</w:t>
+      </w:r>
+      <w:proofErr w:type="spellEnd"/>
+      <w:r>
+        <w:t xml:space="preserve"> response. Kubernetes does not care how the webhook makes its decision; it expects the decision in the </w:t>
+      </w:r>
+      <w:proofErr w:type="spellStart"/>
+      <w:r>
+        <w:t>status.allowed</w:t>
+      </w:r>
+      <w:proofErr w:type="spellEnd"/>
+      <w:r>
+        <w:t xml:space="preserve"> field. </w:t>
+      </w:r>
+      <w:proofErr w:type="spellStart"/>
+      <w:r>
+        <w:t>status.allowed</w:t>
+      </w:r>
+      <w:proofErr w:type="spellEnd"/>
+      <w:r>
+        <w:t xml:space="preserve">: true allows the image, while </w:t>
+      </w:r>
+      <w:proofErr w:type="spellStart"/>
+      <w:r>
+        <w:t>status.allowed</w:t>
+      </w:r>
+      <w:proofErr w:type="spellEnd"/>
+      <w:r>
+        <w:t>: false rejects it.</w:t>
+      </w:r>
+    </w:p>
+    <w:p/>
+    <w:p>
+      <w:pPr>
+        <w:rPr>
+          <w:b/>
+          <w:bCs/>
+        </w:rPr>
+      </w:pPr>
+      <w:r>
+        <w:rPr>
+          <w:b/>
+          <w:bCs/>
+        </w:rPr>
+        <w:t>ENTRYPOINT can be written in two forms:</w:t>
+      </w:r>
+    </w:p>
+    <w:p>
+      <w:pPr>
+        <w:rPr>
+          <w:b/>
+          <w:bCs/>
+        </w:rPr>
+      </w:pPr>
+      <w:r>
+        <w:rPr>
+          <w:b/>
+          <w:bCs/>
+        </w:rPr>
+        <w:t>In Docker:</w:t>
+      </w:r>
+    </w:p>
+    <w:p>
+      <w:r>
+        <w:t>Exec form: ENTRYPOINT ["command"] — runs the command directly. CMD or arguments passed with docker run are appended as arguments. Recommended for applications.</w:t>
+      </w:r>
+    </w:p>
+    <w:p>
+      <w:r>
+        <w:t>Shell form: ENTRYPOINT command — runs through /bin/</w:t>
+      </w:r>
+      <w:proofErr w:type="spellStart"/>
+      <w:r>
+        <w:t>sh</w:t>
+      </w:r>
+      <w:proofErr w:type="spellEnd"/>
+      <w:r>
+        <w:t xml:space="preserve"> -c. CMD and runtime arguments are not passed to the </w:t>
+      </w:r>
+      <w:proofErr w:type="spellStart"/>
+      <w:r>
+        <w:t>entrypoint</w:t>
+      </w:r>
+      <w:proofErr w:type="spellEnd"/>
+      <w:r>
+        <w:t xml:space="preserve"> command in the normal way. Useful when shell features such as &amp;&amp;, pipes, or variable expansion are required.</w:t>
+      </w:r>
+    </w:p>
+    <w:p>
+      <w:r>
+        <w:t>Rule: Use exec form for normal applications; use shell form when shell behavior is specifically required.</w:t>
+      </w:r>
+    </w:p>
+    <w:p>
+      <w:r>
+        <w:rPr>
+          <w:b/>
+          <w:bCs/>
+        </w:rPr>
+        <w:t>ENTRYPOINT</w:t>
+      </w:r>
+      <w:r>
+        <w:t xml:space="preserve"> provides the main executable; </w:t>
+      </w:r>
+      <w:r>
+        <w:rPr>
+          <w:b/>
+          <w:bCs/>
+        </w:rPr>
+        <w:t>CMD</w:t>
+      </w:r>
+      <w:r>
+        <w:t xml:space="preserve"> provides default arguments to it, which can be overridden by arguments supplied to docker run.</w:t>
+      </w:r>
+    </w:p>
+    <w:p/>
+    <w:p>
+      <w:r>
+        <w:t xml:space="preserve">To over ride an entry point, use the  </w:t>
+      </w:r>
+      <w:r>
+        <w:rPr>
+          <w:b/>
+          <w:bCs/>
+        </w:rPr>
+        <w:t>“--</w:t>
+      </w:r>
+      <w:proofErr w:type="spellStart"/>
+      <w:r>
+        <w:rPr>
+          <w:b/>
+          <w:bCs/>
+        </w:rPr>
+        <w:t>entrypoint</w:t>
+      </w:r>
+      <w:proofErr w:type="spellEnd"/>
+      <w:r>
+        <w:rPr>
+          <w:b/>
+          <w:bCs/>
+        </w:rPr>
+        <w:t>”</w:t>
+      </w:r>
+      <w:r>
+        <w:t xml:space="preserve"> flag.</w:t>
+      </w:r>
+    </w:p>
+    <w:p>
+      <w:proofErr w:type="spellStart"/>
+      <w:r>
+        <w:t>eg</w:t>
+      </w:r>
+      <w:proofErr w:type="spellEnd"/>
+      <w:r>
+        <w:t xml:space="preserve">: </w:t>
+      </w:r>
+      <w:r>
+        <w:t xml:space="preserve">docker run </w:t>
+      </w:r>
+      <w:r>
+        <w:rPr>
+          <w:b/>
+          <w:bCs/>
+        </w:rPr>
+        <w:t>--</w:t>
+      </w:r>
+      <w:proofErr w:type="spellStart"/>
+      <w:r>
+        <w:rPr>
+          <w:b/>
+          <w:bCs/>
+        </w:rPr>
+        <w:t>entrypoint</w:t>
+      </w:r>
+      <w:proofErr w:type="spellEnd"/>
+      <w:r>
+        <w:t xml:space="preserve"> ls image</w:t>
+      </w:r>
+      <w:r>
+        <w:t xml:space="preserve">  # This override the default entry point with </w:t>
+      </w:r>
+      <w:proofErr w:type="spellStart"/>
+      <w:r>
+        <w:t>ls</w:t>
+      </w:r>
+      <w:r>
+        <w:t>s</w:t>
+      </w:r>
+      <w:proofErr w:type="spellEnd"/>
+    </w:p>
+    <w:p/>
+    <w:p>
+      <w:pPr>
+        <w:rPr>
+          <w:b/>
+          <w:bCs/>
+        </w:rPr>
+      </w:pPr>
+      <w:r>
+        <w:rPr>
+          <w:b/>
+          <w:bCs/>
+        </w:rPr>
+        <w:t>In Kubernetes:</w:t>
+      </w:r>
+    </w:p>
+    <w:p>
+      <w:r>
+        <w:t xml:space="preserve">Docker’s </w:t>
+      </w:r>
+      <w:r>
+        <w:rPr>
+          <w:b/>
+          <w:bCs/>
+        </w:rPr>
+        <w:t xml:space="preserve">Entry point = </w:t>
+      </w:r>
+      <w:r>
+        <w:t>Kubernetes</w:t>
+      </w:r>
+      <w:r>
+        <w:rPr>
+          <w:b/>
+          <w:bCs/>
+        </w:rPr>
+        <w:t xml:space="preserve"> </w:t>
+      </w:r>
+      <w:r>
+        <w:rPr>
+          <w:b/>
+          <w:bCs/>
+        </w:rPr>
+        <w:t>command</w:t>
+      </w:r>
+      <w:r>
+        <w:t xml:space="preserve">   #This is the base command that run during container start up</w:t>
+      </w:r>
+    </w:p>
+    <w:p>
+      <w:r>
+        <w:t xml:space="preserve">Docker’s </w:t>
+      </w:r>
+      <w:r>
+        <w:rPr>
+          <w:b/>
+          <w:bCs/>
+        </w:rPr>
+        <w:t xml:space="preserve">command = </w:t>
+      </w:r>
+      <w:r>
+        <w:t>Kubernetes</w:t>
+      </w:r>
+      <w:r>
+        <w:rPr>
+          <w:b/>
+          <w:bCs/>
+        </w:rPr>
+        <w:t xml:space="preserve"> </w:t>
+      </w:r>
+      <w:proofErr w:type="spellStart"/>
+      <w:r>
+        <w:rPr>
+          <w:b/>
+          <w:bCs/>
+        </w:rPr>
+        <w:t>args</w:t>
+      </w:r>
+      <w:proofErr w:type="spellEnd"/>
+      <w:r>
+        <w:t xml:space="preserve">  # This is the argument passed to the entry point. This will be appended as an argument to entry point</w:t>
+      </w:r>
+    </w:p>
+    <w:p/>
+    <w:p/>
+    <w:p/>
+    <w:p>
+      <w:pPr>
+        <w:rPr>
+          <w:b/>
+          <w:bCs/>
+        </w:rPr>
+      </w:pPr>
+      <w:r>
+        <w:rPr>
+          <w:b/>
+          <w:bCs/>
+        </w:rPr>
+        <w:lastRenderedPageBreak/>
+        <w:t xml:space="preserve">Difference between </w:t>
+      </w:r>
+      <w:proofErr w:type="spellStart"/>
+      <w:r>
+        <w:rPr>
+          <w:b/>
+          <w:bCs/>
+        </w:rPr>
         <w:t>kubectl</w:t>
       </w:r>
       <w:proofErr w:type="spellEnd"/>
       <w:r>
-        <w:t xml:space="preserve"> logs commands only displays the applications </w:t>
-      </w:r>
-      <w:proofErr w:type="spellStart"/>
-      <w:r>
-        <w:rPr>
-          <w:b/>
-          <w:bCs/>
-        </w:rPr>
-        <w:t>stdout</w:t>
-      </w:r>
-      <w:proofErr w:type="spellEnd"/>
-      <w:r>
-        <w:t xml:space="preserve"> and </w:t>
-      </w:r>
-      <w:r>
-        <w:rPr>
-          <w:b/>
-          <w:bCs/>
-        </w:rPr>
-        <w:t>stderr</w:t>
-      </w:r>
-      <w:r>
-        <w:rPr>
-          <w:b/>
-          <w:bCs/>
-        </w:rPr>
-        <w:t xml:space="preserve">. </w:t>
-      </w:r>
-      <w:r>
-        <w:t xml:space="preserve">It does not include application specific </w:t>
-      </w:r>
-      <w:r>
-        <w:t>logs.</w:t>
+        <w:rPr>
+          <w:b/>
+          <w:bCs/>
+        </w:rPr>
+        <w:t xml:space="preserve"> create vs </w:t>
+      </w:r>
+      <w:proofErr w:type="spellStart"/>
+      <w:r>
+        <w:rPr>
+          <w:b/>
+          <w:bCs/>
+        </w:rPr>
+        <w:t>kubectl</w:t>
+      </w:r>
+      <w:proofErr w:type="spellEnd"/>
+      <w:r>
+        <w:rPr>
+          <w:b/>
+          <w:bCs/>
+        </w:rPr>
+        <w:t xml:space="preserve"> apply</w:t>
+      </w:r>
+    </w:p>
+    <w:p>
+      <w:proofErr w:type="spellStart"/>
+      <w:r>
+        <w:rPr>
+          <w:b/>
+          <w:bCs/>
+        </w:rPr>
+        <w:t>kubectl</w:t>
+      </w:r>
+      <w:proofErr w:type="spellEnd"/>
+      <w:r>
+        <w:rPr>
+          <w:b/>
+          <w:bCs/>
+        </w:rPr>
+        <w:t xml:space="preserve"> create</w:t>
       </w:r>
       <w:r>
         <w:t xml:space="preserve"> </w:t>
       </w:r>
-      <w:proofErr w:type="spellStart"/>
-      <w:r>
-        <w:t>etc</w:t>
-      </w:r>
-      <w:proofErr w:type="spellEnd"/>
-      <w:r>
-        <w:t xml:space="preserve"> those stored in /var/</w:t>
-      </w:r>
-      <w:r>
-        <w:t>…</w:t>
-      </w:r>
-    </w:p>
-    <w:p/>
-    <w:p>
-      <w:r>
-        <w:rPr>
-          <w:b/>
-          <w:bCs/>
-        </w:rPr>
-        <w:t>Custom-Scheduler:</w:t>
-      </w:r>
-    </w:p>
-    <w:p>
-      <w:r>
-        <w:t xml:space="preserve">After using a customer-scheduler, if you want to see the evidence that the pod used it, you can get the events of the po along with -o wide flag. Check the </w:t>
-      </w:r>
-      <w:r>
-        <w:rPr>
-          <w:b/>
-          <w:bCs/>
-        </w:rPr>
-        <w:t>SOURCE</w:t>
-      </w:r>
-      <w:r>
-        <w:t xml:space="preserve"> field.</w:t>
-      </w:r>
-    </w:p>
-    <w:p>
-      <w:r>
-        <w:t xml:space="preserve">Eg: </w:t>
-      </w:r>
-      <w:proofErr w:type="gramStart"/>
-      <w:r>
-        <w:t>“</w:t>
-      </w:r>
-      <w:r>
-        <w:t xml:space="preserve"> my</w:t>
-      </w:r>
-      <w:proofErr w:type="gramEnd"/>
-      <w:r>
-        <w:t xml:space="preserve">-scheduler, my-scheduler-my-scheduler   Successfully assigned default/nginx to </w:t>
-      </w:r>
-      <w:proofErr w:type="spellStart"/>
-      <w:r>
-        <w:t>controlplan</w:t>
-      </w:r>
-      <w:proofErr w:type="spellEnd"/>
-      <w:r>
-        <w:t>”</w:t>
-      </w:r>
-    </w:p>
-    <w:p/>
-    <w:p>
-      <w:pPr>
-        <w:rPr>
-          <w:b/>
-          <w:bCs/>
-        </w:rPr>
-      </w:pPr>
-      <w:r>
-        <w:rPr>
-          <w:b/>
-          <w:bCs/>
-        </w:rPr>
-        <w:t>Kubernetes scheduling Stages</w:t>
-      </w:r>
-    </w:p>
-    <w:p>
-      <w:r>
-        <w:t xml:space="preserve">Kubernetes scheduling involves the scheduler selecting a suitable node for a Pod. The main stages are </w:t>
-      </w:r>
-      <w:r>
-        <w:rPr>
-          <w:b/>
-          <w:bCs/>
-        </w:rPr>
-        <w:t>Queue → Filter → Score → Bind</w:t>
-      </w:r>
-      <w:r>
-        <w:t xml:space="preserve">. Queue selects a pending Pod, Filter eliminates nodes where the Pod cannot run, Score ranks the remaining nodes, and Bind assigns the Pod to the selected node. The scheduler records the selected node in the Pod object's </w:t>
-      </w:r>
-      <w:proofErr w:type="spellStart"/>
-      <w:proofErr w:type="gramStart"/>
-      <w:r>
-        <w:t>spec.nodeName</w:t>
-      </w:r>
-      <w:proofErr w:type="spellEnd"/>
-      <w:proofErr w:type="gramEnd"/>
-      <w:r>
-        <w:t xml:space="preserve"> field. The </w:t>
-      </w:r>
-      <w:proofErr w:type="spellStart"/>
-      <w:r>
-        <w:t>kubelet</w:t>
-      </w:r>
-      <w:proofErr w:type="spellEnd"/>
-      <w:r>
-        <w:t xml:space="preserve"> on that node then starts the Pod.</w:t>
-      </w:r>
-    </w:p>
-    <w:p/>
-    <w:p>
-      <w:r>
-        <w:rPr>
-          <w:b/>
-          <w:bCs/>
-        </w:rPr>
-        <w:t>Scheduler profiles</w:t>
-      </w:r>
-    </w:p>
-    <w:p>
-      <w:r>
-        <w:rPr>
-          <w:b/>
-          <w:bCs/>
-        </w:rPr>
-        <w:t>Scheduler profiles</w:t>
-      </w:r>
-      <w:r>
-        <w:t xml:space="preserve"> are different configurations of the same </w:t>
-      </w:r>
-      <w:proofErr w:type="spellStart"/>
-      <w:r>
-        <w:t>kube</w:t>
-      </w:r>
-      <w:proofErr w:type="spellEnd"/>
-      <w:r>
-        <w:t xml:space="preserve">-scheduler. Each profile can have its own </w:t>
-      </w:r>
-      <w:r>
-        <w:rPr>
-          <w:b/>
-          <w:bCs/>
-        </w:rPr>
-        <w:t>scheduler plugins</w:t>
-      </w:r>
-      <w:r>
-        <w:t xml:space="preserve"> enabled, disabled, or configured. A Pod selects a profile using </w:t>
-      </w:r>
-      <w:proofErr w:type="spellStart"/>
-      <w:proofErr w:type="gramStart"/>
-      <w:r>
-        <w:t>spec.schedulerName</w:t>
-      </w:r>
-      <w:proofErr w:type="spellEnd"/>
-      <w:proofErr w:type="gramEnd"/>
-      <w:r>
-        <w:t xml:space="preserve">. Plugins implement scheduling logic at stages such as </w:t>
-      </w:r>
-      <w:r>
-        <w:rPr>
-          <w:b/>
-          <w:bCs/>
-        </w:rPr>
-        <w:t>Filter</w:t>
-      </w:r>
-      <w:r>
-        <w:t xml:space="preserve"> and </w:t>
-      </w:r>
-      <w:r>
-        <w:rPr>
-          <w:b/>
-          <w:bCs/>
-        </w:rPr>
-        <w:t>Score</w:t>
-      </w:r>
-      <w:r>
-        <w:t>. This allows different Pods to use different scheduling behavior.</w:t>
-      </w:r>
-    </w:p>
-    <w:p/>
-    <w:p>
-      <w:r>
-        <w:rPr>
-          <w:b/>
-          <w:bCs/>
-        </w:rPr>
-        <w:t>Admission Controller</w:t>
-      </w:r>
-      <w:r>
-        <w:rPr>
-          <w:b/>
-          <w:bCs/>
-        </w:rPr>
-        <w:t>:</w:t>
-      </w:r>
-    </w:p>
-    <w:p>
-      <w:r>
-        <w:t xml:space="preserve">An </w:t>
-      </w:r>
-      <w:r>
-        <w:rPr>
-          <w:b/>
-          <w:bCs/>
-        </w:rPr>
-        <w:t>Admission Controller</w:t>
-      </w:r>
-      <w:r>
-        <w:t xml:space="preserve"> intercepts API requests after authentication and authorization but before the object is stored in </w:t>
-      </w:r>
-      <w:proofErr w:type="spellStart"/>
-      <w:r>
-        <w:t>etcd</w:t>
-      </w:r>
-      <w:proofErr w:type="spellEnd"/>
-      <w:r>
-        <w:t xml:space="preserve">. It can </w:t>
-      </w:r>
-      <w:r>
-        <w:rPr>
-          <w:b/>
-          <w:bCs/>
-        </w:rPr>
-        <w:t>validate, modify, or reject</w:t>
-      </w:r>
-      <w:r>
-        <w:t xml:space="preserve"> requests. Admission controllers are used to enforce cluster-wide policies such as requiring security settings, labels, resource limits, or approved container images. </w:t>
-      </w:r>
-      <w:r>
-        <w:rPr>
-          <w:b/>
-          <w:bCs/>
-        </w:rPr>
-        <w:t>Real-world use case:</w:t>
-      </w:r>
-      <w:r>
-        <w:t xml:space="preserve"> a company can use an admission controller to reject Pods that use images from untrusted registries and allow only images from its approved private registry.</w:t>
-      </w:r>
-    </w:p>
-    <w:p>
-      <w:r>
-        <w:rPr>
-          <w:b/>
-          <w:bCs/>
-        </w:rPr>
-        <w:t xml:space="preserve">How Kubernetes determine to allow or </w:t>
-      </w:r>
-      <w:proofErr w:type="spellStart"/>
-      <w:proofErr w:type="gramStart"/>
-      <w:r>
-        <w:rPr>
-          <w:b/>
-          <w:bCs/>
-        </w:rPr>
-        <w:t>deny:</w:t>
-      </w:r>
-      <w:r>
-        <w:rPr>
-          <w:b/>
-          <w:bCs/>
-        </w:rPr>
-        <w:t>s</w:t>
-      </w:r>
-      <w:proofErr w:type="spellEnd"/>
-      <w:proofErr w:type="gramEnd"/>
-    </w:p>
-    <w:p>
-      <w:r>
-        <w:t xml:space="preserve">The </w:t>
-      </w:r>
-      <w:proofErr w:type="spellStart"/>
-      <w:r>
-        <w:t>ImagePolicyWebhook</w:t>
-      </w:r>
-      <w:proofErr w:type="spellEnd"/>
-      <w:r>
-        <w:t xml:space="preserve"> sends information about the requested container image to an external webhook. The webhook performs its own policy logic and then returns an </w:t>
-      </w:r>
-      <w:proofErr w:type="spellStart"/>
-      <w:r>
-        <w:t>ImageReview</w:t>
-      </w:r>
-      <w:proofErr w:type="spellEnd"/>
-      <w:r>
-        <w:t xml:space="preserve"> response. Kubernetes does not care how the webhook makes its decision; it expects the decision in the </w:t>
-      </w:r>
-      <w:proofErr w:type="spellStart"/>
-      <w:proofErr w:type="gramStart"/>
-      <w:r>
-        <w:t>status.allowed</w:t>
-      </w:r>
-      <w:proofErr w:type="spellEnd"/>
-      <w:proofErr w:type="gramEnd"/>
-      <w:r>
-        <w:t xml:space="preserve"> field. </w:t>
-      </w:r>
-      <w:proofErr w:type="spellStart"/>
-      <w:proofErr w:type="gramStart"/>
-      <w:r>
-        <w:t>status.allowed</w:t>
-      </w:r>
-      <w:proofErr w:type="spellEnd"/>
-      <w:proofErr w:type="gramEnd"/>
-      <w:r>
-        <w:t xml:space="preserve">: true allows the image, while </w:t>
-      </w:r>
-      <w:proofErr w:type="spellStart"/>
-      <w:proofErr w:type="gramStart"/>
-      <w:r>
-        <w:t>status.allowed</w:t>
-      </w:r>
-      <w:proofErr w:type="spellEnd"/>
-      <w:proofErr w:type="gramEnd"/>
-      <w:r>
-        <w:t>: false rejects it.</w:t>
-      </w:r>
-    </w:p>
-    <w:p/>
-    <w:p>
-      <w:pPr>
-        <w:rPr>
-          <w:b/>
-          <w:bCs/>
-        </w:rPr>
-      </w:pPr>
-      <w:r>
-        <w:rPr>
-          <w:b/>
-          <w:bCs/>
-        </w:rPr>
-        <w:t>ENTRYPOINT can be written in two forms:</w:t>
-      </w:r>
-    </w:p>
-    <w:p>
-      <w:pPr>
-        <w:rPr>
-          <w:b/>
-          <w:bCs/>
-        </w:rPr>
-      </w:pPr>
-      <w:r>
-        <w:rPr>
-          <w:b/>
-          <w:bCs/>
-        </w:rPr>
-        <w:t>In Docker:</w:t>
-      </w:r>
-    </w:p>
-    <w:p>
-      <w:r>
-        <w:lastRenderedPageBreak/>
-        <w:t>Exec form: ENTRYPOINT ["command"] — runs the command directly. CMD or arguments passed with docker run are appended as arguments. Recommended for applications.</w:t>
-      </w:r>
-    </w:p>
-    <w:p>
-      <w:r>
-        <w:t>Shell form: ENTRYPOINT command — runs through /bin/</w:t>
-      </w:r>
-      <w:proofErr w:type="spellStart"/>
-      <w:r>
-        <w:t>sh</w:t>
-      </w:r>
-      <w:proofErr w:type="spellEnd"/>
-      <w:r>
-        <w:t xml:space="preserve"> -c. CMD and runtime arguments are not passed to the </w:t>
-      </w:r>
-      <w:proofErr w:type="spellStart"/>
-      <w:r>
-        <w:t>entrypoint</w:t>
-      </w:r>
-      <w:proofErr w:type="spellEnd"/>
-      <w:r>
-        <w:t xml:space="preserve"> command in the normal way. Useful when shell features such as &amp;&amp;, pipes, or variable expansion are required.</w:t>
-      </w:r>
-    </w:p>
-    <w:p>
-      <w:r>
-        <w:t>Rule: Use exec form for normal applications; use shell form when shell behavior is specifically required.</w:t>
-      </w:r>
-    </w:p>
-    <w:p>
-      <w:r>
-        <w:rPr>
-          <w:b/>
-          <w:bCs/>
-        </w:rPr>
-        <w:t>ENTRYPOINT</w:t>
-      </w:r>
-      <w:r>
-        <w:t xml:space="preserve"> provides the main executable; </w:t>
-      </w:r>
-      <w:r>
-        <w:rPr>
-          <w:b/>
-          <w:bCs/>
-        </w:rPr>
-        <w:t>CMD</w:t>
-      </w:r>
-      <w:r>
-        <w:t xml:space="preserve"> provides default arguments to it, which can be overridden by arguments supplied to docker run.</w:t>
-      </w:r>
-    </w:p>
-    <w:p/>
-    <w:p>
-      <w:r>
-        <w:t xml:space="preserve">To over ride an entry point, use </w:t>
-      </w:r>
-      <w:proofErr w:type="gramStart"/>
-      <w:r>
-        <w:t xml:space="preserve">the  </w:t>
-      </w:r>
-      <w:r>
-        <w:rPr>
-          <w:b/>
-          <w:bCs/>
-        </w:rPr>
-        <w:t>“</w:t>
-      </w:r>
-      <w:proofErr w:type="gramEnd"/>
-      <w:r>
-        <w:rPr>
-          <w:b/>
-          <w:bCs/>
-        </w:rPr>
-        <w:t>--</w:t>
-      </w:r>
-      <w:proofErr w:type="spellStart"/>
-      <w:r>
-        <w:rPr>
-          <w:b/>
-          <w:bCs/>
-        </w:rPr>
-        <w:t>entrypoint</w:t>
-      </w:r>
-      <w:proofErr w:type="spellEnd"/>
-      <w:r>
-        <w:rPr>
-          <w:b/>
-          <w:bCs/>
-        </w:rPr>
-        <w:t>”</w:t>
-      </w:r>
-      <w:r>
-        <w:t xml:space="preserve"> flag.</w:t>
-      </w:r>
-    </w:p>
-    <w:p>
-      <w:proofErr w:type="spellStart"/>
-      <w:r>
-        <w:t>eg</w:t>
-      </w:r>
-      <w:proofErr w:type="spellEnd"/>
-      <w:r>
-        <w:t xml:space="preserve">: </w:t>
-      </w:r>
-      <w:r>
-        <w:t xml:space="preserve">docker run </w:t>
-      </w:r>
-      <w:r>
-        <w:rPr>
-          <w:b/>
-          <w:bCs/>
-        </w:rPr>
-        <w:t>--</w:t>
-      </w:r>
-      <w:proofErr w:type="spellStart"/>
-      <w:r>
-        <w:rPr>
-          <w:b/>
-          <w:bCs/>
-        </w:rPr>
-        <w:t>entrypoint</w:t>
-      </w:r>
-      <w:proofErr w:type="spellEnd"/>
-      <w:r>
-        <w:t xml:space="preserve"> ls </w:t>
-      </w:r>
-      <w:proofErr w:type="gramStart"/>
-      <w:r>
-        <w:t>image</w:t>
-      </w:r>
-      <w:r>
-        <w:t xml:space="preserve">  #</w:t>
-      </w:r>
-      <w:proofErr w:type="gramEnd"/>
-      <w:r>
-        <w:t xml:space="preserve"> This </w:t>
-      </w:r>
-      <w:proofErr w:type="gramStart"/>
-      <w:r>
-        <w:t>override</w:t>
-      </w:r>
-      <w:proofErr w:type="gramEnd"/>
-      <w:r>
-        <w:t xml:space="preserve"> the default entry point with </w:t>
-      </w:r>
-      <w:proofErr w:type="spellStart"/>
-      <w:r>
-        <w:t>ls</w:t>
-      </w:r>
-      <w:r>
-        <w:t>s</w:t>
-      </w:r>
-      <w:proofErr w:type="spellEnd"/>
-    </w:p>
-    <w:p/>
-    <w:p>
-      <w:pPr>
-        <w:rPr>
-          <w:b/>
-          <w:bCs/>
-        </w:rPr>
-      </w:pPr>
-      <w:r>
-        <w:rPr>
-          <w:b/>
-          <w:bCs/>
-        </w:rPr>
-        <w:t>In Kubernetes:</w:t>
-      </w:r>
-    </w:p>
-    <w:p>
-      <w:r>
-        <w:t xml:space="preserve">Docker’s </w:t>
-      </w:r>
-      <w:r>
-        <w:rPr>
-          <w:b/>
-          <w:bCs/>
-        </w:rPr>
-        <w:t xml:space="preserve">Entry point = </w:t>
-      </w:r>
-      <w:r>
-        <w:t>Kubernetes</w:t>
-      </w:r>
-      <w:r>
-        <w:rPr>
-          <w:b/>
-          <w:bCs/>
-        </w:rPr>
+      <w:r>
+        <w:t>-</w:t>
+      </w:r>
+      <w:r>
+        <w:t xml:space="preserve"> Creates the resource; errors if it already exists. </w:t>
+      </w:r>
+    </w:p>
+    <w:p>
+      <w:proofErr w:type="spellStart"/>
+      <w:r>
+        <w:rPr>
+          <w:b/>
+          <w:bCs/>
+        </w:rPr>
+        <w:t>kubectl</w:t>
+      </w:r>
+      <w:proofErr w:type="spellEnd"/>
+      <w:r>
+        <w:rPr>
+          <w:b/>
+          <w:bCs/>
+        </w:rPr>
+        <w:t xml:space="preserve"> apply</w:t>
+      </w:r>
+      <w:r>
         <w:t xml:space="preserve"> </w:t>
       </w:r>
       <w:r>
-        <w:rPr>
-          <w:b/>
-          <w:bCs/>
-        </w:rPr>
-        <w:t>command</w:t>
-      </w:r>
-      <w:r>
-        <w:t xml:space="preserve">   #This is the base command that run during container start up</w:t>
-      </w:r>
-    </w:p>
-    <w:p>
-      <w:r>
-        <w:t xml:space="preserve">Docker’s </w:t>
-      </w:r>
-      <w:r>
-        <w:rPr>
-          <w:b/>
-          <w:bCs/>
-        </w:rPr>
-        <w:t xml:space="preserve">command = </w:t>
-      </w:r>
-      <w:r>
-        <w:t>Kubernetes</w:t>
-      </w:r>
-      <w:r>
-        <w:rPr>
-          <w:b/>
-          <w:bCs/>
-        </w:rPr>
-        <w:t xml:space="preserve"> </w:t>
-      </w:r>
-      <w:proofErr w:type="spellStart"/>
-      <w:proofErr w:type="gramStart"/>
-      <w:r>
-        <w:rPr>
-          <w:b/>
-          <w:bCs/>
-        </w:rPr>
-        <w:t>args</w:t>
-      </w:r>
-      <w:proofErr w:type="spellEnd"/>
-      <w:r>
-        <w:t xml:space="preserve">  #</w:t>
-      </w:r>
-      <w:proofErr w:type="gramEnd"/>
-      <w:r>
-        <w:t xml:space="preserve"> This is the argument passed to the entry point. This will be appended as an argument to entry point</w:t>
-      </w:r>
-    </w:p>
-    <w:p/>
-    <w:p/>
-    <w:p/>
-    <w:p>
-      <w:pPr>
-        <w:rPr>
-          <w:b/>
-          <w:bCs/>
-        </w:rPr>
-      </w:pPr>
-      <w:r>
-        <w:rPr>
-          <w:b/>
-          <w:bCs/>
-        </w:rPr>
-        <w:t xml:space="preserve">Difference between </w:t>
-      </w:r>
-      <w:proofErr w:type="spellStart"/>
-      <w:r>
-        <w:rPr>
-          <w:b/>
-          <w:bCs/>
-        </w:rPr>
-        <w:t>kubectl</w:t>
-      </w:r>
-      <w:proofErr w:type="spellEnd"/>
-      <w:r>
-        <w:rPr>
-          <w:b/>
-          <w:bCs/>
-        </w:rPr>
-        <w:t xml:space="preserve"> create vs </w:t>
-      </w:r>
-      <w:proofErr w:type="spellStart"/>
-      <w:r>
-        <w:rPr>
-          <w:b/>
-          <w:bCs/>
-        </w:rPr>
-        <w:t>kubectl</w:t>
-      </w:r>
-      <w:proofErr w:type="spellEnd"/>
-      <w:r>
-        <w:rPr>
-          <w:b/>
-          <w:bCs/>
-        </w:rPr>
-        <w:t xml:space="preserve"> apply</w:t>
-      </w:r>
-    </w:p>
-    <w:p>
-      <w:proofErr w:type="spellStart"/>
-      <w:r>
-        <w:rPr>
-          <w:b/>
-          <w:bCs/>
-        </w:rPr>
-        <w:t>kubectl</w:t>
-      </w:r>
-      <w:proofErr w:type="spellEnd"/>
-      <w:r>
-        <w:rPr>
-          <w:b/>
-          <w:bCs/>
-        </w:rPr>
-        <w:t xml:space="preserve"> create</w:t>
-      </w:r>
-      <w:r>
-        <w:t xml:space="preserve"> </w:t>
-      </w:r>
-      <w:r>
-        <w:t>-</w:t>
-      </w:r>
-      <w:r>
-        <w:t xml:space="preserve"> Creates the resource; errors if it already exists. </w:t>
-      </w:r>
-    </w:p>
-    <w:p>
-      <w:proofErr w:type="spellStart"/>
-      <w:r>
-        <w:rPr>
-          <w:b/>
-          <w:bCs/>
-        </w:rPr>
-        <w:t>kubectl</w:t>
-      </w:r>
-      <w:proofErr w:type="spellEnd"/>
-      <w:r>
-        <w:rPr>
-          <w:b/>
-          <w:bCs/>
-        </w:rPr>
-        <w:t xml:space="preserve"> apply</w:t>
-      </w:r>
-      <w:r>
-        <w:t xml:space="preserve"> </w:t>
-      </w:r>
-      <w:r>
         <w:t xml:space="preserve">- </w:t>
       </w:r>
       <w:r>
@@ -2361,7 +2275,6 @@
           <w:bCs/>
           <w:highlight w:val="cyan"/>
         </w:rPr>
-        <w:lastRenderedPageBreak/>
         <w:t>PORTS</w:t>
       </w:r>
     </w:p>
@@ -2425,6 +2338,7 @@
         <w:rPr>
           <w:noProof/>
         </w:rPr>
+        <w:lastRenderedPageBreak/>
         <w:drawing>
           <wp:inline distT="0" distB="0" distL="0" distR="0" wp14:anchorId="097944D0" wp14:editId="0BE941F4">
             <wp:extent cx="5943600" cy="3713480"/>
@@ -2592,6 +2506,7 @@
           <w:b/>
           <w:bCs/>
         </w:rPr>
+        <w:lastRenderedPageBreak/>
         <w:t>CA Certificates in Kubernetes:</w:t>
       </w:r>
     </w:p>
@@ -2847,6 +2762,7 @@
     </w:p>
     <w:p>
       <w:r>
+        <w:lastRenderedPageBreak/>
         <w:t xml:space="preserve">A sidecar is an </w:t>
       </w:r>
       <w:proofErr w:type="spellStart"/>
@@ -2936,7 +2852,6 @@
         <w:rPr>
           <w:noProof/>
         </w:rPr>
-        <w:lastRenderedPageBreak/>
         <w:drawing>
           <wp:inline distT="0" distB="0" distL="0" distR="0" wp14:anchorId="2B8C344E" wp14:editId="0391BC2E">
             <wp:extent cx="5943600" cy="2762885"/>
@@ -3000,7 +2915,11 @@
         <w:t xml:space="preserve"> (VPA)</w:t>
       </w:r>
       <w:r>
-        <w:t xml:space="preserve"> automatically adjusts the CPU and memory requests/limits of Pods based on their actual usage. It is installed as a Kubernetes add-on and has three main components: the </w:t>
+        <w:t xml:space="preserve"> automatically adjusts the CPU and memory requests/limits of Pods based on their actual usage. It is installed as a Kubernetes add-on and has three </w:t>
+      </w:r>
+      <w:r>
+        <w:lastRenderedPageBreak/>
+        <w:t xml:space="preserve">main components: the </w:t>
       </w:r>
       <w:r>
         <w:rPr>
@@ -3184,7 +3103,6 @@
           <w:b/>
           <w:bCs/>
         </w:rPr>
-        <w:lastRenderedPageBreak/>
         <w:t>PodDisruptionBudget</w:t>
       </w:r>
       <w:proofErr w:type="spellEnd"/>
@@ -3346,7 +3264,6 @@
         <w:rPr>
           <w:noProof/>
         </w:rPr>
-        <w:lastRenderedPageBreak/>
         <w:drawing>
           <wp:inline distT="0" distB="0" distL="0" distR="0" wp14:anchorId="22D4B03C" wp14:editId="5479A2D8">
             <wp:extent cx="4210638" cy="1686160"/>
@@ -3389,6 +3306,7 @@
         <w:rPr>
           <w:noProof/>
         </w:rPr>
+        <w:lastRenderedPageBreak/>
         <w:drawing>
           <wp:inline distT="0" distB="0" distL="0" distR="0" wp14:anchorId="2175538B" wp14:editId="21CDB136">
             <wp:extent cx="5943600" cy="3197225"/>
@@ -3515,75 +3433,75 @@
           <w:bCs/>
           <w:highlight w:val="cyan"/>
         </w:rPr>
+        <w:t>How to pull an image from a private registry</w:t>
+      </w:r>
+    </w:p>
+    <w:p>
+      <w:pPr>
+        <w:rPr>
+          <w:b/>
+          <w:bCs/>
+        </w:rPr>
+      </w:pPr>
+    </w:p>
+    <w:p>
+      <w:pPr>
+        <w:rPr>
+          <w:b/>
+          <w:bCs/>
+        </w:rPr>
+      </w:pPr>
+      <w:r>
+        <w:rPr>
+          <w:b/>
+          <w:bCs/>
+        </w:rPr>
+        <w:t>Step 1: Create a Secret</w:t>
+      </w:r>
+    </w:p>
+    <w:p>
+      <w:proofErr w:type="spellStart"/>
+      <w:r>
+        <w:t>kubectl</w:t>
+      </w:r>
+      <w:proofErr w:type="spellEnd"/>
+      <w:r>
+        <w:t xml:space="preserve"> create secret docker-registry </w:t>
+      </w:r>
+      <w:proofErr w:type="spellStart"/>
+      <w:r>
+        <w:rPr>
+          <w:b/>
+          <w:bCs/>
+        </w:rPr>
+        <w:t>regcred</w:t>
+      </w:r>
+      <w:proofErr w:type="spellEnd"/>
+      <w:r>
+        <w:t xml:space="preserve"> \</w:t>
+      </w:r>
+    </w:p>
+    <w:p>
+      <w:r>
+        <w:t xml:space="preserve">  --docker-server=registry.example.com \</w:t>
+      </w:r>
+    </w:p>
+    <w:p>
+      <w:r>
+        <w:t xml:space="preserve">  --docker-username=</w:t>
+      </w:r>
+      <w:proofErr w:type="spellStart"/>
+      <w:r>
+        <w:t>myuser</w:t>
+      </w:r>
+      <w:proofErr w:type="spellEnd"/>
+      <w:r>
+        <w:t xml:space="preserve"> \</w:t>
+      </w:r>
+    </w:p>
+    <w:p>
+      <w:r>
         <w:lastRenderedPageBreak/>
-        <w:t>How to pull an image from a private registry</w:t>
-      </w:r>
-    </w:p>
-    <w:p>
-      <w:pPr>
-        <w:rPr>
-          <w:b/>
-          <w:bCs/>
-        </w:rPr>
-      </w:pPr>
-    </w:p>
-    <w:p>
-      <w:pPr>
-        <w:rPr>
-          <w:b/>
-          <w:bCs/>
-        </w:rPr>
-      </w:pPr>
-      <w:r>
-        <w:rPr>
-          <w:b/>
-          <w:bCs/>
-        </w:rPr>
-        <w:t>Step 1: Create a Secret</w:t>
-      </w:r>
-    </w:p>
-    <w:p>
-      <w:proofErr w:type="spellStart"/>
-      <w:r>
-        <w:t>kubectl</w:t>
-      </w:r>
-      <w:proofErr w:type="spellEnd"/>
-      <w:r>
-        <w:t xml:space="preserve"> create secret docker-registry </w:t>
-      </w:r>
-      <w:proofErr w:type="spellStart"/>
-      <w:r>
-        <w:rPr>
-          <w:b/>
-          <w:bCs/>
-        </w:rPr>
-        <w:t>regcred</w:t>
-      </w:r>
-      <w:proofErr w:type="spellEnd"/>
-      <w:r>
-        <w:t xml:space="preserve"> \</w:t>
-      </w:r>
-    </w:p>
-    <w:p>
-      <w:r>
-        <w:t xml:space="preserve">  --docker-server=registry.example.com \</w:t>
-      </w:r>
-    </w:p>
-    <w:p>
-      <w:r>
-        <w:t xml:space="preserve">  --docker-username=</w:t>
-      </w:r>
-      <w:proofErr w:type="spellStart"/>
-      <w:r>
-        <w:t>myuser</w:t>
-      </w:r>
-      <w:proofErr w:type="spellEnd"/>
-      <w:r>
-        <w:t xml:space="preserve"> \</w:t>
-      </w:r>
-    </w:p>
-    <w:p>
-      <w:r>
         <w:t xml:space="preserve">  --docker-password=</w:t>
       </w:r>
       <w:proofErr w:type="spellStart"/>
@@ -3673,15 +3591,7 @@
     </w:p>
     <w:p>
       <w:r>
-        <w:t xml:space="preserve">      image: registry.example.com/</w:t>
-      </w:r>
-      <w:proofErr w:type="gramStart"/>
-      <w:r>
-        <w:t>myapp:v</w:t>
-      </w:r>
-      <w:proofErr w:type="gramEnd"/>
-      <w:r>
-        <w:t>1</w:t>
+        <w:t xml:space="preserve">      image: registry.example.com/myapp:v1</w:t>
       </w:r>
     </w:p>
     <w:p>
@@ -3811,6 +3721,7 @@
     </w:p>
     <w:p>
       <w:r>
+        <w:lastRenderedPageBreak/>
         <w:t>- CAP_SYS_ADMIN — grants a broad set of system administration privileges.</w:t>
       </w:r>
     </w:p>
@@ -4703,7 +4614,6 @@
       <w:r>
         <w:t xml:space="preserve"> </w:t>
       </w:r>
-      <w:proofErr w:type="gramStart"/>
       <w:r>
         <w:t>-</w:t>
       </w:r>
@@ -4711,32 +4621,23 @@
         <w:t xml:space="preserve"> </w:t>
       </w:r>
       <w:r>
-        <w:t xml:space="preserve"> Inject</w:t>
-      </w:r>
-      <w:proofErr w:type="gramEnd"/>
+        <w:t xml:space="preserve"> Inject </w:t>
+      </w:r>
+      <w:r>
+        <w:t xml:space="preserve">specific key </w:t>
+      </w:r>
+    </w:p>
+    <w:p>
+      <w:proofErr w:type="spellStart"/>
+      <w:r>
+        <w:t>configMapRef</w:t>
+      </w:r>
+      <w:proofErr w:type="spellEnd"/>
       <w:r>
         <w:t xml:space="preserve"> </w:t>
       </w:r>
       <w:r>
-        <w:t xml:space="preserve">specific key </w:t>
-      </w:r>
-    </w:p>
-    <w:p>
-      <w:proofErr w:type="spellStart"/>
-      <w:r>
-        <w:t>configMapRef</w:t>
-      </w:r>
-      <w:proofErr w:type="spellEnd"/>
-      <w:r>
-        <w:t xml:space="preserve"> </w:t>
-      </w:r>
-      <w:proofErr w:type="gramStart"/>
-      <w:r>
-        <w:t>-  Inject</w:t>
-      </w:r>
-      <w:proofErr w:type="gramEnd"/>
-      <w:r>
-        <w:t xml:space="preserve"> </w:t>
+        <w:t xml:space="preserve">-  Inject </w:t>
       </w:r>
       <w:r>
         <w:t>all keys</w:t>
@@ -5478,10 +5379,6 @@
     </w:p>
     <w:p/>
     <w:p/>
-    <w:p/>
-    <w:p/>
-    <w:p/>
-    <w:p/>
     <w:p>
       <w:pPr>
         <w:jc w:val="center"/>
@@ -5496,6 +5393,691 @@
           <w:bCs/>
           <w:highlight w:val="yellow"/>
         </w:rPr>
+        <w:lastRenderedPageBreak/>
+        <w:t>NETWORKING</w:t>
+      </w:r>
+    </w:p>
+    <w:p/>
+    <w:p>
+      <w:pPr>
+        <w:rPr>
+          <w:b/>
+          <w:bCs/>
+        </w:rPr>
+      </w:pPr>
+      <w:r>
+        <w:rPr>
+          <w:b/>
+          <w:bCs/>
+          <w:highlight w:val="cyan"/>
+        </w:rPr>
+        <w:t>Kubernetes Pod &amp; Namespace Architecture Summary</w:t>
+      </w:r>
+      <w:r>
+        <w:rPr>
+          <w:b/>
+          <w:bCs/>
+          <w:highlight w:val="cyan"/>
+        </w:rPr>
+        <w:t xml:space="preserve"> with respect to Networking</w:t>
+      </w:r>
+    </w:p>
+    <w:p>
+      <w:pPr>
+        <w:rPr>
+          <w:b/>
+          <w:bCs/>
+        </w:rPr>
+      </w:pPr>
+      <w:r>
+        <w:rPr>
+          <w:b/>
+          <w:bCs/>
+        </w:rPr>
+        <w:t>Core Concept: The Pod Network Primitive</w:t>
+      </w:r>
+    </w:p>
+    <w:p>
+      <w:r>
+        <w:t xml:space="preserve">In Kubernetes, the </w:t>
+      </w:r>
+      <w:r>
+        <w:rPr>
+          <w:b/>
+          <w:bCs/>
+        </w:rPr>
+        <w:t>Pod</w:t>
+      </w:r>
+      <w:r>
+        <w:t xml:space="preserve">, </w:t>
+      </w:r>
+      <w:r>
+        <w:t>not the container</w:t>
+      </w:r>
+      <w:r>
+        <w:t xml:space="preserve"> </w:t>
+      </w:r>
+      <w:r>
+        <w:t>is the atomic unit of deployment and networking.</w:t>
+      </w:r>
+    </w:p>
+    <w:p>
+      <w:pPr>
+        <w:numPr>
+          <w:ilvl w:val="0"/>
+          <w:numId w:val="17"/>
+        </w:numPr>
+      </w:pPr>
+      <w:r>
+        <w:rPr>
+          <w:b/>
+          <w:bCs/>
+        </w:rPr>
+        <w:t>One Shared Network Namespace Per Pod:</w:t>
+      </w:r>
+    </w:p>
+    <w:p>
+      <w:pPr>
+        <w:numPr>
+          <w:ilvl w:val="1"/>
+          <w:numId w:val="17"/>
+        </w:numPr>
+      </w:pPr>
+      <w:r>
+        <w:t>Every Pod gets a single, dedicated Linux Network Namespace.</w:t>
+      </w:r>
+    </w:p>
+    <w:p>
+      <w:pPr>
+        <w:numPr>
+          <w:ilvl w:val="1"/>
+          <w:numId w:val="17"/>
+        </w:numPr>
+      </w:pPr>
+      <w:r>
+        <w:t>All containers within the same Pod share this network namespace.</w:t>
+      </w:r>
+    </w:p>
+    <w:p>
+      <w:pPr>
+        <w:numPr>
+          <w:ilvl w:val="1"/>
+          <w:numId w:val="17"/>
+        </w:numPr>
+      </w:pPr>
+      <w:r>
+        <w:t>As a result, containers inside the same Pod share the same IP address, MAC address, and port space, allowing them to communicate via localhost.</w:t>
+      </w:r>
+    </w:p>
+    <w:p>
+      <w:pPr>
+        <w:numPr>
+          <w:ilvl w:val="0"/>
+          <w:numId w:val="17"/>
+        </w:numPr>
+      </w:pPr>
+      <w:r>
+        <w:rPr>
+          <w:b/>
+          <w:bCs/>
+        </w:rPr>
+        <w:t>The "Pause" Container:</w:t>
+      </w:r>
+    </w:p>
+    <w:p>
+      <w:pPr>
+        <w:numPr>
+          <w:ilvl w:val="1"/>
+          <w:numId w:val="17"/>
+        </w:numPr>
+      </w:pPr>
+      <w:r>
+        <w:t>When a Pod starts (whether it has 1 container or 5), Kubernetes spins up a light helper container called the Pause container.</w:t>
+      </w:r>
+    </w:p>
+    <w:p>
+      <w:pPr>
+        <w:numPr>
+          <w:ilvl w:val="1"/>
+          <w:numId w:val="17"/>
+        </w:numPr>
+      </w:pPr>
+      <w:r>
+        <w:t>The Pause container creates and holds open the Pod's Network Namespace.</w:t>
+      </w:r>
+    </w:p>
+    <w:p>
+      <w:pPr>
+        <w:numPr>
+          <w:ilvl w:val="1"/>
+          <w:numId w:val="17"/>
+        </w:numPr>
+      </w:pPr>
+      <w:r>
+        <w:t xml:space="preserve">The CNI plugin attaches the </w:t>
+      </w:r>
+      <w:proofErr w:type="spellStart"/>
+      <w:r>
+        <w:t>veth</w:t>
+      </w:r>
+      <w:proofErr w:type="spellEnd"/>
+      <w:r>
+        <w:t xml:space="preserve"> pair and allocates the IP address directly to this namespace. All application containers then join this exact same network stack.</w:t>
+      </w:r>
+    </w:p>
+    <w:p>
+      <w:pPr>
+        <w:numPr>
+          <w:ilvl w:val="0"/>
+          <w:numId w:val="17"/>
+        </w:numPr>
+      </w:pPr>
+      <w:r>
+        <w:rPr>
+          <w:b/>
+          <w:bCs/>
+        </w:rPr>
+        <w:t>Namespace Isolation Breakdown:</w:t>
+      </w:r>
+    </w:p>
+    <w:p>
+      <w:pPr>
+        <w:numPr>
+          <w:ilvl w:val="1"/>
+          <w:numId w:val="17"/>
+        </w:numPr>
+      </w:pPr>
+      <w:r>
+        <w:rPr>
+          <w:b/>
+          <w:bCs/>
+        </w:rPr>
+        <w:t>Network Namespace</w:t>
+      </w:r>
+      <w:r>
+        <w:t>: Shared by default across all containers in the Pod.</w:t>
+      </w:r>
+    </w:p>
+    <w:p>
+      <w:pPr>
+        <w:numPr>
+          <w:ilvl w:val="1"/>
+          <w:numId w:val="17"/>
+        </w:numPr>
+      </w:pPr>
+      <w:r>
+        <w:rPr>
+          <w:b/>
+          <w:bCs/>
+        </w:rPr>
+        <w:t>PID Namespace (Process ID):</w:t>
+      </w:r>
+      <w:r>
+        <w:t xml:space="preserve"> Isolated by default. Container 1 cannot see Container 2's processes (unless </w:t>
+      </w:r>
+      <w:proofErr w:type="spellStart"/>
+      <w:r>
+        <w:t>shareProcessNamespace</w:t>
+      </w:r>
+      <w:proofErr w:type="spellEnd"/>
+      <w:r>
+        <w:t>: true is explicitly enabled).</w:t>
+      </w:r>
+    </w:p>
+    <w:p>
+      <w:pPr>
+        <w:numPr>
+          <w:ilvl w:val="1"/>
+          <w:numId w:val="17"/>
+        </w:numPr>
+      </w:pPr>
+      <w:r>
+        <w:rPr>
+          <w:b/>
+          <w:bCs/>
+        </w:rPr>
+        <w:t>Mount / Filesystem Namespace:</w:t>
+      </w:r>
+      <w:r>
+        <w:t xml:space="preserve"> Isolated by default. Filesystems are separate unless shared via mounted Kubernetes Volumes.</w:t>
+      </w:r>
+    </w:p>
+    <w:p>
+      <w:pPr>
+        <w:rPr>
+          <w:rFonts w:ascii="Segoe UI Emoji" w:hAnsi="Segoe UI Emoji" w:cs="Segoe UI Emoji"/>
+          <w:b/>
+          <w:bCs/>
+        </w:rPr>
+      </w:pPr>
+    </w:p>
+    <w:p>
+      <w:pPr>
+        <w:rPr>
+          <w:rFonts w:ascii="Segoe UI Emoji" w:hAnsi="Segoe UI Emoji" w:cs="Segoe UI Emoji"/>
+          <w:b/>
+          <w:bCs/>
+        </w:rPr>
+      </w:pPr>
+    </w:p>
+    <w:p>
+      <w:pPr>
+        <w:rPr>
+          <w:b/>
+          <w:bCs/>
+        </w:rPr>
+      </w:pPr>
+      <w:r>
+        <w:rPr>
+          <w:b/>
+          <w:bCs/>
+        </w:rPr>
+        <w:t>Why This Design Matters</w:t>
+      </w:r>
+    </w:p>
+    <w:p>
+      <w:pPr>
+        <w:numPr>
+          <w:ilvl w:val="0"/>
+          <w:numId w:val="18"/>
+        </w:numPr>
+      </w:pPr>
+      <w:r>
+        <w:rPr>
+          <w:b/>
+          <w:bCs/>
+        </w:rPr>
+        <w:lastRenderedPageBreak/>
+        <w:t>Container Lifecycle Separation:</w:t>
+      </w:r>
+      <w:r>
+        <w:t xml:space="preserve"> If an application container crashes and restarts, the network stack and IP remain stable because the underlying Pause container keeps the namespace alive.</w:t>
+      </w:r>
+    </w:p>
+    <w:p>
+      <w:pPr>
+        <w:numPr>
+          <w:ilvl w:val="0"/>
+          <w:numId w:val="18"/>
+        </w:numPr>
+      </w:pPr>
+      <w:r>
+        <w:rPr>
+          <w:b/>
+          <w:bCs/>
+        </w:rPr>
+        <w:t>Sidecar Pattern:</w:t>
+      </w:r>
+      <w:r>
+        <w:t xml:space="preserve"> Sidecars (e.g., logging, proxying, monitoring) can observe or proxy main app traffic locally over localhost without complex internal routing.</w:t>
+      </w:r>
+    </w:p>
+    <w:p/>
+    <w:p/>
+    <w:p/>
+    <w:p>
+      <w:pPr>
+        <w:rPr>
+          <w:b/>
+          <w:bCs/>
+        </w:rPr>
+      </w:pPr>
+      <w:r>
+        <w:rPr>
+          <w:b/>
+          <w:bCs/>
+          <w:highlight w:val="cyan"/>
+        </w:rPr>
+        <w:t>Container Network Interface (CNI)</w:t>
+      </w:r>
+    </w:p>
+    <w:p>
+      <w:pPr>
+        <w:rPr>
+          <w:b/>
+          <w:bCs/>
+        </w:rPr>
+      </w:pPr>
+    </w:p>
+    <w:p>
+      <w:r>
+        <w:rPr>
+          <w:b/>
+          <w:bCs/>
+        </w:rPr>
+        <w:t>CNI</w:t>
+      </w:r>
+      <w:r>
+        <w:t xml:space="preserve"> is a standardized specification and framework under the Cloud Native Computing Foundation (CNCF) designed to configure network interfaces for Linux containers. In the Kubernetes ecosystem, it acts as the universal bridge between the container runtime and network plugins.</w:t>
+      </w:r>
+    </w:p>
+    <w:p>
+      <w:pPr>
+        <w:rPr>
+          <w:b/>
+          <w:bCs/>
+        </w:rPr>
+      </w:pPr>
+      <w:r>
+        <w:rPr>
+          <w:b/>
+          <w:bCs/>
+        </w:rPr>
+        <w:t>Core Architecture</w:t>
+      </w:r>
+    </w:p>
+    <w:p>
+      <w:r>
+        <w:t>The CNI model relies on three main components working together on a node:</w:t>
+      </w:r>
+    </w:p>
+    <w:p>
+      <w:pPr>
+        <w:numPr>
+          <w:ilvl w:val="0"/>
+          <w:numId w:val="19"/>
+        </w:numPr>
+      </w:pPr>
+      <w:r>
+        <w:rPr>
+          <w:b/>
+          <w:bCs/>
+        </w:rPr>
+        <w:t xml:space="preserve">The </w:t>
+      </w:r>
+      <w:proofErr w:type="spellStart"/>
+      <w:r>
+        <w:rPr>
+          <w:b/>
+          <w:bCs/>
+        </w:rPr>
+        <w:t>Conflist</w:t>
+      </w:r>
+      <w:proofErr w:type="spellEnd"/>
+      <w:r>
+        <w:rPr>
+          <w:b/>
+          <w:bCs/>
+        </w:rPr>
+        <w:t xml:space="preserve"> / Rules (/</w:t>
+      </w:r>
+      <w:proofErr w:type="spellStart"/>
+      <w:r>
+        <w:rPr>
+          <w:b/>
+          <w:bCs/>
+        </w:rPr>
+        <w:t>etc</w:t>
+      </w:r>
+      <w:proofErr w:type="spellEnd"/>
+      <w:r>
+        <w:rPr>
+          <w:b/>
+          <w:bCs/>
+        </w:rPr>
+        <w:t>/</w:t>
+      </w:r>
+      <w:proofErr w:type="spellStart"/>
+      <w:r>
+        <w:rPr>
+          <w:b/>
+          <w:bCs/>
+        </w:rPr>
+        <w:t>cni</w:t>
+      </w:r>
+      <w:proofErr w:type="spellEnd"/>
+      <w:r>
+        <w:rPr>
+          <w:b/>
+          <w:bCs/>
+        </w:rPr>
+        <w:t>/</w:t>
+      </w:r>
+      <w:proofErr w:type="spellStart"/>
+      <w:r>
+        <w:rPr>
+          <w:b/>
+          <w:bCs/>
+        </w:rPr>
+        <w:t>net.d</w:t>
+      </w:r>
+      <w:proofErr w:type="spellEnd"/>
+      <w:r>
+        <w:rPr>
+          <w:b/>
+          <w:bCs/>
+        </w:rPr>
+        <w:t>/)</w:t>
+      </w:r>
+    </w:p>
+    <w:p>
+      <w:pPr>
+        <w:numPr>
+          <w:ilvl w:val="1"/>
+          <w:numId w:val="19"/>
+        </w:numPr>
+      </w:pPr>
+      <w:r>
+        <w:t>JSON-formatted configuration files (or .</w:t>
+      </w:r>
+      <w:proofErr w:type="spellStart"/>
+      <w:r>
+        <w:t>conflist</w:t>
+      </w:r>
+      <w:proofErr w:type="spellEnd"/>
+      <w:r>
+        <w:t xml:space="preserve"> chains) that define the network parameters, subnet ranges, and the sequence of plugins to execute.</w:t>
+      </w:r>
+    </w:p>
+    <w:p>
+      <w:pPr>
+        <w:numPr>
+          <w:ilvl w:val="0"/>
+          <w:numId w:val="19"/>
+        </w:numPr>
+      </w:pPr>
+      <w:r>
+        <w:rPr>
+          <w:b/>
+          <w:bCs/>
+        </w:rPr>
+        <w:t>The Binaries (/opt/</w:t>
+      </w:r>
+      <w:proofErr w:type="spellStart"/>
+      <w:r>
+        <w:rPr>
+          <w:b/>
+          <w:bCs/>
+        </w:rPr>
+        <w:t>cni</w:t>
+      </w:r>
+      <w:proofErr w:type="spellEnd"/>
+      <w:r>
+        <w:rPr>
+          <w:b/>
+          <w:bCs/>
+        </w:rPr>
+        <w:t>/bin/)</w:t>
+      </w:r>
+    </w:p>
+    <w:p>
+      <w:pPr>
+        <w:numPr>
+          <w:ilvl w:val="1"/>
+          <w:numId w:val="19"/>
+        </w:numPr>
+      </w:pPr>
+      <w:r>
+        <w:t xml:space="preserve">Executable tools (bridge, </w:t>
+      </w:r>
+      <w:proofErr w:type="spellStart"/>
+      <w:r>
+        <w:t>ptp</w:t>
+      </w:r>
+      <w:proofErr w:type="spellEnd"/>
+      <w:r>
+        <w:t xml:space="preserve">, host-local, </w:t>
+      </w:r>
+      <w:proofErr w:type="spellStart"/>
+      <w:r>
+        <w:t>portmap</w:t>
+      </w:r>
+      <w:proofErr w:type="spellEnd"/>
+      <w:r>
+        <w:t>, etc.) that perform the actual kernel-level plumbing</w:t>
+      </w:r>
+      <w:r>
+        <w:t xml:space="preserve"> </w:t>
+      </w:r>
+      <w:r>
+        <w:t xml:space="preserve">such as creating </w:t>
+      </w:r>
+      <w:proofErr w:type="spellStart"/>
+      <w:r>
+        <w:t>veth</w:t>
+      </w:r>
+      <w:proofErr w:type="spellEnd"/>
+      <w:r>
+        <w:t xml:space="preserve"> pairs, attaching them to namespaces, and assigning IP addresses.</w:t>
+      </w:r>
+    </w:p>
+    <w:p>
+      <w:pPr>
+        <w:numPr>
+          <w:ilvl w:val="0"/>
+          <w:numId w:val="19"/>
+        </w:numPr>
+      </w:pPr>
+      <w:r>
+        <w:rPr>
+          <w:b/>
+          <w:bCs/>
+        </w:rPr>
+        <w:t>The Orchestrator (Container Runtime)</w:t>
+      </w:r>
+    </w:p>
+    <w:p>
+      <w:pPr>
+        <w:numPr>
+          <w:ilvl w:val="1"/>
+          <w:numId w:val="19"/>
+        </w:numPr>
+      </w:pPr>
+      <w:r>
+        <w:t xml:space="preserve">Runtimes like </w:t>
+      </w:r>
+      <w:proofErr w:type="spellStart"/>
+      <w:r>
+        <w:rPr>
+          <w:b/>
+          <w:bCs/>
+        </w:rPr>
+        <w:t>containerd</w:t>
+      </w:r>
+      <w:proofErr w:type="spellEnd"/>
+      <w:r>
+        <w:t xml:space="preserve"> or </w:t>
+      </w:r>
+      <w:r>
+        <w:rPr>
+          <w:b/>
+          <w:bCs/>
+        </w:rPr>
+        <w:t>CRI-O</w:t>
+      </w:r>
+      <w:r>
+        <w:t xml:space="preserve"> monitor pod lifecycles and trigger the CNI binaries with an </w:t>
+      </w:r>
+      <w:r>
+        <w:rPr>
+          <w:b/>
+          <w:bCs/>
+        </w:rPr>
+        <w:t>ADD</w:t>
+      </w:r>
+      <w:r>
+        <w:t xml:space="preserve"> command when a pod starts, and a </w:t>
+      </w:r>
+      <w:r>
+        <w:rPr>
+          <w:b/>
+          <w:bCs/>
+        </w:rPr>
+        <w:t>DEL</w:t>
+      </w:r>
+      <w:r>
+        <w:t xml:space="preserve"> command when it terminates.</w:t>
+      </w:r>
+    </w:p>
+    <w:p>
+      <w:pPr>
+        <w:rPr>
+          <w:b/>
+          <w:bCs/>
+        </w:rPr>
+      </w:pPr>
+      <w:r>
+        <w:rPr>
+          <w:b/>
+          <w:bCs/>
+        </w:rPr>
+        <w:t>Why It Matters</w:t>
+      </w:r>
+    </w:p>
+    <w:p>
+      <w:r>
+        <w:t xml:space="preserve">Because CNI provides a strictly defined, vendor-neutral interface, it decouples the container runtime from the underlying networking implementation. This standard design is </w:t>
+      </w:r>
+      <w:r>
+        <w:lastRenderedPageBreak/>
+        <w:t>what allows cluster administrators to plug in completely different networking solutions</w:t>
+      </w:r>
+      <w:r>
+        <w:t xml:space="preserve"> </w:t>
+      </w:r>
+      <w:r>
+        <w:t>such as Kindnet, Flannel, Calico, or Cilium</w:t>
+      </w:r>
+      <w:r>
+        <w:t xml:space="preserve"> </w:t>
+      </w:r>
+      <w:r>
+        <w:t>without altering how Kubernetes or its container runtimes manage pod lifecycles.</w:t>
+      </w:r>
+    </w:p>
+    <w:p/>
+    <w:p/>
+    <w:p/>
+    <w:p/>
+    <w:p/>
+    <w:p/>
+    <w:p/>
+    <w:p/>
+    <w:p/>
+    <w:p/>
+    <w:p/>
+    <w:p/>
+    <w:p/>
+    <w:p/>
+    <w:p/>
+    <w:p/>
+    <w:p/>
+    <w:p/>
+    <w:p/>
+    <w:p>
+      <w:pPr>
+        <w:jc w:val="center"/>
+        <w:rPr>
+          <w:b/>
+          <w:bCs/>
+        </w:rPr>
+      </w:pPr>
+      <w:r>
+        <w:rPr>
+          <w:b/>
+          <w:bCs/>
+          <w:highlight w:val="yellow"/>
+        </w:rPr>
         <w:t>KUBECTL COMMANDS RELATED</w:t>
       </w:r>
     </w:p>
@@ -5536,6 +6118,7 @@
     <w:p>
       <w:proofErr w:type="spellStart"/>
       <w:r>
+        <w:lastRenderedPageBreak/>
         <w:t>k</w:t>
       </w:r>
       <w:r>
@@ -5572,12 +6155,10 @@
         <w:t xml:space="preserve"> apply -f </w:t>
       </w:r>
       <w:proofErr w:type="spellStart"/>
-      <w:proofErr w:type="gramStart"/>
       <w:r>
         <w:t>file.yaml</w:t>
       </w:r>
       <w:proofErr w:type="spellEnd"/>
-      <w:proofErr w:type="gramEnd"/>
       <w:r>
         <w:t xml:space="preserve"> → Creates the resource if it doesn't exist, or updates it if it already exists. </w:t>
       </w:r>
@@ -5592,12 +6173,10 @@
         <w:t xml:space="preserve"> replace -f </w:t>
       </w:r>
       <w:proofErr w:type="spellStart"/>
-      <w:proofErr w:type="gramStart"/>
       <w:r>
         <w:t>file.yaml</w:t>
       </w:r>
       <w:proofErr w:type="spellEnd"/>
-      <w:proofErr w:type="gramEnd"/>
       <w:r>
         <w:t xml:space="preserve"> → Replaces an existing resource. It fails if the resource doesn't exist.</w:t>
       </w:r>
@@ -5647,15 +6226,7 @@
     </w:p>
     <w:p>
       <w:r>
-        <w:t xml:space="preserve">You can </w:t>
-      </w:r>
-      <w:proofErr w:type="gramStart"/>
-      <w:r>
-        <w:t>use  --</w:t>
-      </w:r>
-      <w:proofErr w:type="gramEnd"/>
-      <w:r>
-        <w:t xml:space="preserve">recursive flag to display all the applicable fields that are part of </w:t>
+        <w:t xml:space="preserve">You can use  --recursive flag to display all the applicable fields that are part of </w:t>
       </w:r>
       <w:r>
         <w:t>those resources</w:t>
@@ -5677,12 +6248,10 @@
         <w:t xml:space="preserve"> explain </w:t>
       </w:r>
       <w:proofErr w:type="spellStart"/>
-      <w:proofErr w:type="gramStart"/>
       <w:r>
         <w:t>pod.spec</w:t>
       </w:r>
       <w:proofErr w:type="spellEnd"/>
-      <w:proofErr w:type="gramEnd"/>
       <w:r>
         <w:t xml:space="preserve"> </w:t>
       </w:r>
@@ -5780,6 +6349,272 @@
 <file path=word/numbering.xml><?xml version="1.0" encoding="utf-8"?>
 <w:numbering xmlns:wpc="http://schemas.microsoft.com/office/word/2010/wordprocessingCanvas" xmlns:cx="http://schemas.microsoft.com/office/drawing/2014/chartex" xmlns:cx1="http://schemas.microsoft.com/office/drawing/2015/9/8/chartex" xmlns:cx2="http://schemas.microsoft.com/office/drawing/2015/10/21/chartex" xmlns:cx3="http://schemas.microsoft.com/office/drawing/2016/5/9/chartex" xmlns:cx4="http://schemas.microsoft.com/office/drawing/2016/5/10/chartex" xmlns:cx5="http://schemas.microsoft.com/office/drawing/2016/5/11/chartex" xmlns:cx6="http://schemas.microsoft.com/office/drawing/2016/5/12/chartex" xmlns:cx7="http://schemas.microsoft.com/office/drawing/2016/5/13/chartex" xmlns:cx8="http://schemas.microsoft.com/office/drawing/2016/5/14/chartex" xmlns:mc="http://schemas.openxmlformats.org/markup-compatibility/2006" xmlns:aink="http://schemas.microsoft.com/office/drawing/2016/ink" xmlns:am3d="http://schemas.microsoft.com/office/drawing/2017/model3d" xmlns:o="urn:schemas-microsoft-com:office:office" xmlns:oel="http://schemas.microsoft.com/office/2019/extlst" xmlns:r="http://schemas.openxmlformats.org/officeDocument/2006/relationships" xmlns:m="http://schemas.openxmlformats.org/officeDocument/2006/math" xmlns:v="urn:schemas-microsoft-com:vml" xmlns:wp14="http://schemas.microsoft.com/office/word/2010/wordprocessingDrawing" xmlns:wp="http://schemas.openxmlformats.org/drawingml/2006/wordprocessingDrawing" xmlns:w10="urn:schemas-microsoft-com:office:word" xmlns:w="http://schemas.openxmlformats.org/wordprocessingml/2006/main" xmlns:w14="http://schemas.microsoft.com/office/word/2010/wordml" xmlns:w15="http://schemas.microsoft.com/office/word/2012/wordml" xmlns:w16cex="http://schemas.microsoft.com/office/word/2018/wordml/cex" xmlns:w16cid="http://schemas.microsoft.com/office/word/2016/wordml/cid" xmlns:w16="http://schemas.microsoft.com/office/word/2018/wordml" xmlns:w16du="http://schemas.microsoft.com/office/word/2023/wordml/word16du" xmlns:w16sdtdh="http://schemas.microsoft.com/office/word/2020/wordml/sdtdatahash" xmlns:w16sdtfl="http://schemas.microsoft.com/office/word/2024/wordml/sdtformatlock" xmlns:w16se="http://schemas.microsoft.com/office/word/2015/wordml/symex" xmlns:wpg="http://schemas.microsoft.com/office/word/2010/wordprocessingGroup" xmlns:wpi="http://schemas.microsoft.com/office/word/2010/wordprocessingInk" xmlns:wne="http://schemas.microsoft.com/office/word/2006/wordml" xmlns:wps="http://schemas.microsoft.com/office/word/2010/wordprocessingShape" mc:Ignorable="w14 w15 w16se w16cid w16 w16cex w16sdtdh w16sdtfl w16du wp14">
   <w:abstractNum w:abstractNumId="0" w15:restartNumberingAfterBreak="0">
+    <w:nsid w:val="03852DE4"/>
+    <w:multiLevelType w:val="multilevel"/>
+    <w:tmpl w:val="9BCEB86E"/>
+    <w:lvl w:ilvl="0">
+      <w:start w:val="1"/>
+      <w:numFmt w:val="bullet"/>
+      <w:lvlText w:val=""/>
+      <w:lvlJc w:val="left"/>
+      <w:pPr>
+        <w:tabs>
+          <w:tab w:val="num" w:pos="720"/>
+        </w:tabs>
+        <w:ind w:left="720" w:hanging="360"/>
+      </w:pPr>
+      <w:rPr>
+        <w:rFonts w:ascii="Symbol" w:hAnsi="Symbol" w:hint="default"/>
+        <w:sz w:val="20"/>
+      </w:rPr>
+    </w:lvl>
+    <w:lvl w:ilvl="1" w:tentative="1">
+      <w:start w:val="1"/>
+      <w:numFmt w:val="bullet"/>
+      <w:lvlText w:val="o"/>
+      <w:lvlJc w:val="left"/>
+      <w:pPr>
+        <w:tabs>
+          <w:tab w:val="num" w:pos="1440"/>
+        </w:tabs>
+        <w:ind w:left="1440" w:hanging="360"/>
+      </w:pPr>
+      <w:rPr>
+        <w:rFonts w:ascii="Courier New" w:hAnsi="Courier New" w:hint="default"/>
+        <w:sz w:val="20"/>
+      </w:rPr>
+    </w:lvl>
+    <w:lvl w:ilvl="2" w:tentative="1">
+      <w:start w:val="1"/>
+      <w:numFmt w:val="bullet"/>
+      <w:lvlText w:val=""/>
+      <w:lvlJc w:val="left"/>
+      <w:pPr>
+        <w:tabs>
+          <w:tab w:val="num" w:pos="2160"/>
+        </w:tabs>
+        <w:ind w:left="2160" w:hanging="360"/>
+      </w:pPr>
+      <w:rPr>
+        <w:rFonts w:ascii="Wingdings" w:hAnsi="Wingdings" w:hint="default"/>
+        <w:sz w:val="20"/>
+      </w:rPr>
+    </w:lvl>
+    <w:lvl w:ilvl="3" w:tentative="1">
+      <w:start w:val="1"/>
+      <w:numFmt w:val="bullet"/>
+      <w:lvlText w:val=""/>
+      <w:lvlJc w:val="left"/>
+      <w:pPr>
+        <w:tabs>
+          <w:tab w:val="num" w:pos="2880"/>
+        </w:tabs>
+        <w:ind w:left="2880" w:hanging="360"/>
+      </w:pPr>
+      <w:rPr>
+        <w:rFonts w:ascii="Wingdings" w:hAnsi="Wingdings" w:hint="default"/>
+        <w:sz w:val="20"/>
+      </w:rPr>
+    </w:lvl>
+    <w:lvl w:ilvl="4" w:tentative="1">
+      <w:start w:val="1"/>
+      <w:numFmt w:val="bullet"/>
+      <w:lvlText w:val=""/>
+      <w:lvlJc w:val="left"/>
+      <w:pPr>
+        <w:tabs>
+          <w:tab w:val="num" w:pos="3600"/>
+        </w:tabs>
+        <w:ind w:left="3600" w:hanging="360"/>
+      </w:pPr>
+      <w:rPr>
+        <w:rFonts w:ascii="Wingdings" w:hAnsi="Wingdings" w:hint="default"/>
+        <w:sz w:val="20"/>
+      </w:rPr>
+    </w:lvl>
+    <w:lvl w:ilvl="5" w:tentative="1">
+      <w:start w:val="1"/>
+      <w:numFmt w:val="bullet"/>
+      <w:lvlText w:val=""/>
+      <w:lvlJc w:val="left"/>
+      <w:pPr>
+        <w:tabs>
+          <w:tab w:val="num" w:pos="4320"/>
+        </w:tabs>
+        <w:ind w:left="4320" w:hanging="360"/>
+      </w:pPr>
+      <w:rPr>
+        <w:rFonts w:ascii="Wingdings" w:hAnsi="Wingdings" w:hint="default"/>
+        <w:sz w:val="20"/>
+      </w:rPr>
+    </w:lvl>
+    <w:lvl w:ilvl="6" w:tentative="1">
+      <w:start w:val="1"/>
+      <w:numFmt w:val="bullet"/>
+      <w:lvlText w:val=""/>
+      <w:lvlJc w:val="left"/>
+      <w:pPr>
+        <w:tabs>
+          <w:tab w:val="num" w:pos="5040"/>
+        </w:tabs>
+        <w:ind w:left="5040" w:hanging="360"/>
+      </w:pPr>
+      <w:rPr>
+        <w:rFonts w:ascii="Wingdings" w:hAnsi="Wingdings" w:hint="default"/>
+        <w:sz w:val="20"/>
+      </w:rPr>
+    </w:lvl>
+    <w:lvl w:ilvl="7" w:tentative="1">
+      <w:start w:val="1"/>
+      <w:numFmt w:val="bullet"/>
+      <w:lvlText w:val=""/>
+      <w:lvlJc w:val="left"/>
+      <w:pPr>
+        <w:tabs>
+          <w:tab w:val="num" w:pos="5760"/>
+        </w:tabs>
+        <w:ind w:left="5760" w:hanging="360"/>
+      </w:pPr>
+      <w:rPr>
+        <w:rFonts w:ascii="Wingdings" w:hAnsi="Wingdings" w:hint="default"/>
+        <w:sz w:val="20"/>
+      </w:rPr>
+    </w:lvl>
+    <w:lvl w:ilvl="8" w:tentative="1">
+      <w:start w:val="1"/>
+      <w:numFmt w:val="bullet"/>
+      <w:lvlText w:val=""/>
+      <w:lvlJc w:val="left"/>
+      <w:pPr>
+        <w:tabs>
+          <w:tab w:val="num" w:pos="6480"/>
+        </w:tabs>
+        <w:ind w:left="6480" w:hanging="360"/>
+      </w:pPr>
+      <w:rPr>
+        <w:rFonts w:ascii="Wingdings" w:hAnsi="Wingdings" w:hint="default"/>
+        <w:sz w:val="20"/>
+      </w:rPr>
+    </w:lvl>
+  </w:abstractNum>
+  <w:abstractNum w:abstractNumId="1" w15:restartNumberingAfterBreak="0">
+    <w:nsid w:val="0FCB028D"/>
+    <w:multiLevelType w:val="multilevel"/>
+    <w:tmpl w:val="333E3CB6"/>
+    <w:lvl w:ilvl="0">
+      <w:start w:val="1"/>
+      <w:numFmt w:val="decimal"/>
+      <w:lvlText w:val="%1."/>
+      <w:lvlJc w:val="left"/>
+      <w:pPr>
+        <w:tabs>
+          <w:tab w:val="num" w:pos="720"/>
+        </w:tabs>
+        <w:ind w:left="720" w:hanging="360"/>
+      </w:pPr>
+    </w:lvl>
+    <w:lvl w:ilvl="1">
+      <w:start w:val="1"/>
+      <w:numFmt w:val="bullet"/>
+      <w:lvlText w:val="o"/>
+      <w:lvlJc w:val="left"/>
+      <w:pPr>
+        <w:tabs>
+          <w:tab w:val="num" w:pos="1440"/>
+        </w:tabs>
+        <w:ind w:left="1440" w:hanging="360"/>
+      </w:pPr>
+      <w:rPr>
+        <w:rFonts w:ascii="Courier New" w:hAnsi="Courier New" w:hint="default"/>
+        <w:sz w:val="20"/>
+      </w:rPr>
+    </w:lvl>
+    <w:lvl w:ilvl="2" w:tentative="1">
+      <w:start w:val="1"/>
+      <w:numFmt w:val="decimal"/>
+      <w:lvlText w:val="%3."/>
+      <w:lvlJc w:val="left"/>
+      <w:pPr>
+        <w:tabs>
+          <w:tab w:val="num" w:pos="2160"/>
+        </w:tabs>
+        <w:ind w:left="2160" w:hanging="360"/>
+      </w:pPr>
+    </w:lvl>
+    <w:lvl w:ilvl="3" w:tentative="1">
+      <w:start w:val="1"/>
+      <w:numFmt w:val="decimal"/>
+      <w:lvlText w:val="%4."/>
+      <w:lvlJc w:val="left"/>
+      <w:pPr>
+        <w:tabs>
+          <w:tab w:val="num" w:pos="2880"/>
+        </w:tabs>
+        <w:ind w:left="2880" w:hanging="360"/>
+      </w:pPr>
+    </w:lvl>
+    <w:lvl w:ilvl="4" w:tentative="1">
+      <w:start w:val="1"/>
+      <w:numFmt w:val="decimal"/>
+      <w:lvlText w:val="%5."/>
+      <w:lvlJc w:val="left"/>
+      <w:pPr>
+        <w:tabs>
+          <w:tab w:val="num" w:pos="3600"/>
+        </w:tabs>
+        <w:ind w:left="3600" w:hanging="360"/>
+      </w:pPr>
+    </w:lvl>
+    <w:lvl w:ilvl="5" w:tentative="1">
+      <w:start w:val="1"/>
+      <w:numFmt w:val="decimal"/>
+      <w:lvlText w:val="%6."/>
+      <w:lvlJc w:val="left"/>
+      <w:pPr>
+        <w:tabs>
+          <w:tab w:val="num" w:pos="4320"/>
+        </w:tabs>
+        <w:ind w:left="4320" w:hanging="360"/>
+      </w:pPr>
+    </w:lvl>
+    <w:lvl w:ilvl="6" w:tentative="1">
+      <w:start w:val="1"/>
+      <w:numFmt w:val="decimal"/>
+      <w:lvlText w:val="%7."/>
+      <w:lvlJc w:val="left"/>
+      <w:pPr>
+        <w:tabs>
+          <w:tab w:val="num" w:pos="5040"/>
+        </w:tabs>
+        <w:ind w:left="5040" w:hanging="360"/>
+      </w:pPr>
+    </w:lvl>
+    <w:lvl w:ilvl="7" w:tentative="1">
+      <w:start w:val="1"/>
+      <w:numFmt w:val="decimal"/>
+      <w:lvlText w:val="%8."/>
+      <w:lvlJc w:val="left"/>
+      <w:pPr>
+        <w:tabs>
+          <w:tab w:val="num" w:pos="5760"/>
+        </w:tabs>
+        <w:ind w:left="5760" w:hanging="360"/>
+      </w:pPr>
+    </w:lvl>
+    <w:lvl w:ilvl="8" w:tentative="1">
+      <w:start w:val="1"/>
+      <w:numFmt w:val="decimal"/>
+      <w:lvlText w:val="%9."/>
+      <w:lvlJc w:val="left"/>
+      <w:pPr>
+        <w:tabs>
+          <w:tab w:val="num" w:pos="6480"/>
+        </w:tabs>
+        <w:ind w:left="6480" w:hanging="360"/>
+      </w:pPr>
+    </w:lvl>
+  </w:abstractNum>
+  <w:abstractNum w:abstractNumId="2" w15:restartNumberingAfterBreak="0">
     <w:nsid w:val="14EB4279"/>
     <w:multiLevelType w:val="hybridMultilevel"/>
     <w:tmpl w:val="6F34B0D2"/>
@@ -5868,7 +6703,7 @@
       </w:pPr>
     </w:lvl>
   </w:abstractNum>
-  <w:abstractNum w:abstractNumId="1" w15:restartNumberingAfterBreak="0">
+  <w:abstractNum w:abstractNumId="3" w15:restartNumberingAfterBreak="0">
     <w:nsid w:val="1EC935CE"/>
     <w:multiLevelType w:val="hybridMultilevel"/>
     <w:tmpl w:val="AA029186"/>
@@ -5981,7 +6816,124 @@
       </w:rPr>
     </w:lvl>
   </w:abstractNum>
-  <w:abstractNum w:abstractNumId="2" w15:restartNumberingAfterBreak="0">
+  <w:abstractNum w:abstractNumId="4" w15:restartNumberingAfterBreak="0">
+    <w:nsid w:val="1F750CC4"/>
+    <w:multiLevelType w:val="multilevel"/>
+    <w:tmpl w:val="E2208C88"/>
+    <w:lvl w:ilvl="0">
+      <w:start w:val="1"/>
+      <w:numFmt w:val="decimal"/>
+      <w:lvlText w:val="%1."/>
+      <w:lvlJc w:val="left"/>
+      <w:pPr>
+        <w:tabs>
+          <w:tab w:val="num" w:pos="720"/>
+        </w:tabs>
+        <w:ind w:left="720" w:hanging="360"/>
+      </w:pPr>
+    </w:lvl>
+    <w:lvl w:ilvl="1">
+      <w:start w:val="1"/>
+      <w:numFmt w:val="bullet"/>
+      <w:lvlText w:val="o"/>
+      <w:lvlJc w:val="left"/>
+      <w:pPr>
+        <w:tabs>
+          <w:tab w:val="num" w:pos="1440"/>
+        </w:tabs>
+        <w:ind w:left="1440" w:hanging="360"/>
+      </w:pPr>
+      <w:rPr>
+        <w:rFonts w:ascii="Courier New" w:hAnsi="Courier New" w:hint="default"/>
+        <w:sz w:val="20"/>
+      </w:rPr>
+    </w:lvl>
+    <w:lvl w:ilvl="2" w:tentative="1">
+      <w:start w:val="1"/>
+      <w:numFmt w:val="decimal"/>
+      <w:lvlText w:val="%3."/>
+      <w:lvlJc w:val="left"/>
+      <w:pPr>
+        <w:tabs>
+          <w:tab w:val="num" w:pos="2160"/>
+        </w:tabs>
+        <w:ind w:left="2160" w:hanging="360"/>
+      </w:pPr>
+    </w:lvl>
+    <w:lvl w:ilvl="3" w:tentative="1">
+      <w:start w:val="1"/>
+      <w:numFmt w:val="decimal"/>
+      <w:lvlText w:val="%4."/>
+      <w:lvlJc w:val="left"/>
+      <w:pPr>
+        <w:tabs>
+          <w:tab w:val="num" w:pos="2880"/>
+        </w:tabs>
+        <w:ind w:left="2880" w:hanging="360"/>
+      </w:pPr>
+    </w:lvl>
+    <w:lvl w:ilvl="4" w:tentative="1">
+      <w:start w:val="1"/>
+      <w:numFmt w:val="decimal"/>
+      <w:lvlText w:val="%5."/>
+      <w:lvlJc w:val="left"/>
+      <w:pPr>
+        <w:tabs>
+          <w:tab w:val="num" w:pos="3600"/>
+        </w:tabs>
+        <w:ind w:left="3600" w:hanging="360"/>
+      </w:pPr>
+    </w:lvl>
+    <w:lvl w:ilvl="5" w:tentative="1">
+      <w:start w:val="1"/>
+      <w:numFmt w:val="decimal"/>
+      <w:lvlText w:val="%6."/>
+      <w:lvlJc w:val="left"/>
+      <w:pPr>
+        <w:tabs>
+          <w:tab w:val="num" w:pos="4320"/>
+        </w:tabs>
+        <w:ind w:left="4320" w:hanging="360"/>
+      </w:pPr>
+    </w:lvl>
+    <w:lvl w:ilvl="6" w:tentative="1">
+      <w:start w:val="1"/>
+      <w:numFmt w:val="decimal"/>
+      <w:lvlText w:val="%7."/>
+      <w:lvlJc w:val="left"/>
+      <w:pPr>
+        <w:tabs>
+          <w:tab w:val="num" w:pos="5040"/>
+        </w:tabs>
+        <w:ind w:left="5040" w:hanging="360"/>
+      </w:pPr>
+    </w:lvl>
+    <w:lvl w:ilvl="7" w:tentative="1">
+      <w:start w:val="1"/>
+      <w:numFmt w:val="decimal"/>
+      <w:lvlText w:val="%8."/>
+      <w:lvlJc w:val="left"/>
+      <w:pPr>
+        <w:tabs>
+          <w:tab w:val="num" w:pos="5760"/>
+        </w:tabs>
+        <w:ind w:left="5760" w:hanging="360"/>
+      </w:pPr>
+    </w:lvl>
+    <w:lvl w:ilvl="8" w:tentative="1">
+      <w:start w:val="1"/>
+      <w:numFmt w:val="decimal"/>
+      <w:lvlText w:val="%9."/>
+      <w:lvlJc w:val="left"/>
+      <w:pPr>
+        <w:tabs>
+          <w:tab w:val="num" w:pos="6480"/>
+        </w:tabs>
+        <w:ind w:left="6480" w:hanging="360"/>
+      </w:pPr>
+    </w:lvl>
+  </w:abstractNum>
+  <w:abstractNum w:abstractNumId="5" w15:restartNumberingAfterBreak="0">
     <w:nsid w:val="1FFB2A39"/>
     <w:multiLevelType w:val="multilevel"/>
     <w:tmpl w:val="003AE8A8"/>
@@ -6130,7 +7082,7 @@
       </w:rPr>
     </w:lvl>
   </w:abstractNum>
-  <w:abstractNum w:abstractNumId="3" w15:restartNumberingAfterBreak="0">
+  <w:abstractNum w:abstractNumId="6" w15:restartNumberingAfterBreak="0">
     <w:nsid w:val="21A273DA"/>
     <w:multiLevelType w:val="hybridMultilevel"/>
     <w:tmpl w:val="825437A6"/>
@@ -6243,7 +7195,7 @@
       </w:rPr>
     </w:lvl>
   </w:abstractNum>
-  <w:abstractNum w:abstractNumId="4" w15:restartNumberingAfterBreak="0">
+  <w:abstractNum w:abstractNumId="7" w15:restartNumberingAfterBreak="0">
     <w:nsid w:val="2F254815"/>
     <w:multiLevelType w:val="hybridMultilevel"/>
     <w:tmpl w:val="3814D6FA"/>
@@ -6356,7 +7308,7 @@
       </w:rPr>
     </w:lvl>
   </w:abstractNum>
-  <w:abstractNum w:abstractNumId="5" w15:restartNumberingAfterBreak="0">
+  <w:abstractNum w:abstractNumId="8" w15:restartNumberingAfterBreak="0">
     <w:nsid w:val="2FF922CF"/>
     <w:multiLevelType w:val="hybridMultilevel"/>
     <w:tmpl w:val="13B43BCE"/>
@@ -6469,7 +7421,7 @@
       </w:rPr>
     </w:lvl>
   </w:abstractNum>
-  <w:abstractNum w:abstractNumId="6" w15:restartNumberingAfterBreak="0">
+  <w:abstractNum w:abstractNumId="9" w15:restartNumberingAfterBreak="0">
     <w:nsid w:val="3AD12E15"/>
     <w:multiLevelType w:val="multilevel"/>
     <w:tmpl w:val="1B26CE52"/>
@@ -6582,7 +7534,7 @@
       </w:pPr>
     </w:lvl>
   </w:abstractNum>
-  <w:abstractNum w:abstractNumId="7" w15:restartNumberingAfterBreak="0">
+  <w:abstractNum w:abstractNumId="10" w15:restartNumberingAfterBreak="0">
     <w:nsid w:val="46851638"/>
     <w:multiLevelType w:val="hybridMultilevel"/>
     <w:tmpl w:val="5002E234"/>
@@ -6695,7 +7647,7 @@
       </w:rPr>
     </w:lvl>
   </w:abstractNum>
-  <w:abstractNum w:abstractNumId="8" w15:restartNumberingAfterBreak="0">
+  <w:abstractNum w:abstractNumId="11" w15:restartNumberingAfterBreak="0">
     <w:nsid w:val="4C687D05"/>
     <w:multiLevelType w:val="hybridMultilevel"/>
     <w:tmpl w:val="3E06CC0A"/>
@@ -6808,7 +7760,7 @@
       </w:rPr>
     </w:lvl>
   </w:abstractNum>
-  <w:abstractNum w:abstractNumId="9" w15:restartNumberingAfterBreak="0">
+  <w:abstractNum w:abstractNumId="12" w15:restartNumberingAfterBreak="0">
     <w:nsid w:val="4E251AC9"/>
     <w:multiLevelType w:val="hybridMultilevel"/>
     <w:tmpl w:val="B8BE0B24"/>
@@ -6897,7 +7849,7 @@
       </w:pPr>
     </w:lvl>
   </w:abstractNum>
-  <w:abstractNum w:abstractNumId="10" w15:restartNumberingAfterBreak="0">
+  <w:abstractNum w:abstractNumId="13" w15:restartNumberingAfterBreak="0">
     <w:nsid w:val="65052AC2"/>
     <w:multiLevelType w:val="hybridMultilevel"/>
     <w:tmpl w:val="2A207D80"/>
@@ -7010,7 +7962,7 @@
       </w:rPr>
     </w:lvl>
   </w:abstractNum>
-  <w:abstractNum w:abstractNumId="11" w15:restartNumberingAfterBreak="0">
+  <w:abstractNum w:abstractNumId="14" w15:restartNumberingAfterBreak="0">
     <w:nsid w:val="6DAB0C8B"/>
     <w:multiLevelType w:val="hybridMultilevel"/>
     <w:tmpl w:val="E6168C9A"/>
@@ -7123,7 +8075,7 @@
       </w:rPr>
     </w:lvl>
   </w:abstractNum>
-  <w:abstractNum w:abstractNumId="12" w15:restartNumberingAfterBreak="0">
+  <w:abstractNum w:abstractNumId="15" w15:restartNumberingAfterBreak="0">
     <w:nsid w:val="6F6B297F"/>
     <w:multiLevelType w:val="hybridMultilevel"/>
     <w:tmpl w:val="90604326"/>
@@ -7235,7 +8187,7 @@
       </w:rPr>
     </w:lvl>
   </w:abstractNum>
-  <w:abstractNum w:abstractNumId="13" w15:restartNumberingAfterBreak="0">
+  <w:abstractNum w:abstractNumId="16" w15:restartNumberingAfterBreak="0">
     <w:nsid w:val="71231961"/>
     <w:multiLevelType w:val="hybridMultilevel"/>
     <w:tmpl w:val="856A9720"/>
@@ -7348,7 +8300,7 @@
       </w:rPr>
     </w:lvl>
   </w:abstractNum>
-  <w:abstractNum w:abstractNumId="14" w15:restartNumberingAfterBreak="0">
+  <w:abstractNum w:abstractNumId="17" w15:restartNumberingAfterBreak="0">
     <w:nsid w:val="74815055"/>
     <w:multiLevelType w:val="hybridMultilevel"/>
     <w:tmpl w:val="2FD09D60"/>
@@ -7437,7 +8389,7 @@
       </w:pPr>
     </w:lvl>
   </w:abstractNum>
-  <w:abstractNum w:abstractNumId="15" w15:restartNumberingAfterBreak="0">
+  <w:abstractNum w:abstractNumId="18" w15:restartNumberingAfterBreak="0">
     <w:nsid w:val="7FE96A27"/>
     <w:multiLevelType w:val="multilevel"/>
     <w:tmpl w:val="2E109BCA"/>
@@ -7587,52 +8539,61 @@
     </w:lvl>
   </w:abstractNum>
   <w:num w:numId="1" w16cid:durableId="1329406315">
+    <w:abstractNumId w:val="15"/>
+  </w:num>
+  <w:num w:numId="2" w16cid:durableId="346176687">
+    <w:abstractNumId w:val="18"/>
+  </w:num>
+  <w:num w:numId="3" w16cid:durableId="588125869">
+    <w:abstractNumId w:val="6"/>
+  </w:num>
+  <w:num w:numId="4" w16cid:durableId="423965292">
+    <w:abstractNumId w:val="3"/>
+  </w:num>
+  <w:num w:numId="5" w16cid:durableId="487792376">
+    <w:abstractNumId w:val="2"/>
+  </w:num>
+  <w:num w:numId="6" w16cid:durableId="1462187803">
+    <w:abstractNumId w:val="9"/>
+  </w:num>
+  <w:num w:numId="7" w16cid:durableId="313225329">
     <w:abstractNumId w:val="12"/>
   </w:num>
-  <w:num w:numId="2" w16cid:durableId="346176687">
-    <w:abstractNumId w:val="15"/>
+  <w:num w:numId="8" w16cid:durableId="11156116">
+    <w:abstractNumId w:val="5"/>
   </w:num>
-  <w:num w:numId="3" w16cid:durableId="588125869">
-    <w:abstractNumId w:val="3"/>
+  <w:num w:numId="9" w16cid:durableId="1024936680">
+    <w:abstractNumId w:val="14"/>
   </w:num>
-  <w:num w:numId="4" w16cid:durableId="423965292">
+  <w:num w:numId="10" w16cid:durableId="1490097057">
+    <w:abstractNumId w:val="8"/>
+  </w:num>
+  <w:num w:numId="11" w16cid:durableId="1170869400">
+    <w:abstractNumId w:val="11"/>
+  </w:num>
+  <w:num w:numId="12" w16cid:durableId="2014062361">
+    <w:abstractNumId w:val="17"/>
+  </w:num>
+  <w:num w:numId="13" w16cid:durableId="241136983">
+    <w:abstractNumId w:val="13"/>
+  </w:num>
+  <w:num w:numId="14" w16cid:durableId="529539341">
+    <w:abstractNumId w:val="7"/>
+  </w:num>
+  <w:num w:numId="15" w16cid:durableId="1436974733">
+    <w:abstractNumId w:val="10"/>
+  </w:num>
+  <w:num w:numId="16" w16cid:durableId="46534208">
+    <w:abstractNumId w:val="16"/>
+  </w:num>
+  <w:num w:numId="17" w16cid:durableId="1015765958">
     <w:abstractNumId w:val="1"/>
   </w:num>
-  <w:num w:numId="5" w16cid:durableId="487792376">
+  <w:num w:numId="18" w16cid:durableId="1676495180">
     <w:abstractNumId w:val="0"/>
   </w:num>
-  <w:num w:numId="6" w16cid:durableId="1462187803">
-    <w:abstractNumId w:val="6"/>
-  </w:num>
-  <w:num w:numId="7" w16cid:durableId="313225329">
-    <w:abstractNumId w:val="9"/>
-  </w:num>
-  <w:num w:numId="8" w16cid:durableId="11156116">
-    <w:abstractNumId w:val="2"/>
-  </w:num>
-  <w:num w:numId="9" w16cid:durableId="1024936680">
-    <w:abstractNumId w:val="11"/>
-  </w:num>
-  <w:num w:numId="10" w16cid:durableId="1490097057">
-    <w:abstractNumId w:val="5"/>
-  </w:num>
-  <w:num w:numId="11" w16cid:durableId="1170869400">
-    <w:abstractNumId w:val="8"/>
-  </w:num>
-  <w:num w:numId="12" w16cid:durableId="2014062361">
-    <w:abstractNumId w:val="14"/>
-  </w:num>
-  <w:num w:numId="13" w16cid:durableId="241136983">
-    <w:abstractNumId w:val="10"/>
-  </w:num>
-  <w:num w:numId="14" w16cid:durableId="529539341">
+  <w:num w:numId="19" w16cid:durableId="1576696570">
     <w:abstractNumId w:val="4"/>
-  </w:num>
-  <w:num w:numId="15" w16cid:durableId="1436974733">
-    <w:abstractNumId w:val="7"/>
-  </w:num>
-  <w:num w:numId="16" w16cid:durableId="46534208">
-    <w:abstractNumId w:val="13"/>
   </w:num>
 </w:numbering>
 </file>
@@ -8240,7 +9201,6 @@
   <w:style w:type="character" w:default="1" w:styleId="DefaultParagraphFont">
     <w:name w:val="Default Paragraph Font"/>
     <w:uiPriority w:val="1"/>
-    <w:semiHidden/>
     <w:unhideWhenUsed/>
   </w:style>
   <w:style w:type="table" w:default="1" w:styleId="TableNormal">

</xml_diff>

<commit_message>
Learned CoreDNS, how pod get the default resolve conf name server with kubelet config, how to connect to services  across namespaces
</commit_message>
<xml_diff>
--- a/9-Interesting_learning_Notes/Learning_Notes.docx
+++ b/9-Interesting_learning_Notes/Learning_Notes.docx
@@ -119,7 +119,6 @@
       <w:r>
         <w:t xml:space="preserve">, Kubernetes assigns it a </w:t>
       </w:r>
-      <w:proofErr w:type="spellStart"/>
       <w:r>
         <w:rPr>
           <w:b/>
@@ -127,7 +126,6 @@
         </w:rPr>
         <w:t>ClusterIP</w:t>
       </w:r>
-      <w:proofErr w:type="spellEnd"/>
       <w:r>
         <w:t xml:space="preserve">. </w:t>
       </w:r>
@@ -181,21 +179,12 @@
           <w:numId w:val="2"/>
         </w:numPr>
       </w:pPr>
-      <w:proofErr w:type="spellStart"/>
-      <w:r>
-        <w:rPr>
-          <w:b/>
-          <w:bCs/>
-        </w:rPr>
-        <w:t>kube</w:t>
-      </w:r>
-      <w:proofErr w:type="spellEnd"/>
-      <w:r>
-        <w:rPr>
-          <w:b/>
-          <w:bCs/>
-        </w:rPr>
-        <w:t>-proxy does not assign the Service IP.</w:t>
+      <w:r>
+        <w:rPr>
+          <w:b/>
+          <w:bCs/>
+        </w:rPr>
+        <w:t>kube-proxy does not assign the Service IP.</w:t>
       </w:r>
       <w:r>
         <w:t xml:space="preserve"> </w:t>
@@ -208,13 +197,8 @@
           <w:numId w:val="2"/>
         </w:numPr>
       </w:pPr>
-      <w:proofErr w:type="spellStart"/>
-      <w:r>
-        <w:t>kube</w:t>
-      </w:r>
-      <w:proofErr w:type="spellEnd"/>
-      <w:r>
-        <w:t xml:space="preserve">-proxy watches Services and creates </w:t>
+      <w:r>
+        <w:t xml:space="preserve">kube-proxy watches Services and creates </w:t>
       </w:r>
       <w:r>
         <w:rPr>
@@ -224,15 +208,7 @@
         <w:t>networking rules</w:t>
       </w:r>
       <w:r>
-        <w:t xml:space="preserve"> (iptables/IPVS/</w:t>
-      </w:r>
-      <w:proofErr w:type="spellStart"/>
-      <w:r>
-        <w:t>nftables</w:t>
-      </w:r>
-      <w:proofErr w:type="spellEnd"/>
-      <w:r>
-        <w:t>) to route traffic from the Service IP to the backend Pod IPs.</w:t>
+        <w:t xml:space="preserve"> (iptables/IPVS/nftables) to route traffic from the Service IP to the backend Pod IPs.</w:t>
       </w:r>
     </w:p>
     <w:p>
@@ -263,21 +239,12 @@
           <w:numId w:val="2"/>
         </w:numPr>
       </w:pPr>
-      <w:proofErr w:type="spellStart"/>
-      <w:r>
-        <w:rPr>
-          <w:b/>
-          <w:bCs/>
-        </w:rPr>
-        <w:t>kube</w:t>
-      </w:r>
-      <w:proofErr w:type="spellEnd"/>
-      <w:r>
-        <w:rPr>
-          <w:b/>
-          <w:bCs/>
-        </w:rPr>
-        <w:t>-proxy</w:t>
+      <w:r>
+        <w:rPr>
+          <w:b/>
+          <w:bCs/>
+        </w:rPr>
+        <w:t>kube-proxy</w:t>
       </w:r>
       <w:r>
         <w:t xml:space="preserve"> creates networking rules that recognize this virtual IP and forward traffic to the Service's backend Pods.</w:t>
@@ -323,40 +290,19 @@
         <w:t xml:space="preserve">: </w:t>
       </w:r>
       <w:r>
-        <w:t xml:space="preserve">A Kubernetes </w:t>
-      </w:r>
-      <w:proofErr w:type="spellStart"/>
-      <w:r>
-        <w:t>NodePort</w:t>
-      </w:r>
-      <w:proofErr w:type="spellEnd"/>
-      <w:r>
-        <w:t xml:space="preserve"> does not create a normal listening socket on the node. Instead, </w:t>
-      </w:r>
-      <w:proofErr w:type="spellStart"/>
-      <w:r>
-        <w:t>Kuberne</w:t>
+        <w:t>A Kubernetes NodePort does not create a normal listening socket on the node. Instead, Kuberne</w:t>
       </w:r>
       <w:r>
         <w:t>s</w:t>
       </w:r>
       <w:r>
-        <w:t>tes</w:t>
-      </w:r>
-      <w:proofErr w:type="spellEnd"/>
-      <w:r>
-        <w:t xml:space="preserve"> configures networking rules to forward traffic arriving on that port to the Service. Therefore, if a host-level application is already listening on the same port, traffic arriving through that node may be handled by the existing application instead of reaching the Kubernetes Service, depending on the networking implementation and rule processing.</w:t>
-      </w:r>
-    </w:p>
-    <w:p/>
-    <w:p>
-      <w:proofErr w:type="spellStart"/>
-      <w:r>
-        <w:t>NodePort</w:t>
-      </w:r>
-      <w:proofErr w:type="spellEnd"/>
-      <w:r>
-        <w:t xml:space="preserve"> 30005 does NOT mean:</w:t>
+        <w:t>tes configures networking rules to forward traffic arriving on that port to the Service. Therefore, if a host-level application is already listening on the same port, traffic arriving through that node may be handled by the existing application instead of reaching the Kubernetes Service, depending on the networking implementation and rule processing.</w:t>
+      </w:r>
+    </w:p>
+    <w:p/>
+    <w:p>
+      <w:r>
+        <w:t>NodePort 30005 does NOT mean:</w:t>
       </w:r>
     </w:p>
     <w:p>
@@ -380,21 +326,12 @@
       <w:r>
         <w:t xml:space="preserve">packet gets </w:t>
       </w:r>
-      <w:proofErr w:type="spellStart"/>
-      <w:r>
-        <w:rPr>
-          <w:b/>
-          <w:bCs/>
-        </w:rPr>
-        <w:t>DNAT'ed</w:t>
-      </w:r>
-      <w:proofErr w:type="spellEnd"/>
-      <w:r>
-        <w:rPr>
-          <w:b/>
-          <w:bCs/>
-        </w:rPr>
-        <w:t>/redirected by the Kubernetes networking rules before normal socket delivery</w:t>
+      <w:r>
+        <w:rPr>
+          <w:b/>
+          <w:bCs/>
+        </w:rPr>
+        <w:t>DNAT'ed/redirected by the Kubernetes networking rules before normal socket delivery</w:t>
       </w:r>
       <w:r>
         <w:t>.</w:t>
@@ -411,7 +348,6 @@
       <w:r>
         <w:t xml:space="preserve">The full DNS to refer a service is: </w:t>
       </w:r>
-      <w:proofErr w:type="spellStart"/>
       <w:r>
         <w:rPr>
           <w:b/>
@@ -419,7 +355,6 @@
         </w:rPr>
         <w:t>myservice.default.svc.cluster.local</w:t>
       </w:r>
-      <w:proofErr w:type="spellEnd"/>
     </w:p>
     <w:p>
       <w:pPr>
@@ -446,21 +381,8 @@
     </w:p>
     <w:p>
       <w:r>
-        <w:t xml:space="preserve">The Structure of a Kubernetes Service DNS </w:t>
-      </w:r>
-      <w:proofErr w:type="spellStart"/>
-      <w:r>
-        <w:t>NameEvery</w:t>
-      </w:r>
-      <w:proofErr w:type="spellEnd"/>
-      <w:r>
-        <w:t xml:space="preserve"> Service gets a full DNS address that looks like this:[service-name].[namespace].</w:t>
-      </w:r>
-      <w:proofErr w:type="spellStart"/>
-      <w:r>
-        <w:t>svc.cluster.local</w:t>
-      </w:r>
-      <w:proofErr w:type="spellEnd"/>
+        <w:t>The Structure of a Kubernetes Service DNS NameEvery Service gets a full DNS address that looks like this:[service-name].[namespace].svc.cluster.local</w:t>
+      </w:r>
     </w:p>
     <w:p>
       <w:pPr>
@@ -470,13 +392,8 @@
           <w:numId w:val="3"/>
         </w:numPr>
       </w:pPr>
-      <w:proofErr w:type="spellStart"/>
-      <w:r>
-        <w:t>service-name:The</w:t>
-      </w:r>
-      <w:proofErr w:type="spellEnd"/>
-      <w:r>
-        <w:t xml:space="preserve"> name you gave your Service.</w:t>
+      <w:r>
+        <w:t>service-name:The name you gave your Service.</w:t>
       </w:r>
     </w:p>
     <w:p>
@@ -504,93 +421,24 @@
       </w:r>
     </w:p>
     <w:p>
-      <w:proofErr w:type="spellStart"/>
-      <w:r>
-        <w:t>cluster.local</w:t>
-      </w:r>
-      <w:proofErr w:type="spellEnd"/>
-      <w:r>
-        <w:t>: The default local domain name for your entire cluster.</w:t>
-      </w:r>
-    </w:p>
-    <w:p/>
-    <w:p>
-      <w:r>
-        <w:t>Scenario A Example: A pod in the "frontend" namespace connects to a database in the same namespace using just "</w:t>
-      </w:r>
-      <w:proofErr w:type="spellStart"/>
-      <w:r>
-        <w:t>db</w:t>
-      </w:r>
-      <w:proofErr w:type="spellEnd"/>
-      <w:r>
-        <w:t>-service".</w:t>
-      </w:r>
-    </w:p>
-    <w:p>
-      <w:r>
-        <w:t>Scenario B Example: A pod in the "frontend" namespace connects to a database in the "backend" namespace using "</w:t>
-      </w:r>
-      <w:proofErr w:type="spellStart"/>
-      <w:r>
-        <w:t>db-service.backend</w:t>
-      </w:r>
-      <w:proofErr w:type="spellEnd"/>
-      <w:r>
-        <w:t>".</w:t>
-      </w:r>
-    </w:p>
-    <w:p>
-      <w:r>
-        <w:t>The remaining part of the address—.</w:t>
-      </w:r>
-      <w:proofErr w:type="spellStart"/>
-      <w:r>
-        <w:t>svc.cluster.local</w:t>
-      </w:r>
-      <w:proofErr w:type="spellEnd"/>
-      <w:r>
-        <w:t>—is called the cluster suffix. It is not mandatory because every container running inside a Kubernetes Pod has a hidden configuration file (/</w:t>
-      </w:r>
-      <w:proofErr w:type="spellStart"/>
-      <w:r>
-        <w:t>etc</w:t>
-      </w:r>
-      <w:proofErr w:type="spellEnd"/>
-      <w:r>
-        <w:t>/</w:t>
-      </w:r>
-      <w:proofErr w:type="spellStart"/>
-      <w:r>
-        <w:t>resolv.conf</w:t>
-      </w:r>
-      <w:proofErr w:type="spellEnd"/>
-      <w:r>
-        <w:t xml:space="preserve">) created automatically by the cluster. it contain all the search </w:t>
-      </w:r>
-      <w:proofErr w:type="spellStart"/>
-      <w:r>
-        <w:t>list.Because</w:t>
-      </w:r>
-      <w:proofErr w:type="spellEnd"/>
-      <w:r>
-        <w:t xml:space="preserve"> of this search list, if you type just </w:t>
-      </w:r>
-      <w:proofErr w:type="spellStart"/>
-      <w:r>
-        <w:t>db</w:t>
-      </w:r>
-      <w:proofErr w:type="spellEnd"/>
-      <w:r>
-        <w:t>-service, Kubernetes automatically appends the remaining parts (.</w:t>
-      </w:r>
-      <w:proofErr w:type="spellStart"/>
-      <w:r>
-        <w:t>svc.cluster.local</w:t>
-      </w:r>
-      <w:proofErr w:type="spellEnd"/>
-      <w:r>
-        <w:t>) behind the scenes and tests them one by one until it finds a match!</w:t>
+      <w:r>
+        <w:t>cluster.local: The default local domain name for your entire cluster.</w:t>
+      </w:r>
+    </w:p>
+    <w:p/>
+    <w:p>
+      <w:r>
+        <w:t>Scenario A Example: A pod in the "frontend" namespace connects to a database in the same namespace using just "db-service".</w:t>
+      </w:r>
+    </w:p>
+    <w:p>
+      <w:r>
+        <w:t>Scenario B Example: A pod in the "frontend" namespace connects to a database in the "backend" namespace using "db-service.backend".</w:t>
+      </w:r>
+    </w:p>
+    <w:p>
+      <w:r>
+        <w:t>The remaining part of the address—.svc.cluster.local—is called the cluster suffix. It is not mandatory because every container running inside a Kubernetes Pod has a hidden configuration file (/etc/resolv.conf) created automatically by the cluster. it contain all the search list.Because of this search list, if you type just db-service, Kubernetes automatically appends the remaining parts (.svc.cluster.local) behind the scenes and tests them one by one until it finds a match!</w:t>
       </w:r>
     </w:p>
     <w:p>
@@ -673,59 +521,41 @@
       <w:r>
         <w:t xml:space="preserve"> </w:t>
       </w:r>
-      <w:proofErr w:type="spellStart"/>
-      <w:r>
-        <w:t>kubectl</w:t>
-      </w:r>
-      <w:proofErr w:type="spellEnd"/>
+      <w:r>
+        <w:t xml:space="preserve">kubectl </w:t>
+      </w:r>
+      <w:r>
+        <w:rPr>
+          <w:b/>
+          <w:bCs/>
+        </w:rPr>
+        <w:t>edit</w:t>
+      </w:r>
+      <w:r>
+        <w:t xml:space="preserve"> svc my-nodeport-service</w:t>
+      </w:r>
+    </w:p>
+    <w:p>
+      <w:pPr>
+        <w:rPr>
+          <w:b/>
+          <w:bCs/>
+        </w:rPr>
+      </w:pPr>
+      <w:r>
+        <w:t xml:space="preserve">Under the selector section, add the label of the pod. The pod label can be found </w:t>
+      </w:r>
+      <w:r>
+        <w:t>using:</w:t>
+      </w:r>
       <w:r>
         <w:t xml:space="preserve"> </w:t>
       </w:r>
       <w:r>
-        <w:rPr>
-          <w:b/>
-          <w:bCs/>
-        </w:rPr>
-        <w:t>edit</w:t>
-      </w:r>
-      <w:r>
-        <w:t xml:space="preserve"> svc my-</w:t>
-      </w:r>
-      <w:proofErr w:type="spellStart"/>
-      <w:r>
-        <w:t>nodeport</w:t>
-      </w:r>
-      <w:proofErr w:type="spellEnd"/>
-      <w:r>
-        <w:t>-service</w:t>
-      </w:r>
-    </w:p>
-    <w:p>
-      <w:pPr>
-        <w:rPr>
-          <w:b/>
-          <w:bCs/>
-        </w:rPr>
-      </w:pPr>
-      <w:r>
-        <w:t xml:space="preserve">Under the selector section, add the label of the pod. The pod label can be found </w:t>
-      </w:r>
-      <w:r>
-        <w:t>using:</w:t>
-      </w:r>
-      <w:r>
-        <w:t xml:space="preserve"> </w:t>
-      </w:r>
-      <w:proofErr w:type="spellStart"/>
-      <w:r>
         <w:t>k</w:t>
       </w:r>
       <w:r>
-        <w:t>ubectl</w:t>
-      </w:r>
-      <w:proofErr w:type="spellEnd"/>
-      <w:r>
-        <w:t xml:space="preserve"> </w:t>
+        <w:t xml:space="preserve">ubectl </w:t>
       </w:r>
       <w:r>
         <w:t xml:space="preserve">get pods </w:t>
@@ -753,46 +583,18 @@
           <w:bCs/>
         </w:rPr>
       </w:pPr>
-      <w:proofErr w:type="spellStart"/>
       <w:r>
         <w:rPr>
           <w:b/>
           <w:bCs/>
           <w:highlight w:val="cyan"/>
         </w:rPr>
-        <w:t>ExternalName</w:t>
-      </w:r>
-      <w:proofErr w:type="spellEnd"/>
-      <w:r>
-        <w:rPr>
-          <w:b/>
-          <w:bCs/>
-          <w:highlight w:val="cyan"/>
-        </w:rPr>
-        <w:t xml:space="preserve"> </w:t>
-      </w:r>
-      <w:proofErr w:type="spellStart"/>
-      <w:r>
-        <w:rPr>
-          <w:b/>
-          <w:bCs/>
-          <w:highlight w:val="cyan"/>
-        </w:rPr>
-        <w:t>Sevice</w:t>
-      </w:r>
-      <w:proofErr w:type="spellEnd"/>
-    </w:p>
-    <w:p>
-      <w:r>
-        <w:t xml:space="preserve">An </w:t>
-      </w:r>
-      <w:proofErr w:type="spellStart"/>
-      <w:r>
-        <w:t>ExternalName</w:t>
-      </w:r>
-      <w:proofErr w:type="spellEnd"/>
-      <w:r>
-        <w:t xml:space="preserve"> Service maps an internal Kubernetes DNS name to an external domain name using a CNAME record, allowing applications inside the cluster to access external resources without hardcoding external URLs.</w:t>
+        <w:t>ExternalName Sevice</w:t>
+      </w:r>
+    </w:p>
+    <w:p>
+      <w:r>
+        <w:t>An ExternalName Service maps an internal Kubernetes DNS name to an external domain name using a CNAME record, allowing applications inside the cluster to access external resources without hardcoding external URLs.</w:t>
       </w:r>
     </w:p>
     <w:p>
@@ -1091,107 +893,60 @@
       </w:r>
     </w:p>
     <w:p>
-      <w:proofErr w:type="spellStart"/>
       <w:r>
         <w:t>k</w:t>
       </w:r>
       <w:r>
-        <w:t>ubectl</w:t>
-      </w:r>
-      <w:proofErr w:type="spellEnd"/>
-      <w:r>
-        <w:t xml:space="preserve"> run pods -h  #This will shows example usages and explanations.</w:t>
-      </w:r>
-    </w:p>
-    <w:p/>
-    <w:p>
-      <w:pPr>
-        <w:rPr>
-          <w:b/>
-          <w:bCs/>
-        </w:rPr>
-      </w:pPr>
-    </w:p>
-    <w:p>
-      <w:proofErr w:type="spellStart"/>
-      <w:r>
-        <w:t>kubectl</w:t>
-      </w:r>
-      <w:proofErr w:type="spellEnd"/>
+        <w:t>ubectl run pods -h  #This will shows example usages and explanations.</w:t>
+      </w:r>
+    </w:p>
+    <w:p/>
+    <w:p>
+      <w:pPr>
+        <w:rPr>
+          <w:b/>
+          <w:bCs/>
+        </w:rPr>
+      </w:pPr>
+    </w:p>
+    <w:p>
+      <w:r>
+        <w:t>kubectl api-resources -o wide</w:t>
+      </w:r>
+      <w:r>
+        <w:t xml:space="preserve"> : shows all resources of Kubernetes. Helps to find the apiversion.  </w:t>
+      </w:r>
+    </w:p>
+    <w:p>
+      <w:r>
+        <w:t>When you run kubectl get all, the resources that should be included in the “</w:t>
+      </w:r>
+      <w:r>
+        <w:rPr>
+          <w:b/>
+          <w:bCs/>
+        </w:rPr>
+        <w:t>all</w:t>
+      </w:r>
+      <w:r>
+        <w:t>” can be seen in the output of “</w:t>
+      </w:r>
+      <w:r>
+        <w:t>kubectl api-resources -o wide</w:t>
+      </w:r>
+      <w:r>
+        <w:t xml:space="preserve">” command, under the </w:t>
+      </w:r>
+      <w:r>
+        <w:rPr>
+          <w:b/>
+          <w:bCs/>
+        </w:rPr>
+        <w:t>CATEGORIES</w:t>
+      </w:r>
       <w:r>
         <w:t xml:space="preserve"> </w:t>
       </w:r>
-      <w:proofErr w:type="spellStart"/>
-      <w:r>
-        <w:t>api</w:t>
-      </w:r>
-      <w:proofErr w:type="spellEnd"/>
-      <w:r>
-        <w:t>-resources -o wide</w:t>
-      </w:r>
-      <w:r>
-        <w:t xml:space="preserve"> : shows all resources of Kubernetes. Helps to find the </w:t>
-      </w:r>
-      <w:proofErr w:type="spellStart"/>
-      <w:r>
-        <w:t>apiversion</w:t>
-      </w:r>
-      <w:proofErr w:type="spellEnd"/>
-      <w:r>
-        <w:t xml:space="preserve">.  </w:t>
-      </w:r>
-    </w:p>
-    <w:p>
-      <w:r>
-        <w:t xml:space="preserve">When you run </w:t>
-      </w:r>
-      <w:proofErr w:type="spellStart"/>
-      <w:r>
-        <w:t>kubectl</w:t>
-      </w:r>
-      <w:proofErr w:type="spellEnd"/>
-      <w:r>
-        <w:t xml:space="preserve"> get all, the resources that should be included in the “</w:t>
-      </w:r>
-      <w:r>
-        <w:rPr>
-          <w:b/>
-          <w:bCs/>
-        </w:rPr>
-        <w:t>all</w:t>
-      </w:r>
-      <w:r>
-        <w:t>” can be seen in the output of “</w:t>
-      </w:r>
-      <w:proofErr w:type="spellStart"/>
-      <w:r>
-        <w:t>kubectl</w:t>
-      </w:r>
-      <w:proofErr w:type="spellEnd"/>
-      <w:r>
-        <w:t xml:space="preserve"> </w:t>
-      </w:r>
-      <w:proofErr w:type="spellStart"/>
-      <w:r>
-        <w:t>api</w:t>
-      </w:r>
-      <w:proofErr w:type="spellEnd"/>
-      <w:r>
-        <w:t>-resources -o wide</w:t>
-      </w:r>
-      <w:r>
-        <w:t xml:space="preserve">” command, under the </w:t>
-      </w:r>
-      <w:r>
-        <w:rPr>
-          <w:b/>
-          <w:bCs/>
-        </w:rPr>
-        <w:t>CATEGORIES</w:t>
-      </w:r>
-      <w:r>
-        <w:t xml:space="preserve"> </w:t>
-      </w:r>
       <w:r>
         <w:t>columns</w:t>
       </w:r>
@@ -1199,15 +954,7 @@
     <w:p/>
     <w:p>
       <w:r>
-        <w:t xml:space="preserve">The cluster-info CA certificate in </w:t>
-      </w:r>
-      <w:proofErr w:type="spellStart"/>
-      <w:r>
-        <w:t>kube</w:t>
-      </w:r>
-      <w:proofErr w:type="spellEnd"/>
-      <w:r>
-        <w:t>-public acts just like the trusted root certificates in your web browser, allowing new clients to safely verify the identity of the Kubernetes API server during a secure TLS connection.</w:t>
+        <w:t>The cluster-info CA certificate in kube-public acts just like the trusted root certificates in your web browser, allowing new clients to safely verify the identity of the Kubernetes API server during a secure TLS connection.</w:t>
       </w:r>
     </w:p>
     <w:p/>
@@ -1244,13 +991,8 @@
       </w:pPr>
     </w:p>
     <w:p>
-      <w:proofErr w:type="spellStart"/>
-      <w:r>
-        <w:t>kubectl</w:t>
-      </w:r>
-      <w:proofErr w:type="spellEnd"/>
-      <w:r>
-        <w:t xml:space="preserve"> apply -f folder/ does not guarantee resource creation order.</w:t>
+      <w:r>
+        <w:t>kubectl apply -f folder/ does not guarantee resource creation order.</w:t>
       </w:r>
     </w:p>
     <w:p>
@@ -1282,53 +1024,13 @@
     </w:p>
     <w:p>
       <w:r>
-        <w:t xml:space="preserve">When PID 1 exits, the container runtime records its exit code, and </w:t>
-      </w:r>
-      <w:proofErr w:type="spellStart"/>
-      <w:r>
-        <w:t>kubelet</w:t>
-      </w:r>
-      <w:proofErr w:type="spellEnd"/>
-      <w:r>
-        <w:t xml:space="preserve"> uses that result along with the </w:t>
-      </w:r>
-      <w:proofErr w:type="spellStart"/>
-      <w:r>
-        <w:t>restartPolicy</w:t>
-      </w:r>
-      <w:proofErr w:type="spellEnd"/>
-      <w:r>
-        <w:t xml:space="preserve"> to decide whether to restart the container.</w:t>
-      </w:r>
-    </w:p>
-    <w:p/>
-    <w:p>
-      <w:r>
-        <w:t xml:space="preserve">Kubernetes stores the last applied configuration in the same live object configuration in </w:t>
-      </w:r>
-      <w:proofErr w:type="spellStart"/>
-      <w:r>
-        <w:t>etcd</w:t>
-      </w:r>
-      <w:proofErr w:type="spellEnd"/>
-      <w:r>
-        <w:t xml:space="preserve">. It uses this and the actual </w:t>
-      </w:r>
-      <w:proofErr w:type="spellStart"/>
-      <w:r>
-        <w:t>yaml</w:t>
-      </w:r>
-      <w:proofErr w:type="spellEnd"/>
-      <w:r>
-        <w:t xml:space="preserve"> to decide how modifications need to be performed when using </w:t>
-      </w:r>
-      <w:proofErr w:type="spellStart"/>
-      <w:r>
-        <w:t>kubectl</w:t>
-      </w:r>
-      <w:proofErr w:type="spellEnd"/>
-      <w:r>
-        <w:t xml:space="preserve"> apply command</w:t>
+        <w:t>When PID 1 exits, the container runtime records its exit code, and kubelet uses that result along with the restartPolicy to decide whether to restart the container.</w:t>
+      </w:r>
+    </w:p>
+    <w:p/>
+    <w:p>
+      <w:r>
+        <w:t>Kubernetes stores the last applied configuration in the same live object configuration in etcd. It uses this and the actual yaml to decide how modifications need to be performed when using kubectl apply command</w:t>
       </w:r>
       <w:r>
         <w:t>s</w:t>
@@ -1379,15 +1081,7 @@
     <w:p/>
     <w:p>
       <w:r>
-        <w:t xml:space="preserve">You can manually schedule a pod using the </w:t>
-      </w:r>
-      <w:proofErr w:type="spellStart"/>
-      <w:r>
-        <w:t>nodeName</w:t>
-      </w:r>
-      <w:proofErr w:type="spellEnd"/>
-      <w:r>
-        <w:t xml:space="preserve"> property. It can be used</w:t>
+        <w:t>You can manually schedule a pod using the nodeName property. It can be used</w:t>
       </w:r>
       <w:r>
         <w:t xml:space="preserve"> in situations where s</w:t>
@@ -1398,32 +1092,15 @@
     </w:p>
     <w:p/>
     <w:p>
-      <w:proofErr w:type="spellStart"/>
-      <w:r>
-        <w:rPr>
-          <w:b/>
-          <w:bCs/>
-        </w:rPr>
-        <w:t>PriorityClass</w:t>
-      </w:r>
-      <w:proofErr w:type="spellEnd"/>
-      <w:r>
-        <w:rPr>
-          <w:b/>
-          <w:bCs/>
-        </w:rPr>
-        <w:t>:</w:t>
-      </w:r>
-      <w:r>
-        <w:t xml:space="preserve"> A Kubernetes object that defines the priority of Pods. Higher-priority Pods are scheduled before lower-priority Pods and can </w:t>
-      </w:r>
-      <w:proofErr w:type="spellStart"/>
-      <w:r>
-        <w:t>preempt</w:t>
-      </w:r>
-      <w:proofErr w:type="spellEnd"/>
-      <w:r>
-        <w:t xml:space="preserve"> (evict) lower-priority Pods when resources are insufficient.</w:t>
+      <w:r>
+        <w:rPr>
+          <w:b/>
+          <w:bCs/>
+        </w:rPr>
+        <w:t>PriorityClass:</w:t>
+      </w:r>
+      <w:r>
+        <w:t xml:space="preserve"> A Kubernetes object that defines the priority of Pods. Higher-priority Pods are scheduled before lower-priority Pods and can preempt (evict) lower-priority Pods when resources are insufficient.</w:t>
       </w:r>
     </w:p>
     <w:p>
@@ -1448,15 +1125,7 @@
         <w:t>-</w:t>
       </w:r>
       <w:r>
-        <w:t xml:space="preserve"> Pod has higher priority → scheduled first and can </w:t>
-      </w:r>
-      <w:proofErr w:type="spellStart"/>
-      <w:r>
-        <w:t>preempt</w:t>
-      </w:r>
-      <w:proofErr w:type="spellEnd"/>
-      <w:r>
-        <w:t xml:space="preserve"> lower-priority Pods. </w:t>
+        <w:t xml:space="preserve"> Pod has higher priority → scheduled first and can preempt lower-priority Pods. </w:t>
       </w:r>
     </w:p>
     <w:p>
@@ -1481,15 +1150,7 @@
         <w:t>-</w:t>
       </w:r>
       <w:r>
-        <w:t xml:space="preserve"> Pod has lower priority → scheduled later and can be </w:t>
-      </w:r>
-      <w:proofErr w:type="spellStart"/>
-      <w:r>
-        <w:t>preempted</w:t>
-      </w:r>
-      <w:proofErr w:type="spellEnd"/>
-      <w:r>
-        <w:t xml:space="preserve"> by higher-priority Pods.</w:t>
+        <w:t xml:space="preserve"> Pod has lower priority → scheduled later and can be preempted by higher-priority Pods.</w:t>
       </w:r>
     </w:p>
     <w:p>
@@ -1519,45 +1180,24 @@
           <w:numId w:val="4"/>
         </w:numPr>
       </w:pPr>
-      <w:proofErr w:type="spellStart"/>
-      <w:r>
-        <w:t>preemptionPolicy</w:t>
-      </w:r>
-      <w:proofErr w:type="spellEnd"/>
-      <w:r>
-        <w:t xml:space="preserve">: </w:t>
-      </w:r>
-      <w:proofErr w:type="spellStart"/>
-      <w:r>
-        <w:t>PreemptLowerPriority</w:t>
-      </w:r>
-      <w:proofErr w:type="spellEnd"/>
+      <w:r>
+        <w:t>preemptionPolicy: PreemptLowerPriority</w:t>
+      </w:r>
       <w:r>
         <w:t xml:space="preserve">  or </w:t>
       </w:r>
-      <w:proofErr w:type="spellStart"/>
-      <w:r>
-        <w:t>preemptionPolicy</w:t>
-      </w:r>
-      <w:proofErr w:type="spellEnd"/>
-      <w:r>
-        <w:t>: Never</w:t>
+      <w:r>
+        <w:t>preemptionPolicy: Never</w:t>
       </w:r>
       <w:r>
         <w:t>s</w:t>
       </w:r>
     </w:p>
     <w:p>
-      <w:proofErr w:type="spellStart"/>
       <w:r>
         <w:lastRenderedPageBreak/>
-        <w:t>kubectl</w:t>
-      </w:r>
-      <w:proofErr w:type="spellEnd"/>
-      <w:r>
-        <w:t xml:space="preserve"> logs commands only displays the applications </w:t>
-      </w:r>
-      <w:proofErr w:type="spellStart"/>
+        <w:t xml:space="preserve">kubectl logs commands only displays the applications </w:t>
+      </w:r>
       <w:r>
         <w:rPr>
           <w:b/>
@@ -1565,7 +1205,6 @@
         </w:rPr>
         <w:t>stdout</w:t>
       </w:r>
-      <w:proofErr w:type="spellEnd"/>
       <w:r>
         <w:t xml:space="preserve"> and </w:t>
       </w:r>
@@ -1590,620 +1229,424 @@
         <w:t>logs.</w:t>
       </w:r>
       <w:r>
+        <w:t xml:space="preserve"> etc those stored in /var/</w:t>
+      </w:r>
+      <w:r>
+        <w:t>…</w:t>
+      </w:r>
+    </w:p>
+    <w:p/>
+    <w:p>
+      <w:r>
+        <w:rPr>
+          <w:b/>
+          <w:bCs/>
+        </w:rPr>
+        <w:t>Custom-Scheduler:</w:t>
+      </w:r>
+    </w:p>
+    <w:p>
+      <w:r>
+        <w:t xml:space="preserve">After using a customer-scheduler, if you want to see the evidence that the pod used it, you can get the events of the po along with -o wide flag. Check the </w:t>
+      </w:r>
+      <w:r>
+        <w:rPr>
+          <w:b/>
+          <w:bCs/>
+        </w:rPr>
+        <w:t>SOURCE</w:t>
+      </w:r>
+      <w:r>
+        <w:t xml:space="preserve"> field.</w:t>
+      </w:r>
+    </w:p>
+    <w:p>
+      <w:r>
+        <w:t>Eg: “</w:t>
+      </w:r>
+      <w:r>
+        <w:t xml:space="preserve"> my-scheduler, my-scheduler-my-scheduler   Successfully assigned default/nginx to controlplan</w:t>
+      </w:r>
+      <w:r>
+        <w:t>”</w:t>
+      </w:r>
+    </w:p>
+    <w:p/>
+    <w:p>
+      <w:pPr>
+        <w:rPr>
+          <w:b/>
+          <w:bCs/>
+        </w:rPr>
+      </w:pPr>
+      <w:r>
+        <w:rPr>
+          <w:b/>
+          <w:bCs/>
+        </w:rPr>
+        <w:t>Kubernetes scheduling Stages</w:t>
+      </w:r>
+    </w:p>
+    <w:p>
+      <w:r>
+        <w:t xml:space="preserve">Kubernetes scheduling involves the scheduler selecting a suitable node for a Pod. The main stages are </w:t>
+      </w:r>
+      <w:r>
+        <w:rPr>
+          <w:b/>
+          <w:bCs/>
+        </w:rPr>
+        <w:t>Queue → Filter → Score → Bind</w:t>
+      </w:r>
+      <w:r>
+        <w:t>. Queue selects a pending Pod, Filter eliminates nodes where the Pod cannot run, Score ranks the remaining nodes, and Bind assigns the Pod to the selected node. The scheduler records the selected node in the Pod object's spec.nodeName field. The kubelet on that node then starts the Pod.</w:t>
+      </w:r>
+    </w:p>
+    <w:p/>
+    <w:p>
+      <w:r>
+        <w:rPr>
+          <w:b/>
+          <w:bCs/>
+        </w:rPr>
+        <w:t>Scheduler profiles</w:t>
+      </w:r>
+    </w:p>
+    <w:p>
+      <w:r>
+        <w:rPr>
+          <w:b/>
+          <w:bCs/>
+        </w:rPr>
+        <w:t>Scheduler profiles</w:t>
+      </w:r>
+      <w:r>
+        <w:t xml:space="preserve"> are different configurations of the same kube-scheduler. Each profile can have its own </w:t>
+      </w:r>
+      <w:r>
+        <w:rPr>
+          <w:b/>
+          <w:bCs/>
+        </w:rPr>
+        <w:t>scheduler plugins</w:t>
+      </w:r>
+      <w:r>
+        <w:t xml:space="preserve"> enabled, disabled, or configured. A Pod selects a profile using spec.schedulerName. Plugins implement scheduling logic at stages such as </w:t>
+      </w:r>
+      <w:r>
+        <w:rPr>
+          <w:b/>
+          <w:bCs/>
+        </w:rPr>
+        <w:t>Filter</w:t>
+      </w:r>
+      <w:r>
+        <w:t xml:space="preserve"> and </w:t>
+      </w:r>
+      <w:r>
+        <w:rPr>
+          <w:b/>
+          <w:bCs/>
+        </w:rPr>
+        <w:t>Score</w:t>
+      </w:r>
+      <w:r>
+        <w:t>. This allows different Pods to use different scheduling behavior.</w:t>
+      </w:r>
+    </w:p>
+    <w:p/>
+    <w:p>
+      <w:r>
+        <w:rPr>
+          <w:b/>
+          <w:bCs/>
+        </w:rPr>
+        <w:t>Admission Controller</w:t>
+      </w:r>
+      <w:r>
+        <w:rPr>
+          <w:b/>
+          <w:bCs/>
+        </w:rPr>
+        <w:t>:</w:t>
+      </w:r>
+    </w:p>
+    <w:p>
+      <w:r>
+        <w:t xml:space="preserve">An </w:t>
+      </w:r>
+      <w:r>
+        <w:rPr>
+          <w:b/>
+          <w:bCs/>
+        </w:rPr>
+        <w:t>Admission Controller</w:t>
+      </w:r>
+      <w:r>
+        <w:t xml:space="preserve"> intercepts API requests after authentication and authorization but before the object is stored in etcd. It can </w:t>
+      </w:r>
+      <w:r>
+        <w:rPr>
+          <w:b/>
+          <w:bCs/>
+        </w:rPr>
+        <w:t>validate, modify, or reject</w:t>
+      </w:r>
+      <w:r>
+        <w:t xml:space="preserve"> requests. Admission controllers are used to enforce cluster-wide policies such as requiring security settings, labels, resource limits, or approved container images. </w:t>
+      </w:r>
+      <w:r>
+        <w:rPr>
+          <w:b/>
+          <w:bCs/>
+        </w:rPr>
+        <w:t>Real-world use case:</w:t>
+      </w:r>
+      <w:r>
+        <w:t xml:space="preserve"> a company can use an admission controller to reject Pods that use images from untrusted registries and allow only images from its approved private registry.</w:t>
+      </w:r>
+    </w:p>
+    <w:p>
+      <w:r>
+        <w:rPr>
+          <w:b/>
+          <w:bCs/>
+        </w:rPr>
+        <w:t>How Kubernetes determine to allow or deny:</w:t>
+      </w:r>
+      <w:r>
+        <w:rPr>
+          <w:b/>
+          <w:bCs/>
+        </w:rPr>
+        <w:t>s</w:t>
+      </w:r>
+    </w:p>
+    <w:p>
+      <w:r>
+        <w:lastRenderedPageBreak/>
+        <w:t>The ImagePolicyWebhook sends information about the requested container image to an external webhook. The webhook performs its own policy logic and then returns an ImageReview response. Kubernetes does not care how the webhook makes its decision; it expects the decision in the status.allowed field. status.allowed: true allows the image, while status.allowed: false rejects it.</w:t>
+      </w:r>
+    </w:p>
+    <w:p/>
+    <w:p>
+      <w:pPr>
+        <w:rPr>
+          <w:b/>
+          <w:bCs/>
+        </w:rPr>
+      </w:pPr>
+      <w:r>
+        <w:rPr>
+          <w:b/>
+          <w:bCs/>
+        </w:rPr>
+        <w:t>ENTRYPOINT can be written in two forms:</w:t>
+      </w:r>
+    </w:p>
+    <w:p>
+      <w:pPr>
+        <w:rPr>
+          <w:b/>
+          <w:bCs/>
+        </w:rPr>
+      </w:pPr>
+      <w:r>
+        <w:rPr>
+          <w:b/>
+          <w:bCs/>
+        </w:rPr>
+        <w:t>In Docker:</w:t>
+      </w:r>
+    </w:p>
+    <w:p>
+      <w:r>
+        <w:t>Exec form: ENTRYPOINT ["command"] — runs the command directly. CMD or arguments passed with docker run are appended as arguments. Recommended for applications.</w:t>
+      </w:r>
+    </w:p>
+    <w:p>
+      <w:r>
+        <w:t>Shell form: ENTRYPOINT command — runs through /bin/sh -c. CMD and runtime arguments are not passed to the entrypoint command in the normal way. Useful when shell features such as &amp;&amp;, pipes, or variable expansion are required.</w:t>
+      </w:r>
+    </w:p>
+    <w:p>
+      <w:r>
+        <w:t>Rule: Use exec form for normal applications; use shell form when shell behavior is specifically required.</w:t>
+      </w:r>
+    </w:p>
+    <w:p>
+      <w:r>
+        <w:rPr>
+          <w:b/>
+          <w:bCs/>
+        </w:rPr>
+        <w:t>ENTRYPOINT</w:t>
+      </w:r>
+      <w:r>
+        <w:t xml:space="preserve"> provides the main executable; </w:t>
+      </w:r>
+      <w:r>
+        <w:rPr>
+          <w:b/>
+          <w:bCs/>
+        </w:rPr>
+        <w:t>CMD</w:t>
+      </w:r>
+      <w:r>
+        <w:t xml:space="preserve"> provides default arguments to it, which can be overridden by arguments supplied to docker run.</w:t>
+      </w:r>
+    </w:p>
+    <w:p/>
+    <w:p>
+      <w:r>
+        <w:t xml:space="preserve">To over ride an entry point, use the  </w:t>
+      </w:r>
+      <w:r>
+        <w:rPr>
+          <w:b/>
+          <w:bCs/>
+        </w:rPr>
+        <w:t>“--entrypoint”</w:t>
+      </w:r>
+      <w:r>
+        <w:t xml:space="preserve"> flag.</w:t>
+      </w:r>
+    </w:p>
+    <w:p>
+      <w:r>
+        <w:t xml:space="preserve">eg: </w:t>
+      </w:r>
+      <w:r>
+        <w:t xml:space="preserve">docker run </w:t>
+      </w:r>
+      <w:r>
+        <w:rPr>
+          <w:b/>
+          <w:bCs/>
+        </w:rPr>
+        <w:t>--entrypoint</w:t>
+      </w:r>
+      <w:r>
+        <w:t xml:space="preserve"> ls image</w:t>
+      </w:r>
+      <w:r>
+        <w:t xml:space="preserve">  # This override the default entry point with ls</w:t>
+      </w:r>
+      <w:r>
+        <w:t>s</w:t>
+      </w:r>
+    </w:p>
+    <w:p/>
+    <w:p>
+      <w:pPr>
+        <w:rPr>
+          <w:b/>
+          <w:bCs/>
+        </w:rPr>
+      </w:pPr>
+      <w:r>
+        <w:rPr>
+          <w:b/>
+          <w:bCs/>
+        </w:rPr>
+        <w:t>In Kubernetes:</w:t>
+      </w:r>
+    </w:p>
+    <w:p>
+      <w:r>
+        <w:t xml:space="preserve">Docker’s </w:t>
+      </w:r>
+      <w:r>
+        <w:rPr>
+          <w:b/>
+          <w:bCs/>
+        </w:rPr>
+        <w:t xml:space="preserve">Entry point = </w:t>
+      </w:r>
+      <w:r>
+        <w:t>Kubernetes</w:t>
+      </w:r>
+      <w:r>
+        <w:rPr>
+          <w:b/>
+          <w:bCs/>
+        </w:rPr>
         <w:t xml:space="preserve"> </w:t>
       </w:r>
-      <w:proofErr w:type="spellStart"/>
-      <w:r>
-        <w:t>etc</w:t>
-      </w:r>
-      <w:proofErr w:type="spellEnd"/>
-      <w:r>
-        <w:t xml:space="preserve"> those stored in /var/</w:t>
-      </w:r>
-      <w:r>
-        <w:t>…</w:t>
-      </w:r>
-    </w:p>
-    <w:p/>
-    <w:p>
-      <w:r>
-        <w:rPr>
-          <w:b/>
-          <w:bCs/>
-        </w:rPr>
-        <w:t>Custom-Scheduler:</w:t>
-      </w:r>
-    </w:p>
-    <w:p>
-      <w:r>
-        <w:t xml:space="preserve">After using a customer-scheduler, if you want to see the evidence that the pod used it, you can get the events of the po along with -o wide flag. Check the </w:t>
-      </w:r>
-      <w:r>
-        <w:rPr>
-          <w:b/>
-          <w:bCs/>
-        </w:rPr>
-        <w:t>SOURCE</w:t>
-      </w:r>
-      <w:r>
-        <w:t xml:space="preserve"> field.</w:t>
-      </w:r>
-    </w:p>
-    <w:p>
-      <w:r>
-        <w:t>Eg: “</w:t>
-      </w:r>
-      <w:r>
-        <w:t xml:space="preserve"> my-scheduler, my-scheduler-my-scheduler   Successfully assigned default/nginx to </w:t>
-      </w:r>
-      <w:proofErr w:type="spellStart"/>
-      <w:r>
-        <w:t>controlplan</w:t>
-      </w:r>
-      <w:proofErr w:type="spellEnd"/>
-      <w:r>
-        <w:t>”</w:t>
-      </w:r>
-    </w:p>
-    <w:p/>
-    <w:p>
-      <w:pPr>
-        <w:rPr>
-          <w:b/>
-          <w:bCs/>
-        </w:rPr>
-      </w:pPr>
-      <w:r>
-        <w:rPr>
-          <w:b/>
-          <w:bCs/>
-        </w:rPr>
-        <w:t>Kubernetes scheduling Stages</w:t>
-      </w:r>
-    </w:p>
-    <w:p>
-      <w:r>
-        <w:t xml:space="preserve">Kubernetes scheduling involves the scheduler selecting a suitable node for a Pod. The main stages are </w:t>
-      </w:r>
-      <w:r>
-        <w:rPr>
-          <w:b/>
-          <w:bCs/>
-        </w:rPr>
-        <w:t>Queue → Filter → Score → Bind</w:t>
-      </w:r>
-      <w:r>
-        <w:t xml:space="preserve">. Queue selects a pending Pod, Filter eliminates nodes where the Pod cannot run, Score ranks the remaining nodes, and Bind assigns the Pod to the selected node. The scheduler records the selected node in the Pod object's </w:t>
-      </w:r>
-      <w:proofErr w:type="spellStart"/>
-      <w:r>
-        <w:t>spec.nodeName</w:t>
-      </w:r>
-      <w:proofErr w:type="spellEnd"/>
-      <w:r>
-        <w:t xml:space="preserve"> field. The </w:t>
-      </w:r>
-      <w:proofErr w:type="spellStart"/>
-      <w:r>
-        <w:t>kubelet</w:t>
-      </w:r>
-      <w:proofErr w:type="spellEnd"/>
-      <w:r>
-        <w:t xml:space="preserve"> on that node then starts the Pod.</w:t>
-      </w:r>
-    </w:p>
-    <w:p/>
-    <w:p>
-      <w:r>
-        <w:rPr>
-          <w:b/>
-          <w:bCs/>
-        </w:rPr>
-        <w:t>Scheduler profiles</w:t>
-      </w:r>
-    </w:p>
-    <w:p>
-      <w:r>
-        <w:rPr>
-          <w:b/>
-          <w:bCs/>
-        </w:rPr>
-        <w:t>Scheduler profiles</w:t>
-      </w:r>
-      <w:r>
-        <w:t xml:space="preserve"> are different configurations of the same </w:t>
-      </w:r>
-      <w:proofErr w:type="spellStart"/>
-      <w:r>
-        <w:t>kube</w:t>
-      </w:r>
-      <w:proofErr w:type="spellEnd"/>
-      <w:r>
-        <w:t xml:space="preserve">-scheduler. Each profile can have its own </w:t>
-      </w:r>
-      <w:r>
-        <w:rPr>
-          <w:b/>
-          <w:bCs/>
-        </w:rPr>
-        <w:t>scheduler plugins</w:t>
-      </w:r>
-      <w:r>
-        <w:t xml:space="preserve"> enabled, disabled, or configured. A Pod selects a profile using </w:t>
-      </w:r>
-      <w:proofErr w:type="spellStart"/>
-      <w:r>
-        <w:t>spec.schedulerName</w:t>
-      </w:r>
-      <w:proofErr w:type="spellEnd"/>
-      <w:r>
-        <w:t xml:space="preserve">. Plugins implement scheduling logic at stages such as </w:t>
-      </w:r>
-      <w:r>
-        <w:rPr>
-          <w:b/>
-          <w:bCs/>
-        </w:rPr>
-        <w:t>Filter</w:t>
-      </w:r>
-      <w:r>
-        <w:t xml:space="preserve"> and </w:t>
-      </w:r>
-      <w:r>
-        <w:rPr>
-          <w:b/>
-          <w:bCs/>
-        </w:rPr>
-        <w:t>Score</w:t>
-      </w:r>
-      <w:r>
-        <w:t>. This allows different Pods to use different scheduling behavior.</w:t>
-      </w:r>
-    </w:p>
-    <w:p/>
-    <w:p>
-      <w:r>
-        <w:rPr>
-          <w:b/>
-          <w:bCs/>
-        </w:rPr>
-        <w:t>Admission Controller</w:t>
-      </w:r>
-      <w:r>
-        <w:rPr>
-          <w:b/>
-          <w:bCs/>
-        </w:rPr>
-        <w:t>:</w:t>
-      </w:r>
-    </w:p>
-    <w:p>
-      <w:r>
-        <w:t xml:space="preserve">An </w:t>
-      </w:r>
-      <w:r>
-        <w:rPr>
-          <w:b/>
-          <w:bCs/>
-        </w:rPr>
-        <w:t>Admission Controller</w:t>
-      </w:r>
-      <w:r>
-        <w:t xml:space="preserve"> intercepts API requests after authentication and authorization but before the object is stored in </w:t>
-      </w:r>
-      <w:proofErr w:type="spellStart"/>
-      <w:r>
-        <w:t>etcd</w:t>
-      </w:r>
-      <w:proofErr w:type="spellEnd"/>
-      <w:r>
-        <w:t xml:space="preserve">. It can </w:t>
-      </w:r>
-      <w:r>
-        <w:rPr>
-          <w:b/>
-          <w:bCs/>
-        </w:rPr>
-        <w:t>validate, modify, or reject</w:t>
-      </w:r>
-      <w:r>
-        <w:t xml:space="preserve"> requests. Admission controllers are used to enforce cluster-wide policies such as requiring security settings, labels, resource limits, or approved container images. </w:t>
-      </w:r>
-      <w:r>
-        <w:rPr>
-          <w:b/>
-          <w:bCs/>
-        </w:rPr>
-        <w:t>Real-world use case:</w:t>
-      </w:r>
-      <w:r>
-        <w:t xml:space="preserve"> a company can use an admission controller to reject Pods that use images from untrusted registries and allow only images from its approved private registry.</w:t>
-      </w:r>
-    </w:p>
-    <w:p>
-      <w:r>
-        <w:rPr>
-          <w:b/>
-          <w:bCs/>
-        </w:rPr>
-        <w:t xml:space="preserve">How Kubernetes determine to allow or </w:t>
-      </w:r>
-      <w:proofErr w:type="spellStart"/>
-      <w:r>
-        <w:rPr>
-          <w:b/>
-          <w:bCs/>
-        </w:rPr>
-        <w:t>deny:</w:t>
-      </w:r>
-      <w:r>
-        <w:rPr>
-          <w:b/>
-          <w:bCs/>
-        </w:rPr>
-        <w:t>s</w:t>
-      </w:r>
-      <w:proofErr w:type="spellEnd"/>
-    </w:p>
-    <w:p>
-      <w:r>
+      <w:r>
+        <w:rPr>
+          <w:b/>
+          <w:bCs/>
+        </w:rPr>
+        <w:t>command</w:t>
+      </w:r>
+      <w:r>
+        <w:t xml:space="preserve">   #This is the base command that run during container start up</w:t>
+      </w:r>
+    </w:p>
+    <w:p>
+      <w:r>
+        <w:t xml:space="preserve">Docker’s </w:t>
+      </w:r>
+      <w:r>
+        <w:rPr>
+          <w:b/>
+          <w:bCs/>
+        </w:rPr>
+        <w:t xml:space="preserve">command = </w:t>
+      </w:r>
+      <w:r>
+        <w:t>Kubernetes</w:t>
+      </w:r>
+      <w:r>
+        <w:rPr>
+          <w:b/>
+          <w:bCs/>
+        </w:rPr>
+        <w:t xml:space="preserve"> </w:t>
+      </w:r>
+      <w:r>
+        <w:rPr>
+          <w:b/>
+          <w:bCs/>
+        </w:rPr>
+        <w:t>args</w:t>
+      </w:r>
+      <w:r>
+        <w:t xml:space="preserve">  # This is the argument passed to the entry point. This will be appended as an argument to entry point</w:t>
+      </w:r>
+    </w:p>
+    <w:p/>
+    <w:p/>
+    <w:p/>
+    <w:p>
+      <w:pPr>
+        <w:rPr>
+          <w:b/>
+          <w:bCs/>
+        </w:rPr>
+      </w:pPr>
+      <w:r>
+        <w:rPr>
+          <w:b/>
+          <w:bCs/>
+        </w:rPr>
         <w:lastRenderedPageBreak/>
-        <w:t xml:space="preserve">The </w:t>
-      </w:r>
-      <w:proofErr w:type="spellStart"/>
-      <w:r>
-        <w:t>ImagePolicyWebhook</w:t>
-      </w:r>
-      <w:proofErr w:type="spellEnd"/>
-      <w:r>
-        <w:t xml:space="preserve"> sends information about the requested container image to an external webhook. The webhook performs its own policy logic and then returns an </w:t>
-      </w:r>
-      <w:proofErr w:type="spellStart"/>
-      <w:r>
-        <w:t>ImageReview</w:t>
-      </w:r>
-      <w:proofErr w:type="spellEnd"/>
-      <w:r>
-        <w:t xml:space="preserve"> response. Kubernetes does not care how the webhook makes its decision; it expects the decision in the </w:t>
-      </w:r>
-      <w:proofErr w:type="spellStart"/>
-      <w:r>
-        <w:t>status.allowed</w:t>
-      </w:r>
-      <w:proofErr w:type="spellEnd"/>
-      <w:r>
-        <w:t xml:space="preserve"> field. </w:t>
-      </w:r>
-      <w:proofErr w:type="spellStart"/>
-      <w:r>
-        <w:t>status.allowed</w:t>
-      </w:r>
-      <w:proofErr w:type="spellEnd"/>
-      <w:r>
-        <w:t xml:space="preserve">: true allows the image, while </w:t>
-      </w:r>
-      <w:proofErr w:type="spellStart"/>
-      <w:r>
-        <w:t>status.allowed</w:t>
-      </w:r>
-      <w:proofErr w:type="spellEnd"/>
-      <w:r>
-        <w:t>: false rejects it.</w:t>
-      </w:r>
-    </w:p>
-    <w:p/>
-    <w:p>
-      <w:pPr>
-        <w:rPr>
-          <w:b/>
-          <w:bCs/>
-        </w:rPr>
-      </w:pPr>
-      <w:r>
-        <w:rPr>
-          <w:b/>
-          <w:bCs/>
-        </w:rPr>
-        <w:t>ENTRYPOINT can be written in two forms:</w:t>
-      </w:r>
-    </w:p>
-    <w:p>
-      <w:pPr>
-        <w:rPr>
-          <w:b/>
-          <w:bCs/>
-        </w:rPr>
-      </w:pPr>
-      <w:r>
-        <w:rPr>
-          <w:b/>
-          <w:bCs/>
-        </w:rPr>
-        <w:t>In Docker:</w:t>
-      </w:r>
-    </w:p>
-    <w:p>
-      <w:r>
-        <w:t>Exec form: ENTRYPOINT ["command"] — runs the command directly. CMD or arguments passed with docker run are appended as arguments. Recommended for applications.</w:t>
-      </w:r>
-    </w:p>
-    <w:p>
-      <w:r>
-        <w:t>Shell form: ENTRYPOINT command — runs through /bin/</w:t>
-      </w:r>
-      <w:proofErr w:type="spellStart"/>
-      <w:r>
-        <w:t>sh</w:t>
-      </w:r>
-      <w:proofErr w:type="spellEnd"/>
-      <w:r>
-        <w:t xml:space="preserve"> -c. CMD and runtime arguments are not passed to the </w:t>
-      </w:r>
-      <w:proofErr w:type="spellStart"/>
-      <w:r>
-        <w:t>entrypoint</w:t>
-      </w:r>
-      <w:proofErr w:type="spellEnd"/>
-      <w:r>
-        <w:t xml:space="preserve"> command in the normal way. Useful when shell features such as &amp;&amp;, pipes, or variable expansion are required.</w:t>
-      </w:r>
-    </w:p>
-    <w:p>
-      <w:r>
-        <w:t>Rule: Use exec form for normal applications; use shell form when shell behavior is specifically required.</w:t>
-      </w:r>
-    </w:p>
-    <w:p>
-      <w:r>
-        <w:rPr>
-          <w:b/>
-          <w:bCs/>
-        </w:rPr>
-        <w:t>ENTRYPOINT</w:t>
-      </w:r>
-      <w:r>
-        <w:t xml:space="preserve"> provides the main executable; </w:t>
-      </w:r>
-      <w:r>
-        <w:rPr>
-          <w:b/>
-          <w:bCs/>
-        </w:rPr>
-        <w:t>CMD</w:t>
-      </w:r>
-      <w:r>
-        <w:t xml:space="preserve"> provides default arguments to it, which can be overridden by arguments supplied to docker run.</w:t>
-      </w:r>
-    </w:p>
-    <w:p/>
-    <w:p>
-      <w:r>
-        <w:t xml:space="preserve">To over ride an entry point, use the  </w:t>
-      </w:r>
-      <w:r>
-        <w:rPr>
-          <w:b/>
-          <w:bCs/>
-        </w:rPr>
-        <w:t>“--</w:t>
-      </w:r>
-      <w:proofErr w:type="spellStart"/>
-      <w:r>
-        <w:rPr>
-          <w:b/>
-          <w:bCs/>
-        </w:rPr>
-        <w:t>entrypoint</w:t>
-      </w:r>
-      <w:proofErr w:type="spellEnd"/>
-      <w:r>
-        <w:rPr>
-          <w:b/>
-          <w:bCs/>
-        </w:rPr>
-        <w:t>”</w:t>
-      </w:r>
-      <w:r>
-        <w:t xml:space="preserve"> flag.</w:t>
-      </w:r>
-    </w:p>
-    <w:p>
-      <w:proofErr w:type="spellStart"/>
-      <w:r>
-        <w:t>eg</w:t>
-      </w:r>
-      <w:proofErr w:type="spellEnd"/>
-      <w:r>
-        <w:t xml:space="preserve">: </w:t>
-      </w:r>
-      <w:r>
-        <w:t xml:space="preserve">docker run </w:t>
-      </w:r>
-      <w:r>
-        <w:rPr>
-          <w:b/>
-          <w:bCs/>
-        </w:rPr>
-        <w:t>--</w:t>
-      </w:r>
-      <w:proofErr w:type="spellStart"/>
-      <w:r>
-        <w:rPr>
-          <w:b/>
-          <w:bCs/>
-        </w:rPr>
-        <w:t>entrypoint</w:t>
-      </w:r>
-      <w:proofErr w:type="spellEnd"/>
-      <w:r>
-        <w:t xml:space="preserve"> ls image</w:t>
-      </w:r>
-      <w:r>
-        <w:t xml:space="preserve">  # This override the default entry point with </w:t>
-      </w:r>
-      <w:proofErr w:type="spellStart"/>
-      <w:r>
-        <w:t>ls</w:t>
-      </w:r>
-      <w:r>
-        <w:t>s</w:t>
-      </w:r>
-      <w:proofErr w:type="spellEnd"/>
-    </w:p>
-    <w:p/>
-    <w:p>
-      <w:pPr>
-        <w:rPr>
-          <w:b/>
-          <w:bCs/>
-        </w:rPr>
-      </w:pPr>
-      <w:r>
-        <w:rPr>
-          <w:b/>
-          <w:bCs/>
-        </w:rPr>
-        <w:t>In Kubernetes:</w:t>
-      </w:r>
-    </w:p>
-    <w:p>
-      <w:r>
-        <w:t xml:space="preserve">Docker’s </w:t>
-      </w:r>
-      <w:r>
-        <w:rPr>
-          <w:b/>
-          <w:bCs/>
-        </w:rPr>
-        <w:t xml:space="preserve">Entry point = </w:t>
-      </w:r>
-      <w:r>
-        <w:t>Kubernetes</w:t>
-      </w:r>
-      <w:r>
-        <w:rPr>
-          <w:b/>
-          <w:bCs/>
-        </w:rPr>
+        <w:t>Difference between kubectl create vs kubectl apply</w:t>
+      </w:r>
+    </w:p>
+    <w:p>
+      <w:r>
+        <w:rPr>
+          <w:b/>
+          <w:bCs/>
+        </w:rPr>
+        <w:t>kubectl create</w:t>
+      </w:r>
+      <w:r>
         <w:t xml:space="preserve"> </w:t>
       </w:r>
       <w:r>
-        <w:rPr>
-          <w:b/>
-          <w:bCs/>
-        </w:rPr>
-        <w:t>command</w:t>
-      </w:r>
-      <w:r>
-        <w:t xml:space="preserve">   #This is the base command that run during container start up</w:t>
-      </w:r>
-    </w:p>
-    <w:p>
-      <w:r>
-        <w:t xml:space="preserve">Docker’s </w:t>
-      </w:r>
-      <w:r>
-        <w:rPr>
-          <w:b/>
-          <w:bCs/>
-        </w:rPr>
-        <w:t xml:space="preserve">command = </w:t>
-      </w:r>
-      <w:r>
-        <w:t>Kubernetes</w:t>
-      </w:r>
-      <w:r>
-        <w:rPr>
-          <w:b/>
-          <w:bCs/>
-        </w:rPr>
-        <w:t xml:space="preserve"> </w:t>
-      </w:r>
-      <w:proofErr w:type="spellStart"/>
-      <w:r>
-        <w:rPr>
-          <w:b/>
-          <w:bCs/>
-        </w:rPr>
-        <w:t>args</w:t>
-      </w:r>
-      <w:proofErr w:type="spellEnd"/>
-      <w:r>
-        <w:t xml:space="preserve">  # This is the argument passed to the entry point. This will be appended as an argument to entry point</w:t>
-      </w:r>
-    </w:p>
-    <w:p/>
-    <w:p/>
-    <w:p/>
-    <w:p>
-      <w:pPr>
-        <w:rPr>
-          <w:b/>
-          <w:bCs/>
-        </w:rPr>
-      </w:pPr>
-      <w:r>
-        <w:rPr>
-          <w:b/>
-          <w:bCs/>
-        </w:rPr>
-        <w:lastRenderedPageBreak/>
-        <w:t xml:space="preserve">Difference between </w:t>
-      </w:r>
-      <w:proofErr w:type="spellStart"/>
-      <w:r>
-        <w:rPr>
-          <w:b/>
-          <w:bCs/>
-        </w:rPr>
-        <w:t>kubectl</w:t>
-      </w:r>
-      <w:proofErr w:type="spellEnd"/>
-      <w:r>
-        <w:rPr>
-          <w:b/>
-          <w:bCs/>
-        </w:rPr>
-        <w:t xml:space="preserve"> create vs </w:t>
-      </w:r>
-      <w:proofErr w:type="spellStart"/>
-      <w:r>
-        <w:rPr>
-          <w:b/>
-          <w:bCs/>
-        </w:rPr>
-        <w:t>kubectl</w:t>
-      </w:r>
-      <w:proofErr w:type="spellEnd"/>
-      <w:r>
-        <w:rPr>
-          <w:b/>
-          <w:bCs/>
-        </w:rPr>
-        <w:t xml:space="preserve"> apply</w:t>
-      </w:r>
-    </w:p>
-    <w:p>
-      <w:proofErr w:type="spellStart"/>
-      <w:r>
-        <w:rPr>
-          <w:b/>
-          <w:bCs/>
-        </w:rPr>
-        <w:t>kubectl</w:t>
-      </w:r>
-      <w:proofErr w:type="spellEnd"/>
-      <w:r>
-        <w:rPr>
-          <w:b/>
-          <w:bCs/>
-        </w:rPr>
-        <w:t xml:space="preserve"> create</w:t>
-      </w:r>
-      <w:r>
-        <w:t xml:space="preserve"> </w:t>
-      </w:r>
-      <w:r>
         <w:t>-</w:t>
       </w:r>
       <w:r>
@@ -2211,21 +1654,12 @@
       </w:r>
     </w:p>
     <w:p>
-      <w:proofErr w:type="spellStart"/>
-      <w:r>
-        <w:rPr>
-          <w:b/>
-          <w:bCs/>
-        </w:rPr>
-        <w:t>kubectl</w:t>
-      </w:r>
-      <w:proofErr w:type="spellEnd"/>
-      <w:r>
-        <w:rPr>
-          <w:b/>
-          <w:bCs/>
-        </w:rPr>
-        <w:t xml:space="preserve"> apply</w:t>
+      <w:r>
+        <w:rPr>
+          <w:b/>
+          <w:bCs/>
+        </w:rPr>
+        <w:t>kubectl apply</w:t>
       </w:r>
       <w:r>
         <w:t xml:space="preserve"> </w:t>
@@ -2415,54 +1849,20 @@
     </w:p>
     <w:p>
       <w:r>
-        <w:t xml:space="preserve">It gets metrics from </w:t>
-      </w:r>
-      <w:proofErr w:type="spellStart"/>
-      <w:r>
-        <w:t>kubelets</w:t>
-      </w:r>
-      <w:proofErr w:type="spellEnd"/>
-      <w:r>
-        <w:t xml:space="preserve">, which expose </w:t>
-      </w:r>
-      <w:proofErr w:type="spellStart"/>
-      <w:r>
+        <w:t>It gets metrics from kubelets, which expose cAdvisor derived container metrics.</w:t>
+      </w:r>
+    </w:p>
+    <w:p/>
+    <w:p>
+      <w:r>
+        <w:rPr>
+          <w:b/>
+          <w:bCs/>
+        </w:rPr>
         <w:t>cAdvisor</w:t>
       </w:r>
-      <w:proofErr w:type="spellEnd"/>
-      <w:r>
-        <w:t xml:space="preserve"> derived container metrics.</w:t>
-      </w:r>
-    </w:p>
-    <w:p/>
-    <w:p>
-      <w:proofErr w:type="spellStart"/>
-      <w:r>
-        <w:rPr>
-          <w:b/>
-          <w:bCs/>
-        </w:rPr>
-        <w:t>cAdvisor</w:t>
-      </w:r>
-      <w:proofErr w:type="spellEnd"/>
-      <w:r>
-        <w:t xml:space="preserve"> is part of </w:t>
-      </w:r>
-      <w:proofErr w:type="spellStart"/>
-      <w:r>
-        <w:t>kubelet</w:t>
-      </w:r>
-      <w:proofErr w:type="spellEnd"/>
-      <w:r>
-        <w:t xml:space="preserve"> and collects container resource metrics. Metrics Server collects metrics from </w:t>
-      </w:r>
-      <w:proofErr w:type="spellStart"/>
-      <w:r>
-        <w:t>kubelets</w:t>
-      </w:r>
-      <w:proofErr w:type="spellEnd"/>
-      <w:r>
-        <w:t xml:space="preserve"> and provides them through the Kubernetes Metrics API.</w:t>
+      <w:r>
+        <w:t xml:space="preserve"> is part of kubelet and collects container resource metrics. Metrics Server collects metrics from kubelets and provides them through the Kubernetes Metrics API.</w:t>
       </w:r>
     </w:p>
     <w:p>
@@ -2471,26 +1871,13 @@
       </w:r>
     </w:p>
     <w:p>
-      <w:proofErr w:type="spellStart"/>
-      <w:r>
-        <w:t>kubectl</w:t>
-      </w:r>
-      <w:proofErr w:type="spellEnd"/>
-      <w:r>
-        <w:t xml:space="preserve"> top pods</w:t>
-      </w:r>
-    </w:p>
-    <w:p>
-      <w:r>
-        <w:t xml:space="preserve"> </w:t>
-      </w:r>
-      <w:proofErr w:type="spellStart"/>
-      <w:r>
-        <w:t>kubectl</w:t>
-      </w:r>
-      <w:proofErr w:type="spellEnd"/>
-      <w:r>
-        <w:t xml:space="preserve"> top nodes</w:t>
+      <w:r>
+        <w:t>kubectl top pods</w:t>
+      </w:r>
+    </w:p>
+    <w:p>
+      <w:r>
+        <w:t xml:space="preserve"> kubectl top nodes</w:t>
       </w:r>
     </w:p>
     <w:p/>
@@ -2512,15 +1899,7 @@
     </w:p>
     <w:p>
       <w:r>
-        <w:t xml:space="preserve">Kubernetes does not use a single CA for all components. Most control plane components (API Server, </w:t>
-      </w:r>
-      <w:proofErr w:type="spellStart"/>
-      <w:r>
-        <w:t>kube</w:t>
-      </w:r>
-      <w:proofErr w:type="spellEnd"/>
-      <w:r>
-        <w:t xml:space="preserve">-proxy, scheduler, controller-manager, admin clients) use the </w:t>
+        <w:t xml:space="preserve">Kubernetes does not use a single CA for all components. Most control plane components (API Server, kube-proxy, scheduler, controller-manager, admin clients) use the </w:t>
       </w:r>
       <w:r>
         <w:rPr>
@@ -2623,71 +2002,38 @@
         <w:t>Sidecar Container:</w:t>
       </w:r>
       <w:r>
-        <w:t xml:space="preserve"> A </w:t>
-      </w:r>
-      <w:proofErr w:type="spellStart"/>
-      <w:r>
-        <w:t>restartable</w:t>
-      </w:r>
-      <w:proofErr w:type="spellEnd"/>
+        <w:t xml:space="preserve"> A restartable init container (restartPolicy: Always) that starts during Pod initialization and continues running alongside the main container.</w:t>
+      </w:r>
+    </w:p>
+    <w:p>
+      <w:r>
+        <w:t>Ongoing support</w:t>
+      </w:r>
+      <w:r>
+        <w:t xml:space="preserve">: </w:t>
+      </w:r>
+      <w:r>
+        <w:t>log collection, proxy, monitoring, or traffic handling.</w:t>
+      </w:r>
+    </w:p>
+    <w:p/>
+    <w:p/>
+    <w:p/>
+    <w:p/>
+    <w:p>
+      <w:r>
+        <w:t xml:space="preserve">This is the sidecar container. It is an </w:t>
+      </w:r>
+      <w:r>
+        <w:rPr>
+          <w:b/>
+          <w:bCs/>
+        </w:rPr>
+        <w:t>init container</w:t>
+      </w:r>
       <w:r>
         <w:t xml:space="preserve"> </w:t>
       </w:r>
-      <w:proofErr w:type="spellStart"/>
-      <w:r>
-        <w:t>init</w:t>
-      </w:r>
-      <w:proofErr w:type="spellEnd"/>
-      <w:r>
-        <w:t xml:space="preserve"> container (</w:t>
-      </w:r>
-      <w:proofErr w:type="spellStart"/>
-      <w:r>
-        <w:t>restartPolicy</w:t>
-      </w:r>
-      <w:proofErr w:type="spellEnd"/>
-      <w:r>
-        <w:t>: Always) that starts during Pod initialization and continues running alongside the main container.</w:t>
-      </w:r>
-    </w:p>
-    <w:p>
-      <w:r>
-        <w:t>Ongoing support</w:t>
-      </w:r>
-      <w:r>
-        <w:t xml:space="preserve">: </w:t>
-      </w:r>
-      <w:r>
-        <w:t>log collection, proxy, monitoring, or traffic handling.</w:t>
-      </w:r>
-    </w:p>
-    <w:p/>
-    <w:p/>
-    <w:p/>
-    <w:p/>
-    <w:p>
-      <w:r>
-        <w:t xml:space="preserve">This is the sidecar container. It is an </w:t>
-      </w:r>
-      <w:proofErr w:type="spellStart"/>
-      <w:r>
-        <w:rPr>
-          <w:b/>
-          <w:bCs/>
-        </w:rPr>
-        <w:t>init</w:t>
-      </w:r>
-      <w:proofErr w:type="spellEnd"/>
-      <w:r>
-        <w:rPr>
-          <w:b/>
-          <w:bCs/>
-        </w:rPr>
-        <w:t xml:space="preserve"> container</w:t>
-      </w:r>
-      <w:r>
-        <w:t xml:space="preserve"> </w:t>
-      </w:r>
       <w:r>
         <w:t>with</w:t>
       </w:r>
@@ -2696,17 +2042,8 @@
           <w:b/>
           <w:bCs/>
         </w:rPr>
-        <w:t xml:space="preserve"> </w:t>
-      </w:r>
-      <w:proofErr w:type="spellStart"/>
-      <w:r>
-        <w:rPr>
-          <w:b/>
-          <w:bCs/>
-        </w:rPr>
-        <w:t>restartPolicy</w:t>
-      </w:r>
-      <w:proofErr w:type="spellEnd"/>
+        <w:t xml:space="preserve"> restartPolicy</w:t>
+      </w:r>
       <w:r>
         <w:t xml:space="preserve"> set to </w:t>
       </w:r>
@@ -2763,43 +2100,18 @@
     <w:p>
       <w:r>
         <w:lastRenderedPageBreak/>
-        <w:t xml:space="preserve">A sidecar is an </w:t>
-      </w:r>
-      <w:proofErr w:type="spellStart"/>
-      <w:r>
-        <w:t>init</w:t>
-      </w:r>
-      <w:proofErr w:type="spellEnd"/>
-      <w:r>
-        <w:t xml:space="preserve"> container with </w:t>
-      </w:r>
-      <w:proofErr w:type="spellStart"/>
-      <w:r>
-        <w:t>restartPolicy</w:t>
-      </w:r>
-      <w:proofErr w:type="spellEnd"/>
-      <w:r>
-        <w:t>: Always. It starts during Pod initialization and continues running alongside the main container, restarting if it exits.</w:t>
-      </w:r>
-    </w:p>
-    <w:p/>
-    <w:p>
-      <w:r>
-        <w:rPr>
-          <w:b/>
-          <w:bCs/>
-        </w:rPr>
-        <w:t xml:space="preserve">Vertical Pod </w:t>
-      </w:r>
-      <w:proofErr w:type="spellStart"/>
-      <w:r>
-        <w:rPr>
-          <w:b/>
-          <w:bCs/>
-        </w:rPr>
-        <w:t>Autoscaler</w:t>
-      </w:r>
-      <w:proofErr w:type="spellEnd"/>
+        <w:t>A sidecar is an init container with restartPolicy: Always. It starts during Pod initialization and continues running alongside the main container, restarting if it exits.</w:t>
+      </w:r>
+    </w:p>
+    <w:p/>
+    <w:p>
+      <w:r>
+        <w:rPr>
+          <w:b/>
+          <w:bCs/>
+        </w:rPr>
+        <w:t>Vertical Pod Autoscaler</w:t>
+      </w:r>
       <w:r>
         <w:t>: It is not an inbuilt resource. You have to deploy them separately.</w:t>
       </w:r>
@@ -2896,23 +2208,7 @@
           <w:b/>
           <w:bCs/>
         </w:rPr>
-        <w:t xml:space="preserve">Vertical Pod </w:t>
-      </w:r>
-      <w:proofErr w:type="spellStart"/>
-      <w:r>
-        <w:rPr>
-          <w:b/>
-          <w:bCs/>
-        </w:rPr>
-        <w:t>Autoscaler</w:t>
-      </w:r>
-      <w:proofErr w:type="spellEnd"/>
-      <w:r>
-        <w:rPr>
-          <w:b/>
-          <w:bCs/>
-        </w:rPr>
-        <w:t xml:space="preserve"> (VPA)</w:t>
+        <w:t>Vertical Pod Autoscaler (VPA)</w:t>
       </w:r>
       <w:r>
         <w:t xml:space="preserve"> automatically adjusts the CPU and memory requests/limits of Pods based on their actual usage. It is installed as a Kubernetes add-on and has three </w:t>
@@ -2949,24 +2245,14 @@
         <w:t>Admission Controller</w:t>
       </w:r>
       <w:r>
-        <w:t xml:space="preserve"> applies the recommended resources when replacement Pods are created. VPA is configured using a </w:t>
-      </w:r>
-      <w:proofErr w:type="spellStart"/>
-      <w:r>
-        <w:t>VerticalPodAutoscaler</w:t>
-      </w:r>
-      <w:proofErr w:type="spellEnd"/>
-      <w:r>
-        <w:t xml:space="preserve"> </w:t>
+        <w:t xml:space="preserve"> applies the recommended resources when replacement Pods are created. VPA is configured using a VerticalPodAutoscaler </w:t>
       </w:r>
       <w:r>
         <w:t xml:space="preserve">custom </w:t>
       </w:r>
-      <w:proofErr w:type="spellStart"/>
       <w:r>
         <w:t>resourcedefinition</w:t>
       </w:r>
-      <w:proofErr w:type="spellEnd"/>
       <w:r>
         <w:t xml:space="preserve"> </w:t>
       </w:r>
@@ -3097,57 +2383,24 @@
           <w:bCs/>
         </w:rPr>
       </w:pPr>
-      <w:proofErr w:type="spellStart"/>
-      <w:r>
-        <w:rPr>
-          <w:b/>
-          <w:bCs/>
-        </w:rPr>
-        <w:t>PodDisruptionBudget</w:t>
-      </w:r>
-      <w:proofErr w:type="spellEnd"/>
-      <w:r>
-        <w:rPr>
-          <w:b/>
-          <w:bCs/>
-        </w:rPr>
-        <w:t xml:space="preserve"> (PDB)</w:t>
-      </w:r>
-    </w:p>
-    <w:p/>
-    <w:p>
-      <w:r>
-        <w:t xml:space="preserve">A </w:t>
-      </w:r>
-      <w:proofErr w:type="spellStart"/>
-      <w:r>
-        <w:t>PodDisruptionBudget</w:t>
-      </w:r>
-      <w:proofErr w:type="spellEnd"/>
-      <w:r>
-        <w:t xml:space="preserve"> (PDB) protects application availability during voluntary disruptions such as node draining, maintenance, and upgrades. It defines the minimum number of Pods that must remain available, preventing Kubernetes from voluntarily evicting too many Pods at the same time. For example, if an application has 3 replicas and </w:t>
-      </w:r>
-      <w:proofErr w:type="spellStart"/>
-      <w:r>
-        <w:t>minAvailable</w:t>
-      </w:r>
-      <w:proofErr w:type="spellEnd"/>
-      <w:r>
-        <w:t>: 2, Kubernetes can evict one Pod, but it will not allow another voluntary eviction until the replacement Pod becomes available and the application returns to 3 available Pods.</w:t>
-      </w:r>
-    </w:p>
-    <w:p/>
-    <w:p>
-      <w:r>
-        <w:t xml:space="preserve">For example, with 3 replicas and </w:t>
-      </w:r>
-      <w:proofErr w:type="spellStart"/>
-      <w:r>
-        <w:t>minAvailable</w:t>
-      </w:r>
-      <w:proofErr w:type="spellEnd"/>
-      <w:r>
-        <w:t>: 2, Kubernetes allows one Pod to be evicted during a node drain while ensuring at least 2 Pods remain available; the Deployment creates a replacement Pod and once it becomes Ready, the next Pod can be evicted.</w:t>
+      <w:r>
+        <w:rPr>
+          <w:b/>
+          <w:bCs/>
+        </w:rPr>
+        <w:t>PodDisruptionBudget (PDB)</w:t>
+      </w:r>
+    </w:p>
+    <w:p/>
+    <w:p>
+      <w:r>
+        <w:t>A PodDisruptionBudget (PDB) protects application availability during voluntary disruptions such as node draining, maintenance, and upgrades. It defines the minimum number of Pods that must remain available, preventing Kubernetes from voluntarily evicting too many Pods at the same time. For example, if an application has 3 replicas and minAvailable: 2, Kubernetes can evict one Pod, but it will not allow another voluntary eviction until the replacement Pod becomes available and the application returns to 3 available Pods.</w:t>
+      </w:r>
+    </w:p>
+    <w:p/>
+    <w:p>
+      <w:r>
+        <w:t>For example, with 3 replicas and minAvailable: 2, Kubernetes allows one Pod to be evicted during a node drain while ensuring at least 2 Pods remain available; the Deployment creates a replacement Pod and once it becomes Ready, the next Pod can be evicted.</w:t>
       </w:r>
     </w:p>
     <w:p/>
@@ -3214,23 +2467,7 @@
     </w:p>
     <w:p>
       <w:r>
-        <w:t xml:space="preserve">With </w:t>
-      </w:r>
-      <w:proofErr w:type="spellStart"/>
-      <w:r>
-        <w:t>hostNetwork</w:t>
-      </w:r>
-      <w:proofErr w:type="spellEnd"/>
-      <w:r>
-        <w:t xml:space="preserve">: true, a Pod shares the node's network namespace, so it uses the node's IP address directly. The application inside the Pod can therefore listen on the node's ports and receive traffic without a </w:t>
-      </w:r>
-      <w:proofErr w:type="spellStart"/>
-      <w:r>
-        <w:t>NodePort</w:t>
-      </w:r>
-      <w:proofErr w:type="spellEnd"/>
-      <w:r>
-        <w:t xml:space="preserve"> Service.</w:t>
+        <w:t>With hostNetwork: true, a Pod shares the node's network namespace, so it uses the node's IP address directly. The application inside the Pod can therefore listen on the node's ports and receive traffic without a NodePort Service.</w:t>
       </w:r>
     </w:p>
     <w:p>
@@ -3240,23 +2477,7 @@
     </w:p>
     <w:p>
       <w:r>
-        <w:t xml:space="preserve">A normal Pod has its own Pod IP and network namespace, so external clients cannot normally access it through the node IP directly. </w:t>
-      </w:r>
-      <w:proofErr w:type="spellStart"/>
-      <w:r>
-        <w:t>NodePort</w:t>
-      </w:r>
-      <w:proofErr w:type="spellEnd"/>
-      <w:r>
-        <w:t xml:space="preserve"> provides a way to expose such normal Pods through a node IP and port without using </w:t>
-      </w:r>
-      <w:proofErr w:type="spellStart"/>
-      <w:r>
-        <w:t>hostNetwork</w:t>
-      </w:r>
-      <w:proofErr w:type="spellEnd"/>
-      <w:r>
-        <w:t>.</w:t>
+        <w:t>A normal Pod has its own Pod IP and network namespace, so external clients cannot normally access it through the node IP directly. NodePort provides a way to expose such normal Pods through a node IP and port without using hostNetwork.</w:t>
       </w:r>
     </w:p>
     <w:p>
@@ -3460,15 +2681,9 @@
       </w:r>
     </w:p>
     <w:p>
-      <w:proofErr w:type="spellStart"/>
-      <w:r>
-        <w:t>kubectl</w:t>
-      </w:r>
-      <w:proofErr w:type="spellEnd"/>
-      <w:r>
-        <w:t xml:space="preserve"> create secret docker-registry </w:t>
-      </w:r>
-      <w:proofErr w:type="spellStart"/>
+      <w:r>
+        <w:t xml:space="preserve">kubectl create secret docker-registry </w:t>
+      </w:r>
       <w:r>
         <w:rPr>
           <w:b/>
@@ -3476,7 +2691,6 @@
         </w:rPr>
         <w:t>regcred</w:t>
       </w:r>
-      <w:proofErr w:type="spellEnd"/>
       <w:r>
         <w:t xml:space="preserve"> \</w:t>
       </w:r>
@@ -3488,29 +2702,13 @@
     </w:p>
     <w:p>
       <w:r>
-        <w:t xml:space="preserve">  --docker-username=</w:t>
-      </w:r>
-      <w:proofErr w:type="spellStart"/>
-      <w:r>
-        <w:t>myuser</w:t>
-      </w:r>
-      <w:proofErr w:type="spellEnd"/>
-      <w:r>
-        <w:t xml:space="preserve"> \</w:t>
+        <w:t xml:space="preserve">  --docker-username=myuser \</w:t>
       </w:r>
     </w:p>
     <w:p>
       <w:r>
         <w:lastRenderedPageBreak/>
-        <w:t xml:space="preserve">  --docker-password=</w:t>
-      </w:r>
-      <w:proofErr w:type="spellStart"/>
-      <w:r>
-        <w:t>mypassword</w:t>
-      </w:r>
-      <w:proofErr w:type="spellEnd"/>
-      <w:r>
-        <w:t xml:space="preserve"> \</w:t>
+        <w:t xml:space="preserve">  --docker-password=mypassword \</w:t>
       </w:r>
     </w:p>
     <w:p>
@@ -3550,13 +2748,8 @@
       </w:r>
     </w:p>
     <w:p>
-      <w:proofErr w:type="spellStart"/>
-      <w:r>
-        <w:t>apiVersion</w:t>
-      </w:r>
-      <w:proofErr w:type="spellEnd"/>
-      <w:r>
-        <w:t>: v1</w:t>
+      <w:r>
+        <w:t>apiVersion: v1</w:t>
       </w:r>
     </w:p>
     <w:p>
@@ -3606,23 +2799,7 @@
           <w:b/>
           <w:bCs/>
         </w:rPr>
-        <w:t xml:space="preserve">  </w:t>
-      </w:r>
-      <w:proofErr w:type="spellStart"/>
-      <w:r>
-        <w:rPr>
-          <w:b/>
-          <w:bCs/>
-        </w:rPr>
-        <w:t>imagePullSecrets</w:t>
-      </w:r>
-      <w:proofErr w:type="spellEnd"/>
-      <w:r>
-        <w:rPr>
-          <w:b/>
-          <w:bCs/>
-        </w:rPr>
-        <w:t>:</w:t>
+        <w:t xml:space="preserve">  imagePullSecrets:</w:t>
       </w:r>
       <w:r>
         <w:rPr>
@@ -3651,17 +2828,8 @@
           <w:b/>
           <w:bCs/>
         </w:rPr>
-        <w:t xml:space="preserve">    - name: </w:t>
-      </w:r>
-      <w:proofErr w:type="spellStart"/>
-      <w:r>
-        <w:rPr>
-          <w:b/>
-          <w:bCs/>
-        </w:rPr>
-        <w:t>regcred</w:t>
-      </w:r>
-      <w:proofErr w:type="spellEnd"/>
+        <w:t xml:space="preserve">    - name: regcred</w:t>
+      </w:r>
     </w:p>
     <w:p/>
     <w:p/>
@@ -3797,13 +2965,8 @@
       </w:r>
     </w:p>
     <w:p>
-      <w:proofErr w:type="spellStart"/>
-      <w:r>
-        <w:t>securityContext</w:t>
-      </w:r>
-      <w:proofErr w:type="spellEnd"/>
-      <w:r>
-        <w:t>:</w:t>
+      <w:r>
+        <w:t>securityContext:</w:t>
       </w:r>
     </w:p>
     <w:p>
@@ -3882,23 +3045,13 @@
     <w:p/>
     <w:p/>
     <w:p>
-      <w:proofErr w:type="spellStart"/>
       <w:r>
         <w:rPr>
           <w:b/>
           <w:bCs/>
           <w:highlight w:val="cyan"/>
         </w:rPr>
-        <w:t>CustomResourceDefinition</w:t>
-      </w:r>
-      <w:proofErr w:type="spellEnd"/>
-      <w:r>
-        <w:rPr>
-          <w:b/>
-          <w:bCs/>
-          <w:highlight w:val="cyan"/>
-        </w:rPr>
-        <w:t xml:space="preserve"> (CRD)</w:t>
+        <w:t>CustomResourceDefinition (CRD)</w:t>
       </w:r>
       <w:r>
         <w:rPr>
@@ -3953,21 +3106,12 @@
           <w:bCs/>
         </w:rPr>
       </w:pPr>
-      <w:proofErr w:type="spellStart"/>
-      <w:r>
-        <w:rPr>
-          <w:b/>
-          <w:bCs/>
-        </w:rPr>
-        <w:t>Usecase</w:t>
-      </w:r>
-      <w:proofErr w:type="spellEnd"/>
-      <w:r>
-        <w:rPr>
-          <w:b/>
-          <w:bCs/>
-        </w:rPr>
-        <w:t>:</w:t>
+      <w:r>
+        <w:rPr>
+          <w:b/>
+          <w:bCs/>
+        </w:rPr>
+        <w:t>Usecase:</w:t>
       </w:r>
     </w:p>
     <w:p>
@@ -3979,15 +3123,7 @@
         </w:numPr>
       </w:pPr>
       <w:r>
-        <w:t xml:space="preserve">Suppose Kubernetes does not have a built-in </w:t>
-      </w:r>
-      <w:proofErr w:type="spellStart"/>
-      <w:r>
-        <w:t>FlightBooking</w:t>
-      </w:r>
-      <w:proofErr w:type="spellEnd"/>
-      <w:r>
-        <w:t xml:space="preserve"> resource.</w:t>
+        <w:t>Suppose Kubernetes does not have a built-in FlightBooking resource.</w:t>
       </w:r>
     </w:p>
     <w:p>
@@ -3999,15 +3135,7 @@
         </w:numPr>
       </w:pPr>
       <w:r>
-        <w:t xml:space="preserve">CRD: Defines the </w:t>
-      </w:r>
-      <w:proofErr w:type="spellStart"/>
-      <w:r>
-        <w:t>FlightBooking</w:t>
-      </w:r>
-      <w:proofErr w:type="spellEnd"/>
-      <w:r>
-        <w:t xml:space="preserve"> resource type.</w:t>
+        <w:t>CRD: Defines the FlightBooking resource type.</w:t>
       </w:r>
     </w:p>
     <w:p>
@@ -4074,15 +3202,7 @@
         <w:t>default,</w:t>
       </w:r>
       <w:r>
-        <w:t xml:space="preserve"> </w:t>
-      </w:r>
-      <w:proofErr w:type="spellStart"/>
-      <w:r>
-        <w:t>etcd</w:t>
-      </w:r>
-      <w:proofErr w:type="spellEnd"/>
-      <w:r>
-        <w:t xml:space="preserve"> </w:t>
+        <w:t xml:space="preserve"> etcd </w:t>
       </w:r>
       <w:r>
         <w:rPr>
@@ -4150,31 +3270,7 @@
     <w:p/>
     <w:p>
       <w:r>
-        <w:t>ETCD stores Kubernetes objects as raw bytes (</w:t>
-      </w:r>
-      <w:proofErr w:type="spellStart"/>
-      <w:r>
-        <w:t>protobuf</w:t>
-      </w:r>
-      <w:proofErr w:type="spellEnd"/>
-      <w:r>
-        <w:t xml:space="preserve"> format). In a </w:t>
-      </w:r>
-      <w:proofErr w:type="spellStart"/>
-      <w:r>
-        <w:t>hexdump</w:t>
-      </w:r>
-      <w:proofErr w:type="spellEnd"/>
-      <w:r>
-        <w:t xml:space="preserve">, the left side shows the actual hexadecimal byte values, while the right side shows their ASCII representation. Printable bytes appear as text, and non-printable </w:t>
-      </w:r>
-      <w:proofErr w:type="spellStart"/>
-      <w:r>
-        <w:t>protobuf</w:t>
-      </w:r>
-      <w:proofErr w:type="spellEnd"/>
-      <w:r>
-        <w:t xml:space="preserve"> metadata is displayed as dots (.).</w:t>
+        <w:t>ETCD stores Kubernetes objects as raw bytes (protobuf format). In a hexdump, the left side shows the actual hexadecimal byte values, while the right side shows their ASCII representation. Printable bytes appear as text, and non-printable protobuf metadata is displayed as dots (.).</w:t>
       </w:r>
     </w:p>
     <w:p>
@@ -4190,15 +3286,7 @@
         <w:t xml:space="preserve"> </w:t>
       </w:r>
       <w:r>
-        <w:t xml:space="preserve">Enabling Encryption at Rest does not automatically encrypt existing data in </w:t>
-      </w:r>
-      <w:proofErr w:type="spellStart"/>
-      <w:r>
-        <w:t>etcd</w:t>
-      </w:r>
-      <w:proofErr w:type="spellEnd"/>
-      <w:r>
-        <w:t>. Only newly created or updated resources are encrypted. Existing resources must be rewritten (updated/recreated) to be stored in encrypted form.</w:t>
+        <w:t>Enabling Encryption at Rest does not automatically encrypt existing data in etcd. Only newly created or updated resources are encrypted. Existing resources must be rewritten (updated/recreated) to be stored in encrypted form.</w:t>
       </w:r>
     </w:p>
     <w:p>
@@ -4250,49 +3338,17 @@
     </w:p>
     <w:p>
       <w:r>
-        <w:t xml:space="preserve">It gets the </w:t>
-      </w:r>
-      <w:proofErr w:type="spellStart"/>
-      <w:r>
-        <w:t>yaml</w:t>
-      </w:r>
-      <w:proofErr w:type="spellEnd"/>
-      <w:r>
-        <w:t xml:space="preserve"> and passes it to </w:t>
-      </w:r>
-      <w:proofErr w:type="spellStart"/>
-      <w:r>
-        <w:t>kubectl</w:t>
-      </w:r>
-      <w:proofErr w:type="spellEnd"/>
-      <w:r>
-        <w:t xml:space="preserve"> replace -f command: it will recreate the resource.</w:t>
-      </w:r>
-    </w:p>
-    <w:p>
-      <w:r>
-        <w:t xml:space="preserve">When Encryption at Rest is enabled, back up both the ETCD snapshot and the </w:t>
-      </w:r>
-      <w:proofErr w:type="spellStart"/>
-      <w:r>
-        <w:t>EncryptionConfiguration</w:t>
-      </w:r>
-      <w:proofErr w:type="spellEnd"/>
-      <w:r>
-        <w:t xml:space="preserve"> (including encryption keys). Without the original key, encrypted data in ETCD cannot be decrypted after a restore.</w:t>
-      </w:r>
-    </w:p>
-    <w:p>
-      <w:r>
-        <w:t xml:space="preserve">Never replace an encryption key directly. Add the new key alongside the old key for key rotation. If the original encryption key is lost and no backup exists, Kubernetes may be unable to decrypt previously encrypted Secrets stored in </w:t>
-      </w:r>
-      <w:proofErr w:type="spellStart"/>
-      <w:r>
-        <w:t>etcd</w:t>
-      </w:r>
-      <w:proofErr w:type="spellEnd"/>
-      <w:r>
-        <w:t>.</w:t>
+        <w:t>It gets the yaml and passes it to kubectl replace -f command: it will recreate the resource.</w:t>
+      </w:r>
+    </w:p>
+    <w:p>
+      <w:r>
+        <w:t>When Encryption at Rest is enabled, back up both the ETCD snapshot and the EncryptionConfiguration (including encryption keys). Without the original key, encrypted data in ETCD cannot be decrypted after a restore.</w:t>
+      </w:r>
+    </w:p>
+    <w:p>
+      <w:r>
+        <w:t>Never replace an encryption key directly. Add the new key alongside the old key for key rotation. If the original encryption key is lost and no backup exists, Kubernetes may be unable to decrypt previously encrypted Secrets stored in etcd.</w:t>
       </w:r>
     </w:p>
     <w:p/>
@@ -4317,15 +3373,7 @@
     </w:p>
     <w:p>
       <w:r>
-        <w:t xml:space="preserve">A </w:t>
-      </w:r>
-      <w:proofErr w:type="spellStart"/>
-      <w:r>
-        <w:t>ConfigMap</w:t>
-      </w:r>
-      <w:proofErr w:type="spellEnd"/>
-      <w:r>
-        <w:t xml:space="preserve"> stores non-sensitive configuration data for applications, such as environment variables, configuration files, or command-line arguments.</w:t>
+        <w:t>A ConfigMap stores non-sensitive configuration data for applications, such as environment variables, configuration files, or command-line arguments.</w:t>
       </w:r>
     </w:p>
     <w:p>
@@ -4360,21 +3408,8 @@
       </w:r>
     </w:p>
     <w:p>
-      <w:proofErr w:type="spellStart"/>
-      <w:r>
-        <w:t>kubectl</w:t>
-      </w:r>
-      <w:proofErr w:type="spellEnd"/>
-      <w:r>
-        <w:t xml:space="preserve"> create </w:t>
-      </w:r>
-      <w:proofErr w:type="spellStart"/>
-      <w:r>
-        <w:t>configmap</w:t>
-      </w:r>
-      <w:proofErr w:type="spellEnd"/>
-      <w:r>
-        <w:t xml:space="preserve"> app-config --from-literal=APP_COLOR=blue</w:t>
+      <w:r>
+        <w:t>kubectl create configmap app-config --from-literal=APP_COLOR=blue</w:t>
       </w:r>
     </w:p>
     <w:p/>
@@ -4399,21 +3434,8 @@
       </w:r>
     </w:p>
     <w:p>
-      <w:proofErr w:type="spellStart"/>
-      <w:r>
-        <w:t>kubectl</w:t>
-      </w:r>
-      <w:proofErr w:type="spellEnd"/>
-      <w:r>
-        <w:t xml:space="preserve"> create </w:t>
-      </w:r>
-      <w:proofErr w:type="spellStart"/>
-      <w:r>
-        <w:t>configmap</w:t>
-      </w:r>
-      <w:proofErr w:type="spellEnd"/>
-      <w:r>
-        <w:t xml:space="preserve"> app-config --from-file=config.txt</w:t>
+      <w:r>
+        <w:t>kubectl create configmap app-config --from-file=config.txt</w:t>
       </w:r>
     </w:p>
     <w:p/>
@@ -4438,27 +3460,9 @@
       </w:r>
     </w:p>
     <w:p>
-      <w:proofErr w:type="spellStart"/>
-      <w:r>
-        <w:t>kubectl</w:t>
-      </w:r>
-      <w:proofErr w:type="spellEnd"/>
-      <w:r>
-        <w:t xml:space="preserve"> create </w:t>
-      </w:r>
-      <w:proofErr w:type="spellStart"/>
-      <w:r>
-        <w:t>configmap</w:t>
-      </w:r>
-      <w:proofErr w:type="spellEnd"/>
-      <w:r>
-        <w:t xml:space="preserve"> app-config --from-env-file=</w:t>
-      </w:r>
-      <w:proofErr w:type="spellStart"/>
-      <w:r>
-        <w:t>app.env</w:t>
-      </w:r>
-      <w:proofErr w:type="spellEnd"/>
+      <w:r>
+        <w:t>kubectl create configmap app-config --from-env-file=app.env</w:t>
+      </w:r>
     </w:p>
     <w:p/>
     <w:p>
@@ -4536,17 +3540,8 @@
           <w:b/>
           <w:bCs/>
         </w:rPr>
-        <w:t xml:space="preserve">injecting a </w:t>
-      </w:r>
-      <w:proofErr w:type="spellStart"/>
-      <w:r>
-        <w:rPr>
-          <w:b/>
-          <w:bCs/>
-        </w:rPr>
-        <w:t>ConfigMap</w:t>
-      </w:r>
-      <w:proofErr w:type="spellEnd"/>
+        <w:t>injecting a ConfigMap</w:t>
+      </w:r>
       <w:r>
         <w:t xml:space="preserve">, it is specified at the </w:t>
       </w:r>
@@ -4562,21 +3557,8 @@
       </w:r>
     </w:p>
     <w:p>
-      <w:proofErr w:type="spellStart"/>
-      <w:r>
-        <w:t>ConfigMap</w:t>
-      </w:r>
-      <w:proofErr w:type="spellEnd"/>
-      <w:r>
-        <w:t xml:space="preserve"> can be consumed through environment variables, command/</w:t>
-      </w:r>
-      <w:proofErr w:type="spellStart"/>
-      <w:r>
-        <w:t>args</w:t>
-      </w:r>
-      <w:proofErr w:type="spellEnd"/>
-      <w:r>
-        <w:t xml:space="preserve">, or a </w:t>
+      <w:r>
+        <w:t xml:space="preserve">ConfigMap can be consumed through environment variables, command/args, or a </w:t>
       </w:r>
       <w:r>
         <w:rPr>
@@ -4586,41 +3568,20 @@
         <w:t>volume</w:t>
       </w:r>
       <w:r>
-        <w:t xml:space="preserve">. Workloads like Deployments and </w:t>
-      </w:r>
-      <w:proofErr w:type="spellStart"/>
-      <w:r>
-        <w:t>StatefulSets</w:t>
-      </w:r>
-      <w:proofErr w:type="spellEnd"/>
-      <w:r>
-        <w:t xml:space="preserve"> use </w:t>
-      </w:r>
-      <w:proofErr w:type="spellStart"/>
-      <w:r>
-        <w:t>ConfigMaps</w:t>
-      </w:r>
-      <w:proofErr w:type="spellEnd"/>
-      <w:r>
-        <w:t xml:space="preserve"> through their Pod templates.</w:t>
-      </w:r>
-    </w:p>
-    <w:p>
-      <w:proofErr w:type="spellStart"/>
-      <w:r>
-        <w:t>configMapKeyRef</w:t>
-      </w:r>
-      <w:proofErr w:type="spellEnd"/>
+        <w:t>. Workloads like Deployments and StatefulSets use ConfigMaps through their Pod templates.</w:t>
+      </w:r>
+    </w:p>
+    <w:p>
+      <w:r>
+        <w:t xml:space="preserve">configMapKeyRef </w:t>
+      </w:r>
+      <w:r>
+        <w:t>-</w:t>
+      </w:r>
       <w:r>
         <w:t xml:space="preserve"> </w:t>
       </w:r>
       <w:r>
-        <w:t>-</w:t>
-      </w:r>
-      <w:r>
-        <w:t xml:space="preserve"> </w:t>
-      </w:r>
-      <w:r>
         <w:t xml:space="preserve"> Inject </w:t>
       </w:r>
       <w:r>
@@ -4628,13 +3589,8 @@
       </w:r>
     </w:p>
     <w:p>
-      <w:proofErr w:type="spellStart"/>
-      <w:r>
-        <w:t>configMapRef</w:t>
-      </w:r>
-      <w:proofErr w:type="spellEnd"/>
-      <w:r>
-        <w:t xml:space="preserve"> </w:t>
+      <w:r>
+        <w:t xml:space="preserve">configMapRef </w:t>
       </w:r>
       <w:r>
         <w:t xml:space="preserve">-  Inject </w:t>
@@ -4695,15 +3651,7 @@
         <w:t>Base64-encoded</w:t>
       </w:r>
       <w:r>
-        <w:t xml:space="preserve"> values, while </w:t>
-      </w:r>
-      <w:proofErr w:type="spellStart"/>
-      <w:r>
-        <w:t>stringData</w:t>
-      </w:r>
-      <w:proofErr w:type="spellEnd"/>
-      <w:r>
-        <w:t xml:space="preserve"> accepts </w:t>
+        <w:t xml:space="preserve"> values, while stringData accepts </w:t>
       </w:r>
       <w:r>
         <w:rPr>
@@ -4796,15 +3744,7 @@
         <w:t>Declarative: (</w:t>
       </w:r>
       <w:r>
-        <w:t xml:space="preserve">Using </w:t>
-      </w:r>
-      <w:proofErr w:type="spellStart"/>
-      <w:r>
-        <w:t>stringData</w:t>
-      </w:r>
-      <w:proofErr w:type="spellEnd"/>
-      <w:r>
-        <w:t xml:space="preserve"> </w:t>
+        <w:t xml:space="preserve">Using stringData </w:t>
       </w:r>
       <w:r>
         <w:t xml:space="preserve">- </w:t>
@@ -4971,23 +3911,7 @@
           <w:b/>
           <w:bCs/>
         </w:rPr>
-        <w:t xml:space="preserve">Way </w:t>
-      </w:r>
-      <w:proofErr w:type="spellStart"/>
-      <w:r>
-        <w:rPr>
-          <w:b/>
-          <w:bCs/>
-        </w:rPr>
-        <w:t>kubernetes</w:t>
-      </w:r>
-      <w:proofErr w:type="spellEnd"/>
-      <w:r>
-        <w:rPr>
-          <w:b/>
-          <w:bCs/>
-        </w:rPr>
-        <w:t xml:space="preserve"> handles secrets:</w:t>
+        <w:t>Way kubernetes handles secrets:</w:t>
       </w:r>
     </w:p>
     <w:p>
@@ -5010,21 +3934,8 @@
           <w:numId w:val="9"/>
         </w:numPr>
       </w:pPr>
-      <w:proofErr w:type="spellStart"/>
-      <w:r>
-        <w:t>Kubelet</w:t>
-      </w:r>
-      <w:proofErr w:type="spellEnd"/>
-      <w:r>
-        <w:t xml:space="preserve"> stores the secret into a </w:t>
-      </w:r>
-      <w:proofErr w:type="spellStart"/>
-      <w:r>
-        <w:t>tmpfs</w:t>
-      </w:r>
-      <w:proofErr w:type="spellEnd"/>
-      <w:r>
-        <w:t xml:space="preserve"> so that the secret is not written to disk storage.</w:t>
+      <w:r>
+        <w:t>Kubelet stores the secret into a tmpfs so that the secret is not written to disk storage.</w:t>
       </w:r>
     </w:p>
     <w:p>
@@ -5036,15 +3947,7 @@
         </w:numPr>
       </w:pPr>
       <w:r>
-        <w:t xml:space="preserve">Once the Pod that depends on the secret is deleted, </w:t>
-      </w:r>
-      <w:proofErr w:type="spellStart"/>
-      <w:r>
-        <w:t>kubelet</w:t>
-      </w:r>
-      <w:proofErr w:type="spellEnd"/>
-      <w:r>
-        <w:t xml:space="preserve"> will delete its local copy of the secret data as well.</w:t>
+        <w:t>Once the Pod that depends on the secret is deleted, kubelet will delete its local copy of the secret data as well.</w:t>
       </w:r>
     </w:p>
     <w:p>
@@ -5077,23 +3980,7 @@
           <w:b/>
           <w:bCs/>
         </w:rPr>
-        <w:t xml:space="preserve">Types of Volume </w:t>
-      </w:r>
-      <w:proofErr w:type="spellStart"/>
-      <w:r>
-        <w:rPr>
-          <w:b/>
-          <w:bCs/>
-        </w:rPr>
-        <w:t>Provissioning</w:t>
-      </w:r>
-      <w:proofErr w:type="spellEnd"/>
-      <w:r>
-        <w:rPr>
-          <w:b/>
-          <w:bCs/>
-        </w:rPr>
-        <w:t>:</w:t>
+        <w:t>Types of Volume Provissioning:</w:t>
       </w:r>
     </w:p>
     <w:p>
@@ -5213,23 +4100,7 @@
         </w:numPr>
       </w:pPr>
       <w:r>
-        <w:t xml:space="preserve">Automatically creates a </w:t>
-      </w:r>
-      <w:proofErr w:type="spellStart"/>
-      <w:r>
-        <w:t>PersistentVolume</w:t>
-      </w:r>
-      <w:proofErr w:type="spellEnd"/>
-      <w:r>
-        <w:t xml:space="preserve"> (PV) when a </w:t>
-      </w:r>
-      <w:proofErr w:type="spellStart"/>
-      <w:r>
-        <w:t>PersistentVolumeClaim</w:t>
-      </w:r>
-      <w:proofErr w:type="spellEnd"/>
-      <w:r>
-        <w:t xml:space="preserve"> (PVC) requests storage.</w:t>
+        <w:t>Automatically creates a PersistentVolume (PV) when a PersistentVolumeClaim (PVC) requests storage.</w:t>
       </w:r>
     </w:p>
     <w:p>
@@ -5241,15 +4112,7 @@
         </w:numPr>
       </w:pPr>
       <w:r>
-        <w:t xml:space="preserve">Uses a </w:t>
-      </w:r>
-      <w:proofErr w:type="spellStart"/>
-      <w:r>
-        <w:t>StorageClass</w:t>
-      </w:r>
-      <w:proofErr w:type="spellEnd"/>
-      <w:r>
-        <w:t xml:space="preserve"> to determine how the storage should be created.</w:t>
+        <w:t>Uses a StorageClass to determine how the storage should be created.</w:t>
       </w:r>
     </w:p>
     <w:p>
@@ -5282,15 +4145,7 @@
     </w:p>
     <w:p>
       <w:r>
-        <w:t xml:space="preserve">PVC → </w:t>
-      </w:r>
-      <w:proofErr w:type="spellStart"/>
-      <w:r>
-        <w:t>StorageClass</w:t>
-      </w:r>
-      <w:proofErr w:type="spellEnd"/>
-      <w:r>
-        <w:t xml:space="preserve"> → Provisioner → PV → Pod uses storage</w:t>
+        <w:t>PVC → StorageClass → Provisioner → PV → Pod uses storage</w:t>
       </w:r>
     </w:p>
     <w:p/>
@@ -5300,24 +4155,14 @@
       </w:r>
     </w:p>
     <w:p>
-      <w:proofErr w:type="spellStart"/>
-      <w:r>
-        <w:t>apiVersion</w:t>
-      </w:r>
-      <w:proofErr w:type="spellEnd"/>
-      <w:r>
-        <w:t>: storage.k8s.io/v1</w:t>
-      </w:r>
-    </w:p>
-    <w:p>
-      <w:r>
-        <w:t xml:space="preserve">kind: </w:t>
-      </w:r>
-      <w:proofErr w:type="spellStart"/>
-      <w:r>
-        <w:t>StorageClass</w:t>
-      </w:r>
-      <w:proofErr w:type="spellEnd"/>
+      <w:r>
+        <w:t>apiVersion: storage.k8s.io/v1</w:t>
+      </w:r>
+    </w:p>
+    <w:p>
+      <w:r>
+        <w:t>kind: StorageClass</w:t>
+      </w:r>
     </w:p>
     <w:p>
       <w:r>
@@ -5326,15 +4171,7 @@
     </w:p>
     <w:p>
       <w:r>
-        <w:t xml:space="preserve">  name: </w:t>
-      </w:r>
-      <w:proofErr w:type="spellStart"/>
-      <w:r>
-        <w:t>gcp</w:t>
-      </w:r>
-      <w:proofErr w:type="spellEnd"/>
-      <w:r>
-        <w:t>-balanced</w:t>
+        <w:t xml:space="preserve">  name: gcp-balanced</w:t>
       </w:r>
     </w:p>
     <w:p>
@@ -5342,13 +4179,8 @@
         <w:t>provisioner: pd.csi.storage.gke.io</w:t>
       </w:r>
       <w:r>
-        <w:t xml:space="preserve">   #GCP </w:t>
-      </w:r>
-      <w:proofErr w:type="spellStart"/>
-      <w:r>
-        <w:t>provissioner</w:t>
-      </w:r>
-      <w:proofErr w:type="spellEnd"/>
+        <w:t xml:space="preserve">   #GCP provissioner</w:t>
+      </w:r>
     </w:p>
     <w:p>
       <w:r>
@@ -5368,13 +4200,8 @@
       <w:r>
         <w:t xml:space="preserve">Note: </w:t>
       </w:r>
-      <w:proofErr w:type="spellStart"/>
-      <w:r>
-        <w:t>StorageClass</w:t>
-      </w:r>
-      <w:proofErr w:type="spellEnd"/>
-      <w:r>
-        <w:t xml:space="preserve"> is the configuration; dynamic provisioning is the process</w:t>
+      <w:r>
+        <w:t>StorageClass is the configuration; dynamic provisioning is the process</w:t>
       </w:r>
     </w:p>
     <w:p/>
@@ -5554,15 +4381,7 @@
         </w:numPr>
       </w:pPr>
       <w:r>
-        <w:t xml:space="preserve">The CNI plugin attaches the </w:t>
-      </w:r>
-      <w:proofErr w:type="spellStart"/>
-      <w:r>
-        <w:t>veth</w:t>
-      </w:r>
-      <w:proofErr w:type="spellEnd"/>
-      <w:r>
-        <w:t xml:space="preserve"> pair and allocates the IP address directly to this namespace. All application containers then join this exact same network stack.</w:t>
+        <w:t>The CNI plugin attaches the veth pair and allocates the IP address directly to this namespace. All application containers then join this exact same network stack.</w:t>
       </w:r>
     </w:p>
     <w:p>
@@ -5613,15 +4432,7 @@
         <w:t>PID Namespace (Process ID):</w:t>
       </w:r>
       <w:r>
-        <w:t xml:space="preserve"> Isolated by default. Container 1 cannot see Container 2's processes (unless </w:t>
-      </w:r>
-      <w:proofErr w:type="spellStart"/>
-      <w:r>
-        <w:t>shareProcessNamespace</w:t>
-      </w:r>
-      <w:proofErr w:type="spellEnd"/>
-      <w:r>
-        <w:t>: true is explicitly enabled).</w:t>
+        <w:t xml:space="preserve"> Isolated by default. Container 1 cannot see Container 2's processes (unless shareProcessNamespace: true is explicitly enabled).</w:t>
       </w:r>
     </w:p>
     <w:p>
@@ -5783,71 +4594,7 @@
           <w:b/>
           <w:bCs/>
         </w:rPr>
-        <w:t xml:space="preserve">The </w:t>
-      </w:r>
-      <w:proofErr w:type="spellStart"/>
-      <w:r>
-        <w:rPr>
-          <w:b/>
-          <w:bCs/>
-        </w:rPr>
-        <w:t>Conflist</w:t>
-      </w:r>
-      <w:proofErr w:type="spellEnd"/>
-      <w:r>
-        <w:rPr>
-          <w:b/>
-          <w:bCs/>
-        </w:rPr>
-        <w:t xml:space="preserve"> / Rules (/</w:t>
-      </w:r>
-      <w:proofErr w:type="spellStart"/>
-      <w:r>
-        <w:rPr>
-          <w:b/>
-          <w:bCs/>
-        </w:rPr>
-        <w:t>etc</w:t>
-      </w:r>
-      <w:proofErr w:type="spellEnd"/>
-      <w:r>
-        <w:rPr>
-          <w:b/>
-          <w:bCs/>
-        </w:rPr>
-        <w:t>/</w:t>
-      </w:r>
-      <w:proofErr w:type="spellStart"/>
-      <w:r>
-        <w:rPr>
-          <w:b/>
-          <w:bCs/>
-        </w:rPr>
-        <w:t>cni</w:t>
-      </w:r>
-      <w:proofErr w:type="spellEnd"/>
-      <w:r>
-        <w:rPr>
-          <w:b/>
-          <w:bCs/>
-        </w:rPr>
-        <w:t>/</w:t>
-      </w:r>
-      <w:proofErr w:type="spellStart"/>
-      <w:r>
-        <w:rPr>
-          <w:b/>
-          <w:bCs/>
-        </w:rPr>
-        <w:t>net.d</w:t>
-      </w:r>
-      <w:proofErr w:type="spellEnd"/>
-      <w:r>
-        <w:rPr>
-          <w:b/>
-          <w:bCs/>
-        </w:rPr>
-        <w:t>/)</w:t>
+        <w:t>The Conflist / Rules (/etc/cni/net.d/)</w:t>
       </w:r>
     </w:p>
     <w:p>
@@ -5858,15 +4605,7 @@
         </w:numPr>
       </w:pPr>
       <w:r>
-        <w:t>JSON-formatted configuration files (or .</w:t>
-      </w:r>
-      <w:proofErr w:type="spellStart"/>
-      <w:r>
-        <w:t>conflist</w:t>
-      </w:r>
-      <w:proofErr w:type="spellEnd"/>
-      <w:r>
-        <w:t xml:space="preserve"> chains) that define the network parameters, subnet ranges, and the sequence of plugins to execute.</w:t>
+        <w:t>JSON-formatted configuration files (or .conflist chains) that define the network parameters, subnet ranges, and the sequence of plugins to execute.</w:t>
       </w:r>
     </w:p>
     <w:p>
@@ -5881,23 +4620,7 @@
           <w:b/>
           <w:bCs/>
         </w:rPr>
-        <w:t>The Binaries (/opt/</w:t>
-      </w:r>
-      <w:proofErr w:type="spellStart"/>
-      <w:r>
-        <w:rPr>
-          <w:b/>
-          <w:bCs/>
-        </w:rPr>
-        <w:t>cni</w:t>
-      </w:r>
-      <w:proofErr w:type="spellEnd"/>
-      <w:r>
-        <w:rPr>
-          <w:b/>
-          <w:bCs/>
-        </w:rPr>
-        <w:t>/bin/)</w:t>
+        <w:t>The Binaries (/opt/cni/bin/)</w:t>
       </w:r>
     </w:p>
     <w:p>
@@ -5908,37 +4631,13 @@
         </w:numPr>
       </w:pPr>
       <w:r>
-        <w:t xml:space="preserve">Executable tools (bridge, </w:t>
-      </w:r>
-      <w:proofErr w:type="spellStart"/>
-      <w:r>
-        <w:t>ptp</w:t>
-      </w:r>
-      <w:proofErr w:type="spellEnd"/>
-      <w:r>
-        <w:t xml:space="preserve">, host-local, </w:t>
-      </w:r>
-      <w:proofErr w:type="spellStart"/>
-      <w:r>
-        <w:t>portmap</w:t>
-      </w:r>
-      <w:proofErr w:type="spellEnd"/>
-      <w:r>
-        <w:t>, etc.) that perform the actual kernel-level plumbing</w:t>
+        <w:t>Executable tools (bridge, ptp, host-local, portmap, etc.) that perform the actual kernel-level plumbing</w:t>
       </w:r>
       <w:r>
         <w:t xml:space="preserve"> </w:t>
       </w:r>
       <w:r>
-        <w:t xml:space="preserve">such as creating </w:t>
-      </w:r>
-      <w:proofErr w:type="spellStart"/>
-      <w:r>
-        <w:t>veth</w:t>
-      </w:r>
-      <w:proofErr w:type="spellEnd"/>
-      <w:r>
-        <w:t xml:space="preserve"> pairs, attaching them to namespaces, and assigning IP addresses.</w:t>
+        <w:t>such as creating veth pairs, attaching them to namespaces, and assigning IP addresses.</w:t>
       </w:r>
     </w:p>
     <w:p>
@@ -5966,7 +4665,6 @@
       <w:r>
         <w:t xml:space="preserve">Runtimes like </w:t>
       </w:r>
-      <w:proofErr w:type="spellStart"/>
       <w:r>
         <w:rPr>
           <w:b/>
@@ -5974,7 +4672,6 @@
         </w:rPr>
         <w:t>containerd</w:t>
       </w:r>
-      <w:proofErr w:type="spellEnd"/>
       <w:r>
         <w:t xml:space="preserve"> or </w:t>
       </w:r>
@@ -6048,9 +4745,99 @@
     <w:p/>
     <w:p/>
     <w:p/>
-    <w:p/>
-    <w:p/>
-    <w:p/>
+    <w:p>
+      <w:pPr>
+        <w:rPr>
+          <w:b/>
+          <w:bCs/>
+        </w:rPr>
+      </w:pPr>
+      <w:r>
+        <w:rPr>
+          <w:b/>
+          <w:bCs/>
+          <w:highlight w:val="cyan"/>
+        </w:rPr>
+        <w:t>COREDNS</w:t>
+      </w:r>
+    </w:p>
+    <w:p>
+      <w:pPr>
+        <w:rPr>
+          <w:b/>
+          <w:bCs/>
+        </w:rPr>
+      </w:pPr>
+    </w:p>
+    <w:p>
+      <w:pPr>
+        <w:rPr>
+          <w:b/>
+          <w:bCs/>
+        </w:rPr>
+      </w:pPr>
+      <w:r>
+        <w:rPr>
+          <w:b/>
+          <w:bCs/>
+        </w:rPr>
+        <w:t>How pods perform name</w:t>
+      </w:r>
+      <w:r>
+        <w:rPr>
+          <w:b/>
+          <w:bCs/>
+        </w:rPr>
+        <w:t xml:space="preserve"> </w:t>
+      </w:r>
+      <w:r>
+        <w:rPr>
+          <w:b/>
+          <w:bCs/>
+        </w:rPr>
+        <w:t>resolution?</w:t>
+      </w:r>
+    </w:p>
+    <w:p>
+      <w:r>
+        <w:t>CoreDNS is the DNS server in Kubernetes that resolves names of Services and Pods into IP addresses. Each Pod normally uses the CoreDNS Service ClusterIP (10.96.0.10) as its DNS nameserver. When a Pod needs to resolve a DNS name, it sends a query to this IP, and CoreDNS returns the corresponding IP address.</w:t>
+      </w:r>
+    </w:p>
+    <w:p/>
+    <w:p>
+      <w:pPr>
+        <w:rPr>
+          <w:b/>
+          <w:bCs/>
+        </w:rPr>
+      </w:pPr>
+      <w:r>
+        <w:rPr>
+          <w:b/>
+          <w:bCs/>
+        </w:rPr>
+        <w:t>Who inject this IP to resolve.conf?</w:t>
+      </w:r>
+    </w:p>
+    <w:p/>
+    <w:p>
+      <w:r>
+        <w:t>T</w:t>
+      </w:r>
+      <w:r>
+        <w:t xml:space="preserve">he </w:t>
+      </w:r>
+      <w:r>
+        <w:rPr>
+          <w:b/>
+          <w:bCs/>
+        </w:rPr>
+        <w:t>kubelet</w:t>
+      </w:r>
+      <w:r>
+        <w:t xml:space="preserve"> on each node has its configuration in /var/lib/kubelet/config.yaml, where clusterDNS: 10.96.0.10 specifies the CoreDNS Service IP to be configured as the DNS nameserver in Pods' /etc/resolv.conf.</w:t>
+      </w:r>
+    </w:p>
     <w:p/>
     <w:p/>
     <w:p/>
@@ -6084,15 +4871,7 @@
     <w:p/>
     <w:p>
       <w:r>
-        <w:t xml:space="preserve">To delete all pods together: </w:t>
-      </w:r>
-      <w:proofErr w:type="spellStart"/>
-      <w:r>
-        <w:t>kubectl</w:t>
-      </w:r>
-      <w:proofErr w:type="spellEnd"/>
-      <w:r>
-        <w:t xml:space="preserve"> delete pods –all</w:t>
+        <w:t>To delete all pods together: kubectl delete pods –all</w:t>
       </w:r>
     </w:p>
     <w:p>
@@ -6103,28 +4882,17 @@
         <w:t>resources</w:t>
       </w:r>
       <w:r>
-        <w:t xml:space="preserve">: </w:t>
-      </w:r>
-      <w:proofErr w:type="spellStart"/>
-      <w:r>
-        <w:t>kubectl</w:t>
-      </w:r>
-      <w:proofErr w:type="spellEnd"/>
-      <w:r>
-        <w:t xml:space="preserve"> delete pods --all -n &lt;namespace-name&gt;</w:t>
-      </w:r>
-    </w:p>
-    <w:p/>
-    <w:p>
-      <w:proofErr w:type="spellStart"/>
-      <w:r>
-        <w:lastRenderedPageBreak/>
+        <w:t>: kubectl delete pods --all -n &lt;namespace-name&gt;</w:t>
+      </w:r>
+    </w:p>
+    <w:p/>
+    <w:p>
+      <w:r>
         <w:t>k</w:t>
       </w:r>
       <w:r>
         <w:t>ubectl</w:t>
       </w:r>
-      <w:proofErr w:type="spellEnd"/>
       <w:r>
         <w:t xml:space="preserve"> get pods --show-</w:t>
       </w:r>
@@ -6143,85 +4911,27 @@
     </w:p>
     <w:p/>
     <w:p>
-      <w:proofErr w:type="spellStart"/>
       <w:r>
         <w:t>ku</w:t>
       </w:r>
       <w:r>
-        <w:t>bectl</w:t>
-      </w:r>
-      <w:proofErr w:type="spellEnd"/>
-      <w:r>
-        <w:t xml:space="preserve"> apply -f </w:t>
-      </w:r>
-      <w:proofErr w:type="spellStart"/>
-      <w:r>
-        <w:t>file.yaml</w:t>
-      </w:r>
-      <w:proofErr w:type="spellEnd"/>
-      <w:r>
-        <w:t xml:space="preserve"> → Creates the resource if it doesn't exist, or updates it if it already exists. </w:t>
-      </w:r>
-    </w:p>
-    <w:p>
-      <w:proofErr w:type="spellStart"/>
-      <w:r>
-        <w:t>kubectl</w:t>
-      </w:r>
-      <w:proofErr w:type="spellEnd"/>
-      <w:r>
-        <w:t xml:space="preserve"> replace -f </w:t>
-      </w:r>
-      <w:proofErr w:type="spellStart"/>
-      <w:r>
-        <w:t>file.yaml</w:t>
-      </w:r>
-      <w:proofErr w:type="spellEnd"/>
-      <w:r>
-        <w:t xml:space="preserve"> → Replaces an existing resource. It fails if the resource doesn't exist.</w:t>
-      </w:r>
-    </w:p>
-    <w:p/>
-    <w:p>
-      <w:r>
-        <w:t xml:space="preserve">You can use the </w:t>
-      </w:r>
-      <w:proofErr w:type="spellStart"/>
-      <w:r>
-        <w:t>kubectl</w:t>
-      </w:r>
-      <w:proofErr w:type="spellEnd"/>
-      <w:r>
-        <w:t xml:space="preserve"> explain to learn more about different resources.</w:t>
-      </w:r>
-    </w:p>
-    <w:p>
-      <w:r>
-        <w:t xml:space="preserve">Eg: </w:t>
-      </w:r>
-      <w:proofErr w:type="spellStart"/>
-      <w:r>
-        <w:t>kubectl</w:t>
-      </w:r>
-      <w:proofErr w:type="spellEnd"/>
-      <w:r>
-        <w:t xml:space="preserve"> explain pod, </w:t>
-      </w:r>
-      <w:proofErr w:type="spellStart"/>
-      <w:r>
-        <w:t>kubectl</w:t>
-      </w:r>
-      <w:proofErr w:type="spellEnd"/>
-      <w:r>
-        <w:t xml:space="preserve"> explain </w:t>
-      </w:r>
-      <w:proofErr w:type="spellStart"/>
-      <w:r>
-        <w:t>pod.spec</w:t>
-      </w:r>
-      <w:proofErr w:type="spellEnd"/>
-      <w:r>
-        <w:t>.</w:t>
+        <w:t xml:space="preserve">bectl apply -f file.yaml → Creates the resource if it doesn't exist, or updates it if it already exists. </w:t>
+      </w:r>
+    </w:p>
+    <w:p>
+      <w:r>
+        <w:t>kubectl replace -f file.yaml → Replaces an existing resource. It fails if the resource doesn't exist.</w:t>
+      </w:r>
+    </w:p>
+    <w:p/>
+    <w:p>
+      <w:r>
+        <w:t>You can use the kubectl explain to learn more about different resources.</w:t>
+      </w:r>
+    </w:p>
+    <w:p>
+      <w:r>
+        <w:t>Eg: kubectl explain pod, kubectl explain pod.spec.</w:t>
       </w:r>
     </w:p>
     <w:p>
@@ -6237,54 +4947,26 @@
     </w:p>
     <w:p>
       <w:r>
-        <w:t xml:space="preserve">Eg: </w:t>
-      </w:r>
-      <w:proofErr w:type="spellStart"/>
-      <w:r>
-        <w:t>kubectl</w:t>
-      </w:r>
-      <w:proofErr w:type="spellEnd"/>
-      <w:r>
-        <w:t xml:space="preserve"> explain </w:t>
-      </w:r>
-      <w:proofErr w:type="spellStart"/>
-      <w:r>
-        <w:t>pod.spec</w:t>
-      </w:r>
-      <w:proofErr w:type="spellEnd"/>
-      <w:r>
-        <w:t xml:space="preserve"> </w:t>
+        <w:t xml:space="preserve">Eg: kubectl explain pod.spec </w:t>
       </w:r>
       <w:r>
         <w:t>–</w:t>
       </w:r>
-      <w:proofErr w:type="spellStart"/>
       <w:r>
         <w:t>recusrsive</w:t>
       </w:r>
       <w:r>
         <w:t>s</w:t>
       </w:r>
-      <w:proofErr w:type="spellEnd"/>
     </w:p>
     <w:p/>
     <w:p>
       <w:r>
         <w:t xml:space="preserve">To log in to a multi container pod:  </w:t>
       </w:r>
-      <w:proofErr w:type="spellStart"/>
-      <w:r>
-        <w:t>kubectl</w:t>
-      </w:r>
-      <w:proofErr w:type="spellEnd"/>
-      <w:r>
-        <w:t xml:space="preserve"> exec -it &lt;pod-name&gt; -c &lt;container-name&gt; -- /bin/</w:t>
-      </w:r>
-      <w:proofErr w:type="spellStart"/>
-      <w:r>
-        <w:t>sh</w:t>
-      </w:r>
-      <w:proofErr w:type="spellEnd"/>
+      <w:r>
+        <w:t>kubectl exec -it &lt;pod-name&gt; -c &lt;container-name&gt; -- /bin/sh</w:t>
+      </w:r>
     </w:p>
     <w:sectPr>
       <w:pgSz w:w="12240" w:h="15840"/>
@@ -9201,6 +7883,7 @@
   <w:style w:type="character" w:default="1" w:styleId="DefaultParagraphFont">
     <w:name w:val="Default Paragraph Font"/>
     <w:uiPriority w:val="1"/>
+    <w:semiHidden/>
     <w:unhideWhenUsed/>
   </w:style>
   <w:style w:type="table" w:default="1" w:styleId="TableNormal">

</xml_diff>

<commit_message>
Learned Ingress, Ingress controller, Create path and host based routing in ingress, enable SSL termination in ingress, and annotate to chnage path in ingress
</commit_message>
<xml_diff>
--- a/9-Interesting_learning_Notes/Learning_Notes.docx
+++ b/9-Interesting_learning_Notes/Learning_Notes.docx
@@ -119,6 +119,7 @@
       <w:r>
         <w:t xml:space="preserve">, Kubernetes assigns it a </w:t>
       </w:r>
+      <w:proofErr w:type="spellStart"/>
       <w:r>
         <w:rPr>
           <w:b/>
@@ -126,6 +127,7 @@
         </w:rPr>
         <w:t>ClusterIP</w:t>
       </w:r>
+      <w:proofErr w:type="spellEnd"/>
       <w:r>
         <w:t xml:space="preserve">. </w:t>
       </w:r>
@@ -179,12 +181,21 @@
           <w:numId w:val="2"/>
         </w:numPr>
       </w:pPr>
-      <w:r>
-        <w:rPr>
-          <w:b/>
-          <w:bCs/>
-        </w:rPr>
-        <w:t>kube-proxy does not assign the Service IP.</w:t>
+      <w:proofErr w:type="spellStart"/>
+      <w:r>
+        <w:rPr>
+          <w:b/>
+          <w:bCs/>
+        </w:rPr>
+        <w:t>kube</w:t>
+      </w:r>
+      <w:proofErr w:type="spellEnd"/>
+      <w:r>
+        <w:rPr>
+          <w:b/>
+          <w:bCs/>
+        </w:rPr>
+        <w:t>-proxy does not assign the Service IP.</w:t>
       </w:r>
       <w:r>
         <w:t xml:space="preserve"> </w:t>
@@ -197,8 +208,13 @@
           <w:numId w:val="2"/>
         </w:numPr>
       </w:pPr>
-      <w:r>
-        <w:t xml:space="preserve">kube-proxy watches Services and creates </w:t>
+      <w:proofErr w:type="spellStart"/>
+      <w:r>
+        <w:t>kube</w:t>
+      </w:r>
+      <w:proofErr w:type="spellEnd"/>
+      <w:r>
+        <w:t xml:space="preserve">-proxy watches Services and creates </w:t>
       </w:r>
       <w:r>
         <w:rPr>
@@ -208,7 +224,15 @@
         <w:t>networking rules</w:t>
       </w:r>
       <w:r>
-        <w:t xml:space="preserve"> (iptables/IPVS/nftables) to route traffic from the Service IP to the backend Pod IPs.</w:t>
+        <w:t xml:space="preserve"> (iptables/IPVS/</w:t>
+      </w:r>
+      <w:proofErr w:type="spellStart"/>
+      <w:r>
+        <w:t>nftables</w:t>
+      </w:r>
+      <w:proofErr w:type="spellEnd"/>
+      <w:r>
+        <w:t>) to route traffic from the Service IP to the backend Pod IPs.</w:t>
       </w:r>
     </w:p>
     <w:p>
@@ -239,12 +263,21 @@
           <w:numId w:val="2"/>
         </w:numPr>
       </w:pPr>
-      <w:r>
-        <w:rPr>
-          <w:b/>
-          <w:bCs/>
-        </w:rPr>
-        <w:t>kube-proxy</w:t>
+      <w:proofErr w:type="spellStart"/>
+      <w:r>
+        <w:rPr>
+          <w:b/>
+          <w:bCs/>
+        </w:rPr>
+        <w:t>kube</w:t>
+      </w:r>
+      <w:proofErr w:type="spellEnd"/>
+      <w:r>
+        <w:rPr>
+          <w:b/>
+          <w:bCs/>
+        </w:rPr>
+        <w:t>-proxy</w:t>
       </w:r>
       <w:r>
         <w:t xml:space="preserve"> creates networking rules that recognize this virtual IP and forward traffic to the Service's backend Pods.</w:t>
@@ -290,19 +323,40 @@
         <w:t xml:space="preserve">: </w:t>
       </w:r>
       <w:r>
-        <w:t>A Kubernetes NodePort does not create a normal listening socket on the node. Instead, Kuberne</w:t>
+        <w:t xml:space="preserve">A Kubernetes </w:t>
+      </w:r>
+      <w:proofErr w:type="spellStart"/>
+      <w:r>
+        <w:t>NodePort</w:t>
+      </w:r>
+      <w:proofErr w:type="spellEnd"/>
+      <w:r>
+        <w:t xml:space="preserve"> does not create a normal listening socket on the node. Instead, </w:t>
+      </w:r>
+      <w:proofErr w:type="spellStart"/>
+      <w:r>
+        <w:t>Kuberne</w:t>
       </w:r>
       <w:r>
         <w:t>s</w:t>
       </w:r>
       <w:r>
-        <w:t>tes configures networking rules to forward traffic arriving on that port to the Service. Therefore, if a host-level application is already listening on the same port, traffic arriving through that node may be handled by the existing application instead of reaching the Kubernetes Service, depending on the networking implementation and rule processing.</w:t>
-      </w:r>
-    </w:p>
-    <w:p/>
-    <w:p>
-      <w:r>
-        <w:t>NodePort 30005 does NOT mean:</w:t>
+        <w:t>tes</w:t>
+      </w:r>
+      <w:proofErr w:type="spellEnd"/>
+      <w:r>
+        <w:t xml:space="preserve"> configures networking rules to forward traffic arriving on that port to the Service. Therefore, if a host-level application is already listening on the same port, traffic arriving through that node may be handled by the existing application instead of reaching the Kubernetes Service, depending on the networking implementation and rule processing.</w:t>
+      </w:r>
+    </w:p>
+    <w:p/>
+    <w:p>
+      <w:proofErr w:type="spellStart"/>
+      <w:r>
+        <w:t>NodePort</w:t>
+      </w:r>
+      <w:proofErr w:type="spellEnd"/>
+      <w:r>
+        <w:t xml:space="preserve"> 30005 does NOT mean:</w:t>
       </w:r>
     </w:p>
     <w:p>
@@ -326,12 +380,21 @@
       <w:r>
         <w:t xml:space="preserve">packet gets </w:t>
       </w:r>
-      <w:r>
-        <w:rPr>
-          <w:b/>
-          <w:bCs/>
-        </w:rPr>
-        <w:t>DNAT'ed/redirected by the Kubernetes networking rules before normal socket delivery</w:t>
+      <w:proofErr w:type="spellStart"/>
+      <w:r>
+        <w:rPr>
+          <w:b/>
+          <w:bCs/>
+        </w:rPr>
+        <w:t>DNAT'ed</w:t>
+      </w:r>
+      <w:proofErr w:type="spellEnd"/>
+      <w:r>
+        <w:rPr>
+          <w:b/>
+          <w:bCs/>
+        </w:rPr>
+        <w:t>/redirected by the Kubernetes networking rules before normal socket delivery</w:t>
       </w:r>
       <w:r>
         <w:t>.</w:t>
@@ -348,13 +411,24 @@
       <w:r>
         <w:t xml:space="preserve">The full DNS to refer a service is: </w:t>
       </w:r>
-      <w:r>
-        <w:rPr>
-          <w:b/>
-          <w:bCs/>
-        </w:rPr>
-        <w:t>myservice.default.svc.cluster.local</w:t>
-      </w:r>
+      <w:proofErr w:type="spellStart"/>
+      <w:proofErr w:type="gramStart"/>
+      <w:r>
+        <w:rPr>
+          <w:b/>
+          <w:bCs/>
+        </w:rPr>
+        <w:t>myservice.default.svc.cluster</w:t>
+      </w:r>
+      <w:proofErr w:type="gramEnd"/>
+      <w:r>
+        <w:rPr>
+          <w:b/>
+          <w:bCs/>
+        </w:rPr>
+        <w:t>.local</w:t>
+      </w:r>
+      <w:proofErr w:type="spellEnd"/>
     </w:p>
     <w:p>
       <w:pPr>
@@ -381,8 +455,42 @@
     </w:p>
     <w:p>
       <w:r>
-        <w:t>The Structure of a Kubernetes Service DNS NameEvery Service gets a full DNS address that looks like this:[service-name].[namespace].svc.cluster.local</w:t>
-      </w:r>
+        <w:t xml:space="preserve">The Structure of a Kubernetes Service DNS </w:t>
+      </w:r>
+      <w:proofErr w:type="spellStart"/>
+      <w:r>
+        <w:t>NameEvery</w:t>
+      </w:r>
+      <w:proofErr w:type="spellEnd"/>
+      <w:r>
+        <w:t xml:space="preserve"> Service gets a full DNS address that looks like </w:t>
+      </w:r>
+      <w:proofErr w:type="gramStart"/>
+      <w:r>
+        <w:t>this:[</w:t>
+      </w:r>
+      <w:proofErr w:type="gramEnd"/>
+      <w:r>
+        <w:t>service-name</w:t>
+      </w:r>
+      <w:proofErr w:type="gramStart"/>
+      <w:r>
+        <w:t>].[</w:t>
+      </w:r>
+      <w:proofErr w:type="gramEnd"/>
+      <w:r>
+        <w:t>namespace].</w:t>
+      </w:r>
+      <w:proofErr w:type="spellStart"/>
+      <w:proofErr w:type="gramStart"/>
+      <w:r>
+        <w:t>svc.cluster</w:t>
+      </w:r>
+      <w:proofErr w:type="gramEnd"/>
+      <w:r>
+        <w:t>.local</w:t>
+      </w:r>
+      <w:proofErr w:type="spellEnd"/>
     </w:p>
     <w:p>
       <w:pPr>
@@ -392,8 +500,18 @@
           <w:numId w:val="3"/>
         </w:numPr>
       </w:pPr>
-      <w:r>
-        <w:t>service-name:The name you gave your Service.</w:t>
+      <w:proofErr w:type="spellStart"/>
+      <w:r>
+        <w:t>service-</w:t>
+      </w:r>
+      <w:proofErr w:type="gramStart"/>
+      <w:r>
+        <w:t>name:The</w:t>
+      </w:r>
+      <w:proofErr w:type="spellEnd"/>
+      <w:proofErr w:type="gramEnd"/>
+      <w:r>
+        <w:t xml:space="preserve"> name you gave your Service.</w:t>
       </w:r>
     </w:p>
     <w:p>
@@ -421,24 +539,128 @@
       </w:r>
     </w:p>
     <w:p>
-      <w:r>
-        <w:t>cluster.local: The default local domain name for your entire cluster.</w:t>
-      </w:r>
-    </w:p>
-    <w:p/>
-    <w:p>
-      <w:r>
-        <w:t>Scenario A Example: A pod in the "frontend" namespace connects to a database in the same namespace using just "db-service".</w:t>
-      </w:r>
-    </w:p>
-    <w:p>
-      <w:r>
-        <w:t>Scenario B Example: A pod in the "frontend" namespace connects to a database in the "backend" namespace using "db-service.backend".</w:t>
-      </w:r>
-    </w:p>
-    <w:p>
-      <w:r>
-        <w:t>The remaining part of the address—.svc.cluster.local—is called the cluster suffix. It is not mandatory because every container running inside a Kubernetes Pod has a hidden configuration file (/etc/resolv.conf) created automatically by the cluster. it contain all the search list.Because of this search list, if you type just db-service, Kubernetes automatically appends the remaining parts (.svc.cluster.local) behind the scenes and tests them one by one until it finds a match!</w:t>
+      <w:proofErr w:type="spellStart"/>
+      <w:proofErr w:type="gramStart"/>
+      <w:r>
+        <w:t>cluster.local</w:t>
+      </w:r>
+      <w:proofErr w:type="spellEnd"/>
+      <w:proofErr w:type="gramEnd"/>
+      <w:r>
+        <w:t>: The default local domain name for your entire cluster.</w:t>
+      </w:r>
+    </w:p>
+    <w:p/>
+    <w:p>
+      <w:r>
+        <w:t xml:space="preserve">Scenario </w:t>
+      </w:r>
+      <w:proofErr w:type="gramStart"/>
+      <w:r>
+        <w:t>A</w:t>
+      </w:r>
+      <w:proofErr w:type="gramEnd"/>
+      <w:r>
+        <w:t xml:space="preserve"> Example: A pod in the "frontend" namespace connects to a database in the same namespace using just "</w:t>
+      </w:r>
+      <w:proofErr w:type="spellStart"/>
+      <w:r>
+        <w:t>db</w:t>
+      </w:r>
+      <w:proofErr w:type="spellEnd"/>
+      <w:r>
+        <w:t>-service".</w:t>
+      </w:r>
+    </w:p>
+    <w:p>
+      <w:r>
+        <w:t>Scenario B Example: A pod in the "frontend" namespace connects to a database in the "backend" namespace using "</w:t>
+      </w:r>
+      <w:proofErr w:type="spellStart"/>
+      <w:r>
+        <w:t>db-</w:t>
+      </w:r>
+      <w:proofErr w:type="gramStart"/>
+      <w:r>
+        <w:t>service.backend</w:t>
+      </w:r>
+      <w:proofErr w:type="spellEnd"/>
+      <w:proofErr w:type="gramEnd"/>
+      <w:r>
+        <w:t>".</w:t>
+      </w:r>
+    </w:p>
+    <w:p>
+      <w:r>
+        <w:t>The remaining part of the address—.</w:t>
+      </w:r>
+      <w:proofErr w:type="spellStart"/>
+      <w:proofErr w:type="gramStart"/>
+      <w:r>
+        <w:t>svc.cluster</w:t>
+      </w:r>
+      <w:proofErr w:type="gramEnd"/>
+      <w:r>
+        <w:t>.local</w:t>
+      </w:r>
+      <w:proofErr w:type="spellEnd"/>
+      <w:r>
+        <w:t>—is called the cluster suffix. It is not mandatory because every container running inside a Kubernetes Pod has a hidden configuration file (/</w:t>
+      </w:r>
+      <w:proofErr w:type="spellStart"/>
+      <w:r>
+        <w:t>etc</w:t>
+      </w:r>
+      <w:proofErr w:type="spellEnd"/>
+      <w:r>
+        <w:t>/</w:t>
+      </w:r>
+      <w:proofErr w:type="spellStart"/>
+      <w:r>
+        <w:t>resolv.conf</w:t>
+      </w:r>
+      <w:proofErr w:type="spellEnd"/>
+      <w:r>
+        <w:t xml:space="preserve">) created automatically by the cluster. it </w:t>
+      </w:r>
+      <w:proofErr w:type="gramStart"/>
+      <w:r>
+        <w:t>contain</w:t>
+      </w:r>
+      <w:proofErr w:type="gramEnd"/>
+      <w:r>
+        <w:t xml:space="preserve"> all the search </w:t>
+      </w:r>
+      <w:proofErr w:type="spellStart"/>
+      <w:proofErr w:type="gramStart"/>
+      <w:r>
+        <w:t>list.Because</w:t>
+      </w:r>
+      <w:proofErr w:type="spellEnd"/>
+      <w:proofErr w:type="gramEnd"/>
+      <w:r>
+        <w:t xml:space="preserve"> of this search list, if you type just </w:t>
+      </w:r>
+      <w:proofErr w:type="spellStart"/>
+      <w:r>
+        <w:t>db</w:t>
+      </w:r>
+      <w:proofErr w:type="spellEnd"/>
+      <w:r>
+        <w:t>-service, Kubernetes automatically appends the remaining parts (.</w:t>
+      </w:r>
+      <w:proofErr w:type="spellStart"/>
+      <w:proofErr w:type="gramStart"/>
+      <w:r>
+        <w:t>svc.cluster</w:t>
+      </w:r>
+      <w:proofErr w:type="gramEnd"/>
+      <w:r>
+        <w:t>.local</w:t>
+      </w:r>
+      <w:proofErr w:type="spellEnd"/>
+      <w:r>
+        <w:t>) behind the scenes and tests them one by one until it finds a match!</w:t>
       </w:r>
     </w:p>
     <w:p>
@@ -521,8 +743,13 @@
       <w:r>
         <w:t xml:space="preserve"> </w:t>
       </w:r>
-      <w:r>
-        <w:t xml:space="preserve">kubectl </w:t>
+      <w:proofErr w:type="spellStart"/>
+      <w:r>
+        <w:t>kubectl</w:t>
+      </w:r>
+      <w:proofErr w:type="spellEnd"/>
+      <w:r>
+        <w:t xml:space="preserve"> </w:t>
       </w:r>
       <w:r>
         <w:rPr>
@@ -532,7 +759,15 @@
         <w:t>edit</w:t>
       </w:r>
       <w:r>
-        <w:t xml:space="preserve"> svc my-nodeport-service</w:t>
+        <w:t xml:space="preserve"> svc my-</w:t>
+      </w:r>
+      <w:proofErr w:type="spellStart"/>
+      <w:r>
+        <w:t>nodeport</w:t>
+      </w:r>
+      <w:proofErr w:type="spellEnd"/>
+      <w:r>
+        <w:t>-service</w:t>
       </w:r>
     </w:p>
     <w:p>
@@ -551,11 +786,16 @@
       <w:r>
         <w:t xml:space="preserve"> </w:t>
       </w:r>
+      <w:proofErr w:type="spellStart"/>
       <w:r>
         <w:t>k</w:t>
       </w:r>
       <w:r>
-        <w:t xml:space="preserve">ubectl </w:t>
+        <w:t>ubectl</w:t>
+      </w:r>
+      <w:proofErr w:type="spellEnd"/>
+      <w:r>
+        <w:t xml:space="preserve"> </w:t>
       </w:r>
       <w:r>
         <w:t xml:space="preserve">get pods </w:t>
@@ -583,18 +823,46 @@
           <w:bCs/>
         </w:rPr>
       </w:pPr>
+      <w:proofErr w:type="spellStart"/>
       <w:r>
         <w:rPr>
           <w:b/>
           <w:bCs/>
           <w:highlight w:val="cyan"/>
         </w:rPr>
-        <w:t>ExternalName Sevice</w:t>
-      </w:r>
-    </w:p>
-    <w:p>
-      <w:r>
-        <w:t>An ExternalName Service maps an internal Kubernetes DNS name to an external domain name using a CNAME record, allowing applications inside the cluster to access external resources without hardcoding external URLs.</w:t>
+        <w:t>ExternalName</w:t>
+      </w:r>
+      <w:proofErr w:type="spellEnd"/>
+      <w:r>
+        <w:rPr>
+          <w:b/>
+          <w:bCs/>
+          <w:highlight w:val="cyan"/>
+        </w:rPr>
+        <w:t xml:space="preserve"> </w:t>
+      </w:r>
+      <w:proofErr w:type="spellStart"/>
+      <w:r>
+        <w:rPr>
+          <w:b/>
+          <w:bCs/>
+          <w:highlight w:val="cyan"/>
+        </w:rPr>
+        <w:t>Sevice</w:t>
+      </w:r>
+      <w:proofErr w:type="spellEnd"/>
+    </w:p>
+    <w:p>
+      <w:r>
+        <w:t xml:space="preserve">An </w:t>
+      </w:r>
+      <w:proofErr w:type="spellStart"/>
+      <w:r>
+        <w:t>ExternalName</w:t>
+      </w:r>
+      <w:proofErr w:type="spellEnd"/>
+      <w:r>
+        <w:t xml:space="preserve"> Service maps an internal Kubernetes DNS name to an external domain name using a CNAME record, allowing applications inside the cluster to access external resources without hardcoding external URLs.</w:t>
       </w:r>
     </w:p>
     <w:p>
@@ -893,33 +1161,91 @@
       </w:r>
     </w:p>
     <w:p>
+      <w:proofErr w:type="spellStart"/>
       <w:r>
         <w:t>k</w:t>
       </w:r>
       <w:r>
-        <w:t>ubectl run pods -h  #This will shows example usages and explanations.</w:t>
-      </w:r>
-    </w:p>
-    <w:p/>
-    <w:p>
-      <w:pPr>
-        <w:rPr>
-          <w:b/>
-          <w:bCs/>
-        </w:rPr>
-      </w:pPr>
-    </w:p>
-    <w:p>
-      <w:r>
-        <w:t>kubectl api-resources -o wide</w:t>
-      </w:r>
-      <w:r>
-        <w:t xml:space="preserve"> : shows all resources of Kubernetes. Helps to find the apiversion.  </w:t>
-      </w:r>
-    </w:p>
-    <w:p>
-      <w:r>
-        <w:t>When you run kubectl get all, the resources that should be included in the “</w:t>
+        <w:t>ubectl</w:t>
+      </w:r>
+      <w:proofErr w:type="spellEnd"/>
+      <w:r>
+        <w:t xml:space="preserve"> run pods -</w:t>
+      </w:r>
+      <w:proofErr w:type="gramStart"/>
+      <w:r>
+        <w:t>h  #</w:t>
+      </w:r>
+      <w:proofErr w:type="gramEnd"/>
+      <w:r>
+        <w:t xml:space="preserve">This will </w:t>
+      </w:r>
+      <w:proofErr w:type="gramStart"/>
+      <w:r>
+        <w:t>shows</w:t>
+      </w:r>
+      <w:proofErr w:type="gramEnd"/>
+      <w:r>
+        <w:t xml:space="preserve"> example usages and explanations.</w:t>
+      </w:r>
+    </w:p>
+    <w:p/>
+    <w:p>
+      <w:pPr>
+        <w:rPr>
+          <w:b/>
+          <w:bCs/>
+        </w:rPr>
+      </w:pPr>
+    </w:p>
+    <w:p>
+      <w:proofErr w:type="spellStart"/>
+      <w:r>
+        <w:t>kubectl</w:t>
+      </w:r>
+      <w:proofErr w:type="spellEnd"/>
+      <w:r>
+        <w:t xml:space="preserve"> </w:t>
+      </w:r>
+      <w:proofErr w:type="spellStart"/>
+      <w:r>
+        <w:t>api</w:t>
+      </w:r>
+      <w:proofErr w:type="spellEnd"/>
+      <w:r>
+        <w:t xml:space="preserve">-resources -o </w:t>
+      </w:r>
+      <w:proofErr w:type="gramStart"/>
+      <w:r>
+        <w:t>wide</w:t>
+      </w:r>
+      <w:r>
+        <w:t xml:space="preserve"> :</w:t>
+      </w:r>
+      <w:proofErr w:type="gramEnd"/>
+      <w:r>
+        <w:t xml:space="preserve"> shows all resources of Kubernetes. Helps to find the </w:t>
+      </w:r>
+      <w:proofErr w:type="spellStart"/>
+      <w:r>
+        <w:t>apiversion</w:t>
+      </w:r>
+      <w:proofErr w:type="spellEnd"/>
+      <w:r>
+        <w:t xml:space="preserve">.  </w:t>
+      </w:r>
+    </w:p>
+    <w:p>
+      <w:r>
+        <w:t xml:space="preserve">When you run </w:t>
+      </w:r>
+      <w:proofErr w:type="spellStart"/>
+      <w:r>
+        <w:t>kubectl</w:t>
+      </w:r>
+      <w:proofErr w:type="spellEnd"/>
+      <w:r>
+        <w:t xml:space="preserve"> get all, the resources that should be included in the “</w:t>
       </w:r>
       <w:r>
         <w:rPr>
@@ -931,8 +1257,21 @@
       <w:r>
         <w:t>” can be seen in the output of “</w:t>
       </w:r>
-      <w:r>
-        <w:t>kubectl api-resources -o wide</w:t>
+      <w:proofErr w:type="spellStart"/>
+      <w:r>
+        <w:t>kubectl</w:t>
+      </w:r>
+      <w:proofErr w:type="spellEnd"/>
+      <w:r>
+        <w:t xml:space="preserve"> </w:t>
+      </w:r>
+      <w:proofErr w:type="spellStart"/>
+      <w:r>
+        <w:t>api</w:t>
+      </w:r>
+      <w:proofErr w:type="spellEnd"/>
+      <w:r>
+        <w:t>-resources -o wide</w:t>
       </w:r>
       <w:r>
         <w:t xml:space="preserve">” command, under the </w:t>
@@ -954,7 +1293,15 @@
     <w:p/>
     <w:p>
       <w:r>
-        <w:t>The cluster-info CA certificate in kube-public acts just like the trusted root certificates in your web browser, allowing new clients to safely verify the identity of the Kubernetes API server during a secure TLS connection.</w:t>
+        <w:t xml:space="preserve">The cluster-info CA certificate in </w:t>
+      </w:r>
+      <w:proofErr w:type="spellStart"/>
+      <w:r>
+        <w:t>kube</w:t>
+      </w:r>
+      <w:proofErr w:type="spellEnd"/>
+      <w:r>
+        <w:t>-public acts just like the trusted root certificates in your web browser, allowing new clients to safely verify the identity of the Kubernetes API server during a secure TLS connection.</w:t>
       </w:r>
     </w:p>
     <w:p/>
@@ -991,8 +1338,13 @@
       </w:pPr>
     </w:p>
     <w:p>
-      <w:r>
-        <w:t>kubectl apply -f folder/ does not guarantee resource creation order.</w:t>
+      <w:proofErr w:type="spellStart"/>
+      <w:r>
+        <w:t>kubectl</w:t>
+      </w:r>
+      <w:proofErr w:type="spellEnd"/>
+      <w:r>
+        <w:t xml:space="preserve"> apply -f folder/ does not guarantee resource creation order.</w:t>
       </w:r>
     </w:p>
     <w:p>
@@ -1024,13 +1376,53 @@
     </w:p>
     <w:p>
       <w:r>
-        <w:t>When PID 1 exits, the container runtime records its exit code, and kubelet uses that result along with the restartPolicy to decide whether to restart the container.</w:t>
-      </w:r>
-    </w:p>
-    <w:p/>
-    <w:p>
-      <w:r>
-        <w:t>Kubernetes stores the last applied configuration in the same live object configuration in etcd. It uses this and the actual yaml to decide how modifications need to be performed when using kubectl apply command</w:t>
+        <w:t xml:space="preserve">When PID 1 exits, the container runtime records its exit code, and </w:t>
+      </w:r>
+      <w:proofErr w:type="spellStart"/>
+      <w:r>
+        <w:t>kubelet</w:t>
+      </w:r>
+      <w:proofErr w:type="spellEnd"/>
+      <w:r>
+        <w:t xml:space="preserve"> uses that result along with the </w:t>
+      </w:r>
+      <w:proofErr w:type="spellStart"/>
+      <w:r>
+        <w:t>restartPolicy</w:t>
+      </w:r>
+      <w:proofErr w:type="spellEnd"/>
+      <w:r>
+        <w:t xml:space="preserve"> to decide whether to restart the container.</w:t>
+      </w:r>
+    </w:p>
+    <w:p/>
+    <w:p>
+      <w:r>
+        <w:t xml:space="preserve">Kubernetes stores the last applied configuration in the same live object configuration in </w:t>
+      </w:r>
+      <w:proofErr w:type="spellStart"/>
+      <w:r>
+        <w:t>etcd</w:t>
+      </w:r>
+      <w:proofErr w:type="spellEnd"/>
+      <w:r>
+        <w:t xml:space="preserve">. It uses this and the actual </w:t>
+      </w:r>
+      <w:proofErr w:type="spellStart"/>
+      <w:r>
+        <w:t>yaml</w:t>
+      </w:r>
+      <w:proofErr w:type="spellEnd"/>
+      <w:r>
+        <w:t xml:space="preserve"> to decide how modifications need to be performed when using </w:t>
+      </w:r>
+      <w:proofErr w:type="spellStart"/>
+      <w:r>
+        <w:t>kubectl</w:t>
+      </w:r>
+      <w:proofErr w:type="spellEnd"/>
+      <w:r>
+        <w:t xml:space="preserve"> apply command</w:t>
       </w:r>
       <w:r>
         <w:t>s</w:t>
@@ -1081,7 +1473,15 @@
     <w:p/>
     <w:p>
       <w:r>
-        <w:t>You can manually schedule a pod using the nodeName property. It can be used</w:t>
+        <w:t xml:space="preserve">You can manually schedule a pod using the </w:t>
+      </w:r>
+      <w:proofErr w:type="spellStart"/>
+      <w:r>
+        <w:t>nodeName</w:t>
+      </w:r>
+      <w:proofErr w:type="spellEnd"/>
+      <w:r>
+        <w:t xml:space="preserve"> property. It can be used</w:t>
       </w:r>
       <w:r>
         <w:t xml:space="preserve"> in situations where s</w:t>
@@ -1092,15 +1492,32 @@
     </w:p>
     <w:p/>
     <w:p>
-      <w:r>
-        <w:rPr>
-          <w:b/>
-          <w:bCs/>
-        </w:rPr>
-        <w:t>PriorityClass:</w:t>
-      </w:r>
-      <w:r>
-        <w:t xml:space="preserve"> A Kubernetes object that defines the priority of Pods. Higher-priority Pods are scheduled before lower-priority Pods and can preempt (evict) lower-priority Pods when resources are insufficient.</w:t>
+      <w:proofErr w:type="spellStart"/>
+      <w:r>
+        <w:rPr>
+          <w:b/>
+          <w:bCs/>
+        </w:rPr>
+        <w:t>PriorityClass</w:t>
+      </w:r>
+      <w:proofErr w:type="spellEnd"/>
+      <w:r>
+        <w:rPr>
+          <w:b/>
+          <w:bCs/>
+        </w:rPr>
+        <w:t>:</w:t>
+      </w:r>
+      <w:r>
+        <w:t xml:space="preserve"> A Kubernetes object that defines the priority of Pods. Higher-priority Pods are scheduled before lower-priority Pods and can </w:t>
+      </w:r>
+      <w:proofErr w:type="spellStart"/>
+      <w:r>
+        <w:t>preempt</w:t>
+      </w:r>
+      <w:proofErr w:type="spellEnd"/>
+      <w:r>
+        <w:t xml:space="preserve"> (evict) lower-priority Pods when resources are insufficient.</w:t>
       </w:r>
     </w:p>
     <w:p>
@@ -1125,7 +1542,15 @@
         <w:t>-</w:t>
       </w:r>
       <w:r>
-        <w:t xml:space="preserve"> Pod has higher priority → scheduled first and can preempt lower-priority Pods. </w:t>
+        <w:t xml:space="preserve"> Pod has higher priority → scheduled first and can </w:t>
+      </w:r>
+      <w:proofErr w:type="spellStart"/>
+      <w:r>
+        <w:t>preempt</w:t>
+      </w:r>
+      <w:proofErr w:type="spellEnd"/>
+      <w:r>
+        <w:t xml:space="preserve"> lower-priority Pods. </w:t>
       </w:r>
     </w:p>
     <w:p>
@@ -1150,7 +1575,15 @@
         <w:t>-</w:t>
       </w:r>
       <w:r>
-        <w:t xml:space="preserve"> Pod has lower priority → scheduled later and can be preempted by higher-priority Pods.</w:t>
+        <w:t xml:space="preserve"> Pod has lower priority → scheduled later and can be </w:t>
+      </w:r>
+      <w:proofErr w:type="spellStart"/>
+      <w:r>
+        <w:t>preempted</w:t>
+      </w:r>
+      <w:proofErr w:type="spellEnd"/>
+      <w:r>
+        <w:t xml:space="preserve"> by higher-priority Pods.</w:t>
       </w:r>
     </w:p>
     <w:p>
@@ -1180,24 +1613,50 @@
           <w:numId w:val="4"/>
         </w:numPr>
       </w:pPr>
-      <w:r>
-        <w:t>preemptionPolicy: PreemptLowerPriority</w:t>
-      </w:r>
-      <w:r>
-        <w:t xml:space="preserve">  or </w:t>
-      </w:r>
-      <w:r>
-        <w:t>preemptionPolicy: Never</w:t>
+      <w:proofErr w:type="spellStart"/>
+      <w:r>
+        <w:t>preemptionPolicy</w:t>
+      </w:r>
+      <w:proofErr w:type="spellEnd"/>
+      <w:r>
+        <w:t xml:space="preserve">: </w:t>
+      </w:r>
+      <w:proofErr w:type="spellStart"/>
+      <w:proofErr w:type="gramStart"/>
+      <w:r>
+        <w:t>PreemptLowerPriority</w:t>
+      </w:r>
+      <w:proofErr w:type="spellEnd"/>
+      <w:r>
+        <w:t xml:space="preserve">  or</w:t>
+      </w:r>
+      <w:proofErr w:type="gramEnd"/>
+      <w:r>
+        <w:t xml:space="preserve"> </w:t>
+      </w:r>
+      <w:proofErr w:type="spellStart"/>
+      <w:r>
+        <w:t>preemptionPolicy</w:t>
+      </w:r>
+      <w:proofErr w:type="spellEnd"/>
+      <w:r>
+        <w:t>: Never</w:t>
       </w:r>
       <w:r>
         <w:t>s</w:t>
       </w:r>
     </w:p>
     <w:p>
+      <w:proofErr w:type="spellStart"/>
       <w:r>
         <w:lastRenderedPageBreak/>
-        <w:t xml:space="preserve">kubectl logs commands only displays the applications </w:t>
-      </w:r>
+        <w:t>kubectl</w:t>
+      </w:r>
+      <w:proofErr w:type="spellEnd"/>
+      <w:r>
+        <w:t xml:space="preserve"> logs commands only displays the applications </w:t>
+      </w:r>
+      <w:proofErr w:type="spellStart"/>
       <w:r>
         <w:rPr>
           <w:b/>
@@ -1205,6 +1664,7 @@
         </w:rPr>
         <w:t>stdout</w:t>
       </w:r>
+      <w:proofErr w:type="spellEnd"/>
       <w:r>
         <w:t xml:space="preserve"> and </w:t>
       </w:r>
@@ -1229,7 +1689,15 @@
         <w:t>logs.</w:t>
       </w:r>
       <w:r>
-        <w:t xml:space="preserve"> etc those stored in /var/</w:t>
+        <w:t xml:space="preserve"> </w:t>
+      </w:r>
+      <w:proofErr w:type="spellStart"/>
+      <w:r>
+        <w:t>etc</w:t>
+      </w:r>
+      <w:proofErr w:type="spellEnd"/>
+      <w:r>
+        <w:t xml:space="preserve"> those stored in /var/</w:t>
       </w:r>
       <w:r>
         <w:t>…</w:t>
@@ -1262,11 +1730,24 @@
     </w:p>
     <w:p>
       <w:r>
-        <w:t>Eg: “</w:t>
-      </w:r>
-      <w:r>
-        <w:t xml:space="preserve"> my-scheduler, my-scheduler-my-scheduler   Successfully assigned default/nginx to controlplan</w:t>
-      </w:r>
+        <w:t xml:space="preserve">Eg: </w:t>
+      </w:r>
+      <w:proofErr w:type="gramStart"/>
+      <w:r>
+        <w:t>“</w:t>
+      </w:r>
+      <w:r>
+        <w:t xml:space="preserve"> my</w:t>
+      </w:r>
+      <w:proofErr w:type="gramEnd"/>
+      <w:r>
+        <w:t xml:space="preserve">-scheduler, my-scheduler-my-scheduler   Successfully assigned default/nginx to </w:t>
+      </w:r>
+      <w:proofErr w:type="spellStart"/>
+      <w:r>
+        <w:t>controlplan</w:t>
+      </w:r>
+      <w:proofErr w:type="spellEnd"/>
       <w:r>
         <w:t>”</w:t>
       </w:r>
@@ -1299,7 +1780,25 @@
         <w:t>Queue → Filter → Score → Bind</w:t>
       </w:r>
       <w:r>
-        <w:t>. Queue selects a pending Pod, Filter eliminates nodes where the Pod cannot run, Score ranks the remaining nodes, and Bind assigns the Pod to the selected node. The scheduler records the selected node in the Pod object's spec.nodeName field. The kubelet on that node then starts the Pod.</w:t>
+        <w:t xml:space="preserve">. Queue selects a pending Pod, Filter eliminates nodes where the Pod cannot run, Score ranks the remaining nodes, and Bind assigns the Pod to the selected node. The scheduler records the selected node in the Pod object's </w:t>
+      </w:r>
+      <w:proofErr w:type="spellStart"/>
+      <w:proofErr w:type="gramStart"/>
+      <w:r>
+        <w:t>spec.nodeName</w:t>
+      </w:r>
+      <w:proofErr w:type="spellEnd"/>
+      <w:proofErr w:type="gramEnd"/>
+      <w:r>
+        <w:t xml:space="preserve"> field. The </w:t>
+      </w:r>
+      <w:proofErr w:type="spellStart"/>
+      <w:r>
+        <w:t>kubelet</w:t>
+      </w:r>
+      <w:proofErr w:type="spellEnd"/>
+      <w:r>
+        <w:t xml:space="preserve"> on that node then starts the Pod.</w:t>
       </w:r>
     </w:p>
     <w:p/>
@@ -1321,7 +1820,15 @@
         <w:t>Scheduler profiles</w:t>
       </w:r>
       <w:r>
-        <w:t xml:space="preserve"> are different configurations of the same kube-scheduler. Each profile can have its own </w:t>
+        <w:t xml:space="preserve"> are different configurations of the same </w:t>
+      </w:r>
+      <w:proofErr w:type="spellStart"/>
+      <w:r>
+        <w:t>kube</w:t>
+      </w:r>
+      <w:proofErr w:type="spellEnd"/>
+      <w:r>
+        <w:t xml:space="preserve">-scheduler. Each profile can have its own </w:t>
       </w:r>
       <w:r>
         <w:rPr>
@@ -1331,7 +1838,17 @@
         <w:t>scheduler plugins</w:t>
       </w:r>
       <w:r>
-        <w:t xml:space="preserve"> enabled, disabled, or configured. A Pod selects a profile using spec.schedulerName. Plugins implement scheduling logic at stages such as </w:t>
+        <w:t xml:space="preserve"> enabled, disabled, or configured. A Pod selects a profile using </w:t>
+      </w:r>
+      <w:proofErr w:type="spellStart"/>
+      <w:proofErr w:type="gramStart"/>
+      <w:r>
+        <w:t>spec.schedulerName</w:t>
+      </w:r>
+      <w:proofErr w:type="spellEnd"/>
+      <w:proofErr w:type="gramEnd"/>
+      <w:r>
+        <w:t xml:space="preserve">. Plugins implement scheduling logic at stages such as </w:t>
       </w:r>
       <w:r>
         <w:rPr>
@@ -1383,7 +1900,15 @@
         <w:t>Admission Controller</w:t>
       </w:r>
       <w:r>
-        <w:t xml:space="preserve"> intercepts API requests after authentication and authorization but before the object is stored in etcd. It can </w:t>
+        <w:t xml:space="preserve"> intercepts API requests after authentication and authorization but before the object is stored in </w:t>
+      </w:r>
+      <w:proofErr w:type="spellStart"/>
+      <w:r>
+        <w:t>etcd</w:t>
+      </w:r>
+      <w:proofErr w:type="spellEnd"/>
+      <w:r>
+        <w:t xml:space="preserve">. It can </w:t>
       </w:r>
       <w:r>
         <w:rPr>
@@ -1412,7 +1937,16 @@
           <w:b/>
           <w:bCs/>
         </w:rPr>
-        <w:t>How Kubernetes determine to allow or deny:</w:t>
+        <w:t xml:space="preserve">How Kubernetes determine to allow or </w:t>
+      </w:r>
+      <w:proofErr w:type="spellStart"/>
+      <w:proofErr w:type="gramStart"/>
+      <w:r>
+        <w:rPr>
+          <w:b/>
+          <w:bCs/>
+        </w:rPr>
+        <w:t>deny:</w:t>
       </w:r>
       <w:r>
         <w:rPr>
@@ -1421,11 +1955,59 @@
         </w:rPr>
         <w:t>s</w:t>
       </w:r>
+      <w:proofErr w:type="spellEnd"/>
+      <w:proofErr w:type="gramEnd"/>
     </w:p>
     <w:p>
       <w:r>
         <w:lastRenderedPageBreak/>
-        <w:t>The ImagePolicyWebhook sends information about the requested container image to an external webhook. The webhook performs its own policy logic and then returns an ImageReview response. Kubernetes does not care how the webhook makes its decision; it expects the decision in the status.allowed field. status.allowed: true allows the image, while status.allowed: false rejects it.</w:t>
+        <w:t xml:space="preserve">The </w:t>
+      </w:r>
+      <w:proofErr w:type="spellStart"/>
+      <w:r>
+        <w:t>ImagePolicyWebhook</w:t>
+      </w:r>
+      <w:proofErr w:type="spellEnd"/>
+      <w:r>
+        <w:t xml:space="preserve"> sends information about the requested container image to an external webhook. The webhook performs its own policy logic and then returns an </w:t>
+      </w:r>
+      <w:proofErr w:type="spellStart"/>
+      <w:r>
+        <w:t>ImageReview</w:t>
+      </w:r>
+      <w:proofErr w:type="spellEnd"/>
+      <w:r>
+        <w:t xml:space="preserve"> response. Kubernetes does not care how the webhook makes its decision; it expects the decision in the </w:t>
+      </w:r>
+      <w:proofErr w:type="spellStart"/>
+      <w:proofErr w:type="gramStart"/>
+      <w:r>
+        <w:t>status.allowed</w:t>
+      </w:r>
+      <w:proofErr w:type="spellEnd"/>
+      <w:proofErr w:type="gramEnd"/>
+      <w:r>
+        <w:t xml:space="preserve"> field. </w:t>
+      </w:r>
+      <w:proofErr w:type="spellStart"/>
+      <w:proofErr w:type="gramStart"/>
+      <w:r>
+        <w:t>status.allowed</w:t>
+      </w:r>
+      <w:proofErr w:type="spellEnd"/>
+      <w:proofErr w:type="gramEnd"/>
+      <w:r>
+        <w:t xml:space="preserve">: true allows the image, while </w:t>
+      </w:r>
+      <w:proofErr w:type="spellStart"/>
+      <w:proofErr w:type="gramStart"/>
+      <w:r>
+        <w:t>status.allowed</w:t>
+      </w:r>
+      <w:proofErr w:type="spellEnd"/>
+      <w:proofErr w:type="gramEnd"/>
+      <w:r>
+        <w:t>: false rejects it.</w:t>
       </w:r>
     </w:p>
     <w:p/>
@@ -1466,7 +2048,23 @@
     </w:p>
     <w:p>
       <w:r>
-        <w:t>Shell form: ENTRYPOINT command — runs through /bin/sh -c. CMD and runtime arguments are not passed to the entrypoint command in the normal way. Useful when shell features such as &amp;&amp;, pipes, or variable expansion are required.</w:t>
+        <w:t>Shell form: ENTRYPOINT command — runs through /bin/</w:t>
+      </w:r>
+      <w:proofErr w:type="spellStart"/>
+      <w:r>
+        <w:t>sh</w:t>
+      </w:r>
+      <w:proofErr w:type="spellEnd"/>
+      <w:r>
+        <w:t xml:space="preserve"> -c. CMD and runtime arguments are not passed to the </w:t>
+      </w:r>
+      <w:proofErr w:type="spellStart"/>
+      <w:r>
+        <w:t>entrypoint</w:t>
+      </w:r>
+      <w:proofErr w:type="spellEnd"/>
+      <w:r>
+        <w:t xml:space="preserve"> command in the normal way. Useful when shell features such as &amp;&amp;, pipes, or variable expansion are required.</w:t>
       </w:r>
     </w:p>
     <w:p>
@@ -1499,22 +2097,55 @@
     <w:p/>
     <w:p>
       <w:r>
-        <w:t xml:space="preserve">To over ride an entry point, use the  </w:t>
-      </w:r>
-      <w:r>
-        <w:rPr>
-          <w:b/>
-          <w:bCs/>
-        </w:rPr>
-        <w:t>“--entrypoint”</w:t>
+        <w:t xml:space="preserve">To over ride an entry point, use </w:t>
+      </w:r>
+      <w:proofErr w:type="gramStart"/>
+      <w:r>
+        <w:t xml:space="preserve">the  </w:t>
+      </w:r>
+      <w:r>
+        <w:rPr>
+          <w:b/>
+          <w:bCs/>
+        </w:rPr>
+        <w:t>“</w:t>
+      </w:r>
+      <w:proofErr w:type="gramEnd"/>
+      <w:r>
+        <w:rPr>
+          <w:b/>
+          <w:bCs/>
+        </w:rPr>
+        <w:t>--</w:t>
+      </w:r>
+      <w:proofErr w:type="spellStart"/>
+      <w:r>
+        <w:rPr>
+          <w:b/>
+          <w:bCs/>
+        </w:rPr>
+        <w:t>entrypoint</w:t>
+      </w:r>
+      <w:proofErr w:type="spellEnd"/>
+      <w:r>
+        <w:rPr>
+          <w:b/>
+          <w:bCs/>
+        </w:rPr>
+        <w:t>”</w:t>
       </w:r>
       <w:r>
         <w:t xml:space="preserve"> flag.</w:t>
       </w:r>
     </w:p>
     <w:p>
-      <w:r>
-        <w:t xml:space="preserve">eg: </w:t>
+      <w:proofErr w:type="spellStart"/>
+      <w:r>
+        <w:t>eg</w:t>
+      </w:r>
+      <w:proofErr w:type="spellEnd"/>
+      <w:r>
+        <w:t xml:space="preserve">: </w:t>
       </w:r>
       <w:r>
         <w:t xml:space="preserve">docker run </w:t>
@@ -1524,17 +2155,47 @@
           <w:b/>
           <w:bCs/>
         </w:rPr>
-        <w:t>--entrypoint</w:t>
-      </w:r>
-      <w:r>
-        <w:t xml:space="preserve"> ls image</w:t>
-      </w:r>
-      <w:r>
-        <w:t xml:space="preserve">  # This override the default entry point with ls</w:t>
+        <w:t>--</w:t>
+      </w:r>
+      <w:proofErr w:type="spellStart"/>
+      <w:r>
+        <w:rPr>
+          <w:b/>
+          <w:bCs/>
+        </w:rPr>
+        <w:t>entrypoint</w:t>
+      </w:r>
+      <w:proofErr w:type="spellEnd"/>
+      <w:r>
+        <w:t xml:space="preserve"> ls </w:t>
+      </w:r>
+      <w:proofErr w:type="gramStart"/>
+      <w:r>
+        <w:t>image</w:t>
+      </w:r>
+      <w:r>
+        <w:t xml:space="preserve">  #</w:t>
+      </w:r>
+      <w:proofErr w:type="gramEnd"/>
+      <w:r>
+        <w:t xml:space="preserve"> This </w:t>
+      </w:r>
+      <w:proofErr w:type="gramStart"/>
+      <w:r>
+        <w:t>override</w:t>
+      </w:r>
+      <w:proofErr w:type="gramEnd"/>
+      <w:r>
+        <w:t xml:space="preserve"> the default entry point with </w:t>
+      </w:r>
+      <w:proofErr w:type="spellStart"/>
+      <w:r>
+        <w:t>ls</w:t>
       </w:r>
       <w:r>
         <w:t>s</w:t>
       </w:r>
+      <w:proofErr w:type="spellEnd"/>
     </w:p>
     <w:p/>
     <w:p>
@@ -1605,6 +2266,8 @@
         </w:rPr>
         <w:t xml:space="preserve"> </w:t>
       </w:r>
+      <w:proofErr w:type="spellStart"/>
+      <w:proofErr w:type="gramStart"/>
       <w:r>
         <w:rPr>
           <w:b/>
@@ -1612,8 +2275,13 @@
         </w:rPr>
         <w:t>args</w:t>
       </w:r>
-      <w:r>
-        <w:t xml:space="preserve">  # This is the argument passed to the entry point. This will be appended as an argument to entry point</w:t>
+      <w:proofErr w:type="spellEnd"/>
+      <w:r>
+        <w:t xml:space="preserve">  #</w:t>
+      </w:r>
+      <w:proofErr w:type="gramEnd"/>
+      <w:r>
+        <w:t xml:space="preserve"> This is the argument passed to the entry point. This will be appended as an argument to entry point</w:t>
       </w:r>
     </w:p>
     <w:p/>
@@ -1632,16 +2300,57 @@
           <w:bCs/>
         </w:rPr>
         <w:lastRenderedPageBreak/>
-        <w:t>Difference between kubectl create vs kubectl apply</w:t>
-      </w:r>
-    </w:p>
-    <w:p>
-      <w:r>
-        <w:rPr>
-          <w:b/>
-          <w:bCs/>
-        </w:rPr>
-        <w:t>kubectl create</w:t>
+        <w:t xml:space="preserve">Difference between </w:t>
+      </w:r>
+      <w:proofErr w:type="spellStart"/>
+      <w:r>
+        <w:rPr>
+          <w:b/>
+          <w:bCs/>
+        </w:rPr>
+        <w:t>kubectl</w:t>
+      </w:r>
+      <w:proofErr w:type="spellEnd"/>
+      <w:r>
+        <w:rPr>
+          <w:b/>
+          <w:bCs/>
+        </w:rPr>
+        <w:t xml:space="preserve"> create vs </w:t>
+      </w:r>
+      <w:proofErr w:type="spellStart"/>
+      <w:r>
+        <w:rPr>
+          <w:b/>
+          <w:bCs/>
+        </w:rPr>
+        <w:t>kubectl</w:t>
+      </w:r>
+      <w:proofErr w:type="spellEnd"/>
+      <w:r>
+        <w:rPr>
+          <w:b/>
+          <w:bCs/>
+        </w:rPr>
+        <w:t xml:space="preserve"> apply</w:t>
+      </w:r>
+    </w:p>
+    <w:p>
+      <w:proofErr w:type="spellStart"/>
+      <w:r>
+        <w:rPr>
+          <w:b/>
+          <w:bCs/>
+        </w:rPr>
+        <w:t>kubectl</w:t>
+      </w:r>
+      <w:proofErr w:type="spellEnd"/>
+      <w:r>
+        <w:rPr>
+          <w:b/>
+          <w:bCs/>
+        </w:rPr>
+        <w:t xml:space="preserve"> create</w:t>
       </w:r>
       <w:r>
         <w:t xml:space="preserve"> </w:t>
@@ -1654,12 +2363,21 @@
       </w:r>
     </w:p>
     <w:p>
-      <w:r>
-        <w:rPr>
-          <w:b/>
-          <w:bCs/>
-        </w:rPr>
-        <w:t>kubectl apply</w:t>
+      <w:proofErr w:type="spellStart"/>
+      <w:r>
+        <w:rPr>
+          <w:b/>
+          <w:bCs/>
+        </w:rPr>
+        <w:t>kubectl</w:t>
+      </w:r>
+      <w:proofErr w:type="spellEnd"/>
+      <w:r>
+        <w:rPr>
+          <w:b/>
+          <w:bCs/>
+        </w:rPr>
+        <w:t xml:space="preserve"> apply</w:t>
       </w:r>
       <w:r>
         <w:t xml:space="preserve"> </w:t>
@@ -1849,20 +2567,54 @@
     </w:p>
     <w:p>
       <w:r>
-        <w:t>It gets metrics from kubelets, which expose cAdvisor derived container metrics.</w:t>
-      </w:r>
-    </w:p>
-    <w:p/>
-    <w:p>
-      <w:r>
-        <w:rPr>
-          <w:b/>
-          <w:bCs/>
-        </w:rPr>
+        <w:t xml:space="preserve">It gets metrics from </w:t>
+      </w:r>
+      <w:proofErr w:type="spellStart"/>
+      <w:r>
+        <w:t>kubelets</w:t>
+      </w:r>
+      <w:proofErr w:type="spellEnd"/>
+      <w:r>
+        <w:t xml:space="preserve">, which expose </w:t>
+      </w:r>
+      <w:proofErr w:type="spellStart"/>
+      <w:r>
         <w:t>cAdvisor</w:t>
       </w:r>
-      <w:r>
-        <w:t xml:space="preserve"> is part of kubelet and collects container resource metrics. Metrics Server collects metrics from kubelets and provides them through the Kubernetes Metrics API.</w:t>
+      <w:proofErr w:type="spellEnd"/>
+      <w:r>
+        <w:t xml:space="preserve"> derived container metrics.</w:t>
+      </w:r>
+    </w:p>
+    <w:p/>
+    <w:p>
+      <w:proofErr w:type="spellStart"/>
+      <w:r>
+        <w:rPr>
+          <w:b/>
+          <w:bCs/>
+        </w:rPr>
+        <w:t>cAdvisor</w:t>
+      </w:r>
+      <w:proofErr w:type="spellEnd"/>
+      <w:r>
+        <w:t xml:space="preserve"> is part of </w:t>
+      </w:r>
+      <w:proofErr w:type="spellStart"/>
+      <w:r>
+        <w:t>kubelet</w:t>
+      </w:r>
+      <w:proofErr w:type="spellEnd"/>
+      <w:r>
+        <w:t xml:space="preserve"> and collects container resource metrics. Metrics Server collects metrics from </w:t>
+      </w:r>
+      <w:proofErr w:type="spellStart"/>
+      <w:r>
+        <w:t>kubelets</w:t>
+      </w:r>
+      <w:proofErr w:type="spellEnd"/>
+      <w:r>
+        <w:t xml:space="preserve"> and provides them through the Kubernetes Metrics API.</w:t>
       </w:r>
     </w:p>
     <w:p>
@@ -1871,13 +2623,26 @@
       </w:r>
     </w:p>
     <w:p>
-      <w:r>
-        <w:t>kubectl top pods</w:t>
-      </w:r>
-    </w:p>
-    <w:p>
-      <w:r>
-        <w:t xml:space="preserve"> kubectl top nodes</w:t>
+      <w:proofErr w:type="spellStart"/>
+      <w:r>
+        <w:t>kubectl</w:t>
+      </w:r>
+      <w:proofErr w:type="spellEnd"/>
+      <w:r>
+        <w:t xml:space="preserve"> top pods</w:t>
+      </w:r>
+    </w:p>
+    <w:p>
+      <w:r>
+        <w:t xml:space="preserve"> </w:t>
+      </w:r>
+      <w:proofErr w:type="spellStart"/>
+      <w:r>
+        <w:t>kubectl</w:t>
+      </w:r>
+      <w:proofErr w:type="spellEnd"/>
+      <w:r>
+        <w:t xml:space="preserve"> top nodes</w:t>
       </w:r>
     </w:p>
     <w:p/>
@@ -1899,7 +2664,15 @@
     </w:p>
     <w:p>
       <w:r>
-        <w:t xml:space="preserve">Kubernetes does not use a single CA for all components. Most control plane components (API Server, kube-proxy, scheduler, controller-manager, admin clients) use the </w:t>
+        <w:t xml:space="preserve">Kubernetes does not use a single CA for all components. Most control plane components (API Server, </w:t>
+      </w:r>
+      <w:proofErr w:type="spellStart"/>
+      <w:r>
+        <w:t>kube</w:t>
+      </w:r>
+      <w:proofErr w:type="spellEnd"/>
+      <w:r>
+        <w:t xml:space="preserve">-proxy, scheduler, controller-manager, admin clients) use the </w:t>
       </w:r>
       <w:r>
         <w:rPr>
@@ -2002,7 +2775,31 @@
         <w:t>Sidecar Container:</w:t>
       </w:r>
       <w:r>
-        <w:t xml:space="preserve"> A restartable init container (restartPolicy: Always) that starts during Pod initialization and continues running alongside the main container.</w:t>
+        <w:t xml:space="preserve"> A </w:t>
+      </w:r>
+      <w:proofErr w:type="spellStart"/>
+      <w:r>
+        <w:t>restartable</w:t>
+      </w:r>
+      <w:proofErr w:type="spellEnd"/>
+      <w:r>
+        <w:t xml:space="preserve"> </w:t>
+      </w:r>
+      <w:proofErr w:type="spellStart"/>
+      <w:r>
+        <w:t>init</w:t>
+      </w:r>
+      <w:proofErr w:type="spellEnd"/>
+      <w:r>
+        <w:t xml:space="preserve"> container (</w:t>
+      </w:r>
+      <w:proofErr w:type="spellStart"/>
+      <w:r>
+        <w:t>restartPolicy</w:t>
+      </w:r>
+      <w:proofErr w:type="spellEnd"/>
+      <w:r>
+        <w:t>: Always) that starts during Pod initialization and continues running alongside the main container.</w:t>
       </w:r>
     </w:p>
     <w:p>
@@ -2024,12 +2821,21 @@
       <w:r>
         <w:t xml:space="preserve">This is the sidecar container. It is an </w:t>
       </w:r>
-      <w:r>
-        <w:rPr>
-          <w:b/>
-          <w:bCs/>
-        </w:rPr>
-        <w:t>init container</w:t>
+      <w:proofErr w:type="spellStart"/>
+      <w:r>
+        <w:rPr>
+          <w:b/>
+          <w:bCs/>
+        </w:rPr>
+        <w:t>init</w:t>
+      </w:r>
+      <w:proofErr w:type="spellEnd"/>
+      <w:r>
+        <w:rPr>
+          <w:b/>
+          <w:bCs/>
+        </w:rPr>
+        <w:t xml:space="preserve"> container</w:t>
       </w:r>
       <w:r>
         <w:t xml:space="preserve"> </w:t>
@@ -2042,8 +2848,17 @@
           <w:b/>
           <w:bCs/>
         </w:rPr>
-        <w:t xml:space="preserve"> restartPolicy</w:t>
-      </w:r>
+        <w:t xml:space="preserve"> </w:t>
+      </w:r>
+      <w:proofErr w:type="spellStart"/>
+      <w:r>
+        <w:rPr>
+          <w:b/>
+          <w:bCs/>
+        </w:rPr>
+        <w:t>restartPolicy</w:t>
+      </w:r>
+      <w:proofErr w:type="spellEnd"/>
       <w:r>
         <w:t xml:space="preserve"> set to </w:t>
       </w:r>
@@ -2100,18 +2915,43 @@
     <w:p>
       <w:r>
         <w:lastRenderedPageBreak/>
-        <w:t>A sidecar is an init container with restartPolicy: Always. It starts during Pod initialization and continues running alongside the main container, restarting if it exits.</w:t>
-      </w:r>
-    </w:p>
-    <w:p/>
-    <w:p>
-      <w:r>
-        <w:rPr>
-          <w:b/>
-          <w:bCs/>
-        </w:rPr>
-        <w:t>Vertical Pod Autoscaler</w:t>
-      </w:r>
+        <w:t xml:space="preserve">A sidecar is an </w:t>
+      </w:r>
+      <w:proofErr w:type="spellStart"/>
+      <w:r>
+        <w:t>init</w:t>
+      </w:r>
+      <w:proofErr w:type="spellEnd"/>
+      <w:r>
+        <w:t xml:space="preserve"> container with </w:t>
+      </w:r>
+      <w:proofErr w:type="spellStart"/>
+      <w:r>
+        <w:t>restartPolicy</w:t>
+      </w:r>
+      <w:proofErr w:type="spellEnd"/>
+      <w:r>
+        <w:t>: Always. It starts during Pod initialization and continues running alongside the main container, restarting if it exits.</w:t>
+      </w:r>
+    </w:p>
+    <w:p/>
+    <w:p>
+      <w:r>
+        <w:rPr>
+          <w:b/>
+          <w:bCs/>
+        </w:rPr>
+        <w:t xml:space="preserve">Vertical Pod </w:t>
+      </w:r>
+      <w:proofErr w:type="spellStart"/>
+      <w:r>
+        <w:rPr>
+          <w:b/>
+          <w:bCs/>
+        </w:rPr>
+        <w:t>Autoscaler</w:t>
+      </w:r>
+      <w:proofErr w:type="spellEnd"/>
       <w:r>
         <w:t>: It is not an inbuilt resource. You have to deploy them separately.</w:t>
       </w:r>
@@ -2208,7 +3048,23 @@
           <w:b/>
           <w:bCs/>
         </w:rPr>
-        <w:t>Vertical Pod Autoscaler (VPA)</w:t>
+        <w:t xml:space="preserve">Vertical Pod </w:t>
+      </w:r>
+      <w:proofErr w:type="spellStart"/>
+      <w:r>
+        <w:rPr>
+          <w:b/>
+          <w:bCs/>
+        </w:rPr>
+        <w:t>Autoscaler</w:t>
+      </w:r>
+      <w:proofErr w:type="spellEnd"/>
+      <w:r>
+        <w:rPr>
+          <w:b/>
+          <w:bCs/>
+        </w:rPr>
+        <w:t xml:space="preserve"> (VPA)</w:t>
       </w:r>
       <w:r>
         <w:t xml:space="preserve"> automatically adjusts the CPU and memory requests/limits of Pods based on their actual usage. It is installed as a Kubernetes add-on and has three </w:t>
@@ -2245,14 +3101,24 @@
         <w:t>Admission Controller</w:t>
       </w:r>
       <w:r>
-        <w:t xml:space="preserve"> applies the recommended resources when replacement Pods are created. VPA is configured using a VerticalPodAutoscaler </w:t>
+        <w:t xml:space="preserve"> applies the recommended resources when replacement Pods are created. VPA is configured using a </w:t>
+      </w:r>
+      <w:proofErr w:type="spellStart"/>
+      <w:r>
+        <w:t>VerticalPodAutoscaler</w:t>
+      </w:r>
+      <w:proofErr w:type="spellEnd"/>
+      <w:r>
+        <w:t xml:space="preserve"> </w:t>
       </w:r>
       <w:r>
         <w:t xml:space="preserve">custom </w:t>
       </w:r>
+      <w:proofErr w:type="spellStart"/>
       <w:r>
         <w:t>resourcedefinition</w:t>
       </w:r>
+      <w:proofErr w:type="spellEnd"/>
       <w:r>
         <w:t xml:space="preserve"> </w:t>
       </w:r>
@@ -2383,24 +3249,57 @@
           <w:bCs/>
         </w:rPr>
       </w:pPr>
-      <w:r>
-        <w:rPr>
-          <w:b/>
-          <w:bCs/>
-        </w:rPr>
-        <w:t>PodDisruptionBudget (PDB)</w:t>
-      </w:r>
-    </w:p>
-    <w:p/>
-    <w:p>
-      <w:r>
-        <w:t>A PodDisruptionBudget (PDB) protects application availability during voluntary disruptions such as node draining, maintenance, and upgrades. It defines the minimum number of Pods that must remain available, preventing Kubernetes from voluntarily evicting too many Pods at the same time. For example, if an application has 3 replicas and minAvailable: 2, Kubernetes can evict one Pod, but it will not allow another voluntary eviction until the replacement Pod becomes available and the application returns to 3 available Pods.</w:t>
-      </w:r>
-    </w:p>
-    <w:p/>
-    <w:p>
-      <w:r>
-        <w:t>For example, with 3 replicas and minAvailable: 2, Kubernetes allows one Pod to be evicted during a node drain while ensuring at least 2 Pods remain available; the Deployment creates a replacement Pod and once it becomes Ready, the next Pod can be evicted.</w:t>
+      <w:proofErr w:type="spellStart"/>
+      <w:r>
+        <w:rPr>
+          <w:b/>
+          <w:bCs/>
+        </w:rPr>
+        <w:t>PodDisruptionBudget</w:t>
+      </w:r>
+      <w:proofErr w:type="spellEnd"/>
+      <w:r>
+        <w:rPr>
+          <w:b/>
+          <w:bCs/>
+        </w:rPr>
+        <w:t xml:space="preserve"> (PDB)</w:t>
+      </w:r>
+    </w:p>
+    <w:p/>
+    <w:p>
+      <w:r>
+        <w:t xml:space="preserve">A </w:t>
+      </w:r>
+      <w:proofErr w:type="spellStart"/>
+      <w:r>
+        <w:t>PodDisruptionBudget</w:t>
+      </w:r>
+      <w:proofErr w:type="spellEnd"/>
+      <w:r>
+        <w:t xml:space="preserve"> (PDB) protects application availability during voluntary disruptions such as node draining, maintenance, and upgrades. It defines the minimum number of Pods that must remain available, preventing Kubernetes from voluntarily evicting too many Pods at the same time. For example, if an application has 3 replicas and </w:t>
+      </w:r>
+      <w:proofErr w:type="spellStart"/>
+      <w:r>
+        <w:t>minAvailable</w:t>
+      </w:r>
+      <w:proofErr w:type="spellEnd"/>
+      <w:r>
+        <w:t>: 2, Kubernetes can evict one Pod, but it will not allow another voluntary eviction until the replacement Pod becomes available and the application returns to 3 available Pods.</w:t>
+      </w:r>
+    </w:p>
+    <w:p/>
+    <w:p>
+      <w:r>
+        <w:t xml:space="preserve">For example, with 3 replicas and </w:t>
+      </w:r>
+      <w:proofErr w:type="spellStart"/>
+      <w:r>
+        <w:t>minAvailable</w:t>
+      </w:r>
+      <w:proofErr w:type="spellEnd"/>
+      <w:r>
+        <w:t>: 2, Kubernetes allows one Pod to be evicted during a node drain while ensuring at least 2 Pods remain available; the Deployment creates a replacement Pod and once it becomes Ready, the next Pod can be evicted.</w:t>
       </w:r>
     </w:p>
     <w:p/>
@@ -2467,7 +3366,23 @@
     </w:p>
     <w:p>
       <w:r>
-        <w:t>With hostNetwork: true, a Pod shares the node's network namespace, so it uses the node's IP address directly. The application inside the Pod can therefore listen on the node's ports and receive traffic without a NodePort Service.</w:t>
+        <w:t xml:space="preserve">With </w:t>
+      </w:r>
+      <w:proofErr w:type="spellStart"/>
+      <w:r>
+        <w:t>hostNetwork</w:t>
+      </w:r>
+      <w:proofErr w:type="spellEnd"/>
+      <w:r>
+        <w:t xml:space="preserve">: true, a Pod shares the node's network namespace, so it uses the node's IP address directly. The application inside the Pod can therefore listen on the node's ports and receive traffic without a </w:t>
+      </w:r>
+      <w:proofErr w:type="spellStart"/>
+      <w:r>
+        <w:t>NodePort</w:t>
+      </w:r>
+      <w:proofErr w:type="spellEnd"/>
+      <w:r>
+        <w:t xml:space="preserve"> Service.</w:t>
       </w:r>
     </w:p>
     <w:p>
@@ -2477,7 +3392,23 @@
     </w:p>
     <w:p>
       <w:r>
-        <w:t>A normal Pod has its own Pod IP and network namespace, so external clients cannot normally access it through the node IP directly. NodePort provides a way to expose such normal Pods through a node IP and port without using hostNetwork.</w:t>
+        <w:t xml:space="preserve">A normal Pod has its own Pod IP and network namespace, so external clients cannot normally access it through the node IP directly. </w:t>
+      </w:r>
+      <w:proofErr w:type="spellStart"/>
+      <w:r>
+        <w:t>NodePort</w:t>
+      </w:r>
+      <w:proofErr w:type="spellEnd"/>
+      <w:r>
+        <w:t xml:space="preserve"> provides a way to expose such normal Pods through a node IP and port without using </w:t>
+      </w:r>
+      <w:proofErr w:type="spellStart"/>
+      <w:r>
+        <w:t>hostNetwork</w:t>
+      </w:r>
+      <w:proofErr w:type="spellEnd"/>
+      <w:r>
+        <w:t>.</w:t>
       </w:r>
     </w:p>
     <w:p>
@@ -2681,9 +3612,15 @@
       </w:r>
     </w:p>
     <w:p>
-      <w:r>
-        <w:t xml:space="preserve">kubectl create secret docker-registry </w:t>
-      </w:r>
+      <w:proofErr w:type="spellStart"/>
+      <w:r>
+        <w:t>kubectl</w:t>
+      </w:r>
+      <w:proofErr w:type="spellEnd"/>
+      <w:r>
+        <w:t xml:space="preserve"> create secret docker-registry </w:t>
+      </w:r>
+      <w:proofErr w:type="spellStart"/>
       <w:r>
         <w:rPr>
           <w:b/>
@@ -2691,6 +3628,7 @@
         </w:rPr>
         <w:t>regcred</w:t>
       </w:r>
+      <w:proofErr w:type="spellEnd"/>
       <w:r>
         <w:t xml:space="preserve"> \</w:t>
       </w:r>
@@ -2702,13 +3640,29 @@
     </w:p>
     <w:p>
       <w:r>
-        <w:t xml:space="preserve">  --docker-username=myuser \</w:t>
+        <w:t xml:space="preserve">  --docker-username=</w:t>
+      </w:r>
+      <w:proofErr w:type="spellStart"/>
+      <w:r>
+        <w:t>myuser</w:t>
+      </w:r>
+      <w:proofErr w:type="spellEnd"/>
+      <w:r>
+        <w:t xml:space="preserve"> \</w:t>
       </w:r>
     </w:p>
     <w:p>
       <w:r>
         <w:lastRenderedPageBreak/>
-        <w:t xml:space="preserve">  --docker-password=mypassword \</w:t>
+        <w:t xml:space="preserve">  --docker-password=</w:t>
+      </w:r>
+      <w:proofErr w:type="spellStart"/>
+      <w:r>
+        <w:t>mypassword</w:t>
+      </w:r>
+      <w:proofErr w:type="spellEnd"/>
+      <w:r>
+        <w:t xml:space="preserve"> \</w:t>
       </w:r>
     </w:p>
     <w:p>
@@ -2748,8 +3702,13 @@
       </w:r>
     </w:p>
     <w:p>
-      <w:r>
-        <w:t>apiVersion: v1</w:t>
+      <w:proofErr w:type="spellStart"/>
+      <w:r>
+        <w:t>apiVersion</w:t>
+      </w:r>
+      <w:proofErr w:type="spellEnd"/>
+      <w:r>
+        <w:t>: v1</w:t>
       </w:r>
     </w:p>
     <w:p>
@@ -2784,22 +3743,46 @@
     </w:p>
     <w:p>
       <w:r>
-        <w:t xml:space="preserve">      image: registry.example.com/myapp:v1</w:t>
-      </w:r>
-    </w:p>
-    <w:p>
-      <w:pPr>
-        <w:rPr>
-          <w:b/>
-          <w:bCs/>
-        </w:rPr>
-      </w:pPr>
-      <w:r>
-        <w:rPr>
-          <w:b/>
-          <w:bCs/>
-        </w:rPr>
-        <w:t xml:space="preserve">  imagePullSecrets:</w:t>
+        <w:t xml:space="preserve">      image: registry.example.com/</w:t>
+      </w:r>
+      <w:proofErr w:type="gramStart"/>
+      <w:r>
+        <w:t>myapp:v</w:t>
+      </w:r>
+      <w:proofErr w:type="gramEnd"/>
+      <w:r>
+        <w:t>1</w:t>
+      </w:r>
+    </w:p>
+    <w:p>
+      <w:pPr>
+        <w:rPr>
+          <w:b/>
+          <w:bCs/>
+        </w:rPr>
+      </w:pPr>
+      <w:r>
+        <w:rPr>
+          <w:b/>
+          <w:bCs/>
+        </w:rPr>
+        <w:t xml:space="preserve">  </w:t>
+      </w:r>
+      <w:proofErr w:type="spellStart"/>
+      <w:r>
+        <w:rPr>
+          <w:b/>
+          <w:bCs/>
+        </w:rPr>
+        <w:t>imagePullSecrets</w:t>
+      </w:r>
+      <w:proofErr w:type="spellEnd"/>
+      <w:r>
+        <w:rPr>
+          <w:b/>
+          <w:bCs/>
+        </w:rPr>
+        <w:t>:</w:t>
       </w:r>
       <w:r>
         <w:rPr>
@@ -2828,8 +3811,17 @@
           <w:b/>
           <w:bCs/>
         </w:rPr>
-        <w:t xml:space="preserve">    - name: regcred</w:t>
-      </w:r>
+        <w:t xml:space="preserve">    - name: </w:t>
+      </w:r>
+      <w:proofErr w:type="spellStart"/>
+      <w:r>
+        <w:rPr>
+          <w:b/>
+          <w:bCs/>
+        </w:rPr>
+        <w:t>regcred</w:t>
+      </w:r>
+      <w:proofErr w:type="spellEnd"/>
     </w:p>
     <w:p/>
     <w:p/>
@@ -2965,8 +3957,13 @@
       </w:r>
     </w:p>
     <w:p>
-      <w:r>
-        <w:t>securityContext:</w:t>
+      <w:proofErr w:type="spellStart"/>
+      <w:r>
+        <w:t>securityContext</w:t>
+      </w:r>
+      <w:proofErr w:type="spellEnd"/>
+      <w:r>
+        <w:t>:</w:t>
       </w:r>
     </w:p>
     <w:p>
@@ -3045,13 +4042,23 @@
     <w:p/>
     <w:p/>
     <w:p>
+      <w:proofErr w:type="spellStart"/>
       <w:r>
         <w:rPr>
           <w:b/>
           <w:bCs/>
           <w:highlight w:val="cyan"/>
         </w:rPr>
-        <w:t>CustomResourceDefinition (CRD)</w:t>
+        <w:t>CustomResourceDefinition</w:t>
+      </w:r>
+      <w:proofErr w:type="spellEnd"/>
+      <w:r>
+        <w:rPr>
+          <w:b/>
+          <w:bCs/>
+          <w:highlight w:val="cyan"/>
+        </w:rPr>
+        <w:t xml:space="preserve"> (CRD)</w:t>
       </w:r>
       <w:r>
         <w:rPr>
@@ -3106,12 +4113,21 @@
           <w:bCs/>
         </w:rPr>
       </w:pPr>
-      <w:r>
-        <w:rPr>
-          <w:b/>
-          <w:bCs/>
-        </w:rPr>
-        <w:t>Usecase:</w:t>
+      <w:proofErr w:type="spellStart"/>
+      <w:r>
+        <w:rPr>
+          <w:b/>
+          <w:bCs/>
+        </w:rPr>
+        <w:t>Usecase</w:t>
+      </w:r>
+      <w:proofErr w:type="spellEnd"/>
+      <w:r>
+        <w:rPr>
+          <w:b/>
+          <w:bCs/>
+        </w:rPr>
+        <w:t>:</w:t>
       </w:r>
     </w:p>
     <w:p>
@@ -3123,7 +4139,15 @@
         </w:numPr>
       </w:pPr>
       <w:r>
-        <w:t>Suppose Kubernetes does not have a built-in FlightBooking resource.</w:t>
+        <w:t xml:space="preserve">Suppose Kubernetes does not have a built-in </w:t>
+      </w:r>
+      <w:proofErr w:type="spellStart"/>
+      <w:r>
+        <w:t>FlightBooking</w:t>
+      </w:r>
+      <w:proofErr w:type="spellEnd"/>
+      <w:r>
+        <w:t xml:space="preserve"> resource.</w:t>
       </w:r>
     </w:p>
     <w:p>
@@ -3135,7 +4159,15 @@
         </w:numPr>
       </w:pPr>
       <w:r>
-        <w:t>CRD: Defines the FlightBooking resource type.</w:t>
+        <w:t xml:space="preserve">CRD: Defines the </w:t>
+      </w:r>
+      <w:proofErr w:type="spellStart"/>
+      <w:r>
+        <w:t>FlightBooking</w:t>
+      </w:r>
+      <w:proofErr w:type="spellEnd"/>
+      <w:r>
+        <w:t xml:space="preserve"> resource type.</w:t>
       </w:r>
     </w:p>
     <w:p>
@@ -3202,7 +4234,15 @@
         <w:t>default,</w:t>
       </w:r>
       <w:r>
-        <w:t xml:space="preserve"> etcd </w:t>
+        <w:t xml:space="preserve"> </w:t>
+      </w:r>
+      <w:proofErr w:type="spellStart"/>
+      <w:r>
+        <w:t>etcd</w:t>
+      </w:r>
+      <w:proofErr w:type="spellEnd"/>
+      <w:r>
+        <w:t xml:space="preserve"> </w:t>
       </w:r>
       <w:r>
         <w:rPr>
@@ -3270,7 +4310,31 @@
     <w:p/>
     <w:p>
       <w:r>
-        <w:t>ETCD stores Kubernetes objects as raw bytes (protobuf format). In a hexdump, the left side shows the actual hexadecimal byte values, while the right side shows their ASCII representation. Printable bytes appear as text, and non-printable protobuf metadata is displayed as dots (.).</w:t>
+        <w:t>ETCD stores Kubernetes objects as raw bytes (</w:t>
+      </w:r>
+      <w:proofErr w:type="spellStart"/>
+      <w:r>
+        <w:t>protobuf</w:t>
+      </w:r>
+      <w:proofErr w:type="spellEnd"/>
+      <w:r>
+        <w:t xml:space="preserve"> format). In a </w:t>
+      </w:r>
+      <w:proofErr w:type="spellStart"/>
+      <w:r>
+        <w:t>hexdump</w:t>
+      </w:r>
+      <w:proofErr w:type="spellEnd"/>
+      <w:r>
+        <w:t xml:space="preserve">, the left side shows the actual hexadecimal byte values, while the right side shows their ASCII representation. Printable bytes appear as text, and non-printable </w:t>
+      </w:r>
+      <w:proofErr w:type="spellStart"/>
+      <w:r>
+        <w:t>protobuf</w:t>
+      </w:r>
+      <w:proofErr w:type="spellEnd"/>
+      <w:r>
+        <w:t xml:space="preserve"> metadata is displayed as dots (.).</w:t>
       </w:r>
     </w:p>
     <w:p>
@@ -3286,7 +4350,15 @@
         <w:t xml:space="preserve"> </w:t>
       </w:r>
       <w:r>
-        <w:t>Enabling Encryption at Rest does not automatically encrypt existing data in etcd. Only newly created or updated resources are encrypted. Existing resources must be rewritten (updated/recreated) to be stored in encrypted form.</w:t>
+        <w:t xml:space="preserve">Enabling Encryption at Rest does not automatically encrypt existing data in </w:t>
+      </w:r>
+      <w:proofErr w:type="spellStart"/>
+      <w:r>
+        <w:t>etcd</w:t>
+      </w:r>
+      <w:proofErr w:type="spellEnd"/>
+      <w:r>
+        <w:t>. Only newly created or updated resources are encrypted. Existing resources must be rewritten (updated/recreated) to be stored in encrypted form.</w:t>
       </w:r>
     </w:p>
     <w:p>
@@ -3338,17 +4410,49 @@
     </w:p>
     <w:p>
       <w:r>
-        <w:t>It gets the yaml and passes it to kubectl replace -f command: it will recreate the resource.</w:t>
-      </w:r>
-    </w:p>
-    <w:p>
-      <w:r>
-        <w:t>When Encryption at Rest is enabled, back up both the ETCD snapshot and the EncryptionConfiguration (including encryption keys). Without the original key, encrypted data in ETCD cannot be decrypted after a restore.</w:t>
-      </w:r>
-    </w:p>
-    <w:p>
-      <w:r>
-        <w:t>Never replace an encryption key directly. Add the new key alongside the old key for key rotation. If the original encryption key is lost and no backup exists, Kubernetes may be unable to decrypt previously encrypted Secrets stored in etcd.</w:t>
+        <w:t xml:space="preserve">It gets the </w:t>
+      </w:r>
+      <w:proofErr w:type="spellStart"/>
+      <w:r>
+        <w:t>yaml</w:t>
+      </w:r>
+      <w:proofErr w:type="spellEnd"/>
+      <w:r>
+        <w:t xml:space="preserve"> and passes it to </w:t>
+      </w:r>
+      <w:proofErr w:type="spellStart"/>
+      <w:r>
+        <w:t>kubectl</w:t>
+      </w:r>
+      <w:proofErr w:type="spellEnd"/>
+      <w:r>
+        <w:t xml:space="preserve"> replace -f command: it will recreate the resource.</w:t>
+      </w:r>
+    </w:p>
+    <w:p>
+      <w:r>
+        <w:t xml:space="preserve">When Encryption at Rest is enabled, back up both the ETCD snapshot and the </w:t>
+      </w:r>
+      <w:proofErr w:type="spellStart"/>
+      <w:r>
+        <w:t>EncryptionConfiguration</w:t>
+      </w:r>
+      <w:proofErr w:type="spellEnd"/>
+      <w:r>
+        <w:t xml:space="preserve"> (including encryption keys). Without the original key, encrypted data in ETCD cannot be decrypted after a restore.</w:t>
+      </w:r>
+    </w:p>
+    <w:p>
+      <w:r>
+        <w:t xml:space="preserve">Never replace an encryption key directly. Add the new key alongside the old key for key rotation. If the original encryption key is lost and no backup exists, Kubernetes may be unable to decrypt previously encrypted Secrets stored in </w:t>
+      </w:r>
+      <w:proofErr w:type="spellStart"/>
+      <w:r>
+        <w:t>etcd</w:t>
+      </w:r>
+      <w:proofErr w:type="spellEnd"/>
+      <w:r>
+        <w:t>.</w:t>
       </w:r>
     </w:p>
     <w:p/>
@@ -3373,7 +4477,15 @@
     </w:p>
     <w:p>
       <w:r>
-        <w:t>A ConfigMap stores non-sensitive configuration data for applications, such as environment variables, configuration files, or command-line arguments.</w:t>
+        <w:t xml:space="preserve">A </w:t>
+      </w:r>
+      <w:proofErr w:type="spellStart"/>
+      <w:r>
+        <w:t>ConfigMap</w:t>
+      </w:r>
+      <w:proofErr w:type="spellEnd"/>
+      <w:r>
+        <w:t xml:space="preserve"> stores non-sensitive configuration data for applications, such as environment variables, configuration files, or command-line arguments.</w:t>
       </w:r>
     </w:p>
     <w:p>
@@ -3408,8 +4520,21 @@
       </w:r>
     </w:p>
     <w:p>
-      <w:r>
-        <w:t>kubectl create configmap app-config --from-literal=APP_COLOR=blue</w:t>
+      <w:proofErr w:type="spellStart"/>
+      <w:r>
+        <w:t>kubectl</w:t>
+      </w:r>
+      <w:proofErr w:type="spellEnd"/>
+      <w:r>
+        <w:t xml:space="preserve"> create </w:t>
+      </w:r>
+      <w:proofErr w:type="spellStart"/>
+      <w:r>
+        <w:t>configmap</w:t>
+      </w:r>
+      <w:proofErr w:type="spellEnd"/>
+      <w:r>
+        <w:t xml:space="preserve"> app-config --from-literal=APP_COLOR=blue</w:t>
       </w:r>
     </w:p>
     <w:p/>
@@ -3434,8 +4559,21 @@
       </w:r>
     </w:p>
     <w:p>
-      <w:r>
-        <w:t>kubectl create configmap app-config --from-file=config.txt</w:t>
+      <w:proofErr w:type="spellStart"/>
+      <w:r>
+        <w:t>kubectl</w:t>
+      </w:r>
+      <w:proofErr w:type="spellEnd"/>
+      <w:r>
+        <w:t xml:space="preserve"> create </w:t>
+      </w:r>
+      <w:proofErr w:type="spellStart"/>
+      <w:r>
+        <w:t>configmap</w:t>
+      </w:r>
+      <w:proofErr w:type="spellEnd"/>
+      <w:r>
+        <w:t xml:space="preserve"> app-config --from-file=config.txt</w:t>
       </w:r>
     </w:p>
     <w:p/>
@@ -3460,9 +4598,27 @@
       </w:r>
     </w:p>
     <w:p>
-      <w:r>
-        <w:t>kubectl create configmap app-config --from-env-file=app.env</w:t>
-      </w:r>
+      <w:proofErr w:type="spellStart"/>
+      <w:r>
+        <w:t>kubectl</w:t>
+      </w:r>
+      <w:proofErr w:type="spellEnd"/>
+      <w:r>
+        <w:t xml:space="preserve"> create </w:t>
+      </w:r>
+      <w:proofErr w:type="spellStart"/>
+      <w:r>
+        <w:t>configmap</w:t>
+      </w:r>
+      <w:proofErr w:type="spellEnd"/>
+      <w:r>
+        <w:t xml:space="preserve"> app-config --from-env-file=</w:t>
+      </w:r>
+      <w:proofErr w:type="spellStart"/>
+      <w:r>
+        <w:t>app.env</w:t>
+      </w:r>
+      <w:proofErr w:type="spellEnd"/>
     </w:p>
     <w:p/>
     <w:p>
@@ -3540,8 +4696,17 @@
           <w:b/>
           <w:bCs/>
         </w:rPr>
-        <w:t>injecting a ConfigMap</w:t>
-      </w:r>
+        <w:t xml:space="preserve">injecting a </w:t>
+      </w:r>
+      <w:proofErr w:type="spellStart"/>
+      <w:r>
+        <w:rPr>
+          <w:b/>
+          <w:bCs/>
+        </w:rPr>
+        <w:t>ConfigMap</w:t>
+      </w:r>
+      <w:proofErr w:type="spellEnd"/>
       <w:r>
         <w:t xml:space="preserve">, it is specified at the </w:t>
       </w:r>
@@ -3557,8 +4722,21 @@
       </w:r>
     </w:p>
     <w:p>
-      <w:r>
-        <w:t xml:space="preserve">ConfigMap can be consumed through environment variables, command/args, or a </w:t>
+      <w:proofErr w:type="spellStart"/>
+      <w:r>
+        <w:t>ConfigMap</w:t>
+      </w:r>
+      <w:proofErr w:type="spellEnd"/>
+      <w:r>
+        <w:t xml:space="preserve"> can be consumed through environment variables, command/</w:t>
+      </w:r>
+      <w:proofErr w:type="spellStart"/>
+      <w:r>
+        <w:t>args</w:t>
+      </w:r>
+      <w:proofErr w:type="spellEnd"/>
+      <w:r>
+        <w:t xml:space="preserve">, or a </w:t>
       </w:r>
       <w:r>
         <w:rPr>
@@ -3568,13 +4746,35 @@
         <w:t>volume</w:t>
       </w:r>
       <w:r>
-        <w:t>. Workloads like Deployments and StatefulSets use ConfigMaps through their Pod templates.</w:t>
-      </w:r>
-    </w:p>
-    <w:p>
-      <w:r>
-        <w:t xml:space="preserve">configMapKeyRef </w:t>
-      </w:r>
+        <w:t xml:space="preserve">. Workloads like Deployments and </w:t>
+      </w:r>
+      <w:proofErr w:type="spellStart"/>
+      <w:r>
+        <w:t>StatefulSets</w:t>
+      </w:r>
+      <w:proofErr w:type="spellEnd"/>
+      <w:r>
+        <w:t xml:space="preserve"> use </w:t>
+      </w:r>
+      <w:proofErr w:type="spellStart"/>
+      <w:r>
+        <w:t>ConfigMaps</w:t>
+      </w:r>
+      <w:proofErr w:type="spellEnd"/>
+      <w:r>
+        <w:t xml:space="preserve"> through their Pod templates.</w:t>
+      </w:r>
+    </w:p>
+    <w:p>
+      <w:proofErr w:type="spellStart"/>
+      <w:r>
+        <w:t>configMapKeyRef</w:t>
+      </w:r>
+      <w:proofErr w:type="spellEnd"/>
+      <w:r>
+        <w:t xml:space="preserve"> </w:t>
+      </w:r>
+      <w:proofErr w:type="gramStart"/>
       <w:r>
         <w:t>-</w:t>
       </w:r>
@@ -3582,18 +4782,32 @@
         <w:t xml:space="preserve"> </w:t>
       </w:r>
       <w:r>
-        <w:t xml:space="preserve"> Inject </w:t>
+        <w:t xml:space="preserve"> Inject</w:t>
+      </w:r>
+      <w:proofErr w:type="gramEnd"/>
+      <w:r>
+        <w:t xml:space="preserve"> </w:t>
       </w:r>
       <w:r>
         <w:t xml:space="preserve">specific key </w:t>
       </w:r>
     </w:p>
     <w:p>
-      <w:r>
-        <w:t xml:space="preserve">configMapRef </w:t>
-      </w:r>
-      <w:r>
-        <w:t xml:space="preserve">-  Inject </w:t>
+      <w:proofErr w:type="spellStart"/>
+      <w:r>
+        <w:t>configMapRef</w:t>
+      </w:r>
+      <w:proofErr w:type="spellEnd"/>
+      <w:r>
+        <w:t xml:space="preserve"> </w:t>
+      </w:r>
+      <w:proofErr w:type="gramStart"/>
+      <w:r>
+        <w:t>-  Inject</w:t>
+      </w:r>
+      <w:proofErr w:type="gramEnd"/>
+      <w:r>
+        <w:t xml:space="preserve"> </w:t>
       </w:r>
       <w:r>
         <w:t>all keys</w:t>
@@ -3651,7 +4865,15 @@
         <w:t>Base64-encoded</w:t>
       </w:r>
       <w:r>
-        <w:t xml:space="preserve"> values, while stringData accepts </w:t>
+        <w:t xml:space="preserve"> values, while </w:t>
+      </w:r>
+      <w:proofErr w:type="spellStart"/>
+      <w:r>
+        <w:t>stringData</w:t>
+      </w:r>
+      <w:proofErr w:type="spellEnd"/>
+      <w:r>
+        <w:t xml:space="preserve"> accepts </w:t>
       </w:r>
       <w:r>
         <w:rPr>
@@ -3744,7 +4966,15 @@
         <w:t>Declarative: (</w:t>
       </w:r>
       <w:r>
-        <w:t xml:space="preserve">Using stringData </w:t>
+        <w:t xml:space="preserve">Using </w:t>
+      </w:r>
+      <w:proofErr w:type="spellStart"/>
+      <w:r>
+        <w:t>stringData</w:t>
+      </w:r>
+      <w:proofErr w:type="spellEnd"/>
+      <w:r>
+        <w:t xml:space="preserve"> </w:t>
       </w:r>
       <w:r>
         <w:t xml:space="preserve">- </w:t>
@@ -3911,7 +5141,23 @@
           <w:b/>
           <w:bCs/>
         </w:rPr>
-        <w:t>Way kubernetes handles secrets:</w:t>
+        <w:t xml:space="preserve">Way </w:t>
+      </w:r>
+      <w:proofErr w:type="spellStart"/>
+      <w:r>
+        <w:rPr>
+          <w:b/>
+          <w:bCs/>
+        </w:rPr>
+        <w:t>kubernetes</w:t>
+      </w:r>
+      <w:proofErr w:type="spellEnd"/>
+      <w:r>
+        <w:rPr>
+          <w:b/>
+          <w:bCs/>
+        </w:rPr>
+        <w:t xml:space="preserve"> handles secrets:</w:t>
       </w:r>
     </w:p>
     <w:p>
@@ -3934,8 +5180,21 @@
           <w:numId w:val="9"/>
         </w:numPr>
       </w:pPr>
-      <w:r>
-        <w:t>Kubelet stores the secret into a tmpfs so that the secret is not written to disk storage.</w:t>
+      <w:proofErr w:type="spellStart"/>
+      <w:r>
+        <w:t>Kubelet</w:t>
+      </w:r>
+      <w:proofErr w:type="spellEnd"/>
+      <w:r>
+        <w:t xml:space="preserve"> stores the secret into a </w:t>
+      </w:r>
+      <w:proofErr w:type="spellStart"/>
+      <w:r>
+        <w:t>tmpfs</w:t>
+      </w:r>
+      <w:proofErr w:type="spellEnd"/>
+      <w:r>
+        <w:t xml:space="preserve"> so that the secret is not written to disk storage.</w:t>
       </w:r>
     </w:p>
     <w:p>
@@ -3947,7 +5206,15 @@
         </w:numPr>
       </w:pPr>
       <w:r>
-        <w:t>Once the Pod that depends on the secret is deleted, kubelet will delete its local copy of the secret data as well.</w:t>
+        <w:t xml:space="preserve">Once the Pod that depends on the secret is deleted, </w:t>
+      </w:r>
+      <w:proofErr w:type="spellStart"/>
+      <w:r>
+        <w:t>kubelet</w:t>
+      </w:r>
+      <w:proofErr w:type="spellEnd"/>
+      <w:r>
+        <w:t xml:space="preserve"> will delete its local copy of the secret data as well.</w:t>
       </w:r>
     </w:p>
     <w:p>
@@ -3980,7 +5247,23 @@
           <w:b/>
           <w:bCs/>
         </w:rPr>
-        <w:t>Types of Volume Provissioning:</w:t>
+        <w:t xml:space="preserve">Types of Volume </w:t>
+      </w:r>
+      <w:proofErr w:type="spellStart"/>
+      <w:r>
+        <w:rPr>
+          <w:b/>
+          <w:bCs/>
+        </w:rPr>
+        <w:t>Provissioning</w:t>
+      </w:r>
+      <w:proofErr w:type="spellEnd"/>
+      <w:r>
+        <w:rPr>
+          <w:b/>
+          <w:bCs/>
+        </w:rPr>
+        <w:t>:</w:t>
       </w:r>
     </w:p>
     <w:p>
@@ -4100,7 +5383,23 @@
         </w:numPr>
       </w:pPr>
       <w:r>
-        <w:t>Automatically creates a PersistentVolume (PV) when a PersistentVolumeClaim (PVC) requests storage.</w:t>
+        <w:t xml:space="preserve">Automatically creates a </w:t>
+      </w:r>
+      <w:proofErr w:type="spellStart"/>
+      <w:r>
+        <w:t>PersistentVolume</w:t>
+      </w:r>
+      <w:proofErr w:type="spellEnd"/>
+      <w:r>
+        <w:t xml:space="preserve"> (PV) when a </w:t>
+      </w:r>
+      <w:proofErr w:type="spellStart"/>
+      <w:r>
+        <w:t>PersistentVolumeClaim</w:t>
+      </w:r>
+      <w:proofErr w:type="spellEnd"/>
+      <w:r>
+        <w:t xml:space="preserve"> (PVC) requests storage.</w:t>
       </w:r>
     </w:p>
     <w:p>
@@ -4112,7 +5411,15 @@
         </w:numPr>
       </w:pPr>
       <w:r>
-        <w:t>Uses a StorageClass to determine how the storage should be created.</w:t>
+        <w:t xml:space="preserve">Uses a </w:t>
+      </w:r>
+      <w:proofErr w:type="spellStart"/>
+      <w:r>
+        <w:t>StorageClass</w:t>
+      </w:r>
+      <w:proofErr w:type="spellEnd"/>
+      <w:r>
+        <w:t xml:space="preserve"> to determine how the storage should be created.</w:t>
       </w:r>
     </w:p>
     <w:p>
@@ -4145,7 +5452,15 @@
     </w:p>
     <w:p>
       <w:r>
-        <w:t>PVC → StorageClass → Provisioner → PV → Pod uses storage</w:t>
+        <w:t xml:space="preserve">PVC → </w:t>
+      </w:r>
+      <w:proofErr w:type="spellStart"/>
+      <w:r>
+        <w:t>StorageClass</w:t>
+      </w:r>
+      <w:proofErr w:type="spellEnd"/>
+      <w:r>
+        <w:t xml:space="preserve"> → Provisioner → PV → Pod uses storage</w:t>
       </w:r>
     </w:p>
     <w:p/>
@@ -4155,14 +5470,24 @@
       </w:r>
     </w:p>
     <w:p>
-      <w:r>
-        <w:t>apiVersion: storage.k8s.io/v1</w:t>
-      </w:r>
-    </w:p>
-    <w:p>
-      <w:r>
-        <w:t>kind: StorageClass</w:t>
-      </w:r>
+      <w:proofErr w:type="spellStart"/>
+      <w:r>
+        <w:t>apiVersion</w:t>
+      </w:r>
+      <w:proofErr w:type="spellEnd"/>
+      <w:r>
+        <w:t>: storage.k8s.io/v1</w:t>
+      </w:r>
+    </w:p>
+    <w:p>
+      <w:r>
+        <w:t xml:space="preserve">kind: </w:t>
+      </w:r>
+      <w:proofErr w:type="spellStart"/>
+      <w:r>
+        <w:t>StorageClass</w:t>
+      </w:r>
+      <w:proofErr w:type="spellEnd"/>
     </w:p>
     <w:p>
       <w:r>
@@ -4171,7 +5496,15 @@
     </w:p>
     <w:p>
       <w:r>
-        <w:t xml:space="preserve">  name: gcp-balanced</w:t>
+        <w:t xml:space="preserve">  name: </w:t>
+      </w:r>
+      <w:proofErr w:type="spellStart"/>
+      <w:r>
+        <w:t>gcp</w:t>
+      </w:r>
+      <w:proofErr w:type="spellEnd"/>
+      <w:r>
+        <w:t>-balanced</w:t>
       </w:r>
     </w:p>
     <w:p>
@@ -4179,8 +5512,13 @@
         <w:t>provisioner: pd.csi.storage.gke.io</w:t>
       </w:r>
       <w:r>
-        <w:t xml:space="preserve">   #GCP provissioner</w:t>
-      </w:r>
+        <w:t xml:space="preserve">   #GCP </w:t>
+      </w:r>
+      <w:proofErr w:type="spellStart"/>
+      <w:r>
+        <w:t>provissioner</w:t>
+      </w:r>
+      <w:proofErr w:type="spellEnd"/>
     </w:p>
     <w:p>
       <w:r>
@@ -4200,8 +5538,13 @@
       <w:r>
         <w:t xml:space="preserve">Note: </w:t>
       </w:r>
-      <w:r>
-        <w:t>StorageClass is the configuration; dynamic provisioning is the process</w:t>
+      <w:proofErr w:type="spellStart"/>
+      <w:r>
+        <w:t>StorageClass</w:t>
+      </w:r>
+      <w:proofErr w:type="spellEnd"/>
+      <w:r>
+        <w:t xml:space="preserve"> is the configuration; dynamic provisioning is the process</w:t>
       </w:r>
     </w:p>
     <w:p/>
@@ -4381,7 +5724,15 @@
         </w:numPr>
       </w:pPr>
       <w:r>
-        <w:t>The CNI plugin attaches the veth pair and allocates the IP address directly to this namespace. All application containers then join this exact same network stack.</w:t>
+        <w:t xml:space="preserve">The CNI plugin attaches the </w:t>
+      </w:r>
+      <w:proofErr w:type="spellStart"/>
+      <w:r>
+        <w:t>veth</w:t>
+      </w:r>
+      <w:proofErr w:type="spellEnd"/>
+      <w:r>
+        <w:t xml:space="preserve"> pair and allocates the IP address directly to this namespace. All application containers then join this exact same network stack.</w:t>
       </w:r>
     </w:p>
     <w:p>
@@ -4432,7 +5783,15 @@
         <w:t>PID Namespace (Process ID):</w:t>
       </w:r>
       <w:r>
-        <w:t xml:space="preserve"> Isolated by default. Container 1 cannot see Container 2's processes (unless shareProcessNamespace: true is explicitly enabled).</w:t>
+        <w:t xml:space="preserve"> Isolated by default. Container 1 cannot see Container 2's processes (unless </w:t>
+      </w:r>
+      <w:proofErr w:type="spellStart"/>
+      <w:r>
+        <w:t>shareProcessNamespace</w:t>
+      </w:r>
+      <w:proofErr w:type="spellEnd"/>
+      <w:r>
+        <w:t>: true is explicitly enabled).</w:t>
       </w:r>
     </w:p>
     <w:p>
@@ -4594,7 +5953,73 @@
           <w:b/>
           <w:bCs/>
         </w:rPr>
-        <w:t>The Conflist / Rules (/etc/cni/net.d/)</w:t>
+        <w:t xml:space="preserve">The </w:t>
+      </w:r>
+      <w:proofErr w:type="spellStart"/>
+      <w:r>
+        <w:rPr>
+          <w:b/>
+          <w:bCs/>
+        </w:rPr>
+        <w:t>Conflist</w:t>
+      </w:r>
+      <w:proofErr w:type="spellEnd"/>
+      <w:r>
+        <w:rPr>
+          <w:b/>
+          <w:bCs/>
+        </w:rPr>
+        <w:t xml:space="preserve"> / Rules (/</w:t>
+      </w:r>
+      <w:proofErr w:type="spellStart"/>
+      <w:r>
+        <w:rPr>
+          <w:b/>
+          <w:bCs/>
+        </w:rPr>
+        <w:t>etc</w:t>
+      </w:r>
+      <w:proofErr w:type="spellEnd"/>
+      <w:r>
+        <w:rPr>
+          <w:b/>
+          <w:bCs/>
+        </w:rPr>
+        <w:t>/</w:t>
+      </w:r>
+      <w:proofErr w:type="spellStart"/>
+      <w:r>
+        <w:rPr>
+          <w:b/>
+          <w:bCs/>
+        </w:rPr>
+        <w:t>cni</w:t>
+      </w:r>
+      <w:proofErr w:type="spellEnd"/>
+      <w:r>
+        <w:rPr>
+          <w:b/>
+          <w:bCs/>
+        </w:rPr>
+        <w:t>/</w:t>
+      </w:r>
+      <w:proofErr w:type="spellStart"/>
+      <w:proofErr w:type="gramStart"/>
+      <w:r>
+        <w:rPr>
+          <w:b/>
+          <w:bCs/>
+        </w:rPr>
+        <w:t>net.d</w:t>
+      </w:r>
+      <w:proofErr w:type="spellEnd"/>
+      <w:proofErr w:type="gramEnd"/>
+      <w:r>
+        <w:rPr>
+          <w:b/>
+          <w:bCs/>
+        </w:rPr>
+        <w:t>/)</w:t>
       </w:r>
     </w:p>
     <w:p>
@@ -4605,7 +6030,20 @@
         </w:numPr>
       </w:pPr>
       <w:r>
-        <w:t>JSON-formatted configuration files (or .conflist chains) that define the network parameters, subnet ranges, and the sequence of plugins to execute.</w:t>
+        <w:t>JSON-formatted configuration files (</w:t>
+      </w:r>
+      <w:proofErr w:type="gramStart"/>
+      <w:r>
+        <w:t>or .</w:t>
+      </w:r>
+      <w:proofErr w:type="spellStart"/>
+      <w:r>
+        <w:t>conflist</w:t>
+      </w:r>
+      <w:proofErr w:type="spellEnd"/>
+      <w:proofErr w:type="gramEnd"/>
+      <w:r>
+        <w:t xml:space="preserve"> chains) that define the network parameters, subnet ranges, and the sequence of plugins to execute.</w:t>
       </w:r>
     </w:p>
     <w:p>
@@ -4620,7 +6058,23 @@
           <w:b/>
           <w:bCs/>
         </w:rPr>
-        <w:t>The Binaries (/opt/cni/bin/)</w:t>
+        <w:t>The Binaries (/opt/</w:t>
+      </w:r>
+      <w:proofErr w:type="spellStart"/>
+      <w:r>
+        <w:rPr>
+          <w:b/>
+          <w:bCs/>
+        </w:rPr>
+        <w:t>cni</w:t>
+      </w:r>
+      <w:proofErr w:type="spellEnd"/>
+      <w:r>
+        <w:rPr>
+          <w:b/>
+          <w:bCs/>
+        </w:rPr>
+        <w:t>/bin/)</w:t>
       </w:r>
     </w:p>
     <w:p>
@@ -4631,13 +6085,37 @@
         </w:numPr>
       </w:pPr>
       <w:r>
-        <w:t>Executable tools (bridge, ptp, host-local, portmap, etc.) that perform the actual kernel-level plumbing</w:t>
+        <w:t xml:space="preserve">Executable tools (bridge, </w:t>
+      </w:r>
+      <w:proofErr w:type="spellStart"/>
+      <w:r>
+        <w:t>ptp</w:t>
+      </w:r>
+      <w:proofErr w:type="spellEnd"/>
+      <w:r>
+        <w:t xml:space="preserve">, host-local, </w:t>
+      </w:r>
+      <w:proofErr w:type="spellStart"/>
+      <w:r>
+        <w:t>portmap</w:t>
+      </w:r>
+      <w:proofErr w:type="spellEnd"/>
+      <w:r>
+        <w:t>, etc.) that perform the actual kernel-level plumbing</w:t>
       </w:r>
       <w:r>
         <w:t xml:space="preserve"> </w:t>
       </w:r>
       <w:r>
-        <w:t>such as creating veth pairs, attaching them to namespaces, and assigning IP addresses.</w:t>
+        <w:t xml:space="preserve">such as creating </w:t>
+      </w:r>
+      <w:proofErr w:type="spellStart"/>
+      <w:r>
+        <w:t>veth</w:t>
+      </w:r>
+      <w:proofErr w:type="spellEnd"/>
+      <w:r>
+        <w:t xml:space="preserve"> pairs, attaching them to namespaces, and assigning IP addresses.</w:t>
       </w:r>
     </w:p>
     <w:p>
@@ -4665,6 +6143,7 @@
       <w:r>
         <w:t xml:space="preserve">Runtimes like </w:t>
       </w:r>
+      <w:proofErr w:type="spellStart"/>
       <w:r>
         <w:rPr>
           <w:b/>
@@ -4672,6 +6151,7 @@
         </w:rPr>
         <w:t>containerd</w:t>
       </w:r>
+      <w:proofErr w:type="spellEnd"/>
       <w:r>
         <w:t xml:space="preserve"> or </w:t>
       </w:r>
@@ -4733,7 +6213,15 @@
         <w:t xml:space="preserve"> </w:t>
       </w:r>
       <w:r>
-        <w:t>such as Kindnet, Flannel, Calico, or Cilium</w:t>
+        <w:t xml:space="preserve">such as </w:t>
+      </w:r>
+      <w:proofErr w:type="spellStart"/>
+      <w:r>
+        <w:t>Kindnet</w:t>
+      </w:r>
+      <w:proofErr w:type="spellEnd"/>
+      <w:r>
+        <w:t>, Flannel, Calico, or Cilium</w:t>
       </w:r>
       <w:r>
         <w:t xml:space="preserve"> </w:t>
@@ -4799,24 +6287,69 @@
       </w:r>
     </w:p>
     <w:p>
-      <w:r>
-        <w:t>CoreDNS is the DNS server in Kubernetes that resolves names of Services and Pods into IP addresses. Each Pod normally uses the CoreDNS Service ClusterIP (10.96.0.10) as its DNS nameserver. When a Pod needs to resolve a DNS name, it sends a query to this IP, and CoreDNS returns the corresponding IP address.</w:t>
-      </w:r>
-    </w:p>
-    <w:p/>
-    <w:p>
-      <w:pPr>
-        <w:rPr>
-          <w:b/>
-          <w:bCs/>
-        </w:rPr>
-      </w:pPr>
-      <w:r>
-        <w:rPr>
-          <w:b/>
-          <w:bCs/>
-        </w:rPr>
-        <w:t>Who inject this IP to resolve.conf?</w:t>
+      <w:proofErr w:type="spellStart"/>
+      <w:r>
+        <w:t>CoreDNS</w:t>
+      </w:r>
+      <w:proofErr w:type="spellEnd"/>
+      <w:r>
+        <w:t xml:space="preserve"> is the DNS server in Kubernetes that resolves names of Services and Pods into IP addresses. Each Pod normally uses the </w:t>
+      </w:r>
+      <w:proofErr w:type="spellStart"/>
+      <w:r>
+        <w:t>CoreDNS</w:t>
+      </w:r>
+      <w:proofErr w:type="spellEnd"/>
+      <w:r>
+        <w:t xml:space="preserve"> Service </w:t>
+      </w:r>
+      <w:proofErr w:type="spellStart"/>
+      <w:r>
+        <w:t>ClusterIP</w:t>
+      </w:r>
+      <w:proofErr w:type="spellEnd"/>
+      <w:r>
+        <w:t xml:space="preserve"> (10.96.0.10) as its DNS nameserver. When a Pod needs to resolve a DNS name, it sends a query to this IP, and </w:t>
+      </w:r>
+      <w:proofErr w:type="spellStart"/>
+      <w:r>
+        <w:t>CoreDNS</w:t>
+      </w:r>
+      <w:proofErr w:type="spellEnd"/>
+      <w:r>
+        <w:t xml:space="preserve"> returns the corresponding IP address.</w:t>
+      </w:r>
+    </w:p>
+    <w:p/>
+    <w:p>
+      <w:pPr>
+        <w:rPr>
+          <w:b/>
+          <w:bCs/>
+        </w:rPr>
+      </w:pPr>
+      <w:r>
+        <w:rPr>
+          <w:b/>
+          <w:bCs/>
+        </w:rPr>
+        <w:t xml:space="preserve">Who inject this IP to </w:t>
+      </w:r>
+      <w:proofErr w:type="spellStart"/>
+      <w:r>
+        <w:rPr>
+          <w:b/>
+          <w:bCs/>
+        </w:rPr>
+        <w:t>resolve.conf</w:t>
+      </w:r>
+      <w:proofErr w:type="spellEnd"/>
+      <w:r>
+        <w:rPr>
+          <w:b/>
+          <w:bCs/>
+        </w:rPr>
+        <w:t>?</w:t>
       </w:r>
     </w:p>
     <w:p/>
@@ -4827,6 +6360,7 @@
       <w:r>
         <w:t xml:space="preserve">he </w:t>
       </w:r>
+      <w:proofErr w:type="spellStart"/>
       <w:r>
         <w:rPr>
           <w:b/>
@@ -4834,19 +6368,210 @@
         </w:rPr>
         <w:t>kubelet</w:t>
       </w:r>
-      <w:r>
-        <w:t xml:space="preserve"> on each node has its configuration in /var/lib/kubelet/config.yaml, where clusterDNS: 10.96.0.10 specifies the CoreDNS Service IP to be configured as the DNS nameserver in Pods' /etc/resolv.conf.</w:t>
-      </w:r>
-    </w:p>
-    <w:p/>
-    <w:p/>
-    <w:p/>
-    <w:p/>
-    <w:p/>
-    <w:p/>
-    <w:p/>
-    <w:p/>
-    <w:p/>
+      <w:proofErr w:type="spellEnd"/>
+      <w:r>
+        <w:t xml:space="preserve"> on each node has its configuration in /var/lib/</w:t>
+      </w:r>
+      <w:proofErr w:type="spellStart"/>
+      <w:r>
+        <w:t>kubelet</w:t>
+      </w:r>
+      <w:proofErr w:type="spellEnd"/>
+      <w:r>
+        <w:t>/</w:t>
+      </w:r>
+      <w:proofErr w:type="spellStart"/>
+      <w:r>
+        <w:t>config.yaml</w:t>
+      </w:r>
+      <w:proofErr w:type="spellEnd"/>
+      <w:r>
+        <w:t xml:space="preserve">, where </w:t>
+      </w:r>
+      <w:proofErr w:type="spellStart"/>
+      <w:r>
+        <w:t>clusterDNS</w:t>
+      </w:r>
+      <w:proofErr w:type="spellEnd"/>
+      <w:r>
+        <w:t xml:space="preserve">: 10.96.0.10 specifies the </w:t>
+      </w:r>
+      <w:proofErr w:type="spellStart"/>
+      <w:r>
+        <w:t>CoreDNS</w:t>
+      </w:r>
+      <w:proofErr w:type="spellEnd"/>
+      <w:r>
+        <w:t xml:space="preserve"> Service IP to be configured as the DNS nameserver in Pods' /</w:t>
+      </w:r>
+      <w:proofErr w:type="spellStart"/>
+      <w:r>
+        <w:t>etc</w:t>
+      </w:r>
+      <w:proofErr w:type="spellEnd"/>
+      <w:r>
+        <w:t>/</w:t>
+      </w:r>
+      <w:proofErr w:type="spellStart"/>
+      <w:r>
+        <w:t>resolv.conf</w:t>
+      </w:r>
+      <w:proofErr w:type="spellEnd"/>
+      <w:r>
+        <w:t>.</w:t>
+      </w:r>
+    </w:p>
+    <w:p/>
+    <w:p/>
+    <w:p>
+      <w:pPr>
+        <w:rPr>
+          <w:b/>
+          <w:bCs/>
+        </w:rPr>
+      </w:pPr>
+      <w:r>
+        <w:rPr>
+          <w:b/>
+          <w:bCs/>
+        </w:rPr>
+        <w:t>INGRESS</w:t>
+      </w:r>
+    </w:p>
+    <w:p>
+      <w:r>
+        <w:t>Additional note:</w:t>
+      </w:r>
+    </w:p>
+    <w:p>
+      <w:r>
+        <w:t>A Kubernetes Ingress controller acts as an entry point that maps external URL paths to internal cluster services. By default, the Ingress controller forwards the exact URL path requested by the user directly to the backend application container.</w:t>
+      </w:r>
+    </w:p>
+    <w:p/>
+    <w:p/>
+    <w:p/>
+    <w:p>
+      <w:r>
+        <w:lastRenderedPageBreak/>
+        <w:t>The Role of rewrite-target</w:t>
+      </w:r>
+    </w:p>
+    <w:p/>
+    <w:p>
+      <w:r>
+        <w:t>The nginx.ingress.kubernetes.io/rewrite-target annotation alters the request path after it matches an Ingress rule but before it is handed off to the backend pod.</w:t>
+      </w:r>
+    </w:p>
+    <w:p>
+      <w:r>
+        <w:t>• When it is required: Use it when the external routing path differs from the internal code route. For instance, if an external user visits /pay but the application code is hosted at the root (/), the annotation strips /pay and sends / to the container to prevent a 404 Not Found error.</w:t>
+      </w:r>
+    </w:p>
+    <w:p>
+      <w:r>
+        <w:t>• When it is omitted: Do not use it if the application code is explicitly programmed to listen on the exact same sub-path (e.g., the code features an API route explicitly defined as /pay).</w:t>
+      </w:r>
+    </w:p>
+    <w:p>
+      <w:r>
+        <w:drawing>
+          <wp:inline distT="0" distB="0" distL="0" distR="0" wp14:anchorId="73E5D5F0" wp14:editId="534D54DE">
+            <wp:extent cx="4839375" cy="3772426"/>
+            <wp:effectExtent l="0" t="0" r="0" b="0"/>
+            <wp:docPr id="1169876086" name="Picture 1"/>
+            <wp:cNvGraphicFramePr>
+              <a:graphicFrameLocks xmlns:a="http://schemas.openxmlformats.org/drawingml/2006/main" noChangeAspect="1"/>
+            </wp:cNvGraphicFramePr>
+            <a:graphic xmlns:a="http://schemas.openxmlformats.org/drawingml/2006/main">
+              <a:graphicData uri="http://schemas.openxmlformats.org/drawingml/2006/picture">
+                <pic:pic xmlns:pic="http://schemas.openxmlformats.org/drawingml/2006/picture">
+                  <pic:nvPicPr>
+                    <pic:cNvPr id="1169876086" name=""/>
+                    <pic:cNvPicPr/>
+                  </pic:nvPicPr>
+                  <pic:blipFill>
+                    <a:blip r:embed="rId27"/>
+                    <a:stretch>
+                      <a:fillRect/>
+                    </a:stretch>
+                  </pic:blipFill>
+                  <pic:spPr>
+                    <a:xfrm>
+                      <a:off x="0" y="0"/>
+                      <a:ext cx="4839375" cy="3772426"/>
+                    </a:xfrm>
+                    <a:prstGeom prst="rect">
+                      <a:avLst/>
+                    </a:prstGeom>
+                  </pic:spPr>
+                </pic:pic>
+              </a:graphicData>
+            </a:graphic>
+          </wp:inline>
+        </w:drawing>
+      </w:r>
+    </w:p>
+    <w:p/>
+    <w:p/>
+    <w:p/>
+    <w:p/>
+    <w:p/>
+    <w:p>
+      <w:pPr>
+        <w:rPr>
+          <w:b/>
+          <w:bCs/>
+        </w:rPr>
+      </w:pPr>
+      <w:r>
+        <w:rPr>
+          <w:b/>
+          <w:bCs/>
+        </w:rPr>
+        <w:lastRenderedPageBreak/>
+        <w:t>To enable TLS in Ingress:</w:t>
+      </w:r>
+    </w:p>
+    <w:p>
+      <w:r>
+        <w:drawing>
+          <wp:inline distT="0" distB="0" distL="0" distR="0" wp14:anchorId="43C28DC0" wp14:editId="19C4D3CC">
+            <wp:extent cx="5849166" cy="4639322"/>
+            <wp:effectExtent l="0" t="0" r="0" b="8890"/>
+            <wp:docPr id="1518052831" name="Picture 1"/>
+            <wp:cNvGraphicFramePr>
+              <a:graphicFrameLocks xmlns:a="http://schemas.openxmlformats.org/drawingml/2006/main" noChangeAspect="1"/>
+            </wp:cNvGraphicFramePr>
+            <a:graphic xmlns:a="http://schemas.openxmlformats.org/drawingml/2006/main">
+              <a:graphicData uri="http://schemas.openxmlformats.org/drawingml/2006/picture">
+                <pic:pic xmlns:pic="http://schemas.openxmlformats.org/drawingml/2006/picture">
+                  <pic:nvPicPr>
+                    <pic:cNvPr id="1518052831" name=""/>
+                    <pic:cNvPicPr/>
+                  </pic:nvPicPr>
+                  <pic:blipFill>
+                    <a:blip r:embed="rId28"/>
+                    <a:stretch>
+                      <a:fillRect/>
+                    </a:stretch>
+                  </pic:blipFill>
+                  <pic:spPr>
+                    <a:xfrm>
+                      <a:off x="0" y="0"/>
+                      <a:ext cx="5849166" cy="4639322"/>
+                    </a:xfrm>
+                    <a:prstGeom prst="rect">
+                      <a:avLst/>
+                    </a:prstGeom>
+                  </pic:spPr>
+                </pic:pic>
+              </a:graphicData>
+            </a:graphic>
+          </wp:inline>
+        </w:drawing>
+      </w:r>
+    </w:p>
     <w:p/>
     <w:p/>
     <w:p/>
@@ -4871,7 +6596,15 @@
     <w:p/>
     <w:p>
       <w:r>
-        <w:t>To delete all pods together: kubectl delete pods –all</w:t>
+        <w:t xml:space="preserve">To delete all pods together: </w:t>
+      </w:r>
+      <w:proofErr w:type="spellStart"/>
+      <w:r>
+        <w:t>kubectl</w:t>
+      </w:r>
+      <w:proofErr w:type="spellEnd"/>
+      <w:r>
+        <w:t xml:space="preserve"> delete pods –all</w:t>
       </w:r>
     </w:p>
     <w:p>
@@ -4882,17 +6615,28 @@
         <w:t>resources</w:t>
       </w:r>
       <w:r>
-        <w:t>: kubectl delete pods --all -n &lt;namespace-name&gt;</w:t>
-      </w:r>
-    </w:p>
-    <w:p/>
-    <w:p>
-      <w:r>
+        <w:t xml:space="preserve">: </w:t>
+      </w:r>
+      <w:proofErr w:type="spellStart"/>
+      <w:r>
+        <w:t>kubectl</w:t>
+      </w:r>
+      <w:proofErr w:type="spellEnd"/>
+      <w:r>
+        <w:t xml:space="preserve"> delete pods --all -n &lt;namespace-name&gt;</w:t>
+      </w:r>
+    </w:p>
+    <w:p/>
+    <w:p>
+      <w:proofErr w:type="spellStart"/>
+      <w:r>
+        <w:lastRenderedPageBreak/>
         <w:t>k</w:t>
       </w:r>
       <w:r>
         <w:t>ubectl</w:t>
       </w:r>
+      <w:proofErr w:type="spellEnd"/>
       <w:r>
         <w:t xml:space="preserve"> get pods --show-</w:t>
       </w:r>
@@ -4911,32 +6655,102 @@
     </w:p>
     <w:p/>
     <w:p>
+      <w:proofErr w:type="spellStart"/>
       <w:r>
         <w:t>ku</w:t>
       </w:r>
       <w:r>
-        <w:t xml:space="preserve">bectl apply -f file.yaml → Creates the resource if it doesn't exist, or updates it if it already exists. </w:t>
-      </w:r>
-    </w:p>
-    <w:p>
-      <w:r>
-        <w:t>kubectl replace -f file.yaml → Replaces an existing resource. It fails if the resource doesn't exist.</w:t>
-      </w:r>
-    </w:p>
-    <w:p/>
-    <w:p>
-      <w:r>
-        <w:t>You can use the kubectl explain to learn more about different resources.</w:t>
-      </w:r>
-    </w:p>
-    <w:p>
-      <w:r>
-        <w:t>Eg: kubectl explain pod, kubectl explain pod.spec.</w:t>
-      </w:r>
-    </w:p>
-    <w:p>
-      <w:r>
-        <w:t xml:space="preserve">You can use  --recursive flag to display all the applicable fields that are part of </w:t>
+        <w:t>bectl</w:t>
+      </w:r>
+      <w:proofErr w:type="spellEnd"/>
+      <w:r>
+        <w:t xml:space="preserve"> apply -f </w:t>
+      </w:r>
+      <w:proofErr w:type="spellStart"/>
+      <w:proofErr w:type="gramStart"/>
+      <w:r>
+        <w:t>file.yaml</w:t>
+      </w:r>
+      <w:proofErr w:type="spellEnd"/>
+      <w:proofErr w:type="gramEnd"/>
+      <w:r>
+        <w:t xml:space="preserve"> → Creates the resource if it doesn't exist, or updates it if it already exists. </w:t>
+      </w:r>
+    </w:p>
+    <w:p>
+      <w:proofErr w:type="spellStart"/>
+      <w:r>
+        <w:t>kubectl</w:t>
+      </w:r>
+      <w:proofErr w:type="spellEnd"/>
+      <w:r>
+        <w:t xml:space="preserve"> replace -f </w:t>
+      </w:r>
+      <w:proofErr w:type="spellStart"/>
+      <w:proofErr w:type="gramStart"/>
+      <w:r>
+        <w:t>file.yaml</w:t>
+      </w:r>
+      <w:proofErr w:type="spellEnd"/>
+      <w:proofErr w:type="gramEnd"/>
+      <w:r>
+        <w:t xml:space="preserve"> → Replaces an existing resource. It fails if the resource doesn't exist.</w:t>
+      </w:r>
+    </w:p>
+    <w:p/>
+    <w:p>
+      <w:r>
+        <w:t xml:space="preserve">You can use the </w:t>
+      </w:r>
+      <w:proofErr w:type="spellStart"/>
+      <w:r>
+        <w:t>kubectl</w:t>
+      </w:r>
+      <w:proofErr w:type="spellEnd"/>
+      <w:r>
+        <w:t xml:space="preserve"> explain to learn more about different resources.</w:t>
+      </w:r>
+    </w:p>
+    <w:p>
+      <w:r>
+        <w:t xml:space="preserve">Eg: </w:t>
+      </w:r>
+      <w:proofErr w:type="spellStart"/>
+      <w:r>
+        <w:t>kubectl</w:t>
+      </w:r>
+      <w:proofErr w:type="spellEnd"/>
+      <w:r>
+        <w:t xml:space="preserve"> explain pod, </w:t>
+      </w:r>
+      <w:proofErr w:type="spellStart"/>
+      <w:r>
+        <w:t>kubectl</w:t>
+      </w:r>
+      <w:proofErr w:type="spellEnd"/>
+      <w:r>
+        <w:t xml:space="preserve"> explain </w:t>
+      </w:r>
+      <w:proofErr w:type="spellStart"/>
+      <w:r>
+        <w:t>pod.spec</w:t>
+      </w:r>
+      <w:proofErr w:type="spellEnd"/>
+      <w:r>
+        <w:t>.</w:t>
+      </w:r>
+    </w:p>
+    <w:p>
+      <w:r>
+        <w:t xml:space="preserve">You can </w:t>
+      </w:r>
+      <w:proofErr w:type="gramStart"/>
+      <w:r>
+        <w:t>use  --</w:t>
+      </w:r>
+      <w:proofErr w:type="gramEnd"/>
+      <w:r>
+        <w:t xml:space="preserve">recursive flag to display all the applicable fields that are part of </w:t>
       </w:r>
       <w:r>
         <w:t>those resources</w:t>
@@ -4947,26 +6761,56 @@
     </w:p>
     <w:p>
       <w:r>
-        <w:t xml:space="preserve">Eg: kubectl explain pod.spec </w:t>
+        <w:t xml:space="preserve">Eg: </w:t>
+      </w:r>
+      <w:proofErr w:type="spellStart"/>
+      <w:r>
+        <w:t>kubectl</w:t>
+      </w:r>
+      <w:proofErr w:type="spellEnd"/>
+      <w:r>
+        <w:t xml:space="preserve"> explain </w:t>
+      </w:r>
+      <w:proofErr w:type="spellStart"/>
+      <w:proofErr w:type="gramStart"/>
+      <w:r>
+        <w:t>pod.spec</w:t>
+      </w:r>
+      <w:proofErr w:type="spellEnd"/>
+      <w:proofErr w:type="gramEnd"/>
+      <w:r>
+        <w:t xml:space="preserve"> </w:t>
       </w:r>
       <w:r>
         <w:t>–</w:t>
       </w:r>
+      <w:proofErr w:type="spellStart"/>
       <w:r>
         <w:t>recusrsive</w:t>
       </w:r>
       <w:r>
         <w:t>s</w:t>
       </w:r>
+      <w:proofErr w:type="spellEnd"/>
     </w:p>
     <w:p/>
     <w:p>
       <w:r>
         <w:t xml:space="preserve">To log in to a multi container pod:  </w:t>
       </w:r>
-      <w:r>
-        <w:t>kubectl exec -it &lt;pod-name&gt; -c &lt;container-name&gt; -- /bin/sh</w:t>
-      </w:r>
+      <w:proofErr w:type="spellStart"/>
+      <w:r>
+        <w:t>kubectl</w:t>
+      </w:r>
+      <w:proofErr w:type="spellEnd"/>
+      <w:r>
+        <w:t xml:space="preserve"> exec -it &lt;pod-name&gt; -c &lt;container-name&gt; -- /bin/</w:t>
+      </w:r>
+      <w:proofErr w:type="spellStart"/>
+      <w:r>
+        <w:t>sh</w:t>
+      </w:r>
+      <w:proofErr w:type="spellEnd"/>
     </w:p>
     <w:sectPr>
       <w:pgSz w:w="12240" w:h="15840"/>

</xml_diff>

<commit_message>
Learned Gateway API, Performed a demo of its implementation
</commit_message>
<xml_diff>
--- a/9-Interesting_learning_Notes/Learning_Notes.docx
+++ b/9-Interesting_learning_Notes/Learning_Notes.docx
@@ -6475,6 +6475,9 @@
     </w:p>
     <w:p>
       <w:r>
+        <w:rPr>
+          <w:noProof/>
+        </w:rPr>
         <w:drawing>
           <wp:inline distT="0" distB="0" distL="0" distR="0" wp14:anchorId="73E5D5F0" wp14:editId="534D54DE">
             <wp:extent cx="4839375" cy="3772426"/>
@@ -6535,6 +6538,9 @@
     </w:p>
     <w:p>
       <w:r>
+        <w:rPr>
+          <w:noProof/>
+        </w:rPr>
         <w:drawing>
           <wp:inline distT="0" distB="0" distL="0" distR="0" wp14:anchorId="43C28DC0" wp14:editId="19C4D3CC">
             <wp:extent cx="5849166" cy="4639322"/>
@@ -6574,6 +6580,122 @@
     </w:p>
     <w:p/>
     <w:p/>
+    <w:p>
+      <w:pPr>
+        <w:rPr>
+          <w:b/>
+          <w:bCs/>
+        </w:rPr>
+      </w:pPr>
+      <w:r>
+        <w:rPr>
+          <w:b/>
+          <w:bCs/>
+          <w:highlight w:val="cyan"/>
+        </w:rPr>
+        <w:t>Kubernetes Gateway API</w:t>
+      </w:r>
+    </w:p>
+    <w:p>
+      <w:r>
+        <w:t>Gateway API is a modern, more expressive successor to the Kubernetes Ingress API. It manages incoming traffic and provides advanced routing capabilities.</w:t>
+      </w:r>
+    </w:p>
+    <w:p/>
+    <w:p>
+      <w:pPr>
+        <w:rPr>
+          <w:b/>
+          <w:bCs/>
+        </w:rPr>
+      </w:pPr>
+      <w:r>
+        <w:rPr>
+          <w:b/>
+          <w:bCs/>
+        </w:rPr>
+        <w:t>Three main resources:</w:t>
+      </w:r>
+    </w:p>
+    <w:p>
+      <w:r>
+        <w:t xml:space="preserve">- </w:t>
+      </w:r>
+      <w:proofErr w:type="spellStart"/>
+      <w:r>
+        <w:t>GatewayClass</w:t>
+      </w:r>
+      <w:proofErr w:type="spellEnd"/>
+      <w:r>
+        <w:t>: Defines the Gateway controller implementation.</w:t>
+      </w:r>
+    </w:p>
+    <w:p>
+      <w:r>
+        <w:t>- Gateway: Defines entry points, listeners and ports.</w:t>
+      </w:r>
+    </w:p>
+    <w:p>
+      <w:r>
+        <w:t xml:space="preserve">- </w:t>
+      </w:r>
+      <w:proofErr w:type="spellStart"/>
+      <w:r>
+        <w:t>HTTPRoute</w:t>
+      </w:r>
+      <w:proofErr w:type="spellEnd"/>
+      <w:r>
+        <w:t>: Defines routing rules to backend Services.</w:t>
+      </w:r>
+    </w:p>
+    <w:p>
+      <w:pPr>
+        <w:rPr>
+          <w:b/>
+          <w:bCs/>
+        </w:rPr>
+      </w:pPr>
+      <w:r>
+        <w:rPr>
+          <w:b/>
+          <w:bCs/>
+        </w:rPr>
+        <w:lastRenderedPageBreak/>
+        <w:t>Why Gateway API is better than Ingress:</w:t>
+      </w:r>
+    </w:p>
+    <w:p>
+      <w:r>
+        <w:t>- Supports advanced traffic routing (header matching, traffic splitting, etc.).</w:t>
+      </w:r>
+    </w:p>
+    <w:p>
+      <w:r>
+        <w:t>- Supports multiple protocols (HTTP, HTTPS, TCP, UDP, depending on implementation).</w:t>
+      </w:r>
+    </w:p>
+    <w:p>
+      <w:r>
+        <w:t>- Separates infrastructure and application responsibilities.</w:t>
+      </w:r>
+    </w:p>
+    <w:p>
+      <w:r>
+        <w:t>- Reduces dependency on controller-specific annotations.</w:t>
+      </w:r>
+    </w:p>
+    <w:p>
+      <w:r>
+        <w:t>- Provides a standardized and extensible API.</w:t>
+      </w:r>
+    </w:p>
+    <w:p/>
+    <w:p/>
+    <w:p/>
+    <w:p/>
+    <w:p/>
+    <w:p/>
+    <w:p/>
     <w:p/>
     <w:p/>
     <w:p>
@@ -6630,7 +6752,6 @@
     <w:p>
       <w:proofErr w:type="spellStart"/>
       <w:r>
-        <w:lastRenderedPageBreak/>
         <w:t>k</w:t>
       </w:r>
       <w:r>

</xml_diff>